<commit_message>
Assistente virtuale attivo: corsivo nelle risposte; Registro 4.2, Manuale Amministratore 3.6, Manuale Test 3.2, Ripristino 1.1, Presentazione 2.2
Co-Authored-By: Claude Opus 5.5 <noreply@anthropic.com>
Claude-Session: https://claude.ai/code/session_01E8XCbEeVHWVP3hntUZ6kZ1
</commit_message>
<xml_diff>
--- a/public/documentazione/Istruzioni_Ripristino_Portale_CWP.docx
+++ b/public/documentazione/Istruzioni_Ripristino_Portale_CWP.docx
@@ -302,7 +302,7 @@
                 <w:sz w:val="20"/>
                 <w:szCs w:val="20"/>
               </w:rPr>
-              <w:t xml:space="preserve">Rev. 1.0</w:t>
+              <w:t xml:space="preserve">Rev. 1.1</w:t>
             </w:r>
           </w:p>
         </w:tc>
@@ -719,6 +719,140 @@
                 <w:sz w:val="18"/>
                 <w:szCs w:val="18"/>
               </w:rPr>
+              <w:t xml:space="preserve">1.1</w:t>
+            </w:r>
+          </w:p>
+        </w:tc>
+        <w:tc>
+          <w:tcPr>
+            <w:tcW w:type="dxa" w:w="1300"/>
+            <w:tcBorders>
+              <w:top w:val="single" w:color="D9D4C5" w:sz="4"/>
+              <w:left w:val="single" w:color="D9D4C5" w:sz="4"/>
+              <w:bottom w:val="single" w:color="D9D4C5" w:sz="4"/>
+              <w:right w:val="single" w:color="D9D4C5" w:sz="4"/>
+            </w:tcBorders>
+            <w:tcMar>
+              <w:top w:type="dxa" w:w="70"/>
+              <w:left w:type="dxa" w:w="110"/>
+              <w:bottom w:type="dxa" w:w="70"/>
+              <w:right w:type="dxa" w:w="110"/>
+            </w:tcMar>
+            <w:vAlign w:val="center"/>
+          </w:tcPr>
+          <w:p>
+            <w:pPr>
+              <w:spacing w:after="0" w:before="0"/>
+            </w:pPr>
+            <w:r>
+              <w:rPr>
+                <w:rFonts w:ascii="Arial" w:cs="Arial" w:eastAsia="Arial" w:hAnsi="Arial"/>
+                <w:color w:val="1B2118"/>
+                <w:sz w:val="18"/>
+                <w:szCs w:val="18"/>
+              </w:rPr>
+              <w:t xml:space="preserve">19/10/2026</w:t>
+            </w:r>
+          </w:p>
+        </w:tc>
+        <w:tc>
+          <w:tcPr>
+            <w:tcW w:type="dxa" w:w="5538"/>
+            <w:tcBorders>
+              <w:top w:val="single" w:color="D9D4C5" w:sz="4"/>
+              <w:left w:val="single" w:color="D9D4C5" w:sz="4"/>
+              <w:bottom w:val="single" w:color="D9D4C5" w:sz="4"/>
+              <w:right w:val="single" w:color="D9D4C5" w:sz="4"/>
+            </w:tcBorders>
+            <w:tcMar>
+              <w:top w:type="dxa" w:w="70"/>
+              <w:left w:type="dxa" w:w="110"/>
+              <w:bottom w:type="dxa" w:w="70"/>
+              <w:right w:type="dxa" w:w="110"/>
+            </w:tcMar>
+            <w:vAlign w:val="center"/>
+          </w:tcPr>
+          <w:p>
+            <w:pPr>
+              <w:spacing w:after="0" w:before="0"/>
+            </w:pPr>
+            <w:r>
+              <w:rPr>
+                <w:rFonts w:ascii="Arial" w:cs="Arial" w:eastAsia="Arial" w:hAnsi="Arial"/>
+                <w:color w:val="1B2118"/>
+                <w:sz w:val="18"/>
+                <w:szCs w:val="18"/>
+              </w:rPr>
+              <w:t xml:space="preserve">Funzione assistente e chiave ANTHROPIC_API_KEY; Claude Console tra i servizi; script 01-31.</w:t>
+            </w:r>
+          </w:p>
+        </w:tc>
+        <w:tc>
+          <w:tcPr>
+            <w:tcW w:type="dxa" w:w="2000"/>
+            <w:tcBorders>
+              <w:top w:val="single" w:color="D9D4C5" w:sz="4"/>
+              <w:left w:val="single" w:color="D9D4C5" w:sz="4"/>
+              <w:bottom w:val="single" w:color="D9D4C5" w:sz="4"/>
+              <w:right w:val="single" w:color="D9D4C5" w:sz="4"/>
+            </w:tcBorders>
+            <w:tcMar>
+              <w:top w:type="dxa" w:w="70"/>
+              <w:left w:type="dxa" w:w="110"/>
+              <w:bottom w:type="dxa" w:w="70"/>
+              <w:right w:type="dxa" w:w="110"/>
+            </w:tcMar>
+            <w:vAlign w:val="center"/>
+          </w:tcPr>
+          <w:p>
+            <w:pPr>
+              <w:spacing w:after="0" w:before="0"/>
+            </w:pPr>
+            <w:r>
+              <w:rPr>
+                <w:rFonts w:ascii="Arial" w:cs="Arial" w:eastAsia="Arial" w:hAnsi="Arial"/>
+                <w:color w:val="1B2118"/>
+                <w:sz w:val="18"/>
+                <w:szCs w:val="18"/>
+              </w:rPr>
+              <w:t xml:space="preserve">Fondazione Operate</w:t>
+            </w:r>
+          </w:p>
+        </w:tc>
+      </w:tr>
+      <w:tr>
+        <w:trPr>
+          <w:cantSplit/>
+        </w:trPr>
+        <w:tc>
+          <w:tcPr>
+            <w:tcW w:type="dxa" w:w="800"/>
+            <w:tcBorders>
+              <w:top w:val="single" w:color="D9D4C5" w:sz="4"/>
+              <w:left w:val="single" w:color="D9D4C5" w:sz="4"/>
+              <w:bottom w:val="single" w:color="D9D4C5" w:sz="4"/>
+              <w:right w:val="single" w:color="D9D4C5" w:sz="4"/>
+            </w:tcBorders>
+            <w:shd w:fill="F6F4EE" w:color="auto" w:val="clear"/>
+            <w:tcMar>
+              <w:top w:type="dxa" w:w="70"/>
+              <w:left w:type="dxa" w:w="110"/>
+              <w:bottom w:type="dxa" w:w="70"/>
+              <w:right w:type="dxa" w:w="110"/>
+            </w:tcMar>
+            <w:vAlign w:val="center"/>
+          </w:tcPr>
+          <w:p>
+            <w:pPr>
+              <w:spacing w:after="0" w:before="0"/>
+            </w:pPr>
+            <w:r>
+              <w:rPr>
+                <w:rFonts w:ascii="Arial" w:cs="Arial" w:eastAsia="Arial" w:hAnsi="Arial"/>
+                <w:color w:val="1B2118"/>
+                <w:sz w:val="18"/>
+                <w:szCs w:val="18"/>
+              </w:rPr>
               <w:t xml:space="preserve">1.0</w:t>
             </w:r>
           </w:p>
@@ -732,6 +866,7 @@
               <w:bottom w:val="single" w:color="D9D4C5" w:sz="4"/>
               <w:right w:val="single" w:color="D9D4C5" w:sz="4"/>
             </w:tcBorders>
+            <w:shd w:fill="F6F4EE" w:color="auto" w:val="clear"/>
             <w:tcMar>
               <w:top w:type="dxa" w:w="70"/>
               <w:left w:type="dxa" w:w="110"/>
@@ -764,6 +899,7 @@
               <w:bottom w:val="single" w:color="D9D4C5" w:sz="4"/>
               <w:right w:val="single" w:color="D9D4C5" w:sz="4"/>
             </w:tcBorders>
+            <w:shd w:fill="F6F4EE" w:color="auto" w:val="clear"/>
             <w:tcMar>
               <w:top w:type="dxa" w:w="70"/>
               <w:left w:type="dxa" w:w="110"/>
@@ -796,6 +932,7 @@
               <w:bottom w:val="single" w:color="D9D4C5" w:sz="4"/>
               <w:right w:val="single" w:color="D9D4C5" w:sz="4"/>
             </w:tcBorders>
+            <w:shd w:fill="F6F4EE" w:color="auto" w:val="clear"/>
             <w:tcMar>
               <w:top w:type="dxa" w:w="70"/>
               <w:left w:type="dxa" w:w="110"/>
@@ -837,7 +974,7 @@
           <w:sz w:val="20"/>
           <w:szCs w:val="20"/>
         </w:rPr>
-        <w:t xml:space="preserve">Istruzioni alla revisione 1.0 del 19/10/2026. Si aggiornano quando cambiano servizi, piani, script del database, funzioni o chiavi; una copia è dentro ogni archivio di backup e la versione corrente si scarica dall'area Documentazione del portale (solo Amministratori).</w:t>
+        <w:t xml:space="preserve">Istruzioni alla revisione 1.1 del 19/10/2026. Si aggiornano quando cambiano servizi, piani, script del database, funzioni o chiavi; una copia è dentro ogni archivio di backup e la versione corrente si scarica dall'area Documentazione del portale (solo Amministratori).</w:t>
       </w:r>
     </w:p>
     <w:p>
@@ -2127,7 +2264,7 @@
           <w:sz w:val="21"/>
           <w:szCs w:val="21"/>
         </w:rPr>
-        <w:t xml:space="preserve">Il portale non ha un server proprio: è distribuito su cinque servizi. Sapere che cosa sta dove dice che cosa si perde e che cosa si recupera.</w:t>
+        <w:t xml:space="preserve">Il portale non ha un server proprio: è distribuito su sei servizi. Sapere che cosa sta dove dice che cosa si perde e che cosa si recupera.</w:t>
       </w:r>
     </w:p>
     <w:tbl>
@@ -2333,7 +2470,7 @@
                 <w:sz w:val="18"/>
                 <w:szCs w:val="18"/>
               </w:rPr>
-              <w:t xml:space="preserve">Tutto il codice, gli script del database (01-27), le funzioni del server, i manuali e la loro storia</w:t>
+              <w:t xml:space="preserve">Tutto il codice, gli script del database (01-31), le funzioni del server, i manuali e la loro storia</w:t>
             </w:r>
           </w:p>
         </w:tc>
@@ -2793,6 +2930,137 @@
                 <w:sz w:val="18"/>
                 <w:szCs w:val="18"/>
               </w:rPr>
+              <w:t xml:space="preserve">Claude Console</w:t>
+            </w:r>
+            <w:r>
+              <w:rPr>
+                <w:rFonts w:ascii="Arial" w:cs="Arial" w:eastAsia="Arial" w:hAnsi="Arial"/>
+                <w:color w:val="1B2118"/>
+                <w:sz w:val="18"/>
+                <w:szCs w:val="18"/>
+              </w:rPr>
+              <w:t xml:space="preserve"> di Anthropic (organizzazione «Luca's Individual Org», spazio di lavoro dedicato)</w:t>
+            </w:r>
+          </w:p>
+        </w:tc>
+        <w:tc>
+          <w:tcPr>
+            <w:tcW w:type="dxa" w:w="3213"/>
+            <w:tcBorders>
+              <w:top w:val="single" w:color="D9D4C5" w:sz="4"/>
+              <w:left w:val="single" w:color="D9D4C5" w:sz="4"/>
+              <w:bottom w:val="single" w:color="D9D4C5" w:sz="4"/>
+              <w:right w:val="single" w:color="D9D4C5" w:sz="4"/>
+            </w:tcBorders>
+            <w:tcMar>
+              <w:top w:type="dxa" w:w="70"/>
+              <w:left w:type="dxa" w:w="110"/>
+              <w:bottom w:type="dxa" w:w="70"/>
+              <w:right w:type="dxa" w:w="110"/>
+            </w:tcMar>
+            <w:vAlign w:val="center"/>
+          </w:tcPr>
+          <w:p>
+            <w:pPr>
+              <w:spacing w:after="0" w:before="0"/>
+            </w:pPr>
+            <w:r>
+              <w:rPr>
+                <w:rFonts w:ascii="Arial" w:cs="Arial" w:eastAsia="Arial" w:hAnsi="Arial"/>
+                <w:color w:val="1B2118"/>
+                <w:sz w:val="18"/>
+                <w:szCs w:val="18"/>
+              </w:rPr>
+              <w:t xml:space="preserve">Chiave API e crediti dell'assistente virtuale; nessun dato del portale</w:t>
+            </w:r>
+          </w:p>
+        </w:tc>
+        <w:tc>
+          <w:tcPr>
+            <w:tcW w:type="dxa" w:w="3212"/>
+            <w:tcBorders>
+              <w:top w:val="single" w:color="D9D4C5" w:sz="4"/>
+              <w:left w:val="single" w:color="D9D4C5" w:sz="4"/>
+              <w:bottom w:val="single" w:color="D9D4C5" w:sz="4"/>
+              <w:right w:val="single" w:color="D9D4C5" w:sz="4"/>
+            </w:tcBorders>
+            <w:tcMar>
+              <w:top w:type="dxa" w:w="70"/>
+              <w:left w:type="dxa" w:w="110"/>
+              <w:bottom w:type="dxa" w:w="70"/>
+              <w:right w:type="dxa" w:w="110"/>
+            </w:tcMar>
+            <w:vAlign w:val="center"/>
+          </w:tcPr>
+          <w:p>
+            <w:pPr>
+              <w:spacing w:after="0" w:before="0"/>
+            </w:pPr>
+            <w:r>
+              <w:rPr>
+                <w:rFonts w:ascii="Arial" w:cs="Arial" w:eastAsia="Arial" w:hAnsi="Arial"/>
+                <w:color w:val="1B2118"/>
+                <w:sz w:val="18"/>
+                <w:szCs w:val="18"/>
+              </w:rPr>
+              <w:t xml:space="preserve">Nuova chiave legata a un solo spazio di lavoro, poi aggiornare </w:t>
+            </w:r>
+            <w:r>
+              <w:rPr>
+                <w:rFonts w:ascii="Consolas" w:cs="Consolas" w:eastAsia="Consolas" w:hAnsi="Consolas"/>
+                <w:color w:val="2F5D3A"/>
+                <w:sz w:val="18"/>
+                <w:szCs w:val="18"/>
+              </w:rPr>
+              <w:t xml:space="preserve">ANTHROPIC_API_KEY</w:t>
+            </w:r>
+            <w:r>
+              <w:rPr>
+                <w:rFonts w:ascii="Arial" w:cs="Arial" w:eastAsia="Arial" w:hAnsi="Arial"/>
+                <w:color w:val="1B2118"/>
+                <w:sz w:val="18"/>
+                <w:szCs w:val="18"/>
+              </w:rPr>
+              <w:t xml:space="preserve"> in Supabase</w:t>
+            </w:r>
+          </w:p>
+        </w:tc>
+      </w:tr>
+      <w:tr>
+        <w:trPr>
+          <w:cantSplit/>
+        </w:trPr>
+        <w:tc>
+          <w:tcPr>
+            <w:tcW w:type="dxa" w:w="3213"/>
+            <w:tcBorders>
+              <w:top w:val="single" w:color="D9D4C5" w:sz="4"/>
+              <w:left w:val="single" w:color="D9D4C5" w:sz="4"/>
+              <w:bottom w:val="single" w:color="D9D4C5" w:sz="4"/>
+              <w:right w:val="single" w:color="D9D4C5" w:sz="4"/>
+            </w:tcBorders>
+            <w:shd w:fill="F6F4EE" w:color="auto" w:val="clear"/>
+            <w:tcMar>
+              <w:top w:type="dxa" w:w="70"/>
+              <w:left w:type="dxa" w:w="110"/>
+              <w:bottom w:type="dxa" w:w="70"/>
+              <w:right w:type="dxa" w:w="110"/>
+            </w:tcMar>
+            <w:vAlign w:val="center"/>
+          </w:tcPr>
+          <w:p>
+            <w:pPr>
+              <w:spacing w:after="0" w:before="0"/>
+            </w:pPr>
+            <w:r>
+              <w:rPr>
+                <w:rFonts w:ascii="Arial" w:cs="Arial" w:eastAsia="Arial" w:hAnsi="Arial"/>
+                <w:b/>
+                <w:bCs/>
+                <w:color w:val="1B2118"/>
+                <w:sz w:val="18"/>
+                <w:szCs w:val="18"/>
+              </w:rPr>
               <w:t xml:space="preserve">Claude</w:t>
             </w:r>
             <w:r>
@@ -2815,6 +3083,7 @@
               <w:bottom w:val="single" w:color="D9D4C5" w:sz="4"/>
               <w:right w:val="single" w:color="D9D4C5" w:sz="4"/>
             </w:tcBorders>
+            <w:shd w:fill="F6F4EE" w:color="auto" w:val="clear"/>
             <w:tcMar>
               <w:top w:type="dxa" w:w="70"/>
               <w:left w:type="dxa" w:w="110"/>
@@ -2847,6 +3116,7 @@
               <w:bottom w:val="single" w:color="D9D4C5" w:sz="4"/>
               <w:right w:val="single" w:color="D9D4C5" w:sz="4"/>
             </w:tcBorders>
+            <w:shd w:fill="F6F4EE" w:color="auto" w:val="clear"/>
             <w:tcMar>
               <w:top w:type="dxa" w:w="70"/>
               <w:left w:type="dxa" w:w="110"/>
@@ -7431,7 +7701,7 @@
           <w:sz w:val="21"/>
           <w:szCs w:val="21"/>
         </w:rPr>
-        <w:t xml:space="preserve">Create le cinque funzioni con lo </w:t>
+        <w:t xml:space="preserve">Create le sei funzioni con lo </w:t>
       </w:r>
       <w:r>
         <w:rPr>
@@ -7526,8 +7796,8 @@
         <w:tblLayout w:type="fixed"/>
       </w:tblPr>
       <w:tblGrid>
-        <w:gridCol w:w="3313"/>
-        <w:gridCol w:w="6325"/>
+        <w:gridCol w:w="3349"/>
+        <w:gridCol w:w="6289"/>
       </w:tblGrid>
       <w:tr>
         <w:trPr>
@@ -7535,7 +7805,7 @@
         </w:trPr>
         <w:tc>
           <w:tcPr>
-            <w:tcW w:type="dxa" w:w="3313"/>
+            <w:tcW w:type="dxa" w:w="3349"/>
             <w:tcBorders>
               <w:top w:val="single" w:color="D9D4C5" w:sz="4"/>
               <w:left w:val="single" w:color="D9D4C5" w:sz="4"/>
@@ -7570,7 +7840,7 @@
         </w:tc>
         <w:tc>
           <w:tcPr>
-            <w:tcW w:type="dxa" w:w="6325"/>
+            <w:tcW w:type="dxa" w:w="6289"/>
             <w:tcBorders>
               <w:top w:val="single" w:color="D9D4C5" w:sz="4"/>
               <w:left w:val="single" w:color="D9D4C5" w:sz="4"/>
@@ -7610,7 +7880,7 @@
         </w:trPr>
         <w:tc>
           <w:tcPr>
-            <w:tcW w:type="dxa" w:w="3313"/>
+            <w:tcW w:type="dxa" w:w="3349"/>
             <w:tcBorders>
               <w:top w:val="single" w:color="D9D4C5" w:sz="4"/>
               <w:left w:val="single" w:color="D9D4C5" w:sz="4"/>
@@ -7642,7 +7912,7 @@
         </w:tc>
         <w:tc>
           <w:tcPr>
-            <w:tcW w:type="dxa" w:w="6325"/>
+            <w:tcW w:type="dxa" w:w="6289"/>
             <w:tcBorders>
               <w:top w:val="single" w:color="D9D4C5" w:sz="4"/>
               <w:left w:val="single" w:color="D9D4C5" w:sz="4"/>
@@ -7679,7 +7949,7 @@
         </w:trPr>
         <w:tc>
           <w:tcPr>
-            <w:tcW w:type="dxa" w:w="3313"/>
+            <w:tcW w:type="dxa" w:w="3349"/>
             <w:tcBorders>
               <w:top w:val="single" w:color="D9D4C5" w:sz="4"/>
               <w:left w:val="single" w:color="D9D4C5" w:sz="4"/>
@@ -7712,7 +7982,7 @@
         </w:tc>
         <w:tc>
           <w:tcPr>
-            <w:tcW w:type="dxa" w:w="6325"/>
+            <w:tcW w:type="dxa" w:w="6289"/>
             <w:tcBorders>
               <w:top w:val="single" w:color="D9D4C5" w:sz="4"/>
               <w:left w:val="single" w:color="D9D4C5" w:sz="4"/>
@@ -7750,7 +8020,7 @@
         </w:trPr>
         <w:tc>
           <w:tcPr>
-            <w:tcW w:type="dxa" w:w="3313"/>
+            <w:tcW w:type="dxa" w:w="3349"/>
             <w:tcBorders>
               <w:top w:val="single" w:color="D9D4C5" w:sz="4"/>
               <w:left w:val="single" w:color="D9D4C5" w:sz="4"/>
@@ -7776,50 +8046,39 @@
                 <w:sz w:val="18"/>
                 <w:szCs w:val="18"/>
               </w:rPr>
-              <w:t xml:space="preserve">consultazione-pubblica</w:t>
-            </w:r>
-          </w:p>
-        </w:tc>
-        <w:tc>
-          <w:tcPr>
-            <w:tcW w:type="dxa" w:w="6325"/>
-            <w:tcBorders>
-              <w:top w:val="single" w:color="D9D4C5" w:sz="4"/>
-              <w:left w:val="single" w:color="D9D4C5" w:sz="4"/>
-              <w:bottom w:val="single" w:color="D9D4C5" w:sz="4"/>
-              <w:right w:val="single" w:color="D9D4C5" w:sz="4"/>
-            </w:tcBorders>
-            <w:tcMar>
-              <w:top w:type="dxa" w:w="70"/>
-              <w:left w:type="dxa" w:w="110"/>
-              <w:bottom w:type="dxa" w:w="70"/>
-              <w:right w:type="dxa" w:w="110"/>
-            </w:tcMar>
-            <w:vAlign w:val="center"/>
-          </w:tcPr>
-          <w:p>
-            <w:pPr>
-              <w:spacing w:after="0" w:before="0"/>
-            </w:pPr>
-            <w:r>
-              <w:rPr>
-                <w:rFonts w:ascii="Arial" w:cs="Arial" w:eastAsia="Arial" w:hAnsi="Arial"/>
-                <w:b/>
-                <w:bCs/>
+              <w:t xml:space="preserve">assistente</w:t>
+            </w:r>
+          </w:p>
+        </w:tc>
+        <w:tc>
+          <w:tcPr>
+            <w:tcW w:type="dxa" w:w="6289"/>
+            <w:tcBorders>
+              <w:top w:val="single" w:color="D9D4C5" w:sz="4"/>
+              <w:left w:val="single" w:color="D9D4C5" w:sz="4"/>
+              <w:bottom w:val="single" w:color="D9D4C5" w:sz="4"/>
+              <w:right w:val="single" w:color="D9D4C5" w:sz="4"/>
+            </w:tcBorders>
+            <w:tcMar>
+              <w:top w:type="dxa" w:w="70"/>
+              <w:left w:type="dxa" w:w="110"/>
+              <w:bottom w:type="dxa" w:w="70"/>
+              <w:right w:type="dxa" w:w="110"/>
+            </w:tcMar>
+            <w:vAlign w:val="center"/>
+          </w:tcPr>
+          <w:p>
+            <w:pPr>
+              <w:spacing w:after="0" w:before="0"/>
+            </w:pPr>
+            <w:r>
+              <w:rPr>
+                <w:rFonts w:ascii="Arial" w:cs="Arial" w:eastAsia="Arial" w:hAnsi="Arial"/>
                 <w:color w:val="1B2118"/>
                 <w:sz w:val="18"/>
                 <w:szCs w:val="18"/>
               </w:rPr>
-              <w:t xml:space="preserve">Disattivato</w:t>
-            </w:r>
-            <w:r>
-              <w:rPr>
-                <w:rFonts w:ascii="Arial" w:cs="Arial" w:eastAsia="Arial" w:hAnsi="Arial"/>
-                <w:color w:val="1B2118"/>
-                <w:sz w:val="18"/>
-                <w:szCs w:val="18"/>
-              </w:rPr>
-              <w:t xml:space="preserve"> (pagina pubblica senza accesso)</w:t>
+              <w:t xml:space="preserve">Attivo</w:t>
             </w:r>
           </w:p>
         </w:tc>
@@ -7830,7 +8089,7 @@
         </w:trPr>
         <w:tc>
           <w:tcPr>
-            <w:tcW w:type="dxa" w:w="3313"/>
+            <w:tcW w:type="dxa" w:w="3349"/>
             <w:tcBorders>
               <w:top w:val="single" w:color="D9D4C5" w:sz="4"/>
               <w:left w:val="single" w:color="D9D4C5" w:sz="4"/>
@@ -7857,13 +8116,13 @@
                 <w:sz w:val="18"/>
                 <w:szCs w:val="18"/>
               </w:rPr>
-              <w:t xml:space="preserve">recupera-password</w:t>
-            </w:r>
-          </w:p>
-        </w:tc>
-        <w:tc>
-          <w:tcPr>
-            <w:tcW w:type="dxa" w:w="6325"/>
+              <w:t xml:space="preserve">consultazione-pubblica</w:t>
+            </w:r>
+          </w:p>
+        </w:tc>
+        <w:tc>
+          <w:tcPr>
+            <w:tcW w:type="dxa" w:w="6289"/>
             <w:tcBorders>
               <w:top w:val="single" w:color="D9D4C5" w:sz="4"/>
               <w:left w:val="single" w:color="D9D4C5" w:sz="4"/>
@@ -7901,7 +8160,7 @@
                 <w:sz w:val="18"/>
                 <w:szCs w:val="18"/>
               </w:rPr>
-              <w:t xml:space="preserve"> (chi l'ha dimenticata non è entrato)</w:t>
+              <w:t xml:space="preserve"> (pagina pubblica senza accesso)</w:t>
             </w:r>
           </w:p>
         </w:tc>
@@ -7912,7 +8171,7 @@
         </w:trPr>
         <w:tc>
           <w:tcPr>
-            <w:tcW w:type="dxa" w:w="3313"/>
+            <w:tcW w:type="dxa" w:w="3349"/>
             <w:tcBorders>
               <w:top w:val="single" w:color="D9D4C5" w:sz="4"/>
               <w:left w:val="single" w:color="D9D4C5" w:sz="4"/>
@@ -7938,19 +8197,101 @@
                 <w:sz w:val="18"/>
                 <w:szCs w:val="18"/>
               </w:rPr>
+              <w:t xml:space="preserve">recupera-password</w:t>
+            </w:r>
+          </w:p>
+        </w:tc>
+        <w:tc>
+          <w:tcPr>
+            <w:tcW w:type="dxa" w:w="6289"/>
+            <w:tcBorders>
+              <w:top w:val="single" w:color="D9D4C5" w:sz="4"/>
+              <w:left w:val="single" w:color="D9D4C5" w:sz="4"/>
+              <w:bottom w:val="single" w:color="D9D4C5" w:sz="4"/>
+              <w:right w:val="single" w:color="D9D4C5" w:sz="4"/>
+            </w:tcBorders>
+            <w:tcMar>
+              <w:top w:type="dxa" w:w="70"/>
+              <w:left w:type="dxa" w:w="110"/>
+              <w:bottom w:type="dxa" w:w="70"/>
+              <w:right w:type="dxa" w:w="110"/>
+            </w:tcMar>
+            <w:vAlign w:val="center"/>
+          </w:tcPr>
+          <w:p>
+            <w:pPr>
+              <w:spacing w:after="0" w:before="0"/>
+            </w:pPr>
+            <w:r>
+              <w:rPr>
+                <w:rFonts w:ascii="Arial" w:cs="Arial" w:eastAsia="Arial" w:hAnsi="Arial"/>
+                <w:b/>
+                <w:bCs/>
+                <w:color w:val="1B2118"/>
+                <w:sz w:val="18"/>
+                <w:szCs w:val="18"/>
+              </w:rPr>
+              <w:t xml:space="preserve">Disattivato</w:t>
+            </w:r>
+            <w:r>
+              <w:rPr>
+                <w:rFonts w:ascii="Arial" w:cs="Arial" w:eastAsia="Arial" w:hAnsi="Arial"/>
+                <w:color w:val="1B2118"/>
+                <w:sz w:val="18"/>
+                <w:szCs w:val="18"/>
+              </w:rPr>
+              <w:t xml:space="preserve"> (chi l'ha dimenticata non è entrato)</w:t>
+            </w:r>
+          </w:p>
+        </w:tc>
+      </w:tr>
+      <w:tr>
+        <w:trPr>
+          <w:cantSplit/>
+        </w:trPr>
+        <w:tc>
+          <w:tcPr>
+            <w:tcW w:type="dxa" w:w="3349"/>
+            <w:tcBorders>
+              <w:top w:val="single" w:color="D9D4C5" w:sz="4"/>
+              <w:left w:val="single" w:color="D9D4C5" w:sz="4"/>
+              <w:bottom w:val="single" w:color="D9D4C5" w:sz="4"/>
+              <w:right w:val="single" w:color="D9D4C5" w:sz="4"/>
+            </w:tcBorders>
+            <w:shd w:fill="F6F4EE" w:color="auto" w:val="clear"/>
+            <w:tcMar>
+              <w:top w:type="dxa" w:w="70"/>
+              <w:left w:type="dxa" w:w="110"/>
+              <w:bottom w:type="dxa" w:w="70"/>
+              <w:right w:type="dxa" w:w="110"/>
+            </w:tcMar>
+            <w:vAlign w:val="center"/>
+          </w:tcPr>
+          <w:p>
+            <w:pPr>
+              <w:spacing w:after="0" w:before="0"/>
+            </w:pPr>
+            <w:r>
+              <w:rPr>
+                <w:rFonts w:ascii="Consolas" w:cs="Consolas" w:eastAsia="Consolas" w:hAnsi="Consolas"/>
+                <w:color w:val="2F5D3A"/>
+                <w:sz w:val="18"/>
+                <w:szCs w:val="18"/>
+              </w:rPr>
               <w:t xml:space="preserve">invia-email-notifica</w:t>
             </w:r>
           </w:p>
         </w:tc>
         <w:tc>
           <w:tcPr>
-            <w:tcW w:type="dxa" w:w="6325"/>
-            <w:tcBorders>
-              <w:top w:val="single" w:color="D9D4C5" w:sz="4"/>
-              <w:left w:val="single" w:color="D9D4C5" w:sz="4"/>
-              <w:bottom w:val="single" w:color="D9D4C5" w:sz="4"/>
-              <w:right w:val="single" w:color="D9D4C5" w:sz="4"/>
-            </w:tcBorders>
+            <w:tcW w:type="dxa" w:w="6289"/>
+            <w:tcBorders>
+              <w:top w:val="single" w:color="D9D4C5" w:sz="4"/>
+              <w:left w:val="single" w:color="D9D4C5" w:sz="4"/>
+              <w:bottom w:val="single" w:color="D9D4C5" w:sz="4"/>
+              <w:right w:val="single" w:color="D9D4C5" w:sz="4"/>
+            </w:tcBorders>
+            <w:shd w:fill="F6F4EE" w:color="auto" w:val="clear"/>
             <w:tcMar>
               <w:top w:type="dxa" w:w="70"/>
               <w:left w:type="dxa" w:w="110"/>
@@ -8136,7 +8477,55 @@
           <w:sz w:val="21"/>
           <w:szCs w:val="21"/>
         </w:rPr>
-        <w:t xml:space="preserve">: l'indirizzo del portale, se diverso da portale-cwp.vercel.app.</w:t>
+        <w:t xml:space="preserve">: l'indirizzo del portale, se diverso da portale-cwp.vercel.app;</w:t>
+      </w:r>
+    </w:p>
+    <w:p>
+      <w:pPr>
+        <w:pStyle w:val="ListParagraph"/>
+        <w:numPr>
+          <w:ilvl w:val="0"/>
+          <w:numId w:val="2"/>
+        </w:numPr>
+        <w:spacing w:after="70" w:line="290"/>
+      </w:pPr>
+      <w:r>
+        <w:rPr>
+          <w:rFonts w:ascii="Consolas" w:cs="Consolas" w:eastAsia="Consolas" w:hAnsi="Consolas"/>
+          <w:color w:val="2F5D3A"/>
+          <w:sz w:val="21"/>
+          <w:szCs w:val="21"/>
+        </w:rPr>
+        <w:t xml:space="preserve">ANTHROPIC_API_KEY</w:t>
+      </w:r>
+      <w:r>
+        <w:rPr>
+          <w:rFonts w:ascii="Arial" w:cs="Arial" w:eastAsia="Arial" w:hAnsi="Arial"/>
+          <w:color w:val="1B2118"/>
+          <w:sz w:val="21"/>
+          <w:szCs w:val="21"/>
+        </w:rPr>
+        <w:t xml:space="preserve">: chiave della Claude Console per l'assistente virtuale. Deve essere legata a </w:t>
+      </w:r>
+      <w:r>
+        <w:rPr>
+          <w:rFonts w:ascii="Arial" w:cs="Arial" w:eastAsia="Arial" w:hAnsi="Arial"/>
+          <w:b/>
+          <w:bCs/>
+          <w:color w:val="1B2118"/>
+          <w:sz w:val="21"/>
+          <w:szCs w:val="21"/>
+        </w:rPr>
+        <w:t xml:space="preserve">un solo spazio di lavoro</w:t>
+      </w:r>
+      <w:r>
+        <w:rPr>
+          <w:rFonts w:ascii="Arial" w:cs="Arial" w:eastAsia="Arial" w:hAnsi="Arial"/>
+          <w:color w:val="1B2118"/>
+          <w:sz w:val="21"/>
+          <w:szCs w:val="21"/>
+        </w:rPr>
+        <w:t xml:space="preserve"> (workspace): una chiave «per tutti gli spazi di lavoro» viene rifiutata. L'organizzazione della Console deve avere credito (crediti mensili del piano Max collegato oppure crediti acquistati).</w:t>
       </w:r>
     </w:p>
     <w:p>
@@ -9611,9 +10000,9 @@
         <w:tblLayout w:type="fixed"/>
       </w:tblPr>
       <w:tblGrid>
-        <w:gridCol w:w="3089"/>
-        <w:gridCol w:w="3010"/>
-        <w:gridCol w:w="3539"/>
+        <w:gridCol w:w="2570"/>
+        <w:gridCol w:w="3213"/>
+        <w:gridCol w:w="3855"/>
       </w:tblGrid>
       <w:tr>
         <w:trPr>
@@ -9621,7 +10010,7 @@
         </w:trPr>
         <w:tc>
           <w:tcPr>
-            <w:tcW w:type="dxa" w:w="3089"/>
+            <w:tcW w:type="dxa" w:w="2570"/>
             <w:tcBorders>
               <w:top w:val="single" w:color="D9D4C5" w:sz="4"/>
               <w:left w:val="single" w:color="D9D4C5" w:sz="4"/>
@@ -9656,7 +10045,7 @@
         </w:tc>
         <w:tc>
           <w:tcPr>
-            <w:tcW w:type="dxa" w:w="3010"/>
+            <w:tcW w:type="dxa" w:w="3213"/>
             <w:tcBorders>
               <w:top w:val="single" w:color="D9D4C5" w:sz="4"/>
               <w:left w:val="single" w:color="D9D4C5" w:sz="4"/>
@@ -9691,7 +10080,7 @@
         </w:tc>
         <w:tc>
           <w:tcPr>
-            <w:tcW w:type="dxa" w:w="3539"/>
+            <w:tcW w:type="dxa" w:w="3855"/>
             <w:tcBorders>
               <w:top w:val="single" w:color="D9D4C5" w:sz="4"/>
               <w:left w:val="single" w:color="D9D4C5" w:sz="4"/>
@@ -9731,7 +10120,7 @@
         </w:trPr>
         <w:tc>
           <w:tcPr>
-            <w:tcW w:type="dxa" w:w="3089"/>
+            <w:tcW w:type="dxa" w:w="2570"/>
             <w:tcBorders>
               <w:top w:val="single" w:color="D9D4C5" w:sz="4"/>
               <w:left w:val="single" w:color="D9D4C5" w:sz="4"/>
@@ -9763,7 +10152,7 @@
         </w:tc>
         <w:tc>
           <w:tcPr>
-            <w:tcW w:type="dxa" w:w="3010"/>
+            <w:tcW w:type="dxa" w:w="3213"/>
             <w:tcBorders>
               <w:top w:val="single" w:color="D9D4C5" w:sz="4"/>
               <w:left w:val="single" w:color="D9D4C5" w:sz="4"/>
@@ -9795,7 +10184,7 @@
         </w:tc>
         <w:tc>
           <w:tcPr>
-            <w:tcW w:type="dxa" w:w="3539"/>
+            <w:tcW w:type="dxa" w:w="3855"/>
             <w:tcBorders>
               <w:top w:val="single" w:color="D9D4C5" w:sz="4"/>
               <w:left w:val="single" w:color="D9D4C5" w:sz="4"/>
@@ -9832,7 +10221,7 @@
         </w:trPr>
         <w:tc>
           <w:tcPr>
-            <w:tcW w:type="dxa" w:w="3089"/>
+            <w:tcW w:type="dxa" w:w="2570"/>
             <w:tcBorders>
               <w:top w:val="single" w:color="D9D4C5" w:sz="4"/>
               <w:left w:val="single" w:color="D9D4C5" w:sz="4"/>
@@ -9865,7 +10254,7 @@
         </w:tc>
         <w:tc>
           <w:tcPr>
-            <w:tcW w:type="dxa" w:w="3010"/>
+            <w:tcW w:type="dxa" w:w="3213"/>
             <w:tcBorders>
               <w:top w:val="single" w:color="D9D4C5" w:sz="4"/>
               <w:left w:val="single" w:color="D9D4C5" w:sz="4"/>
@@ -9898,7 +10287,7 @@
         </w:tc>
         <w:tc>
           <w:tcPr>
-            <w:tcW w:type="dxa" w:w="3539"/>
+            <w:tcW w:type="dxa" w:w="3855"/>
             <w:tcBorders>
               <w:top w:val="single" w:color="D9D4C5" w:sz="4"/>
               <w:left w:val="single" w:color="D9D4C5" w:sz="4"/>
@@ -9936,7 +10325,7 @@
         </w:trPr>
         <w:tc>
           <w:tcPr>
-            <w:tcW w:type="dxa" w:w="3089"/>
+            <w:tcW w:type="dxa" w:w="2570"/>
             <w:tcBorders>
               <w:top w:val="single" w:color="D9D4C5" w:sz="4"/>
               <w:left w:val="single" w:color="D9D4C5" w:sz="4"/>
@@ -9968,7 +10357,7 @@
         </w:tc>
         <w:tc>
           <w:tcPr>
-            <w:tcW w:type="dxa" w:w="3010"/>
+            <w:tcW w:type="dxa" w:w="3213"/>
             <w:tcBorders>
               <w:top w:val="single" w:color="D9D4C5" w:sz="4"/>
               <w:left w:val="single" w:color="D9D4C5" w:sz="4"/>
@@ -10000,7 +10389,7 @@
         </w:tc>
         <w:tc>
           <w:tcPr>
-            <w:tcW w:type="dxa" w:w="3539"/>
+            <w:tcW w:type="dxa" w:w="3855"/>
             <w:tcBorders>
               <w:top w:val="single" w:color="D9D4C5" w:sz="4"/>
               <w:left w:val="single" w:color="D9D4C5" w:sz="4"/>
@@ -10037,7 +10426,7 @@
         </w:trPr>
         <w:tc>
           <w:tcPr>
-            <w:tcW w:type="dxa" w:w="3089"/>
+            <w:tcW w:type="dxa" w:w="2570"/>
             <w:tcBorders>
               <w:top w:val="single" w:color="D9D4C5" w:sz="4"/>
               <w:left w:val="single" w:color="D9D4C5" w:sz="4"/>
@@ -10070,7 +10459,7 @@
         </w:tc>
         <w:tc>
           <w:tcPr>
-            <w:tcW w:type="dxa" w:w="3010"/>
+            <w:tcW w:type="dxa" w:w="3213"/>
             <w:tcBorders>
               <w:top w:val="single" w:color="D9D4C5" w:sz="4"/>
               <w:left w:val="single" w:color="D9D4C5" w:sz="4"/>
@@ -10103,7 +10492,7 @@
         </w:tc>
         <w:tc>
           <w:tcPr>
-            <w:tcW w:type="dxa" w:w="3539"/>
+            <w:tcW w:type="dxa" w:w="3855"/>
             <w:tcBorders>
               <w:top w:val="single" w:color="D9D4C5" w:sz="4"/>
               <w:left w:val="single" w:color="D9D4C5" w:sz="4"/>
@@ -10141,7 +10530,7 @@
         </w:trPr>
         <w:tc>
           <w:tcPr>
-            <w:tcW w:type="dxa" w:w="3089"/>
+            <w:tcW w:type="dxa" w:w="2570"/>
             <w:tcBorders>
               <w:top w:val="single" w:color="D9D4C5" w:sz="4"/>
               <w:left w:val="single" w:color="D9D4C5" w:sz="4"/>
@@ -10173,7 +10562,7 @@
         </w:tc>
         <w:tc>
           <w:tcPr>
-            <w:tcW w:type="dxa" w:w="3010"/>
+            <w:tcW w:type="dxa" w:w="3213"/>
             <w:tcBorders>
               <w:top w:val="single" w:color="D9D4C5" w:sz="4"/>
               <w:left w:val="single" w:color="D9D4C5" w:sz="4"/>
@@ -10199,13 +10588,13 @@
                 <w:sz w:val="18"/>
                 <w:szCs w:val="18"/>
               </w:rPr>
-              <w:t xml:space="preserve">PORTALE_URL</w:t>
-            </w:r>
-          </w:p>
-        </w:tc>
-        <w:tc>
-          <w:tcPr>
-            <w:tcW w:type="dxa" w:w="3539"/>
+              <w:t xml:space="preserve">ANTHROPIC_API_KEY</w:t>
+            </w:r>
+          </w:p>
+        </w:tc>
+        <w:tc>
+          <w:tcPr>
+            <w:tcW w:type="dxa" w:w="3855"/>
             <w:tcBorders>
               <w:top w:val="single" w:color="D9D4C5" w:sz="4"/>
               <w:left w:val="single" w:color="D9D4C5" w:sz="4"/>
@@ -10231,7 +10620,7 @@
                 <w:sz w:val="18"/>
                 <w:szCs w:val="18"/>
               </w:rPr>
-              <w:t xml:space="preserve">Indirizzo del portale nei link delle email (facoltativo)</w:t>
+              <w:t xml:space="preserve">Assistente virtuale (chiave della Claude Console legata a un solo spazio di lavoro)</w:t>
             </w:r>
           </w:p>
         </w:tc>
@@ -10242,7 +10631,7 @@
         </w:trPr>
         <w:tc>
           <w:tcPr>
-            <w:tcW w:type="dxa" w:w="3089"/>
+            <w:tcW w:type="dxa" w:w="2570"/>
             <w:tcBorders>
               <w:top w:val="single" w:color="D9D4C5" w:sz="4"/>
               <w:left w:val="single" w:color="D9D4C5" w:sz="4"/>
@@ -10269,13 +10658,13 @@
                 <w:sz w:val="18"/>
                 <w:szCs w:val="18"/>
               </w:rPr>
-              <w:t xml:space="preserve">Supabase › Authentication › Emails</w:t>
-            </w:r>
-          </w:p>
-        </w:tc>
-        <w:tc>
-          <w:tcPr>
-            <w:tcW w:type="dxa" w:w="3010"/>
+              <w:t xml:space="preserve">Supabase › Edge Functions › Secrets</w:t>
+            </w:r>
+          </w:p>
+        </w:tc>
+        <w:tc>
+          <w:tcPr>
+            <w:tcW w:type="dxa" w:w="3213"/>
             <w:tcBorders>
               <w:top w:val="single" w:color="D9D4C5" w:sz="4"/>
               <w:left w:val="single" w:color="D9D4C5" w:sz="4"/>
@@ -10297,18 +10686,36 @@
             </w:pPr>
             <w:r>
               <w:rPr>
+                <w:rFonts w:ascii="Consolas" w:cs="Consolas" w:eastAsia="Consolas" w:hAnsi="Consolas"/>
+                <w:color w:val="2F5D3A"/>
+                <w:sz w:val="18"/>
+                <w:szCs w:val="18"/>
+              </w:rPr>
+              <w:t xml:space="preserve">ASSISTENTE_LIMITE_GIORNO</w:t>
+            </w:r>
+            <w:r>
+              <w:rPr>
                 <w:rFonts w:ascii="Arial" w:cs="Arial" w:eastAsia="Arial" w:hAnsi="Arial"/>
                 <w:color w:val="1B2118"/>
                 <w:sz w:val="18"/>
                 <w:szCs w:val="18"/>
               </w:rPr>
-              <w:t xml:space="preserve">Password SMTP</w:t>
-            </w:r>
-          </w:p>
-        </w:tc>
-        <w:tc>
-          <w:tcPr>
-            <w:tcW w:type="dxa" w:w="3539"/>
+              <w:t xml:space="preserve">, </w:t>
+            </w:r>
+            <w:r>
+              <w:rPr>
+                <w:rFonts w:ascii="Consolas" w:cs="Consolas" w:eastAsia="Consolas" w:hAnsi="Consolas"/>
+                <w:color w:val="2F5D3A"/>
+                <w:sz w:val="18"/>
+                <w:szCs w:val="18"/>
+              </w:rPr>
+              <w:t xml:space="preserve">ASSISTENTE_MODELLO</w:t>
+            </w:r>
+          </w:p>
+        </w:tc>
+        <w:tc>
+          <w:tcPr>
+            <w:tcW w:type="dxa" w:w="3855"/>
             <w:tcBorders>
               <w:top w:val="single" w:color="D9D4C5" w:sz="4"/>
               <w:left w:val="single" w:color="D9D4C5" w:sz="4"/>
@@ -10335,7 +10742,7 @@
                 <w:sz w:val="18"/>
                 <w:szCs w:val="18"/>
               </w:rPr>
-              <w:t xml:space="preserve">La chiave API di Resend</w:t>
+              <w:t xml:space="preserve">Facoltativi: domande al giorno per utente (40) e modello (Claude Haiku 5.5)</w:t>
             </w:r>
           </w:p>
         </w:tc>
@@ -10346,7 +10753,7 @@
         </w:trPr>
         <w:tc>
           <w:tcPr>
-            <w:tcW w:type="dxa" w:w="3089"/>
+            <w:tcW w:type="dxa" w:w="2570"/>
             <w:tcBorders>
               <w:top w:val="single" w:color="D9D4C5" w:sz="4"/>
               <w:left w:val="single" w:color="D9D4C5" w:sz="4"/>
@@ -10372,13 +10779,45 @@
                 <w:sz w:val="18"/>
                 <w:szCs w:val="18"/>
               </w:rPr>
-              <w:t xml:space="preserve">Supabase › Authentication › URL Configuration</w:t>
-            </w:r>
-          </w:p>
-        </w:tc>
-        <w:tc>
-          <w:tcPr>
-            <w:tcW w:type="dxa" w:w="3010"/>
+              <w:t xml:space="preserve">Supabase › Edge Functions › Secrets</w:t>
+            </w:r>
+          </w:p>
+        </w:tc>
+        <w:tc>
+          <w:tcPr>
+            <w:tcW w:type="dxa" w:w="3213"/>
+            <w:tcBorders>
+              <w:top w:val="single" w:color="D9D4C5" w:sz="4"/>
+              <w:left w:val="single" w:color="D9D4C5" w:sz="4"/>
+              <w:bottom w:val="single" w:color="D9D4C5" w:sz="4"/>
+              <w:right w:val="single" w:color="D9D4C5" w:sz="4"/>
+            </w:tcBorders>
+            <w:tcMar>
+              <w:top w:type="dxa" w:w="70"/>
+              <w:left w:type="dxa" w:w="110"/>
+              <w:bottom w:type="dxa" w:w="70"/>
+              <w:right w:type="dxa" w:w="110"/>
+            </w:tcMar>
+            <w:vAlign w:val="center"/>
+          </w:tcPr>
+          <w:p>
+            <w:pPr>
+              <w:spacing w:after="0" w:before="0"/>
+            </w:pPr>
+            <w:r>
+              <w:rPr>
+                <w:rFonts w:ascii="Consolas" w:cs="Consolas" w:eastAsia="Consolas" w:hAnsi="Consolas"/>
+                <w:color w:val="2F5D3A"/>
+                <w:sz w:val="18"/>
+                <w:szCs w:val="18"/>
+              </w:rPr>
+              <w:t xml:space="preserve">PORTALE_URL</w:t>
+            </w:r>
+          </w:p>
+        </w:tc>
+        <w:tc>
+          <w:tcPr>
+            <w:tcW w:type="dxa" w:w="3855"/>
             <w:tcBorders>
               <w:top w:val="single" w:color="D9D4C5" w:sz="4"/>
               <w:left w:val="single" w:color="D9D4C5" w:sz="4"/>
@@ -10404,39 +10843,7 @@
                 <w:sz w:val="18"/>
                 <w:szCs w:val="18"/>
               </w:rPr>
-              <w:t xml:space="preserve">Site URL e Redirect URL</w:t>
-            </w:r>
-          </w:p>
-        </w:tc>
-        <w:tc>
-          <w:tcPr>
-            <w:tcW w:type="dxa" w:w="3539"/>
-            <w:tcBorders>
-              <w:top w:val="single" w:color="D9D4C5" w:sz="4"/>
-              <w:left w:val="single" w:color="D9D4C5" w:sz="4"/>
-              <w:bottom w:val="single" w:color="D9D4C5" w:sz="4"/>
-              <w:right w:val="single" w:color="D9D4C5" w:sz="4"/>
-            </w:tcBorders>
-            <w:tcMar>
-              <w:top w:type="dxa" w:w="70"/>
-              <w:left w:type="dxa" w:w="110"/>
-              <w:bottom w:type="dxa" w:w="70"/>
-              <w:right w:type="dxa" w:w="110"/>
-            </w:tcMar>
-            <w:vAlign w:val="center"/>
-          </w:tcPr>
-          <w:p>
-            <w:pPr>
-              <w:spacing w:after="0" w:before="0"/>
-            </w:pPr>
-            <w:r>
-              <w:rPr>
-                <w:rFonts w:ascii="Arial" w:cs="Arial" w:eastAsia="Arial" w:hAnsi="Arial"/>
-                <w:color w:val="1B2118"/>
-                <w:sz w:val="18"/>
-                <w:szCs w:val="18"/>
-              </w:rPr>
-              <w:t xml:space="preserve">Ritorno al portale dai link delle email</w:t>
+              <w:t xml:space="preserve">Indirizzo del portale nei link delle email (facoltativo)</w:t>
             </w:r>
           </w:p>
         </w:tc>
@@ -10447,7 +10854,7 @@
         </w:trPr>
         <w:tc>
           <w:tcPr>
-            <w:tcW w:type="dxa" w:w="3089"/>
+            <w:tcW w:type="dxa" w:w="2570"/>
             <w:tcBorders>
               <w:top w:val="single" w:color="D9D4C5" w:sz="4"/>
               <w:left w:val="single" w:color="D9D4C5" w:sz="4"/>
@@ -10474,22 +10881,13 @@
                 <w:sz w:val="18"/>
                 <w:szCs w:val="18"/>
               </w:rPr>
-              <w:t xml:space="preserve">Supabase › database, tabella </w:t>
-            </w:r>
-            <w:r>
-              <w:rPr>
-                <w:rFonts w:ascii="Consolas" w:cs="Consolas" w:eastAsia="Consolas" w:hAnsi="Consolas"/>
-                <w:color w:val="2F5D3A"/>
-                <w:sz w:val="18"/>
-                <w:szCs w:val="18"/>
-              </w:rPr>
-              <w:t xml:space="preserve">impostazione</w:t>
-            </w:r>
-          </w:p>
-        </w:tc>
-        <w:tc>
-          <w:tcPr>
-            <w:tcW w:type="dxa" w:w="3010"/>
+              <w:t xml:space="preserve">Supabase › Authentication › Emails</w:t>
+            </w:r>
+          </w:p>
+        </w:tc>
+        <w:tc>
+          <w:tcPr>
+            <w:tcW w:type="dxa" w:w="3213"/>
             <w:tcBorders>
               <w:top w:val="single" w:color="D9D4C5" w:sz="4"/>
               <w:left w:val="single" w:color="D9D4C5" w:sz="4"/>
@@ -10511,18 +10909,18 @@
             </w:pPr>
             <w:r>
               <w:rPr>
-                <w:rFonts w:ascii="Consolas" w:cs="Consolas" w:eastAsia="Consolas" w:hAnsi="Consolas"/>
-                <w:color w:val="2F5D3A"/>
-                <w:sz w:val="18"/>
-                <w:szCs w:val="18"/>
-              </w:rPr>
-              <w:t xml:space="preserve">url_email_notifiche</w:t>
-            </w:r>
-          </w:p>
-        </w:tc>
-        <w:tc>
-          <w:tcPr>
-            <w:tcW w:type="dxa" w:w="3539"/>
+                <w:rFonts w:ascii="Arial" w:cs="Arial" w:eastAsia="Arial" w:hAnsi="Arial"/>
+                <w:color w:val="1B2118"/>
+                <w:sz w:val="18"/>
+                <w:szCs w:val="18"/>
+              </w:rPr>
+              <w:t xml:space="preserve">Password SMTP</w:t>
+            </w:r>
+          </w:p>
+        </w:tc>
+        <w:tc>
+          <w:tcPr>
+            <w:tcW w:type="dxa" w:w="3855"/>
             <w:tcBorders>
               <w:top w:val="single" w:color="D9D4C5" w:sz="4"/>
               <w:left w:val="single" w:color="D9D4C5" w:sz="4"/>
@@ -10549,16 +10947,7 @@
                 <w:sz w:val="18"/>
                 <w:szCs w:val="18"/>
               </w:rPr>
-              <w:t xml:space="preserve">Indirizzo della funzione </w:t>
-            </w:r>
-            <w:r>
-              <w:rPr>
-                <w:rFonts w:ascii="Consolas" w:cs="Consolas" w:eastAsia="Consolas" w:hAnsi="Consolas"/>
-                <w:color w:val="2F5D3A"/>
-                <w:sz w:val="18"/>
-                <w:szCs w:val="18"/>
-              </w:rPr>
-              <w:t xml:space="preserve">invia-email-notifica</w:t>
+              <w:t xml:space="preserve">La chiave API di Resend</w:t>
             </w:r>
           </w:p>
         </w:tc>
@@ -10569,7 +10958,7 @@
         </w:trPr>
         <w:tc>
           <w:tcPr>
-            <w:tcW w:type="dxa" w:w="3089"/>
+            <w:tcW w:type="dxa" w:w="2570"/>
             <w:tcBorders>
               <w:top w:val="single" w:color="D9D4C5" w:sz="4"/>
               <w:left w:val="single" w:color="D9D4C5" w:sz="4"/>
@@ -10595,54 +10984,13 @@
                 <w:sz w:val="18"/>
                 <w:szCs w:val="18"/>
               </w:rPr>
-              <w:t xml:space="preserve">Supabase › database, tabella </w:t>
-            </w:r>
-            <w:r>
-              <w:rPr>
-                <w:rFonts w:ascii="Consolas" w:cs="Consolas" w:eastAsia="Consolas" w:hAnsi="Consolas"/>
-                <w:color w:val="2F5D3A"/>
-                <w:sz w:val="18"/>
-                <w:szCs w:val="18"/>
-              </w:rPr>
-              <w:t xml:space="preserve">impostazione</w:t>
-            </w:r>
-          </w:p>
-        </w:tc>
-        <w:tc>
-          <w:tcPr>
-            <w:tcW w:type="dxa" w:w="3010"/>
-            <w:tcBorders>
-              <w:top w:val="single" w:color="D9D4C5" w:sz="4"/>
-              <w:left w:val="single" w:color="D9D4C5" w:sz="4"/>
-              <w:bottom w:val="single" w:color="D9D4C5" w:sz="4"/>
-              <w:right w:val="single" w:color="D9D4C5" w:sz="4"/>
-            </w:tcBorders>
-            <w:tcMar>
-              <w:top w:type="dxa" w:w="70"/>
-              <w:left w:type="dxa" w:w="110"/>
-              <w:bottom w:type="dxa" w:w="70"/>
-              <w:right w:type="dxa" w:w="110"/>
-            </w:tcMar>
-            <w:vAlign w:val="center"/>
-          </w:tcPr>
-          <w:p>
-            <w:pPr>
-              <w:spacing w:after="0" w:before="0"/>
-            </w:pPr>
-            <w:r>
-              <w:rPr>
-                <w:rFonts w:ascii="Consolas" w:cs="Consolas" w:eastAsia="Consolas" w:hAnsi="Consolas"/>
-                <w:color w:val="2F5D3A"/>
-                <w:sz w:val="18"/>
-                <w:szCs w:val="18"/>
-              </w:rPr>
-              <w:t xml:space="preserve">mfa_obbligatoria</w:t>
-            </w:r>
-          </w:p>
-        </w:tc>
-        <w:tc>
-          <w:tcPr>
-            <w:tcW w:type="dxa" w:w="3539"/>
+              <w:t xml:space="preserve">Supabase › Authentication › URL Configuration</w:t>
+            </w:r>
+          </w:p>
+        </w:tc>
+        <w:tc>
+          <w:tcPr>
+            <w:tcW w:type="dxa" w:w="3213"/>
             <w:tcBorders>
               <w:top w:val="single" w:color="D9D4C5" w:sz="4"/>
               <w:left w:val="single" w:color="D9D4C5" w:sz="4"/>
@@ -10668,7 +11016,39 @@
                 <w:sz w:val="18"/>
                 <w:szCs w:val="18"/>
               </w:rPr>
-              <w:t xml:space="preserve">Verifica in due passaggi per lo staff (oggi spenta)</w:t>
+              <w:t xml:space="preserve">Site URL e Redirect URL</w:t>
+            </w:r>
+          </w:p>
+        </w:tc>
+        <w:tc>
+          <w:tcPr>
+            <w:tcW w:type="dxa" w:w="3855"/>
+            <w:tcBorders>
+              <w:top w:val="single" w:color="D9D4C5" w:sz="4"/>
+              <w:left w:val="single" w:color="D9D4C5" w:sz="4"/>
+              <w:bottom w:val="single" w:color="D9D4C5" w:sz="4"/>
+              <w:right w:val="single" w:color="D9D4C5" w:sz="4"/>
+            </w:tcBorders>
+            <w:tcMar>
+              <w:top w:type="dxa" w:w="70"/>
+              <w:left w:type="dxa" w:w="110"/>
+              <w:bottom w:type="dxa" w:w="70"/>
+              <w:right w:type="dxa" w:w="110"/>
+            </w:tcMar>
+            <w:vAlign w:val="center"/>
+          </w:tcPr>
+          <w:p>
+            <w:pPr>
+              <w:spacing w:after="0" w:before="0"/>
+            </w:pPr>
+            <w:r>
+              <w:rPr>
+                <w:rFonts w:ascii="Arial" w:cs="Arial" w:eastAsia="Arial" w:hAnsi="Arial"/>
+                <w:color w:val="1B2118"/>
+                <w:sz w:val="18"/>
+                <w:szCs w:val="18"/>
+              </w:rPr>
+              <w:t xml:space="preserve">Ritorno al portale dai link delle email</w:t>
             </w:r>
           </w:p>
         </w:tc>
@@ -10679,7 +11059,7 @@
         </w:trPr>
         <w:tc>
           <w:tcPr>
-            <w:tcW w:type="dxa" w:w="3089"/>
+            <w:tcW w:type="dxa" w:w="2570"/>
             <w:tcBorders>
               <w:top w:val="single" w:color="D9D4C5" w:sz="4"/>
               <w:left w:val="single" w:color="D9D4C5" w:sz="4"/>
@@ -10706,13 +11086,22 @@
                 <w:sz w:val="18"/>
                 <w:szCs w:val="18"/>
               </w:rPr>
-              <w:t xml:space="preserve">Supabase › Project Settings</w:t>
-            </w:r>
-          </w:p>
-        </w:tc>
-        <w:tc>
-          <w:tcPr>
-            <w:tcW w:type="dxa" w:w="3010"/>
+              <w:t xml:space="preserve">Supabase › database, tabella </w:t>
+            </w:r>
+            <w:r>
+              <w:rPr>
+                <w:rFonts w:ascii="Consolas" w:cs="Consolas" w:eastAsia="Consolas" w:hAnsi="Consolas"/>
+                <w:color w:val="2F5D3A"/>
+                <w:sz w:val="18"/>
+                <w:szCs w:val="18"/>
+              </w:rPr>
+              <w:t xml:space="preserve">impostazione</w:t>
+            </w:r>
+          </w:p>
+        </w:tc>
+        <w:tc>
+          <w:tcPr>
+            <w:tcW w:type="dxa" w:w="3213"/>
             <w:tcBorders>
               <w:top w:val="single" w:color="D9D4C5" w:sz="4"/>
               <w:left w:val="single" w:color="D9D4C5" w:sz="4"/>
@@ -10734,45 +11123,54 @@
             </w:pPr>
             <w:r>
               <w:rPr>
+                <w:rFonts w:ascii="Consolas" w:cs="Consolas" w:eastAsia="Consolas" w:hAnsi="Consolas"/>
+                <w:color w:val="2F5D3A"/>
+                <w:sz w:val="18"/>
+                <w:szCs w:val="18"/>
+              </w:rPr>
+              <w:t xml:space="preserve">url_email_notifiche</w:t>
+            </w:r>
+          </w:p>
+        </w:tc>
+        <w:tc>
+          <w:tcPr>
+            <w:tcW w:type="dxa" w:w="3855"/>
+            <w:tcBorders>
+              <w:top w:val="single" w:color="D9D4C5" w:sz="4"/>
+              <w:left w:val="single" w:color="D9D4C5" w:sz="4"/>
+              <w:bottom w:val="single" w:color="D9D4C5" w:sz="4"/>
+              <w:right w:val="single" w:color="D9D4C5" w:sz="4"/>
+            </w:tcBorders>
+            <w:shd w:fill="F6F4EE" w:color="auto" w:val="clear"/>
+            <w:tcMar>
+              <w:top w:type="dxa" w:w="70"/>
+              <w:left w:type="dxa" w:w="110"/>
+              <w:bottom w:type="dxa" w:w="70"/>
+              <w:right w:type="dxa" w:w="110"/>
+            </w:tcMar>
+            <w:vAlign w:val="center"/>
+          </w:tcPr>
+          <w:p>
+            <w:pPr>
+              <w:spacing w:after="0" w:before="0"/>
+            </w:pPr>
+            <w:r>
+              <w:rPr>
                 <w:rFonts w:ascii="Arial" w:cs="Arial" w:eastAsia="Arial" w:hAnsi="Arial"/>
                 <w:color w:val="1B2118"/>
                 <w:sz w:val="18"/>
                 <w:szCs w:val="18"/>
               </w:rPr>
-              <w:t xml:space="preserve">Password del database</w:t>
-            </w:r>
-          </w:p>
-        </w:tc>
-        <w:tc>
-          <w:tcPr>
-            <w:tcW w:type="dxa" w:w="3539"/>
-            <w:tcBorders>
-              <w:top w:val="single" w:color="D9D4C5" w:sz="4"/>
-              <w:left w:val="single" w:color="D9D4C5" w:sz="4"/>
-              <w:bottom w:val="single" w:color="D9D4C5" w:sz="4"/>
-              <w:right w:val="single" w:color="D9D4C5" w:sz="4"/>
-            </w:tcBorders>
-            <w:shd w:fill="F6F4EE" w:color="auto" w:val="clear"/>
-            <w:tcMar>
-              <w:top w:type="dxa" w:w="70"/>
-              <w:left w:type="dxa" w:w="110"/>
-              <w:bottom w:type="dxa" w:w="70"/>
-              <w:right w:type="dxa" w:w="110"/>
-            </w:tcMar>
-            <w:vAlign w:val="center"/>
-          </w:tcPr>
-          <w:p>
-            <w:pPr>
-              <w:spacing w:after="0" w:before="0"/>
-            </w:pPr>
-            <w:r>
-              <w:rPr>
-                <w:rFonts w:ascii="Arial" w:cs="Arial" w:eastAsia="Arial" w:hAnsi="Arial"/>
-                <w:color w:val="1B2118"/>
-                <w:sz w:val="18"/>
-                <w:szCs w:val="18"/>
-              </w:rPr>
-              <w:t xml:space="preserve">Copie manuali e ripristini</w:t>
+              <w:t xml:space="preserve">Indirizzo della funzione </w:t>
+            </w:r>
+            <w:r>
+              <w:rPr>
+                <w:rFonts w:ascii="Consolas" w:cs="Consolas" w:eastAsia="Consolas" w:hAnsi="Consolas"/>
+                <w:color w:val="2F5D3A"/>
+                <w:sz w:val="18"/>
+                <w:szCs w:val="18"/>
+              </w:rPr>
+              <w:t xml:space="preserve">invia-email-notifica</w:t>
             </w:r>
           </w:p>
         </w:tc>
@@ -10783,7 +11181,7 @@
         </w:trPr>
         <w:tc>
           <w:tcPr>
-            <w:tcW w:type="dxa" w:w="3089"/>
+            <w:tcW w:type="dxa" w:w="2570"/>
             <w:tcBorders>
               <w:top w:val="single" w:color="D9D4C5" w:sz="4"/>
               <w:left w:val="single" w:color="D9D4C5" w:sz="4"/>
@@ -10809,13 +11207,227 @@
                 <w:sz w:val="18"/>
                 <w:szCs w:val="18"/>
               </w:rPr>
+              <w:t xml:space="preserve">Supabase › database, tabella </w:t>
+            </w:r>
+            <w:r>
+              <w:rPr>
+                <w:rFonts w:ascii="Consolas" w:cs="Consolas" w:eastAsia="Consolas" w:hAnsi="Consolas"/>
+                <w:color w:val="2F5D3A"/>
+                <w:sz w:val="18"/>
+                <w:szCs w:val="18"/>
+              </w:rPr>
+              <w:t xml:space="preserve">impostazione</w:t>
+            </w:r>
+          </w:p>
+        </w:tc>
+        <w:tc>
+          <w:tcPr>
+            <w:tcW w:type="dxa" w:w="3213"/>
+            <w:tcBorders>
+              <w:top w:val="single" w:color="D9D4C5" w:sz="4"/>
+              <w:left w:val="single" w:color="D9D4C5" w:sz="4"/>
+              <w:bottom w:val="single" w:color="D9D4C5" w:sz="4"/>
+              <w:right w:val="single" w:color="D9D4C5" w:sz="4"/>
+            </w:tcBorders>
+            <w:tcMar>
+              <w:top w:type="dxa" w:w="70"/>
+              <w:left w:type="dxa" w:w="110"/>
+              <w:bottom w:type="dxa" w:w="70"/>
+              <w:right w:type="dxa" w:w="110"/>
+            </w:tcMar>
+            <w:vAlign w:val="center"/>
+          </w:tcPr>
+          <w:p>
+            <w:pPr>
+              <w:spacing w:after="0" w:before="0"/>
+            </w:pPr>
+            <w:r>
+              <w:rPr>
+                <w:rFonts w:ascii="Consolas" w:cs="Consolas" w:eastAsia="Consolas" w:hAnsi="Consolas"/>
+                <w:color w:val="2F5D3A"/>
+                <w:sz w:val="18"/>
+                <w:szCs w:val="18"/>
+              </w:rPr>
+              <w:t xml:space="preserve">mfa_obbligatoria</w:t>
+            </w:r>
+          </w:p>
+        </w:tc>
+        <w:tc>
+          <w:tcPr>
+            <w:tcW w:type="dxa" w:w="3855"/>
+            <w:tcBorders>
+              <w:top w:val="single" w:color="D9D4C5" w:sz="4"/>
+              <w:left w:val="single" w:color="D9D4C5" w:sz="4"/>
+              <w:bottom w:val="single" w:color="D9D4C5" w:sz="4"/>
+              <w:right w:val="single" w:color="D9D4C5" w:sz="4"/>
+            </w:tcBorders>
+            <w:tcMar>
+              <w:top w:type="dxa" w:w="70"/>
+              <w:left w:type="dxa" w:w="110"/>
+              <w:bottom w:type="dxa" w:w="70"/>
+              <w:right w:type="dxa" w:w="110"/>
+            </w:tcMar>
+            <w:vAlign w:val="center"/>
+          </w:tcPr>
+          <w:p>
+            <w:pPr>
+              <w:spacing w:after="0" w:before="0"/>
+            </w:pPr>
+            <w:r>
+              <w:rPr>
+                <w:rFonts w:ascii="Arial" w:cs="Arial" w:eastAsia="Arial" w:hAnsi="Arial"/>
+                <w:color w:val="1B2118"/>
+                <w:sz w:val="18"/>
+                <w:szCs w:val="18"/>
+              </w:rPr>
+              <w:t xml:space="preserve">Verifica in due passaggi per lo staff (oggi spenta)</w:t>
+            </w:r>
+          </w:p>
+        </w:tc>
+      </w:tr>
+      <w:tr>
+        <w:trPr>
+          <w:cantSplit/>
+        </w:trPr>
+        <w:tc>
+          <w:tcPr>
+            <w:tcW w:type="dxa" w:w="2570"/>
+            <w:tcBorders>
+              <w:top w:val="single" w:color="D9D4C5" w:sz="4"/>
+              <w:left w:val="single" w:color="D9D4C5" w:sz="4"/>
+              <w:bottom w:val="single" w:color="D9D4C5" w:sz="4"/>
+              <w:right w:val="single" w:color="D9D4C5" w:sz="4"/>
+            </w:tcBorders>
+            <w:shd w:fill="F6F4EE" w:color="auto" w:val="clear"/>
+            <w:tcMar>
+              <w:top w:type="dxa" w:w="70"/>
+              <w:left w:type="dxa" w:w="110"/>
+              <w:bottom w:type="dxa" w:w="70"/>
+              <w:right w:type="dxa" w:w="110"/>
+            </w:tcMar>
+            <w:vAlign w:val="center"/>
+          </w:tcPr>
+          <w:p>
+            <w:pPr>
+              <w:spacing w:after="0" w:before="0"/>
+            </w:pPr>
+            <w:r>
+              <w:rPr>
+                <w:rFonts w:ascii="Arial" w:cs="Arial" w:eastAsia="Arial" w:hAnsi="Arial"/>
+                <w:color w:val="1B2118"/>
+                <w:sz w:val="18"/>
+                <w:szCs w:val="18"/>
+              </w:rPr>
+              <w:t xml:space="preserve">Supabase › Project Settings</w:t>
+            </w:r>
+          </w:p>
+        </w:tc>
+        <w:tc>
+          <w:tcPr>
+            <w:tcW w:type="dxa" w:w="3213"/>
+            <w:tcBorders>
+              <w:top w:val="single" w:color="D9D4C5" w:sz="4"/>
+              <w:left w:val="single" w:color="D9D4C5" w:sz="4"/>
+              <w:bottom w:val="single" w:color="D9D4C5" w:sz="4"/>
+              <w:right w:val="single" w:color="D9D4C5" w:sz="4"/>
+            </w:tcBorders>
+            <w:shd w:fill="F6F4EE" w:color="auto" w:val="clear"/>
+            <w:tcMar>
+              <w:top w:type="dxa" w:w="70"/>
+              <w:left w:type="dxa" w:w="110"/>
+              <w:bottom w:type="dxa" w:w="70"/>
+              <w:right w:type="dxa" w:w="110"/>
+            </w:tcMar>
+            <w:vAlign w:val="center"/>
+          </w:tcPr>
+          <w:p>
+            <w:pPr>
+              <w:spacing w:after="0" w:before="0"/>
+            </w:pPr>
+            <w:r>
+              <w:rPr>
+                <w:rFonts w:ascii="Arial" w:cs="Arial" w:eastAsia="Arial" w:hAnsi="Arial"/>
+                <w:color w:val="1B2118"/>
+                <w:sz w:val="18"/>
+                <w:szCs w:val="18"/>
+              </w:rPr>
+              <w:t xml:space="preserve">Password del database</w:t>
+            </w:r>
+          </w:p>
+        </w:tc>
+        <w:tc>
+          <w:tcPr>
+            <w:tcW w:type="dxa" w:w="3855"/>
+            <w:tcBorders>
+              <w:top w:val="single" w:color="D9D4C5" w:sz="4"/>
+              <w:left w:val="single" w:color="D9D4C5" w:sz="4"/>
+              <w:bottom w:val="single" w:color="D9D4C5" w:sz="4"/>
+              <w:right w:val="single" w:color="D9D4C5" w:sz="4"/>
+            </w:tcBorders>
+            <w:shd w:fill="F6F4EE" w:color="auto" w:val="clear"/>
+            <w:tcMar>
+              <w:top w:type="dxa" w:w="70"/>
+              <w:left w:type="dxa" w:w="110"/>
+              <w:bottom w:type="dxa" w:w="70"/>
+              <w:right w:type="dxa" w:w="110"/>
+            </w:tcMar>
+            <w:vAlign w:val="center"/>
+          </w:tcPr>
+          <w:p>
+            <w:pPr>
+              <w:spacing w:after="0" w:before="0"/>
+            </w:pPr>
+            <w:r>
+              <w:rPr>
+                <w:rFonts w:ascii="Arial" w:cs="Arial" w:eastAsia="Arial" w:hAnsi="Arial"/>
+                <w:color w:val="1B2118"/>
+                <w:sz w:val="18"/>
+                <w:szCs w:val="18"/>
+              </w:rPr>
+              <w:t xml:space="preserve">Copie manuali e ripristini</w:t>
+            </w:r>
+          </w:p>
+        </w:tc>
+      </w:tr>
+      <w:tr>
+        <w:trPr>
+          <w:cantSplit/>
+        </w:trPr>
+        <w:tc>
+          <w:tcPr>
+            <w:tcW w:type="dxa" w:w="2570"/>
+            <w:tcBorders>
+              <w:top w:val="single" w:color="D9D4C5" w:sz="4"/>
+              <w:left w:val="single" w:color="D9D4C5" w:sz="4"/>
+              <w:bottom w:val="single" w:color="D9D4C5" w:sz="4"/>
+              <w:right w:val="single" w:color="D9D4C5" w:sz="4"/>
+            </w:tcBorders>
+            <w:tcMar>
+              <w:top w:type="dxa" w:w="70"/>
+              <w:left w:type="dxa" w:w="110"/>
+              <w:bottom w:type="dxa" w:w="70"/>
+              <w:right w:type="dxa" w:w="110"/>
+            </w:tcMar>
+            <w:vAlign w:val="center"/>
+          </w:tcPr>
+          <w:p>
+            <w:pPr>
+              <w:spacing w:after="0" w:before="0"/>
+            </w:pPr>
+            <w:r>
+              <w:rPr>
+                <w:rFonts w:ascii="Arial" w:cs="Arial" w:eastAsia="Arial" w:hAnsi="Arial"/>
+                <w:color w:val="1B2118"/>
+                <w:sz w:val="18"/>
+                <w:szCs w:val="18"/>
+              </w:rPr>
               <w:t xml:space="preserve">GitHub, Vercel, Supabase, Resend</w:t>
             </w:r>
           </w:p>
         </w:tc>
         <w:tc>
           <w:tcPr>
-            <w:tcW w:type="dxa" w:w="3010"/>
+            <w:tcW w:type="dxa" w:w="3213"/>
             <w:tcBorders>
               <w:top w:val="single" w:color="D9D4C5" w:sz="4"/>
               <w:left w:val="single" w:color="D9D4C5" w:sz="4"/>
@@ -10847,7 +11459,7 @@
         </w:tc>
         <w:tc>
           <w:tcPr>
-            <w:tcW w:type="dxa" w:w="3539"/>
+            <w:tcW w:type="dxa" w:w="3855"/>
             <w:tcBorders>
               <w:top w:val="single" w:color="D9D4C5" w:sz="4"/>
               <w:left w:val="single" w:color="D9D4C5" w:sz="4"/>
@@ -11144,7 +11756,7 @@
         <w:szCs w:val="16"/>
       </w:rPr>
       <w:tab/>
-      <w:t xml:space="preserve">Istruzioni di ripristino · Rev. 1.0 · 19/10/2026</w:t>
+      <w:t xml:space="preserve">Istruzioni di ripristino · Rev. 1.1 · 19/10/2026</w:t>
     </w:r>
   </w:p>
 </w:hdr>
@@ -11209,7 +11821,7 @@
         <w:szCs w:val="16"/>
       </w:rPr>
       <w:tab/>
-      <w:t xml:space="preserve">Istruzioni di ripristino · Rev. 1.0 · 19/10/2026</w:t>
+      <w:t xml:space="preserve">Istruzioni di ripristino · Rev. 1.1 · 19/10/2026</w:t>
     </w:r>
   </w:p>
 </w:hdr>

</xml_diff>

<commit_message>
Utenti online (script 32, pannello per l'Amministratore principale); errori dell'assistente in italiano; simulatore con PDF impaginato ed export Excel, pagina senza scorrimento laterale sul telefono; Manuale Utente 2.8, Amministratore 3.8, Test 3.4, Registro 4.4, Ripristino 1.2, Presentazione 2.4
Co-Authored-By: Claude Opus 5.5 <noreply@anthropic.com>
Claude-Session: https://claude.ai/code/session_01E8XCbEeVHWVP3hntUZ6kZ1
</commit_message>
<xml_diff>
--- a/public/documentazione/Istruzioni_Ripristino_Portale_CWP.docx
+++ b/public/documentazione/Istruzioni_Ripristino_Portale_CWP.docx
@@ -302,7 +302,7 @@
                 <w:sz w:val="20"/>
                 <w:szCs w:val="20"/>
               </w:rPr>
-              <w:t xml:space="preserve">Rev. 1.1</w:t>
+              <w:t xml:space="preserve">Rev. 1.2</w:t>
             </w:r>
           </w:p>
         </w:tc>
@@ -365,7 +365,7 @@
                 <w:sz w:val="20"/>
                 <w:szCs w:val="20"/>
               </w:rPr>
-              <w:t xml:space="preserve">19/10/2026</w:t>
+              <w:t xml:space="preserve">20/10/2026</w:t>
             </w:r>
           </w:p>
         </w:tc>
@@ -719,7 +719,7 @@
                 <w:sz w:val="18"/>
                 <w:szCs w:val="18"/>
               </w:rPr>
-              <w:t xml:space="preserve">1.1</w:t>
+              <w:t xml:space="preserve">1.2</w:t>
             </w:r>
           </w:p>
         </w:tc>
@@ -751,7 +751,7 @@
                 <w:sz w:val="18"/>
                 <w:szCs w:val="18"/>
               </w:rPr>
-              <w:t xml:space="preserve">19/10/2026</w:t>
+              <w:t xml:space="preserve">20/10/2026</w:t>
             </w:r>
           </w:p>
         </w:tc>
@@ -783,7 +783,7 @@
                 <w:sz w:val="18"/>
                 <w:szCs w:val="18"/>
               </w:rPr>
-              <w:t xml:space="preserve">Funzione assistente e chiave ANTHROPIC_API_KEY; Claude Console tra i servizi; script 01-31.</w:t>
+              <w:t xml:space="preserve">Script 01-32.</w:t>
             </w:r>
           </w:p>
         </w:tc>
@@ -853,6 +853,142 @@
                 <w:sz w:val="18"/>
                 <w:szCs w:val="18"/>
               </w:rPr>
+              <w:t xml:space="preserve">1.1</w:t>
+            </w:r>
+          </w:p>
+        </w:tc>
+        <w:tc>
+          <w:tcPr>
+            <w:tcW w:type="dxa" w:w="1300"/>
+            <w:tcBorders>
+              <w:top w:val="single" w:color="D9D4C5" w:sz="4"/>
+              <w:left w:val="single" w:color="D9D4C5" w:sz="4"/>
+              <w:bottom w:val="single" w:color="D9D4C5" w:sz="4"/>
+              <w:right w:val="single" w:color="D9D4C5" w:sz="4"/>
+            </w:tcBorders>
+            <w:shd w:fill="F6F4EE" w:color="auto" w:val="clear"/>
+            <w:tcMar>
+              <w:top w:type="dxa" w:w="70"/>
+              <w:left w:type="dxa" w:w="110"/>
+              <w:bottom w:type="dxa" w:w="70"/>
+              <w:right w:type="dxa" w:w="110"/>
+            </w:tcMar>
+            <w:vAlign w:val="center"/>
+          </w:tcPr>
+          <w:p>
+            <w:pPr>
+              <w:spacing w:after="0" w:before="0"/>
+            </w:pPr>
+            <w:r>
+              <w:rPr>
+                <w:rFonts w:ascii="Arial" w:cs="Arial" w:eastAsia="Arial" w:hAnsi="Arial"/>
+                <w:color w:val="1B2118"/>
+                <w:sz w:val="18"/>
+                <w:szCs w:val="18"/>
+              </w:rPr>
+              <w:t xml:space="preserve">19/10/2026</w:t>
+            </w:r>
+          </w:p>
+        </w:tc>
+        <w:tc>
+          <w:tcPr>
+            <w:tcW w:type="dxa" w:w="5538"/>
+            <w:tcBorders>
+              <w:top w:val="single" w:color="D9D4C5" w:sz="4"/>
+              <w:left w:val="single" w:color="D9D4C5" w:sz="4"/>
+              <w:bottom w:val="single" w:color="D9D4C5" w:sz="4"/>
+              <w:right w:val="single" w:color="D9D4C5" w:sz="4"/>
+            </w:tcBorders>
+            <w:shd w:fill="F6F4EE" w:color="auto" w:val="clear"/>
+            <w:tcMar>
+              <w:top w:type="dxa" w:w="70"/>
+              <w:left w:type="dxa" w:w="110"/>
+              <w:bottom w:type="dxa" w:w="70"/>
+              <w:right w:type="dxa" w:w="110"/>
+            </w:tcMar>
+            <w:vAlign w:val="center"/>
+          </w:tcPr>
+          <w:p>
+            <w:pPr>
+              <w:spacing w:after="0" w:before="0"/>
+            </w:pPr>
+            <w:r>
+              <w:rPr>
+                <w:rFonts w:ascii="Arial" w:cs="Arial" w:eastAsia="Arial" w:hAnsi="Arial"/>
+                <w:color w:val="1B2118"/>
+                <w:sz w:val="18"/>
+                <w:szCs w:val="18"/>
+              </w:rPr>
+              <w:t xml:space="preserve">Funzione assistente e chiave ANTHROPIC_API_KEY; Claude Console tra i servizi; script 01-31.</w:t>
+            </w:r>
+          </w:p>
+        </w:tc>
+        <w:tc>
+          <w:tcPr>
+            <w:tcW w:type="dxa" w:w="2000"/>
+            <w:tcBorders>
+              <w:top w:val="single" w:color="D9D4C5" w:sz="4"/>
+              <w:left w:val="single" w:color="D9D4C5" w:sz="4"/>
+              <w:bottom w:val="single" w:color="D9D4C5" w:sz="4"/>
+              <w:right w:val="single" w:color="D9D4C5" w:sz="4"/>
+            </w:tcBorders>
+            <w:shd w:fill="F6F4EE" w:color="auto" w:val="clear"/>
+            <w:tcMar>
+              <w:top w:type="dxa" w:w="70"/>
+              <w:left w:type="dxa" w:w="110"/>
+              <w:bottom w:type="dxa" w:w="70"/>
+              <w:right w:type="dxa" w:w="110"/>
+            </w:tcMar>
+            <w:vAlign w:val="center"/>
+          </w:tcPr>
+          <w:p>
+            <w:pPr>
+              <w:spacing w:after="0" w:before="0"/>
+            </w:pPr>
+            <w:r>
+              <w:rPr>
+                <w:rFonts w:ascii="Arial" w:cs="Arial" w:eastAsia="Arial" w:hAnsi="Arial"/>
+                <w:color w:val="1B2118"/>
+                <w:sz w:val="18"/>
+                <w:szCs w:val="18"/>
+              </w:rPr>
+              <w:t xml:space="preserve">Fondazione Operate</w:t>
+            </w:r>
+          </w:p>
+        </w:tc>
+      </w:tr>
+      <w:tr>
+        <w:trPr>
+          <w:cantSplit/>
+        </w:trPr>
+        <w:tc>
+          <w:tcPr>
+            <w:tcW w:type="dxa" w:w="800"/>
+            <w:tcBorders>
+              <w:top w:val="single" w:color="D9D4C5" w:sz="4"/>
+              <w:left w:val="single" w:color="D9D4C5" w:sz="4"/>
+              <w:bottom w:val="single" w:color="D9D4C5" w:sz="4"/>
+              <w:right w:val="single" w:color="D9D4C5" w:sz="4"/>
+            </w:tcBorders>
+            <w:tcMar>
+              <w:top w:type="dxa" w:w="70"/>
+              <w:left w:type="dxa" w:w="110"/>
+              <w:bottom w:type="dxa" w:w="70"/>
+              <w:right w:type="dxa" w:w="110"/>
+            </w:tcMar>
+            <w:vAlign w:val="center"/>
+          </w:tcPr>
+          <w:p>
+            <w:pPr>
+              <w:spacing w:after="0" w:before="0"/>
+            </w:pPr>
+            <w:r>
+              <w:rPr>
+                <w:rFonts w:ascii="Arial" w:cs="Arial" w:eastAsia="Arial" w:hAnsi="Arial"/>
+                <w:color w:val="1B2118"/>
+                <w:sz w:val="18"/>
+                <w:szCs w:val="18"/>
+              </w:rPr>
               <w:t xml:space="preserve">1.0</w:t>
             </w:r>
           </w:p>
@@ -866,7 +1002,6 @@
               <w:bottom w:val="single" w:color="D9D4C5" w:sz="4"/>
               <w:right w:val="single" w:color="D9D4C5" w:sz="4"/>
             </w:tcBorders>
-            <w:shd w:fill="F6F4EE" w:color="auto" w:val="clear"/>
             <w:tcMar>
               <w:top w:type="dxa" w:w="70"/>
               <w:left w:type="dxa" w:w="110"/>
@@ -899,7 +1034,6 @@
               <w:bottom w:val="single" w:color="D9D4C5" w:sz="4"/>
               <w:right w:val="single" w:color="D9D4C5" w:sz="4"/>
             </w:tcBorders>
-            <w:shd w:fill="F6F4EE" w:color="auto" w:val="clear"/>
             <w:tcMar>
               <w:top w:type="dxa" w:w="70"/>
               <w:left w:type="dxa" w:w="110"/>
@@ -932,7 +1066,6 @@
               <w:bottom w:val="single" w:color="D9D4C5" w:sz="4"/>
               <w:right w:val="single" w:color="D9D4C5" w:sz="4"/>
             </w:tcBorders>
-            <w:shd w:fill="F6F4EE" w:color="auto" w:val="clear"/>
             <w:tcMar>
               <w:top w:type="dxa" w:w="70"/>
               <w:left w:type="dxa" w:w="110"/>
@@ -974,7 +1107,7 @@
           <w:sz w:val="20"/>
           <w:szCs w:val="20"/>
         </w:rPr>
-        <w:t xml:space="preserve">Istruzioni alla revisione 1.1 del 19/10/2026. Si aggiornano quando cambiano servizi, piani, script del database, funzioni o chiavi; una copia è dentro ogni archivio di backup e la versione corrente si scarica dall'area Documentazione del portale (solo Amministratori).</w:t>
+        <w:t xml:space="preserve">Istruzioni alla revisione 1.2 del 20/10/2026. Si aggiornano quando cambiano servizi, piani, script del database, funzioni o chiavi; una copia è dentro ogni archivio di backup e la versione corrente si scarica dall'area Documentazione del portale (solo Amministratori).</w:t>
       </w:r>
     </w:p>
     <w:p>
@@ -2470,7 +2603,7 @@
                 <w:sz w:val="18"/>
                 <w:szCs w:val="18"/>
               </w:rPr>
-              <w:t xml:space="preserve">Tutto il codice, gli script del database (01-31), le funzioni del server, i manuali e la loro storia</w:t>
+              <w:t xml:space="preserve">Tutto il codice, gli script del database (01-32), le funzioni del server, i manuali e la loro storia</w:t>
             </w:r>
           </w:p>
         </w:tc>
@@ -11756,7 +11889,7 @@
         <w:szCs w:val="16"/>
       </w:rPr>
       <w:tab/>
-      <w:t xml:space="preserve">Istruzioni di ripristino · Rev. 1.1 · 19/10/2026</w:t>
+      <w:t xml:space="preserve">Istruzioni di ripristino · Rev. 1.2 · 20/10/2026</w:t>
     </w:r>
   </w:p>
 </w:hdr>
@@ -11821,7 +11954,7 @@
         <w:szCs w:val="16"/>
       </w:rPr>
       <w:tab/>
-      <w:t xml:space="preserve">Istruzioni di ripristino · Rev. 1.1 · 19/10/2026</w:t>
+      <w:t xml:space="preserve">Istruzioni di ripristino · Rev. 1.2 · 20/10/2026</w:t>
     </w:r>
   </w:p>
 </w:hdr>

</xml_diff>

<commit_message>
Audit trail user: sezione riservata all'Amministratore principale con utenti online, registro degli accessi (entrate, uscite, tentativi non riusciti) e operazioni per utente, download dei documenti nell'audit (script 33); Registro 4.6, Manuale Utente 2.9, Amministratore 3.9, Test 3.5, Ripristino 1.3, Presentazione 2.5
Co-Authored-By: Claude Opus 5.5 <noreply@anthropic.com>
Claude-Session: https://claude.ai/code/session_01E8XCbEeVHWVP3hntUZ6kZ1
</commit_message>
<xml_diff>
--- a/public/documentazione/Istruzioni_Ripristino_Portale_CWP.docx
+++ b/public/documentazione/Istruzioni_Ripristino_Portale_CWP.docx
@@ -302,7 +302,7 @@
                 <w:sz w:val="20"/>
                 <w:szCs w:val="20"/>
               </w:rPr>
-              <w:t xml:space="preserve">Rev. 1.2</w:t>
+              <w:t xml:space="preserve">Rev. 1.3</w:t>
             </w:r>
           </w:p>
         </w:tc>
@@ -719,7 +719,7 @@
                 <w:sz w:val="18"/>
                 <w:szCs w:val="18"/>
               </w:rPr>
-              <w:t xml:space="preserve">1.2</w:t>
+              <w:t xml:space="preserve">1.3</w:t>
             </w:r>
           </w:p>
         </w:tc>
@@ -783,7 +783,7 @@
                 <w:sz w:val="18"/>
                 <w:szCs w:val="18"/>
               </w:rPr>
-              <w:t xml:space="preserve">Script 01-32.</w:t>
+              <w:t xml:space="preserve">Script 01-33.</w:t>
             </w:r>
           </w:p>
         </w:tc>
@@ -853,7 +853,7 @@
                 <w:sz w:val="18"/>
                 <w:szCs w:val="18"/>
               </w:rPr>
-              <w:t xml:space="preserve">1.1</w:t>
+              <w:t xml:space="preserve">1.2</w:t>
             </w:r>
           </w:p>
         </w:tc>
@@ -886,7 +886,7 @@
                 <w:sz w:val="18"/>
                 <w:szCs w:val="18"/>
               </w:rPr>
-              <w:t xml:space="preserve">19/10/2026</w:t>
+              <w:t xml:space="preserve">20/10/2026</w:t>
             </w:r>
           </w:p>
         </w:tc>
@@ -919,7 +919,7 @@
                 <w:sz w:val="18"/>
                 <w:szCs w:val="18"/>
               </w:rPr>
-              <w:t xml:space="preserve">Funzione assistente e chiave ANTHROPIC_API_KEY; Claude Console tra i servizi; script 01-31.</w:t>
+              <w:t xml:space="preserve">Script 01-32.</w:t>
             </w:r>
           </w:p>
         </w:tc>
@@ -989,6 +989,140 @@
                 <w:sz w:val="18"/>
                 <w:szCs w:val="18"/>
               </w:rPr>
+              <w:t xml:space="preserve">1.1</w:t>
+            </w:r>
+          </w:p>
+        </w:tc>
+        <w:tc>
+          <w:tcPr>
+            <w:tcW w:type="dxa" w:w="1300"/>
+            <w:tcBorders>
+              <w:top w:val="single" w:color="D9D4C5" w:sz="4"/>
+              <w:left w:val="single" w:color="D9D4C5" w:sz="4"/>
+              <w:bottom w:val="single" w:color="D9D4C5" w:sz="4"/>
+              <w:right w:val="single" w:color="D9D4C5" w:sz="4"/>
+            </w:tcBorders>
+            <w:tcMar>
+              <w:top w:type="dxa" w:w="70"/>
+              <w:left w:type="dxa" w:w="110"/>
+              <w:bottom w:type="dxa" w:w="70"/>
+              <w:right w:type="dxa" w:w="110"/>
+            </w:tcMar>
+            <w:vAlign w:val="center"/>
+          </w:tcPr>
+          <w:p>
+            <w:pPr>
+              <w:spacing w:after="0" w:before="0"/>
+            </w:pPr>
+            <w:r>
+              <w:rPr>
+                <w:rFonts w:ascii="Arial" w:cs="Arial" w:eastAsia="Arial" w:hAnsi="Arial"/>
+                <w:color w:val="1B2118"/>
+                <w:sz w:val="18"/>
+                <w:szCs w:val="18"/>
+              </w:rPr>
+              <w:t xml:space="preserve">19/10/2026</w:t>
+            </w:r>
+          </w:p>
+        </w:tc>
+        <w:tc>
+          <w:tcPr>
+            <w:tcW w:type="dxa" w:w="5538"/>
+            <w:tcBorders>
+              <w:top w:val="single" w:color="D9D4C5" w:sz="4"/>
+              <w:left w:val="single" w:color="D9D4C5" w:sz="4"/>
+              <w:bottom w:val="single" w:color="D9D4C5" w:sz="4"/>
+              <w:right w:val="single" w:color="D9D4C5" w:sz="4"/>
+            </w:tcBorders>
+            <w:tcMar>
+              <w:top w:type="dxa" w:w="70"/>
+              <w:left w:type="dxa" w:w="110"/>
+              <w:bottom w:type="dxa" w:w="70"/>
+              <w:right w:type="dxa" w:w="110"/>
+            </w:tcMar>
+            <w:vAlign w:val="center"/>
+          </w:tcPr>
+          <w:p>
+            <w:pPr>
+              <w:spacing w:after="0" w:before="0"/>
+            </w:pPr>
+            <w:r>
+              <w:rPr>
+                <w:rFonts w:ascii="Arial" w:cs="Arial" w:eastAsia="Arial" w:hAnsi="Arial"/>
+                <w:color w:val="1B2118"/>
+                <w:sz w:val="18"/>
+                <w:szCs w:val="18"/>
+              </w:rPr>
+              <w:t xml:space="preserve">Funzione assistente e chiave ANTHROPIC_API_KEY; Claude Console tra i servizi; script 01-31.</w:t>
+            </w:r>
+          </w:p>
+        </w:tc>
+        <w:tc>
+          <w:tcPr>
+            <w:tcW w:type="dxa" w:w="2000"/>
+            <w:tcBorders>
+              <w:top w:val="single" w:color="D9D4C5" w:sz="4"/>
+              <w:left w:val="single" w:color="D9D4C5" w:sz="4"/>
+              <w:bottom w:val="single" w:color="D9D4C5" w:sz="4"/>
+              <w:right w:val="single" w:color="D9D4C5" w:sz="4"/>
+            </w:tcBorders>
+            <w:tcMar>
+              <w:top w:type="dxa" w:w="70"/>
+              <w:left w:type="dxa" w:w="110"/>
+              <w:bottom w:type="dxa" w:w="70"/>
+              <w:right w:type="dxa" w:w="110"/>
+            </w:tcMar>
+            <w:vAlign w:val="center"/>
+          </w:tcPr>
+          <w:p>
+            <w:pPr>
+              <w:spacing w:after="0" w:before="0"/>
+            </w:pPr>
+            <w:r>
+              <w:rPr>
+                <w:rFonts w:ascii="Arial" w:cs="Arial" w:eastAsia="Arial" w:hAnsi="Arial"/>
+                <w:color w:val="1B2118"/>
+                <w:sz w:val="18"/>
+                <w:szCs w:val="18"/>
+              </w:rPr>
+              <w:t xml:space="preserve">Fondazione Operate</w:t>
+            </w:r>
+          </w:p>
+        </w:tc>
+      </w:tr>
+      <w:tr>
+        <w:trPr>
+          <w:cantSplit/>
+        </w:trPr>
+        <w:tc>
+          <w:tcPr>
+            <w:tcW w:type="dxa" w:w="800"/>
+            <w:tcBorders>
+              <w:top w:val="single" w:color="D9D4C5" w:sz="4"/>
+              <w:left w:val="single" w:color="D9D4C5" w:sz="4"/>
+              <w:bottom w:val="single" w:color="D9D4C5" w:sz="4"/>
+              <w:right w:val="single" w:color="D9D4C5" w:sz="4"/>
+            </w:tcBorders>
+            <w:shd w:fill="F6F4EE" w:color="auto" w:val="clear"/>
+            <w:tcMar>
+              <w:top w:type="dxa" w:w="70"/>
+              <w:left w:type="dxa" w:w="110"/>
+              <w:bottom w:type="dxa" w:w="70"/>
+              <w:right w:type="dxa" w:w="110"/>
+            </w:tcMar>
+            <w:vAlign w:val="center"/>
+          </w:tcPr>
+          <w:p>
+            <w:pPr>
+              <w:spacing w:after="0" w:before="0"/>
+            </w:pPr>
+            <w:r>
+              <w:rPr>
+                <w:rFonts w:ascii="Arial" w:cs="Arial" w:eastAsia="Arial" w:hAnsi="Arial"/>
+                <w:color w:val="1B2118"/>
+                <w:sz w:val="18"/>
+                <w:szCs w:val="18"/>
+              </w:rPr>
               <w:t xml:space="preserve">1.0</w:t>
             </w:r>
           </w:p>
@@ -1002,6 +1136,7 @@
               <w:bottom w:val="single" w:color="D9D4C5" w:sz="4"/>
               <w:right w:val="single" w:color="D9D4C5" w:sz="4"/>
             </w:tcBorders>
+            <w:shd w:fill="F6F4EE" w:color="auto" w:val="clear"/>
             <w:tcMar>
               <w:top w:type="dxa" w:w="70"/>
               <w:left w:type="dxa" w:w="110"/>
@@ -1034,6 +1169,7 @@
               <w:bottom w:val="single" w:color="D9D4C5" w:sz="4"/>
               <w:right w:val="single" w:color="D9D4C5" w:sz="4"/>
             </w:tcBorders>
+            <w:shd w:fill="F6F4EE" w:color="auto" w:val="clear"/>
             <w:tcMar>
               <w:top w:type="dxa" w:w="70"/>
               <w:left w:type="dxa" w:w="110"/>
@@ -1066,6 +1202,7 @@
               <w:bottom w:val="single" w:color="D9D4C5" w:sz="4"/>
               <w:right w:val="single" w:color="D9D4C5" w:sz="4"/>
             </w:tcBorders>
+            <w:shd w:fill="F6F4EE" w:color="auto" w:val="clear"/>
             <w:tcMar>
               <w:top w:type="dxa" w:w="70"/>
               <w:left w:type="dxa" w:w="110"/>
@@ -1107,7 +1244,7 @@
           <w:sz w:val="20"/>
           <w:szCs w:val="20"/>
         </w:rPr>
-        <w:t xml:space="preserve">Istruzioni alla revisione 1.2 del 20/10/2026. Si aggiornano quando cambiano servizi, piani, script del database, funzioni o chiavi; una copia è dentro ogni archivio di backup e la versione corrente si scarica dall'area Documentazione del portale (solo Amministratori).</w:t>
+        <w:t xml:space="preserve">Istruzioni alla revisione 1.3 del 20/10/2026. Si aggiornano quando cambiano servizi, piani, script del database, funzioni o chiavi; una copia è dentro ogni archivio di backup e la versione corrente si scarica dall'area Documentazione del portale (solo Amministratori).</w:t>
       </w:r>
     </w:p>
     <w:p>
@@ -2603,7 +2740,7 @@
                 <w:sz w:val="18"/>
                 <w:szCs w:val="18"/>
               </w:rPr>
-              <w:t xml:space="preserve">Tutto il codice, gli script del database (01-32), le funzioni del server, i manuali e la loro storia</w:t>
+              <w:t xml:space="preserve">Tutto il codice, gli script del database (01-33), le funzioni del server, i manuali e la loro storia</w:t>
             </w:r>
           </w:p>
         </w:tc>
@@ -11889,7 +12026,7 @@
         <w:szCs w:val="16"/>
       </w:rPr>
       <w:tab/>
-      <w:t xml:space="preserve">Istruzioni di ripristino · Rev. 1.2 · 20/10/2026</w:t>
+      <w:t xml:space="preserve">Istruzioni di ripristino · Rev. 1.3 · 20/10/2026</w:t>
     </w:r>
   </w:p>
 </w:hdr>
@@ -11954,7 +12091,7 @@
         <w:szCs w:val="16"/>
       </w:rPr>
       <w:tab/>
-      <w:t xml:space="preserve">Istruzioni di ripristino · Rev. 1.2 · 20/10/2026</w:t>
+      <w:t xml:space="preserve">Istruzioni di ripristino · Rev. 1.3 · 20/10/2026</w:t>
     </w:r>
   </w:p>
 </w:hdr>

</xml_diff>

<commit_message>
Menu degli enti riordinato (Il Programma CWP, Manuali); documenti allineati: Registro 4.9 (pagine, menu per ruolo, struttura del codice, stato per area), Manuale Utente 3.1, Amministratore 4.1, Test 3.7, Ripristino 1.4, Presentazione 2.7, base di conoscenza
Co-Authored-By: Claude Opus 5.5 <noreply@anthropic.com>
Claude-Session: https://claude.ai/code/session_01E8XCbEeVHWVP3hntUZ6kZ1
</commit_message>
<xml_diff>
--- a/public/documentazione/Istruzioni_Ripristino_Portale_CWP.docx
+++ b/public/documentazione/Istruzioni_Ripristino_Portale_CWP.docx
@@ -302,7 +302,7 @@
                 <w:sz w:val="20"/>
                 <w:szCs w:val="20"/>
               </w:rPr>
-              <w:t xml:space="preserve">Rev. 1.3</w:t>
+              <w:t xml:space="preserve">Rev. 1.4</w:t>
             </w:r>
           </w:p>
         </w:tc>
@@ -719,7 +719,7 @@
                 <w:sz w:val="18"/>
                 <w:szCs w:val="18"/>
               </w:rPr>
-              <w:t xml:space="preserve">1.3</w:t>
+              <w:t xml:space="preserve">1.4</w:t>
             </w:r>
           </w:p>
         </w:tc>
@@ -783,7 +783,7 @@
                 <w:sz w:val="18"/>
                 <w:szCs w:val="18"/>
               </w:rPr>
-              <w:t xml:space="preserve">Script 01-33.</w:t>
+              <w:t xml:space="preserve">Amministratore principale e verifiche dopo il ripristino (Audit User, assistente).</w:t>
             </w:r>
           </w:p>
         </w:tc>
@@ -853,7 +853,7 @@
                 <w:sz w:val="18"/>
                 <w:szCs w:val="18"/>
               </w:rPr>
-              <w:t xml:space="preserve">1.2</w:t>
+              <w:t xml:space="preserve">1.3</w:t>
             </w:r>
           </w:p>
         </w:tc>
@@ -919,7 +919,7 @@
                 <w:sz w:val="18"/>
                 <w:szCs w:val="18"/>
               </w:rPr>
-              <w:t xml:space="preserve">Script 01-32.</w:t>
+              <w:t xml:space="preserve">Script 01-33.</w:t>
             </w:r>
           </w:p>
         </w:tc>
@@ -989,7 +989,7 @@
                 <w:sz w:val="18"/>
                 <w:szCs w:val="18"/>
               </w:rPr>
-              <w:t xml:space="preserve">1.1</w:t>
+              <w:t xml:space="preserve">1.2</w:t>
             </w:r>
           </w:p>
         </w:tc>
@@ -1021,7 +1021,7 @@
                 <w:sz w:val="18"/>
                 <w:szCs w:val="18"/>
               </w:rPr>
-              <w:t xml:space="preserve">19/10/2026</w:t>
+              <w:t xml:space="preserve">20/10/2026</w:t>
             </w:r>
           </w:p>
         </w:tc>
@@ -1053,7 +1053,7 @@
                 <w:sz w:val="18"/>
                 <w:szCs w:val="18"/>
               </w:rPr>
-              <w:t xml:space="preserve">Funzione assistente e chiave ANTHROPIC_API_KEY; Claude Console tra i servizi; script 01-31.</w:t>
+              <w:t xml:space="preserve">Script 01-32.</w:t>
             </w:r>
           </w:p>
         </w:tc>
@@ -1123,6 +1123,142 @@
                 <w:sz w:val="18"/>
                 <w:szCs w:val="18"/>
               </w:rPr>
+              <w:t xml:space="preserve">1.1</w:t>
+            </w:r>
+          </w:p>
+        </w:tc>
+        <w:tc>
+          <w:tcPr>
+            <w:tcW w:type="dxa" w:w="1300"/>
+            <w:tcBorders>
+              <w:top w:val="single" w:color="D9D4C5" w:sz="4"/>
+              <w:left w:val="single" w:color="D9D4C5" w:sz="4"/>
+              <w:bottom w:val="single" w:color="D9D4C5" w:sz="4"/>
+              <w:right w:val="single" w:color="D9D4C5" w:sz="4"/>
+            </w:tcBorders>
+            <w:shd w:fill="F6F4EE" w:color="auto" w:val="clear"/>
+            <w:tcMar>
+              <w:top w:type="dxa" w:w="70"/>
+              <w:left w:type="dxa" w:w="110"/>
+              <w:bottom w:type="dxa" w:w="70"/>
+              <w:right w:type="dxa" w:w="110"/>
+            </w:tcMar>
+            <w:vAlign w:val="center"/>
+          </w:tcPr>
+          <w:p>
+            <w:pPr>
+              <w:spacing w:after="0" w:before="0"/>
+            </w:pPr>
+            <w:r>
+              <w:rPr>
+                <w:rFonts w:ascii="Arial" w:cs="Arial" w:eastAsia="Arial" w:hAnsi="Arial"/>
+                <w:color w:val="1B2118"/>
+                <w:sz w:val="18"/>
+                <w:szCs w:val="18"/>
+              </w:rPr>
+              <w:t xml:space="preserve">19/10/2026</w:t>
+            </w:r>
+          </w:p>
+        </w:tc>
+        <w:tc>
+          <w:tcPr>
+            <w:tcW w:type="dxa" w:w="5538"/>
+            <w:tcBorders>
+              <w:top w:val="single" w:color="D9D4C5" w:sz="4"/>
+              <w:left w:val="single" w:color="D9D4C5" w:sz="4"/>
+              <w:bottom w:val="single" w:color="D9D4C5" w:sz="4"/>
+              <w:right w:val="single" w:color="D9D4C5" w:sz="4"/>
+            </w:tcBorders>
+            <w:shd w:fill="F6F4EE" w:color="auto" w:val="clear"/>
+            <w:tcMar>
+              <w:top w:type="dxa" w:w="70"/>
+              <w:left w:type="dxa" w:w="110"/>
+              <w:bottom w:type="dxa" w:w="70"/>
+              <w:right w:type="dxa" w:w="110"/>
+            </w:tcMar>
+            <w:vAlign w:val="center"/>
+          </w:tcPr>
+          <w:p>
+            <w:pPr>
+              <w:spacing w:after="0" w:before="0"/>
+            </w:pPr>
+            <w:r>
+              <w:rPr>
+                <w:rFonts w:ascii="Arial" w:cs="Arial" w:eastAsia="Arial" w:hAnsi="Arial"/>
+                <w:color w:val="1B2118"/>
+                <w:sz w:val="18"/>
+                <w:szCs w:val="18"/>
+              </w:rPr>
+              <w:t xml:space="preserve">Funzione assistente e chiave ANTHROPIC_API_KEY; Claude Console tra i servizi; script 01-31.</w:t>
+            </w:r>
+          </w:p>
+        </w:tc>
+        <w:tc>
+          <w:tcPr>
+            <w:tcW w:type="dxa" w:w="2000"/>
+            <w:tcBorders>
+              <w:top w:val="single" w:color="D9D4C5" w:sz="4"/>
+              <w:left w:val="single" w:color="D9D4C5" w:sz="4"/>
+              <w:bottom w:val="single" w:color="D9D4C5" w:sz="4"/>
+              <w:right w:val="single" w:color="D9D4C5" w:sz="4"/>
+            </w:tcBorders>
+            <w:shd w:fill="F6F4EE" w:color="auto" w:val="clear"/>
+            <w:tcMar>
+              <w:top w:type="dxa" w:w="70"/>
+              <w:left w:type="dxa" w:w="110"/>
+              <w:bottom w:type="dxa" w:w="70"/>
+              <w:right w:type="dxa" w:w="110"/>
+            </w:tcMar>
+            <w:vAlign w:val="center"/>
+          </w:tcPr>
+          <w:p>
+            <w:pPr>
+              <w:spacing w:after="0" w:before="0"/>
+            </w:pPr>
+            <w:r>
+              <w:rPr>
+                <w:rFonts w:ascii="Arial" w:cs="Arial" w:eastAsia="Arial" w:hAnsi="Arial"/>
+                <w:color w:val="1B2118"/>
+                <w:sz w:val="18"/>
+                <w:szCs w:val="18"/>
+              </w:rPr>
+              <w:t xml:space="preserve">Fondazione Operate</w:t>
+            </w:r>
+          </w:p>
+        </w:tc>
+      </w:tr>
+      <w:tr>
+        <w:trPr>
+          <w:cantSplit/>
+        </w:trPr>
+        <w:tc>
+          <w:tcPr>
+            <w:tcW w:type="dxa" w:w="800"/>
+            <w:tcBorders>
+              <w:top w:val="single" w:color="D9D4C5" w:sz="4"/>
+              <w:left w:val="single" w:color="D9D4C5" w:sz="4"/>
+              <w:bottom w:val="single" w:color="D9D4C5" w:sz="4"/>
+              <w:right w:val="single" w:color="D9D4C5" w:sz="4"/>
+            </w:tcBorders>
+            <w:tcMar>
+              <w:top w:type="dxa" w:w="70"/>
+              <w:left w:type="dxa" w:w="110"/>
+              <w:bottom w:type="dxa" w:w="70"/>
+              <w:right w:type="dxa" w:w="110"/>
+            </w:tcMar>
+            <w:vAlign w:val="center"/>
+          </w:tcPr>
+          <w:p>
+            <w:pPr>
+              <w:spacing w:after="0" w:before="0"/>
+            </w:pPr>
+            <w:r>
+              <w:rPr>
+                <w:rFonts w:ascii="Arial" w:cs="Arial" w:eastAsia="Arial" w:hAnsi="Arial"/>
+                <w:color w:val="1B2118"/>
+                <w:sz w:val="18"/>
+                <w:szCs w:val="18"/>
+              </w:rPr>
               <w:t xml:space="preserve">1.0</w:t>
             </w:r>
           </w:p>
@@ -1136,7 +1272,6 @@
               <w:bottom w:val="single" w:color="D9D4C5" w:sz="4"/>
               <w:right w:val="single" w:color="D9D4C5" w:sz="4"/>
             </w:tcBorders>
-            <w:shd w:fill="F6F4EE" w:color="auto" w:val="clear"/>
             <w:tcMar>
               <w:top w:type="dxa" w:w="70"/>
               <w:left w:type="dxa" w:w="110"/>
@@ -1169,7 +1304,6 @@
               <w:bottom w:val="single" w:color="D9D4C5" w:sz="4"/>
               <w:right w:val="single" w:color="D9D4C5" w:sz="4"/>
             </w:tcBorders>
-            <w:shd w:fill="F6F4EE" w:color="auto" w:val="clear"/>
             <w:tcMar>
               <w:top w:type="dxa" w:w="70"/>
               <w:left w:type="dxa" w:w="110"/>
@@ -1202,7 +1336,6 @@
               <w:bottom w:val="single" w:color="D9D4C5" w:sz="4"/>
               <w:right w:val="single" w:color="D9D4C5" w:sz="4"/>
             </w:tcBorders>
-            <w:shd w:fill="F6F4EE" w:color="auto" w:val="clear"/>
             <w:tcMar>
               <w:top w:type="dxa" w:w="70"/>
               <w:left w:type="dxa" w:w="110"/>
@@ -1244,7 +1377,7 @@
           <w:sz w:val="20"/>
           <w:szCs w:val="20"/>
         </w:rPr>
-        <w:t xml:space="preserve">Istruzioni alla revisione 1.3 del 20/10/2026. Si aggiornano quando cambiano servizi, piani, script del database, funzioni o chiavi; una copia è dentro ogni archivio di backup e la versione corrente si scarica dall'area Documentazione del portale (solo Amministratori).</w:t>
+        <w:t xml:space="preserve">Istruzioni alla revisione 1.4 del 20/10/2026. Si aggiornano quando cambiano servizi, piani, script del database, funzioni o chiavi; una copia è dentro ogni archivio di backup e la versione corrente si scarica dall'area Documentazione del portale (solo Amministratori).</w:t>
       </w:r>
     </w:p>
     <w:p>
@@ -9257,6 +9390,40 @@
           <w:sz w:val="21"/>
           <w:szCs w:val="21"/>
         </w:rPr>
+        <w:t xml:space="preserve">Se lo script 29 è stato eseguito quando l'account di Luca non c'era ancora, rieseguitelo ora: segna luca.moretti@operate.it come </w:t>
+      </w:r>
+      <w:r>
+        <w:rPr>
+          <w:rFonts w:ascii="Arial" w:cs="Arial" w:eastAsia="Arial" w:hAnsi="Arial"/>
+          <w:b/>
+          <w:bCs/>
+          <w:color w:val="1B2118"/>
+          <w:sz w:val="21"/>
+          <w:szCs w:val="21"/>
+        </w:rPr>
+        <w:t xml:space="preserve">Amministratore principale</w:t>
+      </w:r>
+      <w:r>
+        <w:rPr>
+          <w:rFonts w:ascii="Arial" w:cs="Arial" w:eastAsia="Arial" w:hAnsi="Arial"/>
+          <w:color w:val="1B2118"/>
+          <w:sz w:val="21"/>
+          <w:szCs w:val="21"/>
+        </w:rPr>
+        <w:t xml:space="preserve"> (protetto, con la sezione Audit User e il pannello «n online»).</w:t>
+      </w:r>
+    </w:p>
+    <w:p>
+      <w:pPr>
+        <w:spacing w:after="140" w:line="300"/>
+      </w:pPr>
+      <w:r>
+        <w:rPr>
+          <w:rFonts w:ascii="Arial" w:cs="Arial" w:eastAsia="Arial" w:hAnsi="Arial"/>
+          <w:color w:val="1B2118"/>
+          <w:sz w:val="21"/>
+          <w:szCs w:val="21"/>
+        </w:rPr>
         <w:t xml:space="preserve">Gli altri utenti li crea poi l'Amministratore dal portale (</w:t>
       </w:r>
       <w:r>
@@ -9409,7 +9576,7 @@
           <w:sz w:val="21"/>
           <w:szCs w:val="21"/>
         </w:rPr>
-        <w:t xml:space="preserve">Verifiche: accesso come Amministratore; la pagina /programma mostra gli 8 documenti, la PEC e il soggetto promotore; un utente di prova riceve l'email; i lavori pianificati sono tre:</w:t>
+        <w:t xml:space="preserve">Verifiche: accesso come Amministratore principale, con il menu completo (fino ad Audit User) e la scheda Accessi di Audit User che registra l'accesso appena fatto; la pagina /programma mostra gli 8 documenti, la PEC e il soggetto promotore; un utente di prova riceve l'email; l'assistente risponde; i lavori pianificati sono tre:</w:t>
       </w:r>
     </w:p>
     <w:p>
@@ -12026,7 +12193,7 @@
         <w:szCs w:val="16"/>
       </w:rPr>
       <w:tab/>
-      <w:t xml:space="preserve">Istruzioni di ripristino · Rev. 1.3 · 20/10/2026</w:t>
+      <w:t xml:space="preserve">Istruzioni di ripristino · Rev. 1.4 · 20/10/2026</w:t>
     </w:r>
   </w:p>
 </w:hdr>
@@ -12091,7 +12258,7 @@
         <w:szCs w:val="16"/>
       </w:rPr>
       <w:tab/>
-      <w:t xml:space="preserve">Istruzioni di ripristino · Rev. 1.3 · 20/10/2026</w:t>
+      <w:t xml:space="preserve">Istruzioni di ripristino · Rev. 1.4 · 20/10/2026</w:t>
     </w:r>
   </w:p>
 </w:hdr>

</xml_diff>

<commit_message>
Sicurezza: Content-Security-Policy obbligatoria; documenti aggiornati (Registro 5.0, Manuale Utente 3.2, Amministratore 4.2 con capitolo Sicurezza, Test 3.8, Ripristino 1.5, Presentazione 2.8, base di conoscenza)
Co-Authored-By: Claude Opus 5.5 <noreply@anthropic.com>
Claude-Session: https://claude.ai/code/session_01E8XCbEeVHWVP3hntUZ6kZ1
</commit_message>
<xml_diff>
--- a/public/documentazione/Istruzioni_Ripristino_Portale_CWP.docx
+++ b/public/documentazione/Istruzioni_Ripristino_Portale_CWP.docx
@@ -302,7 +302,7 @@
                 <w:sz w:val="20"/>
                 <w:szCs w:val="20"/>
               </w:rPr>
-              <w:t xml:space="preserve">Rev. 1.4</w:t>
+              <w:t xml:space="preserve">Rev. 1.5</w:t>
             </w:r>
           </w:p>
         </w:tc>
@@ -719,7 +719,7 @@
                 <w:sz w:val="18"/>
                 <w:szCs w:val="18"/>
               </w:rPr>
-              <w:t xml:space="preserve">1.4</w:t>
+              <w:t xml:space="preserve">1.5</w:t>
             </w:r>
           </w:p>
         </w:tc>
@@ -783,7 +783,7 @@
                 <w:sz w:val="18"/>
                 <w:szCs w:val="18"/>
               </w:rPr>
-              <w:t xml:space="preserve">Amministratore principale e verifiche dopo il ripristino (Audit User, assistente).</w:t>
+              <w:t xml:space="preserve">Indirizzo Supabase nella Content-Security-Policy di vercel.json; script 01-34.</w:t>
             </w:r>
           </w:p>
         </w:tc>
@@ -853,7 +853,7 @@
                 <w:sz w:val="18"/>
                 <w:szCs w:val="18"/>
               </w:rPr>
-              <w:t xml:space="preserve">1.3</w:t>
+              <w:t xml:space="preserve">1.4</w:t>
             </w:r>
           </w:p>
         </w:tc>
@@ -919,7 +919,7 @@
                 <w:sz w:val="18"/>
                 <w:szCs w:val="18"/>
               </w:rPr>
-              <w:t xml:space="preserve">Script 01-33.</w:t>
+              <w:t xml:space="preserve">Amministratore principale e verifiche dopo il ripristino (Audit User, assistente).</w:t>
             </w:r>
           </w:p>
         </w:tc>
@@ -989,7 +989,7 @@
                 <w:sz w:val="18"/>
                 <w:szCs w:val="18"/>
               </w:rPr>
-              <w:t xml:space="preserve">1.2</w:t>
+              <w:t xml:space="preserve">1.3</w:t>
             </w:r>
           </w:p>
         </w:tc>
@@ -1053,7 +1053,7 @@
                 <w:sz w:val="18"/>
                 <w:szCs w:val="18"/>
               </w:rPr>
-              <w:t xml:space="preserve">Script 01-32.</w:t>
+              <w:t xml:space="preserve">Script 01-33.</w:t>
             </w:r>
           </w:p>
         </w:tc>
@@ -1123,7 +1123,7 @@
                 <w:sz w:val="18"/>
                 <w:szCs w:val="18"/>
               </w:rPr>
-              <w:t xml:space="preserve">1.1</w:t>
+              <w:t xml:space="preserve">1.2</w:t>
             </w:r>
           </w:p>
         </w:tc>
@@ -1156,7 +1156,7 @@
                 <w:sz w:val="18"/>
                 <w:szCs w:val="18"/>
               </w:rPr>
-              <w:t xml:space="preserve">19/10/2026</w:t>
+              <w:t xml:space="preserve">20/10/2026</w:t>
             </w:r>
           </w:p>
         </w:tc>
@@ -1189,7 +1189,7 @@
                 <w:sz w:val="18"/>
                 <w:szCs w:val="18"/>
               </w:rPr>
-              <w:t xml:space="preserve">Funzione assistente e chiave ANTHROPIC_API_KEY; Claude Console tra i servizi; script 01-31.</w:t>
+              <w:t xml:space="preserve">Script 01-32.</w:t>
             </w:r>
           </w:p>
         </w:tc>
@@ -1259,6 +1259,140 @@
                 <w:sz w:val="18"/>
                 <w:szCs w:val="18"/>
               </w:rPr>
+              <w:t xml:space="preserve">1.1</w:t>
+            </w:r>
+          </w:p>
+        </w:tc>
+        <w:tc>
+          <w:tcPr>
+            <w:tcW w:type="dxa" w:w="1300"/>
+            <w:tcBorders>
+              <w:top w:val="single" w:color="D9D4C5" w:sz="4"/>
+              <w:left w:val="single" w:color="D9D4C5" w:sz="4"/>
+              <w:bottom w:val="single" w:color="D9D4C5" w:sz="4"/>
+              <w:right w:val="single" w:color="D9D4C5" w:sz="4"/>
+            </w:tcBorders>
+            <w:tcMar>
+              <w:top w:type="dxa" w:w="70"/>
+              <w:left w:type="dxa" w:w="110"/>
+              <w:bottom w:type="dxa" w:w="70"/>
+              <w:right w:type="dxa" w:w="110"/>
+            </w:tcMar>
+            <w:vAlign w:val="center"/>
+          </w:tcPr>
+          <w:p>
+            <w:pPr>
+              <w:spacing w:after="0" w:before="0"/>
+            </w:pPr>
+            <w:r>
+              <w:rPr>
+                <w:rFonts w:ascii="Arial" w:cs="Arial" w:eastAsia="Arial" w:hAnsi="Arial"/>
+                <w:color w:val="1B2118"/>
+                <w:sz w:val="18"/>
+                <w:szCs w:val="18"/>
+              </w:rPr>
+              <w:t xml:space="preserve">19/10/2026</w:t>
+            </w:r>
+          </w:p>
+        </w:tc>
+        <w:tc>
+          <w:tcPr>
+            <w:tcW w:type="dxa" w:w="5538"/>
+            <w:tcBorders>
+              <w:top w:val="single" w:color="D9D4C5" w:sz="4"/>
+              <w:left w:val="single" w:color="D9D4C5" w:sz="4"/>
+              <w:bottom w:val="single" w:color="D9D4C5" w:sz="4"/>
+              <w:right w:val="single" w:color="D9D4C5" w:sz="4"/>
+            </w:tcBorders>
+            <w:tcMar>
+              <w:top w:type="dxa" w:w="70"/>
+              <w:left w:type="dxa" w:w="110"/>
+              <w:bottom w:type="dxa" w:w="70"/>
+              <w:right w:type="dxa" w:w="110"/>
+            </w:tcMar>
+            <w:vAlign w:val="center"/>
+          </w:tcPr>
+          <w:p>
+            <w:pPr>
+              <w:spacing w:after="0" w:before="0"/>
+            </w:pPr>
+            <w:r>
+              <w:rPr>
+                <w:rFonts w:ascii="Arial" w:cs="Arial" w:eastAsia="Arial" w:hAnsi="Arial"/>
+                <w:color w:val="1B2118"/>
+                <w:sz w:val="18"/>
+                <w:szCs w:val="18"/>
+              </w:rPr>
+              <w:t xml:space="preserve">Funzione assistente e chiave ANTHROPIC_API_KEY; Claude Console tra i servizi; script 01-31.</w:t>
+            </w:r>
+          </w:p>
+        </w:tc>
+        <w:tc>
+          <w:tcPr>
+            <w:tcW w:type="dxa" w:w="2000"/>
+            <w:tcBorders>
+              <w:top w:val="single" w:color="D9D4C5" w:sz="4"/>
+              <w:left w:val="single" w:color="D9D4C5" w:sz="4"/>
+              <w:bottom w:val="single" w:color="D9D4C5" w:sz="4"/>
+              <w:right w:val="single" w:color="D9D4C5" w:sz="4"/>
+            </w:tcBorders>
+            <w:tcMar>
+              <w:top w:type="dxa" w:w="70"/>
+              <w:left w:type="dxa" w:w="110"/>
+              <w:bottom w:type="dxa" w:w="70"/>
+              <w:right w:type="dxa" w:w="110"/>
+            </w:tcMar>
+            <w:vAlign w:val="center"/>
+          </w:tcPr>
+          <w:p>
+            <w:pPr>
+              <w:spacing w:after="0" w:before="0"/>
+            </w:pPr>
+            <w:r>
+              <w:rPr>
+                <w:rFonts w:ascii="Arial" w:cs="Arial" w:eastAsia="Arial" w:hAnsi="Arial"/>
+                <w:color w:val="1B2118"/>
+                <w:sz w:val="18"/>
+                <w:szCs w:val="18"/>
+              </w:rPr>
+              <w:t xml:space="preserve">Fondazione Operate</w:t>
+            </w:r>
+          </w:p>
+        </w:tc>
+      </w:tr>
+      <w:tr>
+        <w:trPr>
+          <w:cantSplit/>
+        </w:trPr>
+        <w:tc>
+          <w:tcPr>
+            <w:tcW w:type="dxa" w:w="800"/>
+            <w:tcBorders>
+              <w:top w:val="single" w:color="D9D4C5" w:sz="4"/>
+              <w:left w:val="single" w:color="D9D4C5" w:sz="4"/>
+              <w:bottom w:val="single" w:color="D9D4C5" w:sz="4"/>
+              <w:right w:val="single" w:color="D9D4C5" w:sz="4"/>
+            </w:tcBorders>
+            <w:shd w:fill="F6F4EE" w:color="auto" w:val="clear"/>
+            <w:tcMar>
+              <w:top w:type="dxa" w:w="70"/>
+              <w:left w:type="dxa" w:w="110"/>
+              <w:bottom w:type="dxa" w:w="70"/>
+              <w:right w:type="dxa" w:w="110"/>
+            </w:tcMar>
+            <w:vAlign w:val="center"/>
+          </w:tcPr>
+          <w:p>
+            <w:pPr>
+              <w:spacing w:after="0" w:before="0"/>
+            </w:pPr>
+            <w:r>
+              <w:rPr>
+                <w:rFonts w:ascii="Arial" w:cs="Arial" w:eastAsia="Arial" w:hAnsi="Arial"/>
+                <w:color w:val="1B2118"/>
+                <w:sz w:val="18"/>
+                <w:szCs w:val="18"/>
+              </w:rPr>
               <w:t xml:space="preserve">1.0</w:t>
             </w:r>
           </w:p>
@@ -1272,6 +1406,7 @@
               <w:bottom w:val="single" w:color="D9D4C5" w:sz="4"/>
               <w:right w:val="single" w:color="D9D4C5" w:sz="4"/>
             </w:tcBorders>
+            <w:shd w:fill="F6F4EE" w:color="auto" w:val="clear"/>
             <w:tcMar>
               <w:top w:type="dxa" w:w="70"/>
               <w:left w:type="dxa" w:w="110"/>
@@ -1304,6 +1439,7 @@
               <w:bottom w:val="single" w:color="D9D4C5" w:sz="4"/>
               <w:right w:val="single" w:color="D9D4C5" w:sz="4"/>
             </w:tcBorders>
+            <w:shd w:fill="F6F4EE" w:color="auto" w:val="clear"/>
             <w:tcMar>
               <w:top w:type="dxa" w:w="70"/>
               <w:left w:type="dxa" w:w="110"/>
@@ -1336,6 +1472,7 @@
               <w:bottom w:val="single" w:color="D9D4C5" w:sz="4"/>
               <w:right w:val="single" w:color="D9D4C5" w:sz="4"/>
             </w:tcBorders>
+            <w:shd w:fill="F6F4EE" w:color="auto" w:val="clear"/>
             <w:tcMar>
               <w:top w:type="dxa" w:w="70"/>
               <w:left w:type="dxa" w:w="110"/>
@@ -1377,7 +1514,7 @@
           <w:sz w:val="20"/>
           <w:szCs w:val="20"/>
         </w:rPr>
-        <w:t xml:space="preserve">Istruzioni alla revisione 1.4 del 20/10/2026. Si aggiornano quando cambiano servizi, piani, script del database, funzioni o chiavi; una copia è dentro ogni archivio di backup e la versione corrente si scarica dall'area Documentazione del portale (solo Amministratori).</w:t>
+        <w:t xml:space="preserve">Istruzioni alla revisione 1.5 del 20/10/2026. Si aggiornano quando cambiano servizi, piani, script del database, funzioni o chiavi; una copia è dentro ogni archivio di backup e la versione corrente si scarica dall'area Documentazione del portale (solo Amministratori).</w:t>
       </w:r>
     </w:p>
     <w:p>
@@ -2873,7 +3010,7 @@
                 <w:sz w:val="18"/>
                 <w:szCs w:val="18"/>
               </w:rPr>
-              <w:t xml:space="preserve">Tutto il codice, gli script del database (01-33), le funzioni del server, i manuali e la loro storia</w:t>
+              <w:t xml:space="preserve">Tutto il codice, gli script del database (01-34), le funzioni del server, i manuali e la loro storia</w:t>
             </w:r>
           </w:p>
         </w:tc>
@@ -9517,7 +9654,61 @@
           <w:sz w:val="21"/>
           <w:szCs w:val="21"/>
         </w:rPr>
-        <w:t xml:space="preserve"> con i valori del nuovo progetto e ripubblicate (</w:t>
+        <w:t xml:space="preserve"> con i valori del nuovo progetto. Nel file </w:t>
+      </w:r>
+      <w:r>
+        <w:rPr>
+          <w:rFonts w:ascii="Consolas" w:cs="Consolas" w:eastAsia="Consolas" w:hAnsi="Consolas"/>
+          <w:color w:val="2F5D3A"/>
+          <w:sz w:val="21"/>
+          <w:szCs w:val="21"/>
+        </w:rPr>
+        <w:t xml:space="preserve">vercel.json</w:t>
+      </w:r>
+      <w:r>
+        <w:rPr>
+          <w:rFonts w:ascii="Arial" w:cs="Arial" w:eastAsia="Arial" w:hAnsi="Arial"/>
+          <w:color w:val="1B2118"/>
+          <w:sz w:val="21"/>
+          <w:szCs w:val="21"/>
+        </w:rPr>
+        <w:t xml:space="preserve"> del repository sostituite l'indirizzo del vecchio progetto (</w:t>
+      </w:r>
+      <w:r>
+        <w:rPr>
+          <w:rFonts w:ascii="Consolas" w:cs="Consolas" w:eastAsia="Consolas" w:hAnsi="Consolas"/>
+          <w:color w:val="2F5D3A"/>
+          <w:sz w:val="21"/>
+          <w:szCs w:val="21"/>
+        </w:rPr>
+        <w:t xml:space="preserve">ajxrnofgunynkynozmrn.supabase.co</w:t>
+      </w:r>
+      <w:r>
+        <w:rPr>
+          <w:rFonts w:ascii="Arial" w:cs="Arial" w:eastAsia="Arial" w:hAnsi="Arial"/>
+          <w:color w:val="1B2118"/>
+          <w:sz w:val="21"/>
+          <w:szCs w:val="21"/>
+        </w:rPr>
+        <w:t xml:space="preserve">, 4 volte) con quello nuovo, nella regola </w:t>
+      </w:r>
+      <w:r>
+        <w:rPr>
+          <w:rFonts w:ascii="Consolas" w:cs="Consolas" w:eastAsia="Consolas" w:hAnsi="Consolas"/>
+          <w:color w:val="2F5D3A"/>
+          <w:sz w:val="21"/>
+          <w:szCs w:val="21"/>
+        </w:rPr>
+        <w:t xml:space="preserve">Content-Security-Policy</w:t>
+      </w:r>
+      <w:r>
+        <w:rPr>
+          <w:rFonts w:ascii="Arial" w:cs="Arial" w:eastAsia="Arial" w:hAnsi="Arial"/>
+          <w:color w:val="1B2118"/>
+          <w:sz w:val="21"/>
+          <w:szCs w:val="21"/>
+        </w:rPr>
+        <w:t xml:space="preserve">: altrimenti il browser blocca i collegamenti al database e il portale non funziona. Poi ripubblicate (</w:t>
       </w:r>
       <w:r>
         <w:rPr>
@@ -12193,7 +12384,7 @@
         <w:szCs w:val="16"/>
       </w:rPr>
       <w:tab/>
-      <w:t xml:space="preserve">Istruzioni di ripristino · Rev. 1.4 · 20/10/2026</w:t>
+      <w:t xml:space="preserve">Istruzioni di ripristino · Rev. 1.5 · 20/10/2026</w:t>
     </w:r>
   </w:p>
 </w:hdr>
@@ -12258,7 +12449,7 @@
         <w:szCs w:val="16"/>
       </w:rPr>
       <w:tab/>
-      <w:t xml:space="preserve">Istruzioni di ripristino · Rev. 1.4 · 20/10/2026</w:t>
+      <w:t xml:space="preserve">Istruzioni di ripristino · Rev. 1.5 · 20/10/2026</w:t>
     </w:r>
   </w:p>
 </w:hdr>

</xml_diff>

<commit_message>
Documentazione aggiornata dopo il collaudo V05: manuali, Registro, ripristino (script 01-35), presentazione 2.9, base di conoscenza
Co-Authored-By: Claude Opus 5.5 <noreply@anthropic.com>
Claude-Session: https://claude.ai/code/session_01E8XCbEeVHWVP3hntUZ6kZ1
</commit_message>
<xml_diff>
--- a/public/documentazione/Istruzioni_Ripristino_Portale_CWP.docx
+++ b/public/documentazione/Istruzioni_Ripristino_Portale_CWP.docx
@@ -302,7 +302,7 @@
                 <w:sz w:val="20"/>
                 <w:szCs w:val="20"/>
               </w:rPr>
-              <w:t xml:space="preserve">Rev. 1.5</w:t>
+              <w:t xml:space="preserve">Rev. 1.6</w:t>
             </w:r>
           </w:p>
         </w:tc>
@@ -365,7 +365,7 @@
                 <w:sz w:val="20"/>
                 <w:szCs w:val="20"/>
               </w:rPr>
-              <w:t xml:space="preserve">20/10/2026</w:t>
+              <w:t xml:space="preserve">21/10/2026</w:t>
             </w:r>
           </w:p>
         </w:tc>
@@ -719,7 +719,7 @@
                 <w:sz w:val="18"/>
                 <w:szCs w:val="18"/>
               </w:rPr>
-              <w:t xml:space="preserve">1.5</w:t>
+              <w:t xml:space="preserve">1.6</w:t>
             </w:r>
           </w:p>
         </w:tc>
@@ -751,7 +751,7 @@
                 <w:sz w:val="18"/>
                 <w:szCs w:val="18"/>
               </w:rPr>
-              <w:t xml:space="preserve">20/10/2026</w:t>
+              <w:t xml:space="preserve">21/10/2026</w:t>
             </w:r>
           </w:p>
         </w:tc>
@@ -783,7 +783,7 @@
                 <w:sz w:val="18"/>
                 <w:szCs w:val="18"/>
               </w:rPr>
-              <w:t xml:space="preserve">Indirizzo Supabase nella Content-Security-Policy di vercel.json; script 01-34.</w:t>
+              <w:t xml:space="preserve">Ricostruzione del database con gli script da 01 a 35 (simulatore, Amministratore principale, assistente, utenti online, Audit User, avvisi di sicurezza, controlli del collaudo).</w:t>
             </w:r>
           </w:p>
         </w:tc>
@@ -853,7 +853,7 @@
                 <w:sz w:val="18"/>
                 <w:szCs w:val="18"/>
               </w:rPr>
-              <w:t xml:space="preserve">1.4</w:t>
+              <w:t xml:space="preserve">1.5</w:t>
             </w:r>
           </w:p>
         </w:tc>
@@ -919,7 +919,7 @@
                 <w:sz w:val="18"/>
                 <w:szCs w:val="18"/>
               </w:rPr>
-              <w:t xml:space="preserve">Amministratore principale e verifiche dopo il ripristino (Audit User, assistente).</w:t>
+              <w:t xml:space="preserve">Indirizzo Supabase nella Content-Security-Policy di vercel.json; script 01-34.</w:t>
             </w:r>
           </w:p>
         </w:tc>
@@ -989,7 +989,7 @@
                 <w:sz w:val="18"/>
                 <w:szCs w:val="18"/>
               </w:rPr>
-              <w:t xml:space="preserve">1.3</w:t>
+              <w:t xml:space="preserve">1.4</w:t>
             </w:r>
           </w:p>
         </w:tc>
@@ -1053,7 +1053,7 @@
                 <w:sz w:val="18"/>
                 <w:szCs w:val="18"/>
               </w:rPr>
-              <w:t xml:space="preserve">Script 01-33.</w:t>
+              <w:t xml:space="preserve">Amministratore principale e verifiche dopo il ripristino (Audit User, assistente).</w:t>
             </w:r>
           </w:p>
         </w:tc>
@@ -1123,7 +1123,7 @@
                 <w:sz w:val="18"/>
                 <w:szCs w:val="18"/>
               </w:rPr>
-              <w:t xml:space="preserve">1.2</w:t>
+              <w:t xml:space="preserve">1.3</w:t>
             </w:r>
           </w:p>
         </w:tc>
@@ -1189,7 +1189,7 @@
                 <w:sz w:val="18"/>
                 <w:szCs w:val="18"/>
               </w:rPr>
-              <w:t xml:space="preserve">Script 01-32.</w:t>
+              <w:t xml:space="preserve">Script 01-33.</w:t>
             </w:r>
           </w:p>
         </w:tc>
@@ -1259,7 +1259,7 @@
                 <w:sz w:val="18"/>
                 <w:szCs w:val="18"/>
               </w:rPr>
-              <w:t xml:space="preserve">1.1</w:t>
+              <w:t xml:space="preserve">1.2</w:t>
             </w:r>
           </w:p>
         </w:tc>
@@ -1291,7 +1291,7 @@
                 <w:sz w:val="18"/>
                 <w:szCs w:val="18"/>
               </w:rPr>
-              <w:t xml:space="preserve">19/10/2026</w:t>
+              <w:t xml:space="preserve">20/10/2026</w:t>
             </w:r>
           </w:p>
         </w:tc>
@@ -1323,7 +1323,7 @@
                 <w:sz w:val="18"/>
                 <w:szCs w:val="18"/>
               </w:rPr>
-              <w:t xml:space="preserve">Funzione assistente e chiave ANTHROPIC_API_KEY; Claude Console tra i servizi; script 01-31.</w:t>
+              <w:t xml:space="preserve">Script 01-32.</w:t>
             </w:r>
           </w:p>
         </w:tc>
@@ -1393,6 +1393,142 @@
                 <w:sz w:val="18"/>
                 <w:szCs w:val="18"/>
               </w:rPr>
+              <w:t xml:space="preserve">1.1</w:t>
+            </w:r>
+          </w:p>
+        </w:tc>
+        <w:tc>
+          <w:tcPr>
+            <w:tcW w:type="dxa" w:w="1300"/>
+            <w:tcBorders>
+              <w:top w:val="single" w:color="D9D4C5" w:sz="4"/>
+              <w:left w:val="single" w:color="D9D4C5" w:sz="4"/>
+              <w:bottom w:val="single" w:color="D9D4C5" w:sz="4"/>
+              <w:right w:val="single" w:color="D9D4C5" w:sz="4"/>
+            </w:tcBorders>
+            <w:shd w:fill="F6F4EE" w:color="auto" w:val="clear"/>
+            <w:tcMar>
+              <w:top w:type="dxa" w:w="70"/>
+              <w:left w:type="dxa" w:w="110"/>
+              <w:bottom w:type="dxa" w:w="70"/>
+              <w:right w:type="dxa" w:w="110"/>
+            </w:tcMar>
+            <w:vAlign w:val="center"/>
+          </w:tcPr>
+          <w:p>
+            <w:pPr>
+              <w:spacing w:after="0" w:before="0"/>
+            </w:pPr>
+            <w:r>
+              <w:rPr>
+                <w:rFonts w:ascii="Arial" w:cs="Arial" w:eastAsia="Arial" w:hAnsi="Arial"/>
+                <w:color w:val="1B2118"/>
+                <w:sz w:val="18"/>
+                <w:szCs w:val="18"/>
+              </w:rPr>
+              <w:t xml:space="preserve">19/10/2026</w:t>
+            </w:r>
+          </w:p>
+        </w:tc>
+        <w:tc>
+          <w:tcPr>
+            <w:tcW w:type="dxa" w:w="5538"/>
+            <w:tcBorders>
+              <w:top w:val="single" w:color="D9D4C5" w:sz="4"/>
+              <w:left w:val="single" w:color="D9D4C5" w:sz="4"/>
+              <w:bottom w:val="single" w:color="D9D4C5" w:sz="4"/>
+              <w:right w:val="single" w:color="D9D4C5" w:sz="4"/>
+            </w:tcBorders>
+            <w:shd w:fill="F6F4EE" w:color="auto" w:val="clear"/>
+            <w:tcMar>
+              <w:top w:type="dxa" w:w="70"/>
+              <w:left w:type="dxa" w:w="110"/>
+              <w:bottom w:type="dxa" w:w="70"/>
+              <w:right w:type="dxa" w:w="110"/>
+            </w:tcMar>
+            <w:vAlign w:val="center"/>
+          </w:tcPr>
+          <w:p>
+            <w:pPr>
+              <w:spacing w:after="0" w:before="0"/>
+            </w:pPr>
+            <w:r>
+              <w:rPr>
+                <w:rFonts w:ascii="Arial" w:cs="Arial" w:eastAsia="Arial" w:hAnsi="Arial"/>
+                <w:color w:val="1B2118"/>
+                <w:sz w:val="18"/>
+                <w:szCs w:val="18"/>
+              </w:rPr>
+              <w:t xml:space="preserve">Funzione assistente e chiave ANTHROPIC_API_KEY; Claude Console tra i servizi; script 01-31.</w:t>
+            </w:r>
+          </w:p>
+        </w:tc>
+        <w:tc>
+          <w:tcPr>
+            <w:tcW w:type="dxa" w:w="2000"/>
+            <w:tcBorders>
+              <w:top w:val="single" w:color="D9D4C5" w:sz="4"/>
+              <w:left w:val="single" w:color="D9D4C5" w:sz="4"/>
+              <w:bottom w:val="single" w:color="D9D4C5" w:sz="4"/>
+              <w:right w:val="single" w:color="D9D4C5" w:sz="4"/>
+            </w:tcBorders>
+            <w:shd w:fill="F6F4EE" w:color="auto" w:val="clear"/>
+            <w:tcMar>
+              <w:top w:type="dxa" w:w="70"/>
+              <w:left w:type="dxa" w:w="110"/>
+              <w:bottom w:type="dxa" w:w="70"/>
+              <w:right w:type="dxa" w:w="110"/>
+            </w:tcMar>
+            <w:vAlign w:val="center"/>
+          </w:tcPr>
+          <w:p>
+            <w:pPr>
+              <w:spacing w:after="0" w:before="0"/>
+            </w:pPr>
+            <w:r>
+              <w:rPr>
+                <w:rFonts w:ascii="Arial" w:cs="Arial" w:eastAsia="Arial" w:hAnsi="Arial"/>
+                <w:color w:val="1B2118"/>
+                <w:sz w:val="18"/>
+                <w:szCs w:val="18"/>
+              </w:rPr>
+              <w:t xml:space="preserve">Fondazione Operate</w:t>
+            </w:r>
+          </w:p>
+        </w:tc>
+      </w:tr>
+      <w:tr>
+        <w:trPr>
+          <w:cantSplit/>
+        </w:trPr>
+        <w:tc>
+          <w:tcPr>
+            <w:tcW w:type="dxa" w:w="800"/>
+            <w:tcBorders>
+              <w:top w:val="single" w:color="D9D4C5" w:sz="4"/>
+              <w:left w:val="single" w:color="D9D4C5" w:sz="4"/>
+              <w:bottom w:val="single" w:color="D9D4C5" w:sz="4"/>
+              <w:right w:val="single" w:color="D9D4C5" w:sz="4"/>
+            </w:tcBorders>
+            <w:tcMar>
+              <w:top w:type="dxa" w:w="70"/>
+              <w:left w:type="dxa" w:w="110"/>
+              <w:bottom w:type="dxa" w:w="70"/>
+              <w:right w:type="dxa" w:w="110"/>
+            </w:tcMar>
+            <w:vAlign w:val="center"/>
+          </w:tcPr>
+          <w:p>
+            <w:pPr>
+              <w:spacing w:after="0" w:before="0"/>
+            </w:pPr>
+            <w:r>
+              <w:rPr>
+                <w:rFonts w:ascii="Arial" w:cs="Arial" w:eastAsia="Arial" w:hAnsi="Arial"/>
+                <w:color w:val="1B2118"/>
+                <w:sz w:val="18"/>
+                <w:szCs w:val="18"/>
+              </w:rPr>
               <w:t xml:space="preserve">1.0</w:t>
             </w:r>
           </w:p>
@@ -1406,7 +1542,6 @@
               <w:bottom w:val="single" w:color="D9D4C5" w:sz="4"/>
               <w:right w:val="single" w:color="D9D4C5" w:sz="4"/>
             </w:tcBorders>
-            <w:shd w:fill="F6F4EE" w:color="auto" w:val="clear"/>
             <w:tcMar>
               <w:top w:type="dxa" w:w="70"/>
               <w:left w:type="dxa" w:w="110"/>
@@ -1439,7 +1574,6 @@
               <w:bottom w:val="single" w:color="D9D4C5" w:sz="4"/>
               <w:right w:val="single" w:color="D9D4C5" w:sz="4"/>
             </w:tcBorders>
-            <w:shd w:fill="F6F4EE" w:color="auto" w:val="clear"/>
             <w:tcMar>
               <w:top w:type="dxa" w:w="70"/>
               <w:left w:type="dxa" w:w="110"/>
@@ -1472,7 +1606,6 @@
               <w:bottom w:val="single" w:color="D9D4C5" w:sz="4"/>
               <w:right w:val="single" w:color="D9D4C5" w:sz="4"/>
             </w:tcBorders>
-            <w:shd w:fill="F6F4EE" w:color="auto" w:val="clear"/>
             <w:tcMar>
               <w:top w:type="dxa" w:w="70"/>
               <w:left w:type="dxa" w:w="110"/>
@@ -1514,7 +1647,7 @@
           <w:sz w:val="20"/>
           <w:szCs w:val="20"/>
         </w:rPr>
-        <w:t xml:space="preserve">Istruzioni alla revisione 1.5 del 20/10/2026. Si aggiornano quando cambiano servizi, piani, script del database, funzioni o chiavi; una copia è dentro ogni archivio di backup e la versione corrente si scarica dall'area Documentazione del portale (solo Amministratori).</w:t>
+        <w:t xml:space="preserve">Istruzioni alla revisione 1.6 del 21/10/2026. Si aggiornano quando cambiano servizi, piani, script del database, funzioni o chiavi; una copia è dentro ogni archivio di backup e la versione corrente si scarica dall'area Documentazione del portale (solo Amministratori).</w:t>
       </w:r>
     </w:p>
     <w:p>
@@ -3010,7 +3143,7 @@
                 <w:sz w:val="18"/>
                 <w:szCs w:val="18"/>
               </w:rPr>
-              <w:t xml:space="preserve">Tutto il codice, gli script del database (01-34), le funzioni del server, i manuali e la loro storia</w:t>
+              <w:t xml:space="preserve">Tutto il codice, gli script del database (01-35), le funzioni del server, i manuali e la loro storia</w:t>
             </w:r>
           </w:p>
         </w:tc>
@@ -7617,7 +7750,7 @@
           <w:sz w:val="21"/>
           <w:szCs w:val="21"/>
         </w:rPr>
-        <w:t xml:space="preserve">27_soggetto_promotore.sql</w:t>
+        <w:t xml:space="preserve">35_controlli_collaudo.sql</w:t>
       </w:r>
       <w:r>
         <w:rPr>
@@ -7888,6 +8021,25 @@
           <w:szCs w:val="21"/>
         </w:rPr>
         <w:t xml:space="preserve">), con gli stessi nomi di file;</w:t>
+      </w:r>
+    </w:p>
+    <w:p>
+      <w:pPr>
+        <w:pStyle w:val="ListParagraph"/>
+        <w:numPr>
+          <w:ilvl w:val="0"/>
+          <w:numId w:val="2"/>
+        </w:numPr>
+        <w:spacing w:after="70" w:line="290"/>
+      </w:pPr>
+      <w:r>
+        <w:rPr>
+          <w:rFonts w:ascii="Arial" w:cs="Arial" w:eastAsia="Arial" w:hAnsi="Arial"/>
+          <w:color w:val="1B2118"/>
+          <w:sz w:val="21"/>
+          <w:szCs w:val="21"/>
+        </w:rPr>
+        <w:t xml:space="preserve">gli script dal 28 al 35 aggiungono simulatore, Amministratore principale (29), eliminazione degli utenti mai attivi, assistente, utenti online, Audit User, avvisi di sicurezza (34) e i controlli dei dati chiesti dal collaudo (35); il 35 termina con un conteggio di sola lettura che su un database nuovo vale 0 in tutte le righe;</w:t>
       </w:r>
     </w:p>
     <w:p>
@@ -12384,7 +12536,7 @@
         <w:szCs w:val="16"/>
       </w:rPr>
       <w:tab/>
-      <w:t xml:space="preserve">Istruzioni di ripristino · Rev. 1.5 · 20/10/2026</w:t>
+      <w:t xml:space="preserve">Istruzioni di ripristino · Rev. 1.6 · 21/10/2026</w:t>
     </w:r>
   </w:p>
 </w:hdr>
@@ -12449,7 +12601,7 @@
         <w:szCs w:val="16"/>
       </w:rPr>
       <w:tab/>
-      <w:t xml:space="preserve">Istruzioni di ripristino · Rev. 1.5 · 20/10/2026</w:t>
+      <w:t xml:space="preserve">Istruzioni di ripristino · Rev. 1.6 · 21/10/2026</w:t>
     </w:r>
   </w:p>
 </w:hdr>

</xml_diff>

<commit_message>
Backup automatico su Google Drive (Apps Script, 13 e 21) e strumenti di ripristino provati; R08 nei documenti; Ripristino 1.7, Registro 5.5, Registro issue 1.1, presentazione 3.0
Co-Authored-By: Claude Opus 5.5 <noreply@anthropic.com>
Claude-Session: https://claude.ai/code/session_01E8XCbEeVHWVP3hntUZ6kZ1
</commit_message>
<xml_diff>
--- a/public/documentazione/Istruzioni_Ripristino_Portale_CWP.docx
+++ b/public/documentazione/Istruzioni_Ripristino_Portale_CWP.docx
@@ -302,7 +302,7 @@
                 <w:sz w:val="20"/>
                 <w:szCs w:val="20"/>
               </w:rPr>
-              <w:t xml:space="preserve">Rev. 1.6</w:t>
+              <w:t xml:space="preserve">Rev. 1.7</w:t>
             </w:r>
           </w:p>
         </w:tc>
@@ -719,7 +719,7 @@
                 <w:sz w:val="18"/>
                 <w:szCs w:val="18"/>
               </w:rPr>
-              <w:t xml:space="preserve">1.6</w:t>
+              <w:t xml:space="preserve">1.7</w:t>
             </w:r>
           </w:p>
         </w:tc>
@@ -783,7 +783,7 @@
                 <w:sz w:val="18"/>
                 <w:szCs w:val="18"/>
               </w:rPr>
-              <w:t xml:space="preserve">Ricostruzione del database con gli script da 01 a 35 (simulatore, Amministratore principale, assistente, utenti online, Audit User, avvisi di sicurezza, controlli del collaudo).</w:t>
+              <w:t xml:space="preserve">Backup automatico su Google Drive alle 13 e alle 21 (installazione, contenuto) e ripristino da un backup automatico, provato sul banco locale.</w:t>
             </w:r>
           </w:p>
         </w:tc>
@@ -853,7 +853,7 @@
                 <w:sz w:val="18"/>
                 <w:szCs w:val="18"/>
               </w:rPr>
-              <w:t xml:space="preserve">1.5</w:t>
+              <w:t xml:space="preserve">1.6</w:t>
             </w:r>
           </w:p>
         </w:tc>
@@ -886,7 +886,7 @@
                 <w:sz w:val="18"/>
                 <w:szCs w:val="18"/>
               </w:rPr>
-              <w:t xml:space="preserve">20/10/2026</w:t>
+              <w:t xml:space="preserve">21/10/2026</w:t>
             </w:r>
           </w:p>
         </w:tc>
@@ -919,7 +919,7 @@
                 <w:sz w:val="18"/>
                 <w:szCs w:val="18"/>
               </w:rPr>
-              <w:t xml:space="preserve">Indirizzo Supabase nella Content-Security-Policy di vercel.json; script 01-34.</w:t>
+              <w:t xml:space="preserve">Ricostruzione del database con gli script da 01 a 35 (simulatore, Amministratore principale, assistente, utenti online, Audit User, avvisi di sicurezza, controlli del collaudo).</w:t>
             </w:r>
           </w:p>
         </w:tc>
@@ -989,7 +989,7 @@
                 <w:sz w:val="18"/>
                 <w:szCs w:val="18"/>
               </w:rPr>
-              <w:t xml:space="preserve">1.4</w:t>
+              <w:t xml:space="preserve">1.5</w:t>
             </w:r>
           </w:p>
         </w:tc>
@@ -1053,7 +1053,7 @@
                 <w:sz w:val="18"/>
                 <w:szCs w:val="18"/>
               </w:rPr>
-              <w:t xml:space="preserve">Amministratore principale e verifiche dopo il ripristino (Audit User, assistente).</w:t>
+              <w:t xml:space="preserve">Indirizzo Supabase nella Content-Security-Policy di vercel.json; script 01-34.</w:t>
             </w:r>
           </w:p>
         </w:tc>
@@ -1123,7 +1123,7 @@
                 <w:sz w:val="18"/>
                 <w:szCs w:val="18"/>
               </w:rPr>
-              <w:t xml:space="preserve">1.3</w:t>
+              <w:t xml:space="preserve">1.4</w:t>
             </w:r>
           </w:p>
         </w:tc>
@@ -1189,7 +1189,7 @@
                 <w:sz w:val="18"/>
                 <w:szCs w:val="18"/>
               </w:rPr>
-              <w:t xml:space="preserve">Script 01-33.</w:t>
+              <w:t xml:space="preserve">Amministratore principale e verifiche dopo il ripristino (Audit User, assistente).</w:t>
             </w:r>
           </w:p>
         </w:tc>
@@ -1259,7 +1259,7 @@
                 <w:sz w:val="18"/>
                 <w:szCs w:val="18"/>
               </w:rPr>
-              <w:t xml:space="preserve">1.2</w:t>
+              <w:t xml:space="preserve">1.3</w:t>
             </w:r>
           </w:p>
         </w:tc>
@@ -1323,7 +1323,7 @@
                 <w:sz w:val="18"/>
                 <w:szCs w:val="18"/>
               </w:rPr>
-              <w:t xml:space="preserve">Script 01-32.</w:t>
+              <w:t xml:space="preserve">Script 01-33.</w:t>
             </w:r>
           </w:p>
         </w:tc>
@@ -1393,7 +1393,7 @@
                 <w:sz w:val="18"/>
                 <w:szCs w:val="18"/>
               </w:rPr>
-              <w:t xml:space="preserve">1.1</w:t>
+              <w:t xml:space="preserve">1.2</w:t>
             </w:r>
           </w:p>
         </w:tc>
@@ -1426,7 +1426,7 @@
                 <w:sz w:val="18"/>
                 <w:szCs w:val="18"/>
               </w:rPr>
-              <w:t xml:space="preserve">19/10/2026</w:t>
+              <w:t xml:space="preserve">20/10/2026</w:t>
             </w:r>
           </w:p>
         </w:tc>
@@ -1459,7 +1459,7 @@
                 <w:sz w:val="18"/>
                 <w:szCs w:val="18"/>
               </w:rPr>
-              <w:t xml:space="preserve">Funzione assistente e chiave ANTHROPIC_API_KEY; Claude Console tra i servizi; script 01-31.</w:t>
+              <w:t xml:space="preserve">Script 01-32.</w:t>
             </w:r>
           </w:p>
         </w:tc>
@@ -1529,6 +1529,140 @@
                 <w:sz w:val="18"/>
                 <w:szCs w:val="18"/>
               </w:rPr>
+              <w:t xml:space="preserve">1.1</w:t>
+            </w:r>
+          </w:p>
+        </w:tc>
+        <w:tc>
+          <w:tcPr>
+            <w:tcW w:type="dxa" w:w="1300"/>
+            <w:tcBorders>
+              <w:top w:val="single" w:color="D9D4C5" w:sz="4"/>
+              <w:left w:val="single" w:color="D9D4C5" w:sz="4"/>
+              <w:bottom w:val="single" w:color="D9D4C5" w:sz="4"/>
+              <w:right w:val="single" w:color="D9D4C5" w:sz="4"/>
+            </w:tcBorders>
+            <w:tcMar>
+              <w:top w:type="dxa" w:w="70"/>
+              <w:left w:type="dxa" w:w="110"/>
+              <w:bottom w:type="dxa" w:w="70"/>
+              <w:right w:type="dxa" w:w="110"/>
+            </w:tcMar>
+            <w:vAlign w:val="center"/>
+          </w:tcPr>
+          <w:p>
+            <w:pPr>
+              <w:spacing w:after="0" w:before="0"/>
+            </w:pPr>
+            <w:r>
+              <w:rPr>
+                <w:rFonts w:ascii="Arial" w:cs="Arial" w:eastAsia="Arial" w:hAnsi="Arial"/>
+                <w:color w:val="1B2118"/>
+                <w:sz w:val="18"/>
+                <w:szCs w:val="18"/>
+              </w:rPr>
+              <w:t xml:space="preserve">19/10/2026</w:t>
+            </w:r>
+          </w:p>
+        </w:tc>
+        <w:tc>
+          <w:tcPr>
+            <w:tcW w:type="dxa" w:w="5538"/>
+            <w:tcBorders>
+              <w:top w:val="single" w:color="D9D4C5" w:sz="4"/>
+              <w:left w:val="single" w:color="D9D4C5" w:sz="4"/>
+              <w:bottom w:val="single" w:color="D9D4C5" w:sz="4"/>
+              <w:right w:val="single" w:color="D9D4C5" w:sz="4"/>
+            </w:tcBorders>
+            <w:tcMar>
+              <w:top w:type="dxa" w:w="70"/>
+              <w:left w:type="dxa" w:w="110"/>
+              <w:bottom w:type="dxa" w:w="70"/>
+              <w:right w:type="dxa" w:w="110"/>
+            </w:tcMar>
+            <w:vAlign w:val="center"/>
+          </w:tcPr>
+          <w:p>
+            <w:pPr>
+              <w:spacing w:after="0" w:before="0"/>
+            </w:pPr>
+            <w:r>
+              <w:rPr>
+                <w:rFonts w:ascii="Arial" w:cs="Arial" w:eastAsia="Arial" w:hAnsi="Arial"/>
+                <w:color w:val="1B2118"/>
+                <w:sz w:val="18"/>
+                <w:szCs w:val="18"/>
+              </w:rPr>
+              <w:t xml:space="preserve">Funzione assistente e chiave ANTHROPIC_API_KEY; Claude Console tra i servizi; script 01-31.</w:t>
+            </w:r>
+          </w:p>
+        </w:tc>
+        <w:tc>
+          <w:tcPr>
+            <w:tcW w:type="dxa" w:w="2000"/>
+            <w:tcBorders>
+              <w:top w:val="single" w:color="D9D4C5" w:sz="4"/>
+              <w:left w:val="single" w:color="D9D4C5" w:sz="4"/>
+              <w:bottom w:val="single" w:color="D9D4C5" w:sz="4"/>
+              <w:right w:val="single" w:color="D9D4C5" w:sz="4"/>
+            </w:tcBorders>
+            <w:tcMar>
+              <w:top w:type="dxa" w:w="70"/>
+              <w:left w:type="dxa" w:w="110"/>
+              <w:bottom w:type="dxa" w:w="70"/>
+              <w:right w:type="dxa" w:w="110"/>
+            </w:tcMar>
+            <w:vAlign w:val="center"/>
+          </w:tcPr>
+          <w:p>
+            <w:pPr>
+              <w:spacing w:after="0" w:before="0"/>
+            </w:pPr>
+            <w:r>
+              <w:rPr>
+                <w:rFonts w:ascii="Arial" w:cs="Arial" w:eastAsia="Arial" w:hAnsi="Arial"/>
+                <w:color w:val="1B2118"/>
+                <w:sz w:val="18"/>
+                <w:szCs w:val="18"/>
+              </w:rPr>
+              <w:t xml:space="preserve">Fondazione Operate</w:t>
+            </w:r>
+          </w:p>
+        </w:tc>
+      </w:tr>
+      <w:tr>
+        <w:trPr>
+          <w:cantSplit/>
+        </w:trPr>
+        <w:tc>
+          <w:tcPr>
+            <w:tcW w:type="dxa" w:w="800"/>
+            <w:tcBorders>
+              <w:top w:val="single" w:color="D9D4C5" w:sz="4"/>
+              <w:left w:val="single" w:color="D9D4C5" w:sz="4"/>
+              <w:bottom w:val="single" w:color="D9D4C5" w:sz="4"/>
+              <w:right w:val="single" w:color="D9D4C5" w:sz="4"/>
+            </w:tcBorders>
+            <w:shd w:fill="F6F4EE" w:color="auto" w:val="clear"/>
+            <w:tcMar>
+              <w:top w:type="dxa" w:w="70"/>
+              <w:left w:type="dxa" w:w="110"/>
+              <w:bottom w:type="dxa" w:w="70"/>
+              <w:right w:type="dxa" w:w="110"/>
+            </w:tcMar>
+            <w:vAlign w:val="center"/>
+          </w:tcPr>
+          <w:p>
+            <w:pPr>
+              <w:spacing w:after="0" w:before="0"/>
+            </w:pPr>
+            <w:r>
+              <w:rPr>
+                <w:rFonts w:ascii="Arial" w:cs="Arial" w:eastAsia="Arial" w:hAnsi="Arial"/>
+                <w:color w:val="1B2118"/>
+                <w:sz w:val="18"/>
+                <w:szCs w:val="18"/>
+              </w:rPr>
               <w:t xml:space="preserve">1.0</w:t>
             </w:r>
           </w:p>
@@ -1542,6 +1676,7 @@
               <w:bottom w:val="single" w:color="D9D4C5" w:sz="4"/>
               <w:right w:val="single" w:color="D9D4C5" w:sz="4"/>
             </w:tcBorders>
+            <w:shd w:fill="F6F4EE" w:color="auto" w:val="clear"/>
             <w:tcMar>
               <w:top w:type="dxa" w:w="70"/>
               <w:left w:type="dxa" w:w="110"/>
@@ -1574,6 +1709,7 @@
               <w:bottom w:val="single" w:color="D9D4C5" w:sz="4"/>
               <w:right w:val="single" w:color="D9D4C5" w:sz="4"/>
             </w:tcBorders>
+            <w:shd w:fill="F6F4EE" w:color="auto" w:val="clear"/>
             <w:tcMar>
               <w:top w:type="dxa" w:w="70"/>
               <w:left w:type="dxa" w:w="110"/>
@@ -1606,6 +1742,7 @@
               <w:bottom w:val="single" w:color="D9D4C5" w:sz="4"/>
               <w:right w:val="single" w:color="D9D4C5" w:sz="4"/>
             </w:tcBorders>
+            <w:shd w:fill="F6F4EE" w:color="auto" w:val="clear"/>
             <w:tcMar>
               <w:top w:type="dxa" w:w="70"/>
               <w:left w:type="dxa" w:w="110"/>
@@ -1647,7 +1784,7 @@
           <w:sz w:val="20"/>
           <w:szCs w:val="20"/>
         </w:rPr>
-        <w:t xml:space="preserve">Istruzioni alla revisione 1.6 del 21/10/2026. Si aggiornano quando cambiano servizi, piani, script del database, funzioni o chiavi; una copia è dentro ogni archivio di backup e la versione corrente si scarica dall'area Documentazione del portale (solo Amministratori).</w:t>
+        <w:t xml:space="preserve">Istruzioni alla revisione 1.7 del 21/10/2026. Si aggiornano quando cambiano servizi, piani, script del database, funzioni o chiavi; una copia è dentro ogni archivio di backup e la versione corrente si scarica dall'area Documentazione del portale (solo Amministratori).</w:t>
       </w:r>
     </w:p>
     <w:p>
@@ -1776,7 +1913,7 @@
             <w:sz w:val="22"/>
             <w:szCs w:val="22"/>
           </w:rPr>
-          <w:t xml:space="preserve">4.  GitHub e Vercel: tornare alla versione precedente</w:t>
+          <w:t xml:space="preserve">4.  Backup automatico su Google Drive</w:t>
         </w:r>
         <w:r>
           <w:rPr>
@@ -1805,36 +1942,7 @@
             <w:sz w:val="22"/>
             <w:szCs w:val="22"/>
           </w:rPr>
-          <w:t xml:space="preserve">5.  Ripristino di GitHub</w:t>
-        </w:r>
-        <w:r>
-          <w:rPr>
-            <w:rFonts w:ascii="Arial" w:cs="Arial" w:eastAsia="Arial" w:hAnsi="Arial"/>
-            <w:color w:val="1B2118"/>
-            <w:sz w:val="22"/>
-            <w:szCs w:val="22"/>
-          </w:rPr>
-          <w:tab/>
-          <w:t xml:space="preserve">9</w:t>
-        </w:r>
-      </w:hyperlink>
-    </w:p>
-    <w:p>
-      <w:pPr>
-        <w:tabs>
-          <w:tab w:val="right" w:pos="9638" w:leader="dot"/>
-        </w:tabs>
-        <w:spacing w:after="130"/>
-      </w:pPr>
-      <w:hyperlink w:history="1" w:anchor="cap6">
-        <w:r>
-          <w:rPr>
-            <w:rFonts w:ascii="Arial" w:cs="Arial" w:eastAsia="Arial" w:hAnsi="Arial"/>
-            <w:color w:val="1B2118"/>
-            <w:sz w:val="22"/>
-            <w:szCs w:val="22"/>
-          </w:rPr>
-          <w:t xml:space="preserve">6.  Ripristino di Vercel</w:t>
+          <w:t xml:space="preserve">5.  GitHub e Vercel: tornare alla versione precedente</w:t>
         </w:r>
         <w:r>
           <w:rPr>
@@ -1855,7 +1963,7 @@
         </w:tabs>
         <w:spacing w:after="130"/>
       </w:pPr>
-      <w:hyperlink w:history="1" w:anchor="cap7">
+      <w:hyperlink w:history="1" w:anchor="cap6">
         <w:r>
           <w:rPr>
             <w:rFonts w:ascii="Arial" w:cs="Arial" w:eastAsia="Arial" w:hAnsi="Arial"/>
@@ -1863,7 +1971,7 @@
             <w:sz w:val="22"/>
             <w:szCs w:val="22"/>
           </w:rPr>
-          <w:t xml:space="preserve">7.  Supabase: progetto in pausa</w:t>
+          <w:t xml:space="preserve">6.  Ripristino di GitHub</w:t>
         </w:r>
         <w:r>
           <w:rPr>
@@ -1884,7 +1992,7 @@
         </w:tabs>
         <w:spacing w:after="130"/>
       </w:pPr>
-      <w:hyperlink w:history="1" w:anchor="cap8">
+      <w:hyperlink w:history="1" w:anchor="cap7">
         <w:r>
           <w:rPr>
             <w:rFonts w:ascii="Arial" w:cs="Arial" w:eastAsia="Arial" w:hAnsi="Arial"/>
@@ -1892,7 +2000,7 @@
             <w:sz w:val="22"/>
             <w:szCs w:val="22"/>
           </w:rPr>
-          <w:t xml:space="preserve">8.  Supabase: dati cancellati per errore</w:t>
+          <w:t xml:space="preserve">7.  Ripristino di Vercel</w:t>
         </w:r>
         <w:r>
           <w:rPr>
@@ -1913,7 +2021,7 @@
         </w:tabs>
         <w:spacing w:after="130"/>
       </w:pPr>
-      <w:hyperlink w:history="1" w:anchor="cap9">
+      <w:hyperlink w:history="1" w:anchor="cap8">
         <w:r>
           <w:rPr>
             <w:rFonts w:ascii="Arial" w:cs="Arial" w:eastAsia="Arial" w:hAnsi="Arial"/>
@@ -1921,7 +2029,7 @@
             <w:sz w:val="22"/>
             <w:szCs w:val="22"/>
           </w:rPr>
-          <w:t xml:space="preserve">9.  Supabase: ricostruzione da zero</w:t>
+          <w:t xml:space="preserve">8.  Supabase: progetto in pausa</w:t>
         </w:r>
         <w:r>
           <w:rPr>
@@ -1942,7 +2050,7 @@
         </w:tabs>
         <w:spacing w:after="130"/>
       </w:pPr>
-      <w:hyperlink w:history="1" w:anchor="cap10">
+      <w:hyperlink w:history="1" w:anchor="cap9">
         <w:r>
           <w:rPr>
             <w:rFonts w:ascii="Arial" w:cs="Arial" w:eastAsia="Arial" w:hAnsi="Arial"/>
@@ -1950,7 +2058,7 @@
             <w:sz w:val="22"/>
             <w:szCs w:val="22"/>
           </w:rPr>
-          <w:t xml:space="preserve">10.  Ripristino di Resend</w:t>
+          <w:t xml:space="preserve">9.  Supabase: dati cancellati per errore</w:t>
         </w:r>
         <w:r>
           <w:rPr>
@@ -1960,7 +2068,7 @@
             <w:szCs w:val="22"/>
           </w:rPr>
           <w:tab/>
-          <w:t xml:space="preserve">16</w:t>
+          <w:t xml:space="preserve">14</w:t>
         </w:r>
       </w:hyperlink>
     </w:p>
@@ -1971,7 +2079,7 @@
         </w:tabs>
         <w:spacing w:after="130"/>
       </w:pPr>
-      <w:hyperlink w:history="1" w:anchor="cap11">
+      <w:hyperlink w:history="1" w:anchor="cap10">
         <w:r>
           <w:rPr>
             <w:rFonts w:ascii="Arial" w:cs="Arial" w:eastAsia="Arial" w:hAnsi="Arial"/>
@@ -1979,7 +2087,7 @@
             <w:sz w:val="22"/>
             <w:szCs w:val="22"/>
           </w:rPr>
-          <w:t xml:space="preserve">11.  Ripristino del progetto Claude</w:t>
+          <w:t xml:space="preserve">10.  Supabase: ricostruzione da zero</w:t>
         </w:r>
         <w:r>
           <w:rPr>
@@ -1989,7 +2097,7 @@
             <w:szCs w:val="22"/>
           </w:rPr>
           <w:tab/>
-          <w:t xml:space="preserve">17</w:t>
+          <w:t xml:space="preserve">15</w:t>
         </w:r>
       </w:hyperlink>
     </w:p>
@@ -2000,7 +2108,7 @@
         </w:tabs>
         <w:spacing w:after="130"/>
       </w:pPr>
-      <w:hyperlink w:history="1" w:anchor="cap12">
+      <w:hyperlink w:history="1" w:anchor="cap11">
         <w:r>
           <w:rPr>
             <w:rFonts w:ascii="Arial" w:cs="Arial" w:eastAsia="Arial" w:hAnsi="Arial"/>
@@ -2008,7 +2116,7 @@
             <w:sz w:val="22"/>
             <w:szCs w:val="22"/>
           </w:rPr>
-          <w:t xml:space="preserve">12.  Elenco di chiavi e impostazioni</w:t>
+          <w:t xml:space="preserve">11.  Ripristino di Resend</w:t>
         </w:r>
         <w:r>
           <w:rPr>
@@ -2019,6 +2127,64 @@
           </w:rPr>
           <w:tab/>
           <w:t xml:space="preserve">18</w:t>
+        </w:r>
+      </w:hyperlink>
+    </w:p>
+    <w:p>
+      <w:pPr>
+        <w:tabs>
+          <w:tab w:val="right" w:pos="9638" w:leader="dot"/>
+        </w:tabs>
+        <w:spacing w:after="130"/>
+      </w:pPr>
+      <w:hyperlink w:history="1" w:anchor="cap12">
+        <w:r>
+          <w:rPr>
+            <w:rFonts w:ascii="Arial" w:cs="Arial" w:eastAsia="Arial" w:hAnsi="Arial"/>
+            <w:color w:val="1B2118"/>
+            <w:sz w:val="22"/>
+            <w:szCs w:val="22"/>
+          </w:rPr>
+          <w:t xml:space="preserve">12.  Ripristino del progetto Claude</w:t>
+        </w:r>
+        <w:r>
+          <w:rPr>
+            <w:rFonts w:ascii="Arial" w:cs="Arial" w:eastAsia="Arial" w:hAnsi="Arial"/>
+            <w:color w:val="1B2118"/>
+            <w:sz w:val="22"/>
+            <w:szCs w:val="22"/>
+          </w:rPr>
+          <w:tab/>
+          <w:t xml:space="preserve">19</w:t>
+        </w:r>
+      </w:hyperlink>
+    </w:p>
+    <w:p>
+      <w:pPr>
+        <w:tabs>
+          <w:tab w:val="right" w:pos="9638" w:leader="dot"/>
+        </w:tabs>
+        <w:spacing w:after="130"/>
+      </w:pPr>
+      <w:hyperlink w:history="1" w:anchor="cap13">
+        <w:r>
+          <w:rPr>
+            <w:rFonts w:ascii="Arial" w:cs="Arial" w:eastAsia="Arial" w:hAnsi="Arial"/>
+            <w:color w:val="1B2118"/>
+            <w:sz w:val="22"/>
+            <w:szCs w:val="22"/>
+          </w:rPr>
+          <w:t xml:space="preserve">13.  Elenco di chiavi e impostazioni</w:t>
+        </w:r>
+        <w:r>
+          <w:rPr>
+            <w:rFonts w:ascii="Arial" w:cs="Arial" w:eastAsia="Arial" w:hAnsi="Arial"/>
+            <w:color w:val="1B2118"/>
+            <w:sz w:val="22"/>
+            <w:szCs w:val="22"/>
+          </w:rPr>
+          <w:tab/>
+          <w:t xml:space="preserve">20</w:t>
         </w:r>
       </w:hyperlink>
     </w:p>
@@ -4203,9 +4369,9 @@
         <w:tblLayout w:type="fixed"/>
       </w:tblPr>
       <w:tblGrid>
-        <w:gridCol w:w="2871"/>
-        <w:gridCol w:w="5007"/>
-        <w:gridCol w:w="1760"/>
+        <w:gridCol w:w="2217"/>
+        <w:gridCol w:w="3938"/>
+        <w:gridCol w:w="3483"/>
       </w:tblGrid>
       <w:tr>
         <w:trPr>
@@ -4213,7 +4379,7 @@
         </w:trPr>
         <w:tc>
           <w:tcPr>
-            <w:tcW w:type="dxa" w:w="2871"/>
+            <w:tcW w:type="dxa" w:w="2217"/>
             <w:tcBorders>
               <w:top w:val="single" w:color="D9D4C5" w:sz="4"/>
               <w:left w:val="single" w:color="D9D4C5" w:sz="4"/>
@@ -4248,7 +4414,7 @@
         </w:tc>
         <w:tc>
           <w:tcPr>
-            <w:tcW w:type="dxa" w:w="5007"/>
+            <w:tcW w:type="dxa" w:w="3938"/>
             <w:tcBorders>
               <w:top w:val="single" w:color="D9D4C5" w:sz="4"/>
               <w:left w:val="single" w:color="D9D4C5" w:sz="4"/>
@@ -4283,7 +4449,7 @@
         </w:tc>
         <w:tc>
           <w:tcPr>
-            <w:tcW w:type="dxa" w:w="1760"/>
+            <w:tcW w:type="dxa" w:w="3483"/>
             <w:tcBorders>
               <w:top w:val="single" w:color="D9D4C5" w:sz="4"/>
               <w:left w:val="single" w:color="D9D4C5" w:sz="4"/>
@@ -4323,115 +4489,110 @@
         </w:trPr>
         <w:tc>
           <w:tcPr>
-            <w:tcW w:type="dxa" w:w="2871"/>
-            <w:tcBorders>
-              <w:top w:val="single" w:color="D9D4C5" w:sz="4"/>
-              <w:left w:val="single" w:color="D9D4C5" w:sz="4"/>
-              <w:bottom w:val="single" w:color="D9D4C5" w:sz="4"/>
-              <w:right w:val="single" w:color="D9D4C5" w:sz="4"/>
-            </w:tcBorders>
-            <w:tcMar>
-              <w:top w:type="dxa" w:w="70"/>
-              <w:left w:type="dxa" w:w="110"/>
-              <w:bottom w:type="dxa" w:w="70"/>
-              <w:right w:type="dxa" w:w="110"/>
-            </w:tcMar>
-            <w:vAlign w:val="center"/>
-          </w:tcPr>
-          <w:p>
-            <w:pPr>
-              <w:spacing w:after="0" w:before="0"/>
-            </w:pPr>
-            <w:r>
-              <w:rPr>
-                <w:rFonts w:ascii="Arial" w:cs="Arial" w:eastAsia="Arial" w:hAnsi="Arial"/>
-                <w:color w:val="1B2118"/>
-                <w:sz w:val="18"/>
-                <w:szCs w:val="18"/>
-              </w:rPr>
-              <w:t xml:space="preserve">A ogni rilascio importante</w:t>
-            </w:r>
-          </w:p>
-        </w:tc>
-        <w:tc>
-          <w:tcPr>
-            <w:tcW w:type="dxa" w:w="5007"/>
-            <w:tcBorders>
-              <w:top w:val="single" w:color="D9D4C5" w:sz="4"/>
-              <w:left w:val="single" w:color="D9D4C5" w:sz="4"/>
-              <w:bottom w:val="single" w:color="D9D4C5" w:sz="4"/>
-              <w:right w:val="single" w:color="D9D4C5" w:sz="4"/>
-            </w:tcBorders>
-            <w:tcMar>
-              <w:top w:type="dxa" w:w="70"/>
-              <w:left w:type="dxa" w:w="110"/>
-              <w:bottom w:type="dxa" w:w="70"/>
-              <w:right w:type="dxa" w:w="110"/>
-            </w:tcMar>
-            <w:vAlign w:val="center"/>
-          </w:tcPr>
-          <w:p>
-            <w:pPr>
-              <w:spacing w:after="0" w:before="0"/>
-            </w:pPr>
-            <w:r>
-              <w:rPr>
-                <w:rFonts w:ascii="Arial" w:cs="Arial" w:eastAsia="Arial" w:hAnsi="Arial"/>
-                <w:color w:val="1B2118"/>
-                <w:sz w:val="18"/>
-                <w:szCs w:val="18"/>
-              </w:rPr>
-              <w:t xml:space="preserve">Archivio di backup completo (chiederlo a Claude) e ramo </w:t>
-            </w:r>
-            <w:r>
-              <w:rPr>
-                <w:rFonts w:ascii="Consolas" w:cs="Consolas" w:eastAsia="Consolas" w:hAnsi="Consolas"/>
-                <w:color w:val="2F5D3A"/>
-                <w:sz w:val="18"/>
-                <w:szCs w:val="18"/>
-              </w:rPr>
-              <w:t xml:space="preserve">snapshot-&lt;data&gt;</w:t>
-            </w:r>
-            <w:r>
-              <w:rPr>
-                <w:rFonts w:ascii="Arial" w:cs="Arial" w:eastAsia="Arial" w:hAnsi="Arial"/>
-                <w:color w:val="1B2118"/>
-                <w:sz w:val="18"/>
-                <w:szCs w:val="18"/>
-              </w:rPr>
-              <w:t xml:space="preserve"> su GitHub</w:t>
-            </w:r>
-          </w:p>
-        </w:tc>
-        <w:tc>
-          <w:tcPr>
-            <w:tcW w:type="dxa" w:w="1760"/>
-            <w:tcBorders>
-              <w:top w:val="single" w:color="D9D4C5" w:sz="4"/>
-              <w:left w:val="single" w:color="D9D4C5" w:sz="4"/>
-              <w:bottom w:val="single" w:color="D9D4C5" w:sz="4"/>
-              <w:right w:val="single" w:color="D9D4C5" w:sz="4"/>
-            </w:tcBorders>
-            <w:tcMar>
-              <w:top w:type="dxa" w:w="70"/>
-              <w:left w:type="dxa" w:w="110"/>
-              <w:bottom w:type="dxa" w:w="70"/>
-              <w:right w:type="dxa" w:w="110"/>
-            </w:tcMar>
-            <w:vAlign w:val="center"/>
-          </w:tcPr>
-          <w:p>
-            <w:pPr>
-              <w:spacing w:after="0" w:before="0"/>
-            </w:pPr>
-            <w:r>
-              <w:rPr>
-                <w:rFonts w:ascii="Arial" w:cs="Arial" w:eastAsia="Arial" w:hAnsi="Arial"/>
-                <w:color w:val="1B2118"/>
-                <w:sz w:val="18"/>
-                <w:szCs w:val="18"/>
-              </w:rPr>
-              <w:t xml:space="preserve">Claude, su richiesta</w:t>
+            <w:tcW w:type="dxa" w:w="2217"/>
+            <w:tcBorders>
+              <w:top w:val="single" w:color="D9D4C5" w:sz="4"/>
+              <w:left w:val="single" w:color="D9D4C5" w:sz="4"/>
+              <w:bottom w:val="single" w:color="D9D4C5" w:sz="4"/>
+              <w:right w:val="single" w:color="D9D4C5" w:sz="4"/>
+            </w:tcBorders>
+            <w:tcMar>
+              <w:top w:type="dxa" w:w="70"/>
+              <w:left w:type="dxa" w:w="110"/>
+              <w:bottom w:type="dxa" w:w="70"/>
+              <w:right w:type="dxa" w:w="110"/>
+            </w:tcMar>
+            <w:vAlign w:val="center"/>
+          </w:tcPr>
+          <w:p>
+            <w:pPr>
+              <w:spacing w:after="0" w:before="0"/>
+            </w:pPr>
+            <w:r>
+              <w:rPr>
+                <w:rFonts w:ascii="Arial" w:cs="Arial" w:eastAsia="Arial" w:hAnsi="Arial"/>
+                <w:b/>
+                <w:bCs/>
+                <w:color w:val="1B2118"/>
+                <w:sz w:val="18"/>
+                <w:szCs w:val="18"/>
+              </w:rPr>
+              <w:t xml:space="preserve">Ogni giorno alle 13 e alle 21</w:t>
+            </w:r>
+          </w:p>
+        </w:tc>
+        <w:tc>
+          <w:tcPr>
+            <w:tcW w:type="dxa" w:w="3938"/>
+            <w:tcBorders>
+              <w:top w:val="single" w:color="D9D4C5" w:sz="4"/>
+              <w:left w:val="single" w:color="D9D4C5" w:sz="4"/>
+              <w:bottom w:val="single" w:color="D9D4C5" w:sz="4"/>
+              <w:right w:val="single" w:color="D9D4C5" w:sz="4"/>
+            </w:tcBorders>
+            <w:tcMar>
+              <w:top w:type="dxa" w:w="70"/>
+              <w:left w:type="dxa" w:w="110"/>
+              <w:bottom w:type="dxa" w:w="70"/>
+              <w:right w:type="dxa" w:w="110"/>
+            </w:tcMar>
+            <w:vAlign w:val="center"/>
+          </w:tcPr>
+          <w:p>
+            <w:pPr>
+              <w:spacing w:after="0" w:before="0"/>
+            </w:pPr>
+            <w:r>
+              <w:rPr>
+                <w:rFonts w:ascii="Arial" w:cs="Arial" w:eastAsia="Arial" w:hAnsi="Arial"/>
+                <w:b/>
+                <w:bCs/>
+                <w:color w:val="1B2118"/>
+                <w:sz w:val="18"/>
+                <w:szCs w:val="18"/>
+              </w:rPr>
+              <w:t xml:space="preserve">Backup automatico completo su Google Drive</w:t>
+            </w:r>
+            <w:r>
+              <w:rPr>
+                <w:rFonts w:ascii="Arial" w:cs="Arial" w:eastAsia="Arial" w:hAnsi="Arial"/>
+                <w:color w:val="1B2118"/>
+                <w:sz w:val="18"/>
+                <w:szCs w:val="18"/>
+              </w:rPr>
+              <w:t xml:space="preserve"> (cartella «Cwp»: codice, database, file, configurazione; una cartella per backup)</w:t>
+            </w:r>
+          </w:p>
+        </w:tc>
+        <w:tc>
+          <w:tcPr>
+            <w:tcW w:type="dxa" w:w="3483"/>
+            <w:tcBorders>
+              <w:top w:val="single" w:color="D9D4C5" w:sz="4"/>
+              <w:left w:val="single" w:color="D9D4C5" w:sz="4"/>
+              <w:bottom w:val="single" w:color="D9D4C5" w:sz="4"/>
+              <w:right w:val="single" w:color="D9D4C5" w:sz="4"/>
+            </w:tcBorders>
+            <w:tcMar>
+              <w:top w:type="dxa" w:w="70"/>
+              <w:left w:type="dxa" w:w="110"/>
+              <w:bottom w:type="dxa" w:w="70"/>
+              <w:right w:type="dxa" w:w="110"/>
+            </w:tcMar>
+            <w:vAlign w:val="center"/>
+          </w:tcPr>
+          <w:p>
+            <w:pPr>
+              <w:spacing w:after="0" w:before="0"/>
+            </w:pPr>
+            <w:r>
+              <w:rPr>
+                <w:rFonts w:ascii="Arial" w:cs="Arial" w:eastAsia="Arial" w:hAnsi="Arial"/>
+                <w:color w:val="1B2118"/>
+                <w:sz w:val="18"/>
+                <w:szCs w:val="18"/>
+              </w:rPr>
+              <w:t xml:space="preserve">Google Apps Script di Luca, da solo (capitolo «Backup automatico su Google Drive»)</w:t>
             </w:r>
           </w:p>
         </w:tc>
@@ -4442,7 +4603,7 @@
         </w:trPr>
         <w:tc>
           <w:tcPr>
-            <w:tcW w:type="dxa" w:w="2871"/>
+            <w:tcW w:type="dxa" w:w="2217"/>
             <w:tcBorders>
               <w:top w:val="single" w:color="D9D4C5" w:sz="4"/>
               <w:left w:val="single" w:color="D9D4C5" w:sz="4"/>
@@ -4469,13 +4630,13 @@
                 <w:sz w:val="18"/>
                 <w:szCs w:val="18"/>
               </w:rPr>
-              <w:t xml:space="preserve">Ogni settimana, appena ci sono dati reali</w:t>
-            </w:r>
-          </w:p>
-        </w:tc>
-        <w:tc>
-          <w:tcPr>
-            <w:tcW w:type="dxa" w:w="5007"/>
+              <w:t xml:space="preserve">Ogni settimana</w:t>
+            </w:r>
+          </w:p>
+        </w:tc>
+        <w:tc>
+          <w:tcPr>
+            <w:tcW w:type="dxa" w:w="3938"/>
             <w:tcBorders>
               <w:top w:val="single" w:color="D9D4C5" w:sz="4"/>
               <w:left w:val="single" w:color="D9D4C5" w:sz="4"/>
@@ -4502,13 +4663,13 @@
                 <w:sz w:val="18"/>
                 <w:szCs w:val="18"/>
               </w:rPr>
-              <w:t xml:space="preserve">Copia del database e dei file (riquadri qui sotto)</w:t>
-            </w:r>
-          </w:p>
-        </w:tc>
-        <w:tc>
-          <w:tcPr>
-            <w:tcW w:type="dxa" w:w="1760"/>
+              <w:t xml:space="preserve">Togliere a mano le cartelle di backup vecchie (tenerne almeno 14, cioè una settimana)</w:t>
+            </w:r>
+          </w:p>
+        </w:tc>
+        <w:tc>
+          <w:tcPr>
+            <w:tcW w:type="dxa" w:w="3483"/>
             <w:tcBorders>
               <w:top w:val="single" w:color="D9D4C5" w:sz="4"/>
               <w:left w:val="single" w:color="D9D4C5" w:sz="4"/>
@@ -4535,7 +4696,7 @@
                 <w:sz w:val="18"/>
                 <w:szCs w:val="18"/>
               </w:rPr>
-              <w:t xml:space="preserve">Sviluppatore</w:t>
+              <w:t xml:space="preserve">Luca</w:t>
             </w:r>
           </w:p>
         </w:tc>
@@ -4546,97 +4707,115 @@
         </w:trPr>
         <w:tc>
           <w:tcPr>
-            <w:tcW w:type="dxa" w:w="2871"/>
-            <w:tcBorders>
-              <w:top w:val="single" w:color="D9D4C5" w:sz="4"/>
-              <w:left w:val="single" w:color="D9D4C5" w:sz="4"/>
-              <w:bottom w:val="single" w:color="D9D4C5" w:sz="4"/>
-              <w:right w:val="single" w:color="D9D4C5" w:sz="4"/>
-            </w:tcBorders>
-            <w:tcMar>
-              <w:top w:type="dxa" w:w="70"/>
-              <w:left w:type="dxa" w:w="110"/>
-              <w:bottom w:type="dxa" w:w="70"/>
-              <w:right w:type="dxa" w:w="110"/>
-            </w:tcMar>
-            <w:vAlign w:val="center"/>
-          </w:tcPr>
-          <w:p>
-            <w:pPr>
-              <w:spacing w:after="0" w:before="0"/>
-            </w:pPr>
-            <w:r>
-              <w:rPr>
-                <w:rFonts w:ascii="Arial" w:cs="Arial" w:eastAsia="Arial" w:hAnsi="Arial"/>
-                <w:color w:val="1B2118"/>
-                <w:sz w:val="18"/>
-                <w:szCs w:val="18"/>
-              </w:rPr>
-              <w:t xml:space="preserve">Ogni giorno, dopo il passaggio al piano Pro</w:t>
-            </w:r>
-          </w:p>
-        </w:tc>
-        <w:tc>
-          <w:tcPr>
-            <w:tcW w:type="dxa" w:w="5007"/>
-            <w:tcBorders>
-              <w:top w:val="single" w:color="D9D4C5" w:sz="4"/>
-              <w:left w:val="single" w:color="D9D4C5" w:sz="4"/>
-              <w:bottom w:val="single" w:color="D9D4C5" w:sz="4"/>
-              <w:right w:val="single" w:color="D9D4C5" w:sz="4"/>
-            </w:tcBorders>
-            <w:tcMar>
-              <w:top w:type="dxa" w:w="70"/>
-              <w:left w:type="dxa" w:w="110"/>
-              <w:bottom w:type="dxa" w:w="70"/>
-              <w:right w:type="dxa" w:w="110"/>
-            </w:tcMar>
-            <w:vAlign w:val="center"/>
-          </w:tcPr>
-          <w:p>
-            <w:pPr>
-              <w:spacing w:after="0" w:before="0"/>
-            </w:pPr>
-            <w:r>
-              <w:rPr>
-                <w:rFonts w:ascii="Arial" w:cs="Arial" w:eastAsia="Arial" w:hAnsi="Arial"/>
-                <w:color w:val="1B2118"/>
-                <w:sz w:val="18"/>
-                <w:szCs w:val="18"/>
-              </w:rPr>
-              <w:t xml:space="preserve">Copia automatica del database, tenuta 7 giorni</w:t>
-            </w:r>
-          </w:p>
-        </w:tc>
-        <w:tc>
-          <w:tcPr>
-            <w:tcW w:type="dxa" w:w="1760"/>
-            <w:tcBorders>
-              <w:top w:val="single" w:color="D9D4C5" w:sz="4"/>
-              <w:left w:val="single" w:color="D9D4C5" w:sz="4"/>
-              <w:bottom w:val="single" w:color="D9D4C5" w:sz="4"/>
-              <w:right w:val="single" w:color="D9D4C5" w:sz="4"/>
-            </w:tcBorders>
-            <w:tcMar>
-              <w:top w:type="dxa" w:w="70"/>
-              <w:left w:type="dxa" w:w="110"/>
-              <w:bottom w:type="dxa" w:w="70"/>
-              <w:right w:type="dxa" w:w="110"/>
-            </w:tcMar>
-            <w:vAlign w:val="center"/>
-          </w:tcPr>
-          <w:p>
-            <w:pPr>
-              <w:spacing w:after="0" w:before="0"/>
-            </w:pPr>
-            <w:r>
-              <w:rPr>
-                <w:rFonts w:ascii="Arial" w:cs="Arial" w:eastAsia="Arial" w:hAnsi="Arial"/>
-                <w:color w:val="1B2118"/>
-                <w:sz w:val="18"/>
-                <w:szCs w:val="18"/>
-              </w:rPr>
-              <w:t xml:space="preserve">Supabase, da solo</w:t>
+            <w:tcW w:type="dxa" w:w="2217"/>
+            <w:tcBorders>
+              <w:top w:val="single" w:color="D9D4C5" w:sz="4"/>
+              <w:left w:val="single" w:color="D9D4C5" w:sz="4"/>
+              <w:bottom w:val="single" w:color="D9D4C5" w:sz="4"/>
+              <w:right w:val="single" w:color="D9D4C5" w:sz="4"/>
+            </w:tcBorders>
+            <w:tcMar>
+              <w:top w:type="dxa" w:w="70"/>
+              <w:left w:type="dxa" w:w="110"/>
+              <w:bottom w:type="dxa" w:w="70"/>
+              <w:right w:type="dxa" w:w="110"/>
+            </w:tcMar>
+            <w:vAlign w:val="center"/>
+          </w:tcPr>
+          <w:p>
+            <w:pPr>
+              <w:spacing w:after="0" w:before="0"/>
+            </w:pPr>
+            <w:r>
+              <w:rPr>
+                <w:rFonts w:ascii="Arial" w:cs="Arial" w:eastAsia="Arial" w:hAnsi="Arial"/>
+                <w:color w:val="1B2118"/>
+                <w:sz w:val="18"/>
+                <w:szCs w:val="18"/>
+              </w:rPr>
+              <w:t xml:space="preserve">A ogni rilascio importante</w:t>
+            </w:r>
+          </w:p>
+        </w:tc>
+        <w:tc>
+          <w:tcPr>
+            <w:tcW w:type="dxa" w:w="3938"/>
+            <w:tcBorders>
+              <w:top w:val="single" w:color="D9D4C5" w:sz="4"/>
+              <w:left w:val="single" w:color="D9D4C5" w:sz="4"/>
+              <w:bottom w:val="single" w:color="D9D4C5" w:sz="4"/>
+              <w:right w:val="single" w:color="D9D4C5" w:sz="4"/>
+            </w:tcBorders>
+            <w:tcMar>
+              <w:top w:type="dxa" w:w="70"/>
+              <w:left w:type="dxa" w:w="110"/>
+              <w:bottom w:type="dxa" w:w="70"/>
+              <w:right w:type="dxa" w:w="110"/>
+            </w:tcMar>
+            <w:vAlign w:val="center"/>
+          </w:tcPr>
+          <w:p>
+            <w:pPr>
+              <w:spacing w:after="0" w:before="0"/>
+            </w:pPr>
+            <w:r>
+              <w:rPr>
+                <w:rFonts w:ascii="Arial" w:cs="Arial" w:eastAsia="Arial" w:hAnsi="Arial"/>
+                <w:color w:val="1B2118"/>
+                <w:sz w:val="18"/>
+                <w:szCs w:val="18"/>
+              </w:rPr>
+              <w:t xml:space="preserve">Archivio di backup completo (chiederlo a Claude) e ramo </w:t>
+            </w:r>
+            <w:r>
+              <w:rPr>
+                <w:rFonts w:ascii="Consolas" w:cs="Consolas" w:eastAsia="Consolas" w:hAnsi="Consolas"/>
+                <w:color w:val="2F5D3A"/>
+                <w:sz w:val="18"/>
+                <w:szCs w:val="18"/>
+              </w:rPr>
+              <w:t xml:space="preserve">snapshot-&lt;data&gt;</w:t>
+            </w:r>
+            <w:r>
+              <w:rPr>
+                <w:rFonts w:ascii="Arial" w:cs="Arial" w:eastAsia="Arial" w:hAnsi="Arial"/>
+                <w:color w:val="1B2118"/>
+                <w:sz w:val="18"/>
+                <w:szCs w:val="18"/>
+              </w:rPr>
+              <w:t xml:space="preserve"> su GitHub</w:t>
+            </w:r>
+          </w:p>
+        </w:tc>
+        <w:tc>
+          <w:tcPr>
+            <w:tcW w:type="dxa" w:w="3483"/>
+            <w:tcBorders>
+              <w:top w:val="single" w:color="D9D4C5" w:sz="4"/>
+              <w:left w:val="single" w:color="D9D4C5" w:sz="4"/>
+              <w:bottom w:val="single" w:color="D9D4C5" w:sz="4"/>
+              <w:right w:val="single" w:color="D9D4C5" w:sz="4"/>
+            </w:tcBorders>
+            <w:tcMar>
+              <w:top w:type="dxa" w:w="70"/>
+              <w:left w:type="dxa" w:w="110"/>
+              <w:bottom w:type="dxa" w:w="70"/>
+              <w:right w:type="dxa" w:w="110"/>
+            </w:tcMar>
+            <w:vAlign w:val="center"/>
+          </w:tcPr>
+          <w:p>
+            <w:pPr>
+              <w:spacing w:after="0" w:before="0"/>
+            </w:pPr>
+            <w:r>
+              <w:rPr>
+                <w:rFonts w:ascii="Arial" w:cs="Arial" w:eastAsia="Arial" w:hAnsi="Arial"/>
+                <w:color w:val="1B2118"/>
+                <w:sz w:val="18"/>
+                <w:szCs w:val="18"/>
+              </w:rPr>
+              <w:t xml:space="preserve">Claude, su richiesta</w:t>
             </w:r>
           </w:p>
         </w:tc>
@@ -4647,7 +4826,7 @@
         </w:trPr>
         <w:tc>
           <w:tcPr>
-            <w:tcW w:type="dxa" w:w="2871"/>
+            <w:tcW w:type="dxa" w:w="2217"/>
             <w:tcBorders>
               <w:top w:val="single" w:color="D9D4C5" w:sz="4"/>
               <w:left w:val="single" w:color="D9D4C5" w:sz="4"/>
@@ -4674,13 +4853,13 @@
                 <w:sz w:val="18"/>
                 <w:szCs w:val="18"/>
               </w:rPr>
-              <w:t xml:space="preserve">Ogni tre mesi</w:t>
-            </w:r>
-          </w:p>
-        </w:tc>
-        <w:tc>
-          <w:tcPr>
-            <w:tcW w:type="dxa" w:w="5007"/>
+              <w:t xml:space="preserve">Ogni settimana, appena ci sono dati reali</w:t>
+            </w:r>
+          </w:p>
+        </w:tc>
+        <w:tc>
+          <w:tcPr>
+            <w:tcW w:type="dxa" w:w="3938"/>
             <w:tcBorders>
               <w:top w:val="single" w:color="D9D4C5" w:sz="4"/>
               <w:left w:val="single" w:color="D9D4C5" w:sz="4"/>
@@ -4707,13 +4886,13 @@
                 <w:sz w:val="18"/>
                 <w:szCs w:val="18"/>
               </w:rPr>
-              <w:t xml:space="preserve">Prova di ripristino su un progetto Supabase di prova</w:t>
-            </w:r>
-          </w:p>
-        </w:tc>
-        <w:tc>
-          <w:tcPr>
-            <w:tcW w:type="dxa" w:w="1760"/>
+              <w:t xml:space="preserve">Copia del database e dei file (riquadri qui sotto)</w:t>
+            </w:r>
+          </w:p>
+        </w:tc>
+        <w:tc>
+          <w:tcPr>
+            <w:tcW w:type="dxa" w:w="3483"/>
             <w:tcBorders>
               <w:top w:val="single" w:color="D9D4C5" w:sz="4"/>
               <w:left w:val="single" w:color="D9D4C5" w:sz="4"/>
@@ -4751,7 +4930,212 @@
         </w:trPr>
         <w:tc>
           <w:tcPr>
-            <w:tcW w:type="dxa" w:w="2871"/>
+            <w:tcW w:type="dxa" w:w="2217"/>
+            <w:tcBorders>
+              <w:top w:val="single" w:color="D9D4C5" w:sz="4"/>
+              <w:left w:val="single" w:color="D9D4C5" w:sz="4"/>
+              <w:bottom w:val="single" w:color="D9D4C5" w:sz="4"/>
+              <w:right w:val="single" w:color="D9D4C5" w:sz="4"/>
+            </w:tcBorders>
+            <w:tcMar>
+              <w:top w:type="dxa" w:w="70"/>
+              <w:left w:type="dxa" w:w="110"/>
+              <w:bottom w:type="dxa" w:w="70"/>
+              <w:right w:type="dxa" w:w="110"/>
+            </w:tcMar>
+            <w:vAlign w:val="center"/>
+          </w:tcPr>
+          <w:p>
+            <w:pPr>
+              <w:spacing w:after="0" w:before="0"/>
+            </w:pPr>
+            <w:r>
+              <w:rPr>
+                <w:rFonts w:ascii="Arial" w:cs="Arial" w:eastAsia="Arial" w:hAnsi="Arial"/>
+                <w:color w:val="1B2118"/>
+                <w:sz w:val="18"/>
+                <w:szCs w:val="18"/>
+              </w:rPr>
+              <w:t xml:space="preserve">Ogni giorno, dopo il passaggio al piano Pro</w:t>
+            </w:r>
+          </w:p>
+        </w:tc>
+        <w:tc>
+          <w:tcPr>
+            <w:tcW w:type="dxa" w:w="3938"/>
+            <w:tcBorders>
+              <w:top w:val="single" w:color="D9D4C5" w:sz="4"/>
+              <w:left w:val="single" w:color="D9D4C5" w:sz="4"/>
+              <w:bottom w:val="single" w:color="D9D4C5" w:sz="4"/>
+              <w:right w:val="single" w:color="D9D4C5" w:sz="4"/>
+            </w:tcBorders>
+            <w:tcMar>
+              <w:top w:type="dxa" w:w="70"/>
+              <w:left w:type="dxa" w:w="110"/>
+              <w:bottom w:type="dxa" w:w="70"/>
+              <w:right w:type="dxa" w:w="110"/>
+            </w:tcMar>
+            <w:vAlign w:val="center"/>
+          </w:tcPr>
+          <w:p>
+            <w:pPr>
+              <w:spacing w:after="0" w:before="0"/>
+            </w:pPr>
+            <w:r>
+              <w:rPr>
+                <w:rFonts w:ascii="Arial" w:cs="Arial" w:eastAsia="Arial" w:hAnsi="Arial"/>
+                <w:color w:val="1B2118"/>
+                <w:sz w:val="18"/>
+                <w:szCs w:val="18"/>
+              </w:rPr>
+              <w:t xml:space="preserve">Copia automatica del database, tenuta 7 giorni</w:t>
+            </w:r>
+          </w:p>
+        </w:tc>
+        <w:tc>
+          <w:tcPr>
+            <w:tcW w:type="dxa" w:w="3483"/>
+            <w:tcBorders>
+              <w:top w:val="single" w:color="D9D4C5" w:sz="4"/>
+              <w:left w:val="single" w:color="D9D4C5" w:sz="4"/>
+              <w:bottom w:val="single" w:color="D9D4C5" w:sz="4"/>
+              <w:right w:val="single" w:color="D9D4C5" w:sz="4"/>
+            </w:tcBorders>
+            <w:tcMar>
+              <w:top w:type="dxa" w:w="70"/>
+              <w:left w:type="dxa" w:w="110"/>
+              <w:bottom w:type="dxa" w:w="70"/>
+              <w:right w:type="dxa" w:w="110"/>
+            </w:tcMar>
+            <w:vAlign w:val="center"/>
+          </w:tcPr>
+          <w:p>
+            <w:pPr>
+              <w:spacing w:after="0" w:before="0"/>
+            </w:pPr>
+            <w:r>
+              <w:rPr>
+                <w:rFonts w:ascii="Arial" w:cs="Arial" w:eastAsia="Arial" w:hAnsi="Arial"/>
+                <w:color w:val="1B2118"/>
+                <w:sz w:val="18"/>
+                <w:szCs w:val="18"/>
+              </w:rPr>
+              <w:t xml:space="preserve">Supabase, da solo</w:t>
+            </w:r>
+          </w:p>
+        </w:tc>
+      </w:tr>
+      <w:tr>
+        <w:trPr>
+          <w:cantSplit/>
+        </w:trPr>
+        <w:tc>
+          <w:tcPr>
+            <w:tcW w:type="dxa" w:w="2217"/>
+            <w:tcBorders>
+              <w:top w:val="single" w:color="D9D4C5" w:sz="4"/>
+              <w:left w:val="single" w:color="D9D4C5" w:sz="4"/>
+              <w:bottom w:val="single" w:color="D9D4C5" w:sz="4"/>
+              <w:right w:val="single" w:color="D9D4C5" w:sz="4"/>
+            </w:tcBorders>
+            <w:shd w:fill="F6F4EE" w:color="auto" w:val="clear"/>
+            <w:tcMar>
+              <w:top w:type="dxa" w:w="70"/>
+              <w:left w:type="dxa" w:w="110"/>
+              <w:bottom w:type="dxa" w:w="70"/>
+              <w:right w:type="dxa" w:w="110"/>
+            </w:tcMar>
+            <w:vAlign w:val="center"/>
+          </w:tcPr>
+          <w:p>
+            <w:pPr>
+              <w:spacing w:after="0" w:before="0"/>
+            </w:pPr>
+            <w:r>
+              <w:rPr>
+                <w:rFonts w:ascii="Arial" w:cs="Arial" w:eastAsia="Arial" w:hAnsi="Arial"/>
+                <w:color w:val="1B2118"/>
+                <w:sz w:val="18"/>
+                <w:szCs w:val="18"/>
+              </w:rPr>
+              <w:t xml:space="preserve">Ogni tre mesi</w:t>
+            </w:r>
+          </w:p>
+        </w:tc>
+        <w:tc>
+          <w:tcPr>
+            <w:tcW w:type="dxa" w:w="3938"/>
+            <w:tcBorders>
+              <w:top w:val="single" w:color="D9D4C5" w:sz="4"/>
+              <w:left w:val="single" w:color="D9D4C5" w:sz="4"/>
+              <w:bottom w:val="single" w:color="D9D4C5" w:sz="4"/>
+              <w:right w:val="single" w:color="D9D4C5" w:sz="4"/>
+            </w:tcBorders>
+            <w:shd w:fill="F6F4EE" w:color="auto" w:val="clear"/>
+            <w:tcMar>
+              <w:top w:type="dxa" w:w="70"/>
+              <w:left w:type="dxa" w:w="110"/>
+              <w:bottom w:type="dxa" w:w="70"/>
+              <w:right w:type="dxa" w:w="110"/>
+            </w:tcMar>
+            <w:vAlign w:val="center"/>
+          </w:tcPr>
+          <w:p>
+            <w:pPr>
+              <w:spacing w:after="0" w:before="0"/>
+            </w:pPr>
+            <w:r>
+              <w:rPr>
+                <w:rFonts w:ascii="Arial" w:cs="Arial" w:eastAsia="Arial" w:hAnsi="Arial"/>
+                <w:color w:val="1B2118"/>
+                <w:sz w:val="18"/>
+                <w:szCs w:val="18"/>
+              </w:rPr>
+              <w:t xml:space="preserve">Prova di ripristino su un progetto Supabase di prova</w:t>
+            </w:r>
+          </w:p>
+        </w:tc>
+        <w:tc>
+          <w:tcPr>
+            <w:tcW w:type="dxa" w:w="3483"/>
+            <w:tcBorders>
+              <w:top w:val="single" w:color="D9D4C5" w:sz="4"/>
+              <w:left w:val="single" w:color="D9D4C5" w:sz="4"/>
+              <w:bottom w:val="single" w:color="D9D4C5" w:sz="4"/>
+              <w:right w:val="single" w:color="D9D4C5" w:sz="4"/>
+            </w:tcBorders>
+            <w:shd w:fill="F6F4EE" w:color="auto" w:val="clear"/>
+            <w:tcMar>
+              <w:top w:type="dxa" w:w="70"/>
+              <w:left w:type="dxa" w:w="110"/>
+              <w:bottom w:type="dxa" w:w="70"/>
+              <w:right w:type="dxa" w:w="110"/>
+            </w:tcMar>
+            <w:vAlign w:val="center"/>
+          </w:tcPr>
+          <w:p>
+            <w:pPr>
+              <w:spacing w:after="0" w:before="0"/>
+            </w:pPr>
+            <w:r>
+              <w:rPr>
+                <w:rFonts w:ascii="Arial" w:cs="Arial" w:eastAsia="Arial" w:hAnsi="Arial"/>
+                <w:color w:val="1B2118"/>
+                <w:sz w:val="18"/>
+                <w:szCs w:val="18"/>
+              </w:rPr>
+              <w:t xml:space="preserve">Sviluppatore</w:t>
+            </w:r>
+          </w:p>
+        </w:tc>
+      </w:tr>
+      <w:tr>
+        <w:trPr>
+          <w:cantSplit/>
+        </w:trPr>
+        <w:tc>
+          <w:tcPr>
+            <w:tcW w:type="dxa" w:w="2217"/>
             <w:tcBorders>
               <w:top w:val="single" w:color="D9D4C5" w:sz="4"/>
               <w:left w:val="single" w:color="D9D4C5" w:sz="4"/>
@@ -4783,7 +5167,7 @@
         </w:tc>
         <w:tc>
           <w:tcPr>
-            <w:tcW w:type="dxa" w:w="5007"/>
+            <w:tcW w:type="dxa" w:w="3938"/>
             <w:tcBorders>
               <w:top w:val="single" w:color="D9D4C5" w:sz="4"/>
               <w:left w:val="single" w:color="D9D4C5" w:sz="4"/>
@@ -4815,7 +5199,7 @@
         </w:tc>
         <w:tc>
           <w:tcPr>
-            <w:tcW w:type="dxa" w:w="1760"/>
+            <w:tcW w:type="dxa" w:w="3483"/>
             <w:tcBorders>
               <w:top w:val="single" w:color="D9D4C5" w:sz="4"/>
               <w:left w:val="single" w:color="D9D4C5" w:sz="4"/>
@@ -5606,7 +5990,7 @@
           <w:sz w:val="34"/>
           <w:szCs w:val="34"/>
         </w:rPr>
-        <w:t xml:space="preserve">4. GitHub e Vercel: tornare alla versione precedente</w:t>
+        <w:t xml:space="preserve">4. Backup automatico su Google Drive</w:t>
       </w:r>
       <w:bookmarkEnd w:id="1"/>
     </w:p>
@@ -5621,7 +6005,7 @@
           <w:sz w:val="21"/>
           <w:szCs w:val="21"/>
         </w:rPr>
-        <w:t xml:space="preserve">Se un rilascio ha introdotto un errore, il modo più rapido è </w:t>
+        <w:t xml:space="preserve">Dal 21/10/2026 (richiesta di Luca) un programma in </w:t>
       </w:r>
       <w:r>
         <w:rPr>
@@ -5632,16 +6016,790 @@
           <w:sz w:val="21"/>
           <w:szCs w:val="21"/>
         </w:rPr>
-        <w:t xml:space="preserve">ripubblicare la versione precedente</w:t>
-      </w:r>
-      <w:r>
-        <w:rPr>
-          <w:rFonts w:ascii="Arial" w:cs="Arial" w:eastAsia="Arial" w:hAnsi="Arial"/>
-          <w:color w:val="1B2118"/>
-          <w:sz w:val="21"/>
-          <w:szCs w:val="21"/>
-        </w:rPr>
-        <w:t xml:space="preserve">:</w:t>
+        <w:t xml:space="preserve">Google Apps Script</w:t>
+      </w:r>
+      <w:r>
+        <w:rPr>
+          <w:rFonts w:ascii="Arial" w:cs="Arial" w:eastAsia="Arial" w:hAnsi="Arial"/>
+          <w:color w:val="1B2118"/>
+          <w:sz w:val="21"/>
+          <w:szCs w:val="21"/>
+        </w:rPr>
+        <w:t xml:space="preserve">, nell'account Google di Luca, fa </w:t>
+      </w:r>
+      <w:r>
+        <w:rPr>
+          <w:rFonts w:ascii="Arial" w:cs="Arial" w:eastAsia="Arial" w:hAnsi="Arial"/>
+          <w:b/>
+          <w:bCs/>
+          <w:color w:val="1B2118"/>
+          <w:sz w:val="21"/>
+          <w:szCs w:val="21"/>
+        </w:rPr>
+        <w:t xml:space="preserve">ogni giorno due backup completi</w:t>
+      </w:r>
+      <w:r>
+        <w:rPr>
+          <w:rFonts w:ascii="Arial" w:cs="Arial" w:eastAsia="Arial" w:hAnsi="Arial"/>
+          <w:color w:val="1B2118"/>
+          <w:sz w:val="21"/>
+          <w:szCs w:val="21"/>
+        </w:rPr>
+        <w:t xml:space="preserve">, tra le 13 e le 14 e tra le 21 e le 22 (ora italiana). Ogni backup è una </w:t>
+      </w:r>
+      <w:r>
+        <w:rPr>
+          <w:rFonts w:ascii="Arial" w:cs="Arial" w:eastAsia="Arial" w:hAnsi="Arial"/>
+          <w:b/>
+          <w:bCs/>
+          <w:color w:val="1B2118"/>
+          <w:sz w:val="21"/>
+          <w:szCs w:val="21"/>
+        </w:rPr>
+        <w:t xml:space="preserve">nuova cartella</w:t>
+      </w:r>
+      <w:r>
+        <w:rPr>
+          <w:rFonts w:ascii="Arial" w:cs="Arial" w:eastAsia="Arial" w:hAnsi="Arial"/>
+          <w:color w:val="1B2118"/>
+          <w:sz w:val="21"/>
+          <w:szCs w:val="21"/>
+        </w:rPr>
+        <w:t xml:space="preserve"> dentro la cartella </w:t>
+      </w:r>
+      <w:r>
+        <w:rPr>
+          <w:rFonts w:ascii="Arial" w:cs="Arial" w:eastAsia="Arial" w:hAnsi="Arial"/>
+          <w:b/>
+          <w:bCs/>
+          <w:color w:val="1B2118"/>
+          <w:sz w:val="21"/>
+          <w:szCs w:val="21"/>
+        </w:rPr>
+        <w:t xml:space="preserve">Cwp</w:t>
+      </w:r>
+      <w:r>
+        <w:rPr>
+          <w:rFonts w:ascii="Arial" w:cs="Arial" w:eastAsia="Arial" w:hAnsi="Arial"/>
+          <w:color w:val="1B2118"/>
+          <w:sz w:val="21"/>
+          <w:szCs w:val="21"/>
+        </w:rPr>
+        <w:t xml:space="preserve"> del Drive di Luca, con il nome «Backup_CWP_aaaa-mm-gg_hhmm». Le cartelle vecchie non si cancellano da sole: le toglie Luca a mano.</w:t>
+      </w:r>
+    </w:p>
+    <w:tbl>
+      <w:tblPr>
+        <w:tblW w:type="dxa" w:w="9638"/>
+        <w:tblBorders>
+          <w:top w:val="single" w:color="auto" w:sz="4"/>
+          <w:left w:val="single" w:color="auto" w:sz="4"/>
+          <w:bottom w:val="single" w:color="auto" w:sz="4"/>
+          <w:right w:val="single" w:color="auto" w:sz="4"/>
+          <w:insideH w:val="single" w:color="auto" w:sz="4"/>
+          <w:insideV w:val="single" w:color="auto" w:sz="4"/>
+        </w:tblBorders>
+        <w:tblLayout w:type="fixed"/>
+      </w:tblPr>
+      <w:tblGrid>
+        <w:gridCol w:w="3779"/>
+        <w:gridCol w:w="5859"/>
+      </w:tblGrid>
+      <w:tr>
+        <w:trPr>
+          <w:tblHeader/>
+        </w:trPr>
+        <w:tc>
+          <w:tcPr>
+            <w:tcW w:type="dxa" w:w="3779"/>
+            <w:tcBorders>
+              <w:top w:val="single" w:color="D9D4C5" w:sz="4"/>
+              <w:left w:val="single" w:color="D9D4C5" w:sz="4"/>
+              <w:bottom w:val="single" w:color="D9D4C5" w:sz="4"/>
+              <w:right w:val="single" w:color="D9D4C5" w:sz="4"/>
+            </w:tcBorders>
+            <w:shd w:fill="2F5D3A" w:color="auto" w:val="clear"/>
+            <w:tcMar>
+              <w:top w:type="dxa" w:w="70"/>
+              <w:left w:type="dxa" w:w="110"/>
+              <w:bottom w:type="dxa" w:w="70"/>
+              <w:right w:type="dxa" w:w="110"/>
+            </w:tcMar>
+            <w:vAlign w:val="center"/>
+          </w:tcPr>
+          <w:p>
+            <w:pPr>
+              <w:spacing w:after="0" w:before="0"/>
+            </w:pPr>
+            <w:r>
+              <w:rPr>
+                <w:rFonts w:ascii="Arial" w:cs="Arial" w:eastAsia="Arial" w:hAnsi="Arial"/>
+                <w:b/>
+                <w:bCs/>
+                <w:color w:val="FFFFFF"/>
+                <w:sz w:val="18"/>
+                <w:szCs w:val="18"/>
+              </w:rPr>
+              <w:t xml:space="preserve">Cartella</w:t>
+            </w:r>
+          </w:p>
+        </w:tc>
+        <w:tc>
+          <w:tcPr>
+            <w:tcW w:type="dxa" w:w="5859"/>
+            <w:tcBorders>
+              <w:top w:val="single" w:color="D9D4C5" w:sz="4"/>
+              <w:left w:val="single" w:color="D9D4C5" w:sz="4"/>
+              <w:bottom w:val="single" w:color="D9D4C5" w:sz="4"/>
+              <w:right w:val="single" w:color="D9D4C5" w:sz="4"/>
+            </w:tcBorders>
+            <w:shd w:fill="2F5D3A" w:color="auto" w:val="clear"/>
+            <w:tcMar>
+              <w:top w:type="dxa" w:w="70"/>
+              <w:left w:type="dxa" w:w="110"/>
+              <w:bottom w:type="dxa" w:w="70"/>
+              <w:right w:type="dxa" w:w="110"/>
+            </w:tcMar>
+            <w:vAlign w:val="center"/>
+          </w:tcPr>
+          <w:p>
+            <w:pPr>
+              <w:spacing w:after="0" w:before="0"/>
+            </w:pPr>
+            <w:r>
+              <w:rPr>
+                <w:rFonts w:ascii="Arial" w:cs="Arial" w:eastAsia="Arial" w:hAnsi="Arial"/>
+                <w:b/>
+                <w:bCs/>
+                <w:color w:val="FFFFFF"/>
+                <w:sz w:val="18"/>
+                <w:szCs w:val="18"/>
+              </w:rPr>
+              <w:t xml:space="preserve">Contenuto</w:t>
+            </w:r>
+          </w:p>
+        </w:tc>
+      </w:tr>
+      <w:tr>
+        <w:trPr>
+          <w:cantSplit/>
+        </w:trPr>
+        <w:tc>
+          <w:tcPr>
+            <w:tcW w:type="dxa" w:w="3779"/>
+            <w:tcBorders>
+              <w:top w:val="single" w:color="D9D4C5" w:sz="4"/>
+              <w:left w:val="single" w:color="D9D4C5" w:sz="4"/>
+              <w:bottom w:val="single" w:color="D9D4C5" w:sz="4"/>
+              <w:right w:val="single" w:color="D9D4C5" w:sz="4"/>
+            </w:tcBorders>
+            <w:tcMar>
+              <w:top w:type="dxa" w:w="70"/>
+              <w:left w:type="dxa" w:w="110"/>
+              <w:bottom w:type="dxa" w:w="70"/>
+              <w:right w:type="dxa" w:w="110"/>
+            </w:tcMar>
+            <w:vAlign w:val="center"/>
+          </w:tcPr>
+          <w:p>
+            <w:pPr>
+              <w:spacing w:after="0" w:before="0"/>
+            </w:pPr>
+            <w:r>
+              <w:rPr>
+                <w:rFonts w:ascii="Consolas" w:cs="Consolas" w:eastAsia="Consolas" w:hAnsi="Consolas"/>
+                <w:color w:val="2F5D3A"/>
+                <w:sz w:val="18"/>
+                <w:szCs w:val="18"/>
+              </w:rPr>
+              <w:t xml:space="preserve">1_codice</w:t>
+            </w:r>
+          </w:p>
+        </w:tc>
+        <w:tc>
+          <w:tcPr>
+            <w:tcW w:type="dxa" w:w="5859"/>
+            <w:tcBorders>
+              <w:top w:val="single" w:color="D9D4C5" w:sz="4"/>
+              <w:left w:val="single" w:color="D9D4C5" w:sz="4"/>
+              <w:bottom w:val="single" w:color="D9D4C5" w:sz="4"/>
+              <w:right w:val="single" w:color="D9D4C5" w:sz="4"/>
+            </w:tcBorders>
+            <w:tcMar>
+              <w:top w:type="dxa" w:w="70"/>
+              <w:left w:type="dxa" w:w="110"/>
+              <w:bottom w:type="dxa" w:w="70"/>
+              <w:right w:type="dxa" w:w="110"/>
+            </w:tcMar>
+            <w:vAlign w:val="center"/>
+          </w:tcPr>
+          <w:p>
+            <w:pPr>
+              <w:spacing w:after="0" w:before="0"/>
+            </w:pPr>
+            <w:r>
+              <w:rPr>
+                <w:rFonts w:ascii="Arial" w:cs="Arial" w:eastAsia="Arial" w:hAnsi="Arial"/>
+                <w:color w:val="1B2118"/>
+                <w:sz w:val="18"/>
+                <w:szCs w:val="18"/>
+              </w:rPr>
+              <w:t xml:space="preserve">ZIP del codice da GitHub (ramo main): portale, script del database 01-35, funzioni del server, manuali, strumenti di ripristino; </w:t>
+            </w:r>
+            <w:r>
+              <w:rPr>
+                <w:rFonts w:ascii="Consolas" w:cs="Consolas" w:eastAsia="Consolas" w:hAnsi="Consolas"/>
+                <w:color w:val="2F5D3A"/>
+                <w:sz w:val="18"/>
+                <w:szCs w:val="18"/>
+              </w:rPr>
+              <w:t xml:space="preserve">commit.json</w:t>
+            </w:r>
+            <w:r>
+              <w:rPr>
+                <w:rFonts w:ascii="Arial" w:cs="Arial" w:eastAsia="Arial" w:hAnsi="Arial"/>
+                <w:color w:val="1B2118"/>
+                <w:sz w:val="18"/>
+                <w:szCs w:val="18"/>
+              </w:rPr>
+              <w:t xml:space="preserve"> con il commit di riferimento</w:t>
+            </w:r>
+          </w:p>
+        </w:tc>
+      </w:tr>
+      <w:tr>
+        <w:trPr>
+          <w:cantSplit/>
+        </w:trPr>
+        <w:tc>
+          <w:tcPr>
+            <w:tcW w:type="dxa" w:w="3779"/>
+            <w:tcBorders>
+              <w:top w:val="single" w:color="D9D4C5" w:sz="4"/>
+              <w:left w:val="single" w:color="D9D4C5" w:sz="4"/>
+              <w:bottom w:val="single" w:color="D9D4C5" w:sz="4"/>
+              <w:right w:val="single" w:color="D9D4C5" w:sz="4"/>
+            </w:tcBorders>
+            <w:shd w:fill="F6F4EE" w:color="auto" w:val="clear"/>
+            <w:tcMar>
+              <w:top w:type="dxa" w:w="70"/>
+              <w:left w:type="dxa" w:w="110"/>
+              <w:bottom w:type="dxa" w:w="70"/>
+              <w:right w:type="dxa" w:w="110"/>
+            </w:tcMar>
+            <w:vAlign w:val="center"/>
+          </w:tcPr>
+          <w:p>
+            <w:pPr>
+              <w:spacing w:after="0" w:before="0"/>
+            </w:pPr>
+            <w:r>
+              <w:rPr>
+                <w:rFonts w:ascii="Consolas" w:cs="Consolas" w:eastAsia="Consolas" w:hAnsi="Consolas"/>
+                <w:color w:val="2F5D3A"/>
+                <w:sz w:val="18"/>
+                <w:szCs w:val="18"/>
+              </w:rPr>
+              <w:t xml:space="preserve">2_database</w:t>
+            </w:r>
+          </w:p>
+        </w:tc>
+        <w:tc>
+          <w:tcPr>
+            <w:tcW w:type="dxa" w:w="5859"/>
+            <w:tcBorders>
+              <w:top w:val="single" w:color="D9D4C5" w:sz="4"/>
+              <w:left w:val="single" w:color="D9D4C5" w:sz="4"/>
+              <w:bottom w:val="single" w:color="D9D4C5" w:sz="4"/>
+              <w:right w:val="single" w:color="D9D4C5" w:sz="4"/>
+            </w:tcBorders>
+            <w:shd w:fill="F6F4EE" w:color="auto" w:val="clear"/>
+            <w:tcMar>
+              <w:top w:type="dxa" w:w="70"/>
+              <w:left w:type="dxa" w:w="110"/>
+              <w:bottom w:type="dxa" w:w="70"/>
+              <w:right w:type="dxa" w:w="110"/>
+            </w:tcMar>
+            <w:vAlign w:val="center"/>
+          </w:tcPr>
+          <w:p>
+            <w:pPr>
+              <w:spacing w:after="0" w:before="0"/>
+            </w:pPr>
+            <w:r>
+              <w:rPr>
+                <w:rFonts w:ascii="Arial" w:cs="Arial" w:eastAsia="Arial" w:hAnsi="Arial"/>
+                <w:color w:val="1B2118"/>
+                <w:sz w:val="18"/>
+                <w:szCs w:val="18"/>
+              </w:rPr>
+              <w:t xml:space="preserve">Un file JSON per ogni tabella del database, </w:t>
+            </w:r>
+            <w:r>
+              <w:rPr>
+                <w:rFonts w:ascii="Consolas" w:cs="Consolas" w:eastAsia="Consolas" w:hAnsi="Consolas"/>
+                <w:color w:val="2F5D3A"/>
+                <w:sz w:val="18"/>
+                <w:szCs w:val="18"/>
+              </w:rPr>
+              <w:t xml:space="preserve">auth_utenti.json</w:t>
+            </w:r>
+            <w:r>
+              <w:rPr>
+                <w:rFonts w:ascii="Arial" w:cs="Arial" w:eastAsia="Arial" w:hAnsi="Arial"/>
+                <w:color w:val="1B2118"/>
+                <w:sz w:val="18"/>
+                <w:szCs w:val="18"/>
+              </w:rPr>
+              <w:t xml:space="preserve"> (utenti con id ed email, </w:t>
+            </w:r>
+            <w:r>
+              <w:rPr>
+                <w:rFonts w:ascii="Arial" w:cs="Arial" w:eastAsia="Arial" w:hAnsi="Arial"/>
+                <w:b/>
+                <w:bCs/>
+                <w:color w:val="1B2118"/>
+                <w:sz w:val="18"/>
+                <w:szCs w:val="18"/>
+              </w:rPr>
+              <w:t xml:space="preserve">senza password</w:t>
+            </w:r>
+            <w:r>
+              <w:rPr>
+                <w:rFonts w:ascii="Arial" w:cs="Arial" w:eastAsia="Arial" w:hAnsi="Arial"/>
+                <w:color w:val="1B2118"/>
+                <w:sz w:val="18"/>
+                <w:szCs w:val="18"/>
+              </w:rPr>
+              <w:t xml:space="preserve">: non si possono esportare) e </w:t>
+            </w:r>
+            <w:r>
+              <w:rPr>
+                <w:rFonts w:ascii="Consolas" w:cs="Consolas" w:eastAsia="Consolas" w:hAnsi="Consolas"/>
+                <w:color w:val="2F5D3A"/>
+                <w:sz w:val="18"/>
+                <w:szCs w:val="18"/>
+              </w:rPr>
+              <w:t xml:space="preserve">conteggi.json</w:t>
+            </w:r>
+          </w:p>
+        </w:tc>
+      </w:tr>
+      <w:tr>
+        <w:trPr>
+          <w:cantSplit/>
+        </w:trPr>
+        <w:tc>
+          <w:tcPr>
+            <w:tcW w:type="dxa" w:w="3779"/>
+            <w:tcBorders>
+              <w:top w:val="single" w:color="D9D4C5" w:sz="4"/>
+              <w:left w:val="single" w:color="D9D4C5" w:sz="4"/>
+              <w:bottom w:val="single" w:color="D9D4C5" w:sz="4"/>
+              <w:right w:val="single" w:color="D9D4C5" w:sz="4"/>
+            </w:tcBorders>
+            <w:tcMar>
+              <w:top w:type="dxa" w:w="70"/>
+              <w:left w:type="dxa" w:w="110"/>
+              <w:bottom w:type="dxa" w:w="70"/>
+              <w:right w:type="dxa" w:w="110"/>
+            </w:tcMar>
+            <w:vAlign w:val="center"/>
+          </w:tcPr>
+          <w:p>
+            <w:pPr>
+              <w:spacing w:after="0" w:before="0"/>
+            </w:pPr>
+            <w:r>
+              <w:rPr>
+                <w:rFonts w:ascii="Consolas" w:cs="Consolas" w:eastAsia="Consolas" w:hAnsi="Consolas"/>
+                <w:color w:val="2F5D3A"/>
+                <w:sz w:val="18"/>
+                <w:szCs w:val="18"/>
+              </w:rPr>
+              <w:t xml:space="preserve">3_file</w:t>
+            </w:r>
+          </w:p>
+        </w:tc>
+        <w:tc>
+          <w:tcPr>
+            <w:tcW w:type="dxa" w:w="5859"/>
+            <w:tcBorders>
+              <w:top w:val="single" w:color="D9D4C5" w:sz="4"/>
+              <w:left w:val="single" w:color="D9D4C5" w:sz="4"/>
+              <w:bottom w:val="single" w:color="D9D4C5" w:sz="4"/>
+              <w:right w:val="single" w:color="D9D4C5" w:sz="4"/>
+            </w:tcBorders>
+            <w:tcMar>
+              <w:top w:type="dxa" w:w="70"/>
+              <w:left w:type="dxa" w:w="110"/>
+              <w:bottom w:type="dxa" w:w="70"/>
+              <w:right w:type="dxa" w:w="110"/>
+            </w:tcMar>
+            <w:vAlign w:val="center"/>
+          </w:tcPr>
+          <w:p>
+            <w:pPr>
+              <w:spacing w:after="0" w:before="0"/>
+            </w:pPr>
+            <w:r>
+              <w:rPr>
+                <w:rFonts w:ascii="Arial" w:cs="Arial" w:eastAsia="Arial" w:hAnsi="Arial"/>
+                <w:color w:val="1B2118"/>
+                <w:sz w:val="18"/>
+                <w:szCs w:val="18"/>
+              </w:rPr>
+              <w:t xml:space="preserve">Tutti i file degli archivi </w:t>
+            </w:r>
+            <w:r>
+              <w:rPr>
+                <w:rFonts w:ascii="Consolas" w:cs="Consolas" w:eastAsia="Consolas" w:hAnsi="Consolas"/>
+                <w:color w:val="2F5D3A"/>
+                <w:sz w:val="18"/>
+                <w:szCs w:val="18"/>
+              </w:rPr>
+              <w:t xml:space="preserve">documenti</w:t>
+            </w:r>
+            <w:r>
+              <w:rPr>
+                <w:rFonts w:ascii="Arial" w:cs="Arial" w:eastAsia="Arial" w:hAnsi="Arial"/>
+                <w:color w:val="1B2118"/>
+                <w:sz w:val="18"/>
+                <w:szCs w:val="18"/>
+              </w:rPr>
+              <w:t xml:space="preserve">, </w:t>
+            </w:r>
+            <w:r>
+              <w:rPr>
+                <w:rFonts w:ascii="Consolas" w:cs="Consolas" w:eastAsia="Consolas" w:hAnsi="Consolas"/>
+                <w:color w:val="2F5D3A"/>
+                <w:sz w:val="18"/>
+                <w:szCs w:val="18"/>
+              </w:rPr>
+              <w:t xml:space="preserve">modelli</w:t>
+            </w:r>
+            <w:r>
+              <w:rPr>
+                <w:rFonts w:ascii="Arial" w:cs="Arial" w:eastAsia="Arial" w:hAnsi="Arial"/>
+                <w:color w:val="1B2118"/>
+                <w:sz w:val="18"/>
+                <w:szCs w:val="18"/>
+              </w:rPr>
+              <w:t xml:space="preserve"> e </w:t>
+            </w:r>
+            <w:r>
+              <w:rPr>
+                <w:rFonts w:ascii="Consolas" w:cs="Consolas" w:eastAsia="Consolas" w:hAnsi="Consolas"/>
+                <w:color w:val="2F5D3A"/>
+                <w:sz w:val="18"/>
+                <w:szCs w:val="18"/>
+              </w:rPr>
+              <w:t xml:space="preserve">allegati-consultazione</w:t>
+            </w:r>
+            <w:r>
+              <w:rPr>
+                <w:rFonts w:ascii="Arial" w:cs="Arial" w:eastAsia="Arial" w:hAnsi="Arial"/>
+                <w:color w:val="1B2118"/>
+                <w:sz w:val="18"/>
+                <w:szCs w:val="18"/>
+              </w:rPr>
+              <w:t xml:space="preserve">, con le stesse sottocartelle, ed </w:t>
+            </w:r>
+            <w:r>
+              <w:rPr>
+                <w:rFonts w:ascii="Consolas" w:cs="Consolas" w:eastAsia="Consolas" w:hAnsi="Consolas"/>
+                <w:color w:val="2F5D3A"/>
+                <w:sz w:val="18"/>
+                <w:szCs w:val="18"/>
+              </w:rPr>
+              <w:t xml:space="preserve">elenco_file.json</w:t>
+            </w:r>
+          </w:p>
+        </w:tc>
+      </w:tr>
+      <w:tr>
+        <w:trPr>
+          <w:cantSplit/>
+        </w:trPr>
+        <w:tc>
+          <w:tcPr>
+            <w:tcW w:type="dxa" w:w="3779"/>
+            <w:tcBorders>
+              <w:top w:val="single" w:color="D9D4C5" w:sz="4"/>
+              <w:left w:val="single" w:color="D9D4C5" w:sz="4"/>
+              <w:bottom w:val="single" w:color="D9D4C5" w:sz="4"/>
+              <w:right w:val="single" w:color="D9D4C5" w:sz="4"/>
+            </w:tcBorders>
+            <w:shd w:fill="F6F4EE" w:color="auto" w:val="clear"/>
+            <w:tcMar>
+              <w:top w:type="dxa" w:w="70"/>
+              <w:left w:type="dxa" w:w="110"/>
+              <w:bottom w:type="dxa" w:w="70"/>
+              <w:right w:type="dxa" w:w="110"/>
+            </w:tcMar>
+            <w:vAlign w:val="center"/>
+          </w:tcPr>
+          <w:p>
+            <w:pPr>
+              <w:spacing w:after="0" w:before="0"/>
+            </w:pPr>
+            <w:r>
+              <w:rPr>
+                <w:rFonts w:ascii="Consolas" w:cs="Consolas" w:eastAsia="Consolas" w:hAnsi="Consolas"/>
+                <w:color w:val="2F5D3A"/>
+                <w:sz w:val="18"/>
+                <w:szCs w:val="18"/>
+              </w:rPr>
+              <w:t xml:space="preserve">4_servizi</w:t>
+            </w:r>
+          </w:p>
+        </w:tc>
+        <w:tc>
+          <w:tcPr>
+            <w:tcW w:type="dxa" w:w="5859"/>
+            <w:tcBorders>
+              <w:top w:val="single" w:color="D9D4C5" w:sz="4"/>
+              <w:left w:val="single" w:color="D9D4C5" w:sz="4"/>
+              <w:bottom w:val="single" w:color="D9D4C5" w:sz="4"/>
+              <w:right w:val="single" w:color="D9D4C5" w:sz="4"/>
+            </w:tcBorders>
+            <w:shd w:fill="F6F4EE" w:color="auto" w:val="clear"/>
+            <w:tcMar>
+              <w:top w:type="dxa" w:w="70"/>
+              <w:left w:type="dxa" w:w="110"/>
+              <w:bottom w:type="dxa" w:w="70"/>
+              <w:right w:type="dxa" w:w="110"/>
+            </w:tcMar>
+            <w:vAlign w:val="center"/>
+          </w:tcPr>
+          <w:p>
+            <w:pPr>
+              <w:spacing w:after="0" w:before="0"/>
+            </w:pPr>
+            <w:r>
+              <w:rPr>
+                <w:rFonts w:ascii="Arial" w:cs="Arial" w:eastAsia="Arial" w:hAnsi="Arial"/>
+                <w:color w:val="1B2118"/>
+                <w:sz w:val="18"/>
+                <w:szCs w:val="18"/>
+              </w:rPr>
+              <w:t xml:space="preserve">Configurazione di Supabase, Vercel e Resend: nomi delle funzioni e dei segreti, impostazioni di Auth, variabili di Vercel, domini Resend. </w:t>
+            </w:r>
+            <w:r>
+              <w:rPr>
+                <w:rFonts w:ascii="Arial" w:cs="Arial" w:eastAsia="Arial" w:hAnsi="Arial"/>
+                <w:b/>
+                <w:bCs/>
+                <w:color w:val="1B2118"/>
+                <w:sz w:val="18"/>
+                <w:szCs w:val="18"/>
+              </w:rPr>
+              <w:t xml:space="preserve">Mai i valori segreti</w:t>
+            </w:r>
+          </w:p>
+        </w:tc>
+      </w:tr>
+      <w:tr>
+        <w:trPr>
+          <w:cantSplit/>
+        </w:trPr>
+        <w:tc>
+          <w:tcPr>
+            <w:tcW w:type="dxa" w:w="3779"/>
+            <w:tcBorders>
+              <w:top w:val="single" w:color="D9D4C5" w:sz="4"/>
+              <w:left w:val="single" w:color="D9D4C5" w:sz="4"/>
+              <w:bottom w:val="single" w:color="D9D4C5" w:sz="4"/>
+              <w:right w:val="single" w:color="D9D4C5" w:sz="4"/>
+            </w:tcBorders>
+            <w:tcMar>
+              <w:top w:type="dxa" w:w="70"/>
+              <w:left w:type="dxa" w:w="110"/>
+              <w:bottom w:type="dxa" w:w="70"/>
+              <w:right w:type="dxa" w:w="110"/>
+            </w:tcMar>
+            <w:vAlign w:val="center"/>
+          </w:tcPr>
+          <w:p>
+            <w:pPr>
+              <w:spacing w:after="0" w:before="0"/>
+            </w:pPr>
+            <w:r>
+              <w:rPr>
+                <w:rFonts w:ascii="Consolas" w:cs="Consolas" w:eastAsia="Consolas" w:hAnsi="Consolas"/>
+                <w:color w:val="2F5D3A"/>
+                <w:sz w:val="18"/>
+                <w:szCs w:val="18"/>
+              </w:rPr>
+              <w:t xml:space="preserve">LEGGIMI.txt</w:t>
+            </w:r>
+            <w:r>
+              <w:rPr>
+                <w:rFonts w:ascii="Arial" w:cs="Arial" w:eastAsia="Arial" w:hAnsi="Arial"/>
+                <w:color w:val="1B2118"/>
+                <w:sz w:val="18"/>
+                <w:szCs w:val="18"/>
+              </w:rPr>
+              <w:t xml:space="preserve">, PDF delle Istruzioni di ripristino, </w:t>
+            </w:r>
+            <w:r>
+              <w:rPr>
+                <w:rFonts w:ascii="Consolas" w:cs="Consolas" w:eastAsia="Consolas" w:hAnsi="Consolas"/>
+                <w:color w:val="2F5D3A"/>
+                <w:sz w:val="18"/>
+                <w:szCs w:val="18"/>
+              </w:rPr>
+              <w:t xml:space="preserve">esito.json</w:t>
+            </w:r>
+          </w:p>
+        </w:tc>
+        <w:tc>
+          <w:tcPr>
+            <w:tcW w:type="dxa" w:w="5859"/>
+            <w:tcBorders>
+              <w:top w:val="single" w:color="D9D4C5" w:sz="4"/>
+              <w:left w:val="single" w:color="D9D4C5" w:sz="4"/>
+              <w:bottom w:val="single" w:color="D9D4C5" w:sz="4"/>
+              <w:right w:val="single" w:color="D9D4C5" w:sz="4"/>
+            </w:tcBorders>
+            <w:tcMar>
+              <w:top w:type="dxa" w:w="70"/>
+              <w:left w:type="dxa" w:w="110"/>
+              <w:bottom w:type="dxa" w:w="70"/>
+              <w:right w:type="dxa" w:w="110"/>
+            </w:tcMar>
+            <w:vAlign w:val="center"/>
+          </w:tcPr>
+          <w:p>
+            <w:pPr>
+              <w:spacing w:after="0" w:before="0"/>
+            </w:pPr>
+            <w:r>
+              <w:rPr>
+                <w:rFonts w:ascii="Arial" w:cs="Arial" w:eastAsia="Arial" w:hAnsi="Arial"/>
+                <w:color w:val="1B2118"/>
+                <w:sz w:val="18"/>
+                <w:szCs w:val="18"/>
+              </w:rPr>
+              <w:t xml:space="preserve">Guida rapida, queste istruzioni aggiornate ed esito del backup</w:t>
+            </w:r>
+          </w:p>
+        </w:tc>
+      </w:tr>
+    </w:tbl>
+    <w:p>
+      <w:pPr>
+        <w:spacing w:after="160"/>
+      </w:pPr>
+    </w:p>
+    <w:p>
+      <w:pPr>
+        <w:spacing w:after="140" w:line="300"/>
+      </w:pPr>
+      <w:r>
+        <w:rPr>
+          <w:rFonts w:ascii="Arial" w:cs="Arial" w:eastAsia="Arial" w:hAnsi="Arial"/>
+          <w:color w:val="1B2118"/>
+          <w:sz w:val="21"/>
+          <w:szCs w:val="21"/>
+        </w:rPr>
+        <w:t xml:space="preserve">Se un backup non riesce o non finisce (Google concede al massimo 6 minuti per esecuzione), Luca riceve un'email «Backup CWP NON completo» con gli errori.</w:t>
+      </w:r>
+    </w:p>
+    <w:p>
+      <w:pPr>
+        <w:spacing w:after="140" w:line="300"/>
+      </w:pPr>
+      <w:r>
+        <w:rPr>
+          <w:rFonts w:ascii="Arial" w:cs="Arial" w:eastAsia="Arial" w:hAnsi="Arial"/>
+          <w:b/>
+          <w:bCs/>
+          <w:color w:val="1B2118"/>
+          <w:sz w:val="21"/>
+          <w:szCs w:val="21"/>
+        </w:rPr>
+        <w:t xml:space="preserve">Il backup contiene dati personali</w:t>
+      </w:r>
+      <w:r>
+        <w:rPr>
+          <w:rFonts w:ascii="Arial" w:cs="Arial" w:eastAsia="Arial" w:hAnsi="Arial"/>
+          <w:color w:val="1B2118"/>
+          <w:sz w:val="21"/>
+          <w:szCs w:val="21"/>
+        </w:rPr>
+        <w:t xml:space="preserve"> (email degli utenti, documenti delle pratiche): la cartella Cwp non va condivisa.</w:t>
+      </w:r>
+    </w:p>
+    <w:p>
+      <w:pPr>
+        <w:pStyle w:val="Heading2"/>
+        <w:keepNext/>
+        <w:spacing w:after="120" w:before="240"/>
+      </w:pPr>
+      <w:r>
+        <w:rPr>
+          <w:rFonts w:ascii="Arial" w:cs="Arial" w:eastAsia="Arial" w:hAnsi="Arial"/>
+          <w:b/>
+          <w:bCs/>
+          <w:color w:val="2F5D3A"/>
+          <w:sz w:val="25"/>
+          <w:szCs w:val="25"/>
+        </w:rPr>
+        <w:t xml:space="preserve">Installazione (una volta, la fa Luca: circa 10 minuti)</w:t>
+      </w:r>
+    </w:p>
+    <w:p>
+      <w:pPr>
+        <w:spacing w:after="140" w:line="300"/>
+      </w:pPr>
+      <w:r>
+        <w:rPr>
+          <w:rFonts w:ascii="Arial" w:cs="Arial" w:eastAsia="Arial" w:hAnsi="Arial"/>
+          <w:color w:val="1B2118"/>
+          <w:sz w:val="21"/>
+          <w:szCs w:val="21"/>
+        </w:rPr>
+        <w:t xml:space="preserve">Il codice del programma è nel repository, </w:t>
+      </w:r>
+      <w:r>
+        <w:rPr>
+          <w:rFonts w:ascii="Consolas" w:cs="Consolas" w:eastAsia="Consolas" w:hAnsi="Consolas"/>
+          <w:color w:val="2F5D3A"/>
+          <w:sz w:val="21"/>
+          <w:szCs w:val="21"/>
+        </w:rPr>
+        <w:t xml:space="preserve">strumenti/backup/BackupCWP.gs</w:t>
+      </w:r>
+      <w:r>
+        <w:rPr>
+          <w:rFonts w:ascii="Arial" w:cs="Arial" w:eastAsia="Arial" w:hAnsi="Arial"/>
+          <w:color w:val="1B2118"/>
+          <w:sz w:val="21"/>
+          <w:szCs w:val="21"/>
+        </w:rPr>
+        <w:t xml:space="preserve">: si apre in testo semplice all'indirizzo </w:t>
+      </w:r>
+      <w:hyperlink w:history="1" r:id="rIdk3yxkcmbarm9mbu-bvlsr">
+        <w:r>
+          <w:rPr>
+            <w:rFonts w:ascii="Arial" w:cs="Arial" w:eastAsia="Arial" w:hAnsi="Arial"/>
+            <w:color w:val="2F5D3A"/>
+            <w:sz w:val="21"/>
+            <w:szCs w:val="21"/>
+            <w:u w:val="single"/>
+          </w:rPr>
+          <w:t xml:space="preserve">https://raw.githubusercontent.com/lucamorettioperate/portale-cwp/main/strumenti/backup/BackupCWP.gs.</w:t>
+        </w:r>
+      </w:hyperlink>
+      <w:r>
+        <w:rPr>
+          <w:rFonts w:ascii="Arial" w:cs="Arial" w:eastAsia="Arial" w:hAnsi="Arial"/>
+          <w:color w:val="1B2118"/>
+          <w:sz w:val="21"/>
+          <w:szCs w:val="21"/>
+        </w:rPr>
+        <w:t xml:space="preserve"> Nella cartella Cwp c'è anche il documento «Backup CWP — installazione» con questi passi.</w:t>
       </w:r>
     </w:p>
     <w:p>
@@ -5660,7 +6818,7 @@
           <w:sz w:val="21"/>
           <w:szCs w:val="21"/>
         </w:rPr>
-        <w:t xml:space="preserve">Su vercel.com aprite il progetto </w:t>
+        <w:t xml:space="preserve">Aprite </w:t>
       </w:r>
       <w:r>
         <w:rPr>
@@ -5671,36 +6829,36 @@
           <w:sz w:val="21"/>
           <w:szCs w:val="21"/>
         </w:rPr>
-        <w:t xml:space="preserve">portale-cwp</w:t>
-      </w:r>
-      <w:r>
-        <w:rPr>
-          <w:rFonts w:ascii="Arial" w:cs="Arial" w:eastAsia="Arial" w:hAnsi="Arial"/>
-          <w:color w:val="1B2118"/>
-          <w:sz w:val="21"/>
-          <w:szCs w:val="21"/>
-        </w:rPr>
-        <w:t xml:space="preserve">, scheda </w:t>
-      </w:r>
-      <w:r>
-        <w:rPr>
-          <w:rFonts w:ascii="Arial" w:cs="Arial" w:eastAsia="Arial" w:hAnsi="Arial"/>
-          <w:i/>
-          <w:iCs/>
-          <w:color w:val="1B2118"/>
-          <w:sz w:val="21"/>
-          <w:szCs w:val="21"/>
-        </w:rPr>
-        <w:t xml:space="preserve">Deployments</w:t>
-      </w:r>
-      <w:r>
-        <w:rPr>
-          <w:rFonts w:ascii="Arial" w:cs="Arial" w:eastAsia="Arial" w:hAnsi="Arial"/>
-          <w:color w:val="1B2118"/>
-          <w:sz w:val="21"/>
-          <w:szCs w:val="21"/>
-        </w:rPr>
-        <w:t xml:space="preserve">.</w:t>
+        <w:t xml:space="preserve">script.google.com</w:t>
+      </w:r>
+      <w:r>
+        <w:rPr>
+          <w:rFonts w:ascii="Arial" w:cs="Arial" w:eastAsia="Arial" w:hAnsi="Arial"/>
+          <w:color w:val="1B2118"/>
+          <w:sz w:val="21"/>
+          <w:szCs w:val="21"/>
+        </w:rPr>
+        <w:t xml:space="preserve"> con l'account Google che possiede la cartella Cwp → </w:t>
+      </w:r>
+      <w:r>
+        <w:rPr>
+          <w:rFonts w:ascii="Arial" w:cs="Arial" w:eastAsia="Arial" w:hAnsi="Arial"/>
+          <w:b/>
+          <w:bCs/>
+          <w:color w:val="1B2118"/>
+          <w:sz w:val="21"/>
+          <w:szCs w:val="21"/>
+        </w:rPr>
+        <w:t xml:space="preserve">Nuovo progetto</w:t>
+      </w:r>
+      <w:r>
+        <w:rPr>
+          <w:rFonts w:ascii="Arial" w:cs="Arial" w:eastAsia="Arial" w:hAnsi="Arial"/>
+          <w:color w:val="1B2118"/>
+          <w:sz w:val="21"/>
+          <w:szCs w:val="21"/>
+        </w:rPr>
+        <w:t xml:space="preserve">. Rinominatelo «Backup CWP».</w:t>
       </w:r>
     </w:p>
     <w:p>
@@ -5719,7 +6877,45 @@
           <w:sz w:val="21"/>
           <w:szCs w:val="21"/>
         </w:rPr>
-        <w:t xml:space="preserve">Trovate l'ultimo rilascio che funzionava (data e messaggio della modifica).</w:t>
+        <w:t xml:space="preserve">Aprite l'indirizzo del codice qui sopra, selezionate tutto (Cmd+A / Ctrl+A) e copiate. Nell'editor cancellate il contenuto del file </w:t>
+      </w:r>
+      <w:r>
+        <w:rPr>
+          <w:rFonts w:ascii="Consolas" w:cs="Consolas" w:eastAsia="Consolas" w:hAnsi="Consolas"/>
+          <w:color w:val="2F5D3A"/>
+          <w:sz w:val="21"/>
+          <w:szCs w:val="21"/>
+        </w:rPr>
+        <w:t xml:space="preserve">Codice.gs</w:t>
+      </w:r>
+      <w:r>
+        <w:rPr>
+          <w:rFonts w:ascii="Arial" w:cs="Arial" w:eastAsia="Arial" w:hAnsi="Arial"/>
+          <w:color w:val="1B2118"/>
+          <w:sz w:val="21"/>
+          <w:szCs w:val="21"/>
+        </w:rPr>
+        <w:t xml:space="preserve">, incollate e premete </w:t>
+      </w:r>
+      <w:r>
+        <w:rPr>
+          <w:rFonts w:ascii="Arial" w:cs="Arial" w:eastAsia="Arial" w:hAnsi="Arial"/>
+          <w:b/>
+          <w:bCs/>
+          <w:color w:val="1B2118"/>
+          <w:sz w:val="21"/>
+          <w:szCs w:val="21"/>
+        </w:rPr>
+        <w:t xml:space="preserve">Salva</w:t>
+      </w:r>
+      <w:r>
+        <w:rPr>
+          <w:rFonts w:ascii="Arial" w:cs="Arial" w:eastAsia="Arial" w:hAnsi="Arial"/>
+          <w:color w:val="1B2118"/>
+          <w:sz w:val="21"/>
+          <w:szCs w:val="21"/>
+        </w:rPr>
+        <w:t xml:space="preserve"> (icona del dischetto).</w:t>
       </w:r>
     </w:p>
     <w:p>
@@ -5734,6 +6930,1224 @@
       <w:r>
         <w:rPr>
           <w:rFonts w:ascii="Arial" w:cs="Arial" w:eastAsia="Arial" w:hAnsi="Arial"/>
+          <w:b/>
+          <w:bCs/>
+          <w:color w:val="1B2118"/>
+          <w:sz w:val="21"/>
+          <w:szCs w:val="21"/>
+        </w:rPr>
+        <w:t xml:space="preserve">Impostazioni progetto</w:t>
+      </w:r>
+      <w:r>
+        <w:rPr>
+          <w:rFonts w:ascii="Arial" w:cs="Arial" w:eastAsia="Arial" w:hAnsi="Arial"/>
+          <w:color w:val="1B2118"/>
+          <w:sz w:val="21"/>
+          <w:szCs w:val="21"/>
+        </w:rPr>
+        <w:t xml:space="preserve"> (ingranaggio a sinistra):</w:t>
+      </w:r>
+    </w:p>
+    <w:p>
+      <w:pPr>
+        <w:spacing w:after="60"/>
+      </w:pPr>
+    </w:p>
+    <w:p>
+      <w:pPr>
+        <w:spacing w:after="140" w:line="300"/>
+      </w:pPr>
+      <w:r>
+        <w:rPr>
+          <w:rFonts w:ascii="Arial" w:cs="Arial" w:eastAsia="Arial" w:hAnsi="Arial"/>
+          <w:color w:val="1B2118"/>
+          <w:sz w:val="21"/>
+          <w:szCs w:val="21"/>
+        </w:rPr>
+        <w:t xml:space="preserve">- </w:t>
+      </w:r>
+      <w:r>
+        <w:rPr>
+          <w:rFonts w:ascii="Arial" w:cs="Arial" w:eastAsia="Arial" w:hAnsi="Arial"/>
+          <w:b/>
+          <w:bCs/>
+          <w:color w:val="1B2118"/>
+          <w:sz w:val="21"/>
+          <w:szCs w:val="21"/>
+        </w:rPr>
+        <w:t xml:space="preserve">Fuso orario</w:t>
+      </w:r>
+      <w:r>
+        <w:rPr>
+          <w:rFonts w:ascii="Arial" w:cs="Arial" w:eastAsia="Arial" w:hAnsi="Arial"/>
+          <w:color w:val="1B2118"/>
+          <w:sz w:val="21"/>
+          <w:szCs w:val="21"/>
+        </w:rPr>
+        <w:t xml:space="preserve">: «(GMT+01:00) Roma» (oppure «Europe/Rome»); - </w:t>
+      </w:r>
+      <w:r>
+        <w:rPr>
+          <w:rFonts w:ascii="Arial" w:cs="Arial" w:eastAsia="Arial" w:hAnsi="Arial"/>
+          <w:b/>
+          <w:bCs/>
+          <w:color w:val="1B2118"/>
+          <w:sz w:val="21"/>
+          <w:szCs w:val="21"/>
+        </w:rPr>
+        <w:t xml:space="preserve">Proprietà dello script</w:t>
+      </w:r>
+      <w:r>
+        <w:rPr>
+          <w:rFonts w:ascii="Arial" w:cs="Arial" w:eastAsia="Arial" w:hAnsi="Arial"/>
+          <w:color w:val="1B2118"/>
+          <w:sz w:val="21"/>
+          <w:szCs w:val="21"/>
+        </w:rPr>
+        <w:t xml:space="preserve"> → </w:t>
+      </w:r>
+      <w:r>
+        <w:rPr>
+          <w:rFonts w:ascii="Arial" w:cs="Arial" w:eastAsia="Arial" w:hAnsi="Arial"/>
+          <w:b/>
+          <w:bCs/>
+          <w:color w:val="1B2118"/>
+          <w:sz w:val="21"/>
+          <w:szCs w:val="21"/>
+        </w:rPr>
+        <w:t xml:space="preserve">Aggiungi proprietà dello script</w:t>
+      </w:r>
+      <w:r>
+        <w:rPr>
+          <w:rFonts w:ascii="Arial" w:cs="Arial" w:eastAsia="Arial" w:hAnsi="Arial"/>
+          <w:color w:val="1B2118"/>
+          <w:sz w:val="21"/>
+          <w:szCs w:val="21"/>
+        </w:rPr>
+        <w:t xml:space="preserve">, nome </w:t>
+      </w:r>
+      <w:r>
+        <w:rPr>
+          <w:rFonts w:ascii="Consolas" w:cs="Consolas" w:eastAsia="Consolas" w:hAnsi="Consolas"/>
+          <w:color w:val="2F5D3A"/>
+          <w:sz w:val="21"/>
+          <w:szCs w:val="21"/>
+        </w:rPr>
+        <w:t xml:space="preserve">SUPABASE_SERVICE_ROLE_KEY</w:t>
+      </w:r>
+      <w:r>
+        <w:rPr>
+          <w:rFonts w:ascii="Arial" w:cs="Arial" w:eastAsia="Arial" w:hAnsi="Arial"/>
+          <w:color w:val="1B2118"/>
+          <w:sz w:val="21"/>
+          <w:szCs w:val="21"/>
+        </w:rPr>
+        <w:t xml:space="preserve">. Il valore è in Supabase → </w:t>
+      </w:r>
+      <w:r>
+        <w:rPr>
+          <w:rFonts w:ascii="Arial" w:cs="Arial" w:eastAsia="Arial" w:hAnsi="Arial"/>
+          <w:i/>
+          <w:iCs/>
+          <w:color w:val="1B2118"/>
+          <w:sz w:val="21"/>
+          <w:szCs w:val="21"/>
+        </w:rPr>
+        <w:t xml:space="preserve">Project Settings</w:t>
+      </w:r>
+      <w:r>
+        <w:rPr>
+          <w:rFonts w:ascii="Arial" w:cs="Arial" w:eastAsia="Arial" w:hAnsi="Arial"/>
+          <w:color w:val="1B2118"/>
+          <w:sz w:val="21"/>
+          <w:szCs w:val="21"/>
+        </w:rPr>
+        <w:t xml:space="preserve"> → </w:t>
+      </w:r>
+      <w:r>
+        <w:rPr>
+          <w:rFonts w:ascii="Arial" w:cs="Arial" w:eastAsia="Arial" w:hAnsi="Arial"/>
+          <w:i/>
+          <w:iCs/>
+          <w:color w:val="1B2118"/>
+          <w:sz w:val="21"/>
+          <w:szCs w:val="21"/>
+        </w:rPr>
+        <w:t xml:space="preserve">API Keys</w:t>
+      </w:r>
+      <w:r>
+        <w:rPr>
+          <w:rFonts w:ascii="Arial" w:cs="Arial" w:eastAsia="Arial" w:hAnsi="Arial"/>
+          <w:color w:val="1B2118"/>
+          <w:sz w:val="21"/>
+          <w:szCs w:val="21"/>
+        </w:rPr>
+        <w:t xml:space="preserve"> → chiave </w:t>
+      </w:r>
+      <w:r>
+        <w:rPr>
+          <w:rFonts w:ascii="Arial" w:cs="Arial" w:eastAsia="Arial" w:hAnsi="Arial"/>
+          <w:b/>
+          <w:bCs/>
+          <w:color w:val="1B2118"/>
+          <w:sz w:val="21"/>
+          <w:szCs w:val="21"/>
+        </w:rPr>
+        <w:t xml:space="preserve">service_role</w:t>
+      </w:r>
+      <w:r>
+        <w:rPr>
+          <w:rFonts w:ascii="Arial" w:cs="Arial" w:eastAsia="Arial" w:hAnsi="Arial"/>
+          <w:color w:val="1B2118"/>
+          <w:sz w:val="21"/>
+          <w:szCs w:val="21"/>
+        </w:rPr>
+        <w:t xml:space="preserve">: copiatela e incollatela voi, non va mai scritta altrove; - facoltative: </w:t>
+      </w:r>
+      <w:r>
+        <w:rPr>
+          <w:rFonts w:ascii="Consolas" w:cs="Consolas" w:eastAsia="Consolas" w:hAnsi="Consolas"/>
+          <w:color w:val="2F5D3A"/>
+          <w:sz w:val="21"/>
+          <w:szCs w:val="21"/>
+        </w:rPr>
+        <w:t xml:space="preserve">RESEND_API_KEY</w:t>
+      </w:r>
+      <w:r>
+        <w:rPr>
+          <w:rFonts w:ascii="Arial" w:cs="Arial" w:eastAsia="Arial" w:hAnsi="Arial"/>
+          <w:color w:val="1B2118"/>
+          <w:sz w:val="21"/>
+          <w:szCs w:val="21"/>
+        </w:rPr>
+        <w:t xml:space="preserve"> (per salvare l'elenco dei domini Resend) e </w:t>
+      </w:r>
+      <w:r>
+        <w:rPr>
+          <w:rFonts w:ascii="Consolas" w:cs="Consolas" w:eastAsia="Consolas" w:hAnsi="Consolas"/>
+          <w:color w:val="2F5D3A"/>
+          <w:sz w:val="21"/>
+          <w:szCs w:val="21"/>
+        </w:rPr>
+        <w:t xml:space="preserve">VERCEL_TOKEN</w:t>
+      </w:r>
+      <w:r>
+        <w:rPr>
+          <w:rFonts w:ascii="Arial" w:cs="Arial" w:eastAsia="Arial" w:hAnsi="Arial"/>
+          <w:color w:val="1B2118"/>
+          <w:sz w:val="21"/>
+          <w:szCs w:val="21"/>
+        </w:rPr>
+        <w:t xml:space="preserve"> (per salvare le impostazioni del progetto Vercel).</w:t>
+      </w:r>
+    </w:p>
+    <w:p>
+      <w:pPr>
+        <w:pStyle w:val="ListParagraph"/>
+        <w:numPr>
+          <w:ilvl w:val="0"/>
+          <w:numId w:val="5"/>
+        </w:numPr>
+        <w:spacing w:after="70" w:line="290"/>
+      </w:pPr>
+      <w:r>
+        <w:rPr>
+          <w:rFonts w:ascii="Arial" w:cs="Arial" w:eastAsia="Arial" w:hAnsi="Arial"/>
+          <w:color w:val="1B2118"/>
+          <w:sz w:val="21"/>
+          <w:szCs w:val="21"/>
+        </w:rPr>
+        <w:t xml:space="preserve">Tornate all'editor, scegliete la funzione </w:t>
+      </w:r>
+      <w:r>
+        <w:rPr>
+          <w:rFonts w:ascii="Arial" w:cs="Arial" w:eastAsia="Arial" w:hAnsi="Arial"/>
+          <w:b/>
+          <w:bCs/>
+          <w:color w:val="1B2118"/>
+          <w:sz w:val="21"/>
+          <w:szCs w:val="21"/>
+        </w:rPr>
+        <w:t xml:space="preserve">installa</w:t>
+      </w:r>
+      <w:r>
+        <w:rPr>
+          <w:rFonts w:ascii="Arial" w:cs="Arial" w:eastAsia="Arial" w:hAnsi="Arial"/>
+          <w:color w:val="1B2118"/>
+          <w:sz w:val="21"/>
+          <w:szCs w:val="21"/>
+        </w:rPr>
+        <w:t xml:space="preserve"> nel menu in alto e premete </w:t>
+      </w:r>
+      <w:r>
+        <w:rPr>
+          <w:rFonts w:ascii="Arial" w:cs="Arial" w:eastAsia="Arial" w:hAnsi="Arial"/>
+          <w:b/>
+          <w:bCs/>
+          <w:color w:val="1B2118"/>
+          <w:sz w:val="21"/>
+          <w:szCs w:val="21"/>
+        </w:rPr>
+        <w:t xml:space="preserve">Esegui</w:t>
+      </w:r>
+      <w:r>
+        <w:rPr>
+          <w:rFonts w:ascii="Arial" w:cs="Arial" w:eastAsia="Arial" w:hAnsi="Arial"/>
+          <w:color w:val="1B2118"/>
+          <w:sz w:val="21"/>
+          <w:szCs w:val="21"/>
+        </w:rPr>
+        <w:t xml:space="preserve">. Google chiede l'autorizzazione: scegliete l'account, </w:t>
+      </w:r>
+      <w:r>
+        <w:rPr>
+          <w:rFonts w:ascii="Arial" w:cs="Arial" w:eastAsia="Arial" w:hAnsi="Arial"/>
+          <w:i/>
+          <w:iCs/>
+          <w:color w:val="1B2118"/>
+          <w:sz w:val="21"/>
+          <w:szCs w:val="21"/>
+        </w:rPr>
+        <w:t xml:space="preserve">Avanzate</w:t>
+      </w:r>
+      <w:r>
+        <w:rPr>
+          <w:rFonts w:ascii="Arial" w:cs="Arial" w:eastAsia="Arial" w:hAnsi="Arial"/>
+          <w:color w:val="1B2118"/>
+          <w:sz w:val="21"/>
+          <w:szCs w:val="21"/>
+        </w:rPr>
+        <w:t xml:space="preserve"> → </w:t>
+      </w:r>
+      <w:r>
+        <w:rPr>
+          <w:rFonts w:ascii="Arial" w:cs="Arial" w:eastAsia="Arial" w:hAnsi="Arial"/>
+          <w:i/>
+          <w:iCs/>
+          <w:color w:val="1B2118"/>
+          <w:sz w:val="21"/>
+          <w:szCs w:val="21"/>
+        </w:rPr>
+        <w:t xml:space="preserve">Vai a Backup CWP</w:t>
+      </w:r>
+      <w:r>
+        <w:rPr>
+          <w:rFonts w:ascii="Arial" w:cs="Arial" w:eastAsia="Arial" w:hAnsi="Arial"/>
+          <w:color w:val="1B2118"/>
+          <w:sz w:val="21"/>
+          <w:szCs w:val="21"/>
+        </w:rPr>
+        <w:t xml:space="preserve"> → </w:t>
+      </w:r>
+      <w:r>
+        <w:rPr>
+          <w:rFonts w:ascii="Arial" w:cs="Arial" w:eastAsia="Arial" w:hAnsi="Arial"/>
+          <w:b/>
+          <w:bCs/>
+          <w:color w:val="1B2118"/>
+          <w:sz w:val="21"/>
+          <w:szCs w:val="21"/>
+        </w:rPr>
+        <w:t xml:space="preserve">Consenti</w:t>
+      </w:r>
+      <w:r>
+        <w:rPr>
+          <w:rFonts w:ascii="Arial" w:cs="Arial" w:eastAsia="Arial" w:hAnsi="Arial"/>
+          <w:color w:val="1B2118"/>
+          <w:sz w:val="21"/>
+          <w:szCs w:val="21"/>
+        </w:rPr>
+        <w:t xml:space="preserve"> (servono Drive, connessioni esterne ed email).</w:t>
+      </w:r>
+    </w:p>
+    <w:p>
+      <w:pPr>
+        <w:pStyle w:val="ListParagraph"/>
+        <w:numPr>
+          <w:ilvl w:val="0"/>
+          <w:numId w:val="5"/>
+        </w:numPr>
+        <w:spacing w:after="70" w:line="290"/>
+      </w:pPr>
+      <w:r>
+        <w:rPr>
+          <w:rFonts w:ascii="Arial" w:cs="Arial" w:eastAsia="Arial" w:hAnsi="Arial"/>
+          <w:color w:val="1B2118"/>
+          <w:sz w:val="21"/>
+          <w:szCs w:val="21"/>
+        </w:rPr>
+        <w:t xml:space="preserve">Scegliete la funzione </w:t>
+      </w:r>
+      <w:r>
+        <w:rPr>
+          <w:rFonts w:ascii="Arial" w:cs="Arial" w:eastAsia="Arial" w:hAnsi="Arial"/>
+          <w:b/>
+          <w:bCs/>
+          <w:color w:val="1B2118"/>
+          <w:sz w:val="21"/>
+          <w:szCs w:val="21"/>
+        </w:rPr>
+        <w:t xml:space="preserve">provaOra</w:t>
+      </w:r>
+      <w:r>
+        <w:rPr>
+          <w:rFonts w:ascii="Arial" w:cs="Arial" w:eastAsia="Arial" w:hAnsi="Arial"/>
+          <w:color w:val="1B2118"/>
+          <w:sz w:val="21"/>
+          <w:szCs w:val="21"/>
+        </w:rPr>
+        <w:t xml:space="preserve"> e premete </w:t>
+      </w:r>
+      <w:r>
+        <w:rPr>
+          <w:rFonts w:ascii="Arial" w:cs="Arial" w:eastAsia="Arial" w:hAnsi="Arial"/>
+          <w:b/>
+          <w:bCs/>
+          <w:color w:val="1B2118"/>
+          <w:sz w:val="21"/>
+          <w:szCs w:val="21"/>
+        </w:rPr>
+        <w:t xml:space="preserve">Esegui</w:t>
+      </w:r>
+      <w:r>
+        <w:rPr>
+          <w:rFonts w:ascii="Arial" w:cs="Arial" w:eastAsia="Arial" w:hAnsi="Arial"/>
+          <w:color w:val="1B2118"/>
+          <w:sz w:val="21"/>
+          <w:szCs w:val="21"/>
+        </w:rPr>
+        <w:t xml:space="preserve">: dopo uno o due minuti nella cartella Cwp compare il primo «Backup_CWP_…». Aprite </w:t>
+      </w:r>
+      <w:r>
+        <w:rPr>
+          <w:rFonts w:ascii="Consolas" w:cs="Consolas" w:eastAsia="Consolas" w:hAnsi="Consolas"/>
+          <w:color w:val="2F5D3A"/>
+          <w:sz w:val="21"/>
+          <w:szCs w:val="21"/>
+        </w:rPr>
+        <w:t xml:space="preserve">esito.json</w:t>
+      </w:r>
+      <w:r>
+        <w:rPr>
+          <w:rFonts w:ascii="Arial" w:cs="Arial" w:eastAsia="Arial" w:hAnsi="Arial"/>
+          <w:color w:val="1B2118"/>
+          <w:sz w:val="21"/>
+          <w:szCs w:val="21"/>
+        </w:rPr>
+        <w:t xml:space="preserve">: deve dire </w:t>
+      </w:r>
+      <w:r>
+        <w:rPr>
+          <w:rFonts w:ascii="Consolas" w:cs="Consolas" w:eastAsia="Consolas" w:hAnsi="Consolas"/>
+          <w:color w:val="2F5D3A"/>
+          <w:sz w:val="21"/>
+          <w:szCs w:val="21"/>
+        </w:rPr>
+        <w:t xml:space="preserve">"completo": true</w:t>
+      </w:r>
+      <w:r>
+        <w:rPr>
+          <w:rFonts w:ascii="Arial" w:cs="Arial" w:eastAsia="Arial" w:hAnsi="Arial"/>
+          <w:color w:val="1B2118"/>
+          <w:sz w:val="21"/>
+          <w:szCs w:val="21"/>
+        </w:rPr>
+        <w:t xml:space="preserve">.</w:t>
+      </w:r>
+    </w:p>
+    <w:p>
+      <w:pPr>
+        <w:pStyle w:val="ListParagraph"/>
+        <w:numPr>
+          <w:ilvl w:val="0"/>
+          <w:numId w:val="5"/>
+        </w:numPr>
+        <w:spacing w:after="70" w:line="290"/>
+      </w:pPr>
+      <w:r>
+        <w:rPr>
+          <w:rFonts w:ascii="Arial" w:cs="Arial" w:eastAsia="Arial" w:hAnsi="Arial"/>
+          <w:color w:val="1B2118"/>
+          <w:sz w:val="21"/>
+          <w:szCs w:val="21"/>
+        </w:rPr>
+        <w:t xml:space="preserve">In </w:t>
+      </w:r>
+      <w:r>
+        <w:rPr>
+          <w:rFonts w:ascii="Arial" w:cs="Arial" w:eastAsia="Arial" w:hAnsi="Arial"/>
+          <w:b/>
+          <w:bCs/>
+          <w:color w:val="1B2118"/>
+          <w:sz w:val="21"/>
+          <w:szCs w:val="21"/>
+        </w:rPr>
+        <w:t xml:space="preserve">Attivatori</w:t>
+      </w:r>
+      <w:r>
+        <w:rPr>
+          <w:rFonts w:ascii="Arial" w:cs="Arial" w:eastAsia="Arial" w:hAnsi="Arial"/>
+          <w:color w:val="1B2118"/>
+          <w:sz w:val="21"/>
+          <w:szCs w:val="21"/>
+        </w:rPr>
+        <w:t xml:space="preserve"> (sveglia a sinistra) devono comparire due attivatori giornalieri di </w:t>
+      </w:r>
+      <w:r>
+        <w:rPr>
+          <w:rFonts w:ascii="Consolas" w:cs="Consolas" w:eastAsia="Consolas" w:hAnsi="Consolas"/>
+          <w:color w:val="2F5D3A"/>
+          <w:sz w:val="21"/>
+          <w:szCs w:val="21"/>
+        </w:rPr>
+        <w:t xml:space="preserve">eseguiBackup</w:t>
+      </w:r>
+      <w:r>
+        <w:rPr>
+          <w:rFonts w:ascii="Arial" w:cs="Arial" w:eastAsia="Arial" w:hAnsi="Arial"/>
+          <w:color w:val="1B2118"/>
+          <w:sz w:val="21"/>
+          <w:szCs w:val="21"/>
+        </w:rPr>
+        <w:t xml:space="preserve">, alle 13 e alle 21.</w:t>
+      </w:r>
+    </w:p>
+    <w:p>
+      <w:pPr>
+        <w:spacing w:after="60"/>
+      </w:pPr>
+    </w:p>
+    <w:p>
+      <w:pPr>
+        <w:spacing w:after="140" w:line="300"/>
+      </w:pPr>
+      <w:r>
+        <w:rPr>
+          <w:rFonts w:ascii="Arial" w:cs="Arial" w:eastAsia="Arial" w:hAnsi="Arial"/>
+          <w:color w:val="1B2118"/>
+          <w:sz w:val="21"/>
+          <w:szCs w:val="21"/>
+        </w:rPr>
+        <w:t xml:space="preserve">Se la chiave service_role di Supabase cambia, aggiornate la proprietà dello script. Per fermare i backup cancellate i due attivatori.</w:t>
+      </w:r>
+    </w:p>
+    <w:p>
+      <w:pPr>
+        <w:pStyle w:val="Heading2"/>
+        <w:keepNext/>
+        <w:spacing w:after="120" w:before="240"/>
+      </w:pPr>
+      <w:r>
+        <w:rPr>
+          <w:rFonts w:ascii="Arial" w:cs="Arial" w:eastAsia="Arial" w:hAnsi="Arial"/>
+          <w:b/>
+          <w:bCs/>
+          <w:color w:val="2F5D3A"/>
+          <w:sz w:val="25"/>
+          <w:szCs w:val="25"/>
+        </w:rPr>
+        <w:t xml:space="preserve">Ripristino da un backup automatico</w:t>
+      </w:r>
+    </w:p>
+    <w:p>
+      <w:pPr>
+        <w:spacing w:after="140" w:line="300"/>
+      </w:pPr>
+      <w:r>
+        <w:rPr>
+          <w:rFonts w:ascii="Arial" w:cs="Arial" w:eastAsia="Arial" w:hAnsi="Arial"/>
+          <w:color w:val="1B2118"/>
+          <w:sz w:val="21"/>
+          <w:szCs w:val="21"/>
+        </w:rPr>
+        <w:t xml:space="preserve">Si usa quando dati o progetto Supabase sono persi. Serve un computer con Node 18+ e, per i dati grandi, </w:t>
+      </w:r>
+      <w:r>
+        <w:rPr>
+          <w:rFonts w:ascii="Consolas" w:cs="Consolas" w:eastAsia="Consolas" w:hAnsi="Consolas"/>
+          <w:color w:val="2F5D3A"/>
+          <w:sz w:val="21"/>
+          <w:szCs w:val="21"/>
+        </w:rPr>
+        <w:t xml:space="preserve">psql</w:t>
+      </w:r>
+      <w:r>
+        <w:rPr>
+          <w:rFonts w:ascii="Arial" w:cs="Arial" w:eastAsia="Arial" w:hAnsi="Arial"/>
+          <w:color w:val="1B2118"/>
+          <w:sz w:val="21"/>
+          <w:szCs w:val="21"/>
+        </w:rPr>
+        <w:t xml:space="preserve"> (lo sviluppatore).</w:t>
+      </w:r>
+    </w:p>
+    <w:p>
+      <w:pPr>
+        <w:pStyle w:val="ListParagraph"/>
+        <w:numPr>
+          <w:ilvl w:val="0"/>
+          <w:numId w:val="6"/>
+        </w:numPr>
+        <w:spacing w:after="70" w:line="290"/>
+      </w:pPr>
+      <w:r>
+        <w:rPr>
+          <w:rFonts w:ascii="Arial" w:cs="Arial" w:eastAsia="Arial" w:hAnsi="Arial"/>
+          <w:b/>
+          <w:bCs/>
+          <w:color w:val="1B2118"/>
+          <w:sz w:val="21"/>
+          <w:szCs w:val="21"/>
+        </w:rPr>
+        <w:t xml:space="preserve">Scegliete il backup</w:t>
+      </w:r>
+      <w:r>
+        <w:rPr>
+          <w:rFonts w:ascii="Arial" w:cs="Arial" w:eastAsia="Arial" w:hAnsi="Arial"/>
+          <w:color w:val="1B2118"/>
+          <w:sz w:val="21"/>
+          <w:szCs w:val="21"/>
+        </w:rPr>
+        <w:t xml:space="preserve">: l'ultima cartella con </w:t>
+      </w:r>
+      <w:r>
+        <w:rPr>
+          <w:rFonts w:ascii="Consolas" w:cs="Consolas" w:eastAsia="Consolas" w:hAnsi="Consolas"/>
+          <w:color w:val="2F5D3A"/>
+          <w:sz w:val="21"/>
+          <w:szCs w:val="21"/>
+        </w:rPr>
+        <w:t xml:space="preserve">esito.json</w:t>
+      </w:r>
+      <w:r>
+        <w:rPr>
+          <w:rFonts w:ascii="Arial" w:cs="Arial" w:eastAsia="Arial" w:hAnsi="Arial"/>
+          <w:color w:val="1B2118"/>
+          <w:sz w:val="21"/>
+          <w:szCs w:val="21"/>
+        </w:rPr>
+        <w:t xml:space="preserve"> → </w:t>
+      </w:r>
+      <w:r>
+        <w:rPr>
+          <w:rFonts w:ascii="Consolas" w:cs="Consolas" w:eastAsia="Consolas" w:hAnsi="Consolas"/>
+          <w:color w:val="2F5D3A"/>
+          <w:sz w:val="21"/>
+          <w:szCs w:val="21"/>
+        </w:rPr>
+        <w:t xml:space="preserve">"completo": true</w:t>
+      </w:r>
+      <w:r>
+        <w:rPr>
+          <w:rFonts w:ascii="Arial" w:cs="Arial" w:eastAsia="Arial" w:hAnsi="Arial"/>
+          <w:color w:val="1B2118"/>
+          <w:sz w:val="21"/>
+          <w:szCs w:val="21"/>
+        </w:rPr>
+        <w:t xml:space="preserve">. Scaricatela dal Drive (tasto destro → </w:t>
+      </w:r>
+      <w:r>
+        <w:rPr>
+          <w:rFonts w:ascii="Arial" w:cs="Arial" w:eastAsia="Arial" w:hAnsi="Arial"/>
+          <w:i/>
+          <w:iCs/>
+          <w:color w:val="1B2118"/>
+          <w:sz w:val="21"/>
+          <w:szCs w:val="21"/>
+        </w:rPr>
+        <w:t xml:space="preserve">Scarica</w:t>
+      </w:r>
+      <w:r>
+        <w:rPr>
+          <w:rFonts w:ascii="Arial" w:cs="Arial" w:eastAsia="Arial" w:hAnsi="Arial"/>
+          <w:color w:val="1B2118"/>
+          <w:sz w:val="21"/>
+          <w:szCs w:val="21"/>
+        </w:rPr>
+        <w:t xml:space="preserve">) e scompattate lo ZIP di </w:t>
+      </w:r>
+      <w:r>
+        <w:rPr>
+          <w:rFonts w:ascii="Consolas" w:cs="Consolas" w:eastAsia="Consolas" w:hAnsi="Consolas"/>
+          <w:color w:val="2F5D3A"/>
+          <w:sz w:val="21"/>
+          <w:szCs w:val="21"/>
+        </w:rPr>
+        <w:t xml:space="preserve">1_codice</w:t>
+      </w:r>
+      <w:r>
+        <w:rPr>
+          <w:rFonts w:ascii="Arial" w:cs="Arial" w:eastAsia="Arial" w:hAnsi="Arial"/>
+          <w:color w:val="1B2118"/>
+          <w:sz w:val="21"/>
+          <w:szCs w:val="21"/>
+        </w:rPr>
+        <w:t xml:space="preserve">.</w:t>
+      </w:r>
+    </w:p>
+    <w:p>
+      <w:pPr>
+        <w:pStyle w:val="ListParagraph"/>
+        <w:numPr>
+          <w:ilvl w:val="0"/>
+          <w:numId w:val="6"/>
+        </w:numPr>
+        <w:spacing w:after="70" w:line="290"/>
+      </w:pPr>
+      <w:r>
+        <w:rPr>
+          <w:rFonts w:ascii="Arial" w:cs="Arial" w:eastAsia="Arial" w:hAnsi="Arial"/>
+          <w:b/>
+          <w:bCs/>
+          <w:color w:val="1B2118"/>
+          <w:sz w:val="21"/>
+          <w:szCs w:val="21"/>
+        </w:rPr>
+        <w:t xml:space="preserve">Nuovo progetto Supabase</w:t>
+      </w:r>
+      <w:r>
+        <w:rPr>
+          <w:rFonts w:ascii="Arial" w:cs="Arial" w:eastAsia="Arial" w:hAnsi="Arial"/>
+          <w:color w:val="1B2118"/>
+          <w:sz w:val="21"/>
+          <w:szCs w:val="21"/>
+        </w:rPr>
+        <w:t xml:space="preserve"> ed esecuzione degli script 01-35, come nel capitolo «Supabase: ricostruzione da zero», passi 1 e 2.</w:t>
+      </w:r>
+    </w:p>
+    <w:p>
+      <w:pPr>
+        <w:pStyle w:val="ListParagraph"/>
+        <w:numPr>
+          <w:ilvl w:val="0"/>
+          <w:numId w:val="6"/>
+        </w:numPr>
+        <w:spacing w:after="70" w:line="290"/>
+      </w:pPr>
+      <w:r>
+        <w:rPr>
+          <w:rFonts w:ascii="Arial" w:cs="Arial" w:eastAsia="Arial" w:hAnsi="Arial"/>
+          <w:b/>
+          <w:bCs/>
+          <w:color w:val="1B2118"/>
+          <w:sz w:val="21"/>
+          <w:szCs w:val="21"/>
+        </w:rPr>
+        <w:t xml:space="preserve">Dati</w:t>
+      </w:r>
+      <w:r>
+        <w:rPr>
+          <w:rFonts w:ascii="Arial" w:cs="Arial" w:eastAsia="Arial" w:hAnsi="Arial"/>
+          <w:color w:val="1B2118"/>
+          <w:sz w:val="21"/>
+          <w:szCs w:val="21"/>
+        </w:rPr>
+        <w:t xml:space="preserve">: dalla cartella del codice scompattato eseguite </w:t>
+      </w:r>
+      <w:r>
+        <w:rPr>
+          <w:rFonts w:ascii="Consolas" w:cs="Consolas" w:eastAsia="Consolas" w:hAnsi="Consolas"/>
+          <w:color w:val="2F5D3A"/>
+          <w:sz w:val="21"/>
+          <w:szCs w:val="21"/>
+        </w:rPr>
+        <w:t xml:space="preserve">node strumenti/backup/genera_sql_ripristino.mjs &lt;cartella 2_database&gt; ripristino_dati.sql</w:t>
+      </w:r>
+      <w:r>
+        <w:rPr>
+          <w:rFonts w:ascii="Arial" w:cs="Arial" w:eastAsia="Arial" w:hAnsi="Arial"/>
+          <w:color w:val="1B2118"/>
+          <w:sz w:val="21"/>
+          <w:szCs w:val="21"/>
+        </w:rPr>
+        <w:t xml:space="preserve">, poi </w:t>
+      </w:r>
+      <w:r>
+        <w:rPr>
+          <w:rFonts w:ascii="Consolas" w:cs="Consolas" w:eastAsia="Consolas" w:hAnsi="Consolas"/>
+          <w:color w:val="2F5D3A"/>
+          <w:sz w:val="21"/>
+          <w:szCs w:val="21"/>
+        </w:rPr>
+        <w:t xml:space="preserve">psql "&lt;stringa di connessione del nuovo progetto&gt;" -f ripristino_dati.sql</w:t>
+      </w:r>
+      <w:r>
+        <w:rPr>
+          <w:rFonts w:ascii="Arial" w:cs="Arial" w:eastAsia="Arial" w:hAnsi="Arial"/>
+          <w:color w:val="1B2118"/>
+          <w:sz w:val="21"/>
+          <w:szCs w:val="21"/>
+        </w:rPr>
+        <w:t xml:space="preserve">. Se il file è piccolo si può incollare nel SQL Editor.</w:t>
+      </w:r>
+    </w:p>
+    <w:p>
+      <w:pPr>
+        <w:spacing w:after="60"/>
+      </w:pPr>
+    </w:p>
+    <w:p>
+      <w:pPr>
+        <w:spacing w:after="140" w:line="300"/>
+      </w:pPr>
+      <w:r>
+        <w:rPr>
+          <w:rFonts w:ascii="Arial" w:cs="Arial" w:eastAsia="Arial" w:hAnsi="Arial"/>
+          <w:color w:val="1B2118"/>
+          <w:sz w:val="21"/>
+          <w:szCs w:val="21"/>
+        </w:rPr>
+        <w:t xml:space="preserve">- Il file rimette utenti, pratiche, documenti, calcoli, audit e impostazioni </w:t>
+      </w:r>
+      <w:r>
+        <w:rPr>
+          <w:rFonts w:ascii="Arial" w:cs="Arial" w:eastAsia="Arial" w:hAnsi="Arial"/>
+          <w:b/>
+          <w:bCs/>
+          <w:color w:val="1B2118"/>
+          <w:sz w:val="21"/>
+          <w:szCs w:val="21"/>
+        </w:rPr>
+        <w:t xml:space="preserve">identici</w:t>
+      </w:r>
+      <w:r>
+        <w:rPr>
+          <w:rFonts w:ascii="Arial" w:cs="Arial" w:eastAsia="Arial" w:hAnsi="Arial"/>
+          <w:color w:val="1B2118"/>
+          <w:sz w:val="21"/>
+          <w:szCs w:val="21"/>
+        </w:rPr>
+        <w:t xml:space="preserve">, con gli stessi codici, senza far partire notifiche o voci di audit nuove. - Si ferma da solo se il database contiene già delle pratiche, così non si sovrascrive per errore il portale in uso. - In fondo mostra, tabella per tabella, le righe nel backup e quelle ripristinate. Un «RIGA NON RIPRISTINATA» indica un dato vecchio che non rispetta un controllo attuale: va valutato a parte.</w:t>
+      </w:r>
+    </w:p>
+    <w:p>
+      <w:pPr>
+        <w:pStyle w:val="ListParagraph"/>
+        <w:numPr>
+          <w:ilvl w:val="0"/>
+          <w:numId w:val="7"/>
+        </w:numPr>
+        <w:spacing w:after="70" w:line="290"/>
+      </w:pPr>
+      <w:r>
+        <w:rPr>
+          <w:rFonts w:ascii="Arial" w:cs="Arial" w:eastAsia="Arial" w:hAnsi="Arial"/>
+          <w:b/>
+          <w:bCs/>
+          <w:color w:val="1B2118"/>
+          <w:sz w:val="21"/>
+          <w:szCs w:val="21"/>
+        </w:rPr>
+        <w:t xml:space="preserve">File</w:t>
+      </w:r>
+      <w:r>
+        <w:rPr>
+          <w:rFonts w:ascii="Arial" w:cs="Arial" w:eastAsia="Arial" w:hAnsi="Arial"/>
+          <w:color w:val="1B2118"/>
+          <w:sz w:val="21"/>
+          <w:szCs w:val="21"/>
+        </w:rPr>
+        <w:t xml:space="preserve">: </w:t>
+      </w:r>
+      <w:r>
+        <w:rPr>
+          <w:rFonts w:ascii="Consolas" w:cs="Consolas" w:eastAsia="Consolas" w:hAnsi="Consolas"/>
+          <w:color w:val="2F5D3A"/>
+          <w:sz w:val="21"/>
+          <w:szCs w:val="21"/>
+        </w:rPr>
+        <w:t xml:space="preserve">SUPABASE_URL=… SUPABASE_SERVICE_ROLE_KEY=… node strumenti/backup/carica_file_ripristino.mjs &lt;cartella 3_file&gt;</w:t>
+      </w:r>
+      <w:r>
+        <w:rPr>
+          <w:rFonts w:ascii="Arial" w:cs="Arial" w:eastAsia="Arial" w:hAnsi="Arial"/>
+          <w:color w:val="1B2118"/>
+          <w:sz w:val="21"/>
+          <w:szCs w:val="21"/>
+        </w:rPr>
+        <w:t xml:space="preserve">. La chiave è quella del nuovo progetto e la inserisce chi esegue il ripristino.</w:t>
+      </w:r>
+    </w:p>
+    <w:p>
+      <w:pPr>
+        <w:pStyle w:val="ListParagraph"/>
+        <w:numPr>
+          <w:ilvl w:val="0"/>
+          <w:numId w:val="7"/>
+        </w:numPr>
+        <w:spacing w:after="70" w:line="290"/>
+      </w:pPr>
+      <w:r>
+        <w:rPr>
+          <w:rFonts w:ascii="Arial" w:cs="Arial" w:eastAsia="Arial" w:hAnsi="Arial"/>
+          <w:b/>
+          <w:bCs/>
+          <w:color w:val="1B2118"/>
+          <w:sz w:val="21"/>
+          <w:szCs w:val="21"/>
+        </w:rPr>
+        <w:t xml:space="preserve">Funzioni del server e segreti</w:t>
+      </w:r>
+      <w:r>
+        <w:rPr>
+          <w:rFonts w:ascii="Arial" w:cs="Arial" w:eastAsia="Arial" w:hAnsi="Arial"/>
+          <w:color w:val="1B2118"/>
+          <w:sz w:val="21"/>
+          <w:szCs w:val="21"/>
+        </w:rPr>
+        <w:t xml:space="preserve">: dalla cartella </w:t>
+      </w:r>
+      <w:r>
+        <w:rPr>
+          <w:rFonts w:ascii="Consolas" w:cs="Consolas" w:eastAsia="Consolas" w:hAnsi="Consolas"/>
+          <w:color w:val="2F5D3A"/>
+          <w:sz w:val="21"/>
+          <w:szCs w:val="21"/>
+        </w:rPr>
+        <w:t xml:space="preserve">supabase/functions</w:t>
+      </w:r>
+      <w:r>
+        <w:rPr>
+          <w:rFonts w:ascii="Arial" w:cs="Arial" w:eastAsia="Arial" w:hAnsi="Arial"/>
+          <w:color w:val="1B2118"/>
+          <w:sz w:val="21"/>
+          <w:szCs w:val="21"/>
+        </w:rPr>
+        <w:t xml:space="preserve"> del codice, con i segreti elencati in </w:t>
+      </w:r>
+      <w:r>
+        <w:rPr>
+          <w:rFonts w:ascii="Consolas" w:cs="Consolas" w:eastAsia="Consolas" w:hAnsi="Consolas"/>
+          <w:color w:val="2F5D3A"/>
+          <w:sz w:val="21"/>
+          <w:szCs w:val="21"/>
+        </w:rPr>
+        <w:t xml:space="preserve">4_servizi/configurazione_servizi.json</w:t>
+      </w:r>
+      <w:r>
+        <w:rPr>
+          <w:rFonts w:ascii="Arial" w:cs="Arial" w:eastAsia="Arial" w:hAnsi="Arial"/>
+          <w:color w:val="1B2118"/>
+          <w:sz w:val="21"/>
+          <w:szCs w:val="21"/>
+        </w:rPr>
+        <w:t xml:space="preserve"> (capitolo «Chiavi delle funzioni»).</w:t>
+      </w:r>
+    </w:p>
+    <w:p>
+      <w:pPr>
+        <w:pStyle w:val="ListParagraph"/>
+        <w:numPr>
+          <w:ilvl w:val="0"/>
+          <w:numId w:val="7"/>
+        </w:numPr>
+        <w:spacing w:after="70" w:line="290"/>
+      </w:pPr>
+      <w:r>
+        <w:rPr>
+          <w:rFonts w:ascii="Arial" w:cs="Arial" w:eastAsia="Arial" w:hAnsi="Arial"/>
+          <w:b/>
+          <w:bCs/>
+          <w:color w:val="1B2118"/>
+          <w:sz w:val="21"/>
+          <w:szCs w:val="21"/>
+        </w:rPr>
+        <w:t xml:space="preserve">Autenticazione</w:t>
+      </w:r>
+      <w:r>
+        <w:rPr>
+          <w:rFonts w:ascii="Arial" w:cs="Arial" w:eastAsia="Arial" w:hAnsi="Arial"/>
+          <w:color w:val="1B2118"/>
+          <w:sz w:val="21"/>
+          <w:szCs w:val="21"/>
+        </w:rPr>
+        <w:t xml:space="preserve">, </w:t>
+      </w:r>
+      <w:r>
+        <w:rPr>
+          <w:rFonts w:ascii="Arial" w:cs="Arial" w:eastAsia="Arial" w:hAnsi="Arial"/>
+          <w:b/>
+          <w:bCs/>
+          <w:color w:val="1B2118"/>
+          <w:sz w:val="21"/>
+          <w:szCs w:val="21"/>
+        </w:rPr>
+        <w:t xml:space="preserve">Vercel</w:t>
+      </w:r>
+      <w:r>
+        <w:rPr>
+          <w:rFonts w:ascii="Arial" w:cs="Arial" w:eastAsia="Arial" w:hAnsi="Arial"/>
+          <w:color w:val="1B2118"/>
+          <w:sz w:val="21"/>
+          <w:szCs w:val="21"/>
+        </w:rPr>
+        <w:t xml:space="preserve"> e </w:t>
+      </w:r>
+      <w:r>
+        <w:rPr>
+          <w:rFonts w:ascii="Arial" w:cs="Arial" w:eastAsia="Arial" w:hAnsi="Arial"/>
+          <w:b/>
+          <w:bCs/>
+          <w:color w:val="1B2118"/>
+          <w:sz w:val="21"/>
+          <w:szCs w:val="21"/>
+        </w:rPr>
+        <w:t xml:space="preserve">Resend</w:t>
+      </w:r>
+      <w:r>
+        <w:rPr>
+          <w:rFonts w:ascii="Arial" w:cs="Arial" w:eastAsia="Arial" w:hAnsi="Arial"/>
+          <w:color w:val="1B2118"/>
+          <w:sz w:val="21"/>
+          <w:szCs w:val="21"/>
+        </w:rPr>
+        <w:t xml:space="preserve">: come nei capitoli di questo documento, con i valori di </w:t>
+      </w:r>
+      <w:r>
+        <w:rPr>
+          <w:rFonts w:ascii="Consolas" w:cs="Consolas" w:eastAsia="Consolas" w:hAnsi="Consolas"/>
+          <w:color w:val="2F5D3A"/>
+          <w:sz w:val="21"/>
+          <w:szCs w:val="21"/>
+        </w:rPr>
+        <w:t xml:space="preserve">4_servizi</w:t>
+      </w:r>
+      <w:r>
+        <w:rPr>
+          <w:rFonts w:ascii="Arial" w:cs="Arial" w:eastAsia="Arial" w:hAnsi="Arial"/>
+          <w:color w:val="1B2118"/>
+          <w:sz w:val="21"/>
+          <w:szCs w:val="21"/>
+        </w:rPr>
+        <w:t xml:space="preserve">.</w:t>
+      </w:r>
+    </w:p>
+    <w:p>
+      <w:pPr>
+        <w:pStyle w:val="ListParagraph"/>
+        <w:numPr>
+          <w:ilvl w:val="0"/>
+          <w:numId w:val="7"/>
+        </w:numPr>
+        <w:spacing w:after="70" w:line="290"/>
+      </w:pPr>
+      <w:r>
+        <w:rPr>
+          <w:rFonts w:ascii="Arial" w:cs="Arial" w:eastAsia="Arial" w:hAnsi="Arial"/>
+          <w:b/>
+          <w:bCs/>
+          <w:color w:val="1B2118"/>
+          <w:sz w:val="21"/>
+          <w:szCs w:val="21"/>
+        </w:rPr>
+        <w:t xml:space="preserve">Utenti</w:t>
+      </w:r>
+      <w:r>
+        <w:rPr>
+          <w:rFonts w:ascii="Arial" w:cs="Arial" w:eastAsia="Arial" w:hAnsi="Arial"/>
+          <w:color w:val="1B2118"/>
+          <w:sz w:val="21"/>
+          <w:szCs w:val="21"/>
+        </w:rPr>
+        <w:t xml:space="preserve">: tornano con lo stesso id, la stessa email e lo stesso ruolo, ma senza password. Ognuno, al primo accesso, usa «Password dimenticata?». In alternativa l'Amministratore usa «Reimposta password».</w:t>
+      </w:r>
+    </w:p>
+    <w:p>
+      <w:pPr>
+        <w:pStyle w:val="ListParagraph"/>
+        <w:numPr>
+          <w:ilvl w:val="0"/>
+          <w:numId w:val="7"/>
+        </w:numPr>
+        <w:spacing w:after="70" w:line="290"/>
+      </w:pPr>
+      <w:r>
+        <w:rPr>
+          <w:rFonts w:ascii="Arial" w:cs="Arial" w:eastAsia="Arial" w:hAnsi="Arial"/>
+          <w:b/>
+          <w:bCs/>
+          <w:color w:val="1B2118"/>
+          <w:sz w:val="21"/>
+          <w:szCs w:val="21"/>
+        </w:rPr>
+        <w:t xml:space="preserve">Verifica</w:t>
+      </w:r>
+      <w:r>
+        <w:rPr>
+          <w:rFonts w:ascii="Arial" w:cs="Arial" w:eastAsia="Arial" w:hAnsi="Arial"/>
+          <w:color w:val="1B2118"/>
+          <w:sz w:val="21"/>
+          <w:szCs w:val="21"/>
+        </w:rPr>
+        <w:t xml:space="preserve">: accesso dell'Amministratore principale, una pratica con i documenti, l'Audit, il calcolo dei crediti, una notifica.</w:t>
+      </w:r>
+    </w:p>
+    <w:p>
+      <w:pPr>
+        <w:spacing w:after="60"/>
+      </w:pPr>
+    </w:p>
+    <w:p>
+      <w:pPr>
+        <w:spacing w:after="140" w:line="300"/>
+      </w:pPr>
+      <w:r>
+        <w:rPr>
+          <w:rFonts w:ascii="Arial" w:cs="Arial" w:eastAsia="Arial" w:hAnsi="Arial"/>
+          <w:color w:val="1B2118"/>
+          <w:sz w:val="21"/>
+          <w:szCs w:val="21"/>
+        </w:rPr>
+        <w:t xml:space="preserve">La procedura dei dati è stata provata il 21/10/2026 sul banco locale. Su un database ricostruito con gli script 01-35 sono state ripristinate 35 tabelle e 3 utenti, con dati identici al JSON. La prova si è fermata da sola alla seconda esecuzione; un dato vecchio non valido è stato segnalato e i contatori sono stati riallineati. Da ripetere ogni tre mesi su un progetto Supabase di prova (tabella «Copie di sicurezza»).</w:t>
+      </w:r>
+    </w:p>
+    <w:p>
+      <w:pPr>
+        <w:pStyle w:val="Heading1"/>
+        <w:pageBreakBefore/>
+        <w:pBdr>
+          <w:bottom w:val="single" w:color="2F5D3A" w:sz="12" w:space="6"/>
+        </w:pBdr>
+        <w:spacing w:after="240" w:before="0"/>
+      </w:pPr>
+      <w:bookmarkStart w:name="cap5" w:id="1"/>
+      <w:r>
+        <w:rPr>
+          <w:rFonts w:ascii="Arial" w:cs="Arial" w:eastAsia="Arial" w:hAnsi="Arial"/>
+          <w:b/>
+          <w:bCs/>
+          <w:color w:val="2F5D3A"/>
+          <w:sz w:val="34"/>
+          <w:szCs w:val="34"/>
+        </w:rPr>
+        <w:t xml:space="preserve">5. GitHub e Vercel: tornare alla versione precedente</w:t>
+      </w:r>
+      <w:bookmarkEnd w:id="1"/>
+    </w:p>
+    <w:p>
+      <w:pPr>
+        <w:spacing w:after="140" w:line="300"/>
+      </w:pPr>
+      <w:r>
+        <w:rPr>
+          <w:rFonts w:ascii="Arial" w:cs="Arial" w:eastAsia="Arial" w:hAnsi="Arial"/>
+          <w:color w:val="1B2118"/>
+          <w:sz w:val="21"/>
+          <w:szCs w:val="21"/>
+        </w:rPr>
+        <w:t xml:space="preserve">Se un rilascio ha introdotto un errore, il modo più rapido è </w:t>
+      </w:r>
+      <w:r>
+        <w:rPr>
+          <w:rFonts w:ascii="Arial" w:cs="Arial" w:eastAsia="Arial" w:hAnsi="Arial"/>
+          <w:b/>
+          <w:bCs/>
+          <w:color w:val="1B2118"/>
+          <w:sz w:val="21"/>
+          <w:szCs w:val="21"/>
+        </w:rPr>
+        <w:t xml:space="preserve">ripubblicare la versione precedente</w:t>
+      </w:r>
+      <w:r>
+        <w:rPr>
+          <w:rFonts w:ascii="Arial" w:cs="Arial" w:eastAsia="Arial" w:hAnsi="Arial"/>
+          <w:color w:val="1B2118"/>
+          <w:sz w:val="21"/>
+          <w:szCs w:val="21"/>
+        </w:rPr>
+        <w:t xml:space="preserve">:</w:t>
+      </w:r>
+    </w:p>
+    <w:p>
+      <w:pPr>
+        <w:pStyle w:val="ListParagraph"/>
+        <w:numPr>
+          <w:ilvl w:val="0"/>
+          <w:numId w:val="8"/>
+        </w:numPr>
+        <w:spacing w:after="70" w:line="290"/>
+      </w:pPr>
+      <w:r>
+        <w:rPr>
+          <w:rFonts w:ascii="Arial" w:cs="Arial" w:eastAsia="Arial" w:hAnsi="Arial"/>
+          <w:color w:val="1B2118"/>
+          <w:sz w:val="21"/>
+          <w:szCs w:val="21"/>
+        </w:rPr>
+        <w:t xml:space="preserve">Su vercel.com aprite il progetto </w:t>
+      </w:r>
+      <w:r>
+        <w:rPr>
+          <w:rFonts w:ascii="Arial" w:cs="Arial" w:eastAsia="Arial" w:hAnsi="Arial"/>
+          <w:b/>
+          <w:bCs/>
+          <w:color w:val="1B2118"/>
+          <w:sz w:val="21"/>
+          <w:szCs w:val="21"/>
+        </w:rPr>
+        <w:t xml:space="preserve">portale-cwp</w:t>
+      </w:r>
+      <w:r>
+        <w:rPr>
+          <w:rFonts w:ascii="Arial" w:cs="Arial" w:eastAsia="Arial" w:hAnsi="Arial"/>
+          <w:color w:val="1B2118"/>
+          <w:sz w:val="21"/>
+          <w:szCs w:val="21"/>
+        </w:rPr>
+        <w:t xml:space="preserve">, scheda </w:t>
+      </w:r>
+      <w:r>
+        <w:rPr>
+          <w:rFonts w:ascii="Arial" w:cs="Arial" w:eastAsia="Arial" w:hAnsi="Arial"/>
+          <w:i/>
+          <w:iCs/>
+          <w:color w:val="1B2118"/>
+          <w:sz w:val="21"/>
+          <w:szCs w:val="21"/>
+        </w:rPr>
+        <w:t xml:space="preserve">Deployments</w:t>
+      </w:r>
+      <w:r>
+        <w:rPr>
+          <w:rFonts w:ascii="Arial" w:cs="Arial" w:eastAsia="Arial" w:hAnsi="Arial"/>
+          <w:color w:val="1B2118"/>
+          <w:sz w:val="21"/>
+          <w:szCs w:val="21"/>
+        </w:rPr>
+        <w:t xml:space="preserve">.</w:t>
+      </w:r>
+    </w:p>
+    <w:p>
+      <w:pPr>
+        <w:pStyle w:val="ListParagraph"/>
+        <w:numPr>
+          <w:ilvl w:val="0"/>
+          <w:numId w:val="8"/>
+        </w:numPr>
+        <w:spacing w:after="70" w:line="290"/>
+      </w:pPr>
+      <w:r>
+        <w:rPr>
+          <w:rFonts w:ascii="Arial" w:cs="Arial" w:eastAsia="Arial" w:hAnsi="Arial"/>
+          <w:color w:val="1B2118"/>
+          <w:sz w:val="21"/>
+          <w:szCs w:val="21"/>
+        </w:rPr>
+        <w:t xml:space="preserve">Trovate l'ultimo rilascio che funzionava (data e messaggio della modifica).</w:t>
+      </w:r>
+    </w:p>
+    <w:p>
+      <w:pPr>
+        <w:pStyle w:val="ListParagraph"/>
+        <w:numPr>
+          <w:ilvl w:val="0"/>
+          <w:numId w:val="8"/>
+        </w:numPr>
+        <w:spacing w:after="70" w:line="290"/>
+      </w:pPr>
+      <w:r>
+        <w:rPr>
+          <w:rFonts w:ascii="Arial" w:cs="Arial" w:eastAsia="Arial" w:hAnsi="Arial"/>
           <w:color w:val="1B2118"/>
           <w:sz w:val="21"/>
           <w:szCs w:val="21"/>
@@ -5889,7 +8303,7 @@
         </w:pBdr>
         <w:spacing w:after="240" w:before="0"/>
       </w:pPr>
-      <w:bookmarkStart w:name="cap5" w:id="1"/>
+      <w:bookmarkStart w:name="cap6" w:id="1"/>
       <w:r>
         <w:rPr>
           <w:rFonts w:ascii="Arial" w:cs="Arial" w:eastAsia="Arial" w:hAnsi="Arial"/>
@@ -5899,7 +8313,7 @@
           <w:sz w:val="34"/>
           <w:szCs w:val="34"/>
         </w:rPr>
-        <w:t xml:space="preserve">5. Ripristino di GitHub</w:t>
+        <w:t xml:space="preserve">6. Ripristino di GitHub</w:t>
       </w:r>
       <w:bookmarkEnd w:id="1"/>
     </w:p>
@@ -5940,7 +8354,7 @@
         <w:pStyle w:val="ListParagraph"/>
         <w:numPr>
           <w:ilvl w:val="0"/>
-          <w:numId w:val="5"/>
+          <w:numId w:val="9"/>
         </w:numPr>
         <w:spacing w:after="70" w:line="290"/>
       </w:pPr>
@@ -6039,7 +8453,7 @@
         <w:pStyle w:val="ListParagraph"/>
         <w:numPr>
           <w:ilvl w:val="0"/>
-          <w:numId w:val="5"/>
+          <w:numId w:val="9"/>
         </w:numPr>
         <w:spacing w:after="70" w:line="290"/>
       </w:pPr>
@@ -6118,7 +8532,7 @@
         <w:pStyle w:val="ListParagraph"/>
         <w:numPr>
           <w:ilvl w:val="0"/>
-          <w:numId w:val="5"/>
+          <w:numId w:val="9"/>
         </w:numPr>
         <w:spacing w:after="70" w:line="290"/>
       </w:pPr>
@@ -6306,7 +8720,7 @@
         <w:pStyle w:val="ListParagraph"/>
         <w:numPr>
           <w:ilvl w:val="0"/>
-          <w:numId w:val="6"/>
+          <w:numId w:val="10"/>
         </w:numPr>
         <w:spacing w:after="70" w:line="290"/>
       </w:pPr>
@@ -6363,7 +8777,7 @@
         <w:pStyle w:val="ListParagraph"/>
         <w:numPr>
           <w:ilvl w:val="0"/>
-          <w:numId w:val="6"/>
+          <w:numId w:val="10"/>
         </w:numPr>
         <w:spacing w:after="70" w:line="290"/>
       </w:pPr>
@@ -6560,7 +8974,7 @@
         </w:pBdr>
         <w:spacing w:after="240" w:before="0"/>
       </w:pPr>
-      <w:bookmarkStart w:name="cap6" w:id="1"/>
+      <w:bookmarkStart w:name="cap7" w:id="1"/>
       <w:r>
         <w:rPr>
           <w:rFonts w:ascii="Arial" w:cs="Arial" w:eastAsia="Arial" w:hAnsi="Arial"/>
@@ -6570,7 +8984,7 @@
           <w:sz w:val="34"/>
           <w:szCs w:val="34"/>
         </w:rPr>
-        <w:t xml:space="preserve">6. Ripristino di Vercel</w:t>
+        <w:t xml:space="preserve">7. Ripristino di Vercel</w:t>
       </w:r>
       <w:bookmarkEnd w:id="1"/>
     </w:p>
@@ -6593,7 +9007,7 @@
         <w:pStyle w:val="ListParagraph"/>
         <w:numPr>
           <w:ilvl w:val="0"/>
-          <w:numId w:val="7"/>
+          <w:numId w:val="11"/>
         </w:numPr>
         <w:spacing w:after="70" w:line="290"/>
       </w:pPr>
@@ -6672,7 +9086,7 @@
         <w:pStyle w:val="ListParagraph"/>
         <w:numPr>
           <w:ilvl w:val="0"/>
-          <w:numId w:val="7"/>
+          <w:numId w:val="11"/>
         </w:numPr>
         <w:spacing w:after="70" w:line="290"/>
       </w:pPr>
@@ -6765,7 +9179,7 @@
         <w:pStyle w:val="ListParagraph"/>
         <w:numPr>
           <w:ilvl w:val="0"/>
-          <w:numId w:val="7"/>
+          <w:numId w:val="11"/>
         </w:numPr>
         <w:spacing w:after="70" w:line="290"/>
       </w:pPr>
@@ -6871,7 +9285,7 @@
         <w:pStyle w:val="ListParagraph"/>
         <w:numPr>
           <w:ilvl w:val="0"/>
-          <w:numId w:val="7"/>
+          <w:numId w:val="11"/>
         </w:numPr>
         <w:spacing w:after="70" w:line="290"/>
       </w:pPr>
@@ -6901,7 +9315,7 @@
         <w:pStyle w:val="ListParagraph"/>
         <w:numPr>
           <w:ilvl w:val="0"/>
-          <w:numId w:val="7"/>
+          <w:numId w:val="11"/>
         </w:numPr>
         <w:spacing w:after="70" w:line="290"/>
       </w:pPr>
@@ -6987,7 +9401,7 @@
         </w:pBdr>
         <w:spacing w:after="240" w:before="0"/>
       </w:pPr>
-      <w:bookmarkStart w:name="cap7" w:id="1"/>
+      <w:bookmarkStart w:name="cap8" w:id="1"/>
       <w:r>
         <w:rPr>
           <w:rFonts w:ascii="Arial" w:cs="Arial" w:eastAsia="Arial" w:hAnsi="Arial"/>
@@ -6997,7 +9411,7 @@
           <w:sz w:val="34"/>
           <w:szCs w:val="34"/>
         </w:rPr>
-        <w:t xml:space="preserve">7. Supabase: progetto in pausa</w:t>
+        <w:t xml:space="preserve">8. Supabase: progetto in pausa</w:t>
       </w:r>
       <w:bookmarkEnd w:id="1"/>
     </w:p>
@@ -7020,7 +9434,7 @@
         <w:pStyle w:val="ListParagraph"/>
         <w:numPr>
           <w:ilvl w:val="0"/>
-          <w:numId w:val="8"/>
+          <w:numId w:val="12"/>
         </w:numPr>
         <w:spacing w:after="70" w:line="290"/>
       </w:pPr>
@@ -7079,7 +9493,7 @@
         <w:pStyle w:val="ListParagraph"/>
         <w:numPr>
           <w:ilvl w:val="0"/>
-          <w:numId w:val="8"/>
+          <w:numId w:val="12"/>
         </w:numPr>
         <w:spacing w:after="70" w:line="290"/>
       </w:pPr>
@@ -7161,7 +9575,7 @@
         </w:pBdr>
         <w:spacing w:after="240" w:before="0"/>
       </w:pPr>
-      <w:bookmarkStart w:name="cap8" w:id="1"/>
+      <w:bookmarkStart w:name="cap9" w:id="1"/>
       <w:r>
         <w:rPr>
           <w:rFonts w:ascii="Arial" w:cs="Arial" w:eastAsia="Arial" w:hAnsi="Arial"/>
@@ -7171,7 +9585,7 @@
           <w:sz w:val="34"/>
           <w:szCs w:val="34"/>
         </w:rPr>
-        <w:t xml:space="preserve">8. Supabase: dati cancellati per errore</w:t>
+        <w:t xml:space="preserve">9. Supabase: dati cancellati per errore</w:t>
       </w:r>
       <w:bookmarkEnd w:id="1"/>
     </w:p>
@@ -7416,7 +9830,7 @@
         </w:pBdr>
         <w:spacing w:after="240" w:before="0"/>
       </w:pPr>
-      <w:bookmarkStart w:name="cap9" w:id="1"/>
+      <w:bookmarkStart w:name="cap10" w:id="1"/>
       <w:r>
         <w:rPr>
           <w:rFonts w:ascii="Arial" w:cs="Arial" w:eastAsia="Arial" w:hAnsi="Arial"/>
@@ -7426,7 +9840,7 @@
           <w:sz w:val="34"/>
           <w:szCs w:val="34"/>
         </w:rPr>
-        <w:t xml:space="preserve">9. Supabase: ricostruzione da zero</w:t>
+        <w:t xml:space="preserve">10. Supabase: ricostruzione da zero</w:t>
       </w:r>
       <w:bookmarkEnd w:id="1"/>
     </w:p>
@@ -7467,7 +9881,7 @@
         <w:pStyle w:val="ListParagraph"/>
         <w:numPr>
           <w:ilvl w:val="0"/>
-          <w:numId w:val="9"/>
+          <w:numId w:val="13"/>
         </w:numPr>
         <w:spacing w:after="70" w:line="290"/>
       </w:pPr>
@@ -7546,7 +9960,7 @@
         <w:pStyle w:val="ListParagraph"/>
         <w:numPr>
           <w:ilvl w:val="0"/>
-          <w:numId w:val="9"/>
+          <w:numId w:val="13"/>
         </w:numPr>
         <w:spacing w:after="70" w:line="290"/>
       </w:pPr>
@@ -9302,7 +11716,7 @@
         <w:pStyle w:val="ListParagraph"/>
         <w:numPr>
           <w:ilvl w:val="0"/>
-          <w:numId w:val="10"/>
+          <w:numId w:val="14"/>
         </w:numPr>
         <w:spacing w:after="70" w:line="290"/>
       </w:pPr>
@@ -9388,7 +11802,7 @@
         <w:pStyle w:val="ListParagraph"/>
         <w:numPr>
           <w:ilvl w:val="0"/>
-          <w:numId w:val="10"/>
+          <w:numId w:val="14"/>
         </w:numPr>
         <w:spacing w:after="70" w:line="290"/>
       </w:pPr>
@@ -9529,7 +11943,7 @@
         <w:pStyle w:val="ListParagraph"/>
         <w:numPr>
           <w:ilvl w:val="0"/>
-          <w:numId w:val="11"/>
+          <w:numId w:val="15"/>
         </w:numPr>
         <w:spacing w:after="70" w:line="290"/>
       </w:pPr>
@@ -9599,7 +12013,7 @@
         <w:pStyle w:val="ListParagraph"/>
         <w:numPr>
           <w:ilvl w:val="0"/>
-          <w:numId w:val="11"/>
+          <w:numId w:val="15"/>
         </w:numPr>
         <w:spacing w:after="70" w:line="290"/>
       </w:pPr>
@@ -9759,7 +12173,7 @@
         <w:pStyle w:val="ListParagraph"/>
         <w:numPr>
           <w:ilvl w:val="0"/>
-          <w:numId w:val="12"/>
+          <w:numId w:val="16"/>
         </w:numPr>
         <w:spacing w:after="70" w:line="290"/>
       </w:pPr>
@@ -9908,7 +12322,7 @@
         <w:pStyle w:val="ListParagraph"/>
         <w:numPr>
           <w:ilvl w:val="0"/>
-          <w:numId w:val="12"/>
+          <w:numId w:val="16"/>
         </w:numPr>
         <w:spacing w:after="70" w:line="290"/>
       </w:pPr>
@@ -10000,7 +12414,7 @@
         </w:pBdr>
         <w:spacing w:after="240" w:before="0"/>
       </w:pPr>
-      <w:bookmarkStart w:name="cap10" w:id="1"/>
+      <w:bookmarkStart w:name="cap11" w:id="1"/>
       <w:r>
         <w:rPr>
           <w:rFonts w:ascii="Arial" w:cs="Arial" w:eastAsia="Arial" w:hAnsi="Arial"/>
@@ -10010,7 +12424,7 @@
           <w:sz w:val="34"/>
           <w:szCs w:val="34"/>
         </w:rPr>
-        <w:t xml:space="preserve">10. Ripristino di Resend</w:t>
+        <w:t xml:space="preserve">11. Ripristino di Resend</w:t>
       </w:r>
       <w:bookmarkEnd w:id="1"/>
     </w:p>
@@ -10019,7 +12433,7 @@
         <w:pStyle w:val="ListParagraph"/>
         <w:numPr>
           <w:ilvl w:val="0"/>
-          <w:numId w:val="13"/>
+          <w:numId w:val="17"/>
         </w:numPr>
         <w:spacing w:after="70" w:line="290"/>
       </w:pPr>
@@ -10058,7 +12472,7 @@
         <w:pStyle w:val="ListParagraph"/>
         <w:numPr>
           <w:ilvl w:val="0"/>
-          <w:numId w:val="13"/>
+          <w:numId w:val="17"/>
         </w:numPr>
         <w:spacing w:after="70" w:line="290"/>
       </w:pPr>
@@ -10175,7 +12589,7 @@
         <w:pStyle w:val="ListParagraph"/>
         <w:numPr>
           <w:ilvl w:val="0"/>
-          <w:numId w:val="13"/>
+          <w:numId w:val="17"/>
         </w:numPr>
         <w:spacing w:after="70" w:line="290"/>
       </w:pPr>
@@ -10254,7 +12668,7 @@
         <w:pStyle w:val="ListParagraph"/>
         <w:numPr>
           <w:ilvl w:val="0"/>
-          <w:numId w:val="13"/>
+          <w:numId w:val="17"/>
         </w:numPr>
         <w:spacing w:after="70" w:line="290"/>
       </w:pPr>
@@ -10282,7 +12696,7 @@
         </w:pBdr>
         <w:spacing w:after="240" w:before="0"/>
       </w:pPr>
-      <w:bookmarkStart w:name="cap11" w:id="1"/>
+      <w:bookmarkStart w:name="cap12" w:id="1"/>
       <w:r>
         <w:rPr>
           <w:rFonts w:ascii="Arial" w:cs="Arial" w:eastAsia="Arial" w:hAnsi="Arial"/>
@@ -10292,7 +12706,7 @@
           <w:sz w:val="34"/>
           <w:szCs w:val="34"/>
         </w:rPr>
-        <w:t xml:space="preserve">11. Ripristino del progetto Claude</w:t>
+        <w:t xml:space="preserve">12. Ripristino del progetto Claude</w:t>
       </w:r>
       <w:bookmarkEnd w:id="1"/>
     </w:p>
@@ -10315,7 +12729,7 @@
         <w:pStyle w:val="ListParagraph"/>
         <w:numPr>
           <w:ilvl w:val="0"/>
-          <w:numId w:val="14"/>
+          <w:numId w:val="18"/>
         </w:numPr>
         <w:spacing w:after="70" w:line="290"/>
       </w:pPr>
@@ -10345,7 +12759,7 @@
         <w:pStyle w:val="ListParagraph"/>
         <w:numPr>
           <w:ilvl w:val="0"/>
-          <w:numId w:val="14"/>
+          <w:numId w:val="18"/>
         </w:numPr>
         <w:spacing w:after="70" w:line="290"/>
       </w:pPr>
@@ -10447,7 +12861,7 @@
         <w:pStyle w:val="ListParagraph"/>
         <w:numPr>
           <w:ilvl w:val="0"/>
-          <w:numId w:val="14"/>
+          <w:numId w:val="18"/>
         </w:numPr>
         <w:spacing w:after="70" w:line="290"/>
       </w:pPr>
@@ -10477,7 +12891,7 @@
         <w:pStyle w:val="ListParagraph"/>
         <w:numPr>
           <w:ilvl w:val="0"/>
-          <w:numId w:val="14"/>
+          <w:numId w:val="18"/>
         </w:numPr>
         <w:spacing w:after="70" w:line="290"/>
       </w:pPr>
@@ -10525,7 +12939,7 @@
         <w:pStyle w:val="ListParagraph"/>
         <w:numPr>
           <w:ilvl w:val="0"/>
-          <w:numId w:val="14"/>
+          <w:numId w:val="18"/>
         </w:numPr>
         <w:spacing w:after="70" w:line="290"/>
       </w:pPr>
@@ -10573,7 +12987,7 @@
         <w:pStyle w:val="ListParagraph"/>
         <w:numPr>
           <w:ilvl w:val="0"/>
-          <w:numId w:val="14"/>
+          <w:numId w:val="18"/>
         </w:numPr>
         <w:spacing w:after="70" w:line="290"/>
       </w:pPr>
@@ -10639,7 +13053,7 @@
         <w:pStyle w:val="ListParagraph"/>
         <w:numPr>
           <w:ilvl w:val="0"/>
-          <w:numId w:val="14"/>
+          <w:numId w:val="18"/>
         </w:numPr>
         <w:spacing w:after="70" w:line="290"/>
       </w:pPr>
@@ -10738,7 +13152,7 @@
         </w:pBdr>
         <w:spacing w:after="240" w:before="0"/>
       </w:pPr>
-      <w:bookmarkStart w:name="cap12" w:id="1"/>
+      <w:bookmarkStart w:name="cap13" w:id="1"/>
       <w:r>
         <w:rPr>
           <w:rFonts w:ascii="Arial" w:cs="Arial" w:eastAsia="Arial" w:hAnsi="Arial"/>
@@ -10748,7 +13162,7 @@
           <w:sz w:val="34"/>
           <w:szCs w:val="34"/>
         </w:rPr>
-        <w:t xml:space="preserve">12. Elenco di chiavi e impostazioni</w:t>
+        <w:t xml:space="preserve">13. Elenco di chiavi e impostazioni</w:t>
       </w:r>
       <w:bookmarkEnd w:id="1"/>
     </w:p>
@@ -12536,7 +14950,7 @@
         <w:szCs w:val="16"/>
       </w:rPr>
       <w:tab/>
-      <w:t xml:space="preserve">Istruzioni di ripristino · Rev. 1.6 · 21/10/2026</w:t>
+      <w:t xml:space="preserve">Istruzioni di ripristino · Rev. 1.7 · 21/10/2026</w:t>
     </w:r>
   </w:p>
 </w:hdr>
@@ -12601,7 +15015,7 @@
         <w:szCs w:val="16"/>
       </w:rPr>
       <w:tab/>
-      <w:t xml:space="preserve">Istruzioni di ripristino · Rev. 1.6 · 21/10/2026</w:t>
+      <w:t xml:space="preserve">Istruzioni di ripristino · Rev. 1.7 · 21/10/2026</w:t>
     </w:r>
   </w:p>
 </w:hdr>
@@ -12816,6 +15230,30 @@
     </w:lvlOverride>
   </w:num>
   <w:num w:numId="14">
+    <w:abstractNumId w:val="3"/>
+    <w:lvlOverride w:ilvl="0">
+      <w:startOverride w:val="1"/>
+    </w:lvlOverride>
+  </w:num>
+  <w:num w:numId="15">
+    <w:abstractNumId w:val="3"/>
+    <w:lvlOverride w:ilvl="0">
+      <w:startOverride w:val="1"/>
+    </w:lvlOverride>
+  </w:num>
+  <w:num w:numId="16">
+    <w:abstractNumId w:val="3"/>
+    <w:lvlOverride w:ilvl="0">
+      <w:startOverride w:val="1"/>
+    </w:lvlOverride>
+  </w:num>
+  <w:num w:numId="17">
+    <w:abstractNumId w:val="3"/>
+    <w:lvlOverride w:ilvl="0">
+      <w:startOverride w:val="1"/>
+    </w:lvlOverride>
+  </w:num>
+  <w:num w:numId="18">
     <w:abstractNumId w:val="3"/>
     <w:lvlOverride w:ilvl="0">
       <w:startOverride w:val="1"/>

</xml_diff>

<commit_message>
News: osservatorio sui crediti di carbonio volontari per gli Amministratori
Script 36 (tabelle notizia e notizie_esecuzione, RLS solo Admin, limite di
frequenza, lavoro pg_cron ogni 2 ore), funzione del server «notizie»
(feed RSS, pre-filtro, valutazione di Claude con sintesi in italiano),
modulo src/lib/notizie.js, pagina /news e voce di menu. Prove
notizie.test.mjs e t36.sql. Manuali, Registro, Istruzioni di ripristino,
Registro issue e test e presentazione aggiornati.

Co-Authored-By: Claude Opus 5.5 <noreply@anthropic.com>
Claude-Session: https://claude.ai/code/session_01E8XCbEeVHWVP3hntUZ6kZ1
</commit_message>
<xml_diff>
--- a/public/documentazione/Istruzioni_Ripristino_Portale_CWP.docx
+++ b/public/documentazione/Istruzioni_Ripristino_Portale_CWP.docx
@@ -302,7 +302,7 @@
                 <w:sz w:val="20"/>
                 <w:szCs w:val="20"/>
               </w:rPr>
-              <w:t xml:space="preserve">Rev. 1.7</w:t>
+              <w:t xml:space="preserve">Rev. 1.8</w:t>
             </w:r>
           </w:p>
         </w:tc>
@@ -719,7 +719,7 @@
                 <w:sz w:val="18"/>
                 <w:szCs w:val="18"/>
               </w:rPr>
-              <w:t xml:space="preserve">1.7</w:t>
+              <w:t xml:space="preserve">1.8</w:t>
             </w:r>
           </w:p>
         </w:tc>
@@ -783,7 +783,7 @@
                 <w:sz w:val="18"/>
                 <w:szCs w:val="18"/>
               </w:rPr>
-              <w:t xml:space="preserve">Backup automatico su Google Drive alle 13 e alle 21 (installazione, contenuto) e ripristino da un backup automatico, provato sul banco locale.</w:t>
+              <w:t xml:space="preserve">Script 36 e funzione notizie (Verify JWT disattivato, indirizzo url_notizie, quarto lavoro pianificato).</w:t>
             </w:r>
           </w:p>
         </w:tc>
@@ -853,7 +853,7 @@
                 <w:sz w:val="18"/>
                 <w:szCs w:val="18"/>
               </w:rPr>
-              <w:t xml:space="preserve">1.6</w:t>
+              <w:t xml:space="preserve">1.7</w:t>
             </w:r>
           </w:p>
         </w:tc>
@@ -919,7 +919,7 @@
                 <w:sz w:val="18"/>
                 <w:szCs w:val="18"/>
               </w:rPr>
-              <w:t xml:space="preserve">Ricostruzione del database con gli script da 01 a 35 (simulatore, Amministratore principale, assistente, utenti online, Audit User, avvisi di sicurezza, controlli del collaudo).</w:t>
+              <w:t xml:space="preserve">Backup automatico su Google Drive alle 13 e alle 21 (installazione, contenuto) e ripristino da un backup automatico, provato sul banco locale.</w:t>
             </w:r>
           </w:p>
         </w:tc>
@@ -989,7 +989,7 @@
                 <w:sz w:val="18"/>
                 <w:szCs w:val="18"/>
               </w:rPr>
-              <w:t xml:space="preserve">1.5</w:t>
+              <w:t xml:space="preserve">1.6</w:t>
             </w:r>
           </w:p>
         </w:tc>
@@ -1021,7 +1021,7 @@
                 <w:sz w:val="18"/>
                 <w:szCs w:val="18"/>
               </w:rPr>
-              <w:t xml:space="preserve">20/10/2026</w:t>
+              <w:t xml:space="preserve">21/10/2026</w:t>
             </w:r>
           </w:p>
         </w:tc>
@@ -1053,7 +1053,7 @@
                 <w:sz w:val="18"/>
                 <w:szCs w:val="18"/>
               </w:rPr>
-              <w:t xml:space="preserve">Indirizzo Supabase nella Content-Security-Policy di vercel.json; script 01-34.</w:t>
+              <w:t xml:space="preserve">Ricostruzione del database con gli script da 01 a 35 (simulatore, Amministratore principale, assistente, utenti online, Audit User, avvisi di sicurezza, controlli del collaudo).</w:t>
             </w:r>
           </w:p>
         </w:tc>
@@ -1123,7 +1123,7 @@
                 <w:sz w:val="18"/>
                 <w:szCs w:val="18"/>
               </w:rPr>
-              <w:t xml:space="preserve">1.4</w:t>
+              <w:t xml:space="preserve">1.5</w:t>
             </w:r>
           </w:p>
         </w:tc>
@@ -1189,7 +1189,7 @@
                 <w:sz w:val="18"/>
                 <w:szCs w:val="18"/>
               </w:rPr>
-              <w:t xml:space="preserve">Amministratore principale e verifiche dopo il ripristino (Audit User, assistente).</w:t>
+              <w:t xml:space="preserve">Indirizzo Supabase nella Content-Security-Policy di vercel.json; script 01-34.</w:t>
             </w:r>
           </w:p>
         </w:tc>
@@ -1259,7 +1259,7 @@
                 <w:sz w:val="18"/>
                 <w:szCs w:val="18"/>
               </w:rPr>
-              <w:t xml:space="preserve">1.3</w:t>
+              <w:t xml:space="preserve">1.4</w:t>
             </w:r>
           </w:p>
         </w:tc>
@@ -1323,7 +1323,7 @@
                 <w:sz w:val="18"/>
                 <w:szCs w:val="18"/>
               </w:rPr>
-              <w:t xml:space="preserve">Script 01-33.</w:t>
+              <w:t xml:space="preserve">Amministratore principale e verifiche dopo il ripristino (Audit User, assistente).</w:t>
             </w:r>
           </w:p>
         </w:tc>
@@ -1393,7 +1393,7 @@
                 <w:sz w:val="18"/>
                 <w:szCs w:val="18"/>
               </w:rPr>
-              <w:t xml:space="preserve">1.2</w:t>
+              <w:t xml:space="preserve">1.3</w:t>
             </w:r>
           </w:p>
         </w:tc>
@@ -1459,7 +1459,7 @@
                 <w:sz w:val="18"/>
                 <w:szCs w:val="18"/>
               </w:rPr>
-              <w:t xml:space="preserve">Script 01-32.</w:t>
+              <w:t xml:space="preserve">Script 01-33.</w:t>
             </w:r>
           </w:p>
         </w:tc>
@@ -1529,7 +1529,7 @@
                 <w:sz w:val="18"/>
                 <w:szCs w:val="18"/>
               </w:rPr>
-              <w:t xml:space="preserve">1.1</w:t>
+              <w:t xml:space="preserve">1.2</w:t>
             </w:r>
           </w:p>
         </w:tc>
@@ -1561,7 +1561,7 @@
                 <w:sz w:val="18"/>
                 <w:szCs w:val="18"/>
               </w:rPr>
-              <w:t xml:space="preserve">19/10/2026</w:t>
+              <w:t xml:space="preserve">20/10/2026</w:t>
             </w:r>
           </w:p>
         </w:tc>
@@ -1593,7 +1593,7 @@
                 <w:sz w:val="18"/>
                 <w:szCs w:val="18"/>
               </w:rPr>
-              <w:t xml:space="preserve">Funzione assistente e chiave ANTHROPIC_API_KEY; Claude Console tra i servizi; script 01-31.</w:t>
+              <w:t xml:space="preserve">Script 01-32.</w:t>
             </w:r>
           </w:p>
         </w:tc>
@@ -1663,6 +1663,142 @@
                 <w:sz w:val="18"/>
                 <w:szCs w:val="18"/>
               </w:rPr>
+              <w:t xml:space="preserve">1.1</w:t>
+            </w:r>
+          </w:p>
+        </w:tc>
+        <w:tc>
+          <w:tcPr>
+            <w:tcW w:type="dxa" w:w="1300"/>
+            <w:tcBorders>
+              <w:top w:val="single" w:color="D9D4C5" w:sz="4"/>
+              <w:left w:val="single" w:color="D9D4C5" w:sz="4"/>
+              <w:bottom w:val="single" w:color="D9D4C5" w:sz="4"/>
+              <w:right w:val="single" w:color="D9D4C5" w:sz="4"/>
+            </w:tcBorders>
+            <w:shd w:fill="F6F4EE" w:color="auto" w:val="clear"/>
+            <w:tcMar>
+              <w:top w:type="dxa" w:w="70"/>
+              <w:left w:type="dxa" w:w="110"/>
+              <w:bottom w:type="dxa" w:w="70"/>
+              <w:right w:type="dxa" w:w="110"/>
+            </w:tcMar>
+            <w:vAlign w:val="center"/>
+          </w:tcPr>
+          <w:p>
+            <w:pPr>
+              <w:spacing w:after="0" w:before="0"/>
+            </w:pPr>
+            <w:r>
+              <w:rPr>
+                <w:rFonts w:ascii="Arial" w:cs="Arial" w:eastAsia="Arial" w:hAnsi="Arial"/>
+                <w:color w:val="1B2118"/>
+                <w:sz w:val="18"/>
+                <w:szCs w:val="18"/>
+              </w:rPr>
+              <w:t xml:space="preserve">19/10/2026</w:t>
+            </w:r>
+          </w:p>
+        </w:tc>
+        <w:tc>
+          <w:tcPr>
+            <w:tcW w:type="dxa" w:w="5538"/>
+            <w:tcBorders>
+              <w:top w:val="single" w:color="D9D4C5" w:sz="4"/>
+              <w:left w:val="single" w:color="D9D4C5" w:sz="4"/>
+              <w:bottom w:val="single" w:color="D9D4C5" w:sz="4"/>
+              <w:right w:val="single" w:color="D9D4C5" w:sz="4"/>
+            </w:tcBorders>
+            <w:shd w:fill="F6F4EE" w:color="auto" w:val="clear"/>
+            <w:tcMar>
+              <w:top w:type="dxa" w:w="70"/>
+              <w:left w:type="dxa" w:w="110"/>
+              <w:bottom w:type="dxa" w:w="70"/>
+              <w:right w:type="dxa" w:w="110"/>
+            </w:tcMar>
+            <w:vAlign w:val="center"/>
+          </w:tcPr>
+          <w:p>
+            <w:pPr>
+              <w:spacing w:after="0" w:before="0"/>
+            </w:pPr>
+            <w:r>
+              <w:rPr>
+                <w:rFonts w:ascii="Arial" w:cs="Arial" w:eastAsia="Arial" w:hAnsi="Arial"/>
+                <w:color w:val="1B2118"/>
+                <w:sz w:val="18"/>
+                <w:szCs w:val="18"/>
+              </w:rPr>
+              <w:t xml:space="preserve">Funzione assistente e chiave ANTHROPIC_API_KEY; Claude Console tra i servizi; script 01-31.</w:t>
+            </w:r>
+          </w:p>
+        </w:tc>
+        <w:tc>
+          <w:tcPr>
+            <w:tcW w:type="dxa" w:w="2000"/>
+            <w:tcBorders>
+              <w:top w:val="single" w:color="D9D4C5" w:sz="4"/>
+              <w:left w:val="single" w:color="D9D4C5" w:sz="4"/>
+              <w:bottom w:val="single" w:color="D9D4C5" w:sz="4"/>
+              <w:right w:val="single" w:color="D9D4C5" w:sz="4"/>
+            </w:tcBorders>
+            <w:shd w:fill="F6F4EE" w:color="auto" w:val="clear"/>
+            <w:tcMar>
+              <w:top w:type="dxa" w:w="70"/>
+              <w:left w:type="dxa" w:w="110"/>
+              <w:bottom w:type="dxa" w:w="70"/>
+              <w:right w:type="dxa" w:w="110"/>
+            </w:tcMar>
+            <w:vAlign w:val="center"/>
+          </w:tcPr>
+          <w:p>
+            <w:pPr>
+              <w:spacing w:after="0" w:before="0"/>
+            </w:pPr>
+            <w:r>
+              <w:rPr>
+                <w:rFonts w:ascii="Arial" w:cs="Arial" w:eastAsia="Arial" w:hAnsi="Arial"/>
+                <w:color w:val="1B2118"/>
+                <w:sz w:val="18"/>
+                <w:szCs w:val="18"/>
+              </w:rPr>
+              <w:t xml:space="preserve">Fondazione Operate</w:t>
+            </w:r>
+          </w:p>
+        </w:tc>
+      </w:tr>
+      <w:tr>
+        <w:trPr>
+          <w:cantSplit/>
+        </w:trPr>
+        <w:tc>
+          <w:tcPr>
+            <w:tcW w:type="dxa" w:w="800"/>
+            <w:tcBorders>
+              <w:top w:val="single" w:color="D9D4C5" w:sz="4"/>
+              <w:left w:val="single" w:color="D9D4C5" w:sz="4"/>
+              <w:bottom w:val="single" w:color="D9D4C5" w:sz="4"/>
+              <w:right w:val="single" w:color="D9D4C5" w:sz="4"/>
+            </w:tcBorders>
+            <w:tcMar>
+              <w:top w:type="dxa" w:w="70"/>
+              <w:left w:type="dxa" w:w="110"/>
+              <w:bottom w:type="dxa" w:w="70"/>
+              <w:right w:type="dxa" w:w="110"/>
+            </w:tcMar>
+            <w:vAlign w:val="center"/>
+          </w:tcPr>
+          <w:p>
+            <w:pPr>
+              <w:spacing w:after="0" w:before="0"/>
+            </w:pPr>
+            <w:r>
+              <w:rPr>
+                <w:rFonts w:ascii="Arial" w:cs="Arial" w:eastAsia="Arial" w:hAnsi="Arial"/>
+                <w:color w:val="1B2118"/>
+                <w:sz w:val="18"/>
+                <w:szCs w:val="18"/>
+              </w:rPr>
               <w:t xml:space="preserve">1.0</w:t>
             </w:r>
           </w:p>
@@ -1676,7 +1812,6 @@
               <w:bottom w:val="single" w:color="D9D4C5" w:sz="4"/>
               <w:right w:val="single" w:color="D9D4C5" w:sz="4"/>
             </w:tcBorders>
-            <w:shd w:fill="F6F4EE" w:color="auto" w:val="clear"/>
             <w:tcMar>
               <w:top w:type="dxa" w:w="70"/>
               <w:left w:type="dxa" w:w="110"/>
@@ -1709,7 +1844,6 @@
               <w:bottom w:val="single" w:color="D9D4C5" w:sz="4"/>
               <w:right w:val="single" w:color="D9D4C5" w:sz="4"/>
             </w:tcBorders>
-            <w:shd w:fill="F6F4EE" w:color="auto" w:val="clear"/>
             <w:tcMar>
               <w:top w:type="dxa" w:w="70"/>
               <w:left w:type="dxa" w:w="110"/>
@@ -1742,7 +1876,6 @@
               <w:bottom w:val="single" w:color="D9D4C5" w:sz="4"/>
               <w:right w:val="single" w:color="D9D4C5" w:sz="4"/>
             </w:tcBorders>
-            <w:shd w:fill="F6F4EE" w:color="auto" w:val="clear"/>
             <w:tcMar>
               <w:top w:type="dxa" w:w="70"/>
               <w:left w:type="dxa" w:w="110"/>
@@ -1784,7 +1917,7 @@
           <w:sz w:val="20"/>
           <w:szCs w:val="20"/>
         </w:rPr>
-        <w:t xml:space="preserve">Istruzioni alla revisione 1.7 del 21/10/2026. Si aggiornano quando cambiano servizi, piani, script del database, funzioni o chiavi; una copia è dentro ogni archivio di backup e la versione corrente si scarica dall'area Documentazione del portale (solo Amministratori).</w:t>
+        <w:t xml:space="preserve">Istruzioni alla revisione 1.8 del 21/10/2026. Si aggiornano quando cambiano servizi, piani, script del database, funzioni o chiavi; una copia è dentro ogni archivio di backup e la versione corrente si scarica dall'area Documentazione del portale (solo Amministratori).</w:t>
       </w:r>
     </w:p>
     <w:p>
@@ -3309,7 +3442,7 @@
                 <w:sz w:val="18"/>
                 <w:szCs w:val="18"/>
               </w:rPr>
-              <w:t xml:space="preserve">Tutto il codice, gli script del database (01-35), le funzioni del server, i manuali e la loro storia</w:t>
+              <w:t xml:space="preserve">Tutto il codice, gli script del database (01-36), le funzioni del server, i manuali e la loro storia</w:t>
             </w:r>
           </w:p>
         </w:tc>
@@ -6244,7 +6377,7 @@
                 <w:sz w:val="18"/>
                 <w:szCs w:val="18"/>
               </w:rPr>
-              <w:t xml:space="preserve">ZIP del codice da GitHub (ramo main): portale, script del database 01-35, funzioni del server, manuali, strumenti di ripristino; </w:t>
+              <w:t xml:space="preserve">ZIP del codice da GitHub (ramo main): portale, script del database 01-36, funzioni del server, manuali, strumenti di ripristino; </w:t>
             </w:r>
             <w:r>
               <w:rPr>
@@ -6780,7 +6913,7 @@
         </w:rPr>
         <w:t xml:space="preserve">: si apre in testo semplice all'indirizzo </w:t>
       </w:r>
-      <w:hyperlink w:history="1" r:id="rIdk3yxkcmbarm9mbu-bvlsr">
+      <w:hyperlink w:history="1" r:id="rId3xf7bywmqsouyhm2aq8sb">
         <w:r>
           <w:rPr>
             <w:rFonts w:ascii="Arial" w:cs="Arial" w:eastAsia="Arial" w:hAnsi="Arial"/>
@@ -7612,7 +7745,7 @@
           <w:sz w:val="21"/>
           <w:szCs w:val="21"/>
         </w:rPr>
-        <w:t xml:space="preserve"> ed esecuzione degli script 01-35, come nel capitolo «Supabase: ricostruzione da zero», passi 1 e 2.</w:t>
+        <w:t xml:space="preserve"> ed esecuzione degli script 01-36, come nel capitolo «Supabase: ricostruzione da zero», passi 1 e 2.</w:t>
       </w:r>
     </w:p>
     <w:p>
@@ -10164,7 +10297,7 @@
           <w:sz w:val="21"/>
           <w:szCs w:val="21"/>
         </w:rPr>
-        <w:t xml:space="preserve">35_controlli_collaudo.sql</w:t>
+        <w:t xml:space="preserve">36_notizie.sql</w:t>
       </w:r>
       <w:r>
         <w:rPr>
@@ -10453,7 +10586,7 @@
           <w:sz w:val="21"/>
           <w:szCs w:val="21"/>
         </w:rPr>
-        <w:t xml:space="preserve">gli script dal 28 al 35 aggiungono simulatore, Amministratore principale (29), eliminazione degli utenti mai attivi, assistente, utenti online, Audit User, avvisi di sicurezza (34) e i controlli dei dati chiesti dal collaudo (35); il 35 termina con un conteggio di sola lettura che su un database nuovo vale 0 in tutte le righe;</w:t>
+        <w:t xml:space="preserve">gli script dal 28 al 35 aggiungono simulatore, Amministratore principale (29), eliminazione degli utenti mai attivi, assistente, utenti online, Audit User, avvisi di sicurezza (34) e i controlli dei dati chiesti dal collaudo (35) e l'osservatorio News (36); il 35 termina con un conteggio di sola lettura che su un database nuovo vale 0 in tutte le righe;</w:t>
       </w:r>
     </w:p>
     <w:p>
@@ -10551,6 +10684,99 @@
     </w:p>
     <w:p>
       <w:pPr>
+        <w:pStyle w:val="ListParagraph"/>
+        <w:numPr>
+          <w:ilvl w:val="0"/>
+          <w:numId w:val="2"/>
+        </w:numPr>
+        <w:spacing w:after="70" w:line="290"/>
+      </w:pPr>
+      <w:r>
+        <w:rPr>
+          <w:rFonts w:ascii="Arial" w:cs="Arial" w:eastAsia="Arial" w:hAnsi="Arial"/>
+          <w:b/>
+          <w:bCs/>
+          <w:color w:val="1B2118"/>
+          <w:sz w:val="21"/>
+          <w:szCs w:val="21"/>
+        </w:rPr>
+        <w:t xml:space="preserve">dopo</w:t>
+      </w:r>
+      <w:r>
+        <w:rPr>
+          <w:rFonts w:ascii="Arial" w:cs="Arial" w:eastAsia="Arial" w:hAnsi="Arial"/>
+          <w:color w:val="1B2118"/>
+          <w:sz w:val="21"/>
+          <w:szCs w:val="21"/>
+        </w:rPr>
+        <w:t xml:space="preserve"> </w:t>
+      </w:r>
+      <w:r>
+        <w:rPr>
+          <w:rFonts w:ascii="Consolas" w:cs="Consolas" w:eastAsia="Consolas" w:hAnsi="Consolas"/>
+          <w:color w:val="2F5D3A"/>
+          <w:sz w:val="21"/>
+          <w:szCs w:val="21"/>
+        </w:rPr>
+        <w:t xml:space="preserve">36_notizie.sql</w:t>
+      </w:r>
+      <w:r>
+        <w:rPr>
+          <w:rFonts w:ascii="Arial" w:cs="Arial" w:eastAsia="Arial" w:hAnsi="Arial"/>
+          <w:color w:val="1B2118"/>
+          <w:sz w:val="21"/>
+          <w:szCs w:val="21"/>
+        </w:rPr>
+        <w:t xml:space="preserve">, allo stesso modo, l'indirizzo della funzione delle News:</w:t>
+      </w:r>
+    </w:p>
+    <w:p>
+      <w:pPr>
+        <w:shd w:fill="F6F4EE" w:color="auto" w:val="clear"/>
+        <w:spacing w:after="0" w:before="60" w:line="220"/>
+      </w:pPr>
+      <w:r>
+        <w:rPr>
+          <w:rFonts w:ascii="Consolas" w:cs="Consolas" w:eastAsia="Consolas" w:hAnsi="Consolas"/>
+          <w:color w:val="1B2118"/>
+          <w:sz w:val="14"/>
+          <w:szCs w:val="14"/>
+        </w:rPr>
+        <w:t xml:space="preserve">update impostazione</w:t>
+      </w:r>
+    </w:p>
+    <w:p>
+      <w:pPr>
+        <w:shd w:fill="F6F4EE" w:color="auto" w:val="clear"/>
+        <w:spacing w:after="0" w:before="0" w:line="220"/>
+      </w:pPr>
+      <w:r>
+        <w:rPr>
+          <w:rFonts w:ascii="Consolas" w:cs="Consolas" w:eastAsia="Consolas" w:hAnsi="Consolas"/>
+          <w:color w:val="1B2118"/>
+          <w:sz w:val="14"/>
+          <w:szCs w:val="14"/>
+        </w:rPr>
+        <w:t xml:space="preserve">   set valore = 'https://&lt;nuovo-progetto&gt;.supabase.co/functions/v1/notizie'</w:t>
+      </w:r>
+    </w:p>
+    <w:p>
+      <w:pPr>
+        <w:shd w:fill="F6F4EE" w:color="auto" w:val="clear"/>
+        <w:spacing w:after="200" w:before="0" w:line="220"/>
+      </w:pPr>
+      <w:r>
+        <w:rPr>
+          <w:rFonts w:ascii="Consolas" w:cs="Consolas" w:eastAsia="Consolas" w:hAnsi="Consolas"/>
+          <w:color w:val="1B2118"/>
+          <w:sz w:val="14"/>
+          <w:szCs w:val="14"/>
+        </w:rPr>
+        <w:t xml:space="preserve"> where chiave = 'url_notizie';</w:t>
+      </w:r>
+    </w:p>
+    <w:p>
+      <w:pPr>
         <w:pStyle w:val="Heading2"/>
         <w:keepNext/>
         <w:spacing w:after="120" w:before="240"/>
@@ -10807,7 +11033,7 @@
           <w:sz w:val="21"/>
           <w:szCs w:val="21"/>
         </w:rPr>
-        <w:t xml:space="preserve">Create le sei funzioni con lo </w:t>
+        <w:t xml:space="preserve">Create le sette funzioni con lo </w:t>
       </w:r>
       <w:r>
         <w:rPr>
@@ -10902,8 +11128,8 @@
         <w:tblLayout w:type="fixed"/>
       </w:tblPr>
       <w:tblGrid>
-        <w:gridCol w:w="3349"/>
-        <w:gridCol w:w="6289"/>
+        <w:gridCol w:w="3010"/>
+        <w:gridCol w:w="6628"/>
       </w:tblGrid>
       <w:tr>
         <w:trPr>
@@ -10911,7 +11137,7 @@
         </w:trPr>
         <w:tc>
           <w:tcPr>
-            <w:tcW w:type="dxa" w:w="3349"/>
+            <w:tcW w:type="dxa" w:w="3010"/>
             <w:tcBorders>
               <w:top w:val="single" w:color="D9D4C5" w:sz="4"/>
               <w:left w:val="single" w:color="D9D4C5" w:sz="4"/>
@@ -10946,7 +11172,7 @@
         </w:tc>
         <w:tc>
           <w:tcPr>
-            <w:tcW w:type="dxa" w:w="6289"/>
+            <w:tcW w:type="dxa" w:w="6628"/>
             <w:tcBorders>
               <w:top w:val="single" w:color="D9D4C5" w:sz="4"/>
               <w:left w:val="single" w:color="D9D4C5" w:sz="4"/>
@@ -10986,7 +11212,7 @@
         </w:trPr>
         <w:tc>
           <w:tcPr>
-            <w:tcW w:type="dxa" w:w="3349"/>
+            <w:tcW w:type="dxa" w:w="3010"/>
             <w:tcBorders>
               <w:top w:val="single" w:color="D9D4C5" w:sz="4"/>
               <w:left w:val="single" w:color="D9D4C5" w:sz="4"/>
@@ -11018,7 +11244,7 @@
         </w:tc>
         <w:tc>
           <w:tcPr>
-            <w:tcW w:type="dxa" w:w="6289"/>
+            <w:tcW w:type="dxa" w:w="6628"/>
             <w:tcBorders>
               <w:top w:val="single" w:color="D9D4C5" w:sz="4"/>
               <w:left w:val="single" w:color="D9D4C5" w:sz="4"/>
@@ -11055,7 +11281,7 @@
         </w:trPr>
         <w:tc>
           <w:tcPr>
-            <w:tcW w:type="dxa" w:w="3349"/>
+            <w:tcW w:type="dxa" w:w="3010"/>
             <w:tcBorders>
               <w:top w:val="single" w:color="D9D4C5" w:sz="4"/>
               <w:left w:val="single" w:color="D9D4C5" w:sz="4"/>
@@ -11088,7 +11314,7 @@
         </w:tc>
         <w:tc>
           <w:tcPr>
-            <w:tcW w:type="dxa" w:w="6289"/>
+            <w:tcW w:type="dxa" w:w="6628"/>
             <w:tcBorders>
               <w:top w:val="single" w:color="D9D4C5" w:sz="4"/>
               <w:left w:val="single" w:color="D9D4C5" w:sz="4"/>
@@ -11126,7 +11352,7 @@
         </w:trPr>
         <w:tc>
           <w:tcPr>
-            <w:tcW w:type="dxa" w:w="3349"/>
+            <w:tcW w:type="dxa" w:w="3010"/>
             <w:tcBorders>
               <w:top w:val="single" w:color="D9D4C5" w:sz="4"/>
               <w:left w:val="single" w:color="D9D4C5" w:sz="4"/>
@@ -11158,7 +11384,7 @@
         </w:tc>
         <w:tc>
           <w:tcPr>
-            <w:tcW w:type="dxa" w:w="6289"/>
+            <w:tcW w:type="dxa" w:w="6628"/>
             <w:tcBorders>
               <w:top w:val="single" w:color="D9D4C5" w:sz="4"/>
               <w:left w:val="single" w:color="D9D4C5" w:sz="4"/>
@@ -11195,7 +11421,7 @@
         </w:trPr>
         <w:tc>
           <w:tcPr>
-            <w:tcW w:type="dxa" w:w="3349"/>
+            <w:tcW w:type="dxa" w:w="3010"/>
             <w:tcBorders>
               <w:top w:val="single" w:color="D9D4C5" w:sz="4"/>
               <w:left w:val="single" w:color="D9D4C5" w:sz="4"/>
@@ -11228,7 +11454,7 @@
         </w:tc>
         <w:tc>
           <w:tcPr>
-            <w:tcW w:type="dxa" w:w="6289"/>
+            <w:tcW w:type="dxa" w:w="6628"/>
             <w:tcBorders>
               <w:top w:val="single" w:color="D9D4C5" w:sz="4"/>
               <w:left w:val="single" w:color="D9D4C5" w:sz="4"/>
@@ -11277,7 +11503,7 @@
         </w:trPr>
         <w:tc>
           <w:tcPr>
-            <w:tcW w:type="dxa" w:w="3349"/>
+            <w:tcW w:type="dxa" w:w="3010"/>
             <w:tcBorders>
               <w:top w:val="single" w:color="D9D4C5" w:sz="4"/>
               <w:left w:val="single" w:color="D9D4C5" w:sz="4"/>
@@ -11309,7 +11535,7 @@
         </w:tc>
         <w:tc>
           <w:tcPr>
-            <w:tcW w:type="dxa" w:w="6289"/>
+            <w:tcW w:type="dxa" w:w="6628"/>
             <w:tcBorders>
               <w:top w:val="single" w:color="D9D4C5" w:sz="4"/>
               <w:left w:val="single" w:color="D9D4C5" w:sz="4"/>
@@ -11357,7 +11583,7 @@
         </w:trPr>
         <w:tc>
           <w:tcPr>
-            <w:tcW w:type="dxa" w:w="3349"/>
+            <w:tcW w:type="dxa" w:w="3010"/>
             <w:tcBorders>
               <w:top w:val="single" w:color="D9D4C5" w:sz="4"/>
               <w:left w:val="single" w:color="D9D4C5" w:sz="4"/>
@@ -11390,7 +11616,7 @@
         </w:tc>
         <w:tc>
           <w:tcPr>
-            <w:tcW w:type="dxa" w:w="6289"/>
+            <w:tcW w:type="dxa" w:w="6628"/>
             <w:tcBorders>
               <w:top w:val="single" w:color="D9D4C5" w:sz="4"/>
               <w:left w:val="single" w:color="D9D4C5" w:sz="4"/>
@@ -11429,6 +11655,86 @@
                 <w:szCs w:val="18"/>
               </w:rPr>
               <w:t xml:space="preserve"> (la chiama il database)</w:t>
+            </w:r>
+          </w:p>
+        </w:tc>
+      </w:tr>
+      <w:tr>
+        <w:trPr>
+          <w:cantSplit/>
+        </w:trPr>
+        <w:tc>
+          <w:tcPr>
+            <w:tcW w:type="dxa" w:w="3010"/>
+            <w:tcBorders>
+              <w:top w:val="single" w:color="D9D4C5" w:sz="4"/>
+              <w:left w:val="single" w:color="D9D4C5" w:sz="4"/>
+              <w:bottom w:val="single" w:color="D9D4C5" w:sz="4"/>
+              <w:right w:val="single" w:color="D9D4C5" w:sz="4"/>
+            </w:tcBorders>
+            <w:tcMar>
+              <w:top w:type="dxa" w:w="70"/>
+              <w:left w:type="dxa" w:w="110"/>
+              <w:bottom w:type="dxa" w:w="70"/>
+              <w:right w:type="dxa" w:w="110"/>
+            </w:tcMar>
+            <w:vAlign w:val="center"/>
+          </w:tcPr>
+          <w:p>
+            <w:pPr>
+              <w:spacing w:after="0" w:before="0"/>
+            </w:pPr>
+            <w:r>
+              <w:rPr>
+                <w:rFonts w:ascii="Consolas" w:cs="Consolas" w:eastAsia="Consolas" w:hAnsi="Consolas"/>
+                <w:color w:val="2F5D3A"/>
+                <w:sz w:val="18"/>
+                <w:szCs w:val="18"/>
+              </w:rPr>
+              <w:t xml:space="preserve">notizie</w:t>
+            </w:r>
+          </w:p>
+        </w:tc>
+        <w:tc>
+          <w:tcPr>
+            <w:tcW w:type="dxa" w:w="6628"/>
+            <w:tcBorders>
+              <w:top w:val="single" w:color="D9D4C5" w:sz="4"/>
+              <w:left w:val="single" w:color="D9D4C5" w:sz="4"/>
+              <w:bottom w:val="single" w:color="D9D4C5" w:sz="4"/>
+              <w:right w:val="single" w:color="D9D4C5" w:sz="4"/>
+            </w:tcBorders>
+            <w:tcMar>
+              <w:top w:type="dxa" w:w="70"/>
+              <w:left w:type="dxa" w:w="110"/>
+              <w:bottom w:type="dxa" w:w="70"/>
+              <w:right w:type="dxa" w:w="110"/>
+            </w:tcMar>
+            <w:vAlign w:val="center"/>
+          </w:tcPr>
+          <w:p>
+            <w:pPr>
+              <w:spacing w:after="0" w:before="0"/>
+            </w:pPr>
+            <w:r>
+              <w:rPr>
+                <w:rFonts w:ascii="Arial" w:cs="Arial" w:eastAsia="Arial" w:hAnsi="Arial"/>
+                <w:b/>
+                <w:bCs/>
+                <w:color w:val="1B2118"/>
+                <w:sz w:val="18"/>
+                <w:szCs w:val="18"/>
+              </w:rPr>
+              <w:t xml:space="preserve">Disattivato</w:t>
+            </w:r>
+            <w:r>
+              <w:rPr>
+                <w:rFonts w:ascii="Arial" w:cs="Arial" w:eastAsia="Arial" w:hAnsi="Arial"/>
+                <w:color w:val="1B2118"/>
+                <w:sz w:val="18"/>
+                <w:szCs w:val="18"/>
+              </w:rPr>
+              <w:t xml:space="preserve"> (la chiama il lavoro pianificato ogni 2 ore; si protegge da sola: al massimo una ricerca ogni 100 minuti senza accesso di un Amministratore)</w:t>
             </w:r>
           </w:p>
         </w:tc>
@@ -11611,7 +11917,7 @@
           <w:sz w:val="21"/>
           <w:szCs w:val="21"/>
         </w:rPr>
-        <w:t xml:space="preserve">: chiave della Claude Console per l'assistente virtuale. Deve essere legata a </w:t>
+        <w:t xml:space="preserve">: chiave della Claude Console per l'assistente virtuale e per il filtro delle News. Deve essere legata a </w:t>
       </w:r>
       <w:r>
         <w:rPr>
@@ -12333,7 +12639,7 @@
           <w:sz w:val="21"/>
           <w:szCs w:val="21"/>
         </w:rPr>
-        <w:t xml:space="preserve">Verifiche: accesso come Amministratore principale, con il menu completo (fino ad Audit User) e la scheda Accessi di Audit User che registra l'accesso appena fatto; la pagina /programma mostra gli 8 documenti, la PEC e il soggetto promotore; un utente di prova riceve l'email; l'assistente risponde; i lavori pianificati sono tre:</w:t>
+        <w:t xml:space="preserve">Verifiche: accesso come Amministratore principale, con il menu completo (fino ad Audit User) e la scheda Accessi di Audit User che registra l'accesso appena fatto; la pagina /programma mostra gli 8 documenti, la PEC e il soggetto promotore; un utente di prova riceve l'email; l'assistente risponde; nella pagina News «Aggiorna ora» completa una ricerca; i lavori pianificati sono quattro:</w:t>
       </w:r>
     </w:p>
     <w:p>
@@ -12368,7 +12674,7 @@
           <w:sz w:val="14"/>
           <w:szCs w:val="14"/>
         </w:rPr>
-        <w:t xml:space="preserve">-- attesi: cwp_avvisi_crediti, cwp_notifiche_scadenze, cwp_riprova_email</w:t>
+        <w:t xml:space="preserve">-- attesi: cwp_avvisi_crediti, cwp_notifiche_scadenze, cwp_notizie, cwp_riprova_email</w:t>
       </w:r>
     </w:p>
     <w:p>
@@ -14950,7 +15256,7 @@
         <w:szCs w:val="16"/>
       </w:rPr>
       <w:tab/>
-      <w:t xml:space="preserve">Istruzioni di ripristino · Rev. 1.7 · 21/10/2026</w:t>
+      <w:t xml:space="preserve">Istruzioni di ripristino · Rev. 1.8 · 21/10/2026</w:t>
     </w:r>
   </w:p>
 </w:hdr>
@@ -15015,7 +15321,7 @@
         <w:szCs w:val="16"/>
       </w:rPr>
       <w:tab/>
-      <w:t xml:space="preserve">Istruzioni di ripristino · Rev. 1.7 · 21/10/2026</w:t>
+      <w:t xml:space="preserve">Istruzioni di ripristino · Rev. 1.8 · 21/10/2026</w:t>
     </w:r>
   </w:p>
 </w:hdr>

</xml_diff>

<commit_message>
Documenti rigenerati (Notizie CO2, barra a LED, loghi, ISS-036)
Co-Authored-By: Claude Opus 5.5 <noreply@anthropic.com>
Claude-Session: https://claude.ai/code/session_01E8XCbEeVHWVP3hntUZ6kZ1
</commit_message>
<xml_diff>
--- a/public/documentazione/Istruzioni_Ripristino_Portale_CWP.docx
+++ b/public/documentazione/Istruzioni_Ripristino_Portale_CWP.docx
@@ -302,7 +302,7 @@
                 <w:sz w:val="20"/>
                 <w:szCs w:val="20"/>
               </w:rPr>
-              <w:t xml:space="preserve">Rev. 1.8</w:t>
+              <w:t xml:space="preserve">Rev. 1.9</w:t>
             </w:r>
           </w:p>
         </w:tc>
@@ -719,7 +719,7 @@
                 <w:sz w:val="18"/>
                 <w:szCs w:val="18"/>
               </w:rPr>
-              <w:t xml:space="preserve">1.8</w:t>
+              <w:t xml:space="preserve">1.9</w:t>
             </w:r>
           </w:p>
         </w:tc>
@@ -783,7 +783,7 @@
                 <w:sz w:val="18"/>
                 <w:szCs w:val="18"/>
               </w:rPr>
-              <w:t xml:space="preserve">Script 36 e funzione notizie (Verify JWT disattivato, indirizzo url_notizie, quarto lavoro pianificato).</w:t>
+              <w:t xml:space="preserve">Tramite per Google News delle Notizie CO2.</w:t>
             </w:r>
           </w:p>
         </w:tc>
@@ -853,7 +853,7 @@
                 <w:sz w:val="18"/>
                 <w:szCs w:val="18"/>
               </w:rPr>
-              <w:t xml:space="preserve">1.7</w:t>
+              <w:t xml:space="preserve">1.8</w:t>
             </w:r>
           </w:p>
         </w:tc>
@@ -919,7 +919,7 @@
                 <w:sz w:val="18"/>
                 <w:szCs w:val="18"/>
               </w:rPr>
-              <w:t xml:space="preserve">Backup automatico su Google Drive alle 13 e alle 21 (installazione, contenuto) e ripristino da un backup automatico, provato sul banco locale.</w:t>
+              <w:t xml:space="preserve">Script 36 e funzione notizie (Verify JWT disattivato, indirizzo url_notizie, quarto lavoro pianificato).</w:t>
             </w:r>
           </w:p>
         </w:tc>
@@ -989,7 +989,7 @@
                 <w:sz w:val="18"/>
                 <w:szCs w:val="18"/>
               </w:rPr>
-              <w:t xml:space="preserve">1.6</w:t>
+              <w:t xml:space="preserve">1.7</w:t>
             </w:r>
           </w:p>
         </w:tc>
@@ -1053,7 +1053,7 @@
                 <w:sz w:val="18"/>
                 <w:szCs w:val="18"/>
               </w:rPr>
-              <w:t xml:space="preserve">Ricostruzione del database con gli script da 01 a 35 (simulatore, Amministratore principale, assistente, utenti online, Audit User, avvisi di sicurezza, controlli del collaudo).</w:t>
+              <w:t xml:space="preserve">Backup automatico su Google Drive alle 13 e alle 21 (installazione, contenuto) e ripristino da un backup automatico, provato sul banco locale.</w:t>
             </w:r>
           </w:p>
         </w:tc>
@@ -1123,7 +1123,7 @@
                 <w:sz w:val="18"/>
                 <w:szCs w:val="18"/>
               </w:rPr>
-              <w:t xml:space="preserve">1.5</w:t>
+              <w:t xml:space="preserve">1.6</w:t>
             </w:r>
           </w:p>
         </w:tc>
@@ -1156,7 +1156,7 @@
                 <w:sz w:val="18"/>
                 <w:szCs w:val="18"/>
               </w:rPr>
-              <w:t xml:space="preserve">20/10/2026</w:t>
+              <w:t xml:space="preserve">21/10/2026</w:t>
             </w:r>
           </w:p>
         </w:tc>
@@ -1189,7 +1189,7 @@
                 <w:sz w:val="18"/>
                 <w:szCs w:val="18"/>
               </w:rPr>
-              <w:t xml:space="preserve">Indirizzo Supabase nella Content-Security-Policy di vercel.json; script 01-34.</w:t>
+              <w:t xml:space="preserve">Ricostruzione del database con gli script da 01 a 35 (simulatore, Amministratore principale, assistente, utenti online, Audit User, avvisi di sicurezza, controlli del collaudo).</w:t>
             </w:r>
           </w:p>
         </w:tc>
@@ -1259,7 +1259,7 @@
                 <w:sz w:val="18"/>
                 <w:szCs w:val="18"/>
               </w:rPr>
-              <w:t xml:space="preserve">1.4</w:t>
+              <w:t xml:space="preserve">1.5</w:t>
             </w:r>
           </w:p>
         </w:tc>
@@ -1323,7 +1323,7 @@
                 <w:sz w:val="18"/>
                 <w:szCs w:val="18"/>
               </w:rPr>
-              <w:t xml:space="preserve">Amministratore principale e verifiche dopo il ripristino (Audit User, assistente).</w:t>
+              <w:t xml:space="preserve">Indirizzo Supabase nella Content-Security-Policy di vercel.json; script 01-34.</w:t>
             </w:r>
           </w:p>
         </w:tc>
@@ -1393,7 +1393,7 @@
                 <w:sz w:val="18"/>
                 <w:szCs w:val="18"/>
               </w:rPr>
-              <w:t xml:space="preserve">1.3</w:t>
+              <w:t xml:space="preserve">1.4</w:t>
             </w:r>
           </w:p>
         </w:tc>
@@ -1459,7 +1459,7 @@
                 <w:sz w:val="18"/>
                 <w:szCs w:val="18"/>
               </w:rPr>
-              <w:t xml:space="preserve">Script 01-33.</w:t>
+              <w:t xml:space="preserve">Amministratore principale e verifiche dopo il ripristino (Audit User, assistente).</w:t>
             </w:r>
           </w:p>
         </w:tc>
@@ -1529,7 +1529,7 @@
                 <w:sz w:val="18"/>
                 <w:szCs w:val="18"/>
               </w:rPr>
-              <w:t xml:space="preserve">1.2</w:t>
+              <w:t xml:space="preserve">1.3</w:t>
             </w:r>
           </w:p>
         </w:tc>
@@ -1593,7 +1593,7 @@
                 <w:sz w:val="18"/>
                 <w:szCs w:val="18"/>
               </w:rPr>
-              <w:t xml:space="preserve">Script 01-32.</w:t>
+              <w:t xml:space="preserve">Script 01-33.</w:t>
             </w:r>
           </w:p>
         </w:tc>
@@ -1663,7 +1663,7 @@
                 <w:sz w:val="18"/>
                 <w:szCs w:val="18"/>
               </w:rPr>
-              <w:t xml:space="preserve">1.1</w:t>
+              <w:t xml:space="preserve">1.2</w:t>
             </w:r>
           </w:p>
         </w:tc>
@@ -1696,7 +1696,7 @@
                 <w:sz w:val="18"/>
                 <w:szCs w:val="18"/>
               </w:rPr>
-              <w:t xml:space="preserve">19/10/2026</w:t>
+              <w:t xml:space="preserve">20/10/2026</w:t>
             </w:r>
           </w:p>
         </w:tc>
@@ -1729,7 +1729,7 @@
                 <w:sz w:val="18"/>
                 <w:szCs w:val="18"/>
               </w:rPr>
-              <w:t xml:space="preserve">Funzione assistente e chiave ANTHROPIC_API_KEY; Claude Console tra i servizi; script 01-31.</w:t>
+              <w:t xml:space="preserve">Script 01-32.</w:t>
             </w:r>
           </w:p>
         </w:tc>
@@ -1799,6 +1799,140 @@
                 <w:sz w:val="18"/>
                 <w:szCs w:val="18"/>
               </w:rPr>
+              <w:t xml:space="preserve">1.1</w:t>
+            </w:r>
+          </w:p>
+        </w:tc>
+        <w:tc>
+          <w:tcPr>
+            <w:tcW w:type="dxa" w:w="1300"/>
+            <w:tcBorders>
+              <w:top w:val="single" w:color="D9D4C5" w:sz="4"/>
+              <w:left w:val="single" w:color="D9D4C5" w:sz="4"/>
+              <w:bottom w:val="single" w:color="D9D4C5" w:sz="4"/>
+              <w:right w:val="single" w:color="D9D4C5" w:sz="4"/>
+            </w:tcBorders>
+            <w:tcMar>
+              <w:top w:type="dxa" w:w="70"/>
+              <w:left w:type="dxa" w:w="110"/>
+              <w:bottom w:type="dxa" w:w="70"/>
+              <w:right w:type="dxa" w:w="110"/>
+            </w:tcMar>
+            <w:vAlign w:val="center"/>
+          </w:tcPr>
+          <w:p>
+            <w:pPr>
+              <w:spacing w:after="0" w:before="0"/>
+            </w:pPr>
+            <w:r>
+              <w:rPr>
+                <w:rFonts w:ascii="Arial" w:cs="Arial" w:eastAsia="Arial" w:hAnsi="Arial"/>
+                <w:color w:val="1B2118"/>
+                <w:sz w:val="18"/>
+                <w:szCs w:val="18"/>
+              </w:rPr>
+              <w:t xml:space="preserve">19/10/2026</w:t>
+            </w:r>
+          </w:p>
+        </w:tc>
+        <w:tc>
+          <w:tcPr>
+            <w:tcW w:type="dxa" w:w="5538"/>
+            <w:tcBorders>
+              <w:top w:val="single" w:color="D9D4C5" w:sz="4"/>
+              <w:left w:val="single" w:color="D9D4C5" w:sz="4"/>
+              <w:bottom w:val="single" w:color="D9D4C5" w:sz="4"/>
+              <w:right w:val="single" w:color="D9D4C5" w:sz="4"/>
+            </w:tcBorders>
+            <w:tcMar>
+              <w:top w:type="dxa" w:w="70"/>
+              <w:left w:type="dxa" w:w="110"/>
+              <w:bottom w:type="dxa" w:w="70"/>
+              <w:right w:type="dxa" w:w="110"/>
+            </w:tcMar>
+            <w:vAlign w:val="center"/>
+          </w:tcPr>
+          <w:p>
+            <w:pPr>
+              <w:spacing w:after="0" w:before="0"/>
+            </w:pPr>
+            <w:r>
+              <w:rPr>
+                <w:rFonts w:ascii="Arial" w:cs="Arial" w:eastAsia="Arial" w:hAnsi="Arial"/>
+                <w:color w:val="1B2118"/>
+                <w:sz w:val="18"/>
+                <w:szCs w:val="18"/>
+              </w:rPr>
+              <w:t xml:space="preserve">Funzione assistente e chiave ANTHROPIC_API_KEY; Claude Console tra i servizi; script 01-31.</w:t>
+            </w:r>
+          </w:p>
+        </w:tc>
+        <w:tc>
+          <w:tcPr>
+            <w:tcW w:type="dxa" w:w="2000"/>
+            <w:tcBorders>
+              <w:top w:val="single" w:color="D9D4C5" w:sz="4"/>
+              <w:left w:val="single" w:color="D9D4C5" w:sz="4"/>
+              <w:bottom w:val="single" w:color="D9D4C5" w:sz="4"/>
+              <w:right w:val="single" w:color="D9D4C5" w:sz="4"/>
+            </w:tcBorders>
+            <w:tcMar>
+              <w:top w:type="dxa" w:w="70"/>
+              <w:left w:type="dxa" w:w="110"/>
+              <w:bottom w:type="dxa" w:w="70"/>
+              <w:right w:type="dxa" w:w="110"/>
+            </w:tcMar>
+            <w:vAlign w:val="center"/>
+          </w:tcPr>
+          <w:p>
+            <w:pPr>
+              <w:spacing w:after="0" w:before="0"/>
+            </w:pPr>
+            <w:r>
+              <w:rPr>
+                <w:rFonts w:ascii="Arial" w:cs="Arial" w:eastAsia="Arial" w:hAnsi="Arial"/>
+                <w:color w:val="1B2118"/>
+                <w:sz w:val="18"/>
+                <w:szCs w:val="18"/>
+              </w:rPr>
+              <w:t xml:space="preserve">Fondazione Operate</w:t>
+            </w:r>
+          </w:p>
+        </w:tc>
+      </w:tr>
+      <w:tr>
+        <w:trPr>
+          <w:cantSplit/>
+        </w:trPr>
+        <w:tc>
+          <w:tcPr>
+            <w:tcW w:type="dxa" w:w="800"/>
+            <w:tcBorders>
+              <w:top w:val="single" w:color="D9D4C5" w:sz="4"/>
+              <w:left w:val="single" w:color="D9D4C5" w:sz="4"/>
+              <w:bottom w:val="single" w:color="D9D4C5" w:sz="4"/>
+              <w:right w:val="single" w:color="D9D4C5" w:sz="4"/>
+            </w:tcBorders>
+            <w:shd w:fill="F6F4EE" w:color="auto" w:val="clear"/>
+            <w:tcMar>
+              <w:top w:type="dxa" w:w="70"/>
+              <w:left w:type="dxa" w:w="110"/>
+              <w:bottom w:type="dxa" w:w="70"/>
+              <w:right w:type="dxa" w:w="110"/>
+            </w:tcMar>
+            <w:vAlign w:val="center"/>
+          </w:tcPr>
+          <w:p>
+            <w:pPr>
+              <w:spacing w:after="0" w:before="0"/>
+            </w:pPr>
+            <w:r>
+              <w:rPr>
+                <w:rFonts w:ascii="Arial" w:cs="Arial" w:eastAsia="Arial" w:hAnsi="Arial"/>
+                <w:color w:val="1B2118"/>
+                <w:sz w:val="18"/>
+                <w:szCs w:val="18"/>
+              </w:rPr>
               <w:t xml:space="preserve">1.0</w:t>
             </w:r>
           </w:p>
@@ -1812,6 +1946,7 @@
               <w:bottom w:val="single" w:color="D9D4C5" w:sz="4"/>
               <w:right w:val="single" w:color="D9D4C5" w:sz="4"/>
             </w:tcBorders>
+            <w:shd w:fill="F6F4EE" w:color="auto" w:val="clear"/>
             <w:tcMar>
               <w:top w:type="dxa" w:w="70"/>
               <w:left w:type="dxa" w:w="110"/>
@@ -1844,6 +1979,7 @@
               <w:bottom w:val="single" w:color="D9D4C5" w:sz="4"/>
               <w:right w:val="single" w:color="D9D4C5" w:sz="4"/>
             </w:tcBorders>
+            <w:shd w:fill="F6F4EE" w:color="auto" w:val="clear"/>
             <w:tcMar>
               <w:top w:type="dxa" w:w="70"/>
               <w:left w:type="dxa" w:w="110"/>
@@ -1876,6 +2012,7 @@
               <w:bottom w:val="single" w:color="D9D4C5" w:sz="4"/>
               <w:right w:val="single" w:color="D9D4C5" w:sz="4"/>
             </w:tcBorders>
+            <w:shd w:fill="F6F4EE" w:color="auto" w:val="clear"/>
             <w:tcMar>
               <w:top w:type="dxa" w:w="70"/>
               <w:left w:type="dxa" w:w="110"/>
@@ -1917,7 +2054,7 @@
           <w:sz w:val="20"/>
           <w:szCs w:val="20"/>
         </w:rPr>
-        <w:t xml:space="preserve">Istruzioni alla revisione 1.8 del 21/10/2026. Si aggiornano quando cambiano servizi, piani, script del database, funzioni o chiavi; una copia è dentro ogni archivio di backup e la versione corrente si scarica dall'area Documentazione del portale (solo Amministratori).</w:t>
+        <w:t xml:space="preserve">Istruzioni alla revisione 1.9 del 21/10/2026. Si aggiornano quando cambiano servizi, piani, script del database, funzioni o chiavi; una copia è dentro ogni archivio di backup e la versione corrente si scarica dall'area Documentazione del portale (solo Amministratori).</w:t>
       </w:r>
     </w:p>
     <w:p>
@@ -6913,7 +7050,7 @@
         </w:rPr>
         <w:t xml:space="preserve">: si apre in testo semplice all'indirizzo </w:t>
       </w:r>
-      <w:hyperlink w:history="1" r:id="rId3xf7bywmqsouyhm2aq8sb">
+      <w:hyperlink w:history="1" r:id="rId09m1kooxtpo3smnr8xg_-">
         <w:r>
           <w:rPr>
             <w:rFonts w:ascii="Arial" w:cs="Arial" w:eastAsia="Arial" w:hAnsi="Arial"/>
@@ -10586,7 +10723,7 @@
           <w:sz w:val="21"/>
           <w:szCs w:val="21"/>
         </w:rPr>
-        <w:t xml:space="preserve">gli script dal 28 al 35 aggiungono simulatore, Amministratore principale (29), eliminazione degli utenti mai attivi, assistente, utenti online, Audit User, avvisi di sicurezza (34) e i controlli dei dati chiesti dal collaudo (35) e l'osservatorio News (36); il 35 termina con un conteggio di sola lettura che su un database nuovo vale 0 in tutte le righe;</w:t>
+        <w:t xml:space="preserve">gli script dal 28 al 35 aggiungono simulatore, Amministratore principale (29), eliminazione degli utenti mai attivi, assistente, utenti online, Audit User, avvisi di sicurezza (34) e i controlli dei dati chiesti dal collaudo (35) e l'osservatorio Notizie CO2 (36); il 35 termina con un conteggio di sola lettura che su un database nuovo vale 0 in tutte le righe;</w:t>
       </w:r>
     </w:p>
     <w:p>
@@ -10727,7 +10864,7 @@
           <w:sz w:val="21"/>
           <w:szCs w:val="21"/>
         </w:rPr>
-        <w:t xml:space="preserve">, allo stesso modo, l'indirizzo della funzione delle News:</w:t>
+        <w:t xml:space="preserve">, allo stesso modo, l'indirizzo della funzione delle Notizie CO2:</w:t>
       </w:r>
     </w:p>
     <w:p>
@@ -10773,6 +10910,61 @@
           <w:szCs w:val="14"/>
         </w:rPr>
         <w:t xml:space="preserve"> where chiave = 'url_notizie';</w:t>
+      </w:r>
+    </w:p>
+    <w:p>
+      <w:pPr>
+        <w:pStyle w:val="ListParagraph"/>
+        <w:numPr>
+          <w:ilvl w:val="0"/>
+          <w:numId w:val="2"/>
+        </w:numPr>
+        <w:spacing w:after="70" w:line="290"/>
+      </w:pPr>
+      <w:r>
+        <w:rPr>
+          <w:rFonts w:ascii="Arial" w:cs="Arial" w:eastAsia="Arial" w:hAnsi="Arial"/>
+          <w:color w:val="1B2118"/>
+          <w:sz w:val="21"/>
+          <w:szCs w:val="21"/>
+        </w:rPr>
+        <w:t xml:space="preserve">l'impostazione </w:t>
+      </w:r>
+      <w:r>
+        <w:rPr>
+          <w:rFonts w:ascii="Consolas" w:cs="Consolas" w:eastAsia="Consolas" w:hAnsi="Consolas"/>
+          <w:color w:val="2F5D3A"/>
+          <w:sz w:val="21"/>
+          <w:szCs w:val="21"/>
+        </w:rPr>
+        <w:t xml:space="preserve">url_proxy_google_news</w:t>
+      </w:r>
+      <w:r>
+        <w:rPr>
+          <w:rFonts w:ascii="Arial" w:cs="Arial" w:eastAsia="Arial" w:hAnsi="Arial"/>
+          <w:color w:val="1B2118"/>
+          <w:sz w:val="21"/>
+          <w:szCs w:val="21"/>
+        </w:rPr>
+        <w:t xml:space="preserve"> (tramite per Google News) torna con i dati del backup; il programma «Notizie CO2 – Google News» resta in Google Apps Script nell'account di Luca e non va reinstallato (</w:t>
+      </w:r>
+      <w:r>
+        <w:rPr>
+          <w:rFonts w:ascii="Consolas" w:cs="Consolas" w:eastAsia="Consolas" w:hAnsi="Consolas"/>
+          <w:color w:val="2F5D3A"/>
+          <w:sz w:val="21"/>
+          <w:szCs w:val="21"/>
+        </w:rPr>
+        <w:t xml:space="preserve">strumenti/notizie/ProxyGoogleNews.gs</w:t>
+      </w:r>
+      <w:r>
+        <w:rPr>
+          <w:rFonts w:ascii="Arial" w:cs="Arial" w:eastAsia="Arial" w:hAnsi="Arial"/>
+          <w:color w:val="1B2118"/>
+          <w:sz w:val="21"/>
+          <w:szCs w:val="21"/>
+        </w:rPr>
+        <w:t xml:space="preserve">, se servisse).</w:t>
       </w:r>
     </w:p>
     <w:p>
@@ -11917,7 +12109,7 @@
           <w:sz w:val="21"/>
           <w:szCs w:val="21"/>
         </w:rPr>
-        <w:t xml:space="preserve">: chiave della Claude Console per l'assistente virtuale e per il filtro delle News. Deve essere legata a </w:t>
+        <w:t xml:space="preserve">: chiave della Claude Console per l'assistente virtuale e per il filtro delle Notizie CO2. Deve essere legata a </w:t>
       </w:r>
       <w:r>
         <w:rPr>
@@ -12639,7 +12831,7 @@
           <w:sz w:val="21"/>
           <w:szCs w:val="21"/>
         </w:rPr>
-        <w:t xml:space="preserve">Verifiche: accesso come Amministratore principale, con il menu completo (fino ad Audit User) e la scheda Accessi di Audit User che registra l'accesso appena fatto; la pagina /programma mostra gli 8 documenti, la PEC e il soggetto promotore; un utente di prova riceve l'email; l'assistente risponde; nella pagina News «Aggiorna ora» completa una ricerca; i lavori pianificati sono quattro:</w:t>
+        <w:t xml:space="preserve">Verifiche: accesso come Amministratore principale, con il menu completo (fino ad Audit User) e la scheda Accessi di Audit User che registra l'accesso appena fatto; la pagina /programma mostra gli 8 documenti, la PEC e il soggetto promotore; un utente di prova riceve l'email; l'assistente risponde; nella pagina Notizie CO2 «Aggiorna ora» completa una ricerca; i lavori pianificati sono quattro:</w:t>
       </w:r>
     </w:p>
     <w:p>
@@ -15256,7 +15448,7 @@
         <w:szCs w:val="16"/>
       </w:rPr>
       <w:tab/>
-      <w:t xml:space="preserve">Istruzioni di ripristino · Rev. 1.8 · 21/10/2026</w:t>
+      <w:t xml:space="preserve">Istruzioni di ripristino · Rev. 1.9 · 21/10/2026</w:t>
     </w:r>
   </w:p>
 </w:hdr>
@@ -15321,7 +15513,7 @@
         <w:szCs w:val="16"/>
       </w:rPr>
       <w:tab/>
-      <w:t xml:space="preserve">Istruzioni di ripristino · Rev. 1.8 · 21/10/2026</w:t>
+      <w:t xml:space="preserve">Istruzioni di ripristino · Rev. 1.9 · 21/10/2026</w:t>
     </w:r>
   </w:p>
 </w:hdr>

</xml_diff>

<commit_message>
Notizie CO2: pallino verde nel menu per le notizie nuove (script 37)
Co-Authored-By: Claude Opus 5.5 <noreply@anthropic.com>
Claude-Session: https://claude.ai/code/session_01E8XCbEeVHWVP3hntUZ6kZ1
</commit_message>
<xml_diff>
--- a/public/documentazione/Istruzioni_Ripristino_Portale_CWP.docx
+++ b/public/documentazione/Istruzioni_Ripristino_Portale_CWP.docx
@@ -783,7 +783,7 @@
                 <w:sz w:val="18"/>
                 <w:szCs w:val="18"/>
               </w:rPr>
-              <w:t xml:space="preserve">Tramite per Google News delle Notizie CO2.</w:t>
+              <w:t xml:space="preserve">Tramite per Google News delle Notizie CO2. Script 37.</w:t>
             </w:r>
           </w:p>
         </w:tc>
@@ -3579,7 +3579,7 @@
                 <w:sz w:val="18"/>
                 <w:szCs w:val="18"/>
               </w:rPr>
-              <w:t xml:space="preserve">Tutto il codice, gli script del database (01-36), le funzioni del server, i manuali e la loro storia</w:t>
+              <w:t xml:space="preserve">Tutto il codice, gli script del database (01-37), le funzioni del server, i manuali e la loro storia</w:t>
             </w:r>
           </w:p>
         </w:tc>
@@ -6514,7 +6514,7 @@
                 <w:sz w:val="18"/>
                 <w:szCs w:val="18"/>
               </w:rPr>
-              <w:t xml:space="preserve">ZIP del codice da GitHub (ramo main): portale, script del database 01-36, funzioni del server, manuali, strumenti di ripristino; </w:t>
+              <w:t xml:space="preserve">ZIP del codice da GitHub (ramo main): portale, script del database 01-37, funzioni del server, manuali, strumenti di ripristino; </w:t>
             </w:r>
             <w:r>
               <w:rPr>
@@ -7050,7 +7050,7 @@
         </w:rPr>
         <w:t xml:space="preserve">: si apre in testo semplice all'indirizzo </w:t>
       </w:r>
-      <w:hyperlink w:history="1" r:id="rId09m1kooxtpo3smnr8xg_-">
+      <w:hyperlink w:history="1" r:id="rIdeou6ddjyxxgspp-nwbb_e">
         <w:r>
           <w:rPr>
             <w:rFonts w:ascii="Arial" w:cs="Arial" w:eastAsia="Arial" w:hAnsi="Arial"/>
@@ -7882,7 +7882,7 @@
           <w:sz w:val="21"/>
           <w:szCs w:val="21"/>
         </w:rPr>
-        <w:t xml:space="preserve"> ed esecuzione degli script 01-36, come nel capitolo «Supabase: ricostruzione da zero», passi 1 e 2.</w:t>
+        <w:t xml:space="preserve"> ed esecuzione degli script 01-37, come nel capitolo «Supabase: ricostruzione da zero», passi 1 e 2.</w:t>
       </w:r>
     </w:p>
     <w:p>
@@ -10434,7 +10434,7 @@
           <w:sz w:val="21"/>
           <w:szCs w:val="21"/>
         </w:rPr>
-        <w:t xml:space="preserve">36_notizie.sql</w:t>
+        <w:t xml:space="preserve">37_notizie_viste.sql</w:t>
       </w:r>
       <w:r>
         <w:rPr>
@@ -10723,7 +10723,7 @@
           <w:sz w:val="21"/>
           <w:szCs w:val="21"/>
         </w:rPr>
-        <w:t xml:space="preserve">gli script dal 28 al 35 aggiungono simulatore, Amministratore principale (29), eliminazione degli utenti mai attivi, assistente, utenti online, Audit User, avvisi di sicurezza (34) e i controlli dei dati chiesti dal collaudo (35) e l'osservatorio Notizie CO2 (36); il 35 termina con un conteggio di sola lettura che su un database nuovo vale 0 in tutte le righe;</w:t>
+        <w:t xml:space="preserve">gli script dal 28 al 35 aggiungono simulatore, Amministratore principale (29), eliminazione degli utenti mai attivi, assistente, utenti online, Audit User, avvisi di sicurezza (34) e i controlli dei dati chiesti dal collaudo (35) e l'osservatorio Notizie CO2 (36, 37 per il pallino delle notizie nuove); il 35 termina con un conteggio di sola lettura che su un database nuovo vale 0 in tutte le righe;</w:t>
       </w:r>
     </w:p>
     <w:p>

</xml_diff>

<commit_message>
Notizie CO2: siti di notizie ambientali al posto di Google News (in attesa dell'OK di Luca, non rilasciato)
Co-Authored-By: Claude Opus 5.5 <noreply@anthropic.com>
Claude-Session: https://claude.ai/code/session_01E8XCbEeVHWVP3hntUZ6kZ1
</commit_message>
<xml_diff>
--- a/public/documentazione/Istruzioni_Ripristino_Portale_CWP.docx
+++ b/public/documentazione/Istruzioni_Ripristino_Portale_CWP.docx
@@ -783,7 +783,7 @@
                 <w:sz w:val="18"/>
                 <w:szCs w:val="18"/>
               </w:rPr>
-              <w:t xml:space="preserve">Tramite per Google News delle Notizie CO2. Script 37.</w:t>
+              <w:t xml:space="preserve">Tramite per Google News delle Notizie CO2. Script 37. Tolto il tramite per Google News.</w:t>
             </w:r>
           </w:p>
         </w:tc>
@@ -2106,7 +2106,7 @@
             <w:szCs w:val="22"/>
           </w:rPr>
           <w:tab/>
-          <w:t xml:space="preserve">4</w:t>
+          <w:t xml:space="preserve"/>
         </w:r>
       </w:hyperlink>
     </w:p>
@@ -2135,7 +2135,7 @@
             <w:szCs w:val="22"/>
           </w:rPr>
           <w:tab/>
-          <w:t xml:space="preserve">5</w:t>
+          <w:t xml:space="preserve"/>
         </w:r>
       </w:hyperlink>
     </w:p>
@@ -2164,7 +2164,7 @@
             <w:szCs w:val="22"/>
           </w:rPr>
           <w:tab/>
-          <w:t xml:space="preserve">6</w:t>
+          <w:t xml:space="preserve"/>
         </w:r>
       </w:hyperlink>
     </w:p>
@@ -2193,7 +2193,7 @@
             <w:szCs w:val="22"/>
           </w:rPr>
           <w:tab/>
-          <w:t xml:space="preserve">8</w:t>
+          <w:t xml:space="preserve"/>
         </w:r>
       </w:hyperlink>
     </w:p>
@@ -2222,7 +2222,7 @@
             <w:szCs w:val="22"/>
           </w:rPr>
           <w:tab/>
-          <w:t xml:space="preserve">10</w:t>
+          <w:t xml:space="preserve"/>
         </w:r>
       </w:hyperlink>
     </w:p>
@@ -2251,7 +2251,7 @@
             <w:szCs w:val="22"/>
           </w:rPr>
           <w:tab/>
-          <w:t xml:space="preserve">11</w:t>
+          <w:t xml:space="preserve"/>
         </w:r>
       </w:hyperlink>
     </w:p>
@@ -2280,7 +2280,7 @@
             <w:szCs w:val="22"/>
           </w:rPr>
           <w:tab/>
-          <w:t xml:space="preserve">12</w:t>
+          <w:t xml:space="preserve"/>
         </w:r>
       </w:hyperlink>
     </w:p>
@@ -2309,7 +2309,7 @@
             <w:szCs w:val="22"/>
           </w:rPr>
           <w:tab/>
-          <w:t xml:space="preserve">13</w:t>
+          <w:t xml:space="preserve"/>
         </w:r>
       </w:hyperlink>
     </w:p>
@@ -2338,7 +2338,7 @@
             <w:szCs w:val="22"/>
           </w:rPr>
           <w:tab/>
-          <w:t xml:space="preserve">14</w:t>
+          <w:t xml:space="preserve"/>
         </w:r>
       </w:hyperlink>
     </w:p>
@@ -2367,7 +2367,7 @@
             <w:szCs w:val="22"/>
           </w:rPr>
           <w:tab/>
-          <w:t xml:space="preserve">15</w:t>
+          <w:t xml:space="preserve"/>
         </w:r>
       </w:hyperlink>
     </w:p>
@@ -2396,7 +2396,7 @@
             <w:szCs w:val="22"/>
           </w:rPr>
           <w:tab/>
-          <w:t xml:space="preserve">18</w:t>
+          <w:t xml:space="preserve"/>
         </w:r>
       </w:hyperlink>
     </w:p>
@@ -2425,7 +2425,7 @@
             <w:szCs w:val="22"/>
           </w:rPr>
           <w:tab/>
-          <w:t xml:space="preserve">19</w:t>
+          <w:t xml:space="preserve"/>
         </w:r>
       </w:hyperlink>
     </w:p>
@@ -2454,7 +2454,7 @@
             <w:szCs w:val="22"/>
           </w:rPr>
           <w:tab/>
-          <w:t xml:space="preserve">20</w:t>
+          <w:t xml:space="preserve"/>
         </w:r>
       </w:hyperlink>
     </w:p>
@@ -7050,7 +7050,7 @@
         </w:rPr>
         <w:t xml:space="preserve">: si apre in testo semplice all'indirizzo </w:t>
       </w:r>
-      <w:hyperlink w:history="1" r:id="rIdeou6ddjyxxgspp-nwbb_e">
+      <w:hyperlink w:history="1" r:id="rIds4cc1ea3mwladxe7ueiad">
         <w:r>
           <w:rPr>
             <w:rFonts w:ascii="Arial" w:cs="Arial" w:eastAsia="Arial" w:hAnsi="Arial"/>
@@ -10910,61 +10910,6 @@
           <w:szCs w:val="14"/>
         </w:rPr>
         <w:t xml:space="preserve"> where chiave = 'url_notizie';</w:t>
-      </w:r>
-    </w:p>
-    <w:p>
-      <w:pPr>
-        <w:pStyle w:val="ListParagraph"/>
-        <w:numPr>
-          <w:ilvl w:val="0"/>
-          <w:numId w:val="2"/>
-        </w:numPr>
-        <w:spacing w:after="70" w:line="290"/>
-      </w:pPr>
-      <w:r>
-        <w:rPr>
-          <w:rFonts w:ascii="Arial" w:cs="Arial" w:eastAsia="Arial" w:hAnsi="Arial"/>
-          <w:color w:val="1B2118"/>
-          <w:sz w:val="21"/>
-          <w:szCs w:val="21"/>
-        </w:rPr>
-        <w:t xml:space="preserve">l'impostazione </w:t>
-      </w:r>
-      <w:r>
-        <w:rPr>
-          <w:rFonts w:ascii="Consolas" w:cs="Consolas" w:eastAsia="Consolas" w:hAnsi="Consolas"/>
-          <w:color w:val="2F5D3A"/>
-          <w:sz w:val="21"/>
-          <w:szCs w:val="21"/>
-        </w:rPr>
-        <w:t xml:space="preserve">url_proxy_google_news</w:t>
-      </w:r>
-      <w:r>
-        <w:rPr>
-          <w:rFonts w:ascii="Arial" w:cs="Arial" w:eastAsia="Arial" w:hAnsi="Arial"/>
-          <w:color w:val="1B2118"/>
-          <w:sz w:val="21"/>
-          <w:szCs w:val="21"/>
-        </w:rPr>
-        <w:t xml:space="preserve"> (tramite per Google News) torna con i dati del backup; il programma «Notizie CO2 – Google News» resta in Google Apps Script nell'account di Luca e non va reinstallato (</w:t>
-      </w:r>
-      <w:r>
-        <w:rPr>
-          <w:rFonts w:ascii="Consolas" w:cs="Consolas" w:eastAsia="Consolas" w:hAnsi="Consolas"/>
-          <w:color w:val="2F5D3A"/>
-          <w:sz w:val="21"/>
-          <w:szCs w:val="21"/>
-        </w:rPr>
-        <w:t xml:space="preserve">strumenti/notizie/ProxyGoogleNews.gs</w:t>
-      </w:r>
-      <w:r>
-        <w:rPr>
-          <w:rFonts w:ascii="Arial" w:cs="Arial" w:eastAsia="Arial" w:hAnsi="Arial"/>
-          <w:color w:val="1B2118"/>
-          <w:sz w:val="21"/>
-          <w:szCs w:val="21"/>
-        </w:rPr>
-        <w:t xml:space="preserve">, se servisse).</w:t>
       </w:r>
     </w:p>
     <w:p>

</xml_diff>

<commit_message>
Notizie CO2: rilascio dei siti di notizie ambientali (Google News tolto), documenti rigenerati
Co-Authored-By: Claude Opus 5.5 <noreply@anthropic.com>
Claude-Session: https://claude.ai/code/session_01E8XCbEeVHWVP3hntUZ6kZ1
</commit_message>
<xml_diff>
--- a/public/documentazione/Istruzioni_Ripristino_Portale_CWP.docx
+++ b/public/documentazione/Istruzioni_Ripristino_Portale_CWP.docx
@@ -783,7 +783,7 @@
                 <w:sz w:val="18"/>
                 <w:szCs w:val="18"/>
               </w:rPr>
-              <w:t xml:space="preserve">Tramite per Google News delle Notizie CO2. Script 37. Tolto il tramite per Google News.</w:t>
+              <w:t xml:space="preserve">Tramite per Google News delle Notizie CO2. Script 37. Tolto il tramite per Google News. Tolto il tramite per Google News.</w:t>
             </w:r>
           </w:p>
         </w:tc>
@@ -2106,7 +2106,7 @@
             <w:szCs w:val="22"/>
           </w:rPr>
           <w:tab/>
-          <w:t xml:space="preserve"/>
+          <w:t xml:space="preserve">4</w:t>
         </w:r>
       </w:hyperlink>
     </w:p>
@@ -2135,7 +2135,7 @@
             <w:szCs w:val="22"/>
           </w:rPr>
           <w:tab/>
-          <w:t xml:space="preserve"/>
+          <w:t xml:space="preserve">5</w:t>
         </w:r>
       </w:hyperlink>
     </w:p>
@@ -2164,7 +2164,7 @@
             <w:szCs w:val="22"/>
           </w:rPr>
           <w:tab/>
-          <w:t xml:space="preserve"/>
+          <w:t xml:space="preserve">6</w:t>
         </w:r>
       </w:hyperlink>
     </w:p>
@@ -2193,7 +2193,7 @@
             <w:szCs w:val="22"/>
           </w:rPr>
           <w:tab/>
-          <w:t xml:space="preserve"/>
+          <w:t xml:space="preserve">8</w:t>
         </w:r>
       </w:hyperlink>
     </w:p>
@@ -2222,7 +2222,7 @@
             <w:szCs w:val="22"/>
           </w:rPr>
           <w:tab/>
-          <w:t xml:space="preserve"/>
+          <w:t xml:space="preserve">10</w:t>
         </w:r>
       </w:hyperlink>
     </w:p>
@@ -2251,7 +2251,7 @@
             <w:szCs w:val="22"/>
           </w:rPr>
           <w:tab/>
-          <w:t xml:space="preserve"/>
+          <w:t xml:space="preserve">11</w:t>
         </w:r>
       </w:hyperlink>
     </w:p>
@@ -2280,7 +2280,7 @@
             <w:szCs w:val="22"/>
           </w:rPr>
           <w:tab/>
-          <w:t xml:space="preserve"/>
+          <w:t xml:space="preserve">12</w:t>
         </w:r>
       </w:hyperlink>
     </w:p>
@@ -2309,7 +2309,7 @@
             <w:szCs w:val="22"/>
           </w:rPr>
           <w:tab/>
-          <w:t xml:space="preserve"/>
+          <w:t xml:space="preserve">13</w:t>
         </w:r>
       </w:hyperlink>
     </w:p>
@@ -2338,7 +2338,7 @@
             <w:szCs w:val="22"/>
           </w:rPr>
           <w:tab/>
-          <w:t xml:space="preserve"/>
+          <w:t xml:space="preserve">14</w:t>
         </w:r>
       </w:hyperlink>
     </w:p>
@@ -2367,7 +2367,7 @@
             <w:szCs w:val="22"/>
           </w:rPr>
           <w:tab/>
-          <w:t xml:space="preserve"/>
+          <w:t xml:space="preserve">15</w:t>
         </w:r>
       </w:hyperlink>
     </w:p>
@@ -2396,7 +2396,7 @@
             <w:szCs w:val="22"/>
           </w:rPr>
           <w:tab/>
-          <w:t xml:space="preserve"/>
+          <w:t xml:space="preserve">18</w:t>
         </w:r>
       </w:hyperlink>
     </w:p>
@@ -2425,7 +2425,7 @@
             <w:szCs w:val="22"/>
           </w:rPr>
           <w:tab/>
-          <w:t xml:space="preserve"/>
+          <w:t xml:space="preserve">19</w:t>
         </w:r>
       </w:hyperlink>
     </w:p>
@@ -2454,7 +2454,7 @@
             <w:szCs w:val="22"/>
           </w:rPr>
           <w:tab/>
-          <w:t xml:space="preserve"/>
+          <w:t xml:space="preserve">20</w:t>
         </w:r>
       </w:hyperlink>
     </w:p>
@@ -7050,7 +7050,7 @@
         </w:rPr>
         <w:t xml:space="preserve">: si apre in testo semplice all'indirizzo </w:t>
       </w:r>
-      <w:hyperlink w:history="1" r:id="rIds4cc1ea3mwladxe7ueiad">
+      <w:hyperlink w:history="1" r:id="rIduwow8kybtglefeahgmvku">
         <w:r>
           <w:rPr>
             <w:rFonts w:ascii="Arial" w:cs="Arial" w:eastAsia="Arial" w:hAnsi="Arial"/>

</xml_diff>

<commit_message>
Documenti rigenerati (backup dal Mac)
Co-Authored-By: Claude Opus 5.5 <noreply@anthropic.com>
Claude-Session: https://claude.ai/code/session_01E8XCbEeVHWVP3hntUZ6kZ1
</commit_message>
<xml_diff>
--- a/public/documentazione/Istruzioni_Ripristino_Portale_CWP.docx
+++ b/public/documentazione/Istruzioni_Ripristino_Portale_CWP.docx
@@ -302,7 +302,7 @@
                 <w:sz w:val="20"/>
                 <w:szCs w:val="20"/>
               </w:rPr>
-              <w:t xml:space="preserve">Rev. 1.9</w:t>
+              <w:t xml:space="preserve">Rev. 2.0</w:t>
             </w:r>
           </w:p>
         </w:tc>
@@ -719,7 +719,7 @@
                 <w:sz w:val="18"/>
                 <w:szCs w:val="18"/>
               </w:rPr>
-              <w:t xml:space="preserve">1.9</w:t>
+              <w:t xml:space="preserve">2.0</w:t>
             </w:r>
           </w:p>
         </w:tc>
@@ -783,7 +783,7 @@
                 <w:sz w:val="18"/>
                 <w:szCs w:val="18"/>
               </w:rPr>
-              <w:t xml:space="preserve">Tramite per Google News delle Notizie CO2. Script 37. Tolto il tramite per Google News. Tolto il tramite per Google News.</w:t>
+              <w:t xml:space="preserve">Backup giornaliero alle 20:00 dal Mac in Cwp › backup › data (Google blocca Apps Script); backup manuale; script 38.</w:t>
             </w:r>
           </w:p>
         </w:tc>
@@ -853,7 +853,7 @@
                 <w:sz w:val="18"/>
                 <w:szCs w:val="18"/>
               </w:rPr>
-              <w:t xml:space="preserve">1.8</w:t>
+              <w:t xml:space="preserve">1.9</w:t>
             </w:r>
           </w:p>
         </w:tc>
@@ -919,7 +919,7 @@
                 <w:sz w:val="18"/>
                 <w:szCs w:val="18"/>
               </w:rPr>
-              <w:t xml:space="preserve">Script 36 e funzione notizie (Verify JWT disattivato, indirizzo url_notizie, quarto lavoro pianificato).</w:t>
+              <w:t xml:space="preserve">Tramite per Google News delle Notizie CO2. Script 37. Tolto il tramite per Google News. Tolto il tramite per Google News.</w:t>
             </w:r>
           </w:p>
         </w:tc>
@@ -989,7 +989,7 @@
                 <w:sz w:val="18"/>
                 <w:szCs w:val="18"/>
               </w:rPr>
-              <w:t xml:space="preserve">1.7</w:t>
+              <w:t xml:space="preserve">1.8</w:t>
             </w:r>
           </w:p>
         </w:tc>
@@ -1053,7 +1053,7 @@
                 <w:sz w:val="18"/>
                 <w:szCs w:val="18"/>
               </w:rPr>
-              <w:t xml:space="preserve">Backup automatico su Google Drive alle 13 e alle 21 (installazione, contenuto) e ripristino da un backup automatico, provato sul banco locale.</w:t>
+              <w:t xml:space="preserve">Script 36 e funzione notizie (Verify JWT disattivato, indirizzo url_notizie, quarto lavoro pianificato).</w:t>
             </w:r>
           </w:p>
         </w:tc>
@@ -1123,7 +1123,7 @@
                 <w:sz w:val="18"/>
                 <w:szCs w:val="18"/>
               </w:rPr>
-              <w:t xml:space="preserve">1.6</w:t>
+              <w:t xml:space="preserve">1.7</w:t>
             </w:r>
           </w:p>
         </w:tc>
@@ -1189,7 +1189,7 @@
                 <w:sz w:val="18"/>
                 <w:szCs w:val="18"/>
               </w:rPr>
-              <w:t xml:space="preserve">Ricostruzione del database con gli script da 01 a 35 (simulatore, Amministratore principale, assistente, utenti online, Audit User, avvisi di sicurezza, controlli del collaudo).</w:t>
+              <w:t xml:space="preserve">Backup automatico su Google Drive alle 13 e alle 21 (installazione, contenuto) e ripristino da un backup automatico, provato sul banco locale.</w:t>
             </w:r>
           </w:p>
         </w:tc>
@@ -1259,7 +1259,7 @@
                 <w:sz w:val="18"/>
                 <w:szCs w:val="18"/>
               </w:rPr>
-              <w:t xml:space="preserve">1.5</w:t>
+              <w:t xml:space="preserve">1.6</w:t>
             </w:r>
           </w:p>
         </w:tc>
@@ -1291,7 +1291,7 @@
                 <w:sz w:val="18"/>
                 <w:szCs w:val="18"/>
               </w:rPr>
-              <w:t xml:space="preserve">20/10/2026</w:t>
+              <w:t xml:space="preserve">21/10/2026</w:t>
             </w:r>
           </w:p>
         </w:tc>
@@ -1323,7 +1323,7 @@
                 <w:sz w:val="18"/>
                 <w:szCs w:val="18"/>
               </w:rPr>
-              <w:t xml:space="preserve">Indirizzo Supabase nella Content-Security-Policy di vercel.json; script 01-34.</w:t>
+              <w:t xml:space="preserve">Ricostruzione del database con gli script da 01 a 35 (simulatore, Amministratore principale, assistente, utenti online, Audit User, avvisi di sicurezza, controlli del collaudo).</w:t>
             </w:r>
           </w:p>
         </w:tc>
@@ -1393,7 +1393,7 @@
                 <w:sz w:val="18"/>
                 <w:szCs w:val="18"/>
               </w:rPr>
-              <w:t xml:space="preserve">1.4</w:t>
+              <w:t xml:space="preserve">1.5</w:t>
             </w:r>
           </w:p>
         </w:tc>
@@ -1459,7 +1459,7 @@
                 <w:sz w:val="18"/>
                 <w:szCs w:val="18"/>
               </w:rPr>
-              <w:t xml:space="preserve">Amministratore principale e verifiche dopo il ripristino (Audit User, assistente).</w:t>
+              <w:t xml:space="preserve">Indirizzo Supabase nella Content-Security-Policy di vercel.json; script 01-34.</w:t>
             </w:r>
           </w:p>
         </w:tc>
@@ -1529,7 +1529,7 @@
                 <w:sz w:val="18"/>
                 <w:szCs w:val="18"/>
               </w:rPr>
-              <w:t xml:space="preserve">1.3</w:t>
+              <w:t xml:space="preserve">1.4</w:t>
             </w:r>
           </w:p>
         </w:tc>
@@ -1593,7 +1593,7 @@
                 <w:sz w:val="18"/>
                 <w:szCs w:val="18"/>
               </w:rPr>
-              <w:t xml:space="preserve">Script 01-33.</w:t>
+              <w:t xml:space="preserve">Amministratore principale e verifiche dopo il ripristino (Audit User, assistente).</w:t>
             </w:r>
           </w:p>
         </w:tc>
@@ -1663,7 +1663,7 @@
                 <w:sz w:val="18"/>
                 <w:szCs w:val="18"/>
               </w:rPr>
-              <w:t xml:space="preserve">1.2</w:t>
+              <w:t xml:space="preserve">1.3</w:t>
             </w:r>
           </w:p>
         </w:tc>
@@ -1729,7 +1729,7 @@
                 <w:sz w:val="18"/>
                 <w:szCs w:val="18"/>
               </w:rPr>
-              <w:t xml:space="preserve">Script 01-32.</w:t>
+              <w:t xml:space="preserve">Script 01-33.</w:t>
             </w:r>
           </w:p>
         </w:tc>
@@ -1799,7 +1799,7 @@
                 <w:sz w:val="18"/>
                 <w:szCs w:val="18"/>
               </w:rPr>
-              <w:t xml:space="preserve">1.1</w:t>
+              <w:t xml:space="preserve">1.2</w:t>
             </w:r>
           </w:p>
         </w:tc>
@@ -1831,7 +1831,7 @@
                 <w:sz w:val="18"/>
                 <w:szCs w:val="18"/>
               </w:rPr>
-              <w:t xml:space="preserve">19/10/2026</w:t>
+              <w:t xml:space="preserve">20/10/2026</w:t>
             </w:r>
           </w:p>
         </w:tc>
@@ -1863,7 +1863,7 @@
                 <w:sz w:val="18"/>
                 <w:szCs w:val="18"/>
               </w:rPr>
-              <w:t xml:space="preserve">Funzione assistente e chiave ANTHROPIC_API_KEY; Claude Console tra i servizi; script 01-31.</w:t>
+              <w:t xml:space="preserve">Script 01-32.</w:t>
             </w:r>
           </w:p>
         </w:tc>
@@ -1933,6 +1933,142 @@
                 <w:sz w:val="18"/>
                 <w:szCs w:val="18"/>
               </w:rPr>
+              <w:t xml:space="preserve">1.1</w:t>
+            </w:r>
+          </w:p>
+        </w:tc>
+        <w:tc>
+          <w:tcPr>
+            <w:tcW w:type="dxa" w:w="1300"/>
+            <w:tcBorders>
+              <w:top w:val="single" w:color="D9D4C5" w:sz="4"/>
+              <w:left w:val="single" w:color="D9D4C5" w:sz="4"/>
+              <w:bottom w:val="single" w:color="D9D4C5" w:sz="4"/>
+              <w:right w:val="single" w:color="D9D4C5" w:sz="4"/>
+            </w:tcBorders>
+            <w:shd w:fill="F6F4EE" w:color="auto" w:val="clear"/>
+            <w:tcMar>
+              <w:top w:type="dxa" w:w="70"/>
+              <w:left w:type="dxa" w:w="110"/>
+              <w:bottom w:type="dxa" w:w="70"/>
+              <w:right w:type="dxa" w:w="110"/>
+            </w:tcMar>
+            <w:vAlign w:val="center"/>
+          </w:tcPr>
+          <w:p>
+            <w:pPr>
+              <w:spacing w:after="0" w:before="0"/>
+            </w:pPr>
+            <w:r>
+              <w:rPr>
+                <w:rFonts w:ascii="Arial" w:cs="Arial" w:eastAsia="Arial" w:hAnsi="Arial"/>
+                <w:color w:val="1B2118"/>
+                <w:sz w:val="18"/>
+                <w:szCs w:val="18"/>
+              </w:rPr>
+              <w:t xml:space="preserve">19/10/2026</w:t>
+            </w:r>
+          </w:p>
+        </w:tc>
+        <w:tc>
+          <w:tcPr>
+            <w:tcW w:type="dxa" w:w="5538"/>
+            <w:tcBorders>
+              <w:top w:val="single" w:color="D9D4C5" w:sz="4"/>
+              <w:left w:val="single" w:color="D9D4C5" w:sz="4"/>
+              <w:bottom w:val="single" w:color="D9D4C5" w:sz="4"/>
+              <w:right w:val="single" w:color="D9D4C5" w:sz="4"/>
+            </w:tcBorders>
+            <w:shd w:fill="F6F4EE" w:color="auto" w:val="clear"/>
+            <w:tcMar>
+              <w:top w:type="dxa" w:w="70"/>
+              <w:left w:type="dxa" w:w="110"/>
+              <w:bottom w:type="dxa" w:w="70"/>
+              <w:right w:type="dxa" w:w="110"/>
+            </w:tcMar>
+            <w:vAlign w:val="center"/>
+          </w:tcPr>
+          <w:p>
+            <w:pPr>
+              <w:spacing w:after="0" w:before="0"/>
+            </w:pPr>
+            <w:r>
+              <w:rPr>
+                <w:rFonts w:ascii="Arial" w:cs="Arial" w:eastAsia="Arial" w:hAnsi="Arial"/>
+                <w:color w:val="1B2118"/>
+                <w:sz w:val="18"/>
+                <w:szCs w:val="18"/>
+              </w:rPr>
+              <w:t xml:space="preserve">Funzione assistente e chiave ANTHROPIC_API_KEY; Claude Console tra i servizi; script 01-31.</w:t>
+            </w:r>
+          </w:p>
+        </w:tc>
+        <w:tc>
+          <w:tcPr>
+            <w:tcW w:type="dxa" w:w="2000"/>
+            <w:tcBorders>
+              <w:top w:val="single" w:color="D9D4C5" w:sz="4"/>
+              <w:left w:val="single" w:color="D9D4C5" w:sz="4"/>
+              <w:bottom w:val="single" w:color="D9D4C5" w:sz="4"/>
+              <w:right w:val="single" w:color="D9D4C5" w:sz="4"/>
+            </w:tcBorders>
+            <w:shd w:fill="F6F4EE" w:color="auto" w:val="clear"/>
+            <w:tcMar>
+              <w:top w:type="dxa" w:w="70"/>
+              <w:left w:type="dxa" w:w="110"/>
+              <w:bottom w:type="dxa" w:w="70"/>
+              <w:right w:type="dxa" w:w="110"/>
+            </w:tcMar>
+            <w:vAlign w:val="center"/>
+          </w:tcPr>
+          <w:p>
+            <w:pPr>
+              <w:spacing w:after="0" w:before="0"/>
+            </w:pPr>
+            <w:r>
+              <w:rPr>
+                <w:rFonts w:ascii="Arial" w:cs="Arial" w:eastAsia="Arial" w:hAnsi="Arial"/>
+                <w:color w:val="1B2118"/>
+                <w:sz w:val="18"/>
+                <w:szCs w:val="18"/>
+              </w:rPr>
+              <w:t xml:space="preserve">Fondazione Operate</w:t>
+            </w:r>
+          </w:p>
+        </w:tc>
+      </w:tr>
+      <w:tr>
+        <w:trPr>
+          <w:cantSplit/>
+        </w:trPr>
+        <w:tc>
+          <w:tcPr>
+            <w:tcW w:type="dxa" w:w="800"/>
+            <w:tcBorders>
+              <w:top w:val="single" w:color="D9D4C5" w:sz="4"/>
+              <w:left w:val="single" w:color="D9D4C5" w:sz="4"/>
+              <w:bottom w:val="single" w:color="D9D4C5" w:sz="4"/>
+              <w:right w:val="single" w:color="D9D4C5" w:sz="4"/>
+            </w:tcBorders>
+            <w:tcMar>
+              <w:top w:type="dxa" w:w="70"/>
+              <w:left w:type="dxa" w:w="110"/>
+              <w:bottom w:type="dxa" w:w="70"/>
+              <w:right w:type="dxa" w:w="110"/>
+            </w:tcMar>
+            <w:vAlign w:val="center"/>
+          </w:tcPr>
+          <w:p>
+            <w:pPr>
+              <w:spacing w:after="0" w:before="0"/>
+            </w:pPr>
+            <w:r>
+              <w:rPr>
+                <w:rFonts w:ascii="Arial" w:cs="Arial" w:eastAsia="Arial" w:hAnsi="Arial"/>
+                <w:color w:val="1B2118"/>
+                <w:sz w:val="18"/>
+                <w:szCs w:val="18"/>
+              </w:rPr>
               <w:t xml:space="preserve">1.0</w:t>
             </w:r>
           </w:p>
@@ -1946,7 +2082,6 @@
               <w:bottom w:val="single" w:color="D9D4C5" w:sz="4"/>
               <w:right w:val="single" w:color="D9D4C5" w:sz="4"/>
             </w:tcBorders>
-            <w:shd w:fill="F6F4EE" w:color="auto" w:val="clear"/>
             <w:tcMar>
               <w:top w:type="dxa" w:w="70"/>
               <w:left w:type="dxa" w:w="110"/>
@@ -1979,7 +2114,6 @@
               <w:bottom w:val="single" w:color="D9D4C5" w:sz="4"/>
               <w:right w:val="single" w:color="D9D4C5" w:sz="4"/>
             </w:tcBorders>
-            <w:shd w:fill="F6F4EE" w:color="auto" w:val="clear"/>
             <w:tcMar>
               <w:top w:type="dxa" w:w="70"/>
               <w:left w:type="dxa" w:w="110"/>
@@ -2012,7 +2146,6 @@
               <w:bottom w:val="single" w:color="D9D4C5" w:sz="4"/>
               <w:right w:val="single" w:color="D9D4C5" w:sz="4"/>
             </w:tcBorders>
-            <w:shd w:fill="F6F4EE" w:color="auto" w:val="clear"/>
             <w:tcMar>
               <w:top w:type="dxa" w:w="70"/>
               <w:left w:type="dxa" w:w="110"/>
@@ -2054,7 +2187,7 @@
           <w:sz w:val="20"/>
           <w:szCs w:val="20"/>
         </w:rPr>
-        <w:t xml:space="preserve">Istruzioni alla revisione 1.9 del 21/10/2026. Si aggiornano quando cambiano servizi, piani, script del database, funzioni o chiavi; una copia è dentro ogni archivio di backup e la versione corrente si scarica dall'area Documentazione del portale (solo Amministratori).</w:t>
+        <w:t xml:space="preserve">Istruzioni alla revisione 2.0 del 21/10/2026. Si aggiornano quando cambiano servizi, piani, script del database, funzioni o chiavi; una copia è dentro ogni archivio di backup e la versione corrente si scarica dall'area Documentazione del portale (solo Amministratori).</w:t>
       </w:r>
     </w:p>
     <w:p>
@@ -2222,7 +2355,7 @@
             <w:szCs w:val="22"/>
           </w:rPr>
           <w:tab/>
-          <w:t xml:space="preserve">10</w:t>
+          <w:t xml:space="preserve">11</w:t>
         </w:r>
       </w:hyperlink>
     </w:p>
@@ -2251,7 +2384,7 @@
             <w:szCs w:val="22"/>
           </w:rPr>
           <w:tab/>
-          <w:t xml:space="preserve">11</w:t>
+          <w:t xml:space="preserve">12</w:t>
         </w:r>
       </w:hyperlink>
     </w:p>
@@ -2280,7 +2413,7 @@
             <w:szCs w:val="22"/>
           </w:rPr>
           <w:tab/>
-          <w:t xml:space="preserve">12</w:t>
+          <w:t xml:space="preserve">13</w:t>
         </w:r>
       </w:hyperlink>
     </w:p>
@@ -2309,7 +2442,7 @@
             <w:szCs w:val="22"/>
           </w:rPr>
           <w:tab/>
-          <w:t xml:space="preserve">13</w:t>
+          <w:t xml:space="preserve">14</w:t>
         </w:r>
       </w:hyperlink>
     </w:p>
@@ -2338,7 +2471,7 @@
             <w:szCs w:val="22"/>
           </w:rPr>
           <w:tab/>
-          <w:t xml:space="preserve">14</w:t>
+          <w:t xml:space="preserve">15</w:t>
         </w:r>
       </w:hyperlink>
     </w:p>
@@ -2367,7 +2500,7 @@
             <w:szCs w:val="22"/>
           </w:rPr>
           <w:tab/>
-          <w:t xml:space="preserve">15</w:t>
+          <w:t xml:space="preserve">16</w:t>
         </w:r>
       </w:hyperlink>
     </w:p>
@@ -2396,7 +2529,7 @@
             <w:szCs w:val="22"/>
           </w:rPr>
           <w:tab/>
-          <w:t xml:space="preserve">18</w:t>
+          <w:t xml:space="preserve">19</w:t>
         </w:r>
       </w:hyperlink>
     </w:p>
@@ -2425,7 +2558,7 @@
             <w:szCs w:val="22"/>
           </w:rPr>
           <w:tab/>
-          <w:t xml:space="preserve">19</w:t>
+          <w:t xml:space="preserve">20</w:t>
         </w:r>
       </w:hyperlink>
     </w:p>
@@ -2454,7 +2587,7 @@
             <w:szCs w:val="22"/>
           </w:rPr>
           <w:tab/>
-          <w:t xml:space="preserve">20</w:t>
+          <w:t xml:space="preserve">21</w:t>
         </w:r>
       </w:hyperlink>
     </w:p>
@@ -3579,7 +3712,7 @@
                 <w:sz w:val="18"/>
                 <w:szCs w:val="18"/>
               </w:rPr>
-              <w:t xml:space="preserve">Tutto il codice, gli script del database (01-37), le funzioni del server, i manuali e la loro storia</w:t>
+              <w:t xml:space="preserve">Tutto il codice, gli script del database (01-38), le funzioni del server, i manuali e la loro storia</w:t>
             </w:r>
           </w:p>
         </w:tc>
@@ -4639,9 +4772,9 @@
         <w:tblLayout w:type="fixed"/>
       </w:tblPr>
       <w:tblGrid>
-        <w:gridCol w:w="2217"/>
-        <w:gridCol w:w="3938"/>
-        <w:gridCol w:w="3483"/>
+        <w:gridCol w:w="2082"/>
+        <w:gridCol w:w="3778"/>
+        <w:gridCol w:w="3778"/>
       </w:tblGrid>
       <w:tr>
         <w:trPr>
@@ -4649,7 +4782,7 @@
         </w:trPr>
         <w:tc>
           <w:tcPr>
-            <w:tcW w:type="dxa" w:w="2217"/>
+            <w:tcW w:type="dxa" w:w="2082"/>
             <w:tcBorders>
               <w:top w:val="single" w:color="D9D4C5" w:sz="4"/>
               <w:left w:val="single" w:color="D9D4C5" w:sz="4"/>
@@ -4684,7 +4817,7 @@
         </w:tc>
         <w:tc>
           <w:tcPr>
-            <w:tcW w:type="dxa" w:w="3938"/>
+            <w:tcW w:type="dxa" w:w="3778"/>
             <w:tcBorders>
               <w:top w:val="single" w:color="D9D4C5" w:sz="4"/>
               <w:left w:val="single" w:color="D9D4C5" w:sz="4"/>
@@ -4719,7 +4852,7 @@
         </w:tc>
         <w:tc>
           <w:tcPr>
-            <w:tcW w:type="dxa" w:w="3483"/>
+            <w:tcW w:type="dxa" w:w="3778"/>
             <w:tcBorders>
               <w:top w:val="single" w:color="D9D4C5" w:sz="4"/>
               <w:left w:val="single" w:color="D9D4C5" w:sz="4"/>
@@ -4759,7 +4892,7 @@
         </w:trPr>
         <w:tc>
           <w:tcPr>
-            <w:tcW w:type="dxa" w:w="2217"/>
+            <w:tcW w:type="dxa" w:w="2082"/>
             <w:tcBorders>
               <w:top w:val="single" w:color="D9D4C5" w:sz="4"/>
               <w:left w:val="single" w:color="D9D4C5" w:sz="4"/>
@@ -4787,13 +4920,13 @@
                 <w:sz w:val="18"/>
                 <w:szCs w:val="18"/>
               </w:rPr>
-              <w:t xml:space="preserve">Ogni giorno alle 13 e alle 21</w:t>
-            </w:r>
-          </w:p>
-        </w:tc>
-        <w:tc>
-          <w:tcPr>
-            <w:tcW w:type="dxa" w:w="3938"/>
+              <w:t xml:space="preserve">Ogni giorno alle 20</w:t>
+            </w:r>
+          </w:p>
+        </w:tc>
+        <w:tc>
+          <w:tcPr>
+            <w:tcW w:type="dxa" w:w="3778"/>
             <w:tcBorders>
               <w:top w:val="single" w:color="D9D4C5" w:sz="4"/>
               <w:left w:val="single" w:color="D9D4C5" w:sz="4"/>
@@ -4830,39 +4963,39 @@
                 <w:sz w:val="18"/>
                 <w:szCs w:val="18"/>
               </w:rPr>
-              <w:t xml:space="preserve"> (cartella «Cwp»: codice, database, file, configurazione; una cartella per backup)</w:t>
-            </w:r>
-          </w:p>
-        </w:tc>
-        <w:tc>
-          <w:tcPr>
-            <w:tcW w:type="dxa" w:w="3483"/>
-            <w:tcBorders>
-              <w:top w:val="single" w:color="D9D4C5" w:sz="4"/>
-              <w:left w:val="single" w:color="D9D4C5" w:sz="4"/>
-              <w:bottom w:val="single" w:color="D9D4C5" w:sz="4"/>
-              <w:right w:val="single" w:color="D9D4C5" w:sz="4"/>
-            </w:tcBorders>
-            <w:tcMar>
-              <w:top w:type="dxa" w:w="70"/>
-              <w:left w:type="dxa" w:w="110"/>
-              <w:bottom w:type="dxa" w:w="70"/>
-              <w:right w:type="dxa" w:w="110"/>
-            </w:tcMar>
-            <w:vAlign w:val="center"/>
-          </w:tcPr>
-          <w:p>
-            <w:pPr>
-              <w:spacing w:after="0" w:before="0"/>
-            </w:pPr>
-            <w:r>
-              <w:rPr>
-                <w:rFonts w:ascii="Arial" w:cs="Arial" w:eastAsia="Arial" w:hAnsi="Arial"/>
-                <w:color w:val="1B2118"/>
-                <w:sz w:val="18"/>
-                <w:szCs w:val="18"/>
-              </w:rPr>
-              <w:t xml:space="preserve">Google Apps Script di Luca, da solo (capitolo «Backup automatico su Google Drive»)</w:t>
+              <w:t xml:space="preserve"> (Cwp › backup › data: codice, database, file, istruzioni)</w:t>
+            </w:r>
+          </w:p>
+        </w:tc>
+        <w:tc>
+          <w:tcPr>
+            <w:tcW w:type="dxa" w:w="3778"/>
+            <w:tcBorders>
+              <w:top w:val="single" w:color="D9D4C5" w:sz="4"/>
+              <w:left w:val="single" w:color="D9D4C5" w:sz="4"/>
+              <w:bottom w:val="single" w:color="D9D4C5" w:sz="4"/>
+              <w:right w:val="single" w:color="D9D4C5" w:sz="4"/>
+            </w:tcBorders>
+            <w:tcMar>
+              <w:top w:type="dxa" w:w="70"/>
+              <w:left w:type="dxa" w:w="110"/>
+              <w:bottom w:type="dxa" w:w="70"/>
+              <w:right w:type="dxa" w:w="110"/>
+            </w:tcMar>
+            <w:vAlign w:val="center"/>
+          </w:tcPr>
+          <w:p>
+            <w:pPr>
+              <w:spacing w:after="0" w:before="0"/>
+            </w:pPr>
+            <w:r>
+              <w:rPr>
+                <w:rFonts w:ascii="Arial" w:cs="Arial" w:eastAsia="Arial" w:hAnsi="Arial"/>
+                <w:color w:val="1B2118"/>
+                <w:sz w:val="18"/>
+                <w:szCs w:val="18"/>
+              </w:rPr>
+              <w:t xml:space="preserve">Il Mac di Luca, da solo, con Google Drive per desktop (capitolo «Backup automatico su Google Drive»)</w:t>
             </w:r>
           </w:p>
         </w:tc>
@@ -4873,7 +5006,7 @@
         </w:trPr>
         <w:tc>
           <w:tcPr>
-            <w:tcW w:type="dxa" w:w="2217"/>
+            <w:tcW w:type="dxa" w:w="2082"/>
             <w:tcBorders>
               <w:top w:val="single" w:color="D9D4C5" w:sz="4"/>
               <w:left w:val="single" w:color="D9D4C5" w:sz="4"/>
@@ -4906,7 +5039,7 @@
         </w:tc>
         <w:tc>
           <w:tcPr>
-            <w:tcW w:type="dxa" w:w="3938"/>
+            <w:tcW w:type="dxa" w:w="3778"/>
             <w:tcBorders>
               <w:top w:val="single" w:color="D9D4C5" w:sz="4"/>
               <w:left w:val="single" w:color="D9D4C5" w:sz="4"/>
@@ -4933,13 +5066,13 @@
                 <w:sz w:val="18"/>
                 <w:szCs w:val="18"/>
               </w:rPr>
-              <w:t xml:space="preserve">Togliere a mano le cartelle di backup vecchie (tenerne almeno 14, cioè una settimana)</w:t>
-            </w:r>
-          </w:p>
-        </w:tc>
-        <w:tc>
-          <w:tcPr>
-            <w:tcW w:type="dxa" w:w="3483"/>
+              <w:t xml:space="preserve">Togliere a mano le cartelle di backup vecchie (tenerne almeno 7)</w:t>
+            </w:r>
+          </w:p>
+        </w:tc>
+        <w:tc>
+          <w:tcPr>
+            <w:tcW w:type="dxa" w:w="3778"/>
             <w:tcBorders>
               <w:top w:val="single" w:color="D9D4C5" w:sz="4"/>
               <w:left w:val="single" w:color="D9D4C5" w:sz="4"/>
@@ -4977,7 +5110,7 @@
         </w:trPr>
         <w:tc>
           <w:tcPr>
-            <w:tcW w:type="dxa" w:w="2217"/>
+            <w:tcW w:type="dxa" w:w="2082"/>
             <w:tcBorders>
               <w:top w:val="single" w:color="D9D4C5" w:sz="4"/>
               <w:left w:val="single" w:color="D9D4C5" w:sz="4"/>
@@ -5009,7 +5142,7 @@
         </w:tc>
         <w:tc>
           <w:tcPr>
-            <w:tcW w:type="dxa" w:w="3938"/>
+            <w:tcW w:type="dxa" w:w="3778"/>
             <w:tcBorders>
               <w:top w:val="single" w:color="D9D4C5" w:sz="4"/>
               <w:left w:val="single" w:color="D9D4C5" w:sz="4"/>
@@ -5059,7 +5192,7 @@
         </w:tc>
         <w:tc>
           <w:tcPr>
-            <w:tcW w:type="dxa" w:w="3483"/>
+            <w:tcW w:type="dxa" w:w="3778"/>
             <w:tcBorders>
               <w:top w:val="single" w:color="D9D4C5" w:sz="4"/>
               <w:left w:val="single" w:color="D9D4C5" w:sz="4"/>
@@ -5096,7 +5229,7 @@
         </w:trPr>
         <w:tc>
           <w:tcPr>
-            <w:tcW w:type="dxa" w:w="2217"/>
+            <w:tcW w:type="dxa" w:w="2082"/>
             <w:tcBorders>
               <w:top w:val="single" w:color="D9D4C5" w:sz="4"/>
               <w:left w:val="single" w:color="D9D4C5" w:sz="4"/>
@@ -5129,7 +5262,7 @@
         </w:tc>
         <w:tc>
           <w:tcPr>
-            <w:tcW w:type="dxa" w:w="3938"/>
+            <w:tcW w:type="dxa" w:w="3778"/>
             <w:tcBorders>
               <w:top w:val="single" w:color="D9D4C5" w:sz="4"/>
               <w:left w:val="single" w:color="D9D4C5" w:sz="4"/>
@@ -5162,7 +5295,7 @@
         </w:tc>
         <w:tc>
           <w:tcPr>
-            <w:tcW w:type="dxa" w:w="3483"/>
+            <w:tcW w:type="dxa" w:w="3778"/>
             <w:tcBorders>
               <w:top w:val="single" w:color="D9D4C5" w:sz="4"/>
               <w:left w:val="single" w:color="D9D4C5" w:sz="4"/>
@@ -5200,7 +5333,7 @@
         </w:trPr>
         <w:tc>
           <w:tcPr>
-            <w:tcW w:type="dxa" w:w="2217"/>
+            <w:tcW w:type="dxa" w:w="2082"/>
             <w:tcBorders>
               <w:top w:val="single" w:color="D9D4C5" w:sz="4"/>
               <w:left w:val="single" w:color="D9D4C5" w:sz="4"/>
@@ -5232,7 +5365,7 @@
         </w:tc>
         <w:tc>
           <w:tcPr>
-            <w:tcW w:type="dxa" w:w="3938"/>
+            <w:tcW w:type="dxa" w:w="3778"/>
             <w:tcBorders>
               <w:top w:val="single" w:color="D9D4C5" w:sz="4"/>
               <w:left w:val="single" w:color="D9D4C5" w:sz="4"/>
@@ -5264,7 +5397,7 @@
         </w:tc>
         <w:tc>
           <w:tcPr>
-            <w:tcW w:type="dxa" w:w="3483"/>
+            <w:tcW w:type="dxa" w:w="3778"/>
             <w:tcBorders>
               <w:top w:val="single" w:color="D9D4C5" w:sz="4"/>
               <w:left w:val="single" w:color="D9D4C5" w:sz="4"/>
@@ -5301,7 +5434,7 @@
         </w:trPr>
         <w:tc>
           <w:tcPr>
-            <w:tcW w:type="dxa" w:w="2217"/>
+            <w:tcW w:type="dxa" w:w="2082"/>
             <w:tcBorders>
               <w:top w:val="single" w:color="D9D4C5" w:sz="4"/>
               <w:left w:val="single" w:color="D9D4C5" w:sz="4"/>
@@ -5334,7 +5467,7 @@
         </w:tc>
         <w:tc>
           <w:tcPr>
-            <w:tcW w:type="dxa" w:w="3938"/>
+            <w:tcW w:type="dxa" w:w="3778"/>
             <w:tcBorders>
               <w:top w:val="single" w:color="D9D4C5" w:sz="4"/>
               <w:left w:val="single" w:color="D9D4C5" w:sz="4"/>
@@ -5367,7 +5500,7 @@
         </w:tc>
         <w:tc>
           <w:tcPr>
-            <w:tcW w:type="dxa" w:w="3483"/>
+            <w:tcW w:type="dxa" w:w="3778"/>
             <w:tcBorders>
               <w:top w:val="single" w:color="D9D4C5" w:sz="4"/>
               <w:left w:val="single" w:color="D9D4C5" w:sz="4"/>
@@ -5405,7 +5538,7 @@
         </w:trPr>
         <w:tc>
           <w:tcPr>
-            <w:tcW w:type="dxa" w:w="2217"/>
+            <w:tcW w:type="dxa" w:w="2082"/>
             <w:tcBorders>
               <w:top w:val="single" w:color="D9D4C5" w:sz="4"/>
               <w:left w:val="single" w:color="D9D4C5" w:sz="4"/>
@@ -5437,7 +5570,7 @@
         </w:tc>
         <w:tc>
           <w:tcPr>
-            <w:tcW w:type="dxa" w:w="3938"/>
+            <w:tcW w:type="dxa" w:w="3778"/>
             <w:tcBorders>
               <w:top w:val="single" w:color="D9D4C5" w:sz="4"/>
               <w:left w:val="single" w:color="D9D4C5" w:sz="4"/>
@@ -5469,7 +5602,7 @@
         </w:tc>
         <w:tc>
           <w:tcPr>
-            <w:tcW w:type="dxa" w:w="3483"/>
+            <w:tcW w:type="dxa" w:w="3778"/>
             <w:tcBorders>
               <w:top w:val="single" w:color="D9D4C5" w:sz="4"/>
               <w:left w:val="single" w:color="D9D4C5" w:sz="4"/>
@@ -6275,7 +6408,7 @@
           <w:sz w:val="21"/>
           <w:szCs w:val="21"/>
         </w:rPr>
-        <w:t xml:space="preserve">Dal 21/10/2026 (richiesta di Luca) un programma in </w:t>
+        <w:t xml:space="preserve">Dal 21/10/2026 (richiesta di Luca) </w:t>
       </w:r>
       <w:r>
         <w:rPr>
@@ -6286,16 +6419,16 @@
           <w:sz w:val="21"/>
           <w:szCs w:val="21"/>
         </w:rPr>
-        <w:t xml:space="preserve">Google Apps Script</w:t>
-      </w:r>
-      <w:r>
-        <w:rPr>
-          <w:rFonts w:ascii="Arial" w:cs="Arial" w:eastAsia="Arial" w:hAnsi="Arial"/>
-          <w:color w:val="1B2118"/>
-          <w:sz w:val="21"/>
-          <w:szCs w:val="21"/>
-        </w:rPr>
-        <w:t xml:space="preserve">, nell'account Google di Luca, fa </w:t>
+        <w:t xml:space="preserve">ogni giorno alle 20:00</w:t>
+      </w:r>
+      <w:r>
+        <w:rPr>
+          <w:rFonts w:ascii="Arial" w:cs="Arial" w:eastAsia="Arial" w:hAnsi="Arial"/>
+          <w:color w:val="1B2118"/>
+          <w:sz w:val="21"/>
+          <w:szCs w:val="21"/>
+        </w:rPr>
+        <w:t xml:space="preserve"> il Mac di Luca fa un backup completo del portale nella cartella </w:t>
       </w:r>
       <w:r>
         <w:rPr>
@@ -6306,16 +6439,16 @@
           <w:sz w:val="21"/>
           <w:szCs w:val="21"/>
         </w:rPr>
-        <w:t xml:space="preserve">ogni giorno due backup completi</w:t>
-      </w:r>
-      <w:r>
-        <w:rPr>
-          <w:rFonts w:ascii="Arial" w:cs="Arial" w:eastAsia="Arial" w:hAnsi="Arial"/>
-          <w:color w:val="1B2118"/>
-          <w:sz w:val="21"/>
-          <w:szCs w:val="21"/>
-        </w:rPr>
-        <w:t xml:space="preserve">, tra le 13 e le 14 e tra le 21 e le 22 (ora italiana). Ogni backup è una </w:t>
+        <w:t xml:space="preserve">Cwp › backup</w:t>
+      </w:r>
+      <w:r>
+        <w:rPr>
+          <w:rFonts w:ascii="Arial" w:cs="Arial" w:eastAsia="Arial" w:hAnsi="Arial"/>
+          <w:color w:val="1B2118"/>
+          <w:sz w:val="21"/>
+          <w:szCs w:val="21"/>
+        </w:rPr>
+        <w:t xml:space="preserve"> del suo Google Drive, in una </w:t>
       </w:r>
       <w:r>
         <w:rPr>
@@ -6326,17 +6459,58 @@
           <w:sz w:val="21"/>
           <w:szCs w:val="21"/>
         </w:rPr>
-        <w:t xml:space="preserve">nuova cartella</w:t>
-      </w:r>
-      <w:r>
-        <w:rPr>
-          <w:rFonts w:ascii="Arial" w:cs="Arial" w:eastAsia="Arial" w:hAnsi="Arial"/>
-          <w:color w:val="1B2118"/>
-          <w:sz w:val="21"/>
-          <w:szCs w:val="21"/>
-        </w:rPr>
-        <w:t xml:space="preserve"> dentro la cartella </w:t>
-      </w:r>
+        <w:t xml:space="preserve">sottocartella con la data</w:t>
+      </w:r>
+      <w:r>
+        <w:rPr>
+          <w:rFonts w:ascii="Arial" w:cs="Arial" w:eastAsia="Arial" w:hAnsi="Arial"/>
+          <w:color w:val="1B2118"/>
+          <w:sz w:val="21"/>
+          <w:szCs w:val="21"/>
+        </w:rPr>
+        <w:t xml:space="preserve"> (</w:t>
+      </w:r>
+      <w:r>
+        <w:rPr>
+          <w:rFonts w:ascii="Consolas" w:cs="Consolas" w:eastAsia="Consolas" w:hAnsi="Consolas"/>
+          <w:color w:val="2F5D3A"/>
+          <w:sz w:val="21"/>
+          <w:szCs w:val="21"/>
+        </w:rPr>
+        <w:t xml:space="preserve">aaaa-mm-gg</w:t>
+      </w:r>
+      <w:r>
+        <w:rPr>
+          <w:rFonts w:ascii="Arial" w:cs="Arial" w:eastAsia="Arial" w:hAnsi="Arial"/>
+          <w:color w:val="1B2118"/>
+          <w:sz w:val="21"/>
+          <w:szCs w:val="21"/>
+        </w:rPr>
+        <w:t xml:space="preserve">; se nello stesso giorno ce n'è già una, </w:t>
+      </w:r>
+      <w:r>
+        <w:rPr>
+          <w:rFonts w:ascii="Consolas" w:cs="Consolas" w:eastAsia="Consolas" w:hAnsi="Consolas"/>
+          <w:color w:val="2F5D3A"/>
+          <w:sz w:val="21"/>
+          <w:szCs w:val="21"/>
+        </w:rPr>
+        <w:t xml:space="preserve">aaaa-mm-gg_hhmm</w:t>
+      </w:r>
+      <w:r>
+        <w:rPr>
+          <w:rFonts w:ascii="Arial" w:cs="Arial" w:eastAsia="Arial" w:hAnsi="Arial"/>
+          <w:color w:val="1B2118"/>
+          <w:sz w:val="21"/>
+          <w:szCs w:val="21"/>
+        </w:rPr>
+        <w:t xml:space="preserve">). Le cartelle vecchie non si cancellano da sole: le toglie Luca a mano.</w:t>
+      </w:r>
+    </w:p>
+    <w:p>
+      <w:pPr>
+        <w:spacing w:after="140" w:line="300"/>
+      </w:pPr>
       <w:r>
         <w:rPr>
           <w:rFonts w:ascii="Arial" w:cs="Arial" w:eastAsia="Arial" w:hAnsi="Arial"/>
@@ -6346,16 +6520,36 @@
           <w:sz w:val="21"/>
           <w:szCs w:val="21"/>
         </w:rPr>
-        <w:t xml:space="preserve">Cwp</w:t>
-      </w:r>
-      <w:r>
-        <w:rPr>
-          <w:rFonts w:ascii="Arial" w:cs="Arial" w:eastAsia="Arial" w:hAnsi="Arial"/>
-          <w:color w:val="1B2118"/>
-          <w:sz w:val="21"/>
-          <w:szCs w:val="21"/>
-        </w:rPr>
-        <w:t xml:space="preserve"> del Drive di Luca, con il nome «Backup_CWP_aaaa-mm-gg_hhmm». Le cartelle vecchie non si cancellano da sole: le toglie Luca a mano.</w:t>
+        <w:t xml:space="preserve">Perché sul Mac.</w:t>
+      </w:r>
+      <w:r>
+        <w:rPr>
+          <w:rFonts w:ascii="Arial" w:cs="Arial" w:eastAsia="Arial" w:hAnsi="Arial"/>
+          <w:color w:val="1B2118"/>
+          <w:sz w:val="21"/>
+          <w:szCs w:val="21"/>
+        </w:rPr>
+        <w:t xml:space="preserve"> Google blocca i programmi personali in Apps Script sull'account di Luca («Questa app è bloccata»), quindi nessun servizio esterno può scrivere nel suo Drive. L'app </w:t>
+      </w:r>
+      <w:r>
+        <w:rPr>
+          <w:rFonts w:ascii="Arial" w:cs="Arial" w:eastAsia="Arial" w:hAnsi="Arial"/>
+          <w:b/>
+          <w:bCs/>
+          <w:color w:val="1B2118"/>
+          <w:sz w:val="21"/>
+          <w:szCs w:val="21"/>
+        </w:rPr>
+        <w:t xml:space="preserve">Google Drive per desktop</w:t>
+      </w:r>
+      <w:r>
+        <w:rPr>
+          <w:rFonts w:ascii="Arial" w:cs="Arial" w:eastAsia="Arial" w:hAnsi="Arial"/>
+          <w:color w:val="1B2118"/>
+          <w:sz w:val="21"/>
+          <w:szCs w:val="21"/>
+        </w:rPr>
+        <w:t xml:space="preserve">, che è di Google, sincronizza invece la cartella Cwp del Mac: il backup scrive lì e Drive lo carica. Se alle 20:00 il Mac è spento o in stop, il backup parte appena si riaccende.</w:t>
       </w:r>
     </w:p>
     <w:tbl>
@@ -6372,8 +6566,8 @@
         <w:tblLayout w:type="fixed"/>
       </w:tblPr>
       <w:tblGrid>
-        <w:gridCol w:w="3779"/>
-        <w:gridCol w:w="5859"/>
+        <w:gridCol w:w="3213"/>
+        <w:gridCol w:w="6425"/>
       </w:tblGrid>
       <w:tr>
         <w:trPr>
@@ -6381,7 +6575,7 @@
         </w:trPr>
         <w:tc>
           <w:tcPr>
-            <w:tcW w:type="dxa" w:w="3779"/>
+            <w:tcW w:type="dxa" w:w="3213"/>
             <w:tcBorders>
               <w:top w:val="single" w:color="D9D4C5" w:sz="4"/>
               <w:left w:val="single" w:color="D9D4C5" w:sz="4"/>
@@ -6410,13 +6604,13 @@
                 <w:sz w:val="18"/>
                 <w:szCs w:val="18"/>
               </w:rPr>
-              <w:t xml:space="preserve">Cartella</w:t>
-            </w:r>
-          </w:p>
-        </w:tc>
-        <w:tc>
-          <w:tcPr>
-            <w:tcW w:type="dxa" w:w="5859"/>
+              <w:t xml:space="preserve">Contenuto</w:t>
+            </w:r>
+          </w:p>
+        </w:tc>
+        <w:tc>
+          <w:tcPr>
+            <w:tcW w:type="dxa" w:w="6425"/>
             <w:tcBorders>
               <w:top w:val="single" w:color="D9D4C5" w:sz="4"/>
               <w:left w:val="single" w:color="D9D4C5" w:sz="4"/>
@@ -6445,7 +6639,7 @@
                 <w:sz w:val="18"/>
                 <w:szCs w:val="18"/>
               </w:rPr>
-              <w:t xml:space="preserve">Contenuto</w:t>
+              <w:t xml:space="preserve">Descrizione</w:t>
             </w:r>
           </w:p>
         </w:tc>
@@ -6456,7 +6650,7 @@
         </w:trPr>
         <w:tc>
           <w:tcPr>
-            <w:tcW w:type="dxa" w:w="3779"/>
+            <w:tcW w:type="dxa" w:w="3213"/>
             <w:tcBorders>
               <w:top w:val="single" w:color="D9D4C5" w:sz="4"/>
               <w:left w:val="single" w:color="D9D4C5" w:sz="4"/>
@@ -6482,39 +6676,59 @@
                 <w:sz w:val="18"/>
                 <w:szCs w:val="18"/>
               </w:rPr>
-              <w:t xml:space="preserve">1_codice</w:t>
-            </w:r>
-          </w:p>
-        </w:tc>
-        <w:tc>
-          <w:tcPr>
-            <w:tcW w:type="dxa" w:w="5859"/>
-            <w:tcBorders>
-              <w:top w:val="single" w:color="D9D4C5" w:sz="4"/>
-              <w:left w:val="single" w:color="D9D4C5" w:sz="4"/>
-              <w:bottom w:val="single" w:color="D9D4C5" w:sz="4"/>
-              <w:right w:val="single" w:color="D9D4C5" w:sz="4"/>
-            </w:tcBorders>
-            <w:tcMar>
-              <w:top w:type="dxa" w:w="70"/>
-              <w:left w:type="dxa" w:w="110"/>
-              <w:bottom w:type="dxa" w:w="70"/>
-              <w:right w:type="dxa" w:w="110"/>
-            </w:tcMar>
-            <w:vAlign w:val="center"/>
-          </w:tcPr>
-          <w:p>
-            <w:pPr>
-              <w:spacing w:after="0" w:before="0"/>
-            </w:pPr>
-            <w:r>
-              <w:rPr>
-                <w:rFonts w:ascii="Arial" w:cs="Arial" w:eastAsia="Arial" w:hAnsi="Arial"/>
-                <w:color w:val="1B2118"/>
-                <w:sz w:val="18"/>
-                <w:szCs w:val="18"/>
-              </w:rPr>
-              <w:t xml:space="preserve">ZIP del codice da GitHub (ramo main): portale, script del database 01-37, funzioni del server, manuali, strumenti di ripristino; </w:t>
+              <w:t xml:space="preserve">database_completo.json</w:t>
+            </w:r>
+          </w:p>
+        </w:tc>
+        <w:tc>
+          <w:tcPr>
+            <w:tcW w:type="dxa" w:w="6425"/>
+            <w:tcBorders>
+              <w:top w:val="single" w:color="D9D4C5" w:sz="4"/>
+              <w:left w:val="single" w:color="D9D4C5" w:sz="4"/>
+              <w:bottom w:val="single" w:color="D9D4C5" w:sz="4"/>
+              <w:right w:val="single" w:color="D9D4C5" w:sz="4"/>
+            </w:tcBorders>
+            <w:tcMar>
+              <w:top w:type="dxa" w:w="70"/>
+              <w:left w:type="dxa" w:w="110"/>
+              <w:bottom w:type="dxa" w:w="70"/>
+              <w:right w:type="dxa" w:w="110"/>
+            </w:tcMar>
+            <w:vAlign w:val="center"/>
+          </w:tcPr>
+          <w:p>
+            <w:pPr>
+              <w:spacing w:after="0" w:before="0"/>
+            </w:pPr>
+            <w:r>
+              <w:rPr>
+                <w:rFonts w:ascii="Arial" w:cs="Arial" w:eastAsia="Arial" w:hAnsi="Arial"/>
+                <w:color w:val="1B2118"/>
+                <w:sz w:val="18"/>
+                <w:szCs w:val="18"/>
+              </w:rPr>
+              <w:t xml:space="preserve">Tutte le tabelle del database (righe complete), gli utenti dell'autenticazione (id, email, ruoli, </w:t>
+            </w:r>
+            <w:r>
+              <w:rPr>
+                <w:rFonts w:ascii="Arial" w:cs="Arial" w:eastAsia="Arial" w:hAnsi="Arial"/>
+                <w:b/>
+                <w:bCs/>
+                <w:color w:val="1B2118"/>
+                <w:sz w:val="18"/>
+                <w:szCs w:val="18"/>
+              </w:rPr>
+              <w:t xml:space="preserve">senza password</w:t>
+            </w:r>
+            <w:r>
+              <w:rPr>
+                <w:rFonts w:ascii="Arial" w:cs="Arial" w:eastAsia="Arial" w:hAnsi="Arial"/>
+                <w:color w:val="1B2118"/>
+                <w:sz w:val="18"/>
+                <w:szCs w:val="18"/>
+              </w:rPr>
+              <w:t xml:space="preserve">: non si possono esportare), l'elenco dei file e dei lavori pianificati. Lo prepara la funzione del database </w:t>
             </w:r>
             <w:r>
               <w:rPr>
@@ -6523,16 +6737,16 @@
                 <w:sz w:val="18"/>
                 <w:szCs w:val="18"/>
               </w:rPr>
-              <w:t xml:space="preserve">commit.json</w:t>
-            </w:r>
-            <w:r>
-              <w:rPr>
-                <w:rFonts w:ascii="Arial" w:cs="Arial" w:eastAsia="Arial" w:hAnsi="Arial"/>
-                <w:color w:val="1B2118"/>
-                <w:sz w:val="18"/>
-                <w:szCs w:val="18"/>
-              </w:rPr>
-              <w:t xml:space="preserve"> con il commit di riferimento</w:t>
+              <w:t xml:space="preserve">backup_completo()</w:t>
+            </w:r>
+            <w:r>
+              <w:rPr>
+                <w:rFonts w:ascii="Arial" w:cs="Arial" w:eastAsia="Arial" w:hAnsi="Arial"/>
+                <w:color w:val="1B2118"/>
+                <w:sz w:val="18"/>
+                <w:szCs w:val="18"/>
+              </w:rPr>
+              <w:t xml:space="preserve"> (script 38), eseguibile solo con la chiave service_role</w:t>
             </w:r>
           </w:p>
         </w:tc>
@@ -6543,7 +6757,7 @@
         </w:trPr>
         <w:tc>
           <w:tcPr>
-            <w:tcW w:type="dxa" w:w="3779"/>
+            <w:tcW w:type="dxa" w:w="3213"/>
             <w:tcBorders>
               <w:top w:val="single" w:color="D9D4C5" w:sz="4"/>
               <w:left w:val="single" w:color="D9D4C5" w:sz="4"/>
@@ -6570,13 +6784,13 @@
                 <w:sz w:val="18"/>
                 <w:szCs w:val="18"/>
               </w:rPr>
-              <w:t xml:space="preserve">2_database</w:t>
-            </w:r>
-          </w:p>
-        </w:tc>
-        <w:tc>
-          <w:tcPr>
-            <w:tcW w:type="dxa" w:w="5859"/>
+              <w:t xml:space="preserve">file_caricati/</w:t>
+            </w:r>
+          </w:p>
+        </w:tc>
+        <w:tc>
+          <w:tcPr>
+            <w:tcW w:type="dxa" w:w="6425"/>
             <w:tcBorders>
               <w:top w:val="single" w:color="D9D4C5" w:sz="4"/>
               <w:left w:val="single" w:color="D9D4C5" w:sz="4"/>
@@ -6603,7 +6817,7 @@
                 <w:sz w:val="18"/>
                 <w:szCs w:val="18"/>
               </w:rPr>
-              <w:t xml:space="preserve">Un file JSON per ogni tabella del database, </w:t>
+              <w:t xml:space="preserve">Tutti i file degli archivi </w:t>
             </w:r>
             <w:r>
               <w:rPr>
@@ -6612,36 +6826,16 @@
                 <w:sz w:val="18"/>
                 <w:szCs w:val="18"/>
               </w:rPr>
-              <w:t xml:space="preserve">auth_utenti.json</w:t>
-            </w:r>
-            <w:r>
-              <w:rPr>
-                <w:rFonts w:ascii="Arial" w:cs="Arial" w:eastAsia="Arial" w:hAnsi="Arial"/>
-                <w:color w:val="1B2118"/>
-                <w:sz w:val="18"/>
-                <w:szCs w:val="18"/>
-              </w:rPr>
-              <w:t xml:space="preserve"> (utenti con id ed email, </w:t>
-            </w:r>
-            <w:r>
-              <w:rPr>
-                <w:rFonts w:ascii="Arial" w:cs="Arial" w:eastAsia="Arial" w:hAnsi="Arial"/>
-                <w:b/>
-                <w:bCs/>
-                <w:color w:val="1B2118"/>
-                <w:sz w:val="18"/>
-                <w:szCs w:val="18"/>
-              </w:rPr>
-              <w:t xml:space="preserve">senza password</w:t>
-            </w:r>
-            <w:r>
-              <w:rPr>
-                <w:rFonts w:ascii="Arial" w:cs="Arial" w:eastAsia="Arial" w:hAnsi="Arial"/>
-                <w:color w:val="1B2118"/>
-                <w:sz w:val="18"/>
-                <w:szCs w:val="18"/>
-              </w:rPr>
-              <w:t xml:space="preserve">: non si possono esportare) e </w:t>
+              <w:t xml:space="preserve">documenti</w:t>
+            </w:r>
+            <w:r>
+              <w:rPr>
+                <w:rFonts w:ascii="Arial" w:cs="Arial" w:eastAsia="Arial" w:hAnsi="Arial"/>
+                <w:color w:val="1B2118"/>
+                <w:sz w:val="18"/>
+                <w:szCs w:val="18"/>
+              </w:rPr>
+              <w:t xml:space="preserve">, </w:t>
             </w:r>
             <w:r>
               <w:rPr>
@@ -6650,7 +6844,34 @@
                 <w:sz w:val="18"/>
                 <w:szCs w:val="18"/>
               </w:rPr>
-              <w:t xml:space="preserve">conteggi.json</w:t>
+              <w:t xml:space="preserve">modelli</w:t>
+            </w:r>
+            <w:r>
+              <w:rPr>
+                <w:rFonts w:ascii="Arial" w:cs="Arial" w:eastAsia="Arial" w:hAnsi="Arial"/>
+                <w:color w:val="1B2118"/>
+                <w:sz w:val="18"/>
+                <w:szCs w:val="18"/>
+              </w:rPr>
+              <w:t xml:space="preserve"> e </w:t>
+            </w:r>
+            <w:r>
+              <w:rPr>
+                <w:rFonts w:ascii="Consolas" w:cs="Consolas" w:eastAsia="Consolas" w:hAnsi="Consolas"/>
+                <w:color w:val="2F5D3A"/>
+                <w:sz w:val="18"/>
+                <w:szCs w:val="18"/>
+              </w:rPr>
+              <w:t xml:space="preserve">allegati-consultazione</w:t>
+            </w:r>
+            <w:r>
+              <w:rPr>
+                <w:rFonts w:ascii="Arial" w:cs="Arial" w:eastAsia="Arial" w:hAnsi="Arial"/>
+                <w:color w:val="1B2118"/>
+                <w:sz w:val="18"/>
+                <w:szCs w:val="18"/>
+              </w:rPr>
+              <w:t xml:space="preserve">, con le stesse sottocartelle</w:t>
             </w:r>
           </w:p>
         </w:tc>
@@ -6661,7 +6882,7 @@
         </w:trPr>
         <w:tc>
           <w:tcPr>
-            <w:tcW w:type="dxa" w:w="3779"/>
+            <w:tcW w:type="dxa" w:w="3213"/>
             <w:tcBorders>
               <w:top w:val="single" w:color="D9D4C5" w:sz="4"/>
               <w:left w:val="single" w:color="D9D4C5" w:sz="4"/>
@@ -6687,102 +6908,39 @@
                 <w:sz w:val="18"/>
                 <w:szCs w:val="18"/>
               </w:rPr>
-              <w:t xml:space="preserve">3_file</w:t>
-            </w:r>
-          </w:p>
-        </w:tc>
-        <w:tc>
-          <w:tcPr>
-            <w:tcW w:type="dxa" w:w="5859"/>
-            <w:tcBorders>
-              <w:top w:val="single" w:color="D9D4C5" w:sz="4"/>
-              <w:left w:val="single" w:color="D9D4C5" w:sz="4"/>
-              <w:bottom w:val="single" w:color="D9D4C5" w:sz="4"/>
-              <w:right w:val="single" w:color="D9D4C5" w:sz="4"/>
-            </w:tcBorders>
-            <w:tcMar>
-              <w:top w:type="dxa" w:w="70"/>
-              <w:left w:type="dxa" w:w="110"/>
-              <w:bottom w:type="dxa" w:w="70"/>
-              <w:right w:type="dxa" w:w="110"/>
-            </w:tcMar>
-            <w:vAlign w:val="center"/>
-          </w:tcPr>
-          <w:p>
-            <w:pPr>
-              <w:spacing w:after="0" w:before="0"/>
-            </w:pPr>
-            <w:r>
-              <w:rPr>
-                <w:rFonts w:ascii="Arial" w:cs="Arial" w:eastAsia="Arial" w:hAnsi="Arial"/>
-                <w:color w:val="1B2118"/>
-                <w:sz w:val="18"/>
-                <w:szCs w:val="18"/>
-              </w:rPr>
-              <w:t xml:space="preserve">Tutti i file degli archivi </w:t>
-            </w:r>
-            <w:r>
-              <w:rPr>
-                <w:rFonts w:ascii="Consolas" w:cs="Consolas" w:eastAsia="Consolas" w:hAnsi="Consolas"/>
-                <w:color w:val="2F5D3A"/>
-                <w:sz w:val="18"/>
-                <w:szCs w:val="18"/>
-              </w:rPr>
-              <w:t xml:space="preserve">documenti</w:t>
-            </w:r>
-            <w:r>
-              <w:rPr>
-                <w:rFonts w:ascii="Arial" w:cs="Arial" w:eastAsia="Arial" w:hAnsi="Arial"/>
-                <w:color w:val="1B2118"/>
-                <w:sz w:val="18"/>
-                <w:szCs w:val="18"/>
-              </w:rPr>
-              <w:t xml:space="preserve">, </w:t>
-            </w:r>
-            <w:r>
-              <w:rPr>
-                <w:rFonts w:ascii="Consolas" w:cs="Consolas" w:eastAsia="Consolas" w:hAnsi="Consolas"/>
-                <w:color w:val="2F5D3A"/>
-                <w:sz w:val="18"/>
-                <w:szCs w:val="18"/>
-              </w:rPr>
-              <w:t xml:space="preserve">modelli</w:t>
-            </w:r>
-            <w:r>
-              <w:rPr>
-                <w:rFonts w:ascii="Arial" w:cs="Arial" w:eastAsia="Arial" w:hAnsi="Arial"/>
-                <w:color w:val="1B2118"/>
-                <w:sz w:val="18"/>
-                <w:szCs w:val="18"/>
-              </w:rPr>
-              <w:t xml:space="preserve"> e </w:t>
-            </w:r>
-            <w:r>
-              <w:rPr>
-                <w:rFonts w:ascii="Consolas" w:cs="Consolas" w:eastAsia="Consolas" w:hAnsi="Consolas"/>
-                <w:color w:val="2F5D3A"/>
-                <w:sz w:val="18"/>
-                <w:szCs w:val="18"/>
-              </w:rPr>
-              <w:t xml:space="preserve">allegati-consultazione</w:t>
-            </w:r>
-            <w:r>
-              <w:rPr>
-                <w:rFonts w:ascii="Arial" w:cs="Arial" w:eastAsia="Arial" w:hAnsi="Arial"/>
-                <w:color w:val="1B2118"/>
-                <w:sz w:val="18"/>
-                <w:szCs w:val="18"/>
-              </w:rPr>
-              <w:t xml:space="preserve">, con le stesse sottocartelle, ed </w:t>
-            </w:r>
-            <w:r>
-              <w:rPr>
-                <w:rFonts w:ascii="Consolas" w:cs="Consolas" w:eastAsia="Consolas" w:hAnsi="Consolas"/>
-                <w:color w:val="2F5D3A"/>
-                <w:sz w:val="18"/>
-                <w:szCs w:val="18"/>
-              </w:rPr>
-              <w:t xml:space="preserve">elenco_file.json</w:t>
+              <w:t xml:space="preserve">portale-cwp-main.zip</w:t>
+            </w:r>
+          </w:p>
+        </w:tc>
+        <w:tc>
+          <w:tcPr>
+            <w:tcW w:type="dxa" w:w="6425"/>
+            <w:tcBorders>
+              <w:top w:val="single" w:color="D9D4C5" w:sz="4"/>
+              <w:left w:val="single" w:color="D9D4C5" w:sz="4"/>
+              <w:bottom w:val="single" w:color="D9D4C5" w:sz="4"/>
+              <w:right w:val="single" w:color="D9D4C5" w:sz="4"/>
+            </w:tcBorders>
+            <w:tcMar>
+              <w:top w:type="dxa" w:w="70"/>
+              <w:left w:type="dxa" w:w="110"/>
+              <w:bottom w:type="dxa" w:w="70"/>
+              <w:right w:type="dxa" w:w="110"/>
+            </w:tcMar>
+            <w:vAlign w:val="center"/>
+          </w:tcPr>
+          <w:p>
+            <w:pPr>
+              <w:spacing w:after="0" w:before="0"/>
+            </w:pPr>
+            <w:r>
+              <w:rPr>
+                <w:rFonts w:ascii="Arial" w:cs="Arial" w:eastAsia="Arial" w:hAnsi="Arial"/>
+                <w:color w:val="1B2118"/>
+                <w:sz w:val="18"/>
+                <w:szCs w:val="18"/>
+              </w:rPr>
+              <w:t xml:space="preserve">Il codice da GitHub (ramo main): portale, script del database, funzioni del server, manuali, strumenti di ripristino</w:t>
             </w:r>
           </w:p>
         </w:tc>
@@ -6793,7 +6951,7 @@
         </w:trPr>
         <w:tc>
           <w:tcPr>
-            <w:tcW w:type="dxa" w:w="3779"/>
+            <w:tcW w:type="dxa" w:w="3213"/>
             <w:tcBorders>
               <w:top w:val="single" w:color="D9D4C5" w:sz="4"/>
               <w:left w:val="single" w:color="D9D4C5" w:sz="4"/>
@@ -6820,13 +6978,13 @@
                 <w:sz w:val="18"/>
                 <w:szCs w:val="18"/>
               </w:rPr>
-              <w:t xml:space="preserve">4_servizi</w:t>
-            </w:r>
-          </w:p>
-        </w:tc>
-        <w:tc>
-          <w:tcPr>
-            <w:tcW w:type="dxa" w:w="5859"/>
+              <w:t xml:space="preserve">Istruzioni_Ripristino_Portale_CWP.pdf</w:t>
+            </w:r>
+          </w:p>
+        </w:tc>
+        <w:tc>
+          <w:tcPr>
+            <w:tcW w:type="dxa" w:w="6425"/>
             <w:tcBorders>
               <w:top w:val="single" w:color="D9D4C5" w:sz="4"/>
               <w:left w:val="single" w:color="D9D4C5" w:sz="4"/>
@@ -6853,18 +7011,7 @@
                 <w:sz w:val="18"/>
                 <w:szCs w:val="18"/>
               </w:rPr>
-              <w:t xml:space="preserve">Configurazione di Supabase, Vercel e Resend: nomi delle funzioni e dei segreti, impostazioni di Auth, variabili di Vercel, domini Resend. </w:t>
-            </w:r>
-            <w:r>
-              <w:rPr>
-                <w:rFonts w:ascii="Arial" w:cs="Arial" w:eastAsia="Arial" w:hAnsi="Arial"/>
-                <w:b/>
-                <w:bCs/>
-                <w:color w:val="1B2118"/>
-                <w:sz w:val="18"/>
-                <w:szCs w:val="18"/>
-              </w:rPr>
-              <w:t xml:space="preserve">Mai i valori segreti</w:t>
+              <w:t xml:space="preserve">Questo documento, aggiornato</w:t>
             </w:r>
           </w:p>
         </w:tc>
@@ -6875,7 +7022,7 @@
         </w:trPr>
         <w:tc>
           <w:tcPr>
-            <w:tcW w:type="dxa" w:w="3779"/>
+            <w:tcW w:type="dxa" w:w="3213"/>
             <w:tcBorders>
               <w:top w:val="single" w:color="D9D4C5" w:sz="4"/>
               <w:left w:val="single" w:color="D9D4C5" w:sz="4"/>
@@ -6910,7 +7057,7 @@
                 <w:sz w:val="18"/>
                 <w:szCs w:val="18"/>
               </w:rPr>
-              <w:t xml:space="preserve">, PDF delle Istruzioni di ripristino, </w:t>
+              <w:t xml:space="preserve">, </w:t>
             </w:r>
             <w:r>
               <w:rPr>
@@ -6919,39 +7066,39 @@
                 <w:sz w:val="18"/>
                 <w:szCs w:val="18"/>
               </w:rPr>
-              <w:t xml:space="preserve">esito.json</w:t>
-            </w:r>
-          </w:p>
-        </w:tc>
-        <w:tc>
-          <w:tcPr>
-            <w:tcW w:type="dxa" w:w="5859"/>
-            <w:tcBorders>
-              <w:top w:val="single" w:color="D9D4C5" w:sz="4"/>
-              <w:left w:val="single" w:color="D9D4C5" w:sz="4"/>
-              <w:bottom w:val="single" w:color="D9D4C5" w:sz="4"/>
-              <w:right w:val="single" w:color="D9D4C5" w:sz="4"/>
-            </w:tcBorders>
-            <w:tcMar>
-              <w:top w:type="dxa" w:w="70"/>
-              <w:left w:type="dxa" w:w="110"/>
-              <w:bottom w:type="dxa" w:w="70"/>
-              <w:right w:type="dxa" w:w="110"/>
-            </w:tcMar>
-            <w:vAlign w:val="center"/>
-          </w:tcPr>
-          <w:p>
-            <w:pPr>
-              <w:spacing w:after="0" w:before="0"/>
-            </w:pPr>
-            <w:r>
-              <w:rPr>
-                <w:rFonts w:ascii="Arial" w:cs="Arial" w:eastAsia="Arial" w:hAnsi="Arial"/>
-                <w:color w:val="1B2118"/>
-                <w:sz w:val="18"/>
-                <w:szCs w:val="18"/>
-              </w:rPr>
-              <w:t xml:space="preserve">Guida rapida, queste istruzioni aggiornate ed esito del backup</w:t>
+              <w:t xml:space="preserve">esito.txt</w:t>
+            </w:r>
+          </w:p>
+        </w:tc>
+        <w:tc>
+          <w:tcPr>
+            <w:tcW w:type="dxa" w:w="6425"/>
+            <w:tcBorders>
+              <w:top w:val="single" w:color="D9D4C5" w:sz="4"/>
+              <w:left w:val="single" w:color="D9D4C5" w:sz="4"/>
+              <w:bottom w:val="single" w:color="D9D4C5" w:sz="4"/>
+              <w:right w:val="single" w:color="D9D4C5" w:sz="4"/>
+            </w:tcBorders>
+            <w:tcMar>
+              <w:top w:type="dxa" w:w="70"/>
+              <w:left w:type="dxa" w:w="110"/>
+              <w:bottom w:type="dxa" w:w="70"/>
+              <w:right w:type="dxa" w:w="110"/>
+            </w:tcMar>
+            <w:vAlign w:val="center"/>
+          </w:tcPr>
+          <w:p>
+            <w:pPr>
+              <w:spacing w:after="0" w:before="0"/>
+            </w:pPr>
+            <w:r>
+              <w:rPr>
+                <w:rFonts w:ascii="Arial" w:cs="Arial" w:eastAsia="Arial" w:hAnsi="Arial"/>
+                <w:color w:val="1B2118"/>
+                <w:sz w:val="18"/>
+                <w:szCs w:val="18"/>
+              </w:rPr>
+              <w:t xml:space="preserve">Guida rapida ed esito del backup (numeri ed eventuali errori)</w:t>
             </w:r>
           </w:p>
         </w:tc>
@@ -6973,7 +7120,45 @@
           <w:sz w:val="21"/>
           <w:szCs w:val="21"/>
         </w:rPr>
-        <w:t xml:space="preserve">Se un backup non riesce o non finisce (Google concede al massimo 6 minuti per esecuzione), Luca riceve un'email «Backup CWP NON completo» con gli errori.</w:t>
+        <w:t xml:space="preserve">Alla fine compare una </w:t>
+      </w:r>
+      <w:r>
+        <w:rPr>
+          <w:rFonts w:ascii="Arial" w:cs="Arial" w:eastAsia="Arial" w:hAnsi="Arial"/>
+          <w:b/>
+          <w:bCs/>
+          <w:color w:val="1B2118"/>
+          <w:sz w:val="21"/>
+          <w:szCs w:val="21"/>
+        </w:rPr>
+        <w:t xml:space="preserve">notifica del Mac</w:t>
+      </w:r>
+      <w:r>
+        <w:rPr>
+          <w:rFonts w:ascii="Arial" w:cs="Arial" w:eastAsia="Arial" w:hAnsi="Arial"/>
+          <w:color w:val="1B2118"/>
+          <w:sz w:val="21"/>
+          <w:szCs w:val="21"/>
+        </w:rPr>
+        <w:t xml:space="preserve"> con l'esito («Backup del … completato» oppure «… con n errori»). Il registro di ogni esecuzione è nel file </w:t>
+      </w:r>
+      <w:r>
+        <w:rPr>
+          <w:rFonts w:ascii="Consolas" w:cs="Consolas" w:eastAsia="Consolas" w:hAnsi="Consolas"/>
+          <w:color w:val="2F5D3A"/>
+          <w:sz w:val="21"/>
+          <w:szCs w:val="21"/>
+        </w:rPr>
+        <w:t xml:space="preserve">~/.cwp-backup/backup.log</w:t>
+      </w:r>
+      <w:r>
+        <w:rPr>
+          <w:rFonts w:ascii="Arial" w:cs="Arial" w:eastAsia="Arial" w:hAnsi="Arial"/>
+          <w:color w:val="1B2118"/>
+          <w:sz w:val="21"/>
+          <w:szCs w:val="21"/>
+        </w:rPr>
+        <w:t xml:space="preserve"> del Mac.</w:t>
       </w:r>
     </w:p>
     <w:p>
@@ -7016,7 +7201,7 @@
           <w:sz w:val="25"/>
           <w:szCs w:val="25"/>
         </w:rPr>
-        <w:t xml:space="preserve">Installazione (una volta, la fa Luca: circa 10 minuti)</w:t>
+        <w:t xml:space="preserve">Installazione (una volta, la fa Luca: circa 5 minuti)</w:t>
       </w:r>
     </w:p>
     <w:p>
@@ -7030,27 +7215,29 @@
           <w:sz w:val="21"/>
           <w:szCs w:val="21"/>
         </w:rPr>
-        <w:t xml:space="preserve">Il codice del programma è nel repository, </w:t>
-      </w:r>
-      <w:r>
-        <w:rPr>
-          <w:rFonts w:ascii="Consolas" w:cs="Consolas" w:eastAsia="Consolas" w:hAnsi="Consolas"/>
-          <w:color w:val="2F5D3A"/>
-          <w:sz w:val="21"/>
-          <w:szCs w:val="21"/>
-        </w:rPr>
-        <w:t xml:space="preserve">strumenti/backup/BackupCWP.gs</w:t>
-      </w:r>
-      <w:r>
-        <w:rPr>
-          <w:rFonts w:ascii="Arial" w:cs="Arial" w:eastAsia="Arial" w:hAnsi="Arial"/>
-          <w:color w:val="1B2118"/>
-          <w:sz w:val="21"/>
-          <w:szCs w:val="21"/>
-        </w:rPr>
-        <w:t xml:space="preserve">: si apre in testo semplice all'indirizzo </w:t>
-      </w:r>
-      <w:hyperlink w:history="1" r:id="rIduwow8kybtglefeahgmvku">
+        <w:t xml:space="preserve">Servono l'app </w:t>
+      </w:r>
+      <w:r>
+        <w:rPr>
+          <w:rFonts w:ascii="Arial" w:cs="Arial" w:eastAsia="Arial" w:hAnsi="Arial"/>
+          <w:b/>
+          <w:bCs/>
+          <w:color w:val="1B2118"/>
+          <w:sz w:val="21"/>
+          <w:szCs w:val="21"/>
+        </w:rPr>
+        <w:t xml:space="preserve">Google Drive per desktop</w:t>
+      </w:r>
+      <w:r>
+        <w:rPr>
+          <w:rFonts w:ascii="Arial" w:cs="Arial" w:eastAsia="Arial" w:hAnsi="Arial"/>
+          <w:color w:val="1B2118"/>
+          <w:sz w:val="21"/>
+          <w:szCs w:val="21"/>
+        </w:rPr>
+        <w:t xml:space="preserve"> (</w:t>
+      </w:r>
+      <w:hyperlink w:history="1" r:id="rId0sm67ha5u4-g8azsfwn5r">
         <w:r>
           <w:rPr>
             <w:rFonts w:ascii="Arial" w:cs="Arial" w:eastAsia="Arial" w:hAnsi="Arial"/>
@@ -7059,7 +7246,7 @@
             <w:szCs w:val="21"/>
             <w:u w:val="single"/>
           </w:rPr>
-          <w:t xml:space="preserve">https://raw.githubusercontent.com/lucamorettioperate/portale-cwp/main/strumenti/backup/BackupCWP.gs.</w:t>
+          <w:t xml:space="preserve">https://www.google.com/drive/download/</w:t>
         </w:r>
       </w:hyperlink>
       <w:r>
@@ -7069,7 +7256,67 @@
           <w:sz w:val="21"/>
           <w:szCs w:val="21"/>
         </w:rPr>
-        <w:t xml:space="preserve"> Nella cartella Cwp c'è anche il documento «Backup CWP — installazione» con questi passi.</w:t>
+        <w:t xml:space="preserve">) aperta con l'account che possiede la cartella Cwp, e la chiave </w:t>
+      </w:r>
+      <w:r>
+        <w:rPr>
+          <w:rFonts w:ascii="Arial" w:cs="Arial" w:eastAsia="Arial" w:hAnsi="Arial"/>
+          <w:b/>
+          <w:bCs/>
+          <w:color w:val="1B2118"/>
+          <w:sz w:val="21"/>
+          <w:szCs w:val="21"/>
+        </w:rPr>
+        <w:t xml:space="preserve">service_role</w:t>
+      </w:r>
+      <w:r>
+        <w:rPr>
+          <w:rFonts w:ascii="Arial" w:cs="Arial" w:eastAsia="Arial" w:hAnsi="Arial"/>
+          <w:color w:val="1B2118"/>
+          <w:sz w:val="21"/>
+          <w:szCs w:val="21"/>
+        </w:rPr>
+        <w:t xml:space="preserve"> di Supabase (</w:t>
+      </w:r>
+      <w:r>
+        <w:rPr>
+          <w:rFonts w:ascii="Arial" w:cs="Arial" w:eastAsia="Arial" w:hAnsi="Arial"/>
+          <w:i/>
+          <w:iCs/>
+          <w:color w:val="1B2118"/>
+          <w:sz w:val="21"/>
+          <w:szCs w:val="21"/>
+        </w:rPr>
+        <w:t xml:space="preserve">Project Settings</w:t>
+      </w:r>
+      <w:r>
+        <w:rPr>
+          <w:rFonts w:ascii="Arial" w:cs="Arial" w:eastAsia="Arial" w:hAnsi="Arial"/>
+          <w:color w:val="1B2118"/>
+          <w:sz w:val="21"/>
+          <w:szCs w:val="21"/>
+        </w:rPr>
+        <w:t xml:space="preserve"> → </w:t>
+      </w:r>
+      <w:r>
+        <w:rPr>
+          <w:rFonts w:ascii="Arial" w:cs="Arial" w:eastAsia="Arial" w:hAnsi="Arial"/>
+          <w:i/>
+          <w:iCs/>
+          <w:color w:val="1B2118"/>
+          <w:sz w:val="21"/>
+          <w:szCs w:val="21"/>
+        </w:rPr>
+        <w:t xml:space="preserve">API Keys</w:t>
+      </w:r>
+      <w:r>
+        <w:rPr>
+          <w:rFonts w:ascii="Arial" w:cs="Arial" w:eastAsia="Arial" w:hAnsi="Arial"/>
+          <w:color w:val="1B2118"/>
+          <w:sz w:val="21"/>
+          <w:szCs w:val="21"/>
+        </w:rPr>
+        <w:t xml:space="preserve">).</w:t>
       </w:r>
     </w:p>
     <w:p>
@@ -7088,7 +7335,7 @@
           <w:sz w:val="21"/>
           <w:szCs w:val="21"/>
         </w:rPr>
-        <w:t xml:space="preserve">Aprite </w:t>
+        <w:t xml:space="preserve">Aprite il </w:t>
       </w:r>
       <w:r>
         <w:rPr>
@@ -7099,36 +7346,16 @@
           <w:sz w:val="21"/>
           <w:szCs w:val="21"/>
         </w:rPr>
-        <w:t xml:space="preserve">script.google.com</w:t>
-      </w:r>
-      <w:r>
-        <w:rPr>
-          <w:rFonts w:ascii="Arial" w:cs="Arial" w:eastAsia="Arial" w:hAnsi="Arial"/>
-          <w:color w:val="1B2118"/>
-          <w:sz w:val="21"/>
-          <w:szCs w:val="21"/>
-        </w:rPr>
-        <w:t xml:space="preserve"> con l'account Google che possiede la cartella Cwp → </w:t>
-      </w:r>
-      <w:r>
-        <w:rPr>
-          <w:rFonts w:ascii="Arial" w:cs="Arial" w:eastAsia="Arial" w:hAnsi="Arial"/>
-          <w:b/>
-          <w:bCs/>
-          <w:color w:val="1B2118"/>
-          <w:sz w:val="21"/>
-          <w:szCs w:val="21"/>
-        </w:rPr>
-        <w:t xml:space="preserve">Nuovo progetto</w:t>
-      </w:r>
-      <w:r>
-        <w:rPr>
-          <w:rFonts w:ascii="Arial" w:cs="Arial" w:eastAsia="Arial" w:hAnsi="Arial"/>
-          <w:color w:val="1B2118"/>
-          <w:sz w:val="21"/>
-          <w:szCs w:val="21"/>
-        </w:rPr>
-        <w:t xml:space="preserve">. Rinominatelo «Backup CWP».</w:t>
+        <w:t xml:space="preserve">Terminale</w:t>
+      </w:r>
+      <w:r>
+        <w:rPr>
+          <w:rFonts w:ascii="Arial" w:cs="Arial" w:eastAsia="Arial" w:hAnsi="Arial"/>
+          <w:color w:val="1B2118"/>
+          <w:sz w:val="21"/>
+          <w:szCs w:val="21"/>
+        </w:rPr>
+        <w:t xml:space="preserve"> del Mac (Spotlight → «Terminale»).</w:t>
       </w:r>
     </w:p>
     <w:p>
@@ -7147,7 +7374,26 @@
           <w:sz w:val="21"/>
           <w:szCs w:val="21"/>
         </w:rPr>
-        <w:t xml:space="preserve">Aprite l'indirizzo del codice qui sopra, selezionate tutto (Cmd+A / Ctrl+A) e copiate. Nell'editor cancellate il contenuto del file </w:t>
+        <w:t xml:space="preserve">Incollate questo comando e premete Invio:</w:t>
+      </w:r>
+    </w:p>
+    <w:p>
+      <w:pPr>
+        <w:spacing w:after="60"/>
+      </w:pPr>
+    </w:p>
+    <w:p>
+      <w:pPr>
+        <w:spacing w:after="140" w:line="300"/>
+      </w:pPr>
+      <w:r>
+        <w:rPr>
+          <w:rFonts w:ascii="Arial" w:cs="Arial" w:eastAsia="Arial" w:hAnsi="Arial"/>
+          <w:color w:val="1B2118"/>
+          <w:sz w:val="21"/>
+          <w:szCs w:val="21"/>
+        </w:rPr>
+        <w:t xml:space="preserve">``</w:t>
       </w:r>
       <w:r>
         <w:rPr>
@@ -7156,259 +7402,16 @@
           <w:sz w:val="21"/>
           <w:szCs w:val="21"/>
         </w:rPr>
-        <w:t xml:space="preserve">Codice.gs</w:t>
-      </w:r>
-      <w:r>
-        <w:rPr>
-          <w:rFonts w:ascii="Arial" w:cs="Arial" w:eastAsia="Arial" w:hAnsi="Arial"/>
-          <w:color w:val="1B2118"/>
-          <w:sz w:val="21"/>
-          <w:szCs w:val="21"/>
-        </w:rPr>
-        <w:t xml:space="preserve">, incollate e premete </w:t>
-      </w:r>
-      <w:r>
-        <w:rPr>
-          <w:rFonts w:ascii="Arial" w:cs="Arial" w:eastAsia="Arial" w:hAnsi="Arial"/>
-          <w:b/>
-          <w:bCs/>
-          <w:color w:val="1B2118"/>
-          <w:sz w:val="21"/>
-          <w:szCs w:val="21"/>
-        </w:rPr>
-        <w:t xml:space="preserve">Salva</w:t>
-      </w:r>
-      <w:r>
-        <w:rPr>
-          <w:rFonts w:ascii="Arial" w:cs="Arial" w:eastAsia="Arial" w:hAnsi="Arial"/>
-          <w:color w:val="1B2118"/>
-          <w:sz w:val="21"/>
-          <w:szCs w:val="21"/>
-        </w:rPr>
-        <w:t xml:space="preserve"> (icona del dischetto).</w:t>
-      </w:r>
-    </w:p>
-    <w:p>
-      <w:pPr>
-        <w:pStyle w:val="ListParagraph"/>
-        <w:numPr>
-          <w:ilvl w:val="0"/>
-          <w:numId w:val="4"/>
-        </w:numPr>
-        <w:spacing w:after="70" w:line="290"/>
-      </w:pPr>
-      <w:r>
-        <w:rPr>
-          <w:rFonts w:ascii="Arial" w:cs="Arial" w:eastAsia="Arial" w:hAnsi="Arial"/>
-          <w:b/>
-          <w:bCs/>
-          <w:color w:val="1B2118"/>
-          <w:sz w:val="21"/>
-          <w:szCs w:val="21"/>
-        </w:rPr>
-        <w:t xml:space="preserve">Impostazioni progetto</w:t>
-      </w:r>
-      <w:r>
-        <w:rPr>
-          <w:rFonts w:ascii="Arial" w:cs="Arial" w:eastAsia="Arial" w:hAnsi="Arial"/>
-          <w:color w:val="1B2118"/>
-          <w:sz w:val="21"/>
-          <w:szCs w:val="21"/>
-        </w:rPr>
-        <w:t xml:space="preserve"> (ingranaggio a sinistra):</w:t>
-      </w:r>
-    </w:p>
-    <w:p>
-      <w:pPr>
-        <w:spacing w:after="60"/>
-      </w:pPr>
-    </w:p>
-    <w:p>
-      <w:pPr>
-        <w:spacing w:after="140" w:line="300"/>
-      </w:pPr>
-      <w:r>
-        <w:rPr>
-          <w:rFonts w:ascii="Arial" w:cs="Arial" w:eastAsia="Arial" w:hAnsi="Arial"/>
-          <w:color w:val="1B2118"/>
-          <w:sz w:val="21"/>
-          <w:szCs w:val="21"/>
-        </w:rPr>
-        <w:t xml:space="preserve">- </w:t>
-      </w:r>
-      <w:r>
-        <w:rPr>
-          <w:rFonts w:ascii="Arial" w:cs="Arial" w:eastAsia="Arial" w:hAnsi="Arial"/>
-          <w:b/>
-          <w:bCs/>
-          <w:color w:val="1B2118"/>
-          <w:sz w:val="21"/>
-          <w:szCs w:val="21"/>
-        </w:rPr>
-        <w:t xml:space="preserve">Fuso orario</w:t>
-      </w:r>
-      <w:r>
-        <w:rPr>
-          <w:rFonts w:ascii="Arial" w:cs="Arial" w:eastAsia="Arial" w:hAnsi="Arial"/>
-          <w:color w:val="1B2118"/>
-          <w:sz w:val="21"/>
-          <w:szCs w:val="21"/>
-        </w:rPr>
-        <w:t xml:space="preserve">: «(GMT+01:00) Roma» (oppure «Europe/Rome»); - </w:t>
-      </w:r>
-      <w:r>
-        <w:rPr>
-          <w:rFonts w:ascii="Arial" w:cs="Arial" w:eastAsia="Arial" w:hAnsi="Arial"/>
-          <w:b/>
-          <w:bCs/>
-          <w:color w:val="1B2118"/>
-          <w:sz w:val="21"/>
-          <w:szCs w:val="21"/>
-        </w:rPr>
-        <w:t xml:space="preserve">Proprietà dello script</w:t>
-      </w:r>
-      <w:r>
-        <w:rPr>
-          <w:rFonts w:ascii="Arial" w:cs="Arial" w:eastAsia="Arial" w:hAnsi="Arial"/>
-          <w:color w:val="1B2118"/>
-          <w:sz w:val="21"/>
-          <w:szCs w:val="21"/>
-        </w:rPr>
-        <w:t xml:space="preserve"> → </w:t>
-      </w:r>
-      <w:r>
-        <w:rPr>
-          <w:rFonts w:ascii="Arial" w:cs="Arial" w:eastAsia="Arial" w:hAnsi="Arial"/>
-          <w:b/>
-          <w:bCs/>
-          <w:color w:val="1B2118"/>
-          <w:sz w:val="21"/>
-          <w:szCs w:val="21"/>
-        </w:rPr>
-        <w:t xml:space="preserve">Aggiungi proprietà dello script</w:t>
-      </w:r>
-      <w:r>
-        <w:rPr>
-          <w:rFonts w:ascii="Arial" w:cs="Arial" w:eastAsia="Arial" w:hAnsi="Arial"/>
-          <w:color w:val="1B2118"/>
-          <w:sz w:val="21"/>
-          <w:szCs w:val="21"/>
-        </w:rPr>
-        <w:t xml:space="preserve">, nome </w:t>
-      </w:r>
-      <w:r>
-        <w:rPr>
-          <w:rFonts w:ascii="Consolas" w:cs="Consolas" w:eastAsia="Consolas" w:hAnsi="Consolas"/>
-          <w:color w:val="2F5D3A"/>
-          <w:sz w:val="21"/>
-          <w:szCs w:val="21"/>
-        </w:rPr>
-        <w:t xml:space="preserve">SUPABASE_SERVICE_ROLE_KEY</w:t>
-      </w:r>
-      <w:r>
-        <w:rPr>
-          <w:rFonts w:ascii="Arial" w:cs="Arial" w:eastAsia="Arial" w:hAnsi="Arial"/>
-          <w:color w:val="1B2118"/>
-          <w:sz w:val="21"/>
-          <w:szCs w:val="21"/>
-        </w:rPr>
-        <w:t xml:space="preserve">. Il valore è in Supabase → </w:t>
-      </w:r>
-      <w:r>
-        <w:rPr>
-          <w:rFonts w:ascii="Arial" w:cs="Arial" w:eastAsia="Arial" w:hAnsi="Arial"/>
-          <w:i/>
-          <w:iCs/>
-          <w:color w:val="1B2118"/>
-          <w:sz w:val="21"/>
-          <w:szCs w:val="21"/>
-        </w:rPr>
-        <w:t xml:space="preserve">Project Settings</w:t>
-      </w:r>
-      <w:r>
-        <w:rPr>
-          <w:rFonts w:ascii="Arial" w:cs="Arial" w:eastAsia="Arial" w:hAnsi="Arial"/>
-          <w:color w:val="1B2118"/>
-          <w:sz w:val="21"/>
-          <w:szCs w:val="21"/>
-        </w:rPr>
-        <w:t xml:space="preserve"> → </w:t>
-      </w:r>
-      <w:r>
-        <w:rPr>
-          <w:rFonts w:ascii="Arial" w:cs="Arial" w:eastAsia="Arial" w:hAnsi="Arial"/>
-          <w:i/>
-          <w:iCs/>
-          <w:color w:val="1B2118"/>
-          <w:sz w:val="21"/>
-          <w:szCs w:val="21"/>
-        </w:rPr>
-        <w:t xml:space="preserve">API Keys</w:t>
-      </w:r>
-      <w:r>
-        <w:rPr>
-          <w:rFonts w:ascii="Arial" w:cs="Arial" w:eastAsia="Arial" w:hAnsi="Arial"/>
-          <w:color w:val="1B2118"/>
-          <w:sz w:val="21"/>
-          <w:szCs w:val="21"/>
-        </w:rPr>
-        <w:t xml:space="preserve"> → chiave </w:t>
-      </w:r>
-      <w:r>
-        <w:rPr>
-          <w:rFonts w:ascii="Arial" w:cs="Arial" w:eastAsia="Arial" w:hAnsi="Arial"/>
-          <w:b/>
-          <w:bCs/>
-          <w:color w:val="1B2118"/>
-          <w:sz w:val="21"/>
-          <w:szCs w:val="21"/>
-        </w:rPr>
-        <w:t xml:space="preserve">service_role</w:t>
-      </w:r>
-      <w:r>
-        <w:rPr>
-          <w:rFonts w:ascii="Arial" w:cs="Arial" w:eastAsia="Arial" w:hAnsi="Arial"/>
-          <w:color w:val="1B2118"/>
-          <w:sz w:val="21"/>
-          <w:szCs w:val="21"/>
-        </w:rPr>
-        <w:t xml:space="preserve">: copiatela e incollatela voi, non va mai scritta altrove; - facoltative: </w:t>
-      </w:r>
-      <w:r>
-        <w:rPr>
-          <w:rFonts w:ascii="Consolas" w:cs="Consolas" w:eastAsia="Consolas" w:hAnsi="Consolas"/>
-          <w:color w:val="2F5D3A"/>
-          <w:sz w:val="21"/>
-          <w:szCs w:val="21"/>
-        </w:rPr>
-        <w:t xml:space="preserve">RESEND_API_KEY</w:t>
-      </w:r>
-      <w:r>
-        <w:rPr>
-          <w:rFonts w:ascii="Arial" w:cs="Arial" w:eastAsia="Arial" w:hAnsi="Arial"/>
-          <w:color w:val="1B2118"/>
-          <w:sz w:val="21"/>
-          <w:szCs w:val="21"/>
-        </w:rPr>
-        <w:t xml:space="preserve"> (per salvare l'elenco dei domini Resend) e </w:t>
-      </w:r>
-      <w:r>
-        <w:rPr>
-          <w:rFonts w:ascii="Consolas" w:cs="Consolas" w:eastAsia="Consolas" w:hAnsi="Consolas"/>
-          <w:color w:val="2F5D3A"/>
-          <w:sz w:val="21"/>
-          <w:szCs w:val="21"/>
-        </w:rPr>
-        <w:t xml:space="preserve">VERCEL_TOKEN</w:t>
-      </w:r>
-      <w:r>
-        <w:rPr>
-          <w:rFonts w:ascii="Arial" w:cs="Arial" w:eastAsia="Arial" w:hAnsi="Arial"/>
-          <w:color w:val="1B2118"/>
-          <w:sz w:val="21"/>
-          <w:szCs w:val="21"/>
-        </w:rPr>
-        <w:t xml:space="preserve"> (per salvare le impostazioni del progetto Vercel).</w:t>
+        <w:t xml:space="preserve"> curl -fsSL https://raw.githubusercontent.com/lucamorettioperate/portale-cwp/main/strumenti/backup/installa_backup_mac.sh | zsh </w:t>
+      </w:r>
+      <w:r>
+        <w:rPr>
+          <w:rFonts w:ascii="Arial" w:cs="Arial" w:eastAsia="Arial" w:hAnsi="Arial"/>
+          <w:color w:val="1B2118"/>
+          <w:sz w:val="21"/>
+          <w:szCs w:val="21"/>
+        </w:rPr>
+        <w:t xml:space="preserve">``</w:t>
       </w:r>
     </w:p>
     <w:p>
@@ -7427,7 +7430,7 @@
           <w:sz w:val="21"/>
           <w:szCs w:val="21"/>
         </w:rPr>
-        <w:t xml:space="preserve">Tornate all'editor, scegliete la funzione </w:t>
+        <w:t xml:space="preserve">Quando lo chiede, incollate la chiave service_role e premete Invio (mentre la incollate non si vede). La chiave va nel </w:t>
       </w:r>
       <w:r>
         <w:rPr>
@@ -7438,96 +7441,16 @@
           <w:sz w:val="21"/>
           <w:szCs w:val="21"/>
         </w:rPr>
-        <w:t xml:space="preserve">installa</w:t>
-      </w:r>
-      <w:r>
-        <w:rPr>
-          <w:rFonts w:ascii="Arial" w:cs="Arial" w:eastAsia="Arial" w:hAnsi="Arial"/>
-          <w:color w:val="1B2118"/>
-          <w:sz w:val="21"/>
-          <w:szCs w:val="21"/>
-        </w:rPr>
-        <w:t xml:space="preserve"> nel menu in alto e premete </w:t>
-      </w:r>
-      <w:r>
-        <w:rPr>
-          <w:rFonts w:ascii="Arial" w:cs="Arial" w:eastAsia="Arial" w:hAnsi="Arial"/>
-          <w:b/>
-          <w:bCs/>
-          <w:color w:val="1B2118"/>
-          <w:sz w:val="21"/>
-          <w:szCs w:val="21"/>
-        </w:rPr>
-        <w:t xml:space="preserve">Esegui</w:t>
-      </w:r>
-      <w:r>
-        <w:rPr>
-          <w:rFonts w:ascii="Arial" w:cs="Arial" w:eastAsia="Arial" w:hAnsi="Arial"/>
-          <w:color w:val="1B2118"/>
-          <w:sz w:val="21"/>
-          <w:szCs w:val="21"/>
-        </w:rPr>
-        <w:t xml:space="preserve">. Google chiede l'autorizzazione: scegliete l'account, </w:t>
-      </w:r>
-      <w:r>
-        <w:rPr>
-          <w:rFonts w:ascii="Arial" w:cs="Arial" w:eastAsia="Arial" w:hAnsi="Arial"/>
-          <w:i/>
-          <w:iCs/>
-          <w:color w:val="1B2118"/>
-          <w:sz w:val="21"/>
-          <w:szCs w:val="21"/>
-        </w:rPr>
-        <w:t xml:space="preserve">Avanzate</w:t>
-      </w:r>
-      <w:r>
-        <w:rPr>
-          <w:rFonts w:ascii="Arial" w:cs="Arial" w:eastAsia="Arial" w:hAnsi="Arial"/>
-          <w:color w:val="1B2118"/>
-          <w:sz w:val="21"/>
-          <w:szCs w:val="21"/>
-        </w:rPr>
-        <w:t xml:space="preserve"> → </w:t>
-      </w:r>
-      <w:r>
-        <w:rPr>
-          <w:rFonts w:ascii="Arial" w:cs="Arial" w:eastAsia="Arial" w:hAnsi="Arial"/>
-          <w:i/>
-          <w:iCs/>
-          <w:color w:val="1B2118"/>
-          <w:sz w:val="21"/>
-          <w:szCs w:val="21"/>
-        </w:rPr>
-        <w:t xml:space="preserve">Vai a Backup CWP</w:t>
-      </w:r>
-      <w:r>
-        <w:rPr>
-          <w:rFonts w:ascii="Arial" w:cs="Arial" w:eastAsia="Arial" w:hAnsi="Arial"/>
-          <w:color w:val="1B2118"/>
-          <w:sz w:val="21"/>
-          <w:szCs w:val="21"/>
-        </w:rPr>
-        <w:t xml:space="preserve"> → </w:t>
-      </w:r>
-      <w:r>
-        <w:rPr>
-          <w:rFonts w:ascii="Arial" w:cs="Arial" w:eastAsia="Arial" w:hAnsi="Arial"/>
-          <w:b/>
-          <w:bCs/>
-          <w:color w:val="1B2118"/>
-          <w:sz w:val="21"/>
-          <w:szCs w:val="21"/>
-        </w:rPr>
-        <w:t xml:space="preserve">Consenti</w:t>
-      </w:r>
-      <w:r>
-        <w:rPr>
-          <w:rFonts w:ascii="Arial" w:cs="Arial" w:eastAsia="Arial" w:hAnsi="Arial"/>
-          <w:color w:val="1B2118"/>
-          <w:sz w:val="21"/>
-          <w:szCs w:val="21"/>
-        </w:rPr>
-        <w:t xml:space="preserve"> (servono Drive, connessioni esterne ed email).</w:t>
+        <w:t xml:space="preserve">Portachiavi</w:t>
+      </w:r>
+      <w:r>
+        <w:rPr>
+          <w:rFonts w:ascii="Arial" w:cs="Arial" w:eastAsia="Arial" w:hAnsi="Arial"/>
+          <w:color w:val="1B2118"/>
+          <w:sz w:val="21"/>
+          <w:szCs w:val="21"/>
+        </w:rPr>
+        <w:t xml:space="preserve"> del Mac (voce «Backup Portale CWP (Supabase)») e non finisce in nessun file.</w:t>
       </w:r>
     </w:p>
     <w:p>
@@ -7546,7 +7469,25 @@
           <w:sz w:val="21"/>
           <w:szCs w:val="21"/>
         </w:rPr>
-        <w:t xml:space="preserve">Scegliete la funzione </w:t>
+        <w:t xml:space="preserve">L'installazione crea il lavoro pianificato delle 20:00 (</w:t>
+      </w:r>
+      <w:r>
+        <w:rPr>
+          <w:rFonts w:ascii="Consolas" w:cs="Consolas" w:eastAsia="Consolas" w:hAnsi="Consolas"/>
+          <w:color w:val="2F5D3A"/>
+          <w:sz w:val="21"/>
+          <w:szCs w:val="21"/>
+        </w:rPr>
+        <w:t xml:space="preserve">it.operate.cwp-backup</w:t>
+      </w:r>
+      <w:r>
+        <w:rPr>
+          <w:rFonts w:ascii="Arial" w:cs="Arial" w:eastAsia="Arial" w:hAnsi="Arial"/>
+          <w:color w:val="1B2118"/>
+          <w:sz w:val="21"/>
+          <w:szCs w:val="21"/>
+        </w:rPr>
+        <w:t xml:space="preserve">) e fa subito un </w:t>
       </w:r>
       <w:r>
         <w:rPr>
@@ -7557,16 +7498,16 @@
           <w:sz w:val="21"/>
           <w:szCs w:val="21"/>
         </w:rPr>
-        <w:t xml:space="preserve">provaOra</w:t>
-      </w:r>
-      <w:r>
-        <w:rPr>
-          <w:rFonts w:ascii="Arial" w:cs="Arial" w:eastAsia="Arial" w:hAnsi="Arial"/>
-          <w:color w:val="1B2118"/>
-          <w:sz w:val="21"/>
-          <w:szCs w:val="21"/>
-        </w:rPr>
-        <w:t xml:space="preserve"> e premete </w:t>
+        <w:t xml:space="preserve">backup di prova</w:t>
+      </w:r>
+      <w:r>
+        <w:rPr>
+          <w:rFonts w:ascii="Arial" w:cs="Arial" w:eastAsia="Arial" w:hAnsi="Arial"/>
+          <w:color w:val="1B2118"/>
+          <w:sz w:val="21"/>
+          <w:szCs w:val="21"/>
+        </w:rPr>
+        <w:t xml:space="preserve">: nel Terminale compare l'esito e su Drive, in Cwp › backup, la cartella con la data di oggi. Se macOS chiede di consentire l'accesso ai file di Google Drive, premete </w:t>
       </w:r>
       <w:r>
         <w:rPr>
@@ -7577,16 +7518,35 @@
           <w:sz w:val="21"/>
           <w:szCs w:val="21"/>
         </w:rPr>
-        <w:t xml:space="preserve">Esegui</w:t>
-      </w:r>
-      <w:r>
-        <w:rPr>
-          <w:rFonts w:ascii="Arial" w:cs="Arial" w:eastAsia="Arial" w:hAnsi="Arial"/>
-          <w:color w:val="1B2118"/>
-          <w:sz w:val="21"/>
-          <w:szCs w:val="21"/>
-        </w:rPr>
-        <w:t xml:space="preserve">: dopo uno o due minuti nella cartella Cwp compare il primo «Backup_CWP_…». Aprite </w:t>
+        <w:t xml:space="preserve">Consenti</w:t>
+      </w:r>
+      <w:r>
+        <w:rPr>
+          <w:rFonts w:ascii="Arial" w:cs="Arial" w:eastAsia="Arial" w:hAnsi="Arial"/>
+          <w:color w:val="1B2118"/>
+          <w:sz w:val="21"/>
+          <w:szCs w:val="21"/>
+        </w:rPr>
+        <w:t xml:space="preserve">.</w:t>
+      </w:r>
+    </w:p>
+    <w:p>
+      <w:pPr>
+        <w:spacing w:after="60"/>
+      </w:pPr>
+    </w:p>
+    <w:p>
+      <w:pPr>
+        <w:spacing w:after="140" w:line="300"/>
+      </w:pPr>
+      <w:r>
+        <w:rPr>
+          <w:rFonts w:ascii="Arial" w:cs="Arial" w:eastAsia="Arial" w:hAnsi="Arial"/>
+          <w:color w:val="1B2118"/>
+          <w:sz w:val="21"/>
+          <w:szCs w:val="21"/>
+        </w:rPr>
+        <w:t xml:space="preserve">Il programma è nel repository: </w:t>
       </w:r>
       <w:r>
         <w:rPr>
@@ -7595,16 +7555,16 @@
           <w:sz w:val="21"/>
           <w:szCs w:val="21"/>
         </w:rPr>
-        <w:t xml:space="preserve">esito.json</w:t>
-      </w:r>
-      <w:r>
-        <w:rPr>
-          <w:rFonts w:ascii="Arial" w:cs="Arial" w:eastAsia="Arial" w:hAnsi="Arial"/>
-          <w:color w:val="1B2118"/>
-          <w:sz w:val="21"/>
-          <w:szCs w:val="21"/>
-        </w:rPr>
-        <w:t xml:space="preserve">: deve dire </w:t>
+        <w:t xml:space="preserve">strumenti/backup/installa_backup_mac.sh</w:t>
+      </w:r>
+      <w:r>
+        <w:rPr>
+          <w:rFonts w:ascii="Arial" w:cs="Arial" w:eastAsia="Arial" w:hAnsi="Arial"/>
+          <w:color w:val="1B2118"/>
+          <w:sz w:val="21"/>
+          <w:szCs w:val="21"/>
+        </w:rPr>
+        <w:t xml:space="preserve"> (installazione) e </w:t>
       </w:r>
       <w:r>
         <w:rPr>
@@ -7613,55 +7573,60 @@
           <w:sz w:val="21"/>
           <w:szCs w:val="21"/>
         </w:rPr>
-        <w:t xml:space="preserve">"completo": true</w:t>
-      </w:r>
-      <w:r>
-        <w:rPr>
-          <w:rFonts w:ascii="Arial" w:cs="Arial" w:eastAsia="Arial" w:hAnsi="Arial"/>
-          <w:color w:val="1B2118"/>
-          <w:sz w:val="21"/>
-          <w:szCs w:val="21"/>
-        </w:rPr>
-        <w:t xml:space="preserve">.</w:t>
-      </w:r>
-    </w:p>
-    <w:p>
-      <w:pPr>
-        <w:pStyle w:val="ListParagraph"/>
-        <w:numPr>
-          <w:ilvl w:val="0"/>
-          <w:numId w:val="5"/>
-        </w:numPr>
-        <w:spacing w:after="70" w:line="290"/>
-      </w:pPr>
-      <w:r>
-        <w:rPr>
-          <w:rFonts w:ascii="Arial" w:cs="Arial" w:eastAsia="Arial" w:hAnsi="Arial"/>
-          <w:color w:val="1B2118"/>
-          <w:sz w:val="21"/>
-          <w:szCs w:val="21"/>
-        </w:rPr>
-        <w:t xml:space="preserve">In </w:t>
-      </w:r>
-      <w:r>
-        <w:rPr>
-          <w:rFonts w:ascii="Arial" w:cs="Arial" w:eastAsia="Arial" w:hAnsi="Arial"/>
-          <w:b/>
-          <w:bCs/>
-          <w:color w:val="1B2118"/>
-          <w:sz w:val="21"/>
-          <w:szCs w:val="21"/>
-        </w:rPr>
-        <w:t xml:space="preserve">Attivatori</w:t>
-      </w:r>
-      <w:r>
-        <w:rPr>
-          <w:rFonts w:ascii="Arial" w:cs="Arial" w:eastAsia="Arial" w:hAnsi="Arial"/>
-          <w:color w:val="1B2118"/>
-          <w:sz w:val="21"/>
-          <w:szCs w:val="21"/>
-        </w:rPr>
-        <w:t xml:space="preserve"> (sveglia a sinistra) devono comparire due attivatori giornalieri di </w:t>
+        <w:t xml:space="preserve">strumenti/backup/backup_cwp_mac.sh</w:t>
+      </w:r>
+      <w:r>
+        <w:rPr>
+          <w:rFonts w:ascii="Arial" w:cs="Arial" w:eastAsia="Arial" w:hAnsi="Arial"/>
+          <w:color w:val="1B2118"/>
+          <w:sz w:val="21"/>
+          <w:szCs w:val="21"/>
+        </w:rPr>
+        <w:t xml:space="preserve"> (backup). Si può rieseguire il comando per aggiornare il programma o cambiare la chiave. Per fermare i backup, nel Terminale:</w:t>
+      </w:r>
+    </w:p>
+    <w:p>
+      <w:pPr>
+        <w:shd w:fill="F6F4EE" w:color="auto" w:val="clear"/>
+        <w:spacing w:after="0" w:before="60" w:line="220"/>
+      </w:pPr>
+      <w:r>
+        <w:rPr>
+          <w:rFonts w:ascii="Consolas" w:cs="Consolas" w:eastAsia="Consolas" w:hAnsi="Consolas"/>
+          <w:color w:val="1B2118"/>
+          <w:sz w:val="14"/>
+          <w:szCs w:val="14"/>
+        </w:rPr>
+        <w:t xml:space="preserve">launchctl bootout gui/$(id -u)/it.operate.cwp-backup</w:t>
+      </w:r>
+    </w:p>
+    <w:p>
+      <w:pPr>
+        <w:shd w:fill="F6F4EE" w:color="auto" w:val="clear"/>
+        <w:spacing w:after="200" w:before="0" w:line="220"/>
+      </w:pPr>
+      <w:r>
+        <w:rPr>
+          <w:rFonts w:ascii="Consolas" w:cs="Consolas" w:eastAsia="Consolas" w:hAnsi="Consolas"/>
+          <w:color w:val="1B2118"/>
+          <w:sz w:val="14"/>
+          <w:szCs w:val="14"/>
+        </w:rPr>
+        <w:t xml:space="preserve">rm ~/Library/LaunchAgents/it.operate.cwp-backup.plist</w:t>
+      </w:r>
+    </w:p>
+    <w:p>
+      <w:pPr>
+        <w:spacing w:after="140" w:line="300"/>
+      </w:pPr>
+      <w:r>
+        <w:rPr>
+          <w:rFonts w:ascii="Arial" w:cs="Arial" w:eastAsia="Arial" w:hAnsi="Arial"/>
+          <w:color w:val="1B2118"/>
+          <w:sz w:val="21"/>
+          <w:szCs w:val="21"/>
+        </w:rPr>
+        <w:t xml:space="preserve">Il vecchio programma in Google Apps Script (</w:t>
       </w:r>
       <w:r>
         <w:rPr>
@@ -7670,35 +7635,16 @@
           <w:sz w:val="21"/>
           <w:szCs w:val="21"/>
         </w:rPr>
-        <w:t xml:space="preserve">eseguiBackup</w:t>
-      </w:r>
-      <w:r>
-        <w:rPr>
-          <w:rFonts w:ascii="Arial" w:cs="Arial" w:eastAsia="Arial" w:hAnsi="Arial"/>
-          <w:color w:val="1B2118"/>
-          <w:sz w:val="21"/>
-          <w:szCs w:val="21"/>
-        </w:rPr>
-        <w:t xml:space="preserve">, alle 13 e alle 21.</w:t>
-      </w:r>
-    </w:p>
-    <w:p>
-      <w:pPr>
-        <w:spacing w:after="60"/>
-      </w:pPr>
-    </w:p>
-    <w:p>
-      <w:pPr>
-        <w:spacing w:after="140" w:line="300"/>
-      </w:pPr>
-      <w:r>
-        <w:rPr>
-          <w:rFonts w:ascii="Arial" w:cs="Arial" w:eastAsia="Arial" w:hAnsi="Arial"/>
-          <w:color w:val="1B2118"/>
-          <w:sz w:val="21"/>
-          <w:szCs w:val="21"/>
-        </w:rPr>
-        <w:t xml:space="preserve">Se la chiave service_role di Supabase cambia, aggiornate la proprietà dello script. Per fermare i backup cancellate i due attivatori.</w:t>
+        <w:t xml:space="preserve">BackupCWP.gs</w:t>
+      </w:r>
+      <w:r>
+        <w:rPr>
+          <w:rFonts w:ascii="Arial" w:cs="Arial" w:eastAsia="Arial" w:hAnsi="Arial"/>
+          <w:color w:val="1B2118"/>
+          <w:sz w:val="21"/>
+          <w:szCs w:val="21"/>
+        </w:rPr>
+        <w:t xml:space="preserve">, progetto «Backup CWP») non funziona più per il blocco di Google ed è stato tolto dal repository.</w:t>
       </w:r>
     </w:p>
     <w:p>
@@ -7716,7 +7662,246 @@
           <w:sz w:val="25"/>
           <w:szCs w:val="25"/>
         </w:rPr>
-        <w:t xml:space="preserve">Ripristino da un backup automatico</w:t>
+        <w:t xml:space="preserve">Backup manuale (dal browser)</w:t>
+      </w:r>
+    </w:p>
+    <w:p>
+      <w:pPr>
+        <w:spacing w:after="140" w:line="300"/>
+      </w:pPr>
+      <w:r>
+        <w:rPr>
+          <w:rFonts w:ascii="Arial" w:cs="Arial" w:eastAsia="Arial" w:hAnsi="Arial"/>
+          <w:color w:val="1B2118"/>
+          <w:sz w:val="21"/>
+          <w:szCs w:val="21"/>
+        </w:rPr>
+        <w:t xml:space="preserve">Quando il backup automatico non è disponibile, Claude può fare un </w:t>
+      </w:r>
+      <w:r>
+        <w:rPr>
+          <w:rFonts w:ascii="Arial" w:cs="Arial" w:eastAsia="Arial" w:hAnsi="Arial"/>
+          <w:b/>
+          <w:bCs/>
+          <w:color w:val="1B2118"/>
+          <w:sz w:val="21"/>
+          <w:szCs w:val="21"/>
+        </w:rPr>
+        <w:t xml:space="preserve">backup manuale</w:t>
+      </w:r>
+      <w:r>
+        <w:rPr>
+          <w:rFonts w:ascii="Arial" w:cs="Arial" w:eastAsia="Arial" w:hAnsi="Arial"/>
+          <w:color w:val="1B2118"/>
+          <w:sz w:val="21"/>
+          <w:szCs w:val="21"/>
+        </w:rPr>
+        <w:t xml:space="preserve"> dal browser di Luca (il primo è del 21/10/2026, in Cwp › backup › 2026-10-21), con lo stesso contenuto:</w:t>
+      </w:r>
+    </w:p>
+    <w:p>
+      <w:pPr>
+        <w:pStyle w:val="ListParagraph"/>
+        <w:numPr>
+          <w:ilvl w:val="0"/>
+          <w:numId w:val="2"/>
+        </w:numPr>
+        <w:spacing w:after="70" w:line="290"/>
+      </w:pPr>
+      <w:r>
+        <w:rPr>
+          <w:rFonts w:ascii="Consolas" w:cs="Consolas" w:eastAsia="Consolas" w:hAnsi="Consolas"/>
+          <w:color w:val="2F5D3A"/>
+          <w:sz w:val="21"/>
+          <w:szCs w:val="21"/>
+        </w:rPr>
+        <w:t xml:space="preserve">database_completo.json</w:t>
+      </w:r>
+      <w:r>
+        <w:rPr>
+          <w:rFonts w:ascii="Arial" w:cs="Arial" w:eastAsia="Arial" w:hAnsi="Arial"/>
+          <w:color w:val="1B2118"/>
+          <w:sz w:val="21"/>
+          <w:szCs w:val="21"/>
+        </w:rPr>
+        <w:t xml:space="preserve">: tutte le tabelle, gli utenti dell'autenticazione (senza password), l'elenco dei file e dei lavori pianificati, letti dal SQL Editor di Supabase con l'accesso di Luca;</w:t>
+      </w:r>
+    </w:p>
+    <w:p>
+      <w:pPr>
+        <w:pStyle w:val="ListParagraph"/>
+        <w:numPr>
+          <w:ilvl w:val="0"/>
+          <w:numId w:val="2"/>
+        </w:numPr>
+        <w:spacing w:after="70" w:line="290"/>
+      </w:pPr>
+      <w:r>
+        <w:rPr>
+          <w:rFonts w:ascii="Consolas" w:cs="Consolas" w:eastAsia="Consolas" w:hAnsi="Consolas"/>
+          <w:color w:val="2F5D3A"/>
+          <w:sz w:val="21"/>
+          <w:szCs w:val="21"/>
+        </w:rPr>
+        <w:t xml:space="preserve">portale-cwp-main.zip</w:t>
+      </w:r>
+      <w:r>
+        <w:rPr>
+          <w:rFonts w:ascii="Arial" w:cs="Arial" w:eastAsia="Arial" w:hAnsi="Arial"/>
+          <w:color w:val="1B2118"/>
+          <w:sz w:val="21"/>
+          <w:szCs w:val="21"/>
+        </w:rPr>
+        <w:t xml:space="preserve">: il codice da GitHub;</w:t>
+      </w:r>
+    </w:p>
+    <w:p>
+      <w:pPr>
+        <w:pStyle w:val="ListParagraph"/>
+        <w:numPr>
+          <w:ilvl w:val="0"/>
+          <w:numId w:val="2"/>
+        </w:numPr>
+        <w:spacing w:after="70" w:line="290"/>
+      </w:pPr>
+      <w:r>
+        <w:rPr>
+          <w:rFonts w:ascii="Consolas" w:cs="Consolas" w:eastAsia="Consolas" w:hAnsi="Consolas"/>
+          <w:color w:val="2F5D3A"/>
+          <w:sz w:val="21"/>
+          <w:szCs w:val="21"/>
+        </w:rPr>
+        <w:t xml:space="preserve">Istruzioni_Ripristino_Portale_CWP.pdf</w:t>
+      </w:r>
+      <w:r>
+        <w:rPr>
+          <w:rFonts w:ascii="Arial" w:cs="Arial" w:eastAsia="Arial" w:hAnsi="Arial"/>
+          <w:color w:val="1B2118"/>
+          <w:sz w:val="21"/>
+          <w:szCs w:val="21"/>
+        </w:rPr>
+        <w:t xml:space="preserve">: questo documento;</w:t>
+      </w:r>
+    </w:p>
+    <w:p>
+      <w:pPr>
+        <w:pStyle w:val="ListParagraph"/>
+        <w:numPr>
+          <w:ilvl w:val="0"/>
+          <w:numId w:val="2"/>
+        </w:numPr>
+        <w:spacing w:after="70" w:line="290"/>
+      </w:pPr>
+      <w:r>
+        <w:rPr>
+          <w:rFonts w:ascii="Consolas" w:cs="Consolas" w:eastAsia="Consolas" w:hAnsi="Consolas"/>
+          <w:color w:val="2F5D3A"/>
+          <w:sz w:val="21"/>
+          <w:szCs w:val="21"/>
+        </w:rPr>
+        <w:t xml:space="preserve">file_caricati/</w:t>
+      </w:r>
+      <w:r>
+        <w:rPr>
+          <w:rFonts w:ascii="Arial" w:cs="Arial" w:eastAsia="Arial" w:hAnsi="Arial"/>
+          <w:color w:val="1B2118"/>
+          <w:sz w:val="21"/>
+          <w:szCs w:val="21"/>
+        </w:rPr>
+        <w:t xml:space="preserve">: i file degli archivi Storage (documenti e modelli), con gli stessi percorsi;</w:t>
+      </w:r>
+    </w:p>
+    <w:p>
+      <w:pPr>
+        <w:pStyle w:val="ListParagraph"/>
+        <w:numPr>
+          <w:ilvl w:val="0"/>
+          <w:numId w:val="2"/>
+        </w:numPr>
+        <w:spacing w:after="70" w:line="290"/>
+      </w:pPr>
+      <w:r>
+        <w:rPr>
+          <w:rFonts w:ascii="Consolas" w:cs="Consolas" w:eastAsia="Consolas" w:hAnsi="Consolas"/>
+          <w:color w:val="2F5D3A"/>
+          <w:sz w:val="21"/>
+          <w:szCs w:val="21"/>
+        </w:rPr>
+        <w:t xml:space="preserve">LEGGIMI.txt</w:t>
+      </w:r>
+      <w:r>
+        <w:rPr>
+          <w:rFonts w:ascii="Arial" w:cs="Arial" w:eastAsia="Arial" w:hAnsi="Arial"/>
+          <w:color w:val="1B2118"/>
+          <w:sz w:val="21"/>
+          <w:szCs w:val="21"/>
+        </w:rPr>
+        <w:t xml:space="preserve">: contenuto e ordine del ripristino.</w:t>
+      </w:r>
+    </w:p>
+    <w:p>
+      <w:pPr>
+        <w:spacing w:after="140" w:line="300"/>
+      </w:pPr>
+      <w:r>
+        <w:rPr>
+          <w:rFonts w:ascii="Arial" w:cs="Arial" w:eastAsia="Arial" w:hAnsi="Arial"/>
+          <w:color w:val="1B2118"/>
+          <w:sz w:val="21"/>
+          <w:szCs w:val="21"/>
+        </w:rPr>
+        <w:t xml:space="preserve">Il file </w:t>
+      </w:r>
+      <w:r>
+        <w:rPr>
+          <w:rFonts w:ascii="Consolas" w:cs="Consolas" w:eastAsia="Consolas" w:hAnsi="Consolas"/>
+          <w:color w:val="2F5D3A"/>
+          <w:sz w:val="21"/>
+          <w:szCs w:val="21"/>
+        </w:rPr>
+        <w:t xml:space="preserve">database_completo.json</w:t>
+      </w:r>
+      <w:r>
+        <w:rPr>
+          <w:rFonts w:ascii="Arial" w:cs="Arial" w:eastAsia="Arial" w:hAnsi="Arial"/>
+          <w:color w:val="1B2118"/>
+          <w:sz w:val="21"/>
+          <w:szCs w:val="21"/>
+        </w:rPr>
+        <w:t xml:space="preserve"> si ripristina come un backup automatico, indicando il file al posto della cartella:</w:t>
+      </w:r>
+    </w:p>
+    <w:p>
+      <w:pPr>
+        <w:shd w:fill="F6F4EE" w:color="auto" w:val="clear"/>
+        <w:spacing w:after="200" w:before="60" w:line="220"/>
+      </w:pPr>
+      <w:r>
+        <w:rPr>
+          <w:rFonts w:ascii="Consolas" w:cs="Consolas" w:eastAsia="Consolas" w:hAnsi="Consolas"/>
+          <w:color w:val="1B2118"/>
+          <w:sz w:val="14"/>
+          <w:szCs w:val="14"/>
+        </w:rPr>
+        <w:t xml:space="preserve">node strumenti/backup/genera_sql_ripristino.mjs database_completo.json ripristino_dati.sql</w:t>
+      </w:r>
+    </w:p>
+    <w:p>
+      <w:pPr>
+        <w:pStyle w:val="Heading2"/>
+        <w:keepNext/>
+        <w:spacing w:after="120" w:before="240"/>
+      </w:pPr>
+      <w:r>
+        <w:rPr>
+          <w:rFonts w:ascii="Arial" w:cs="Arial" w:eastAsia="Arial" w:hAnsi="Arial"/>
+          <w:b/>
+          <w:bCs/>
+          <w:color w:val="2F5D3A"/>
+          <w:sz w:val="25"/>
+          <w:szCs w:val="25"/>
+        </w:rPr>
+        <w:t xml:space="preserve">Ripristino da un backup (automatico o manuale)</w:t>
       </w:r>
     </w:p>
     <w:p>
@@ -7778,7 +7963,7 @@
           <w:sz w:val="21"/>
           <w:szCs w:val="21"/>
         </w:rPr>
-        <w:t xml:space="preserve">: l'ultima cartella con </w:t>
+        <w:t xml:space="preserve">: l'ultima cartella di Cwp › backup con </w:t>
       </w:r>
       <w:r>
         <w:rPr>
@@ -7787,16 +7972,36 @@
           <w:sz w:val="21"/>
           <w:szCs w:val="21"/>
         </w:rPr>
-        <w:t xml:space="preserve">esito.json</w:t>
-      </w:r>
-      <w:r>
-        <w:rPr>
-          <w:rFonts w:ascii="Arial" w:cs="Arial" w:eastAsia="Arial" w:hAnsi="Arial"/>
-          <w:color w:val="1B2118"/>
-          <w:sz w:val="21"/>
-          <w:szCs w:val="21"/>
-        </w:rPr>
-        <w:t xml:space="preserve"> → </w:t>
+        <w:t xml:space="preserve">esito.txt</w:t>
+      </w:r>
+      <w:r>
+        <w:rPr>
+          <w:rFonts w:ascii="Arial" w:cs="Arial" w:eastAsia="Arial" w:hAnsi="Arial"/>
+          <w:color w:val="1B2118"/>
+          <w:sz w:val="21"/>
+          <w:szCs w:val="21"/>
+        </w:rPr>
+        <w:t xml:space="preserve"> → «Esito: completo, nessun errore». Scaricatela dal Drive (tasto destro → </w:t>
+      </w:r>
+      <w:r>
+        <w:rPr>
+          <w:rFonts w:ascii="Arial" w:cs="Arial" w:eastAsia="Arial" w:hAnsi="Arial"/>
+          <w:i/>
+          <w:iCs/>
+          <w:color w:val="1B2118"/>
+          <w:sz w:val="21"/>
+          <w:szCs w:val="21"/>
+        </w:rPr>
+        <w:t xml:space="preserve">Scarica</w:t>
+      </w:r>
+      <w:r>
+        <w:rPr>
+          <w:rFonts w:ascii="Arial" w:cs="Arial" w:eastAsia="Arial" w:hAnsi="Arial"/>
+          <w:color w:val="1B2118"/>
+          <w:sz w:val="21"/>
+          <w:szCs w:val="21"/>
+        </w:rPr>
+        <w:t xml:space="preserve">) e scompattate </w:t>
       </w:r>
       <w:r>
         <w:rPr>
@@ -7805,45 +8010,7 @@
           <w:sz w:val="21"/>
           <w:szCs w:val="21"/>
         </w:rPr>
-        <w:t xml:space="preserve">"completo": true</w:t>
-      </w:r>
-      <w:r>
-        <w:rPr>
-          <w:rFonts w:ascii="Arial" w:cs="Arial" w:eastAsia="Arial" w:hAnsi="Arial"/>
-          <w:color w:val="1B2118"/>
-          <w:sz w:val="21"/>
-          <w:szCs w:val="21"/>
-        </w:rPr>
-        <w:t xml:space="preserve">. Scaricatela dal Drive (tasto destro → </w:t>
-      </w:r>
-      <w:r>
-        <w:rPr>
-          <w:rFonts w:ascii="Arial" w:cs="Arial" w:eastAsia="Arial" w:hAnsi="Arial"/>
-          <w:i/>
-          <w:iCs/>
-          <w:color w:val="1B2118"/>
-          <w:sz w:val="21"/>
-          <w:szCs w:val="21"/>
-        </w:rPr>
-        <w:t xml:space="preserve">Scarica</w:t>
-      </w:r>
-      <w:r>
-        <w:rPr>
-          <w:rFonts w:ascii="Arial" w:cs="Arial" w:eastAsia="Arial" w:hAnsi="Arial"/>
-          <w:color w:val="1B2118"/>
-          <w:sz w:val="21"/>
-          <w:szCs w:val="21"/>
-        </w:rPr>
-        <w:t xml:space="preserve">) e scompattate lo ZIP di </w:t>
-      </w:r>
-      <w:r>
-        <w:rPr>
-          <w:rFonts w:ascii="Consolas" w:cs="Consolas" w:eastAsia="Consolas" w:hAnsi="Consolas"/>
-          <w:color w:val="2F5D3A"/>
-          <w:sz w:val="21"/>
-          <w:szCs w:val="21"/>
-        </w:rPr>
-        <w:t xml:space="preserve">1_codice</w:t>
+        <w:t xml:space="preserve">portale-cwp-main.zip</w:t>
       </w:r>
       <w:r>
         <w:rPr>
@@ -7882,7 +8049,7 @@
           <w:sz w:val="21"/>
           <w:szCs w:val="21"/>
         </w:rPr>
-        <w:t xml:space="preserve"> ed esecuzione degli script 01-37, come nel capitolo «Supabase: ricostruzione da zero», passi 1 e 2.</w:t>
+        <w:t xml:space="preserve"> ed esecuzione degli script 01-38, come nel capitolo «Supabase: ricostruzione da zero», passi 1 e 2.</w:t>
       </w:r>
     </w:p>
     <w:p>
@@ -7921,7 +8088,7 @@
           <w:sz w:val="21"/>
           <w:szCs w:val="21"/>
         </w:rPr>
-        <w:t xml:space="preserve">node strumenti/backup/genera_sql_ripristino.mjs &lt;cartella 2_database&gt; ripristino_dati.sql</w:t>
+        <w:t xml:space="preserve">node strumenti/backup/genera_sql_ripristino.mjs database_completo.json ripristino_dati.sql</w:t>
       </w:r>
       <w:r>
         <w:rPr>
@@ -8026,7 +8193,7 @@
           <w:sz w:val="21"/>
           <w:szCs w:val="21"/>
         </w:rPr>
-        <w:t xml:space="preserve">SUPABASE_URL=… SUPABASE_SERVICE_ROLE_KEY=… node strumenti/backup/carica_file_ripristino.mjs &lt;cartella 3_file&gt;</w:t>
+        <w:t xml:space="preserve">SUPABASE_URL=… SUPABASE_SERVICE_ROLE_KEY=… node strumenti/backup/carica_file_ripristino.mjs file_caricati</w:t>
       </w:r>
       <w:r>
         <w:rPr>
@@ -8083,25 +8250,7 @@
           <w:sz w:val="21"/>
           <w:szCs w:val="21"/>
         </w:rPr>
-        <w:t xml:space="preserve"> del codice, con i segreti elencati in </w:t>
-      </w:r>
-      <w:r>
-        <w:rPr>
-          <w:rFonts w:ascii="Consolas" w:cs="Consolas" w:eastAsia="Consolas" w:hAnsi="Consolas"/>
-          <w:color w:val="2F5D3A"/>
-          <w:sz w:val="21"/>
-          <w:szCs w:val="21"/>
-        </w:rPr>
-        <w:t xml:space="preserve">4_servizi/configurazione_servizi.json</w:t>
-      </w:r>
-      <w:r>
-        <w:rPr>
-          <w:rFonts w:ascii="Arial" w:cs="Arial" w:eastAsia="Arial" w:hAnsi="Arial"/>
-          <w:color w:val="1B2118"/>
-          <w:sz w:val="21"/>
-          <w:szCs w:val="21"/>
-        </w:rPr>
-        <w:t xml:space="preserve"> (capitolo «Chiavi delle funzioni»).</w:t>
+        <w:t xml:space="preserve"> del codice, con i segreti elencati nel capitolo «Chiavi delle funzioni».</w:t>
       </w:r>
     </w:p>
     <w:p>
@@ -8171,25 +8320,7 @@
           <w:sz w:val="21"/>
           <w:szCs w:val="21"/>
         </w:rPr>
-        <w:t xml:space="preserve">: come nei capitoli di questo documento, con i valori di </w:t>
-      </w:r>
-      <w:r>
-        <w:rPr>
-          <w:rFonts w:ascii="Consolas" w:cs="Consolas" w:eastAsia="Consolas" w:hAnsi="Consolas"/>
-          <w:color w:val="2F5D3A"/>
-          <w:sz w:val="21"/>
-          <w:szCs w:val="21"/>
-        </w:rPr>
-        <w:t xml:space="preserve">4_servizi</w:t>
-      </w:r>
-      <w:r>
-        <w:rPr>
-          <w:rFonts w:ascii="Arial" w:cs="Arial" w:eastAsia="Arial" w:hAnsi="Arial"/>
-          <w:color w:val="1B2118"/>
-          <w:sz w:val="21"/>
-          <w:szCs w:val="21"/>
-        </w:rPr>
-        <w:t xml:space="preserve">.</w:t>
+        <w:t xml:space="preserve">: come nei capitoli di questo documento.</w:t>
       </w:r>
     </w:p>
     <w:p>
@@ -8268,7 +8399,43 @@
           <w:sz w:val="21"/>
           <w:szCs w:val="21"/>
         </w:rPr>
-        <w:t xml:space="preserve">La procedura dei dati è stata provata il 21/10/2026 sul banco locale. Su un database ricostruito con gli script 01-35 sono state ripristinate 35 tabelle e 3 utenti, con dati identici al JSON. La prova si è fermata da sola alla seconda esecuzione; un dato vecchio non valido è stato segnalato e i contatori sono stati riallineati. Da ripetere ogni tre mesi su un progetto Supabase di prova (tabella «Copie di sicurezza»).</w:t>
+        <w:t xml:space="preserve">La procedura dei dati è stata provata il 21/10/2026 sul banco locale, anche con il </w:t>
+      </w:r>
+      <w:r>
+        <w:rPr>
+          <w:rFonts w:ascii="Consolas" w:cs="Consolas" w:eastAsia="Consolas" w:hAnsi="Consolas"/>
+          <w:color w:val="2F5D3A"/>
+          <w:sz w:val="21"/>
+          <w:szCs w:val="21"/>
+        </w:rPr>
+        <w:t xml:space="preserve">database_completo.json</w:t>
+      </w:r>
+      <w:r>
+        <w:rPr>
+          <w:rFonts w:ascii="Arial" w:cs="Arial" w:eastAsia="Arial" w:hAnsi="Arial"/>
+          <w:color w:val="1B2118"/>
+          <w:sz w:val="21"/>
+          <w:szCs w:val="21"/>
+        </w:rPr>
+        <w:t xml:space="preserve"> della funzione </w:t>
+      </w:r>
+      <w:r>
+        <w:rPr>
+          <w:rFonts w:ascii="Consolas" w:cs="Consolas" w:eastAsia="Consolas" w:hAnsi="Consolas"/>
+          <w:color w:val="2F5D3A"/>
+          <w:sz w:val="21"/>
+          <w:szCs w:val="21"/>
+        </w:rPr>
+        <w:t xml:space="preserve">backup_completo()</w:t>
+      </w:r>
+      <w:r>
+        <w:rPr>
+          <w:rFonts w:ascii="Arial" w:cs="Arial" w:eastAsia="Arial" w:hAnsi="Arial"/>
+          <w:color w:val="1B2118"/>
+          <w:sz w:val="21"/>
+          <w:szCs w:val="21"/>
+        </w:rPr>
+        <w:t xml:space="preserve"> (38 tabelle, righe identiche dopo il ripristino). Nella prima prova, su un database ricostruito con gli script 01-35, sono state ripristinate 35 tabelle e 3 utenti, con dati identici al JSON. La prova si è fermata da sola alla seconda esecuzione; un dato vecchio non valido è stato segnalato e i contatori sono stati riallineati. Da ripetere ogni tre mesi su un progetto Supabase di prova (tabella «Copie di sicurezza»).</w:t>
       </w:r>
     </w:p>
     <w:p>
@@ -10434,7 +10601,7 @@
           <w:sz w:val="21"/>
           <w:szCs w:val="21"/>
         </w:rPr>
-        <w:t xml:space="preserve">37_notizie_viste.sql</w:t>
+        <w:t xml:space="preserve">38_backup.sql</w:t>
       </w:r>
       <w:r>
         <w:rPr>
@@ -10723,7 +10890,7 @@
           <w:sz w:val="21"/>
           <w:szCs w:val="21"/>
         </w:rPr>
-        <w:t xml:space="preserve">gli script dal 28 al 35 aggiungono simulatore, Amministratore principale (29), eliminazione degli utenti mai attivi, assistente, utenti online, Audit User, avvisi di sicurezza (34) e i controlli dei dati chiesti dal collaudo (35) e l'osservatorio Notizie CO2 (36, 37 per il pallino delle notizie nuove); il 35 termina con un conteggio di sola lettura che su un database nuovo vale 0 in tutte le righe;</w:t>
+        <w:t xml:space="preserve">gli script dal 28 al 35 aggiungono simulatore, Amministratore principale (29), eliminazione degli utenti mai attivi, assistente, utenti online, Audit User, avvisi di sicurezza (34) e i controlli dei dati chiesti dal collaudo (35) e l'osservatorio Notizie CO2 (36, 37 per il pallino delle notizie nuove), il backup (38); il 35 termina con un conteggio di sola lettura che su un database nuovo vale 0 in tutte le righe;</w:t>
       </w:r>
     </w:p>
     <w:p>
@@ -15393,7 +15560,7 @@
         <w:szCs w:val="16"/>
       </w:rPr>
       <w:tab/>
-      <w:t xml:space="preserve">Istruzioni di ripristino · Rev. 1.9 · 21/10/2026</w:t>
+      <w:t xml:space="preserve">Istruzioni di ripristino · Rev. 2.0 · 21/10/2026</w:t>
     </w:r>
   </w:p>
 </w:hdr>
@@ -15458,7 +15625,7 @@
         <w:szCs w:val="16"/>
       </w:rPr>
       <w:tab/>
-      <w:t xml:space="preserve">Istruzioni di ripristino · Rev. 1.9 · 21/10/2026</w:t>
+      <w:t xml:space="preserve">Istruzioni di ripristino · Rev. 2.0 · 21/10/2026</w:t>
     </w:r>
   </w:p>
 </w:hdr>

</xml_diff>

<commit_message>
Rilievi N01-N06: risposte nel documento del collaudo, manuali, registri, istruzioni di ripristino, base di conoscenza e presentazione aggiornati
Co-Authored-By: Claude Opus 5.5 <noreply@anthropic.com>
Claude-Session: https://claude.ai/code/session_01E8XCbEeVHWVP3hntUZ6kZ1
</commit_message>
<xml_diff>
--- a/public/documentazione/Istruzioni_Ripristino_Portale_CWP.docx
+++ b/public/documentazione/Istruzioni_Ripristino_Portale_CWP.docx
@@ -302,7 +302,7 @@
                 <w:sz w:val="20"/>
                 <w:szCs w:val="20"/>
               </w:rPr>
-              <w:t xml:space="preserve">Rev. 2.0</w:t>
+              <w:t xml:space="preserve">Rev. 2.1</w:t>
             </w:r>
           </w:p>
         </w:tc>
@@ -365,7 +365,7 @@
                 <w:sz w:val="20"/>
                 <w:szCs w:val="20"/>
               </w:rPr>
-              <w:t xml:space="preserve">21/10/2026</w:t>
+              <w:t xml:space="preserve">22/10/2026</w:t>
             </w:r>
           </w:p>
         </w:tc>
@@ -719,7 +719,7 @@
                 <w:sz w:val="18"/>
                 <w:szCs w:val="18"/>
               </w:rPr>
-              <w:t xml:space="preserve">2.0</w:t>
+              <w:t xml:space="preserve">2.1</w:t>
             </w:r>
           </w:p>
         </w:tc>
@@ -751,7 +751,7 @@
                 <w:sz w:val="18"/>
                 <w:szCs w:val="18"/>
               </w:rPr>
-              <w:t xml:space="preserve">21/10/2026</w:t>
+              <w:t xml:space="preserve">22/10/2026</w:t>
             </w:r>
           </w:p>
         </w:tc>
@@ -783,7 +783,7 @@
                 <w:sz w:val="18"/>
                 <w:szCs w:val="18"/>
               </w:rPr>
-              <w:t xml:space="preserve">Backup giornaliero alle 20:00 dal Mac in Cwp › backup › data (Google blocca Apps Script); backup manuale; script 38.</w:t>
+              <w:t xml:space="preserve">Script 01-39.</w:t>
             </w:r>
           </w:p>
         </w:tc>
@@ -853,7 +853,7 @@
                 <w:sz w:val="18"/>
                 <w:szCs w:val="18"/>
               </w:rPr>
-              <w:t xml:space="preserve">1.9</w:t>
+              <w:t xml:space="preserve">2.0</w:t>
             </w:r>
           </w:p>
         </w:tc>
@@ -919,7 +919,7 @@
                 <w:sz w:val="18"/>
                 <w:szCs w:val="18"/>
               </w:rPr>
-              <w:t xml:space="preserve">Tramite per Google News delle Notizie CO2. Script 37. Tolto il tramite per Google News. Tolto il tramite per Google News.</w:t>
+              <w:t xml:space="preserve">Backup giornaliero alle 20:00 dal Mac in Cwp › backup › data (Google blocca Apps Script); backup manuale; script 38.</w:t>
             </w:r>
           </w:p>
         </w:tc>
@@ -989,7 +989,7 @@
                 <w:sz w:val="18"/>
                 <w:szCs w:val="18"/>
               </w:rPr>
-              <w:t xml:space="preserve">1.8</w:t>
+              <w:t xml:space="preserve">1.9</w:t>
             </w:r>
           </w:p>
         </w:tc>
@@ -1053,7 +1053,7 @@
                 <w:sz w:val="18"/>
                 <w:szCs w:val="18"/>
               </w:rPr>
-              <w:t xml:space="preserve">Script 36 e funzione notizie (Verify JWT disattivato, indirizzo url_notizie, quarto lavoro pianificato).</w:t>
+              <w:t xml:space="preserve">Tramite per Google News delle Notizie CO2. Script 37. Tolto il tramite per Google News. Tolto il tramite per Google News.</w:t>
             </w:r>
           </w:p>
         </w:tc>
@@ -1123,7 +1123,7 @@
                 <w:sz w:val="18"/>
                 <w:szCs w:val="18"/>
               </w:rPr>
-              <w:t xml:space="preserve">1.7</w:t>
+              <w:t xml:space="preserve">1.8</w:t>
             </w:r>
           </w:p>
         </w:tc>
@@ -1189,7 +1189,7 @@
                 <w:sz w:val="18"/>
                 <w:szCs w:val="18"/>
               </w:rPr>
-              <w:t xml:space="preserve">Backup automatico su Google Drive alle 13 e alle 21 (installazione, contenuto) e ripristino da un backup automatico, provato sul banco locale.</w:t>
+              <w:t xml:space="preserve">Script 36 e funzione notizie (Verify JWT disattivato, indirizzo url_notizie, quarto lavoro pianificato).</w:t>
             </w:r>
           </w:p>
         </w:tc>
@@ -1259,7 +1259,7 @@
                 <w:sz w:val="18"/>
                 <w:szCs w:val="18"/>
               </w:rPr>
-              <w:t xml:space="preserve">1.6</w:t>
+              <w:t xml:space="preserve">1.7</w:t>
             </w:r>
           </w:p>
         </w:tc>
@@ -1323,7 +1323,7 @@
                 <w:sz w:val="18"/>
                 <w:szCs w:val="18"/>
               </w:rPr>
-              <w:t xml:space="preserve">Ricostruzione del database con gli script da 01 a 35 (simulatore, Amministratore principale, assistente, utenti online, Audit User, avvisi di sicurezza, controlli del collaudo).</w:t>
+              <w:t xml:space="preserve">Backup automatico su Google Drive alle 13 e alle 21 (installazione, contenuto) e ripristino da un backup automatico, provato sul banco locale.</w:t>
             </w:r>
           </w:p>
         </w:tc>
@@ -1393,7 +1393,7 @@
                 <w:sz w:val="18"/>
                 <w:szCs w:val="18"/>
               </w:rPr>
-              <w:t xml:space="preserve">1.5</w:t>
+              <w:t xml:space="preserve">1.6</w:t>
             </w:r>
           </w:p>
         </w:tc>
@@ -1426,7 +1426,7 @@
                 <w:sz w:val="18"/>
                 <w:szCs w:val="18"/>
               </w:rPr>
-              <w:t xml:space="preserve">20/10/2026</w:t>
+              <w:t xml:space="preserve">21/10/2026</w:t>
             </w:r>
           </w:p>
         </w:tc>
@@ -1459,7 +1459,7 @@
                 <w:sz w:val="18"/>
                 <w:szCs w:val="18"/>
               </w:rPr>
-              <w:t xml:space="preserve">Indirizzo Supabase nella Content-Security-Policy di vercel.json; script 01-34.</w:t>
+              <w:t xml:space="preserve">Ricostruzione del database con gli script da 01 a 35 (simulatore, Amministratore principale, assistente, utenti online, Audit User, avvisi di sicurezza, controlli del collaudo).</w:t>
             </w:r>
           </w:p>
         </w:tc>
@@ -1529,7 +1529,7 @@
                 <w:sz w:val="18"/>
                 <w:szCs w:val="18"/>
               </w:rPr>
-              <w:t xml:space="preserve">1.4</w:t>
+              <w:t xml:space="preserve">1.5</w:t>
             </w:r>
           </w:p>
         </w:tc>
@@ -1593,7 +1593,7 @@
                 <w:sz w:val="18"/>
                 <w:szCs w:val="18"/>
               </w:rPr>
-              <w:t xml:space="preserve">Amministratore principale e verifiche dopo il ripristino (Audit User, assistente).</w:t>
+              <w:t xml:space="preserve">Indirizzo Supabase nella Content-Security-Policy di vercel.json; script 01-34.</w:t>
             </w:r>
           </w:p>
         </w:tc>
@@ -1663,7 +1663,7 @@
                 <w:sz w:val="18"/>
                 <w:szCs w:val="18"/>
               </w:rPr>
-              <w:t xml:space="preserve">1.3</w:t>
+              <w:t xml:space="preserve">1.4</w:t>
             </w:r>
           </w:p>
         </w:tc>
@@ -1729,7 +1729,7 @@
                 <w:sz w:val="18"/>
                 <w:szCs w:val="18"/>
               </w:rPr>
-              <w:t xml:space="preserve">Script 01-33.</w:t>
+              <w:t xml:space="preserve">Amministratore principale e verifiche dopo il ripristino (Audit User, assistente).</w:t>
             </w:r>
           </w:p>
         </w:tc>
@@ -1799,7 +1799,7 @@
                 <w:sz w:val="18"/>
                 <w:szCs w:val="18"/>
               </w:rPr>
-              <w:t xml:space="preserve">1.2</w:t>
+              <w:t xml:space="preserve">1.3</w:t>
             </w:r>
           </w:p>
         </w:tc>
@@ -1863,7 +1863,7 @@
                 <w:sz w:val="18"/>
                 <w:szCs w:val="18"/>
               </w:rPr>
-              <w:t xml:space="preserve">Script 01-32.</w:t>
+              <w:t xml:space="preserve">Script 01-33.</w:t>
             </w:r>
           </w:p>
         </w:tc>
@@ -1933,7 +1933,7 @@
                 <w:sz w:val="18"/>
                 <w:szCs w:val="18"/>
               </w:rPr>
-              <w:t xml:space="preserve">1.1</w:t>
+              <w:t xml:space="preserve">1.2</w:t>
             </w:r>
           </w:p>
         </w:tc>
@@ -1966,7 +1966,7 @@
                 <w:sz w:val="18"/>
                 <w:szCs w:val="18"/>
               </w:rPr>
-              <w:t xml:space="preserve">19/10/2026</w:t>
+              <w:t xml:space="preserve">20/10/2026</w:t>
             </w:r>
           </w:p>
         </w:tc>
@@ -1999,7 +1999,7 @@
                 <w:sz w:val="18"/>
                 <w:szCs w:val="18"/>
               </w:rPr>
-              <w:t xml:space="preserve">Funzione assistente e chiave ANTHROPIC_API_KEY; Claude Console tra i servizi; script 01-31.</w:t>
+              <w:t xml:space="preserve">Script 01-32.</w:t>
             </w:r>
           </w:p>
         </w:tc>
@@ -2069,6 +2069,140 @@
                 <w:sz w:val="18"/>
                 <w:szCs w:val="18"/>
               </w:rPr>
+              <w:t xml:space="preserve">1.1</w:t>
+            </w:r>
+          </w:p>
+        </w:tc>
+        <w:tc>
+          <w:tcPr>
+            <w:tcW w:type="dxa" w:w="1300"/>
+            <w:tcBorders>
+              <w:top w:val="single" w:color="D9D4C5" w:sz="4"/>
+              <w:left w:val="single" w:color="D9D4C5" w:sz="4"/>
+              <w:bottom w:val="single" w:color="D9D4C5" w:sz="4"/>
+              <w:right w:val="single" w:color="D9D4C5" w:sz="4"/>
+            </w:tcBorders>
+            <w:tcMar>
+              <w:top w:type="dxa" w:w="70"/>
+              <w:left w:type="dxa" w:w="110"/>
+              <w:bottom w:type="dxa" w:w="70"/>
+              <w:right w:type="dxa" w:w="110"/>
+            </w:tcMar>
+            <w:vAlign w:val="center"/>
+          </w:tcPr>
+          <w:p>
+            <w:pPr>
+              <w:spacing w:after="0" w:before="0"/>
+            </w:pPr>
+            <w:r>
+              <w:rPr>
+                <w:rFonts w:ascii="Arial" w:cs="Arial" w:eastAsia="Arial" w:hAnsi="Arial"/>
+                <w:color w:val="1B2118"/>
+                <w:sz w:val="18"/>
+                <w:szCs w:val="18"/>
+              </w:rPr>
+              <w:t xml:space="preserve">19/10/2026</w:t>
+            </w:r>
+          </w:p>
+        </w:tc>
+        <w:tc>
+          <w:tcPr>
+            <w:tcW w:type="dxa" w:w="5538"/>
+            <w:tcBorders>
+              <w:top w:val="single" w:color="D9D4C5" w:sz="4"/>
+              <w:left w:val="single" w:color="D9D4C5" w:sz="4"/>
+              <w:bottom w:val="single" w:color="D9D4C5" w:sz="4"/>
+              <w:right w:val="single" w:color="D9D4C5" w:sz="4"/>
+            </w:tcBorders>
+            <w:tcMar>
+              <w:top w:type="dxa" w:w="70"/>
+              <w:left w:type="dxa" w:w="110"/>
+              <w:bottom w:type="dxa" w:w="70"/>
+              <w:right w:type="dxa" w:w="110"/>
+            </w:tcMar>
+            <w:vAlign w:val="center"/>
+          </w:tcPr>
+          <w:p>
+            <w:pPr>
+              <w:spacing w:after="0" w:before="0"/>
+            </w:pPr>
+            <w:r>
+              <w:rPr>
+                <w:rFonts w:ascii="Arial" w:cs="Arial" w:eastAsia="Arial" w:hAnsi="Arial"/>
+                <w:color w:val="1B2118"/>
+                <w:sz w:val="18"/>
+                <w:szCs w:val="18"/>
+              </w:rPr>
+              <w:t xml:space="preserve">Funzione assistente e chiave ANTHROPIC_API_KEY; Claude Console tra i servizi; script 01-31.</w:t>
+            </w:r>
+          </w:p>
+        </w:tc>
+        <w:tc>
+          <w:tcPr>
+            <w:tcW w:type="dxa" w:w="2000"/>
+            <w:tcBorders>
+              <w:top w:val="single" w:color="D9D4C5" w:sz="4"/>
+              <w:left w:val="single" w:color="D9D4C5" w:sz="4"/>
+              <w:bottom w:val="single" w:color="D9D4C5" w:sz="4"/>
+              <w:right w:val="single" w:color="D9D4C5" w:sz="4"/>
+            </w:tcBorders>
+            <w:tcMar>
+              <w:top w:type="dxa" w:w="70"/>
+              <w:left w:type="dxa" w:w="110"/>
+              <w:bottom w:type="dxa" w:w="70"/>
+              <w:right w:type="dxa" w:w="110"/>
+            </w:tcMar>
+            <w:vAlign w:val="center"/>
+          </w:tcPr>
+          <w:p>
+            <w:pPr>
+              <w:spacing w:after="0" w:before="0"/>
+            </w:pPr>
+            <w:r>
+              <w:rPr>
+                <w:rFonts w:ascii="Arial" w:cs="Arial" w:eastAsia="Arial" w:hAnsi="Arial"/>
+                <w:color w:val="1B2118"/>
+                <w:sz w:val="18"/>
+                <w:szCs w:val="18"/>
+              </w:rPr>
+              <w:t xml:space="preserve">Fondazione Operate</w:t>
+            </w:r>
+          </w:p>
+        </w:tc>
+      </w:tr>
+      <w:tr>
+        <w:trPr>
+          <w:cantSplit/>
+        </w:trPr>
+        <w:tc>
+          <w:tcPr>
+            <w:tcW w:type="dxa" w:w="800"/>
+            <w:tcBorders>
+              <w:top w:val="single" w:color="D9D4C5" w:sz="4"/>
+              <w:left w:val="single" w:color="D9D4C5" w:sz="4"/>
+              <w:bottom w:val="single" w:color="D9D4C5" w:sz="4"/>
+              <w:right w:val="single" w:color="D9D4C5" w:sz="4"/>
+            </w:tcBorders>
+            <w:shd w:fill="F6F4EE" w:color="auto" w:val="clear"/>
+            <w:tcMar>
+              <w:top w:type="dxa" w:w="70"/>
+              <w:left w:type="dxa" w:w="110"/>
+              <w:bottom w:type="dxa" w:w="70"/>
+              <w:right w:type="dxa" w:w="110"/>
+            </w:tcMar>
+            <w:vAlign w:val="center"/>
+          </w:tcPr>
+          <w:p>
+            <w:pPr>
+              <w:spacing w:after="0" w:before="0"/>
+            </w:pPr>
+            <w:r>
+              <w:rPr>
+                <w:rFonts w:ascii="Arial" w:cs="Arial" w:eastAsia="Arial" w:hAnsi="Arial"/>
+                <w:color w:val="1B2118"/>
+                <w:sz w:val="18"/>
+                <w:szCs w:val="18"/>
+              </w:rPr>
               <w:t xml:space="preserve">1.0</w:t>
             </w:r>
           </w:p>
@@ -2082,6 +2216,7 @@
               <w:bottom w:val="single" w:color="D9D4C5" w:sz="4"/>
               <w:right w:val="single" w:color="D9D4C5" w:sz="4"/>
             </w:tcBorders>
+            <w:shd w:fill="F6F4EE" w:color="auto" w:val="clear"/>
             <w:tcMar>
               <w:top w:type="dxa" w:w="70"/>
               <w:left w:type="dxa" w:w="110"/>
@@ -2114,6 +2249,7 @@
               <w:bottom w:val="single" w:color="D9D4C5" w:sz="4"/>
               <w:right w:val="single" w:color="D9D4C5" w:sz="4"/>
             </w:tcBorders>
+            <w:shd w:fill="F6F4EE" w:color="auto" w:val="clear"/>
             <w:tcMar>
               <w:top w:type="dxa" w:w="70"/>
               <w:left w:type="dxa" w:w="110"/>
@@ -2146,6 +2282,7 @@
               <w:bottom w:val="single" w:color="D9D4C5" w:sz="4"/>
               <w:right w:val="single" w:color="D9D4C5" w:sz="4"/>
             </w:tcBorders>
+            <w:shd w:fill="F6F4EE" w:color="auto" w:val="clear"/>
             <w:tcMar>
               <w:top w:type="dxa" w:w="70"/>
               <w:left w:type="dxa" w:w="110"/>
@@ -2187,7 +2324,7 @@
           <w:sz w:val="20"/>
           <w:szCs w:val="20"/>
         </w:rPr>
-        <w:t xml:space="preserve">Istruzioni alla revisione 2.0 del 21/10/2026. Si aggiornano quando cambiano servizi, piani, script del database, funzioni o chiavi; una copia è dentro ogni archivio di backup e la versione corrente si scarica dall'area Documentazione del portale (solo Amministratori).</w:t>
+        <w:t xml:space="preserve">Istruzioni alla revisione 2.1 del 22/10/2026. Si aggiornano quando cambiano servizi, piani, script del database, funzioni o chiavi; una copia è dentro ogni archivio di backup e la versione corrente si scarica dall'area Documentazione del portale (solo Amministratori).</w:t>
       </w:r>
     </w:p>
     <w:p>
@@ -3712,7 +3849,7 @@
                 <w:sz w:val="18"/>
                 <w:szCs w:val="18"/>
               </w:rPr>
-              <w:t xml:space="preserve">Tutto il codice, gli script del database (01-38), le funzioni del server, i manuali e la loro storia</w:t>
+              <w:t xml:space="preserve">Tutto il codice, gli script del database (01-39), le funzioni del server, i manuali e la loro storia</w:t>
             </w:r>
           </w:p>
         </w:tc>
@@ -7237,7 +7374,7 @@
         </w:rPr>
         <w:t xml:space="preserve"> (</w:t>
       </w:r>
-      <w:hyperlink w:history="1" r:id="rId0sm67ha5u4-g8azsfwn5r">
+      <w:hyperlink w:history="1" r:id="rIdp7dzl_ajnp6-1abyotmtq">
         <w:r>
           <w:rPr>
             <w:rFonts w:ascii="Arial" w:cs="Arial" w:eastAsia="Arial" w:hAnsi="Arial"/>
@@ -8049,7 +8186,7 @@
           <w:sz w:val="21"/>
           <w:szCs w:val="21"/>
         </w:rPr>
-        <w:t xml:space="preserve"> ed esecuzione degli script 01-38, come nel capitolo «Supabase: ricostruzione da zero», passi 1 e 2.</w:t>
+        <w:t xml:space="preserve"> ed esecuzione degli script 01-39, come nel capitolo «Supabase: ricostruzione da zero», passi 1 e 2.</w:t>
       </w:r>
     </w:p>
     <w:p>
@@ -10601,7 +10738,7 @@
           <w:sz w:val="21"/>
           <w:szCs w:val="21"/>
         </w:rPr>
-        <w:t xml:space="preserve">38_backup.sql</w:t>
+        <w:t xml:space="preserve">39_rilievi_n02_n03.sql</w:t>
       </w:r>
       <w:r>
         <w:rPr>
@@ -15560,7 +15697,7 @@
         <w:szCs w:val="16"/>
       </w:rPr>
       <w:tab/>
-      <w:t xml:space="preserve">Istruzioni di ripristino · Rev. 2.0 · 21/10/2026</w:t>
+      <w:t xml:space="preserve">Istruzioni di ripristino · Rev. 2.1 · 22/10/2026</w:t>
     </w:r>
   </w:p>
 </w:hdr>
@@ -15625,7 +15762,7 @@
         <w:szCs w:val="16"/>
       </w:rPr>
       <w:tab/>
-      <w:t xml:space="preserve">Istruzioni di ripristino · Rev. 2.0 · 21/10/2026</w:t>
+      <w:t xml:space="preserve">Istruzioni di ripristino · Rev. 2.1 · 22/10/2026</w:t>
     </w:r>
   </w:p>
 </w:hdr>

</xml_diff>

<commit_message>
Documentazione aggiornata al 22/10: funzionalità per area, uso da telefono, stato del backup, presentazione, PDF e Word rigenerati, base di conoscenza
Co-Authored-By: Claude Opus 5.5 <noreply@anthropic.com>
Claude-Session: https://claude.ai/code/session_01E8XCbEeVHWVP3hntUZ6kZ1
</commit_message>
<xml_diff>
--- a/public/documentazione/Istruzioni_Ripristino_Portale_CWP.docx
+++ b/public/documentazione/Istruzioni_Ripristino_Portale_CWP.docx
@@ -302,7 +302,7 @@
                 <w:sz w:val="20"/>
                 <w:szCs w:val="20"/>
               </w:rPr>
-              <w:t xml:space="preserve">Rev. 2.1</w:t>
+              <w:t xml:space="preserve">Rev. 2.2</w:t>
             </w:r>
           </w:p>
         </w:tc>
@@ -719,7 +719,7 @@
                 <w:sz w:val="18"/>
                 <w:szCs w:val="18"/>
               </w:rPr>
-              <w:t xml:space="preserve">2.1</w:t>
+              <w:t xml:space="preserve">2.2</w:t>
             </w:r>
           </w:p>
         </w:tc>
@@ -783,7 +783,7 @@
                 <w:sz w:val="18"/>
                 <w:szCs w:val="18"/>
               </w:rPr>
-              <w:t xml:space="preserve">Script 01-39.</w:t>
+              <w:t xml:space="preserve">Stato del backup al 22/10: script 38 in produzione, installazione sul Mac da fare.</w:t>
             </w:r>
           </w:p>
         </w:tc>
@@ -853,7 +853,7 @@
                 <w:sz w:val="18"/>
                 <w:szCs w:val="18"/>
               </w:rPr>
-              <w:t xml:space="preserve">2.0</w:t>
+              <w:t xml:space="preserve">2.1</w:t>
             </w:r>
           </w:p>
         </w:tc>
@@ -886,7 +886,7 @@
                 <w:sz w:val="18"/>
                 <w:szCs w:val="18"/>
               </w:rPr>
-              <w:t xml:space="preserve">21/10/2026</w:t>
+              <w:t xml:space="preserve">22/10/2026</w:t>
             </w:r>
           </w:p>
         </w:tc>
@@ -919,7 +919,7 @@
                 <w:sz w:val="18"/>
                 <w:szCs w:val="18"/>
               </w:rPr>
-              <w:t xml:space="preserve">Backup giornaliero alle 20:00 dal Mac in Cwp › backup › data (Google blocca Apps Script); backup manuale; script 38.</w:t>
+              <w:t xml:space="preserve">Script 01-39.</w:t>
             </w:r>
           </w:p>
         </w:tc>
@@ -989,7 +989,7 @@
                 <w:sz w:val="18"/>
                 <w:szCs w:val="18"/>
               </w:rPr>
-              <w:t xml:space="preserve">1.9</w:t>
+              <w:t xml:space="preserve">2.0</w:t>
             </w:r>
           </w:p>
         </w:tc>
@@ -1053,7 +1053,7 @@
                 <w:sz w:val="18"/>
                 <w:szCs w:val="18"/>
               </w:rPr>
-              <w:t xml:space="preserve">Tramite per Google News delle Notizie CO2. Script 37. Tolto il tramite per Google News. Tolto il tramite per Google News.</w:t>
+              <w:t xml:space="preserve">Backup giornaliero alle 20:00 dal Mac in Cwp › backup › data (Google blocca Apps Script); backup manuale; script 38.</w:t>
             </w:r>
           </w:p>
         </w:tc>
@@ -1123,7 +1123,7 @@
                 <w:sz w:val="18"/>
                 <w:szCs w:val="18"/>
               </w:rPr>
-              <w:t xml:space="preserve">1.8</w:t>
+              <w:t xml:space="preserve">1.9</w:t>
             </w:r>
           </w:p>
         </w:tc>
@@ -1189,7 +1189,7 @@
                 <w:sz w:val="18"/>
                 <w:szCs w:val="18"/>
               </w:rPr>
-              <w:t xml:space="preserve">Script 36 e funzione notizie (Verify JWT disattivato, indirizzo url_notizie, quarto lavoro pianificato).</w:t>
+              <w:t xml:space="preserve">Tramite per Google News delle Notizie CO2. Script 37. Tolto il tramite per Google News. Tolto il tramite per Google News.</w:t>
             </w:r>
           </w:p>
         </w:tc>
@@ -1259,7 +1259,7 @@
                 <w:sz w:val="18"/>
                 <w:szCs w:val="18"/>
               </w:rPr>
-              <w:t xml:space="preserve">1.7</w:t>
+              <w:t xml:space="preserve">1.8</w:t>
             </w:r>
           </w:p>
         </w:tc>
@@ -1323,7 +1323,7 @@
                 <w:sz w:val="18"/>
                 <w:szCs w:val="18"/>
               </w:rPr>
-              <w:t xml:space="preserve">Backup automatico su Google Drive alle 13 e alle 21 (installazione, contenuto) e ripristino da un backup automatico, provato sul banco locale.</w:t>
+              <w:t xml:space="preserve">Script 36 e funzione notizie (Verify JWT disattivato, indirizzo url_notizie, quarto lavoro pianificato).</w:t>
             </w:r>
           </w:p>
         </w:tc>
@@ -1393,7 +1393,7 @@
                 <w:sz w:val="18"/>
                 <w:szCs w:val="18"/>
               </w:rPr>
-              <w:t xml:space="preserve">1.6</w:t>
+              <w:t xml:space="preserve">1.7</w:t>
             </w:r>
           </w:p>
         </w:tc>
@@ -1459,7 +1459,7 @@
                 <w:sz w:val="18"/>
                 <w:szCs w:val="18"/>
               </w:rPr>
-              <w:t xml:space="preserve">Ricostruzione del database con gli script da 01 a 35 (simulatore, Amministratore principale, assistente, utenti online, Audit User, avvisi di sicurezza, controlli del collaudo).</w:t>
+              <w:t xml:space="preserve">Backup automatico su Google Drive alle 13 e alle 21 (installazione, contenuto) e ripristino da un backup automatico, provato sul banco locale.</w:t>
             </w:r>
           </w:p>
         </w:tc>
@@ -1529,7 +1529,7 @@
                 <w:sz w:val="18"/>
                 <w:szCs w:val="18"/>
               </w:rPr>
-              <w:t xml:space="preserve">1.5</w:t>
+              <w:t xml:space="preserve">1.6</w:t>
             </w:r>
           </w:p>
         </w:tc>
@@ -1561,7 +1561,7 @@
                 <w:sz w:val="18"/>
                 <w:szCs w:val="18"/>
               </w:rPr>
-              <w:t xml:space="preserve">20/10/2026</w:t>
+              <w:t xml:space="preserve">21/10/2026</w:t>
             </w:r>
           </w:p>
         </w:tc>
@@ -1593,7 +1593,7 @@
                 <w:sz w:val="18"/>
                 <w:szCs w:val="18"/>
               </w:rPr>
-              <w:t xml:space="preserve">Indirizzo Supabase nella Content-Security-Policy di vercel.json; script 01-34.</w:t>
+              <w:t xml:space="preserve">Ricostruzione del database con gli script da 01 a 35 (simulatore, Amministratore principale, assistente, utenti online, Audit User, avvisi di sicurezza, controlli del collaudo).</w:t>
             </w:r>
           </w:p>
         </w:tc>
@@ -1663,7 +1663,7 @@
                 <w:sz w:val="18"/>
                 <w:szCs w:val="18"/>
               </w:rPr>
-              <w:t xml:space="preserve">1.4</w:t>
+              <w:t xml:space="preserve">1.5</w:t>
             </w:r>
           </w:p>
         </w:tc>
@@ -1729,7 +1729,7 @@
                 <w:sz w:val="18"/>
                 <w:szCs w:val="18"/>
               </w:rPr>
-              <w:t xml:space="preserve">Amministratore principale e verifiche dopo il ripristino (Audit User, assistente).</w:t>
+              <w:t xml:space="preserve">Indirizzo Supabase nella Content-Security-Policy di vercel.json; script 01-34.</w:t>
             </w:r>
           </w:p>
         </w:tc>
@@ -1799,7 +1799,7 @@
                 <w:sz w:val="18"/>
                 <w:szCs w:val="18"/>
               </w:rPr>
-              <w:t xml:space="preserve">1.3</w:t>
+              <w:t xml:space="preserve">1.4</w:t>
             </w:r>
           </w:p>
         </w:tc>
@@ -1863,7 +1863,7 @@
                 <w:sz w:val="18"/>
                 <w:szCs w:val="18"/>
               </w:rPr>
-              <w:t xml:space="preserve">Script 01-33.</w:t>
+              <w:t xml:space="preserve">Amministratore principale e verifiche dopo il ripristino (Audit User, assistente).</w:t>
             </w:r>
           </w:p>
         </w:tc>
@@ -1933,7 +1933,7 @@
                 <w:sz w:val="18"/>
                 <w:szCs w:val="18"/>
               </w:rPr>
-              <w:t xml:space="preserve">1.2</w:t>
+              <w:t xml:space="preserve">1.3</w:t>
             </w:r>
           </w:p>
         </w:tc>
@@ -1999,7 +1999,7 @@
                 <w:sz w:val="18"/>
                 <w:szCs w:val="18"/>
               </w:rPr>
-              <w:t xml:space="preserve">Script 01-32.</w:t>
+              <w:t xml:space="preserve">Script 01-33.</w:t>
             </w:r>
           </w:p>
         </w:tc>
@@ -2069,7 +2069,7 @@
                 <w:sz w:val="18"/>
                 <w:szCs w:val="18"/>
               </w:rPr>
-              <w:t xml:space="preserve">1.1</w:t>
+              <w:t xml:space="preserve">1.2</w:t>
             </w:r>
           </w:p>
         </w:tc>
@@ -2101,7 +2101,7 @@
                 <w:sz w:val="18"/>
                 <w:szCs w:val="18"/>
               </w:rPr>
-              <w:t xml:space="preserve">19/10/2026</w:t>
+              <w:t xml:space="preserve">20/10/2026</w:t>
             </w:r>
           </w:p>
         </w:tc>
@@ -2133,7 +2133,7 @@
                 <w:sz w:val="18"/>
                 <w:szCs w:val="18"/>
               </w:rPr>
-              <w:t xml:space="preserve">Funzione assistente e chiave ANTHROPIC_API_KEY; Claude Console tra i servizi; script 01-31.</w:t>
+              <w:t xml:space="preserve">Script 01-32.</w:t>
             </w:r>
           </w:p>
         </w:tc>
@@ -2203,6 +2203,142 @@
                 <w:sz w:val="18"/>
                 <w:szCs w:val="18"/>
               </w:rPr>
+              <w:t xml:space="preserve">1.1</w:t>
+            </w:r>
+          </w:p>
+        </w:tc>
+        <w:tc>
+          <w:tcPr>
+            <w:tcW w:type="dxa" w:w="1300"/>
+            <w:tcBorders>
+              <w:top w:val="single" w:color="D9D4C5" w:sz="4"/>
+              <w:left w:val="single" w:color="D9D4C5" w:sz="4"/>
+              <w:bottom w:val="single" w:color="D9D4C5" w:sz="4"/>
+              <w:right w:val="single" w:color="D9D4C5" w:sz="4"/>
+            </w:tcBorders>
+            <w:shd w:fill="F6F4EE" w:color="auto" w:val="clear"/>
+            <w:tcMar>
+              <w:top w:type="dxa" w:w="70"/>
+              <w:left w:type="dxa" w:w="110"/>
+              <w:bottom w:type="dxa" w:w="70"/>
+              <w:right w:type="dxa" w:w="110"/>
+            </w:tcMar>
+            <w:vAlign w:val="center"/>
+          </w:tcPr>
+          <w:p>
+            <w:pPr>
+              <w:spacing w:after="0" w:before="0"/>
+            </w:pPr>
+            <w:r>
+              <w:rPr>
+                <w:rFonts w:ascii="Arial" w:cs="Arial" w:eastAsia="Arial" w:hAnsi="Arial"/>
+                <w:color w:val="1B2118"/>
+                <w:sz w:val="18"/>
+                <w:szCs w:val="18"/>
+              </w:rPr>
+              <w:t xml:space="preserve">19/10/2026</w:t>
+            </w:r>
+          </w:p>
+        </w:tc>
+        <w:tc>
+          <w:tcPr>
+            <w:tcW w:type="dxa" w:w="5538"/>
+            <w:tcBorders>
+              <w:top w:val="single" w:color="D9D4C5" w:sz="4"/>
+              <w:left w:val="single" w:color="D9D4C5" w:sz="4"/>
+              <w:bottom w:val="single" w:color="D9D4C5" w:sz="4"/>
+              <w:right w:val="single" w:color="D9D4C5" w:sz="4"/>
+            </w:tcBorders>
+            <w:shd w:fill="F6F4EE" w:color="auto" w:val="clear"/>
+            <w:tcMar>
+              <w:top w:type="dxa" w:w="70"/>
+              <w:left w:type="dxa" w:w="110"/>
+              <w:bottom w:type="dxa" w:w="70"/>
+              <w:right w:type="dxa" w:w="110"/>
+            </w:tcMar>
+            <w:vAlign w:val="center"/>
+          </w:tcPr>
+          <w:p>
+            <w:pPr>
+              <w:spacing w:after="0" w:before="0"/>
+            </w:pPr>
+            <w:r>
+              <w:rPr>
+                <w:rFonts w:ascii="Arial" w:cs="Arial" w:eastAsia="Arial" w:hAnsi="Arial"/>
+                <w:color w:val="1B2118"/>
+                <w:sz w:val="18"/>
+                <w:szCs w:val="18"/>
+              </w:rPr>
+              <w:t xml:space="preserve">Funzione assistente e chiave ANTHROPIC_API_KEY; Claude Console tra i servizi; script 01-31.</w:t>
+            </w:r>
+          </w:p>
+        </w:tc>
+        <w:tc>
+          <w:tcPr>
+            <w:tcW w:type="dxa" w:w="2000"/>
+            <w:tcBorders>
+              <w:top w:val="single" w:color="D9D4C5" w:sz="4"/>
+              <w:left w:val="single" w:color="D9D4C5" w:sz="4"/>
+              <w:bottom w:val="single" w:color="D9D4C5" w:sz="4"/>
+              <w:right w:val="single" w:color="D9D4C5" w:sz="4"/>
+            </w:tcBorders>
+            <w:shd w:fill="F6F4EE" w:color="auto" w:val="clear"/>
+            <w:tcMar>
+              <w:top w:type="dxa" w:w="70"/>
+              <w:left w:type="dxa" w:w="110"/>
+              <w:bottom w:type="dxa" w:w="70"/>
+              <w:right w:type="dxa" w:w="110"/>
+            </w:tcMar>
+            <w:vAlign w:val="center"/>
+          </w:tcPr>
+          <w:p>
+            <w:pPr>
+              <w:spacing w:after="0" w:before="0"/>
+            </w:pPr>
+            <w:r>
+              <w:rPr>
+                <w:rFonts w:ascii="Arial" w:cs="Arial" w:eastAsia="Arial" w:hAnsi="Arial"/>
+                <w:color w:val="1B2118"/>
+                <w:sz w:val="18"/>
+                <w:szCs w:val="18"/>
+              </w:rPr>
+              <w:t xml:space="preserve">Fondazione Operate</w:t>
+            </w:r>
+          </w:p>
+        </w:tc>
+      </w:tr>
+      <w:tr>
+        <w:trPr>
+          <w:cantSplit/>
+        </w:trPr>
+        <w:tc>
+          <w:tcPr>
+            <w:tcW w:type="dxa" w:w="800"/>
+            <w:tcBorders>
+              <w:top w:val="single" w:color="D9D4C5" w:sz="4"/>
+              <w:left w:val="single" w:color="D9D4C5" w:sz="4"/>
+              <w:bottom w:val="single" w:color="D9D4C5" w:sz="4"/>
+              <w:right w:val="single" w:color="D9D4C5" w:sz="4"/>
+            </w:tcBorders>
+            <w:tcMar>
+              <w:top w:type="dxa" w:w="70"/>
+              <w:left w:type="dxa" w:w="110"/>
+              <w:bottom w:type="dxa" w:w="70"/>
+              <w:right w:type="dxa" w:w="110"/>
+            </w:tcMar>
+            <w:vAlign w:val="center"/>
+          </w:tcPr>
+          <w:p>
+            <w:pPr>
+              <w:spacing w:after="0" w:before="0"/>
+            </w:pPr>
+            <w:r>
+              <w:rPr>
+                <w:rFonts w:ascii="Arial" w:cs="Arial" w:eastAsia="Arial" w:hAnsi="Arial"/>
+                <w:color w:val="1B2118"/>
+                <w:sz w:val="18"/>
+                <w:szCs w:val="18"/>
+              </w:rPr>
               <w:t xml:space="preserve">1.0</w:t>
             </w:r>
           </w:p>
@@ -2216,7 +2352,6 @@
               <w:bottom w:val="single" w:color="D9D4C5" w:sz="4"/>
               <w:right w:val="single" w:color="D9D4C5" w:sz="4"/>
             </w:tcBorders>
-            <w:shd w:fill="F6F4EE" w:color="auto" w:val="clear"/>
             <w:tcMar>
               <w:top w:type="dxa" w:w="70"/>
               <w:left w:type="dxa" w:w="110"/>
@@ -2249,7 +2384,6 @@
               <w:bottom w:val="single" w:color="D9D4C5" w:sz="4"/>
               <w:right w:val="single" w:color="D9D4C5" w:sz="4"/>
             </w:tcBorders>
-            <w:shd w:fill="F6F4EE" w:color="auto" w:val="clear"/>
             <w:tcMar>
               <w:top w:type="dxa" w:w="70"/>
               <w:left w:type="dxa" w:w="110"/>
@@ -2282,7 +2416,6 @@
               <w:bottom w:val="single" w:color="D9D4C5" w:sz="4"/>
               <w:right w:val="single" w:color="D9D4C5" w:sz="4"/>
             </w:tcBorders>
-            <w:shd w:fill="F6F4EE" w:color="auto" w:val="clear"/>
             <w:tcMar>
               <w:top w:type="dxa" w:w="70"/>
               <w:left w:type="dxa" w:w="110"/>
@@ -2324,7 +2457,7 @@
           <w:sz w:val="20"/>
           <w:szCs w:val="20"/>
         </w:rPr>
-        <w:t xml:space="preserve">Istruzioni alla revisione 2.1 del 22/10/2026. Si aggiornano quando cambiano servizi, piani, script del database, funzioni o chiavi; una copia è dentro ogni archivio di backup e la versione corrente si scarica dall'area Documentazione del portale (solo Amministratori).</w:t>
+        <w:t xml:space="preserve">Istruzioni alla revisione 2.2 del 22/10/2026. Si aggiornano quando cambiano servizi, piani, script del database, funzioni o chiavi; una copia è dentro ogni archivio di backup e la versione corrente si scarica dall'area Documentazione del portale (solo Amministratori).</w:t>
       </w:r>
     </w:p>
     <w:p>
@@ -7348,21 +7481,64 @@
       <w:r>
         <w:rPr>
           <w:rFonts w:ascii="Arial" w:cs="Arial" w:eastAsia="Arial" w:hAnsi="Arial"/>
-          <w:color w:val="1B2118"/>
-          <w:sz w:val="21"/>
-          <w:szCs w:val="21"/>
-        </w:rPr>
-        <w:t xml:space="preserve">Servono l'app </w:t>
-      </w:r>
-      <w:r>
-        <w:rPr>
-          <w:rFonts w:ascii="Arial" w:cs="Arial" w:eastAsia="Arial" w:hAnsi="Arial"/>
           <w:b/>
           <w:bCs/>
           <w:color w:val="1B2118"/>
           <w:sz w:val="21"/>
           <w:szCs w:val="21"/>
         </w:rPr>
+        <w:t xml:space="preserve">Stato al 22/10/2026:</w:t>
+      </w:r>
+      <w:r>
+        <w:rPr>
+          <w:rFonts w:ascii="Arial" w:cs="Arial" w:eastAsia="Arial" w:hAnsi="Arial"/>
+          <w:color w:val="1B2118"/>
+          <w:sz w:val="21"/>
+          <w:szCs w:val="21"/>
+        </w:rPr>
+        <w:t xml:space="preserve"> la funzione </w:t>
+      </w:r>
+      <w:r>
+        <w:rPr>
+          <w:rFonts w:ascii="Consolas" w:cs="Consolas" w:eastAsia="Consolas" w:hAnsi="Consolas"/>
+          <w:color w:val="2F5D3A"/>
+          <w:sz w:val="21"/>
+          <w:szCs w:val="21"/>
+        </w:rPr>
+        <w:t xml:space="preserve">backup_completo()</w:t>
+      </w:r>
+      <w:r>
+        <w:rPr>
+          <w:rFonts w:ascii="Arial" w:cs="Arial" w:eastAsia="Arial" w:hAnsi="Arial"/>
+          <w:color w:val="1B2118"/>
+          <w:sz w:val="21"/>
+          <w:szCs w:val="21"/>
+        </w:rPr>
+        <w:t xml:space="preserve"> (script 38) è installata in produzione; manca solo l'installazione sul Mac qui sotto.</w:t>
+      </w:r>
+    </w:p>
+    <w:p>
+      <w:pPr>
+        <w:spacing w:after="140" w:line="300"/>
+      </w:pPr>
+      <w:r>
+        <w:rPr>
+          <w:rFonts w:ascii="Arial" w:cs="Arial" w:eastAsia="Arial" w:hAnsi="Arial"/>
+          <w:color w:val="1B2118"/>
+          <w:sz w:val="21"/>
+          <w:szCs w:val="21"/>
+        </w:rPr>
+        <w:t xml:space="preserve">Servono l'app </w:t>
+      </w:r>
+      <w:r>
+        <w:rPr>
+          <w:rFonts w:ascii="Arial" w:cs="Arial" w:eastAsia="Arial" w:hAnsi="Arial"/>
+          <w:b/>
+          <w:bCs/>
+          <w:color w:val="1B2118"/>
+          <w:sz w:val="21"/>
+          <w:szCs w:val="21"/>
+        </w:rPr>
         <w:t xml:space="preserve">Google Drive per desktop</w:t>
       </w:r>
       <w:r>
@@ -7374,7 +7550,7 @@
         </w:rPr>
         <w:t xml:space="preserve"> (</w:t>
       </w:r>
-      <w:hyperlink w:history="1" r:id="rIdp7dzl_ajnp6-1abyotmtq">
+      <w:hyperlink w:history="1" r:id="rIdxeylwqhwr3ox0d51bwgem">
         <w:r>
           <w:rPr>
             <w:rFonts w:ascii="Arial" w:cs="Arial" w:eastAsia="Arial" w:hAnsi="Arial"/>
@@ -15697,7 +15873,7 @@
         <w:szCs w:val="16"/>
       </w:rPr>
       <w:tab/>
-      <w:t xml:space="preserve">Istruzioni di ripristino · Rev. 2.1 · 22/10/2026</w:t>
+      <w:t xml:space="preserve">Istruzioni di ripristino · Rev. 2.2 · 22/10/2026</w:t>
     </w:r>
   </w:p>
 </w:hdr>
@@ -15762,7 +15938,7 @@
         <w:szCs w:val="16"/>
       </w:rPr>
       <w:tab/>
-      <w:t xml:space="preserve">Istruzioni di ripristino · Rev. 2.1 · 22/10/2026</w:t>
+      <w:t xml:space="preserve">Istruzioni di ripristino · Rev. 2.2 · 22/10/2026</w:t>
     </w:r>
   </w:p>
 </w:hdr>

</xml_diff>

<commit_message>
Banca Dati Utenze in produzione (script 40); istruzioni di ripristino con gli script 01-40
Co-Authored-By: Claude Opus 5.5 <noreply@anthropic.com>
Claude-Session: https://claude.ai/code/session_01E8XCbEeVHWVP3hntUZ6kZ1
</commit_message>
<xml_diff>
--- a/public/documentazione/Istruzioni_Ripristino_Portale_CWP.docx
+++ b/public/documentazione/Istruzioni_Ripristino_Portale_CWP.docx
@@ -302,7 +302,7 @@
                 <w:sz w:val="20"/>
                 <w:szCs w:val="20"/>
               </w:rPr>
-              <w:t xml:space="preserve">Rev. 2.2</w:t>
+              <w:t xml:space="preserve">Rev. 2.3</w:t>
             </w:r>
           </w:p>
         </w:tc>
@@ -719,7 +719,7 @@
                 <w:sz w:val="18"/>
                 <w:szCs w:val="18"/>
               </w:rPr>
-              <w:t xml:space="preserve">2.2</w:t>
+              <w:t xml:space="preserve">2.3</w:t>
             </w:r>
           </w:p>
         </w:tc>
@@ -783,7 +783,7 @@
                 <w:sz w:val="18"/>
                 <w:szCs w:val="18"/>
               </w:rPr>
-              <w:t xml:space="preserve">Stato del backup al 22/10: script 38 in produzione, installazione sul Mac da fare.</w:t>
+              <w:t xml:space="preserve">Script 01-40 (Banca Dati Utenze).</w:t>
             </w:r>
           </w:p>
         </w:tc>
@@ -853,7 +853,7 @@
                 <w:sz w:val="18"/>
                 <w:szCs w:val="18"/>
               </w:rPr>
-              <w:t xml:space="preserve">2.1</w:t>
+              <w:t xml:space="preserve">2.2</w:t>
             </w:r>
           </w:p>
         </w:tc>
@@ -919,7 +919,7 @@
                 <w:sz w:val="18"/>
                 <w:szCs w:val="18"/>
               </w:rPr>
-              <w:t xml:space="preserve">Script 01-39.</w:t>
+              <w:t xml:space="preserve">Stato del backup al 22/10: script 38 in produzione, installazione sul Mac da fare.</w:t>
             </w:r>
           </w:p>
         </w:tc>
@@ -989,7 +989,7 @@
                 <w:sz w:val="18"/>
                 <w:szCs w:val="18"/>
               </w:rPr>
-              <w:t xml:space="preserve">2.0</w:t>
+              <w:t xml:space="preserve">2.1</w:t>
             </w:r>
           </w:p>
         </w:tc>
@@ -1021,7 +1021,7 @@
                 <w:sz w:val="18"/>
                 <w:szCs w:val="18"/>
               </w:rPr>
-              <w:t xml:space="preserve">21/10/2026</w:t>
+              <w:t xml:space="preserve">22/10/2026</w:t>
             </w:r>
           </w:p>
         </w:tc>
@@ -1053,7 +1053,7 @@
                 <w:sz w:val="18"/>
                 <w:szCs w:val="18"/>
               </w:rPr>
-              <w:t xml:space="preserve">Backup giornaliero alle 20:00 dal Mac in Cwp › backup › data (Google blocca Apps Script); backup manuale; script 38.</w:t>
+              <w:t xml:space="preserve">Script 01-39.</w:t>
             </w:r>
           </w:p>
         </w:tc>
@@ -1123,7 +1123,7 @@
                 <w:sz w:val="18"/>
                 <w:szCs w:val="18"/>
               </w:rPr>
-              <w:t xml:space="preserve">1.9</w:t>
+              <w:t xml:space="preserve">2.0</w:t>
             </w:r>
           </w:p>
         </w:tc>
@@ -1189,7 +1189,7 @@
                 <w:sz w:val="18"/>
                 <w:szCs w:val="18"/>
               </w:rPr>
-              <w:t xml:space="preserve">Tramite per Google News delle Notizie CO2. Script 37. Tolto il tramite per Google News. Tolto il tramite per Google News.</w:t>
+              <w:t xml:space="preserve">Backup giornaliero alle 20:00 dal Mac in Cwp › backup › data (Google blocca Apps Script); backup manuale; script 38.</w:t>
             </w:r>
           </w:p>
         </w:tc>
@@ -1259,7 +1259,7 @@
                 <w:sz w:val="18"/>
                 <w:szCs w:val="18"/>
               </w:rPr>
-              <w:t xml:space="preserve">1.8</w:t>
+              <w:t xml:space="preserve">1.9</w:t>
             </w:r>
           </w:p>
         </w:tc>
@@ -1323,7 +1323,7 @@
                 <w:sz w:val="18"/>
                 <w:szCs w:val="18"/>
               </w:rPr>
-              <w:t xml:space="preserve">Script 36 e funzione notizie (Verify JWT disattivato, indirizzo url_notizie, quarto lavoro pianificato).</w:t>
+              <w:t xml:space="preserve">Tramite per Google News delle Notizie CO2. Script 37. Tolto il tramite per Google News. Tolto il tramite per Google News.</w:t>
             </w:r>
           </w:p>
         </w:tc>
@@ -1393,7 +1393,7 @@
                 <w:sz w:val="18"/>
                 <w:szCs w:val="18"/>
               </w:rPr>
-              <w:t xml:space="preserve">1.7</w:t>
+              <w:t xml:space="preserve">1.8</w:t>
             </w:r>
           </w:p>
         </w:tc>
@@ -1459,7 +1459,7 @@
                 <w:sz w:val="18"/>
                 <w:szCs w:val="18"/>
               </w:rPr>
-              <w:t xml:space="preserve">Backup automatico su Google Drive alle 13 e alle 21 (installazione, contenuto) e ripristino da un backup automatico, provato sul banco locale.</w:t>
+              <w:t xml:space="preserve">Script 36 e funzione notizie (Verify JWT disattivato, indirizzo url_notizie, quarto lavoro pianificato).</w:t>
             </w:r>
           </w:p>
         </w:tc>
@@ -1529,7 +1529,7 @@
                 <w:sz w:val="18"/>
                 <w:szCs w:val="18"/>
               </w:rPr>
-              <w:t xml:space="preserve">1.6</w:t>
+              <w:t xml:space="preserve">1.7</w:t>
             </w:r>
           </w:p>
         </w:tc>
@@ -1593,7 +1593,7 @@
                 <w:sz w:val="18"/>
                 <w:szCs w:val="18"/>
               </w:rPr>
-              <w:t xml:space="preserve">Ricostruzione del database con gli script da 01 a 35 (simulatore, Amministratore principale, assistente, utenti online, Audit User, avvisi di sicurezza, controlli del collaudo).</w:t>
+              <w:t xml:space="preserve">Backup automatico su Google Drive alle 13 e alle 21 (installazione, contenuto) e ripristino da un backup automatico, provato sul banco locale.</w:t>
             </w:r>
           </w:p>
         </w:tc>
@@ -1663,7 +1663,7 @@
                 <w:sz w:val="18"/>
                 <w:szCs w:val="18"/>
               </w:rPr>
-              <w:t xml:space="preserve">1.5</w:t>
+              <w:t xml:space="preserve">1.6</w:t>
             </w:r>
           </w:p>
         </w:tc>
@@ -1696,7 +1696,7 @@
                 <w:sz w:val="18"/>
                 <w:szCs w:val="18"/>
               </w:rPr>
-              <w:t xml:space="preserve">20/10/2026</w:t>
+              <w:t xml:space="preserve">21/10/2026</w:t>
             </w:r>
           </w:p>
         </w:tc>
@@ -1729,7 +1729,7 @@
                 <w:sz w:val="18"/>
                 <w:szCs w:val="18"/>
               </w:rPr>
-              <w:t xml:space="preserve">Indirizzo Supabase nella Content-Security-Policy di vercel.json; script 01-34.</w:t>
+              <w:t xml:space="preserve">Ricostruzione del database con gli script da 01 a 35 (simulatore, Amministratore principale, assistente, utenti online, Audit User, avvisi di sicurezza, controlli del collaudo).</w:t>
             </w:r>
           </w:p>
         </w:tc>
@@ -1799,7 +1799,7 @@
                 <w:sz w:val="18"/>
                 <w:szCs w:val="18"/>
               </w:rPr>
-              <w:t xml:space="preserve">1.4</w:t>
+              <w:t xml:space="preserve">1.5</w:t>
             </w:r>
           </w:p>
         </w:tc>
@@ -1863,7 +1863,7 @@
                 <w:sz w:val="18"/>
                 <w:szCs w:val="18"/>
               </w:rPr>
-              <w:t xml:space="preserve">Amministratore principale e verifiche dopo il ripristino (Audit User, assistente).</w:t>
+              <w:t xml:space="preserve">Indirizzo Supabase nella Content-Security-Policy di vercel.json; script 01-34.</w:t>
             </w:r>
           </w:p>
         </w:tc>
@@ -1933,7 +1933,7 @@
                 <w:sz w:val="18"/>
                 <w:szCs w:val="18"/>
               </w:rPr>
-              <w:t xml:space="preserve">1.3</w:t>
+              <w:t xml:space="preserve">1.4</w:t>
             </w:r>
           </w:p>
         </w:tc>
@@ -1999,7 +1999,7 @@
                 <w:sz w:val="18"/>
                 <w:szCs w:val="18"/>
               </w:rPr>
-              <w:t xml:space="preserve">Script 01-33.</w:t>
+              <w:t xml:space="preserve">Amministratore principale e verifiche dopo il ripristino (Audit User, assistente).</w:t>
             </w:r>
           </w:p>
         </w:tc>
@@ -2069,7 +2069,7 @@
                 <w:sz w:val="18"/>
                 <w:szCs w:val="18"/>
               </w:rPr>
-              <w:t xml:space="preserve">1.2</w:t>
+              <w:t xml:space="preserve">1.3</w:t>
             </w:r>
           </w:p>
         </w:tc>
@@ -2133,7 +2133,7 @@
                 <w:sz w:val="18"/>
                 <w:szCs w:val="18"/>
               </w:rPr>
-              <w:t xml:space="preserve">Script 01-32.</w:t>
+              <w:t xml:space="preserve">Script 01-33.</w:t>
             </w:r>
           </w:p>
         </w:tc>
@@ -2203,7 +2203,7 @@
                 <w:sz w:val="18"/>
                 <w:szCs w:val="18"/>
               </w:rPr>
-              <w:t xml:space="preserve">1.1</w:t>
+              <w:t xml:space="preserve">1.2</w:t>
             </w:r>
           </w:p>
         </w:tc>
@@ -2236,7 +2236,7 @@
                 <w:sz w:val="18"/>
                 <w:szCs w:val="18"/>
               </w:rPr>
-              <w:t xml:space="preserve">19/10/2026</w:t>
+              <w:t xml:space="preserve">20/10/2026</w:t>
             </w:r>
           </w:p>
         </w:tc>
@@ -2269,7 +2269,7 @@
                 <w:sz w:val="18"/>
                 <w:szCs w:val="18"/>
               </w:rPr>
-              <w:t xml:space="preserve">Funzione assistente e chiave ANTHROPIC_API_KEY; Claude Console tra i servizi; script 01-31.</w:t>
+              <w:t xml:space="preserve">Script 01-32.</w:t>
             </w:r>
           </w:p>
         </w:tc>
@@ -2339,6 +2339,140 @@
                 <w:sz w:val="18"/>
                 <w:szCs w:val="18"/>
               </w:rPr>
+              <w:t xml:space="preserve">1.1</w:t>
+            </w:r>
+          </w:p>
+        </w:tc>
+        <w:tc>
+          <w:tcPr>
+            <w:tcW w:type="dxa" w:w="1300"/>
+            <w:tcBorders>
+              <w:top w:val="single" w:color="D9D4C5" w:sz="4"/>
+              <w:left w:val="single" w:color="D9D4C5" w:sz="4"/>
+              <w:bottom w:val="single" w:color="D9D4C5" w:sz="4"/>
+              <w:right w:val="single" w:color="D9D4C5" w:sz="4"/>
+            </w:tcBorders>
+            <w:tcMar>
+              <w:top w:type="dxa" w:w="70"/>
+              <w:left w:type="dxa" w:w="110"/>
+              <w:bottom w:type="dxa" w:w="70"/>
+              <w:right w:type="dxa" w:w="110"/>
+            </w:tcMar>
+            <w:vAlign w:val="center"/>
+          </w:tcPr>
+          <w:p>
+            <w:pPr>
+              <w:spacing w:after="0" w:before="0"/>
+            </w:pPr>
+            <w:r>
+              <w:rPr>
+                <w:rFonts w:ascii="Arial" w:cs="Arial" w:eastAsia="Arial" w:hAnsi="Arial"/>
+                <w:color w:val="1B2118"/>
+                <w:sz w:val="18"/>
+                <w:szCs w:val="18"/>
+              </w:rPr>
+              <w:t xml:space="preserve">19/10/2026</w:t>
+            </w:r>
+          </w:p>
+        </w:tc>
+        <w:tc>
+          <w:tcPr>
+            <w:tcW w:type="dxa" w:w="5538"/>
+            <w:tcBorders>
+              <w:top w:val="single" w:color="D9D4C5" w:sz="4"/>
+              <w:left w:val="single" w:color="D9D4C5" w:sz="4"/>
+              <w:bottom w:val="single" w:color="D9D4C5" w:sz="4"/>
+              <w:right w:val="single" w:color="D9D4C5" w:sz="4"/>
+            </w:tcBorders>
+            <w:tcMar>
+              <w:top w:type="dxa" w:w="70"/>
+              <w:left w:type="dxa" w:w="110"/>
+              <w:bottom w:type="dxa" w:w="70"/>
+              <w:right w:type="dxa" w:w="110"/>
+            </w:tcMar>
+            <w:vAlign w:val="center"/>
+          </w:tcPr>
+          <w:p>
+            <w:pPr>
+              <w:spacing w:after="0" w:before="0"/>
+            </w:pPr>
+            <w:r>
+              <w:rPr>
+                <w:rFonts w:ascii="Arial" w:cs="Arial" w:eastAsia="Arial" w:hAnsi="Arial"/>
+                <w:color w:val="1B2118"/>
+                <w:sz w:val="18"/>
+                <w:szCs w:val="18"/>
+              </w:rPr>
+              <w:t xml:space="preserve">Funzione assistente e chiave ANTHROPIC_API_KEY; Claude Console tra i servizi; script 01-31.</w:t>
+            </w:r>
+          </w:p>
+        </w:tc>
+        <w:tc>
+          <w:tcPr>
+            <w:tcW w:type="dxa" w:w="2000"/>
+            <w:tcBorders>
+              <w:top w:val="single" w:color="D9D4C5" w:sz="4"/>
+              <w:left w:val="single" w:color="D9D4C5" w:sz="4"/>
+              <w:bottom w:val="single" w:color="D9D4C5" w:sz="4"/>
+              <w:right w:val="single" w:color="D9D4C5" w:sz="4"/>
+            </w:tcBorders>
+            <w:tcMar>
+              <w:top w:type="dxa" w:w="70"/>
+              <w:left w:type="dxa" w:w="110"/>
+              <w:bottom w:type="dxa" w:w="70"/>
+              <w:right w:type="dxa" w:w="110"/>
+            </w:tcMar>
+            <w:vAlign w:val="center"/>
+          </w:tcPr>
+          <w:p>
+            <w:pPr>
+              <w:spacing w:after="0" w:before="0"/>
+            </w:pPr>
+            <w:r>
+              <w:rPr>
+                <w:rFonts w:ascii="Arial" w:cs="Arial" w:eastAsia="Arial" w:hAnsi="Arial"/>
+                <w:color w:val="1B2118"/>
+                <w:sz w:val="18"/>
+                <w:szCs w:val="18"/>
+              </w:rPr>
+              <w:t xml:space="preserve">Fondazione Operate</w:t>
+            </w:r>
+          </w:p>
+        </w:tc>
+      </w:tr>
+      <w:tr>
+        <w:trPr>
+          <w:cantSplit/>
+        </w:trPr>
+        <w:tc>
+          <w:tcPr>
+            <w:tcW w:type="dxa" w:w="800"/>
+            <w:tcBorders>
+              <w:top w:val="single" w:color="D9D4C5" w:sz="4"/>
+              <w:left w:val="single" w:color="D9D4C5" w:sz="4"/>
+              <w:bottom w:val="single" w:color="D9D4C5" w:sz="4"/>
+              <w:right w:val="single" w:color="D9D4C5" w:sz="4"/>
+            </w:tcBorders>
+            <w:shd w:fill="F6F4EE" w:color="auto" w:val="clear"/>
+            <w:tcMar>
+              <w:top w:type="dxa" w:w="70"/>
+              <w:left w:type="dxa" w:w="110"/>
+              <w:bottom w:type="dxa" w:w="70"/>
+              <w:right w:type="dxa" w:w="110"/>
+            </w:tcMar>
+            <w:vAlign w:val="center"/>
+          </w:tcPr>
+          <w:p>
+            <w:pPr>
+              <w:spacing w:after="0" w:before="0"/>
+            </w:pPr>
+            <w:r>
+              <w:rPr>
+                <w:rFonts w:ascii="Arial" w:cs="Arial" w:eastAsia="Arial" w:hAnsi="Arial"/>
+                <w:color w:val="1B2118"/>
+                <w:sz w:val="18"/>
+                <w:szCs w:val="18"/>
+              </w:rPr>
               <w:t xml:space="preserve">1.0</w:t>
             </w:r>
           </w:p>
@@ -2352,6 +2486,7 @@
               <w:bottom w:val="single" w:color="D9D4C5" w:sz="4"/>
               <w:right w:val="single" w:color="D9D4C5" w:sz="4"/>
             </w:tcBorders>
+            <w:shd w:fill="F6F4EE" w:color="auto" w:val="clear"/>
             <w:tcMar>
               <w:top w:type="dxa" w:w="70"/>
               <w:left w:type="dxa" w:w="110"/>
@@ -2384,6 +2519,7 @@
               <w:bottom w:val="single" w:color="D9D4C5" w:sz="4"/>
               <w:right w:val="single" w:color="D9D4C5" w:sz="4"/>
             </w:tcBorders>
+            <w:shd w:fill="F6F4EE" w:color="auto" w:val="clear"/>
             <w:tcMar>
               <w:top w:type="dxa" w:w="70"/>
               <w:left w:type="dxa" w:w="110"/>
@@ -2416,6 +2552,7 @@
               <w:bottom w:val="single" w:color="D9D4C5" w:sz="4"/>
               <w:right w:val="single" w:color="D9D4C5" w:sz="4"/>
             </w:tcBorders>
+            <w:shd w:fill="F6F4EE" w:color="auto" w:val="clear"/>
             <w:tcMar>
               <w:top w:type="dxa" w:w="70"/>
               <w:left w:type="dxa" w:w="110"/>
@@ -2457,7 +2594,7 @@
           <w:sz w:val="20"/>
           <w:szCs w:val="20"/>
         </w:rPr>
-        <w:t xml:space="preserve">Istruzioni alla revisione 2.2 del 22/10/2026. Si aggiornano quando cambiano servizi, piani, script del database, funzioni o chiavi; una copia è dentro ogni archivio di backup e la versione corrente si scarica dall'area Documentazione del portale (solo Amministratori).</w:t>
+        <w:t xml:space="preserve">Istruzioni alla revisione 2.3 del 22/10/2026. Si aggiornano quando cambiano servizi, piani, script del database, funzioni o chiavi; una copia è dentro ogni archivio di backup e la versione corrente si scarica dall'area Documentazione del portale (solo Amministratori).</w:t>
       </w:r>
     </w:p>
     <w:p>
@@ -3982,7 +4119,7 @@
                 <w:sz w:val="18"/>
                 <w:szCs w:val="18"/>
               </w:rPr>
-              <w:t xml:space="preserve">Tutto il codice, gli script del database (01-39), le funzioni del server, i manuali e la loro storia</w:t>
+              <w:t xml:space="preserve">Tutto il codice, gli script del database (01-40), le funzioni del server, i manuali e la loro storia</w:t>
             </w:r>
           </w:p>
         </w:tc>
@@ -7550,7 +7687,7 @@
         </w:rPr>
         <w:t xml:space="preserve"> (</w:t>
       </w:r>
-      <w:hyperlink w:history="1" r:id="rIdxeylwqhwr3ox0d51bwgem">
+      <w:hyperlink w:history="1" r:id="rIdkug_ce9biqzn_lrgmnihh">
         <w:r>
           <w:rPr>
             <w:rFonts w:ascii="Arial" w:cs="Arial" w:eastAsia="Arial" w:hAnsi="Arial"/>
@@ -8362,7 +8499,7 @@
           <w:sz w:val="21"/>
           <w:szCs w:val="21"/>
         </w:rPr>
-        <w:t xml:space="preserve"> ed esecuzione degli script 01-39, come nel capitolo «Supabase: ricostruzione da zero», passi 1 e 2.</w:t>
+        <w:t xml:space="preserve"> ed esecuzione degli script 01-40, come nel capitolo «Supabase: ricostruzione da zero», passi 1 e 2.</w:t>
       </w:r>
     </w:p>
     <w:p>
@@ -10914,7 +11051,7 @@
           <w:sz w:val="21"/>
           <w:szCs w:val="21"/>
         </w:rPr>
-        <w:t xml:space="preserve">39_rilievi_n02_n03.sql</w:t>
+        <w:t xml:space="preserve">40_utenze_calcolo.sql</w:t>
       </w:r>
       <w:r>
         <w:rPr>
@@ -15873,7 +16010,7 @@
         <w:szCs w:val="16"/>
       </w:rPr>
       <w:tab/>
-      <w:t xml:space="preserve">Istruzioni di ripristino · Rev. 2.2 · 22/10/2026</w:t>
+      <w:t xml:space="preserve">Istruzioni di ripristino · Rev. 2.3 · 22/10/2026</w:t>
     </w:r>
   </w:p>
 </w:hdr>
@@ -15938,7 +16075,7 @@
         <w:szCs w:val="16"/>
       </w:rPr>
       <w:tab/>
-      <w:t xml:space="preserve">Istruzioni di ripristino · Rev. 2.2 · 22/10/2026</w:t>
+      <w:t xml:space="preserve">Istruzioni di ripristino · Rev. 2.3 · 22/10/2026</w:t>
     </w:r>
   </w:p>
 </w:hdr>

</xml_diff>

<commit_message>
Documentazione: utenze del passo 5a nel calcolo (manuali, test, registri, ripristino 01-41, presentazione, base di conoscenza)
Co-Authored-By: Claude Opus 5.5 <noreply@anthropic.com>
Claude-Session: https://claude.ai/code/session_01E8XCbEeVHWVP3hntUZ6kZ1
</commit_message>
<xml_diff>
--- a/public/documentazione/Istruzioni_Ripristino_Portale_CWP.docx
+++ b/public/documentazione/Istruzioni_Ripristino_Portale_CWP.docx
@@ -302,7 +302,7 @@
                 <w:sz w:val="20"/>
                 <w:szCs w:val="20"/>
               </w:rPr>
-              <w:t xml:space="preserve">Rev. 2.3</w:t>
+              <w:t xml:space="preserve">Rev. 2.4</w:t>
             </w:r>
           </w:p>
         </w:tc>
@@ -365,7 +365,7 @@
                 <w:sz w:val="20"/>
                 <w:szCs w:val="20"/>
               </w:rPr>
-              <w:t xml:space="preserve">22/10/2026</w:t>
+              <w:t xml:space="preserve">23/10/2026</w:t>
             </w:r>
           </w:p>
         </w:tc>
@@ -719,7 +719,7 @@
                 <w:sz w:val="18"/>
                 <w:szCs w:val="18"/>
               </w:rPr>
-              <w:t xml:space="preserve">2.3</w:t>
+              <w:t xml:space="preserve">2.4</w:t>
             </w:r>
           </w:p>
         </w:tc>
@@ -751,7 +751,7 @@
                 <w:sz w:val="18"/>
                 <w:szCs w:val="18"/>
               </w:rPr>
-              <w:t xml:space="preserve">22/10/2026</w:t>
+              <w:t xml:space="preserve">23/10/2026</w:t>
             </w:r>
           </w:p>
         </w:tc>
@@ -783,7 +783,7 @@
                 <w:sz w:val="18"/>
                 <w:szCs w:val="18"/>
               </w:rPr>
-              <w:t xml:space="preserve">Script 01-40 (Banca Dati Utenze).</w:t>
+              <w:t xml:space="preserve">Script del database 01-41.</w:t>
             </w:r>
           </w:p>
         </w:tc>
@@ -853,7 +853,7 @@
                 <w:sz w:val="18"/>
                 <w:szCs w:val="18"/>
               </w:rPr>
-              <w:t xml:space="preserve">2.2</w:t>
+              <w:t xml:space="preserve">2.3</w:t>
             </w:r>
           </w:p>
         </w:tc>
@@ -919,7 +919,7 @@
                 <w:sz w:val="18"/>
                 <w:szCs w:val="18"/>
               </w:rPr>
-              <w:t xml:space="preserve">Stato del backup al 22/10: script 38 in produzione, installazione sul Mac da fare.</w:t>
+              <w:t xml:space="preserve">Script 01-40 (Banca Dati Utenze).</w:t>
             </w:r>
           </w:p>
         </w:tc>
@@ -989,7 +989,7 @@
                 <w:sz w:val="18"/>
                 <w:szCs w:val="18"/>
               </w:rPr>
-              <w:t xml:space="preserve">2.1</w:t>
+              <w:t xml:space="preserve">2.2</w:t>
             </w:r>
           </w:p>
         </w:tc>
@@ -1053,7 +1053,7 @@
                 <w:sz w:val="18"/>
                 <w:szCs w:val="18"/>
               </w:rPr>
-              <w:t xml:space="preserve">Script 01-39.</w:t>
+              <w:t xml:space="preserve">Stato del backup al 22/10: script 38 in produzione, installazione sul Mac da fare.</w:t>
             </w:r>
           </w:p>
         </w:tc>
@@ -1123,7 +1123,7 @@
                 <w:sz w:val="18"/>
                 <w:szCs w:val="18"/>
               </w:rPr>
-              <w:t xml:space="preserve">2.0</w:t>
+              <w:t xml:space="preserve">2.1</w:t>
             </w:r>
           </w:p>
         </w:tc>
@@ -1156,7 +1156,7 @@
                 <w:sz w:val="18"/>
                 <w:szCs w:val="18"/>
               </w:rPr>
-              <w:t xml:space="preserve">21/10/2026</w:t>
+              <w:t xml:space="preserve">22/10/2026</w:t>
             </w:r>
           </w:p>
         </w:tc>
@@ -1189,7 +1189,7 @@
                 <w:sz w:val="18"/>
                 <w:szCs w:val="18"/>
               </w:rPr>
-              <w:t xml:space="preserve">Backup giornaliero alle 20:00 dal Mac in Cwp › backup › data (Google blocca Apps Script); backup manuale; script 38.</w:t>
+              <w:t xml:space="preserve">Script 01-39.</w:t>
             </w:r>
           </w:p>
         </w:tc>
@@ -1259,7 +1259,7 @@
                 <w:sz w:val="18"/>
                 <w:szCs w:val="18"/>
               </w:rPr>
-              <w:t xml:space="preserve">1.9</w:t>
+              <w:t xml:space="preserve">2.0</w:t>
             </w:r>
           </w:p>
         </w:tc>
@@ -1323,7 +1323,7 @@
                 <w:sz w:val="18"/>
                 <w:szCs w:val="18"/>
               </w:rPr>
-              <w:t xml:space="preserve">Tramite per Google News delle Notizie CO2. Script 37. Tolto il tramite per Google News. Tolto il tramite per Google News.</w:t>
+              <w:t xml:space="preserve">Backup giornaliero alle 20:00 dal Mac in Cwp › backup › data (Google blocca Apps Script); backup manuale; script 38.</w:t>
             </w:r>
           </w:p>
         </w:tc>
@@ -1393,7 +1393,7 @@
                 <w:sz w:val="18"/>
                 <w:szCs w:val="18"/>
               </w:rPr>
-              <w:t xml:space="preserve">1.8</w:t>
+              <w:t xml:space="preserve">1.9</w:t>
             </w:r>
           </w:p>
         </w:tc>
@@ -1459,7 +1459,7 @@
                 <w:sz w:val="18"/>
                 <w:szCs w:val="18"/>
               </w:rPr>
-              <w:t xml:space="preserve">Script 36 e funzione notizie (Verify JWT disattivato, indirizzo url_notizie, quarto lavoro pianificato).</w:t>
+              <w:t xml:space="preserve">Tramite per Google News delle Notizie CO2. Script 37. Tolto il tramite per Google News. Tolto il tramite per Google News.</w:t>
             </w:r>
           </w:p>
         </w:tc>
@@ -1529,7 +1529,7 @@
                 <w:sz w:val="18"/>
                 <w:szCs w:val="18"/>
               </w:rPr>
-              <w:t xml:space="preserve">1.7</w:t>
+              <w:t xml:space="preserve">1.8</w:t>
             </w:r>
           </w:p>
         </w:tc>
@@ -1593,7 +1593,7 @@
                 <w:sz w:val="18"/>
                 <w:szCs w:val="18"/>
               </w:rPr>
-              <w:t xml:space="preserve">Backup automatico su Google Drive alle 13 e alle 21 (installazione, contenuto) e ripristino da un backup automatico, provato sul banco locale.</w:t>
+              <w:t xml:space="preserve">Script 36 e funzione notizie (Verify JWT disattivato, indirizzo url_notizie, quarto lavoro pianificato).</w:t>
             </w:r>
           </w:p>
         </w:tc>
@@ -1663,7 +1663,7 @@
                 <w:sz w:val="18"/>
                 <w:szCs w:val="18"/>
               </w:rPr>
-              <w:t xml:space="preserve">1.6</w:t>
+              <w:t xml:space="preserve">1.7</w:t>
             </w:r>
           </w:p>
         </w:tc>
@@ -1729,7 +1729,7 @@
                 <w:sz w:val="18"/>
                 <w:szCs w:val="18"/>
               </w:rPr>
-              <w:t xml:space="preserve">Ricostruzione del database con gli script da 01 a 35 (simulatore, Amministratore principale, assistente, utenti online, Audit User, avvisi di sicurezza, controlli del collaudo).</w:t>
+              <w:t xml:space="preserve">Backup automatico su Google Drive alle 13 e alle 21 (installazione, contenuto) e ripristino da un backup automatico, provato sul banco locale.</w:t>
             </w:r>
           </w:p>
         </w:tc>
@@ -1799,7 +1799,7 @@
                 <w:sz w:val="18"/>
                 <w:szCs w:val="18"/>
               </w:rPr>
-              <w:t xml:space="preserve">1.5</w:t>
+              <w:t xml:space="preserve">1.6</w:t>
             </w:r>
           </w:p>
         </w:tc>
@@ -1831,7 +1831,7 @@
                 <w:sz w:val="18"/>
                 <w:szCs w:val="18"/>
               </w:rPr>
-              <w:t xml:space="preserve">20/10/2026</w:t>
+              <w:t xml:space="preserve">21/10/2026</w:t>
             </w:r>
           </w:p>
         </w:tc>
@@ -1863,7 +1863,7 @@
                 <w:sz w:val="18"/>
                 <w:szCs w:val="18"/>
               </w:rPr>
-              <w:t xml:space="preserve">Indirizzo Supabase nella Content-Security-Policy di vercel.json; script 01-34.</w:t>
+              <w:t xml:space="preserve">Ricostruzione del database con gli script da 01 a 35 (simulatore, Amministratore principale, assistente, utenti online, Audit User, avvisi di sicurezza, controlli del collaudo).</w:t>
             </w:r>
           </w:p>
         </w:tc>
@@ -1933,7 +1933,7 @@
                 <w:sz w:val="18"/>
                 <w:szCs w:val="18"/>
               </w:rPr>
-              <w:t xml:space="preserve">1.4</w:t>
+              <w:t xml:space="preserve">1.5</w:t>
             </w:r>
           </w:p>
         </w:tc>
@@ -1999,7 +1999,7 @@
                 <w:sz w:val="18"/>
                 <w:szCs w:val="18"/>
               </w:rPr>
-              <w:t xml:space="preserve">Amministratore principale e verifiche dopo il ripristino (Audit User, assistente).</w:t>
+              <w:t xml:space="preserve">Indirizzo Supabase nella Content-Security-Policy di vercel.json; script 01-34.</w:t>
             </w:r>
           </w:p>
         </w:tc>
@@ -2069,7 +2069,7 @@
                 <w:sz w:val="18"/>
                 <w:szCs w:val="18"/>
               </w:rPr>
-              <w:t xml:space="preserve">1.3</w:t>
+              <w:t xml:space="preserve">1.4</w:t>
             </w:r>
           </w:p>
         </w:tc>
@@ -2133,7 +2133,7 @@
                 <w:sz w:val="18"/>
                 <w:szCs w:val="18"/>
               </w:rPr>
-              <w:t xml:space="preserve">Script 01-33.</w:t>
+              <w:t xml:space="preserve">Amministratore principale e verifiche dopo il ripristino (Audit User, assistente).</w:t>
             </w:r>
           </w:p>
         </w:tc>
@@ -2203,7 +2203,7 @@
                 <w:sz w:val="18"/>
                 <w:szCs w:val="18"/>
               </w:rPr>
-              <w:t xml:space="preserve">1.2</w:t>
+              <w:t xml:space="preserve">1.3</w:t>
             </w:r>
           </w:p>
         </w:tc>
@@ -2269,7 +2269,7 @@
                 <w:sz w:val="18"/>
                 <w:szCs w:val="18"/>
               </w:rPr>
-              <w:t xml:space="preserve">Script 01-32.</w:t>
+              <w:t xml:space="preserve">Script 01-33.</w:t>
             </w:r>
           </w:p>
         </w:tc>
@@ -2339,7 +2339,7 @@
                 <w:sz w:val="18"/>
                 <w:szCs w:val="18"/>
               </w:rPr>
-              <w:t xml:space="preserve">1.1</w:t>
+              <w:t xml:space="preserve">1.2</w:t>
             </w:r>
           </w:p>
         </w:tc>
@@ -2371,7 +2371,7 @@
                 <w:sz w:val="18"/>
                 <w:szCs w:val="18"/>
               </w:rPr>
-              <w:t xml:space="preserve">19/10/2026</w:t>
+              <w:t xml:space="preserve">20/10/2026</w:t>
             </w:r>
           </w:p>
         </w:tc>
@@ -2403,7 +2403,7 @@
                 <w:sz w:val="18"/>
                 <w:szCs w:val="18"/>
               </w:rPr>
-              <w:t xml:space="preserve">Funzione assistente e chiave ANTHROPIC_API_KEY; Claude Console tra i servizi; script 01-31.</w:t>
+              <w:t xml:space="preserve">Script 01-32.</w:t>
             </w:r>
           </w:p>
         </w:tc>
@@ -2473,6 +2473,142 @@
                 <w:sz w:val="18"/>
                 <w:szCs w:val="18"/>
               </w:rPr>
+              <w:t xml:space="preserve">1.1</w:t>
+            </w:r>
+          </w:p>
+        </w:tc>
+        <w:tc>
+          <w:tcPr>
+            <w:tcW w:type="dxa" w:w="1300"/>
+            <w:tcBorders>
+              <w:top w:val="single" w:color="D9D4C5" w:sz="4"/>
+              <w:left w:val="single" w:color="D9D4C5" w:sz="4"/>
+              <w:bottom w:val="single" w:color="D9D4C5" w:sz="4"/>
+              <w:right w:val="single" w:color="D9D4C5" w:sz="4"/>
+            </w:tcBorders>
+            <w:shd w:fill="F6F4EE" w:color="auto" w:val="clear"/>
+            <w:tcMar>
+              <w:top w:type="dxa" w:w="70"/>
+              <w:left w:type="dxa" w:w="110"/>
+              <w:bottom w:type="dxa" w:w="70"/>
+              <w:right w:type="dxa" w:w="110"/>
+            </w:tcMar>
+            <w:vAlign w:val="center"/>
+          </w:tcPr>
+          <w:p>
+            <w:pPr>
+              <w:spacing w:after="0" w:before="0"/>
+            </w:pPr>
+            <w:r>
+              <w:rPr>
+                <w:rFonts w:ascii="Arial" w:cs="Arial" w:eastAsia="Arial" w:hAnsi="Arial"/>
+                <w:color w:val="1B2118"/>
+                <w:sz w:val="18"/>
+                <w:szCs w:val="18"/>
+              </w:rPr>
+              <w:t xml:space="preserve">19/10/2026</w:t>
+            </w:r>
+          </w:p>
+        </w:tc>
+        <w:tc>
+          <w:tcPr>
+            <w:tcW w:type="dxa" w:w="5538"/>
+            <w:tcBorders>
+              <w:top w:val="single" w:color="D9D4C5" w:sz="4"/>
+              <w:left w:val="single" w:color="D9D4C5" w:sz="4"/>
+              <w:bottom w:val="single" w:color="D9D4C5" w:sz="4"/>
+              <w:right w:val="single" w:color="D9D4C5" w:sz="4"/>
+            </w:tcBorders>
+            <w:shd w:fill="F6F4EE" w:color="auto" w:val="clear"/>
+            <w:tcMar>
+              <w:top w:type="dxa" w:w="70"/>
+              <w:left w:type="dxa" w:w="110"/>
+              <w:bottom w:type="dxa" w:w="70"/>
+              <w:right w:type="dxa" w:w="110"/>
+            </w:tcMar>
+            <w:vAlign w:val="center"/>
+          </w:tcPr>
+          <w:p>
+            <w:pPr>
+              <w:spacing w:after="0" w:before="0"/>
+            </w:pPr>
+            <w:r>
+              <w:rPr>
+                <w:rFonts w:ascii="Arial" w:cs="Arial" w:eastAsia="Arial" w:hAnsi="Arial"/>
+                <w:color w:val="1B2118"/>
+                <w:sz w:val="18"/>
+                <w:szCs w:val="18"/>
+              </w:rPr>
+              <w:t xml:space="preserve">Funzione assistente e chiave ANTHROPIC_API_KEY; Claude Console tra i servizi; script 01-31.</w:t>
+            </w:r>
+          </w:p>
+        </w:tc>
+        <w:tc>
+          <w:tcPr>
+            <w:tcW w:type="dxa" w:w="2000"/>
+            <w:tcBorders>
+              <w:top w:val="single" w:color="D9D4C5" w:sz="4"/>
+              <w:left w:val="single" w:color="D9D4C5" w:sz="4"/>
+              <w:bottom w:val="single" w:color="D9D4C5" w:sz="4"/>
+              <w:right w:val="single" w:color="D9D4C5" w:sz="4"/>
+            </w:tcBorders>
+            <w:shd w:fill="F6F4EE" w:color="auto" w:val="clear"/>
+            <w:tcMar>
+              <w:top w:type="dxa" w:w="70"/>
+              <w:left w:type="dxa" w:w="110"/>
+              <w:bottom w:type="dxa" w:w="70"/>
+              <w:right w:type="dxa" w:w="110"/>
+            </w:tcMar>
+            <w:vAlign w:val="center"/>
+          </w:tcPr>
+          <w:p>
+            <w:pPr>
+              <w:spacing w:after="0" w:before="0"/>
+            </w:pPr>
+            <w:r>
+              <w:rPr>
+                <w:rFonts w:ascii="Arial" w:cs="Arial" w:eastAsia="Arial" w:hAnsi="Arial"/>
+                <w:color w:val="1B2118"/>
+                <w:sz w:val="18"/>
+                <w:szCs w:val="18"/>
+              </w:rPr>
+              <w:t xml:space="preserve">Fondazione Operate</w:t>
+            </w:r>
+          </w:p>
+        </w:tc>
+      </w:tr>
+      <w:tr>
+        <w:trPr>
+          <w:cantSplit/>
+        </w:trPr>
+        <w:tc>
+          <w:tcPr>
+            <w:tcW w:type="dxa" w:w="800"/>
+            <w:tcBorders>
+              <w:top w:val="single" w:color="D9D4C5" w:sz="4"/>
+              <w:left w:val="single" w:color="D9D4C5" w:sz="4"/>
+              <w:bottom w:val="single" w:color="D9D4C5" w:sz="4"/>
+              <w:right w:val="single" w:color="D9D4C5" w:sz="4"/>
+            </w:tcBorders>
+            <w:tcMar>
+              <w:top w:type="dxa" w:w="70"/>
+              <w:left w:type="dxa" w:w="110"/>
+              <w:bottom w:type="dxa" w:w="70"/>
+              <w:right w:type="dxa" w:w="110"/>
+            </w:tcMar>
+            <w:vAlign w:val="center"/>
+          </w:tcPr>
+          <w:p>
+            <w:pPr>
+              <w:spacing w:after="0" w:before="0"/>
+            </w:pPr>
+            <w:r>
+              <w:rPr>
+                <w:rFonts w:ascii="Arial" w:cs="Arial" w:eastAsia="Arial" w:hAnsi="Arial"/>
+                <w:color w:val="1B2118"/>
+                <w:sz w:val="18"/>
+                <w:szCs w:val="18"/>
+              </w:rPr>
               <w:t xml:space="preserve">1.0</w:t>
             </w:r>
           </w:p>
@@ -2486,7 +2622,6 @@
               <w:bottom w:val="single" w:color="D9D4C5" w:sz="4"/>
               <w:right w:val="single" w:color="D9D4C5" w:sz="4"/>
             </w:tcBorders>
-            <w:shd w:fill="F6F4EE" w:color="auto" w:val="clear"/>
             <w:tcMar>
               <w:top w:type="dxa" w:w="70"/>
               <w:left w:type="dxa" w:w="110"/>
@@ -2519,7 +2654,6 @@
               <w:bottom w:val="single" w:color="D9D4C5" w:sz="4"/>
               <w:right w:val="single" w:color="D9D4C5" w:sz="4"/>
             </w:tcBorders>
-            <w:shd w:fill="F6F4EE" w:color="auto" w:val="clear"/>
             <w:tcMar>
               <w:top w:type="dxa" w:w="70"/>
               <w:left w:type="dxa" w:w="110"/>
@@ -2552,7 +2686,6 @@
               <w:bottom w:val="single" w:color="D9D4C5" w:sz="4"/>
               <w:right w:val="single" w:color="D9D4C5" w:sz="4"/>
             </w:tcBorders>
-            <w:shd w:fill="F6F4EE" w:color="auto" w:val="clear"/>
             <w:tcMar>
               <w:top w:type="dxa" w:w="70"/>
               <w:left w:type="dxa" w:w="110"/>
@@ -2594,7 +2727,7 @@
           <w:sz w:val="20"/>
           <w:szCs w:val="20"/>
         </w:rPr>
-        <w:t xml:space="preserve">Istruzioni alla revisione 2.3 del 22/10/2026. Si aggiornano quando cambiano servizi, piani, script del database, funzioni o chiavi; una copia è dentro ogni archivio di backup e la versione corrente si scarica dall'area Documentazione del portale (solo Amministratori).</w:t>
+        <w:t xml:space="preserve">Istruzioni alla revisione 2.4 del 23/10/2026. Si aggiornano quando cambiano servizi, piani, script del database, funzioni o chiavi; una copia è dentro ogni archivio di backup e la versione corrente si scarica dall'area Documentazione del portale (solo Amministratori).</w:t>
       </w:r>
     </w:p>
     <w:p>
@@ -4119,7 +4252,7 @@
                 <w:sz w:val="18"/>
                 <w:szCs w:val="18"/>
               </w:rPr>
-              <w:t xml:space="preserve">Tutto il codice, gli script del database (01-40), le funzioni del server, i manuali e la loro storia</w:t>
+              <w:t xml:space="preserve">Tutto il codice, gli script del database (01-41), le funzioni del server, i manuali e la loro storia</w:t>
             </w:r>
           </w:p>
         </w:tc>
@@ -7687,7 +7820,7 @@
         </w:rPr>
         <w:t xml:space="preserve"> (</w:t>
       </w:r>
-      <w:hyperlink w:history="1" r:id="rIdkug_ce9biqzn_lrgmnihh">
+      <w:hyperlink w:history="1" r:id="rIdpufnqor7bgmrzbrmbd0ay">
         <w:r>
           <w:rPr>
             <w:rFonts w:ascii="Arial" w:cs="Arial" w:eastAsia="Arial" w:hAnsi="Arial"/>
@@ -8499,7 +8632,7 @@
           <w:sz w:val="21"/>
           <w:szCs w:val="21"/>
         </w:rPr>
-        <w:t xml:space="preserve"> ed esecuzione degli script 01-40, come nel capitolo «Supabase: ricostruzione da zero», passi 1 e 2.</w:t>
+        <w:t xml:space="preserve"> ed esecuzione degli script 01-41, come nel capitolo «Supabase: ricostruzione da zero», passi 1 e 2.</w:t>
       </w:r>
     </w:p>
     <w:p>
@@ -11051,7 +11184,7 @@
           <w:sz w:val="21"/>
           <w:szCs w:val="21"/>
         </w:rPr>
-        <w:t xml:space="preserve">40_utenze_calcolo.sql</w:t>
+        <w:t xml:space="preserve">41_utenze_nel_calcolo.sql</w:t>
       </w:r>
       <w:r>
         <w:rPr>
@@ -16010,7 +16143,7 @@
         <w:szCs w:val="16"/>
       </w:rPr>
       <w:tab/>
-      <w:t xml:space="preserve">Istruzioni di ripristino · Rev. 2.3 · 22/10/2026</w:t>
+      <w:t xml:space="preserve">Istruzioni di ripristino · Rev. 2.4 · 23/10/2026</w:t>
     </w:r>
   </w:p>
 </w:hdr>
@@ -16075,7 +16208,7 @@
         <w:szCs w:val="16"/>
       </w:rPr>
       <w:tab/>
-      <w:t xml:space="preserve">Istruzioni di ripristino · Rev. 2.3 · 22/10/2026</w:t>
+      <w:t xml:space="preserve">Istruzioni di ripristino · Rev. 2.4 · 23/10/2026</w:t>
     </w:r>
   </w:p>
 </w:hdr>

</xml_diff>

<commit_message>
Documentazione: valore dei crediti nella Dashboard (manuali, test 10.10m-p, registri, ripristino 01-42, presentazione)
Co-Authored-By: Claude Opus 5.5 <noreply@anthropic.com>
Claude-Session: https://claude.ai/code/session_01E8XCbEeVHWVP3hntUZ6kZ1
</commit_message>
<xml_diff>
--- a/public/documentazione/Istruzioni_Ripristino_Portale_CWP.docx
+++ b/public/documentazione/Istruzioni_Ripristino_Portale_CWP.docx
@@ -302,7 +302,7 @@
                 <w:sz w:val="20"/>
                 <w:szCs w:val="20"/>
               </w:rPr>
-              <w:t xml:space="preserve">Rev. 2.4</w:t>
+              <w:t xml:space="preserve">Rev. 2.5</w:t>
             </w:r>
           </w:p>
         </w:tc>
@@ -719,7 +719,7 @@
                 <w:sz w:val="18"/>
                 <w:szCs w:val="18"/>
               </w:rPr>
-              <w:t xml:space="preserve">2.4</w:t>
+              <w:t xml:space="preserve">2.5</w:t>
             </w:r>
           </w:p>
         </w:tc>
@@ -783,7 +783,7 @@
                 <w:sz w:val="18"/>
                 <w:szCs w:val="18"/>
               </w:rPr>
-              <w:t xml:space="preserve">Script del database 01-41.</w:t>
+              <w:t xml:space="preserve">Script del database 01-42.</w:t>
             </w:r>
           </w:p>
         </w:tc>
@@ -853,7 +853,7 @@
                 <w:sz w:val="18"/>
                 <w:szCs w:val="18"/>
               </w:rPr>
-              <w:t xml:space="preserve">2.3</w:t>
+              <w:t xml:space="preserve">2.4</w:t>
             </w:r>
           </w:p>
         </w:tc>
@@ -886,7 +886,7 @@
                 <w:sz w:val="18"/>
                 <w:szCs w:val="18"/>
               </w:rPr>
-              <w:t xml:space="preserve">22/10/2026</w:t>
+              <w:t xml:space="preserve">23/10/2026</w:t>
             </w:r>
           </w:p>
         </w:tc>
@@ -919,7 +919,7 @@
                 <w:sz w:val="18"/>
                 <w:szCs w:val="18"/>
               </w:rPr>
-              <w:t xml:space="preserve">Script 01-40 (Banca Dati Utenze).</w:t>
+              <w:t xml:space="preserve">Script del database 01-41.</w:t>
             </w:r>
           </w:p>
         </w:tc>
@@ -989,7 +989,7 @@
                 <w:sz w:val="18"/>
                 <w:szCs w:val="18"/>
               </w:rPr>
-              <w:t xml:space="preserve">2.2</w:t>
+              <w:t xml:space="preserve">2.3</w:t>
             </w:r>
           </w:p>
         </w:tc>
@@ -1053,7 +1053,7 @@
                 <w:sz w:val="18"/>
                 <w:szCs w:val="18"/>
               </w:rPr>
-              <w:t xml:space="preserve">Stato del backup al 22/10: script 38 in produzione, installazione sul Mac da fare.</w:t>
+              <w:t xml:space="preserve">Script 01-40 (Banca Dati Utenze).</w:t>
             </w:r>
           </w:p>
         </w:tc>
@@ -1123,7 +1123,7 @@
                 <w:sz w:val="18"/>
                 <w:szCs w:val="18"/>
               </w:rPr>
-              <w:t xml:space="preserve">2.1</w:t>
+              <w:t xml:space="preserve">2.2</w:t>
             </w:r>
           </w:p>
         </w:tc>
@@ -1189,7 +1189,7 @@
                 <w:sz w:val="18"/>
                 <w:szCs w:val="18"/>
               </w:rPr>
-              <w:t xml:space="preserve">Script 01-39.</w:t>
+              <w:t xml:space="preserve">Stato del backup al 22/10: script 38 in produzione, installazione sul Mac da fare.</w:t>
             </w:r>
           </w:p>
         </w:tc>
@@ -1259,7 +1259,7 @@
                 <w:sz w:val="18"/>
                 <w:szCs w:val="18"/>
               </w:rPr>
-              <w:t xml:space="preserve">2.0</w:t>
+              <w:t xml:space="preserve">2.1</w:t>
             </w:r>
           </w:p>
         </w:tc>
@@ -1291,7 +1291,7 @@
                 <w:sz w:val="18"/>
                 <w:szCs w:val="18"/>
               </w:rPr>
-              <w:t xml:space="preserve">21/10/2026</w:t>
+              <w:t xml:space="preserve">22/10/2026</w:t>
             </w:r>
           </w:p>
         </w:tc>
@@ -1323,7 +1323,7 @@
                 <w:sz w:val="18"/>
                 <w:szCs w:val="18"/>
               </w:rPr>
-              <w:t xml:space="preserve">Backup giornaliero alle 20:00 dal Mac in Cwp › backup › data (Google blocca Apps Script); backup manuale; script 38.</w:t>
+              <w:t xml:space="preserve">Script 01-39.</w:t>
             </w:r>
           </w:p>
         </w:tc>
@@ -1393,7 +1393,7 @@
                 <w:sz w:val="18"/>
                 <w:szCs w:val="18"/>
               </w:rPr>
-              <w:t xml:space="preserve">1.9</w:t>
+              <w:t xml:space="preserve">2.0</w:t>
             </w:r>
           </w:p>
         </w:tc>
@@ -1459,7 +1459,7 @@
                 <w:sz w:val="18"/>
                 <w:szCs w:val="18"/>
               </w:rPr>
-              <w:t xml:space="preserve">Tramite per Google News delle Notizie CO2. Script 37. Tolto il tramite per Google News. Tolto il tramite per Google News.</w:t>
+              <w:t xml:space="preserve">Backup giornaliero alle 20:00 dal Mac in Cwp › backup › data (Google blocca Apps Script); backup manuale; script 38.</w:t>
             </w:r>
           </w:p>
         </w:tc>
@@ -1529,7 +1529,7 @@
                 <w:sz w:val="18"/>
                 <w:szCs w:val="18"/>
               </w:rPr>
-              <w:t xml:space="preserve">1.8</w:t>
+              <w:t xml:space="preserve">1.9</w:t>
             </w:r>
           </w:p>
         </w:tc>
@@ -1593,7 +1593,7 @@
                 <w:sz w:val="18"/>
                 <w:szCs w:val="18"/>
               </w:rPr>
-              <w:t xml:space="preserve">Script 36 e funzione notizie (Verify JWT disattivato, indirizzo url_notizie, quarto lavoro pianificato).</w:t>
+              <w:t xml:space="preserve">Tramite per Google News delle Notizie CO2. Script 37. Tolto il tramite per Google News. Tolto il tramite per Google News.</w:t>
             </w:r>
           </w:p>
         </w:tc>
@@ -1663,7 +1663,7 @@
                 <w:sz w:val="18"/>
                 <w:szCs w:val="18"/>
               </w:rPr>
-              <w:t xml:space="preserve">1.7</w:t>
+              <w:t xml:space="preserve">1.8</w:t>
             </w:r>
           </w:p>
         </w:tc>
@@ -1729,7 +1729,7 @@
                 <w:sz w:val="18"/>
                 <w:szCs w:val="18"/>
               </w:rPr>
-              <w:t xml:space="preserve">Backup automatico su Google Drive alle 13 e alle 21 (installazione, contenuto) e ripristino da un backup automatico, provato sul banco locale.</w:t>
+              <w:t xml:space="preserve">Script 36 e funzione notizie (Verify JWT disattivato, indirizzo url_notizie, quarto lavoro pianificato).</w:t>
             </w:r>
           </w:p>
         </w:tc>
@@ -1799,7 +1799,7 @@
                 <w:sz w:val="18"/>
                 <w:szCs w:val="18"/>
               </w:rPr>
-              <w:t xml:space="preserve">1.6</w:t>
+              <w:t xml:space="preserve">1.7</w:t>
             </w:r>
           </w:p>
         </w:tc>
@@ -1863,7 +1863,7 @@
                 <w:sz w:val="18"/>
                 <w:szCs w:val="18"/>
               </w:rPr>
-              <w:t xml:space="preserve">Ricostruzione del database con gli script da 01 a 35 (simulatore, Amministratore principale, assistente, utenti online, Audit User, avvisi di sicurezza, controlli del collaudo).</w:t>
+              <w:t xml:space="preserve">Backup automatico su Google Drive alle 13 e alle 21 (installazione, contenuto) e ripristino da un backup automatico, provato sul banco locale.</w:t>
             </w:r>
           </w:p>
         </w:tc>
@@ -1933,7 +1933,7 @@
                 <w:sz w:val="18"/>
                 <w:szCs w:val="18"/>
               </w:rPr>
-              <w:t xml:space="preserve">1.5</w:t>
+              <w:t xml:space="preserve">1.6</w:t>
             </w:r>
           </w:p>
         </w:tc>
@@ -1966,7 +1966,7 @@
                 <w:sz w:val="18"/>
                 <w:szCs w:val="18"/>
               </w:rPr>
-              <w:t xml:space="preserve">20/10/2026</w:t>
+              <w:t xml:space="preserve">21/10/2026</w:t>
             </w:r>
           </w:p>
         </w:tc>
@@ -1999,7 +1999,7 @@
                 <w:sz w:val="18"/>
                 <w:szCs w:val="18"/>
               </w:rPr>
-              <w:t xml:space="preserve">Indirizzo Supabase nella Content-Security-Policy di vercel.json; script 01-34.</w:t>
+              <w:t xml:space="preserve">Ricostruzione del database con gli script da 01 a 35 (simulatore, Amministratore principale, assistente, utenti online, Audit User, avvisi di sicurezza, controlli del collaudo).</w:t>
             </w:r>
           </w:p>
         </w:tc>
@@ -2069,7 +2069,7 @@
                 <w:sz w:val="18"/>
                 <w:szCs w:val="18"/>
               </w:rPr>
-              <w:t xml:space="preserve">1.4</w:t>
+              <w:t xml:space="preserve">1.5</w:t>
             </w:r>
           </w:p>
         </w:tc>
@@ -2133,7 +2133,7 @@
                 <w:sz w:val="18"/>
                 <w:szCs w:val="18"/>
               </w:rPr>
-              <w:t xml:space="preserve">Amministratore principale e verifiche dopo il ripristino (Audit User, assistente).</w:t>
+              <w:t xml:space="preserve">Indirizzo Supabase nella Content-Security-Policy di vercel.json; script 01-34.</w:t>
             </w:r>
           </w:p>
         </w:tc>
@@ -2203,7 +2203,7 @@
                 <w:sz w:val="18"/>
                 <w:szCs w:val="18"/>
               </w:rPr>
-              <w:t xml:space="preserve">1.3</w:t>
+              <w:t xml:space="preserve">1.4</w:t>
             </w:r>
           </w:p>
         </w:tc>
@@ -2269,7 +2269,7 @@
                 <w:sz w:val="18"/>
                 <w:szCs w:val="18"/>
               </w:rPr>
-              <w:t xml:space="preserve">Script 01-33.</w:t>
+              <w:t xml:space="preserve">Amministratore principale e verifiche dopo il ripristino (Audit User, assistente).</w:t>
             </w:r>
           </w:p>
         </w:tc>
@@ -2339,7 +2339,7 @@
                 <w:sz w:val="18"/>
                 <w:szCs w:val="18"/>
               </w:rPr>
-              <w:t xml:space="preserve">1.2</w:t>
+              <w:t xml:space="preserve">1.3</w:t>
             </w:r>
           </w:p>
         </w:tc>
@@ -2403,7 +2403,7 @@
                 <w:sz w:val="18"/>
                 <w:szCs w:val="18"/>
               </w:rPr>
-              <w:t xml:space="preserve">Script 01-32.</w:t>
+              <w:t xml:space="preserve">Script 01-33.</w:t>
             </w:r>
           </w:p>
         </w:tc>
@@ -2473,7 +2473,7 @@
                 <w:sz w:val="18"/>
                 <w:szCs w:val="18"/>
               </w:rPr>
-              <w:t xml:space="preserve">1.1</w:t>
+              <w:t xml:space="preserve">1.2</w:t>
             </w:r>
           </w:p>
         </w:tc>
@@ -2506,7 +2506,7 @@
                 <w:sz w:val="18"/>
                 <w:szCs w:val="18"/>
               </w:rPr>
-              <w:t xml:space="preserve">19/10/2026</w:t>
+              <w:t xml:space="preserve">20/10/2026</w:t>
             </w:r>
           </w:p>
         </w:tc>
@@ -2539,7 +2539,7 @@
                 <w:sz w:val="18"/>
                 <w:szCs w:val="18"/>
               </w:rPr>
-              <w:t xml:space="preserve">Funzione assistente e chiave ANTHROPIC_API_KEY; Claude Console tra i servizi; script 01-31.</w:t>
+              <w:t xml:space="preserve">Script 01-32.</w:t>
             </w:r>
           </w:p>
         </w:tc>
@@ -2609,6 +2609,140 @@
                 <w:sz w:val="18"/>
                 <w:szCs w:val="18"/>
               </w:rPr>
+              <w:t xml:space="preserve">1.1</w:t>
+            </w:r>
+          </w:p>
+        </w:tc>
+        <w:tc>
+          <w:tcPr>
+            <w:tcW w:type="dxa" w:w="1300"/>
+            <w:tcBorders>
+              <w:top w:val="single" w:color="D9D4C5" w:sz="4"/>
+              <w:left w:val="single" w:color="D9D4C5" w:sz="4"/>
+              <w:bottom w:val="single" w:color="D9D4C5" w:sz="4"/>
+              <w:right w:val="single" w:color="D9D4C5" w:sz="4"/>
+            </w:tcBorders>
+            <w:tcMar>
+              <w:top w:type="dxa" w:w="70"/>
+              <w:left w:type="dxa" w:w="110"/>
+              <w:bottom w:type="dxa" w:w="70"/>
+              <w:right w:type="dxa" w:w="110"/>
+            </w:tcMar>
+            <w:vAlign w:val="center"/>
+          </w:tcPr>
+          <w:p>
+            <w:pPr>
+              <w:spacing w:after="0" w:before="0"/>
+            </w:pPr>
+            <w:r>
+              <w:rPr>
+                <w:rFonts w:ascii="Arial" w:cs="Arial" w:eastAsia="Arial" w:hAnsi="Arial"/>
+                <w:color w:val="1B2118"/>
+                <w:sz w:val="18"/>
+                <w:szCs w:val="18"/>
+              </w:rPr>
+              <w:t xml:space="preserve">19/10/2026</w:t>
+            </w:r>
+          </w:p>
+        </w:tc>
+        <w:tc>
+          <w:tcPr>
+            <w:tcW w:type="dxa" w:w="5538"/>
+            <w:tcBorders>
+              <w:top w:val="single" w:color="D9D4C5" w:sz="4"/>
+              <w:left w:val="single" w:color="D9D4C5" w:sz="4"/>
+              <w:bottom w:val="single" w:color="D9D4C5" w:sz="4"/>
+              <w:right w:val="single" w:color="D9D4C5" w:sz="4"/>
+            </w:tcBorders>
+            <w:tcMar>
+              <w:top w:type="dxa" w:w="70"/>
+              <w:left w:type="dxa" w:w="110"/>
+              <w:bottom w:type="dxa" w:w="70"/>
+              <w:right w:type="dxa" w:w="110"/>
+            </w:tcMar>
+            <w:vAlign w:val="center"/>
+          </w:tcPr>
+          <w:p>
+            <w:pPr>
+              <w:spacing w:after="0" w:before="0"/>
+            </w:pPr>
+            <w:r>
+              <w:rPr>
+                <w:rFonts w:ascii="Arial" w:cs="Arial" w:eastAsia="Arial" w:hAnsi="Arial"/>
+                <w:color w:val="1B2118"/>
+                <w:sz w:val="18"/>
+                <w:szCs w:val="18"/>
+              </w:rPr>
+              <w:t xml:space="preserve">Funzione assistente e chiave ANTHROPIC_API_KEY; Claude Console tra i servizi; script 01-31.</w:t>
+            </w:r>
+          </w:p>
+        </w:tc>
+        <w:tc>
+          <w:tcPr>
+            <w:tcW w:type="dxa" w:w="2000"/>
+            <w:tcBorders>
+              <w:top w:val="single" w:color="D9D4C5" w:sz="4"/>
+              <w:left w:val="single" w:color="D9D4C5" w:sz="4"/>
+              <w:bottom w:val="single" w:color="D9D4C5" w:sz="4"/>
+              <w:right w:val="single" w:color="D9D4C5" w:sz="4"/>
+            </w:tcBorders>
+            <w:tcMar>
+              <w:top w:type="dxa" w:w="70"/>
+              <w:left w:type="dxa" w:w="110"/>
+              <w:bottom w:type="dxa" w:w="70"/>
+              <w:right w:type="dxa" w:w="110"/>
+            </w:tcMar>
+            <w:vAlign w:val="center"/>
+          </w:tcPr>
+          <w:p>
+            <w:pPr>
+              <w:spacing w:after="0" w:before="0"/>
+            </w:pPr>
+            <w:r>
+              <w:rPr>
+                <w:rFonts w:ascii="Arial" w:cs="Arial" w:eastAsia="Arial" w:hAnsi="Arial"/>
+                <w:color w:val="1B2118"/>
+                <w:sz w:val="18"/>
+                <w:szCs w:val="18"/>
+              </w:rPr>
+              <w:t xml:space="preserve">Fondazione Operate</w:t>
+            </w:r>
+          </w:p>
+        </w:tc>
+      </w:tr>
+      <w:tr>
+        <w:trPr>
+          <w:cantSplit/>
+        </w:trPr>
+        <w:tc>
+          <w:tcPr>
+            <w:tcW w:type="dxa" w:w="800"/>
+            <w:tcBorders>
+              <w:top w:val="single" w:color="D9D4C5" w:sz="4"/>
+              <w:left w:val="single" w:color="D9D4C5" w:sz="4"/>
+              <w:bottom w:val="single" w:color="D9D4C5" w:sz="4"/>
+              <w:right w:val="single" w:color="D9D4C5" w:sz="4"/>
+            </w:tcBorders>
+            <w:shd w:fill="F6F4EE" w:color="auto" w:val="clear"/>
+            <w:tcMar>
+              <w:top w:type="dxa" w:w="70"/>
+              <w:left w:type="dxa" w:w="110"/>
+              <w:bottom w:type="dxa" w:w="70"/>
+              <w:right w:type="dxa" w:w="110"/>
+            </w:tcMar>
+            <w:vAlign w:val="center"/>
+          </w:tcPr>
+          <w:p>
+            <w:pPr>
+              <w:spacing w:after="0" w:before="0"/>
+            </w:pPr>
+            <w:r>
+              <w:rPr>
+                <w:rFonts w:ascii="Arial" w:cs="Arial" w:eastAsia="Arial" w:hAnsi="Arial"/>
+                <w:color w:val="1B2118"/>
+                <w:sz w:val="18"/>
+                <w:szCs w:val="18"/>
+              </w:rPr>
               <w:t xml:space="preserve">1.0</w:t>
             </w:r>
           </w:p>
@@ -2622,6 +2756,7 @@
               <w:bottom w:val="single" w:color="D9D4C5" w:sz="4"/>
               <w:right w:val="single" w:color="D9D4C5" w:sz="4"/>
             </w:tcBorders>
+            <w:shd w:fill="F6F4EE" w:color="auto" w:val="clear"/>
             <w:tcMar>
               <w:top w:type="dxa" w:w="70"/>
               <w:left w:type="dxa" w:w="110"/>
@@ -2654,6 +2789,7 @@
               <w:bottom w:val="single" w:color="D9D4C5" w:sz="4"/>
               <w:right w:val="single" w:color="D9D4C5" w:sz="4"/>
             </w:tcBorders>
+            <w:shd w:fill="F6F4EE" w:color="auto" w:val="clear"/>
             <w:tcMar>
               <w:top w:type="dxa" w:w="70"/>
               <w:left w:type="dxa" w:w="110"/>
@@ -2686,6 +2822,7 @@
               <w:bottom w:val="single" w:color="D9D4C5" w:sz="4"/>
               <w:right w:val="single" w:color="D9D4C5" w:sz="4"/>
             </w:tcBorders>
+            <w:shd w:fill="F6F4EE" w:color="auto" w:val="clear"/>
             <w:tcMar>
               <w:top w:type="dxa" w:w="70"/>
               <w:left w:type="dxa" w:w="110"/>
@@ -2727,7 +2864,7 @@
           <w:sz w:val="20"/>
           <w:szCs w:val="20"/>
         </w:rPr>
-        <w:t xml:space="preserve">Istruzioni alla revisione 2.4 del 23/10/2026. Si aggiornano quando cambiano servizi, piani, script del database, funzioni o chiavi; una copia è dentro ogni archivio di backup e la versione corrente si scarica dall'area Documentazione del portale (solo Amministratori).</w:t>
+        <w:t xml:space="preserve">Istruzioni alla revisione 2.5 del 23/10/2026. Si aggiornano quando cambiano servizi, piani, script del database, funzioni o chiavi; una copia è dentro ogni archivio di backup e la versione corrente si scarica dall'area Documentazione del portale (solo Amministratori).</w:t>
       </w:r>
     </w:p>
     <w:p>
@@ -4252,7 +4389,7 @@
                 <w:sz w:val="18"/>
                 <w:szCs w:val="18"/>
               </w:rPr>
-              <w:t xml:space="preserve">Tutto il codice, gli script del database (01-41), le funzioni del server, i manuali e la loro storia</w:t>
+              <w:t xml:space="preserve">Tutto il codice, gli script del database (01-42), le funzioni del server, i manuali e la loro storia</w:t>
             </w:r>
           </w:p>
         </w:tc>
@@ -7820,7 +7957,7 @@
         </w:rPr>
         <w:t xml:space="preserve"> (</w:t>
       </w:r>
-      <w:hyperlink w:history="1" r:id="rIdpufnqor7bgmrzbrmbd0ay">
+      <w:hyperlink w:history="1" r:id="rIdhzyg1ugdjktxa71xpywoa">
         <w:r>
           <w:rPr>
             <w:rFonts w:ascii="Arial" w:cs="Arial" w:eastAsia="Arial" w:hAnsi="Arial"/>
@@ -8632,7 +8769,7 @@
           <w:sz w:val="21"/>
           <w:szCs w:val="21"/>
         </w:rPr>
-        <w:t xml:space="preserve"> ed esecuzione degli script 01-41, come nel capitolo «Supabase: ricostruzione da zero», passi 1 e 2.</w:t>
+        <w:t xml:space="preserve"> ed esecuzione degli script 01-42, come nel capitolo «Supabase: ricostruzione da zero», passi 1 e 2.</w:t>
       </w:r>
     </w:p>
     <w:p>
@@ -11184,7 +11321,7 @@
           <w:sz w:val="21"/>
           <w:szCs w:val="21"/>
         </w:rPr>
-        <w:t xml:space="preserve">41_utenze_nel_calcolo.sql</w:t>
+        <w:t xml:space="preserve">42_valore_crediti.sql</w:t>
       </w:r>
       <w:r>
         <w:rPr>
@@ -16143,7 +16280,7 @@
         <w:szCs w:val="16"/>
       </w:rPr>
       <w:tab/>
-      <w:t xml:space="preserve">Istruzioni di ripristino · Rev. 2.4 · 23/10/2026</w:t>
+      <w:t xml:space="preserve">Istruzioni di ripristino · Rev. 2.5 · 23/10/2026</w:t>
     </w:r>
   </w:p>
 </w:hdr>
@@ -16208,7 +16345,7 @@
         <w:szCs w:val="16"/>
       </w:rPr>
       <w:tab/>
-      <w:t xml:space="preserve">Istruzioni di ripristino · Rev. 2.4 · 23/10/2026</w:t>
+      <w:t xml:space="preserve">Istruzioni di ripristino · Rev. 2.5 · 23/10/2026</w:t>
     </w:r>
   </w:p>
 </w:hdr>

</xml_diff>

<commit_message>
Documentazione: valore dei progetti e listino Caso 1 / Caso 2 (manuali, test 10.10q-s, registri, ripristino 01-43, presentazione)
Co-Authored-By: Claude Opus 5.5 <noreply@anthropic.com>
Claude-Session: https://claude.ai/code/session_01E8XCbEeVHWVP3hntUZ6kZ1
</commit_message>
<xml_diff>
--- a/public/documentazione/Istruzioni_Ripristino_Portale_CWP.docx
+++ b/public/documentazione/Istruzioni_Ripristino_Portale_CWP.docx
@@ -302,7 +302,7 @@
                 <w:sz w:val="20"/>
                 <w:szCs w:val="20"/>
               </w:rPr>
-              <w:t xml:space="preserve">Rev. 2.5</w:t>
+              <w:t xml:space="preserve">Rev. 2.6</w:t>
             </w:r>
           </w:p>
         </w:tc>
@@ -719,7 +719,7 @@
                 <w:sz w:val="18"/>
                 <w:szCs w:val="18"/>
               </w:rPr>
-              <w:t xml:space="preserve">2.5</w:t>
+              <w:t xml:space="preserve">2.6</w:t>
             </w:r>
           </w:p>
         </w:tc>
@@ -783,7 +783,7 @@
                 <w:sz w:val="18"/>
                 <w:szCs w:val="18"/>
               </w:rPr>
-              <w:t xml:space="preserve">Script del database 01-42.</w:t>
+              <w:t xml:space="preserve">Script del database 01-43.</w:t>
             </w:r>
           </w:p>
         </w:tc>
@@ -853,7 +853,7 @@
                 <w:sz w:val="18"/>
                 <w:szCs w:val="18"/>
               </w:rPr>
-              <w:t xml:space="preserve">2.4</w:t>
+              <w:t xml:space="preserve">2.5</w:t>
             </w:r>
           </w:p>
         </w:tc>
@@ -919,7 +919,7 @@
                 <w:sz w:val="18"/>
                 <w:szCs w:val="18"/>
               </w:rPr>
-              <w:t xml:space="preserve">Script del database 01-41.</w:t>
+              <w:t xml:space="preserve">Script del database 01-42.</w:t>
             </w:r>
           </w:p>
         </w:tc>
@@ -989,7 +989,7 @@
                 <w:sz w:val="18"/>
                 <w:szCs w:val="18"/>
               </w:rPr>
-              <w:t xml:space="preserve">2.3</w:t>
+              <w:t xml:space="preserve">2.4</w:t>
             </w:r>
           </w:p>
         </w:tc>
@@ -1021,7 +1021,7 @@
                 <w:sz w:val="18"/>
                 <w:szCs w:val="18"/>
               </w:rPr>
-              <w:t xml:space="preserve">22/10/2026</w:t>
+              <w:t xml:space="preserve">23/10/2026</w:t>
             </w:r>
           </w:p>
         </w:tc>
@@ -1053,7 +1053,7 @@
                 <w:sz w:val="18"/>
                 <w:szCs w:val="18"/>
               </w:rPr>
-              <w:t xml:space="preserve">Script 01-40 (Banca Dati Utenze).</w:t>
+              <w:t xml:space="preserve">Script del database 01-41.</w:t>
             </w:r>
           </w:p>
         </w:tc>
@@ -1123,7 +1123,7 @@
                 <w:sz w:val="18"/>
                 <w:szCs w:val="18"/>
               </w:rPr>
-              <w:t xml:space="preserve">2.2</w:t>
+              <w:t xml:space="preserve">2.3</w:t>
             </w:r>
           </w:p>
         </w:tc>
@@ -1189,7 +1189,7 @@
                 <w:sz w:val="18"/>
                 <w:szCs w:val="18"/>
               </w:rPr>
-              <w:t xml:space="preserve">Stato del backup al 22/10: script 38 in produzione, installazione sul Mac da fare.</w:t>
+              <w:t xml:space="preserve">Script 01-40 (Banca Dati Utenze).</w:t>
             </w:r>
           </w:p>
         </w:tc>
@@ -1259,7 +1259,7 @@
                 <w:sz w:val="18"/>
                 <w:szCs w:val="18"/>
               </w:rPr>
-              <w:t xml:space="preserve">2.1</w:t>
+              <w:t xml:space="preserve">2.2</w:t>
             </w:r>
           </w:p>
         </w:tc>
@@ -1323,7 +1323,7 @@
                 <w:sz w:val="18"/>
                 <w:szCs w:val="18"/>
               </w:rPr>
-              <w:t xml:space="preserve">Script 01-39.</w:t>
+              <w:t xml:space="preserve">Stato del backup al 22/10: script 38 in produzione, installazione sul Mac da fare.</w:t>
             </w:r>
           </w:p>
         </w:tc>
@@ -1393,7 +1393,7 @@
                 <w:sz w:val="18"/>
                 <w:szCs w:val="18"/>
               </w:rPr>
-              <w:t xml:space="preserve">2.0</w:t>
+              <w:t xml:space="preserve">2.1</w:t>
             </w:r>
           </w:p>
         </w:tc>
@@ -1426,7 +1426,7 @@
                 <w:sz w:val="18"/>
                 <w:szCs w:val="18"/>
               </w:rPr>
-              <w:t xml:space="preserve">21/10/2026</w:t>
+              <w:t xml:space="preserve">22/10/2026</w:t>
             </w:r>
           </w:p>
         </w:tc>
@@ -1459,7 +1459,7 @@
                 <w:sz w:val="18"/>
                 <w:szCs w:val="18"/>
               </w:rPr>
-              <w:t xml:space="preserve">Backup giornaliero alle 20:00 dal Mac in Cwp › backup › data (Google blocca Apps Script); backup manuale; script 38.</w:t>
+              <w:t xml:space="preserve">Script 01-39.</w:t>
             </w:r>
           </w:p>
         </w:tc>
@@ -1529,7 +1529,7 @@
                 <w:sz w:val="18"/>
                 <w:szCs w:val="18"/>
               </w:rPr>
-              <w:t xml:space="preserve">1.9</w:t>
+              <w:t xml:space="preserve">2.0</w:t>
             </w:r>
           </w:p>
         </w:tc>
@@ -1593,7 +1593,7 @@
                 <w:sz w:val="18"/>
                 <w:szCs w:val="18"/>
               </w:rPr>
-              <w:t xml:space="preserve">Tramite per Google News delle Notizie CO2. Script 37. Tolto il tramite per Google News. Tolto il tramite per Google News.</w:t>
+              <w:t xml:space="preserve">Backup giornaliero alle 20:00 dal Mac in Cwp › backup › data (Google blocca Apps Script); backup manuale; script 38.</w:t>
             </w:r>
           </w:p>
         </w:tc>
@@ -1663,7 +1663,7 @@
                 <w:sz w:val="18"/>
                 <w:szCs w:val="18"/>
               </w:rPr>
-              <w:t xml:space="preserve">1.8</w:t>
+              <w:t xml:space="preserve">1.9</w:t>
             </w:r>
           </w:p>
         </w:tc>
@@ -1729,7 +1729,7 @@
                 <w:sz w:val="18"/>
                 <w:szCs w:val="18"/>
               </w:rPr>
-              <w:t xml:space="preserve">Script 36 e funzione notizie (Verify JWT disattivato, indirizzo url_notizie, quarto lavoro pianificato).</w:t>
+              <w:t xml:space="preserve">Tramite per Google News delle Notizie CO2. Script 37. Tolto il tramite per Google News. Tolto il tramite per Google News.</w:t>
             </w:r>
           </w:p>
         </w:tc>
@@ -1799,7 +1799,7 @@
                 <w:sz w:val="18"/>
                 <w:szCs w:val="18"/>
               </w:rPr>
-              <w:t xml:space="preserve">1.7</w:t>
+              <w:t xml:space="preserve">1.8</w:t>
             </w:r>
           </w:p>
         </w:tc>
@@ -1863,7 +1863,7 @@
                 <w:sz w:val="18"/>
                 <w:szCs w:val="18"/>
               </w:rPr>
-              <w:t xml:space="preserve">Backup automatico su Google Drive alle 13 e alle 21 (installazione, contenuto) e ripristino da un backup automatico, provato sul banco locale.</w:t>
+              <w:t xml:space="preserve">Script 36 e funzione notizie (Verify JWT disattivato, indirizzo url_notizie, quarto lavoro pianificato).</w:t>
             </w:r>
           </w:p>
         </w:tc>
@@ -1933,7 +1933,7 @@
                 <w:sz w:val="18"/>
                 <w:szCs w:val="18"/>
               </w:rPr>
-              <w:t xml:space="preserve">1.6</w:t>
+              <w:t xml:space="preserve">1.7</w:t>
             </w:r>
           </w:p>
         </w:tc>
@@ -1999,7 +1999,7 @@
                 <w:sz w:val="18"/>
                 <w:szCs w:val="18"/>
               </w:rPr>
-              <w:t xml:space="preserve">Ricostruzione del database con gli script da 01 a 35 (simulatore, Amministratore principale, assistente, utenti online, Audit User, avvisi di sicurezza, controlli del collaudo).</w:t>
+              <w:t xml:space="preserve">Backup automatico su Google Drive alle 13 e alle 21 (installazione, contenuto) e ripristino da un backup automatico, provato sul banco locale.</w:t>
             </w:r>
           </w:p>
         </w:tc>
@@ -2069,7 +2069,7 @@
                 <w:sz w:val="18"/>
                 <w:szCs w:val="18"/>
               </w:rPr>
-              <w:t xml:space="preserve">1.5</w:t>
+              <w:t xml:space="preserve">1.6</w:t>
             </w:r>
           </w:p>
         </w:tc>
@@ -2101,7 +2101,7 @@
                 <w:sz w:val="18"/>
                 <w:szCs w:val="18"/>
               </w:rPr>
-              <w:t xml:space="preserve">20/10/2026</w:t>
+              <w:t xml:space="preserve">21/10/2026</w:t>
             </w:r>
           </w:p>
         </w:tc>
@@ -2133,7 +2133,7 @@
                 <w:sz w:val="18"/>
                 <w:szCs w:val="18"/>
               </w:rPr>
-              <w:t xml:space="preserve">Indirizzo Supabase nella Content-Security-Policy di vercel.json; script 01-34.</w:t>
+              <w:t xml:space="preserve">Ricostruzione del database con gli script da 01 a 35 (simulatore, Amministratore principale, assistente, utenti online, Audit User, avvisi di sicurezza, controlli del collaudo).</w:t>
             </w:r>
           </w:p>
         </w:tc>
@@ -2203,7 +2203,7 @@
                 <w:sz w:val="18"/>
                 <w:szCs w:val="18"/>
               </w:rPr>
-              <w:t xml:space="preserve">1.4</w:t>
+              <w:t xml:space="preserve">1.5</w:t>
             </w:r>
           </w:p>
         </w:tc>
@@ -2269,7 +2269,7 @@
                 <w:sz w:val="18"/>
                 <w:szCs w:val="18"/>
               </w:rPr>
-              <w:t xml:space="preserve">Amministratore principale e verifiche dopo il ripristino (Audit User, assistente).</w:t>
+              <w:t xml:space="preserve">Indirizzo Supabase nella Content-Security-Policy di vercel.json; script 01-34.</w:t>
             </w:r>
           </w:p>
         </w:tc>
@@ -2339,7 +2339,7 @@
                 <w:sz w:val="18"/>
                 <w:szCs w:val="18"/>
               </w:rPr>
-              <w:t xml:space="preserve">1.3</w:t>
+              <w:t xml:space="preserve">1.4</w:t>
             </w:r>
           </w:p>
         </w:tc>
@@ -2403,7 +2403,7 @@
                 <w:sz w:val="18"/>
                 <w:szCs w:val="18"/>
               </w:rPr>
-              <w:t xml:space="preserve">Script 01-33.</w:t>
+              <w:t xml:space="preserve">Amministratore principale e verifiche dopo il ripristino (Audit User, assistente).</w:t>
             </w:r>
           </w:p>
         </w:tc>
@@ -2473,7 +2473,7 @@
                 <w:sz w:val="18"/>
                 <w:szCs w:val="18"/>
               </w:rPr>
-              <w:t xml:space="preserve">1.2</w:t>
+              <w:t xml:space="preserve">1.3</w:t>
             </w:r>
           </w:p>
         </w:tc>
@@ -2539,7 +2539,7 @@
                 <w:sz w:val="18"/>
                 <w:szCs w:val="18"/>
               </w:rPr>
-              <w:t xml:space="preserve">Script 01-32.</w:t>
+              <w:t xml:space="preserve">Script 01-33.</w:t>
             </w:r>
           </w:p>
         </w:tc>
@@ -2609,7 +2609,7 @@
                 <w:sz w:val="18"/>
                 <w:szCs w:val="18"/>
               </w:rPr>
-              <w:t xml:space="preserve">1.1</w:t>
+              <w:t xml:space="preserve">1.2</w:t>
             </w:r>
           </w:p>
         </w:tc>
@@ -2641,7 +2641,7 @@
                 <w:sz w:val="18"/>
                 <w:szCs w:val="18"/>
               </w:rPr>
-              <w:t xml:space="preserve">19/10/2026</w:t>
+              <w:t xml:space="preserve">20/10/2026</w:t>
             </w:r>
           </w:p>
         </w:tc>
@@ -2673,7 +2673,7 @@
                 <w:sz w:val="18"/>
                 <w:szCs w:val="18"/>
               </w:rPr>
-              <w:t xml:space="preserve">Funzione assistente e chiave ANTHROPIC_API_KEY; Claude Console tra i servizi; script 01-31.</w:t>
+              <w:t xml:space="preserve">Script 01-32.</w:t>
             </w:r>
           </w:p>
         </w:tc>
@@ -2743,6 +2743,142 @@
                 <w:sz w:val="18"/>
                 <w:szCs w:val="18"/>
               </w:rPr>
+              <w:t xml:space="preserve">1.1</w:t>
+            </w:r>
+          </w:p>
+        </w:tc>
+        <w:tc>
+          <w:tcPr>
+            <w:tcW w:type="dxa" w:w="1300"/>
+            <w:tcBorders>
+              <w:top w:val="single" w:color="D9D4C5" w:sz="4"/>
+              <w:left w:val="single" w:color="D9D4C5" w:sz="4"/>
+              <w:bottom w:val="single" w:color="D9D4C5" w:sz="4"/>
+              <w:right w:val="single" w:color="D9D4C5" w:sz="4"/>
+            </w:tcBorders>
+            <w:shd w:fill="F6F4EE" w:color="auto" w:val="clear"/>
+            <w:tcMar>
+              <w:top w:type="dxa" w:w="70"/>
+              <w:left w:type="dxa" w:w="110"/>
+              <w:bottom w:type="dxa" w:w="70"/>
+              <w:right w:type="dxa" w:w="110"/>
+            </w:tcMar>
+            <w:vAlign w:val="center"/>
+          </w:tcPr>
+          <w:p>
+            <w:pPr>
+              <w:spacing w:after="0" w:before="0"/>
+            </w:pPr>
+            <w:r>
+              <w:rPr>
+                <w:rFonts w:ascii="Arial" w:cs="Arial" w:eastAsia="Arial" w:hAnsi="Arial"/>
+                <w:color w:val="1B2118"/>
+                <w:sz w:val="18"/>
+                <w:szCs w:val="18"/>
+              </w:rPr>
+              <w:t xml:space="preserve">19/10/2026</w:t>
+            </w:r>
+          </w:p>
+        </w:tc>
+        <w:tc>
+          <w:tcPr>
+            <w:tcW w:type="dxa" w:w="5538"/>
+            <w:tcBorders>
+              <w:top w:val="single" w:color="D9D4C5" w:sz="4"/>
+              <w:left w:val="single" w:color="D9D4C5" w:sz="4"/>
+              <w:bottom w:val="single" w:color="D9D4C5" w:sz="4"/>
+              <w:right w:val="single" w:color="D9D4C5" w:sz="4"/>
+            </w:tcBorders>
+            <w:shd w:fill="F6F4EE" w:color="auto" w:val="clear"/>
+            <w:tcMar>
+              <w:top w:type="dxa" w:w="70"/>
+              <w:left w:type="dxa" w:w="110"/>
+              <w:bottom w:type="dxa" w:w="70"/>
+              <w:right w:type="dxa" w:w="110"/>
+            </w:tcMar>
+            <w:vAlign w:val="center"/>
+          </w:tcPr>
+          <w:p>
+            <w:pPr>
+              <w:spacing w:after="0" w:before="0"/>
+            </w:pPr>
+            <w:r>
+              <w:rPr>
+                <w:rFonts w:ascii="Arial" w:cs="Arial" w:eastAsia="Arial" w:hAnsi="Arial"/>
+                <w:color w:val="1B2118"/>
+                <w:sz w:val="18"/>
+                <w:szCs w:val="18"/>
+              </w:rPr>
+              <w:t xml:space="preserve">Funzione assistente e chiave ANTHROPIC_API_KEY; Claude Console tra i servizi; script 01-31.</w:t>
+            </w:r>
+          </w:p>
+        </w:tc>
+        <w:tc>
+          <w:tcPr>
+            <w:tcW w:type="dxa" w:w="2000"/>
+            <w:tcBorders>
+              <w:top w:val="single" w:color="D9D4C5" w:sz="4"/>
+              <w:left w:val="single" w:color="D9D4C5" w:sz="4"/>
+              <w:bottom w:val="single" w:color="D9D4C5" w:sz="4"/>
+              <w:right w:val="single" w:color="D9D4C5" w:sz="4"/>
+            </w:tcBorders>
+            <w:shd w:fill="F6F4EE" w:color="auto" w:val="clear"/>
+            <w:tcMar>
+              <w:top w:type="dxa" w:w="70"/>
+              <w:left w:type="dxa" w:w="110"/>
+              <w:bottom w:type="dxa" w:w="70"/>
+              <w:right w:type="dxa" w:w="110"/>
+            </w:tcMar>
+            <w:vAlign w:val="center"/>
+          </w:tcPr>
+          <w:p>
+            <w:pPr>
+              <w:spacing w:after="0" w:before="0"/>
+            </w:pPr>
+            <w:r>
+              <w:rPr>
+                <w:rFonts w:ascii="Arial" w:cs="Arial" w:eastAsia="Arial" w:hAnsi="Arial"/>
+                <w:color w:val="1B2118"/>
+                <w:sz w:val="18"/>
+                <w:szCs w:val="18"/>
+              </w:rPr>
+              <w:t xml:space="preserve">Fondazione Operate</w:t>
+            </w:r>
+          </w:p>
+        </w:tc>
+      </w:tr>
+      <w:tr>
+        <w:trPr>
+          <w:cantSplit/>
+        </w:trPr>
+        <w:tc>
+          <w:tcPr>
+            <w:tcW w:type="dxa" w:w="800"/>
+            <w:tcBorders>
+              <w:top w:val="single" w:color="D9D4C5" w:sz="4"/>
+              <w:left w:val="single" w:color="D9D4C5" w:sz="4"/>
+              <w:bottom w:val="single" w:color="D9D4C5" w:sz="4"/>
+              <w:right w:val="single" w:color="D9D4C5" w:sz="4"/>
+            </w:tcBorders>
+            <w:tcMar>
+              <w:top w:type="dxa" w:w="70"/>
+              <w:left w:type="dxa" w:w="110"/>
+              <w:bottom w:type="dxa" w:w="70"/>
+              <w:right w:type="dxa" w:w="110"/>
+            </w:tcMar>
+            <w:vAlign w:val="center"/>
+          </w:tcPr>
+          <w:p>
+            <w:pPr>
+              <w:spacing w:after="0" w:before="0"/>
+            </w:pPr>
+            <w:r>
+              <w:rPr>
+                <w:rFonts w:ascii="Arial" w:cs="Arial" w:eastAsia="Arial" w:hAnsi="Arial"/>
+                <w:color w:val="1B2118"/>
+                <w:sz w:val="18"/>
+                <w:szCs w:val="18"/>
+              </w:rPr>
               <w:t xml:space="preserve">1.0</w:t>
             </w:r>
           </w:p>
@@ -2756,7 +2892,6 @@
               <w:bottom w:val="single" w:color="D9D4C5" w:sz="4"/>
               <w:right w:val="single" w:color="D9D4C5" w:sz="4"/>
             </w:tcBorders>
-            <w:shd w:fill="F6F4EE" w:color="auto" w:val="clear"/>
             <w:tcMar>
               <w:top w:type="dxa" w:w="70"/>
               <w:left w:type="dxa" w:w="110"/>
@@ -2789,7 +2924,6 @@
               <w:bottom w:val="single" w:color="D9D4C5" w:sz="4"/>
               <w:right w:val="single" w:color="D9D4C5" w:sz="4"/>
             </w:tcBorders>
-            <w:shd w:fill="F6F4EE" w:color="auto" w:val="clear"/>
             <w:tcMar>
               <w:top w:type="dxa" w:w="70"/>
               <w:left w:type="dxa" w:w="110"/>
@@ -2822,7 +2956,6 @@
               <w:bottom w:val="single" w:color="D9D4C5" w:sz="4"/>
               <w:right w:val="single" w:color="D9D4C5" w:sz="4"/>
             </w:tcBorders>
-            <w:shd w:fill="F6F4EE" w:color="auto" w:val="clear"/>
             <w:tcMar>
               <w:top w:type="dxa" w:w="70"/>
               <w:left w:type="dxa" w:w="110"/>
@@ -2864,7 +2997,7 @@
           <w:sz w:val="20"/>
           <w:szCs w:val="20"/>
         </w:rPr>
-        <w:t xml:space="preserve">Istruzioni alla revisione 2.5 del 23/10/2026. Si aggiornano quando cambiano servizi, piani, script del database, funzioni o chiavi; una copia è dentro ogni archivio di backup e la versione corrente si scarica dall'area Documentazione del portale (solo Amministratori).</w:t>
+        <w:t xml:space="preserve">Istruzioni alla revisione 2.6 del 23/10/2026. Si aggiornano quando cambiano servizi, piani, script del database, funzioni o chiavi; una copia è dentro ogni archivio di backup e la versione corrente si scarica dall'area Documentazione del portale (solo Amministratori).</w:t>
       </w:r>
     </w:p>
     <w:p>
@@ -4389,7 +4522,7 @@
                 <w:sz w:val="18"/>
                 <w:szCs w:val="18"/>
               </w:rPr>
-              <w:t xml:space="preserve">Tutto il codice, gli script del database (01-42), le funzioni del server, i manuali e la loro storia</w:t>
+              <w:t xml:space="preserve">Tutto il codice, gli script del database (01-43), le funzioni del server, i manuali e la loro storia</w:t>
             </w:r>
           </w:p>
         </w:tc>
@@ -7957,7 +8090,7 @@
         </w:rPr>
         <w:t xml:space="preserve"> (</w:t>
       </w:r>
-      <w:hyperlink w:history="1" r:id="rIdslho_5pixfun5n7bwl2iy">
+      <w:hyperlink w:history="1" r:id="rIddqcz0pqewfclllkfx4891">
         <w:r>
           <w:rPr>
             <w:rFonts w:ascii="Arial" w:cs="Arial" w:eastAsia="Arial" w:hAnsi="Arial"/>
@@ -8769,7 +8902,7 @@
           <w:sz w:val="21"/>
           <w:szCs w:val="21"/>
         </w:rPr>
-        <w:t xml:space="preserve"> ed esecuzione degli script 01-42, come nel capitolo «Supabase: ricostruzione da zero», passi 1 e 2.</w:t>
+        <w:t xml:space="preserve"> ed esecuzione degli script 01-43, come nel capitolo «Supabase: ricostruzione da zero», passi 1 e 2.</w:t>
       </w:r>
     </w:p>
     <w:p>
@@ -11321,7 +11454,7 @@
           <w:sz w:val="21"/>
           <w:szCs w:val="21"/>
         </w:rPr>
-        <w:t xml:space="preserve">42_valore_crediti.sql</w:t>
+        <w:t xml:space="preserve">43_valore_progetti.sql</w:t>
       </w:r>
       <w:r>
         <w:rPr>
@@ -16280,7 +16413,7 @@
         <w:szCs w:val="16"/>
       </w:rPr>
       <w:tab/>
-      <w:t xml:space="preserve">Istruzioni di ripristino · Rev. 2.5 · 23/10/2026</w:t>
+      <w:t xml:space="preserve">Istruzioni di ripristino · Rev. 2.6 · 23/10/2026</w:t>
     </w:r>
   </w:p>
 </w:hdr>
@@ -16345,7 +16478,7 @@
         <w:szCs w:val="16"/>
       </w:rPr>
       <w:tab/>
-      <w:t xml:space="preserve">Istruzioni di ripristino · Rev. 2.5 · 23/10/2026</w:t>
+      <w:t xml:space="preserve">Istruzioni di ripristino · Rev. 2.6 · 23/10/2026</w:t>
     </w:r>
   </w:p>
 </w:hdr>

</xml_diff>

<commit_message>
Registro: script 34 (avvisi di sicurezza e rinforzi del database) eseguito in produzione
Co-Authored-By: Claude Opus 5.5 <noreply@anthropic.com>
Claude-Session: https://claude.ai/code/session_01E8XCbEeVHWVP3hntUZ6kZ1
</commit_message>
<xml_diff>
--- a/public/documentazione/Istruzioni_Ripristino_Portale_CWP.docx
+++ b/public/documentazione/Istruzioni_Ripristino_Portale_CWP.docx
@@ -302,7 +302,7 @@
                 <w:sz w:val="20"/>
                 <w:szCs w:val="20"/>
               </w:rPr>
-              <w:t xml:space="preserve">Rev. 2.6</w:t>
+              <w:t xml:space="preserve">Rev. 2.7</w:t>
             </w:r>
           </w:p>
         </w:tc>
@@ -719,7 +719,7 @@
                 <w:sz w:val="18"/>
                 <w:szCs w:val="18"/>
               </w:rPr>
-              <w:t xml:space="preserve">2.6</w:t>
+              <w:t xml:space="preserve">2.7</w:t>
             </w:r>
           </w:p>
         </w:tc>
@@ -783,7 +783,7 @@
                 <w:sz w:val="18"/>
                 <w:szCs w:val="18"/>
               </w:rPr>
-              <w:t xml:space="preserve">Script del database 01-43.</w:t>
+              <w:t xml:space="preserve">Script 34 in produzione: l'ordine 01-43 resta quello di ricostruzione.</w:t>
             </w:r>
           </w:p>
         </w:tc>
@@ -853,7 +853,7 @@
                 <w:sz w:val="18"/>
                 <w:szCs w:val="18"/>
               </w:rPr>
-              <w:t xml:space="preserve">2.5</w:t>
+              <w:t xml:space="preserve">2.6</w:t>
             </w:r>
           </w:p>
         </w:tc>
@@ -919,7 +919,7 @@
                 <w:sz w:val="18"/>
                 <w:szCs w:val="18"/>
               </w:rPr>
-              <w:t xml:space="preserve">Script del database 01-42.</w:t>
+              <w:t xml:space="preserve">Script del database 01-43.</w:t>
             </w:r>
           </w:p>
         </w:tc>
@@ -989,7 +989,7 @@
                 <w:sz w:val="18"/>
                 <w:szCs w:val="18"/>
               </w:rPr>
-              <w:t xml:space="preserve">2.4</w:t>
+              <w:t xml:space="preserve">2.5</w:t>
             </w:r>
           </w:p>
         </w:tc>
@@ -1053,7 +1053,7 @@
                 <w:sz w:val="18"/>
                 <w:szCs w:val="18"/>
               </w:rPr>
-              <w:t xml:space="preserve">Script del database 01-41.</w:t>
+              <w:t xml:space="preserve">Script del database 01-42.</w:t>
             </w:r>
           </w:p>
         </w:tc>
@@ -1123,7 +1123,7 @@
                 <w:sz w:val="18"/>
                 <w:szCs w:val="18"/>
               </w:rPr>
-              <w:t xml:space="preserve">2.3</w:t>
+              <w:t xml:space="preserve">2.4</w:t>
             </w:r>
           </w:p>
         </w:tc>
@@ -1156,7 +1156,7 @@
                 <w:sz w:val="18"/>
                 <w:szCs w:val="18"/>
               </w:rPr>
-              <w:t xml:space="preserve">22/10/2026</w:t>
+              <w:t xml:space="preserve">23/10/2026</w:t>
             </w:r>
           </w:p>
         </w:tc>
@@ -1189,7 +1189,7 @@
                 <w:sz w:val="18"/>
                 <w:szCs w:val="18"/>
               </w:rPr>
-              <w:t xml:space="preserve">Script 01-40 (Banca Dati Utenze).</w:t>
+              <w:t xml:space="preserve">Script del database 01-41.</w:t>
             </w:r>
           </w:p>
         </w:tc>
@@ -1259,7 +1259,7 @@
                 <w:sz w:val="18"/>
                 <w:szCs w:val="18"/>
               </w:rPr>
-              <w:t xml:space="preserve">2.2</w:t>
+              <w:t xml:space="preserve">2.3</w:t>
             </w:r>
           </w:p>
         </w:tc>
@@ -1323,7 +1323,7 @@
                 <w:sz w:val="18"/>
                 <w:szCs w:val="18"/>
               </w:rPr>
-              <w:t xml:space="preserve">Stato del backup al 22/10: script 38 in produzione, installazione sul Mac da fare.</w:t>
+              <w:t xml:space="preserve">Script 01-40 (Banca Dati Utenze).</w:t>
             </w:r>
           </w:p>
         </w:tc>
@@ -1393,7 +1393,7 @@
                 <w:sz w:val="18"/>
                 <w:szCs w:val="18"/>
               </w:rPr>
-              <w:t xml:space="preserve">2.1</w:t>
+              <w:t xml:space="preserve">2.2</w:t>
             </w:r>
           </w:p>
         </w:tc>
@@ -1459,7 +1459,7 @@
                 <w:sz w:val="18"/>
                 <w:szCs w:val="18"/>
               </w:rPr>
-              <w:t xml:space="preserve">Script 01-39.</w:t>
+              <w:t xml:space="preserve">Stato del backup al 22/10: script 38 in produzione, installazione sul Mac da fare.</w:t>
             </w:r>
           </w:p>
         </w:tc>
@@ -1529,7 +1529,7 @@
                 <w:sz w:val="18"/>
                 <w:szCs w:val="18"/>
               </w:rPr>
-              <w:t xml:space="preserve">2.0</w:t>
+              <w:t xml:space="preserve">2.1</w:t>
             </w:r>
           </w:p>
         </w:tc>
@@ -1561,7 +1561,7 @@
                 <w:sz w:val="18"/>
                 <w:szCs w:val="18"/>
               </w:rPr>
-              <w:t xml:space="preserve">21/10/2026</w:t>
+              <w:t xml:space="preserve">22/10/2026</w:t>
             </w:r>
           </w:p>
         </w:tc>
@@ -1593,7 +1593,7 @@
                 <w:sz w:val="18"/>
                 <w:szCs w:val="18"/>
               </w:rPr>
-              <w:t xml:space="preserve">Backup giornaliero alle 20:00 dal Mac in Cwp › backup › data (Google blocca Apps Script); backup manuale; script 38.</w:t>
+              <w:t xml:space="preserve">Script 01-39.</w:t>
             </w:r>
           </w:p>
         </w:tc>
@@ -1663,7 +1663,7 @@
                 <w:sz w:val="18"/>
                 <w:szCs w:val="18"/>
               </w:rPr>
-              <w:t xml:space="preserve">1.9</w:t>
+              <w:t xml:space="preserve">2.0</w:t>
             </w:r>
           </w:p>
         </w:tc>
@@ -1729,7 +1729,7 @@
                 <w:sz w:val="18"/>
                 <w:szCs w:val="18"/>
               </w:rPr>
-              <w:t xml:space="preserve">Tramite per Google News delle Notizie CO2. Script 37. Tolto il tramite per Google News. Tolto il tramite per Google News.</w:t>
+              <w:t xml:space="preserve">Backup giornaliero alle 20:00 dal Mac in Cwp › backup › data (Google blocca Apps Script); backup manuale; script 38.</w:t>
             </w:r>
           </w:p>
         </w:tc>
@@ -1799,7 +1799,7 @@
                 <w:sz w:val="18"/>
                 <w:szCs w:val="18"/>
               </w:rPr>
-              <w:t xml:space="preserve">1.8</w:t>
+              <w:t xml:space="preserve">1.9</w:t>
             </w:r>
           </w:p>
         </w:tc>
@@ -1863,7 +1863,7 @@
                 <w:sz w:val="18"/>
                 <w:szCs w:val="18"/>
               </w:rPr>
-              <w:t xml:space="preserve">Script 36 e funzione notizie (Verify JWT disattivato, indirizzo url_notizie, quarto lavoro pianificato).</w:t>
+              <w:t xml:space="preserve">Tramite per Google News delle Notizie CO2. Script 37. Tolto il tramite per Google News. Tolto il tramite per Google News.</w:t>
             </w:r>
           </w:p>
         </w:tc>
@@ -1933,7 +1933,7 @@
                 <w:sz w:val="18"/>
                 <w:szCs w:val="18"/>
               </w:rPr>
-              <w:t xml:space="preserve">1.7</w:t>
+              <w:t xml:space="preserve">1.8</w:t>
             </w:r>
           </w:p>
         </w:tc>
@@ -1999,7 +1999,7 @@
                 <w:sz w:val="18"/>
                 <w:szCs w:val="18"/>
               </w:rPr>
-              <w:t xml:space="preserve">Backup automatico su Google Drive alle 13 e alle 21 (installazione, contenuto) e ripristino da un backup automatico, provato sul banco locale.</w:t>
+              <w:t xml:space="preserve">Script 36 e funzione notizie (Verify JWT disattivato, indirizzo url_notizie, quarto lavoro pianificato).</w:t>
             </w:r>
           </w:p>
         </w:tc>
@@ -2069,7 +2069,7 @@
                 <w:sz w:val="18"/>
                 <w:szCs w:val="18"/>
               </w:rPr>
-              <w:t xml:space="preserve">1.6</w:t>
+              <w:t xml:space="preserve">1.7</w:t>
             </w:r>
           </w:p>
         </w:tc>
@@ -2133,7 +2133,7 @@
                 <w:sz w:val="18"/>
                 <w:szCs w:val="18"/>
               </w:rPr>
-              <w:t xml:space="preserve">Ricostruzione del database con gli script da 01 a 35 (simulatore, Amministratore principale, assistente, utenti online, Audit User, avvisi di sicurezza, controlli del collaudo).</w:t>
+              <w:t xml:space="preserve">Backup automatico su Google Drive alle 13 e alle 21 (installazione, contenuto) e ripristino da un backup automatico, provato sul banco locale.</w:t>
             </w:r>
           </w:p>
         </w:tc>
@@ -2203,7 +2203,7 @@
                 <w:sz w:val="18"/>
                 <w:szCs w:val="18"/>
               </w:rPr>
-              <w:t xml:space="preserve">1.5</w:t>
+              <w:t xml:space="preserve">1.6</w:t>
             </w:r>
           </w:p>
         </w:tc>
@@ -2236,7 +2236,7 @@
                 <w:sz w:val="18"/>
                 <w:szCs w:val="18"/>
               </w:rPr>
-              <w:t xml:space="preserve">20/10/2026</w:t>
+              <w:t xml:space="preserve">21/10/2026</w:t>
             </w:r>
           </w:p>
         </w:tc>
@@ -2269,7 +2269,7 @@
                 <w:sz w:val="18"/>
                 <w:szCs w:val="18"/>
               </w:rPr>
-              <w:t xml:space="preserve">Indirizzo Supabase nella Content-Security-Policy di vercel.json; script 01-34.</w:t>
+              <w:t xml:space="preserve">Ricostruzione del database con gli script da 01 a 35 (simulatore, Amministratore principale, assistente, utenti online, Audit User, avvisi di sicurezza, controlli del collaudo).</w:t>
             </w:r>
           </w:p>
         </w:tc>
@@ -2339,7 +2339,7 @@
                 <w:sz w:val="18"/>
                 <w:szCs w:val="18"/>
               </w:rPr>
-              <w:t xml:space="preserve">1.4</w:t>
+              <w:t xml:space="preserve">1.5</w:t>
             </w:r>
           </w:p>
         </w:tc>
@@ -2403,7 +2403,7 @@
                 <w:sz w:val="18"/>
                 <w:szCs w:val="18"/>
               </w:rPr>
-              <w:t xml:space="preserve">Amministratore principale e verifiche dopo il ripristino (Audit User, assistente).</w:t>
+              <w:t xml:space="preserve">Indirizzo Supabase nella Content-Security-Policy di vercel.json; script 01-34.</w:t>
             </w:r>
           </w:p>
         </w:tc>
@@ -2473,7 +2473,7 @@
                 <w:sz w:val="18"/>
                 <w:szCs w:val="18"/>
               </w:rPr>
-              <w:t xml:space="preserve">1.3</w:t>
+              <w:t xml:space="preserve">1.4</w:t>
             </w:r>
           </w:p>
         </w:tc>
@@ -2539,7 +2539,7 @@
                 <w:sz w:val="18"/>
                 <w:szCs w:val="18"/>
               </w:rPr>
-              <w:t xml:space="preserve">Script 01-33.</w:t>
+              <w:t xml:space="preserve">Amministratore principale e verifiche dopo il ripristino (Audit User, assistente).</w:t>
             </w:r>
           </w:p>
         </w:tc>
@@ -2609,7 +2609,7 @@
                 <w:sz w:val="18"/>
                 <w:szCs w:val="18"/>
               </w:rPr>
-              <w:t xml:space="preserve">1.2</w:t>
+              <w:t xml:space="preserve">1.3</w:t>
             </w:r>
           </w:p>
         </w:tc>
@@ -2673,7 +2673,7 @@
                 <w:sz w:val="18"/>
                 <w:szCs w:val="18"/>
               </w:rPr>
-              <w:t xml:space="preserve">Script 01-32.</w:t>
+              <w:t xml:space="preserve">Script 01-33.</w:t>
             </w:r>
           </w:p>
         </w:tc>
@@ -2743,7 +2743,7 @@
                 <w:sz w:val="18"/>
                 <w:szCs w:val="18"/>
               </w:rPr>
-              <w:t xml:space="preserve">1.1</w:t>
+              <w:t xml:space="preserve">1.2</w:t>
             </w:r>
           </w:p>
         </w:tc>
@@ -2776,7 +2776,7 @@
                 <w:sz w:val="18"/>
                 <w:szCs w:val="18"/>
               </w:rPr>
-              <w:t xml:space="preserve">19/10/2026</w:t>
+              <w:t xml:space="preserve">20/10/2026</w:t>
             </w:r>
           </w:p>
         </w:tc>
@@ -2809,7 +2809,7 @@
                 <w:sz w:val="18"/>
                 <w:szCs w:val="18"/>
               </w:rPr>
-              <w:t xml:space="preserve">Funzione assistente e chiave ANTHROPIC_API_KEY; Claude Console tra i servizi; script 01-31.</w:t>
+              <w:t xml:space="preserve">Script 01-32.</w:t>
             </w:r>
           </w:p>
         </w:tc>
@@ -2879,6 +2879,140 @@
                 <w:sz w:val="18"/>
                 <w:szCs w:val="18"/>
               </w:rPr>
+              <w:t xml:space="preserve">1.1</w:t>
+            </w:r>
+          </w:p>
+        </w:tc>
+        <w:tc>
+          <w:tcPr>
+            <w:tcW w:type="dxa" w:w="1300"/>
+            <w:tcBorders>
+              <w:top w:val="single" w:color="D9D4C5" w:sz="4"/>
+              <w:left w:val="single" w:color="D9D4C5" w:sz="4"/>
+              <w:bottom w:val="single" w:color="D9D4C5" w:sz="4"/>
+              <w:right w:val="single" w:color="D9D4C5" w:sz="4"/>
+            </w:tcBorders>
+            <w:tcMar>
+              <w:top w:type="dxa" w:w="70"/>
+              <w:left w:type="dxa" w:w="110"/>
+              <w:bottom w:type="dxa" w:w="70"/>
+              <w:right w:type="dxa" w:w="110"/>
+            </w:tcMar>
+            <w:vAlign w:val="center"/>
+          </w:tcPr>
+          <w:p>
+            <w:pPr>
+              <w:spacing w:after="0" w:before="0"/>
+            </w:pPr>
+            <w:r>
+              <w:rPr>
+                <w:rFonts w:ascii="Arial" w:cs="Arial" w:eastAsia="Arial" w:hAnsi="Arial"/>
+                <w:color w:val="1B2118"/>
+                <w:sz w:val="18"/>
+                <w:szCs w:val="18"/>
+              </w:rPr>
+              <w:t xml:space="preserve">19/10/2026</w:t>
+            </w:r>
+          </w:p>
+        </w:tc>
+        <w:tc>
+          <w:tcPr>
+            <w:tcW w:type="dxa" w:w="5538"/>
+            <w:tcBorders>
+              <w:top w:val="single" w:color="D9D4C5" w:sz="4"/>
+              <w:left w:val="single" w:color="D9D4C5" w:sz="4"/>
+              <w:bottom w:val="single" w:color="D9D4C5" w:sz="4"/>
+              <w:right w:val="single" w:color="D9D4C5" w:sz="4"/>
+            </w:tcBorders>
+            <w:tcMar>
+              <w:top w:type="dxa" w:w="70"/>
+              <w:left w:type="dxa" w:w="110"/>
+              <w:bottom w:type="dxa" w:w="70"/>
+              <w:right w:type="dxa" w:w="110"/>
+            </w:tcMar>
+            <w:vAlign w:val="center"/>
+          </w:tcPr>
+          <w:p>
+            <w:pPr>
+              <w:spacing w:after="0" w:before="0"/>
+            </w:pPr>
+            <w:r>
+              <w:rPr>
+                <w:rFonts w:ascii="Arial" w:cs="Arial" w:eastAsia="Arial" w:hAnsi="Arial"/>
+                <w:color w:val="1B2118"/>
+                <w:sz w:val="18"/>
+                <w:szCs w:val="18"/>
+              </w:rPr>
+              <w:t xml:space="preserve">Funzione assistente e chiave ANTHROPIC_API_KEY; Claude Console tra i servizi; script 01-31.</w:t>
+            </w:r>
+          </w:p>
+        </w:tc>
+        <w:tc>
+          <w:tcPr>
+            <w:tcW w:type="dxa" w:w="2000"/>
+            <w:tcBorders>
+              <w:top w:val="single" w:color="D9D4C5" w:sz="4"/>
+              <w:left w:val="single" w:color="D9D4C5" w:sz="4"/>
+              <w:bottom w:val="single" w:color="D9D4C5" w:sz="4"/>
+              <w:right w:val="single" w:color="D9D4C5" w:sz="4"/>
+            </w:tcBorders>
+            <w:tcMar>
+              <w:top w:type="dxa" w:w="70"/>
+              <w:left w:type="dxa" w:w="110"/>
+              <w:bottom w:type="dxa" w:w="70"/>
+              <w:right w:type="dxa" w:w="110"/>
+            </w:tcMar>
+            <w:vAlign w:val="center"/>
+          </w:tcPr>
+          <w:p>
+            <w:pPr>
+              <w:spacing w:after="0" w:before="0"/>
+            </w:pPr>
+            <w:r>
+              <w:rPr>
+                <w:rFonts w:ascii="Arial" w:cs="Arial" w:eastAsia="Arial" w:hAnsi="Arial"/>
+                <w:color w:val="1B2118"/>
+                <w:sz w:val="18"/>
+                <w:szCs w:val="18"/>
+              </w:rPr>
+              <w:t xml:space="preserve">Fondazione Operate</w:t>
+            </w:r>
+          </w:p>
+        </w:tc>
+      </w:tr>
+      <w:tr>
+        <w:trPr>
+          <w:cantSplit/>
+        </w:trPr>
+        <w:tc>
+          <w:tcPr>
+            <w:tcW w:type="dxa" w:w="800"/>
+            <w:tcBorders>
+              <w:top w:val="single" w:color="D9D4C5" w:sz="4"/>
+              <w:left w:val="single" w:color="D9D4C5" w:sz="4"/>
+              <w:bottom w:val="single" w:color="D9D4C5" w:sz="4"/>
+              <w:right w:val="single" w:color="D9D4C5" w:sz="4"/>
+            </w:tcBorders>
+            <w:shd w:fill="F6F4EE" w:color="auto" w:val="clear"/>
+            <w:tcMar>
+              <w:top w:type="dxa" w:w="70"/>
+              <w:left w:type="dxa" w:w="110"/>
+              <w:bottom w:type="dxa" w:w="70"/>
+              <w:right w:type="dxa" w:w="110"/>
+            </w:tcMar>
+            <w:vAlign w:val="center"/>
+          </w:tcPr>
+          <w:p>
+            <w:pPr>
+              <w:spacing w:after="0" w:before="0"/>
+            </w:pPr>
+            <w:r>
+              <w:rPr>
+                <w:rFonts w:ascii="Arial" w:cs="Arial" w:eastAsia="Arial" w:hAnsi="Arial"/>
+                <w:color w:val="1B2118"/>
+                <w:sz w:val="18"/>
+                <w:szCs w:val="18"/>
+              </w:rPr>
               <w:t xml:space="preserve">1.0</w:t>
             </w:r>
           </w:p>
@@ -2892,6 +3026,7 @@
               <w:bottom w:val="single" w:color="D9D4C5" w:sz="4"/>
               <w:right w:val="single" w:color="D9D4C5" w:sz="4"/>
             </w:tcBorders>
+            <w:shd w:fill="F6F4EE" w:color="auto" w:val="clear"/>
             <w:tcMar>
               <w:top w:type="dxa" w:w="70"/>
               <w:left w:type="dxa" w:w="110"/>
@@ -2924,6 +3059,7 @@
               <w:bottom w:val="single" w:color="D9D4C5" w:sz="4"/>
               <w:right w:val="single" w:color="D9D4C5" w:sz="4"/>
             </w:tcBorders>
+            <w:shd w:fill="F6F4EE" w:color="auto" w:val="clear"/>
             <w:tcMar>
               <w:top w:type="dxa" w:w="70"/>
               <w:left w:type="dxa" w:w="110"/>
@@ -2956,6 +3092,7 @@
               <w:bottom w:val="single" w:color="D9D4C5" w:sz="4"/>
               <w:right w:val="single" w:color="D9D4C5" w:sz="4"/>
             </w:tcBorders>
+            <w:shd w:fill="F6F4EE" w:color="auto" w:val="clear"/>
             <w:tcMar>
               <w:top w:type="dxa" w:w="70"/>
               <w:left w:type="dxa" w:w="110"/>
@@ -2997,7 +3134,7 @@
           <w:sz w:val="20"/>
           <w:szCs w:val="20"/>
         </w:rPr>
-        <w:t xml:space="preserve">Istruzioni alla revisione 2.6 del 23/10/2026. Si aggiornano quando cambiano servizi, piani, script del database, funzioni o chiavi; una copia è dentro ogni archivio di backup e la versione corrente si scarica dall'area Documentazione del portale (solo Amministratori).</w:t>
+        <w:t xml:space="preserve">Istruzioni alla revisione 2.7 del 23/10/2026. Si aggiornano quando cambiano servizi, piani, script del database, funzioni o chiavi; una copia è dentro ogni archivio di backup e la versione corrente si scarica dall'area Documentazione del portale (solo Amministratori).</w:t>
       </w:r>
     </w:p>
     <w:p>
@@ -8090,7 +8227,7 @@
         </w:rPr>
         <w:t xml:space="preserve"> (</w:t>
       </w:r>
-      <w:hyperlink w:history="1" r:id="rIddqcz0pqewfclllkfx4891">
+      <w:hyperlink w:history="1" r:id="rId6_rzmka8r-9xd9_vp6oi7">
         <w:r>
           <w:rPr>
             <w:rFonts w:ascii="Arial" w:cs="Arial" w:eastAsia="Arial" w:hAnsi="Arial"/>
@@ -16413,7 +16550,7 @@
         <w:szCs w:val="16"/>
       </w:rPr>
       <w:tab/>
-      <w:t xml:space="preserve">Istruzioni di ripristino · Rev. 2.6 · 23/10/2026</w:t>
+      <w:t xml:space="preserve">Istruzioni di ripristino · Rev. 2.7 · 23/10/2026</w:t>
     </w:r>
   </w:p>
 </w:hdr>
@@ -16478,7 +16615,7 @@
         <w:szCs w:val="16"/>
       </w:rPr>
       <w:tab/>
-      <w:t xml:space="preserve">Istruzioni di ripristino · Rev. 2.6 · 23/10/2026</w:t>
+      <w:t xml:space="preserve">Istruzioni di ripristino · Rev. 2.7 · 23/10/2026</w:t>
     </w:r>
   </w:p>
 </w:hdr>

</xml_diff>

<commit_message>
Marketing: documenti aggiornati (Registro cap. 16, manuali, test, issue, ripristino 01-44, presentazione), id uuid per mkt_richiesta, grafico e tabella sul telefono
Co-Authored-By: Claude Opus 5.5 <noreply@anthropic.com>
Claude-Session: https://claude.ai/code/session_01E8XCbEeVHWVP3hntUZ6kZ1
</commit_message>
<xml_diff>
--- a/public/documentazione/Istruzioni_Ripristino_Portale_CWP.docx
+++ b/public/documentazione/Istruzioni_Ripristino_Portale_CWP.docx
@@ -302,7 +302,7 @@
                 <w:sz w:val="20"/>
                 <w:szCs w:val="20"/>
               </w:rPr>
-              <w:t xml:space="preserve">Rev. 2.7</w:t>
+              <w:t xml:space="preserve">Rev. 2.8</w:t>
             </w:r>
           </w:p>
         </w:tc>
@@ -719,7 +719,7 @@
                 <w:sz w:val="18"/>
                 <w:szCs w:val="18"/>
               </w:rPr>
-              <w:t xml:space="preserve">2.7</w:t>
+              <w:t xml:space="preserve">2.8</w:t>
             </w:r>
           </w:p>
         </w:tc>
@@ -783,7 +783,7 @@
                 <w:sz w:val="18"/>
                 <w:szCs w:val="18"/>
               </w:rPr>
-              <w:t xml:space="preserve">Script 34 in produzione: l'ordine 01-43 resta quello di ricostruzione.</w:t>
+              <w:t xml:space="preserve">Script 01-44 e funzione marketing (Verify JWT disattivato).</w:t>
             </w:r>
           </w:p>
         </w:tc>
@@ -853,7 +853,7 @@
                 <w:sz w:val="18"/>
                 <w:szCs w:val="18"/>
               </w:rPr>
-              <w:t xml:space="preserve">2.6</w:t>
+              <w:t xml:space="preserve">2.7</w:t>
             </w:r>
           </w:p>
         </w:tc>
@@ -919,7 +919,7 @@
                 <w:sz w:val="18"/>
                 <w:szCs w:val="18"/>
               </w:rPr>
-              <w:t xml:space="preserve">Script del database 01-43.</w:t>
+              <w:t xml:space="preserve">Script 34 in produzione: l'ordine 01-43 resta quello di ricostruzione.</w:t>
             </w:r>
           </w:p>
         </w:tc>
@@ -989,7 +989,7 @@
                 <w:sz w:val="18"/>
                 <w:szCs w:val="18"/>
               </w:rPr>
-              <w:t xml:space="preserve">2.5</w:t>
+              <w:t xml:space="preserve">2.6</w:t>
             </w:r>
           </w:p>
         </w:tc>
@@ -1053,7 +1053,7 @@
                 <w:sz w:val="18"/>
                 <w:szCs w:val="18"/>
               </w:rPr>
-              <w:t xml:space="preserve">Script del database 01-42.</w:t>
+              <w:t xml:space="preserve">Script del database 01-43.</w:t>
             </w:r>
           </w:p>
         </w:tc>
@@ -1123,7 +1123,7 @@
                 <w:sz w:val="18"/>
                 <w:szCs w:val="18"/>
               </w:rPr>
-              <w:t xml:space="preserve">2.4</w:t>
+              <w:t xml:space="preserve">2.5</w:t>
             </w:r>
           </w:p>
         </w:tc>
@@ -1189,7 +1189,7 @@
                 <w:sz w:val="18"/>
                 <w:szCs w:val="18"/>
               </w:rPr>
-              <w:t xml:space="preserve">Script del database 01-41.</w:t>
+              <w:t xml:space="preserve">Script del database 01-42.</w:t>
             </w:r>
           </w:p>
         </w:tc>
@@ -1259,7 +1259,7 @@
                 <w:sz w:val="18"/>
                 <w:szCs w:val="18"/>
               </w:rPr>
-              <w:t xml:space="preserve">2.3</w:t>
+              <w:t xml:space="preserve">2.4</w:t>
             </w:r>
           </w:p>
         </w:tc>
@@ -1291,7 +1291,7 @@
                 <w:sz w:val="18"/>
                 <w:szCs w:val="18"/>
               </w:rPr>
-              <w:t xml:space="preserve">22/10/2026</w:t>
+              <w:t xml:space="preserve">23/10/2026</w:t>
             </w:r>
           </w:p>
         </w:tc>
@@ -1323,7 +1323,7 @@
                 <w:sz w:val="18"/>
                 <w:szCs w:val="18"/>
               </w:rPr>
-              <w:t xml:space="preserve">Script 01-40 (Banca Dati Utenze).</w:t>
+              <w:t xml:space="preserve">Script del database 01-41.</w:t>
             </w:r>
           </w:p>
         </w:tc>
@@ -1393,7 +1393,7 @@
                 <w:sz w:val="18"/>
                 <w:szCs w:val="18"/>
               </w:rPr>
-              <w:t xml:space="preserve">2.2</w:t>
+              <w:t xml:space="preserve">2.3</w:t>
             </w:r>
           </w:p>
         </w:tc>
@@ -1459,7 +1459,7 @@
                 <w:sz w:val="18"/>
                 <w:szCs w:val="18"/>
               </w:rPr>
-              <w:t xml:space="preserve">Stato del backup al 22/10: script 38 in produzione, installazione sul Mac da fare.</w:t>
+              <w:t xml:space="preserve">Script 01-40 (Banca Dati Utenze).</w:t>
             </w:r>
           </w:p>
         </w:tc>
@@ -1529,7 +1529,7 @@
                 <w:sz w:val="18"/>
                 <w:szCs w:val="18"/>
               </w:rPr>
-              <w:t xml:space="preserve">2.1</w:t>
+              <w:t xml:space="preserve">2.2</w:t>
             </w:r>
           </w:p>
         </w:tc>
@@ -1593,7 +1593,7 @@
                 <w:sz w:val="18"/>
                 <w:szCs w:val="18"/>
               </w:rPr>
-              <w:t xml:space="preserve">Script 01-39.</w:t>
+              <w:t xml:space="preserve">Stato del backup al 22/10: script 38 in produzione, installazione sul Mac da fare.</w:t>
             </w:r>
           </w:p>
         </w:tc>
@@ -1663,7 +1663,7 @@
                 <w:sz w:val="18"/>
                 <w:szCs w:val="18"/>
               </w:rPr>
-              <w:t xml:space="preserve">2.0</w:t>
+              <w:t xml:space="preserve">2.1</w:t>
             </w:r>
           </w:p>
         </w:tc>
@@ -1696,7 +1696,7 @@
                 <w:sz w:val="18"/>
                 <w:szCs w:val="18"/>
               </w:rPr>
-              <w:t xml:space="preserve">21/10/2026</w:t>
+              <w:t xml:space="preserve">22/10/2026</w:t>
             </w:r>
           </w:p>
         </w:tc>
@@ -1729,7 +1729,7 @@
                 <w:sz w:val="18"/>
                 <w:szCs w:val="18"/>
               </w:rPr>
-              <w:t xml:space="preserve">Backup giornaliero alle 20:00 dal Mac in Cwp › backup › data (Google blocca Apps Script); backup manuale; script 38.</w:t>
+              <w:t xml:space="preserve">Script 01-39.</w:t>
             </w:r>
           </w:p>
         </w:tc>
@@ -1799,7 +1799,7 @@
                 <w:sz w:val="18"/>
                 <w:szCs w:val="18"/>
               </w:rPr>
-              <w:t xml:space="preserve">1.9</w:t>
+              <w:t xml:space="preserve">2.0</w:t>
             </w:r>
           </w:p>
         </w:tc>
@@ -1863,7 +1863,7 @@
                 <w:sz w:val="18"/>
                 <w:szCs w:val="18"/>
               </w:rPr>
-              <w:t xml:space="preserve">Tramite per Google News delle Notizie CO2. Script 37. Tolto il tramite per Google News. Tolto il tramite per Google News.</w:t>
+              <w:t xml:space="preserve">Backup giornaliero alle 20:00 dal Mac in Cwp › backup › data (Google blocca Apps Script); backup manuale; script 38.</w:t>
             </w:r>
           </w:p>
         </w:tc>
@@ -1933,7 +1933,7 @@
                 <w:sz w:val="18"/>
                 <w:szCs w:val="18"/>
               </w:rPr>
-              <w:t xml:space="preserve">1.8</w:t>
+              <w:t xml:space="preserve">1.9</w:t>
             </w:r>
           </w:p>
         </w:tc>
@@ -1999,7 +1999,7 @@
                 <w:sz w:val="18"/>
                 <w:szCs w:val="18"/>
               </w:rPr>
-              <w:t xml:space="preserve">Script 36 e funzione notizie (Verify JWT disattivato, indirizzo url_notizie, quarto lavoro pianificato).</w:t>
+              <w:t xml:space="preserve">Tramite per Google News delle Notizie CO2. Script 37. Tolto il tramite per Google News. Tolto il tramite per Google News.</w:t>
             </w:r>
           </w:p>
         </w:tc>
@@ -2069,7 +2069,7 @@
                 <w:sz w:val="18"/>
                 <w:szCs w:val="18"/>
               </w:rPr>
-              <w:t xml:space="preserve">1.7</w:t>
+              <w:t xml:space="preserve">1.8</w:t>
             </w:r>
           </w:p>
         </w:tc>
@@ -2133,7 +2133,7 @@
                 <w:sz w:val="18"/>
                 <w:szCs w:val="18"/>
               </w:rPr>
-              <w:t xml:space="preserve">Backup automatico su Google Drive alle 13 e alle 21 (installazione, contenuto) e ripristino da un backup automatico, provato sul banco locale.</w:t>
+              <w:t xml:space="preserve">Script 36 e funzione notizie (Verify JWT disattivato, indirizzo url_notizie, quarto lavoro pianificato).</w:t>
             </w:r>
           </w:p>
         </w:tc>
@@ -2203,7 +2203,7 @@
                 <w:sz w:val="18"/>
                 <w:szCs w:val="18"/>
               </w:rPr>
-              <w:t xml:space="preserve">1.6</w:t>
+              <w:t xml:space="preserve">1.7</w:t>
             </w:r>
           </w:p>
         </w:tc>
@@ -2269,7 +2269,7 @@
                 <w:sz w:val="18"/>
                 <w:szCs w:val="18"/>
               </w:rPr>
-              <w:t xml:space="preserve">Ricostruzione del database con gli script da 01 a 35 (simulatore, Amministratore principale, assistente, utenti online, Audit User, avvisi di sicurezza, controlli del collaudo).</w:t>
+              <w:t xml:space="preserve">Backup automatico su Google Drive alle 13 e alle 21 (installazione, contenuto) e ripristino da un backup automatico, provato sul banco locale.</w:t>
             </w:r>
           </w:p>
         </w:tc>
@@ -2339,7 +2339,7 @@
                 <w:sz w:val="18"/>
                 <w:szCs w:val="18"/>
               </w:rPr>
-              <w:t xml:space="preserve">1.5</w:t>
+              <w:t xml:space="preserve">1.6</w:t>
             </w:r>
           </w:p>
         </w:tc>
@@ -2371,7 +2371,7 @@
                 <w:sz w:val="18"/>
                 <w:szCs w:val="18"/>
               </w:rPr>
-              <w:t xml:space="preserve">20/10/2026</w:t>
+              <w:t xml:space="preserve">21/10/2026</w:t>
             </w:r>
           </w:p>
         </w:tc>
@@ -2403,7 +2403,7 @@
                 <w:sz w:val="18"/>
                 <w:szCs w:val="18"/>
               </w:rPr>
-              <w:t xml:space="preserve">Indirizzo Supabase nella Content-Security-Policy di vercel.json; script 01-34.</w:t>
+              <w:t xml:space="preserve">Ricostruzione del database con gli script da 01 a 35 (simulatore, Amministratore principale, assistente, utenti online, Audit User, avvisi di sicurezza, controlli del collaudo).</w:t>
             </w:r>
           </w:p>
         </w:tc>
@@ -2473,7 +2473,7 @@
                 <w:sz w:val="18"/>
                 <w:szCs w:val="18"/>
               </w:rPr>
-              <w:t xml:space="preserve">1.4</w:t>
+              <w:t xml:space="preserve">1.5</w:t>
             </w:r>
           </w:p>
         </w:tc>
@@ -2539,7 +2539,7 @@
                 <w:sz w:val="18"/>
                 <w:szCs w:val="18"/>
               </w:rPr>
-              <w:t xml:space="preserve">Amministratore principale e verifiche dopo il ripristino (Audit User, assistente).</w:t>
+              <w:t xml:space="preserve">Indirizzo Supabase nella Content-Security-Policy di vercel.json; script 01-34.</w:t>
             </w:r>
           </w:p>
         </w:tc>
@@ -2609,7 +2609,7 @@
                 <w:sz w:val="18"/>
                 <w:szCs w:val="18"/>
               </w:rPr>
-              <w:t xml:space="preserve">1.3</w:t>
+              <w:t xml:space="preserve">1.4</w:t>
             </w:r>
           </w:p>
         </w:tc>
@@ -2673,7 +2673,7 @@
                 <w:sz w:val="18"/>
                 <w:szCs w:val="18"/>
               </w:rPr>
-              <w:t xml:space="preserve">Script 01-33.</w:t>
+              <w:t xml:space="preserve">Amministratore principale e verifiche dopo il ripristino (Audit User, assistente).</w:t>
             </w:r>
           </w:p>
         </w:tc>
@@ -2743,7 +2743,7 @@
                 <w:sz w:val="18"/>
                 <w:szCs w:val="18"/>
               </w:rPr>
-              <w:t xml:space="preserve">1.2</w:t>
+              <w:t xml:space="preserve">1.3</w:t>
             </w:r>
           </w:p>
         </w:tc>
@@ -2809,7 +2809,7 @@
                 <w:sz w:val="18"/>
                 <w:szCs w:val="18"/>
               </w:rPr>
-              <w:t xml:space="preserve">Script 01-32.</w:t>
+              <w:t xml:space="preserve">Script 01-33.</w:t>
             </w:r>
           </w:p>
         </w:tc>
@@ -2879,7 +2879,7 @@
                 <w:sz w:val="18"/>
                 <w:szCs w:val="18"/>
               </w:rPr>
-              <w:t xml:space="preserve">1.1</w:t>
+              <w:t xml:space="preserve">1.2</w:t>
             </w:r>
           </w:p>
         </w:tc>
@@ -2911,7 +2911,7 @@
                 <w:sz w:val="18"/>
                 <w:szCs w:val="18"/>
               </w:rPr>
-              <w:t xml:space="preserve">19/10/2026</w:t>
+              <w:t xml:space="preserve">20/10/2026</w:t>
             </w:r>
           </w:p>
         </w:tc>
@@ -2943,7 +2943,7 @@
                 <w:sz w:val="18"/>
                 <w:szCs w:val="18"/>
               </w:rPr>
-              <w:t xml:space="preserve">Funzione assistente e chiave ANTHROPIC_API_KEY; Claude Console tra i servizi; script 01-31.</w:t>
+              <w:t xml:space="preserve">Script 01-32.</w:t>
             </w:r>
           </w:p>
         </w:tc>
@@ -3013,6 +3013,142 @@
                 <w:sz w:val="18"/>
                 <w:szCs w:val="18"/>
               </w:rPr>
+              <w:t xml:space="preserve">1.1</w:t>
+            </w:r>
+          </w:p>
+        </w:tc>
+        <w:tc>
+          <w:tcPr>
+            <w:tcW w:type="dxa" w:w="1300"/>
+            <w:tcBorders>
+              <w:top w:val="single" w:color="D9D4C5" w:sz="4"/>
+              <w:left w:val="single" w:color="D9D4C5" w:sz="4"/>
+              <w:bottom w:val="single" w:color="D9D4C5" w:sz="4"/>
+              <w:right w:val="single" w:color="D9D4C5" w:sz="4"/>
+            </w:tcBorders>
+            <w:shd w:fill="F6F4EE" w:color="auto" w:val="clear"/>
+            <w:tcMar>
+              <w:top w:type="dxa" w:w="70"/>
+              <w:left w:type="dxa" w:w="110"/>
+              <w:bottom w:type="dxa" w:w="70"/>
+              <w:right w:type="dxa" w:w="110"/>
+            </w:tcMar>
+            <w:vAlign w:val="center"/>
+          </w:tcPr>
+          <w:p>
+            <w:pPr>
+              <w:spacing w:after="0" w:before="0"/>
+            </w:pPr>
+            <w:r>
+              <w:rPr>
+                <w:rFonts w:ascii="Arial" w:cs="Arial" w:eastAsia="Arial" w:hAnsi="Arial"/>
+                <w:color w:val="1B2118"/>
+                <w:sz w:val="18"/>
+                <w:szCs w:val="18"/>
+              </w:rPr>
+              <w:t xml:space="preserve">19/10/2026</w:t>
+            </w:r>
+          </w:p>
+        </w:tc>
+        <w:tc>
+          <w:tcPr>
+            <w:tcW w:type="dxa" w:w="5538"/>
+            <w:tcBorders>
+              <w:top w:val="single" w:color="D9D4C5" w:sz="4"/>
+              <w:left w:val="single" w:color="D9D4C5" w:sz="4"/>
+              <w:bottom w:val="single" w:color="D9D4C5" w:sz="4"/>
+              <w:right w:val="single" w:color="D9D4C5" w:sz="4"/>
+            </w:tcBorders>
+            <w:shd w:fill="F6F4EE" w:color="auto" w:val="clear"/>
+            <w:tcMar>
+              <w:top w:type="dxa" w:w="70"/>
+              <w:left w:type="dxa" w:w="110"/>
+              <w:bottom w:type="dxa" w:w="70"/>
+              <w:right w:type="dxa" w:w="110"/>
+            </w:tcMar>
+            <w:vAlign w:val="center"/>
+          </w:tcPr>
+          <w:p>
+            <w:pPr>
+              <w:spacing w:after="0" w:before="0"/>
+            </w:pPr>
+            <w:r>
+              <w:rPr>
+                <w:rFonts w:ascii="Arial" w:cs="Arial" w:eastAsia="Arial" w:hAnsi="Arial"/>
+                <w:color w:val="1B2118"/>
+                <w:sz w:val="18"/>
+                <w:szCs w:val="18"/>
+              </w:rPr>
+              <w:t xml:space="preserve">Funzione assistente e chiave ANTHROPIC_API_KEY; Claude Console tra i servizi; script 01-31.</w:t>
+            </w:r>
+          </w:p>
+        </w:tc>
+        <w:tc>
+          <w:tcPr>
+            <w:tcW w:type="dxa" w:w="2000"/>
+            <w:tcBorders>
+              <w:top w:val="single" w:color="D9D4C5" w:sz="4"/>
+              <w:left w:val="single" w:color="D9D4C5" w:sz="4"/>
+              <w:bottom w:val="single" w:color="D9D4C5" w:sz="4"/>
+              <w:right w:val="single" w:color="D9D4C5" w:sz="4"/>
+            </w:tcBorders>
+            <w:shd w:fill="F6F4EE" w:color="auto" w:val="clear"/>
+            <w:tcMar>
+              <w:top w:type="dxa" w:w="70"/>
+              <w:left w:type="dxa" w:w="110"/>
+              <w:bottom w:type="dxa" w:w="70"/>
+              <w:right w:type="dxa" w:w="110"/>
+            </w:tcMar>
+            <w:vAlign w:val="center"/>
+          </w:tcPr>
+          <w:p>
+            <w:pPr>
+              <w:spacing w:after="0" w:before="0"/>
+            </w:pPr>
+            <w:r>
+              <w:rPr>
+                <w:rFonts w:ascii="Arial" w:cs="Arial" w:eastAsia="Arial" w:hAnsi="Arial"/>
+                <w:color w:val="1B2118"/>
+                <w:sz w:val="18"/>
+                <w:szCs w:val="18"/>
+              </w:rPr>
+              <w:t xml:space="preserve">Fondazione Operate</w:t>
+            </w:r>
+          </w:p>
+        </w:tc>
+      </w:tr>
+      <w:tr>
+        <w:trPr>
+          <w:cantSplit/>
+        </w:trPr>
+        <w:tc>
+          <w:tcPr>
+            <w:tcW w:type="dxa" w:w="800"/>
+            <w:tcBorders>
+              <w:top w:val="single" w:color="D9D4C5" w:sz="4"/>
+              <w:left w:val="single" w:color="D9D4C5" w:sz="4"/>
+              <w:bottom w:val="single" w:color="D9D4C5" w:sz="4"/>
+              <w:right w:val="single" w:color="D9D4C5" w:sz="4"/>
+            </w:tcBorders>
+            <w:tcMar>
+              <w:top w:type="dxa" w:w="70"/>
+              <w:left w:type="dxa" w:w="110"/>
+              <w:bottom w:type="dxa" w:w="70"/>
+              <w:right w:type="dxa" w:w="110"/>
+            </w:tcMar>
+            <w:vAlign w:val="center"/>
+          </w:tcPr>
+          <w:p>
+            <w:pPr>
+              <w:spacing w:after="0" w:before="0"/>
+            </w:pPr>
+            <w:r>
+              <w:rPr>
+                <w:rFonts w:ascii="Arial" w:cs="Arial" w:eastAsia="Arial" w:hAnsi="Arial"/>
+                <w:color w:val="1B2118"/>
+                <w:sz w:val="18"/>
+                <w:szCs w:val="18"/>
+              </w:rPr>
               <w:t xml:space="preserve">1.0</w:t>
             </w:r>
           </w:p>
@@ -3026,7 +3162,6 @@
               <w:bottom w:val="single" w:color="D9D4C5" w:sz="4"/>
               <w:right w:val="single" w:color="D9D4C5" w:sz="4"/>
             </w:tcBorders>
-            <w:shd w:fill="F6F4EE" w:color="auto" w:val="clear"/>
             <w:tcMar>
               <w:top w:type="dxa" w:w="70"/>
               <w:left w:type="dxa" w:w="110"/>
@@ -3059,7 +3194,6 @@
               <w:bottom w:val="single" w:color="D9D4C5" w:sz="4"/>
               <w:right w:val="single" w:color="D9D4C5" w:sz="4"/>
             </w:tcBorders>
-            <w:shd w:fill="F6F4EE" w:color="auto" w:val="clear"/>
             <w:tcMar>
               <w:top w:type="dxa" w:w="70"/>
               <w:left w:type="dxa" w:w="110"/>
@@ -3092,7 +3226,6 @@
               <w:bottom w:val="single" w:color="D9D4C5" w:sz="4"/>
               <w:right w:val="single" w:color="D9D4C5" w:sz="4"/>
             </w:tcBorders>
-            <w:shd w:fill="F6F4EE" w:color="auto" w:val="clear"/>
             <w:tcMar>
               <w:top w:type="dxa" w:w="70"/>
               <w:left w:type="dxa" w:w="110"/>
@@ -3134,7 +3267,7 @@
           <w:sz w:val="20"/>
           <w:szCs w:val="20"/>
         </w:rPr>
-        <w:t xml:space="preserve">Istruzioni alla revisione 2.7 del 23/10/2026. Si aggiornano quando cambiano servizi, piani, script del database, funzioni o chiavi; una copia è dentro ogni archivio di backup e la versione corrente si scarica dall'area Documentazione del portale (solo Amministratori).</w:t>
+        <w:t xml:space="preserve">Istruzioni alla revisione 2.8 del 23/10/2026. Si aggiornano quando cambiano servizi, piani, script del database, funzioni o chiavi; una copia è dentro ogni archivio di backup e la versione corrente si scarica dall'area Documentazione del portale (solo Amministratori).</w:t>
       </w:r>
     </w:p>
     <w:p>
@@ -4659,7 +4792,7 @@
                 <w:sz w:val="18"/>
                 <w:szCs w:val="18"/>
               </w:rPr>
-              <w:t xml:space="preserve">Tutto il codice, gli script del database (01-43), le funzioni del server, i manuali e la loro storia</w:t>
+              <w:t xml:space="preserve">Tutto il codice, gli script del database (01-44), le funzioni del server, i manuali e la loro storia</w:t>
             </w:r>
           </w:p>
         </w:tc>
@@ -8227,7 +8360,7 @@
         </w:rPr>
         <w:t xml:space="preserve"> (</w:t>
       </w:r>
-      <w:hyperlink w:history="1" r:id="rId6_rzmka8r-9xd9_vp6oi7">
+      <w:hyperlink w:history="1" r:id="rIdisypbqnqsmh6mvsumlut2">
         <w:r>
           <w:rPr>
             <w:rFonts w:ascii="Arial" w:cs="Arial" w:eastAsia="Arial" w:hAnsi="Arial"/>
@@ -9039,7 +9172,7 @@
           <w:sz w:val="21"/>
           <w:szCs w:val="21"/>
         </w:rPr>
-        <w:t xml:space="preserve"> ed esecuzione degli script 01-43, come nel capitolo «Supabase: ricostruzione da zero», passi 1 e 2.</w:t>
+        <w:t xml:space="preserve"> ed esecuzione degli script 01-44, come nel capitolo «Supabase: ricostruzione da zero», passi 1 e 2.</w:t>
       </w:r>
     </w:p>
     <w:p>
@@ -11591,7 +11724,7 @@
           <w:sz w:val="21"/>
           <w:szCs w:val="21"/>
         </w:rPr>
-        <w:t xml:space="preserve">43_valore_progetti.sql</w:t>
+        <w:t xml:space="preserve">44_marketing.sql</w:t>
       </w:r>
       <w:r>
         <w:rPr>
@@ -12985,6 +13118,87 @@
                 <w:sz w:val="18"/>
                 <w:szCs w:val="18"/>
               </w:rPr>
+              <w:t xml:space="preserve">marketing</w:t>
+            </w:r>
+          </w:p>
+        </w:tc>
+        <w:tc>
+          <w:tcPr>
+            <w:tcW w:type="dxa" w:w="6628"/>
+            <w:tcBorders>
+              <w:top w:val="single" w:color="D9D4C5" w:sz="4"/>
+              <w:left w:val="single" w:color="D9D4C5" w:sz="4"/>
+              <w:bottom w:val="single" w:color="D9D4C5" w:sz="4"/>
+              <w:right w:val="single" w:color="D9D4C5" w:sz="4"/>
+            </w:tcBorders>
+            <w:tcMar>
+              <w:top w:type="dxa" w:w="70"/>
+              <w:left w:type="dxa" w:w="110"/>
+              <w:bottom w:type="dxa" w:w="70"/>
+              <w:right w:type="dxa" w:w="110"/>
+            </w:tcMar>
+            <w:vAlign w:val="center"/>
+          </w:tcPr>
+          <w:p>
+            <w:pPr>
+              <w:spacing w:after="0" w:before="0"/>
+            </w:pPr>
+            <w:r>
+              <w:rPr>
+                <w:rFonts w:ascii="Arial" w:cs="Arial" w:eastAsia="Arial" w:hAnsi="Arial"/>
+                <w:b/>
+                <w:bCs/>
+                <w:color w:val="1B2118"/>
+                <w:sz w:val="18"/>
+                <w:szCs w:val="18"/>
+              </w:rPr>
+              <w:t xml:space="preserve">Disattivato</w:t>
+            </w:r>
+            <w:r>
+              <w:rPr>
+                <w:rFonts w:ascii="Arial" w:cs="Arial" w:eastAsia="Arial" w:hAnsi="Arial"/>
+                <w:color w:val="1B2118"/>
+                <w:sz w:val="18"/>
+                <w:szCs w:val="18"/>
+              </w:rPr>
+              <w:t xml:space="preserve"> (pagina pubblica /scopri; le azioni degli Amministratori controllano da sole token e ruolo)</w:t>
+            </w:r>
+          </w:p>
+        </w:tc>
+      </w:tr>
+      <w:tr>
+        <w:trPr>
+          <w:cantSplit/>
+        </w:trPr>
+        <w:tc>
+          <w:tcPr>
+            <w:tcW w:type="dxa" w:w="3010"/>
+            <w:tcBorders>
+              <w:top w:val="single" w:color="D9D4C5" w:sz="4"/>
+              <w:left w:val="single" w:color="D9D4C5" w:sz="4"/>
+              <w:bottom w:val="single" w:color="D9D4C5" w:sz="4"/>
+              <w:right w:val="single" w:color="D9D4C5" w:sz="4"/>
+            </w:tcBorders>
+            <w:shd w:fill="F6F4EE" w:color="auto" w:val="clear"/>
+            <w:tcMar>
+              <w:top w:type="dxa" w:w="70"/>
+              <w:left w:type="dxa" w:w="110"/>
+              <w:bottom w:type="dxa" w:w="70"/>
+              <w:right w:type="dxa" w:w="110"/>
+            </w:tcMar>
+            <w:vAlign w:val="center"/>
+          </w:tcPr>
+          <w:p>
+            <w:pPr>
+              <w:spacing w:after="0" w:before="0"/>
+            </w:pPr>
+            <w:r>
+              <w:rPr>
+                <w:rFonts w:ascii="Consolas" w:cs="Consolas" w:eastAsia="Consolas" w:hAnsi="Consolas"/>
+                <w:color w:val="2F5D3A"/>
+                <w:sz w:val="18"/>
+                <w:szCs w:val="18"/>
+              </w:rPr>
               <w:t xml:space="preserve">notizie</w:t>
             </w:r>
           </w:p>
@@ -12998,6 +13212,7 @@
               <w:bottom w:val="single" w:color="D9D4C5" w:sz="4"/>
               <w:right w:val="single" w:color="D9D4C5" w:sz="4"/>
             </w:tcBorders>
+            <w:shd w:fill="F6F4EE" w:color="auto" w:val="clear"/>
             <w:tcMar>
               <w:top w:type="dxa" w:w="70"/>
               <w:left w:type="dxa" w:w="110"/>
@@ -16550,7 +16765,7 @@
         <w:szCs w:val="16"/>
       </w:rPr>
       <w:tab/>
-      <w:t xml:space="preserve">Istruzioni di ripristino · Rev. 2.7 · 23/10/2026</w:t>
+      <w:t xml:space="preserve">Istruzioni di ripristino · Rev. 2.8 · 23/10/2026</w:t>
     </w:r>
   </w:p>
 </w:hdr>
@@ -16615,7 +16830,7 @@
         <w:szCs w:val="16"/>
       </w:rPr>
       <w:tab/>
-      <w:t xml:space="preserve">Istruzioni di ripristino · Rev. 2.7 · 23/10/2026</w:t>
+      <w:t xml:space="preserve">Istruzioni di ripristino · Rev. 2.8 · 23/10/2026</w:t>
     </w:r>
   </w:p>
 </w:hdr>

</xml_diff>

<commit_message>
Documenti: script 45 in produzione (ISS-039, ISS-040)
Co-Authored-By: Claude Opus 5.5 <noreply@anthropic.com>
Claude-Session: https://claude.ai/code/session_01E8XCbEeVHWVP3hntUZ6kZ1
</commit_message>
<xml_diff>
--- a/public/documentazione/Istruzioni_Ripristino_Portale_CWP.docx
+++ b/public/documentazione/Istruzioni_Ripristino_Portale_CWP.docx
@@ -302,7 +302,7 @@
                 <w:sz w:val="20"/>
                 <w:szCs w:val="20"/>
               </w:rPr>
-              <w:t xml:space="preserve">Rev. 2.8</w:t>
+              <w:t xml:space="preserve">Rev. 2.9</w:t>
             </w:r>
           </w:p>
         </w:tc>
@@ -719,7 +719,7 @@
                 <w:sz w:val="18"/>
                 <w:szCs w:val="18"/>
               </w:rPr>
-              <w:t xml:space="preserve">2.8</w:t>
+              <w:t xml:space="preserve">2.9</w:t>
             </w:r>
           </w:p>
         </w:tc>
@@ -783,7 +783,7 @@
                 <w:sz w:val="18"/>
                 <w:szCs w:val="18"/>
               </w:rPr>
-              <w:t xml:space="preserve">Script 01-44 e funzione marketing (Verify JWT disattivato).</w:t>
+              <w:t xml:space="preserve">Script 01-45.</w:t>
             </w:r>
           </w:p>
         </w:tc>
@@ -853,7 +853,7 @@
                 <w:sz w:val="18"/>
                 <w:szCs w:val="18"/>
               </w:rPr>
-              <w:t xml:space="preserve">2.7</w:t>
+              <w:t xml:space="preserve">2.8</w:t>
             </w:r>
           </w:p>
         </w:tc>
@@ -919,7 +919,7 @@
                 <w:sz w:val="18"/>
                 <w:szCs w:val="18"/>
               </w:rPr>
-              <w:t xml:space="preserve">Script 34 in produzione: l'ordine 01-43 resta quello di ricostruzione.</w:t>
+              <w:t xml:space="preserve">Script 01-44 e funzione marketing (Verify JWT disattivato).</w:t>
             </w:r>
           </w:p>
         </w:tc>
@@ -989,7 +989,7 @@
                 <w:sz w:val="18"/>
                 <w:szCs w:val="18"/>
               </w:rPr>
-              <w:t xml:space="preserve">2.6</w:t>
+              <w:t xml:space="preserve">2.7</w:t>
             </w:r>
           </w:p>
         </w:tc>
@@ -1053,7 +1053,7 @@
                 <w:sz w:val="18"/>
                 <w:szCs w:val="18"/>
               </w:rPr>
-              <w:t xml:space="preserve">Script del database 01-43.</w:t>
+              <w:t xml:space="preserve">Script 34 in produzione: l'ordine 01-43 resta quello di ricostruzione.</w:t>
             </w:r>
           </w:p>
         </w:tc>
@@ -1123,7 +1123,7 @@
                 <w:sz w:val="18"/>
                 <w:szCs w:val="18"/>
               </w:rPr>
-              <w:t xml:space="preserve">2.5</w:t>
+              <w:t xml:space="preserve">2.6</w:t>
             </w:r>
           </w:p>
         </w:tc>
@@ -1189,7 +1189,7 @@
                 <w:sz w:val="18"/>
                 <w:szCs w:val="18"/>
               </w:rPr>
-              <w:t xml:space="preserve">Script del database 01-42.</w:t>
+              <w:t xml:space="preserve">Script del database 01-43.</w:t>
             </w:r>
           </w:p>
         </w:tc>
@@ -1259,7 +1259,7 @@
                 <w:sz w:val="18"/>
                 <w:szCs w:val="18"/>
               </w:rPr>
-              <w:t xml:space="preserve">2.4</w:t>
+              <w:t xml:space="preserve">2.5</w:t>
             </w:r>
           </w:p>
         </w:tc>
@@ -1323,7 +1323,7 @@
                 <w:sz w:val="18"/>
                 <w:szCs w:val="18"/>
               </w:rPr>
-              <w:t xml:space="preserve">Script del database 01-41.</w:t>
+              <w:t xml:space="preserve">Script del database 01-42.</w:t>
             </w:r>
           </w:p>
         </w:tc>
@@ -1393,7 +1393,7 @@
                 <w:sz w:val="18"/>
                 <w:szCs w:val="18"/>
               </w:rPr>
-              <w:t xml:space="preserve">2.3</w:t>
+              <w:t xml:space="preserve">2.4</w:t>
             </w:r>
           </w:p>
         </w:tc>
@@ -1426,7 +1426,7 @@
                 <w:sz w:val="18"/>
                 <w:szCs w:val="18"/>
               </w:rPr>
-              <w:t xml:space="preserve">22/10/2026</w:t>
+              <w:t xml:space="preserve">23/10/2026</w:t>
             </w:r>
           </w:p>
         </w:tc>
@@ -1459,7 +1459,7 @@
                 <w:sz w:val="18"/>
                 <w:szCs w:val="18"/>
               </w:rPr>
-              <w:t xml:space="preserve">Script 01-40 (Banca Dati Utenze).</w:t>
+              <w:t xml:space="preserve">Script del database 01-41.</w:t>
             </w:r>
           </w:p>
         </w:tc>
@@ -1529,7 +1529,7 @@
                 <w:sz w:val="18"/>
                 <w:szCs w:val="18"/>
               </w:rPr>
-              <w:t xml:space="preserve">2.2</w:t>
+              <w:t xml:space="preserve">2.3</w:t>
             </w:r>
           </w:p>
         </w:tc>
@@ -1593,7 +1593,7 @@
                 <w:sz w:val="18"/>
                 <w:szCs w:val="18"/>
               </w:rPr>
-              <w:t xml:space="preserve">Stato del backup al 22/10: script 38 in produzione, installazione sul Mac da fare.</w:t>
+              <w:t xml:space="preserve">Script 01-40 (Banca Dati Utenze).</w:t>
             </w:r>
           </w:p>
         </w:tc>
@@ -1663,7 +1663,7 @@
                 <w:sz w:val="18"/>
                 <w:szCs w:val="18"/>
               </w:rPr>
-              <w:t xml:space="preserve">2.1</w:t>
+              <w:t xml:space="preserve">2.2</w:t>
             </w:r>
           </w:p>
         </w:tc>
@@ -1729,7 +1729,7 @@
                 <w:sz w:val="18"/>
                 <w:szCs w:val="18"/>
               </w:rPr>
-              <w:t xml:space="preserve">Script 01-39.</w:t>
+              <w:t xml:space="preserve">Stato del backup al 22/10: script 38 in produzione, installazione sul Mac da fare.</w:t>
             </w:r>
           </w:p>
         </w:tc>
@@ -1799,7 +1799,7 @@
                 <w:sz w:val="18"/>
                 <w:szCs w:val="18"/>
               </w:rPr>
-              <w:t xml:space="preserve">2.0</w:t>
+              <w:t xml:space="preserve">2.1</w:t>
             </w:r>
           </w:p>
         </w:tc>
@@ -1831,7 +1831,7 @@
                 <w:sz w:val="18"/>
                 <w:szCs w:val="18"/>
               </w:rPr>
-              <w:t xml:space="preserve">21/10/2026</w:t>
+              <w:t xml:space="preserve">22/10/2026</w:t>
             </w:r>
           </w:p>
         </w:tc>
@@ -1863,7 +1863,7 @@
                 <w:sz w:val="18"/>
                 <w:szCs w:val="18"/>
               </w:rPr>
-              <w:t xml:space="preserve">Backup giornaliero alle 20:00 dal Mac in Cwp › backup › data (Google blocca Apps Script); backup manuale; script 38.</w:t>
+              <w:t xml:space="preserve">Script 01-39.</w:t>
             </w:r>
           </w:p>
         </w:tc>
@@ -1933,7 +1933,7 @@
                 <w:sz w:val="18"/>
                 <w:szCs w:val="18"/>
               </w:rPr>
-              <w:t xml:space="preserve">1.9</w:t>
+              <w:t xml:space="preserve">2.0</w:t>
             </w:r>
           </w:p>
         </w:tc>
@@ -1999,7 +1999,7 @@
                 <w:sz w:val="18"/>
                 <w:szCs w:val="18"/>
               </w:rPr>
-              <w:t xml:space="preserve">Tramite per Google News delle Notizie CO2. Script 37. Tolto il tramite per Google News. Tolto il tramite per Google News.</w:t>
+              <w:t xml:space="preserve">Backup giornaliero alle 20:00 dal Mac in Cwp › backup › data (Google blocca Apps Script); backup manuale; script 38.</w:t>
             </w:r>
           </w:p>
         </w:tc>
@@ -2069,7 +2069,7 @@
                 <w:sz w:val="18"/>
                 <w:szCs w:val="18"/>
               </w:rPr>
-              <w:t xml:space="preserve">1.8</w:t>
+              <w:t xml:space="preserve">1.9</w:t>
             </w:r>
           </w:p>
         </w:tc>
@@ -2133,7 +2133,7 @@
                 <w:sz w:val="18"/>
                 <w:szCs w:val="18"/>
               </w:rPr>
-              <w:t xml:space="preserve">Script 36 e funzione notizie (Verify JWT disattivato, indirizzo url_notizie, quarto lavoro pianificato).</w:t>
+              <w:t xml:space="preserve">Tramite per Google News delle Notizie CO2. Script 37. Tolto il tramite per Google News. Tolto il tramite per Google News.</w:t>
             </w:r>
           </w:p>
         </w:tc>
@@ -2203,7 +2203,7 @@
                 <w:sz w:val="18"/>
                 <w:szCs w:val="18"/>
               </w:rPr>
-              <w:t xml:space="preserve">1.7</w:t>
+              <w:t xml:space="preserve">1.8</w:t>
             </w:r>
           </w:p>
         </w:tc>
@@ -2269,7 +2269,7 @@
                 <w:sz w:val="18"/>
                 <w:szCs w:val="18"/>
               </w:rPr>
-              <w:t xml:space="preserve">Backup automatico su Google Drive alle 13 e alle 21 (installazione, contenuto) e ripristino da un backup automatico, provato sul banco locale.</w:t>
+              <w:t xml:space="preserve">Script 36 e funzione notizie (Verify JWT disattivato, indirizzo url_notizie, quarto lavoro pianificato).</w:t>
             </w:r>
           </w:p>
         </w:tc>
@@ -2339,7 +2339,7 @@
                 <w:sz w:val="18"/>
                 <w:szCs w:val="18"/>
               </w:rPr>
-              <w:t xml:space="preserve">1.6</w:t>
+              <w:t xml:space="preserve">1.7</w:t>
             </w:r>
           </w:p>
         </w:tc>
@@ -2403,7 +2403,7 @@
                 <w:sz w:val="18"/>
                 <w:szCs w:val="18"/>
               </w:rPr>
-              <w:t xml:space="preserve">Ricostruzione del database con gli script da 01 a 35 (simulatore, Amministratore principale, assistente, utenti online, Audit User, avvisi di sicurezza, controlli del collaudo).</w:t>
+              <w:t xml:space="preserve">Backup automatico su Google Drive alle 13 e alle 21 (installazione, contenuto) e ripristino da un backup automatico, provato sul banco locale.</w:t>
             </w:r>
           </w:p>
         </w:tc>
@@ -2473,7 +2473,7 @@
                 <w:sz w:val="18"/>
                 <w:szCs w:val="18"/>
               </w:rPr>
-              <w:t xml:space="preserve">1.5</w:t>
+              <w:t xml:space="preserve">1.6</w:t>
             </w:r>
           </w:p>
         </w:tc>
@@ -2506,7 +2506,7 @@
                 <w:sz w:val="18"/>
                 <w:szCs w:val="18"/>
               </w:rPr>
-              <w:t xml:space="preserve">20/10/2026</w:t>
+              <w:t xml:space="preserve">21/10/2026</w:t>
             </w:r>
           </w:p>
         </w:tc>
@@ -2539,7 +2539,7 @@
                 <w:sz w:val="18"/>
                 <w:szCs w:val="18"/>
               </w:rPr>
-              <w:t xml:space="preserve">Indirizzo Supabase nella Content-Security-Policy di vercel.json; script 01-34.</w:t>
+              <w:t xml:space="preserve">Ricostruzione del database con gli script da 01 a 35 (simulatore, Amministratore principale, assistente, utenti online, Audit User, avvisi di sicurezza, controlli del collaudo).</w:t>
             </w:r>
           </w:p>
         </w:tc>
@@ -2609,7 +2609,7 @@
                 <w:sz w:val="18"/>
                 <w:szCs w:val="18"/>
               </w:rPr>
-              <w:t xml:space="preserve">1.4</w:t>
+              <w:t xml:space="preserve">1.5</w:t>
             </w:r>
           </w:p>
         </w:tc>
@@ -2673,7 +2673,7 @@
                 <w:sz w:val="18"/>
                 <w:szCs w:val="18"/>
               </w:rPr>
-              <w:t xml:space="preserve">Amministratore principale e verifiche dopo il ripristino (Audit User, assistente).</w:t>
+              <w:t xml:space="preserve">Indirizzo Supabase nella Content-Security-Policy di vercel.json; script 01-34.</w:t>
             </w:r>
           </w:p>
         </w:tc>
@@ -2743,7 +2743,7 @@
                 <w:sz w:val="18"/>
                 <w:szCs w:val="18"/>
               </w:rPr>
-              <w:t xml:space="preserve">1.3</w:t>
+              <w:t xml:space="preserve">1.4</w:t>
             </w:r>
           </w:p>
         </w:tc>
@@ -2809,7 +2809,7 @@
                 <w:sz w:val="18"/>
                 <w:szCs w:val="18"/>
               </w:rPr>
-              <w:t xml:space="preserve">Script 01-33.</w:t>
+              <w:t xml:space="preserve">Amministratore principale e verifiche dopo il ripristino (Audit User, assistente).</w:t>
             </w:r>
           </w:p>
         </w:tc>
@@ -2879,7 +2879,7 @@
                 <w:sz w:val="18"/>
                 <w:szCs w:val="18"/>
               </w:rPr>
-              <w:t xml:space="preserve">1.2</w:t>
+              <w:t xml:space="preserve">1.3</w:t>
             </w:r>
           </w:p>
         </w:tc>
@@ -2943,7 +2943,7 @@
                 <w:sz w:val="18"/>
                 <w:szCs w:val="18"/>
               </w:rPr>
-              <w:t xml:space="preserve">Script 01-32.</w:t>
+              <w:t xml:space="preserve">Script 01-33.</w:t>
             </w:r>
           </w:p>
         </w:tc>
@@ -3013,7 +3013,7 @@
                 <w:sz w:val="18"/>
                 <w:szCs w:val="18"/>
               </w:rPr>
-              <w:t xml:space="preserve">1.1</w:t>
+              <w:t xml:space="preserve">1.2</w:t>
             </w:r>
           </w:p>
         </w:tc>
@@ -3046,7 +3046,7 @@
                 <w:sz w:val="18"/>
                 <w:szCs w:val="18"/>
               </w:rPr>
-              <w:t xml:space="preserve">19/10/2026</w:t>
+              <w:t xml:space="preserve">20/10/2026</w:t>
             </w:r>
           </w:p>
         </w:tc>
@@ -3079,7 +3079,7 @@
                 <w:sz w:val="18"/>
                 <w:szCs w:val="18"/>
               </w:rPr>
-              <w:t xml:space="preserve">Funzione assistente e chiave ANTHROPIC_API_KEY; Claude Console tra i servizi; script 01-31.</w:t>
+              <w:t xml:space="preserve">Script 01-32.</w:t>
             </w:r>
           </w:p>
         </w:tc>
@@ -3149,6 +3149,140 @@
                 <w:sz w:val="18"/>
                 <w:szCs w:val="18"/>
               </w:rPr>
+              <w:t xml:space="preserve">1.1</w:t>
+            </w:r>
+          </w:p>
+        </w:tc>
+        <w:tc>
+          <w:tcPr>
+            <w:tcW w:type="dxa" w:w="1300"/>
+            <w:tcBorders>
+              <w:top w:val="single" w:color="D9D4C5" w:sz="4"/>
+              <w:left w:val="single" w:color="D9D4C5" w:sz="4"/>
+              <w:bottom w:val="single" w:color="D9D4C5" w:sz="4"/>
+              <w:right w:val="single" w:color="D9D4C5" w:sz="4"/>
+            </w:tcBorders>
+            <w:tcMar>
+              <w:top w:type="dxa" w:w="70"/>
+              <w:left w:type="dxa" w:w="110"/>
+              <w:bottom w:type="dxa" w:w="70"/>
+              <w:right w:type="dxa" w:w="110"/>
+            </w:tcMar>
+            <w:vAlign w:val="center"/>
+          </w:tcPr>
+          <w:p>
+            <w:pPr>
+              <w:spacing w:after="0" w:before="0"/>
+            </w:pPr>
+            <w:r>
+              <w:rPr>
+                <w:rFonts w:ascii="Arial" w:cs="Arial" w:eastAsia="Arial" w:hAnsi="Arial"/>
+                <w:color w:val="1B2118"/>
+                <w:sz w:val="18"/>
+                <w:szCs w:val="18"/>
+              </w:rPr>
+              <w:t xml:space="preserve">19/10/2026</w:t>
+            </w:r>
+          </w:p>
+        </w:tc>
+        <w:tc>
+          <w:tcPr>
+            <w:tcW w:type="dxa" w:w="5538"/>
+            <w:tcBorders>
+              <w:top w:val="single" w:color="D9D4C5" w:sz="4"/>
+              <w:left w:val="single" w:color="D9D4C5" w:sz="4"/>
+              <w:bottom w:val="single" w:color="D9D4C5" w:sz="4"/>
+              <w:right w:val="single" w:color="D9D4C5" w:sz="4"/>
+            </w:tcBorders>
+            <w:tcMar>
+              <w:top w:type="dxa" w:w="70"/>
+              <w:left w:type="dxa" w:w="110"/>
+              <w:bottom w:type="dxa" w:w="70"/>
+              <w:right w:type="dxa" w:w="110"/>
+            </w:tcMar>
+            <w:vAlign w:val="center"/>
+          </w:tcPr>
+          <w:p>
+            <w:pPr>
+              <w:spacing w:after="0" w:before="0"/>
+            </w:pPr>
+            <w:r>
+              <w:rPr>
+                <w:rFonts w:ascii="Arial" w:cs="Arial" w:eastAsia="Arial" w:hAnsi="Arial"/>
+                <w:color w:val="1B2118"/>
+                <w:sz w:val="18"/>
+                <w:szCs w:val="18"/>
+              </w:rPr>
+              <w:t xml:space="preserve">Funzione assistente e chiave ANTHROPIC_API_KEY; Claude Console tra i servizi; script 01-31.</w:t>
+            </w:r>
+          </w:p>
+        </w:tc>
+        <w:tc>
+          <w:tcPr>
+            <w:tcW w:type="dxa" w:w="2000"/>
+            <w:tcBorders>
+              <w:top w:val="single" w:color="D9D4C5" w:sz="4"/>
+              <w:left w:val="single" w:color="D9D4C5" w:sz="4"/>
+              <w:bottom w:val="single" w:color="D9D4C5" w:sz="4"/>
+              <w:right w:val="single" w:color="D9D4C5" w:sz="4"/>
+            </w:tcBorders>
+            <w:tcMar>
+              <w:top w:type="dxa" w:w="70"/>
+              <w:left w:type="dxa" w:w="110"/>
+              <w:bottom w:type="dxa" w:w="70"/>
+              <w:right w:type="dxa" w:w="110"/>
+            </w:tcMar>
+            <w:vAlign w:val="center"/>
+          </w:tcPr>
+          <w:p>
+            <w:pPr>
+              <w:spacing w:after="0" w:before="0"/>
+            </w:pPr>
+            <w:r>
+              <w:rPr>
+                <w:rFonts w:ascii="Arial" w:cs="Arial" w:eastAsia="Arial" w:hAnsi="Arial"/>
+                <w:color w:val="1B2118"/>
+                <w:sz w:val="18"/>
+                <w:szCs w:val="18"/>
+              </w:rPr>
+              <w:t xml:space="preserve">Fondazione Operate</w:t>
+            </w:r>
+          </w:p>
+        </w:tc>
+      </w:tr>
+      <w:tr>
+        <w:trPr>
+          <w:cantSplit/>
+        </w:trPr>
+        <w:tc>
+          <w:tcPr>
+            <w:tcW w:type="dxa" w:w="800"/>
+            <w:tcBorders>
+              <w:top w:val="single" w:color="D9D4C5" w:sz="4"/>
+              <w:left w:val="single" w:color="D9D4C5" w:sz="4"/>
+              <w:bottom w:val="single" w:color="D9D4C5" w:sz="4"/>
+              <w:right w:val="single" w:color="D9D4C5" w:sz="4"/>
+            </w:tcBorders>
+            <w:shd w:fill="F6F4EE" w:color="auto" w:val="clear"/>
+            <w:tcMar>
+              <w:top w:type="dxa" w:w="70"/>
+              <w:left w:type="dxa" w:w="110"/>
+              <w:bottom w:type="dxa" w:w="70"/>
+              <w:right w:type="dxa" w:w="110"/>
+            </w:tcMar>
+            <w:vAlign w:val="center"/>
+          </w:tcPr>
+          <w:p>
+            <w:pPr>
+              <w:spacing w:after="0" w:before="0"/>
+            </w:pPr>
+            <w:r>
+              <w:rPr>
+                <w:rFonts w:ascii="Arial" w:cs="Arial" w:eastAsia="Arial" w:hAnsi="Arial"/>
+                <w:color w:val="1B2118"/>
+                <w:sz w:val="18"/>
+                <w:szCs w:val="18"/>
+              </w:rPr>
               <w:t xml:space="preserve">1.0</w:t>
             </w:r>
           </w:p>
@@ -3162,6 +3296,7 @@
               <w:bottom w:val="single" w:color="D9D4C5" w:sz="4"/>
               <w:right w:val="single" w:color="D9D4C5" w:sz="4"/>
             </w:tcBorders>
+            <w:shd w:fill="F6F4EE" w:color="auto" w:val="clear"/>
             <w:tcMar>
               <w:top w:type="dxa" w:w="70"/>
               <w:left w:type="dxa" w:w="110"/>
@@ -3194,6 +3329,7 @@
               <w:bottom w:val="single" w:color="D9D4C5" w:sz="4"/>
               <w:right w:val="single" w:color="D9D4C5" w:sz="4"/>
             </w:tcBorders>
+            <w:shd w:fill="F6F4EE" w:color="auto" w:val="clear"/>
             <w:tcMar>
               <w:top w:type="dxa" w:w="70"/>
               <w:left w:type="dxa" w:w="110"/>
@@ -3226,6 +3362,7 @@
               <w:bottom w:val="single" w:color="D9D4C5" w:sz="4"/>
               <w:right w:val="single" w:color="D9D4C5" w:sz="4"/>
             </w:tcBorders>
+            <w:shd w:fill="F6F4EE" w:color="auto" w:val="clear"/>
             <w:tcMar>
               <w:top w:type="dxa" w:w="70"/>
               <w:left w:type="dxa" w:w="110"/>
@@ -3267,7 +3404,7 @@
           <w:sz w:val="20"/>
           <w:szCs w:val="20"/>
         </w:rPr>
-        <w:t xml:space="preserve">Istruzioni alla revisione 2.8 del 23/10/2026. Si aggiornano quando cambiano servizi, piani, script del database, funzioni o chiavi; una copia è dentro ogni archivio di backup e la versione corrente si scarica dall'area Documentazione del portale (solo Amministratori).</w:t>
+        <w:t xml:space="preserve">Istruzioni alla revisione 2.9 del 23/10/2026. Si aggiornano quando cambiano servizi, piani, script del database, funzioni o chiavi; una copia è dentro ogni archivio di backup e la versione corrente si scarica dall'area Documentazione del portale (solo Amministratori).</w:t>
       </w:r>
     </w:p>
     <w:p>
@@ -4792,7 +4929,7 @@
                 <w:sz w:val="18"/>
                 <w:szCs w:val="18"/>
               </w:rPr>
-              <w:t xml:space="preserve">Tutto il codice, gli script del database (01-44), le funzioni del server, i manuali e la loro storia</w:t>
+              <w:t xml:space="preserve">Tutto il codice, gli script del database (01-45), le funzioni del server, i manuali e la loro storia</w:t>
             </w:r>
           </w:p>
         </w:tc>
@@ -8360,7 +8497,7 @@
         </w:rPr>
         <w:t xml:space="preserve"> (</w:t>
       </w:r>
-      <w:hyperlink w:history="1" r:id="rIdisypbqnqsmh6mvsumlut2">
+      <w:hyperlink w:history="1" r:id="rIdw_tobpltktigjbee3g0c3">
         <w:r>
           <w:rPr>
             <w:rFonts w:ascii="Arial" w:cs="Arial" w:eastAsia="Arial" w:hAnsi="Arial"/>
@@ -9172,7 +9309,7 @@
           <w:sz w:val="21"/>
           <w:szCs w:val="21"/>
         </w:rPr>
-        <w:t xml:space="preserve"> ed esecuzione degli script 01-44, come nel capitolo «Supabase: ricostruzione da zero», passi 1 e 2.</w:t>
+        <w:t xml:space="preserve"> ed esecuzione degli script 01-45, come nel capitolo «Supabase: ricostruzione da zero», passi 1 e 2.</w:t>
       </w:r>
     </w:p>
     <w:p>
@@ -11724,7 +11861,7 @@
           <w:sz w:val="21"/>
           <w:szCs w:val="21"/>
         </w:rPr>
-        <w:t xml:space="preserve">44_marketing.sql</w:t>
+        <w:t xml:space="preserve">45_rapporto_registrato_marketing_rls.sql</w:t>
       </w:r>
       <w:r>
         <w:rPr>
@@ -16765,7 +16902,7 @@
         <w:szCs w:val="16"/>
       </w:rPr>
       <w:tab/>
-      <w:t xml:space="preserve">Istruzioni di ripristino · Rev. 2.8 · 23/10/2026</w:t>
+      <w:t xml:space="preserve">Istruzioni di ripristino · Rev. 2.9 · 23/10/2026</w:t>
     </w:r>
   </w:p>
 </w:hdr>
@@ -16830,7 +16967,7 @@
         <w:szCs w:val="16"/>
       </w:rPr>
       <w:tab/>
-      <w:t xml:space="preserve">Istruzioni di ripristino · Rev. 2.8 · 23/10/2026</w:t>
+      <w:t xml:space="preserve">Istruzioni di ripristino · Rev. 2.9 · 23/10/2026</w:t>
     </w:r>
   </w:p>
 </w:hdr>

</xml_diff>

<commit_message>
Documenti: lettore dei siti (script 46) e secondo lotto di gestori
Co-Authored-By: Claude Opus 5.5 <noreply@anthropic.com>
Claude-Session: https://claude.ai/code/session_01E8XCbEeVHWVP3hntUZ6kZ1
</commit_message>
<xml_diff>
--- a/public/documentazione/Istruzioni_Ripristino_Portale_CWP.docx
+++ b/public/documentazione/Istruzioni_Ripristino_Portale_CWP.docx
@@ -302,7 +302,7 @@
                 <w:sz w:val="20"/>
                 <w:szCs w:val="20"/>
               </w:rPr>
-              <w:t xml:space="preserve">Rev. 2.9</w:t>
+              <w:t xml:space="preserve">Rev. 3.0</w:t>
             </w:r>
           </w:p>
         </w:tc>
@@ -365,7 +365,7 @@
                 <w:sz w:val="20"/>
                 <w:szCs w:val="20"/>
               </w:rPr>
-              <w:t xml:space="preserve">23/10/2026</w:t>
+              <w:t xml:space="preserve">25/10/2026</w:t>
             </w:r>
           </w:p>
         </w:tc>
@@ -719,7 +719,7 @@
                 <w:sz w:val="18"/>
                 <w:szCs w:val="18"/>
               </w:rPr>
-              <w:t xml:space="preserve">2.9</w:t>
+              <w:t xml:space="preserve">3.0</w:t>
             </w:r>
           </w:p>
         </w:tc>
@@ -751,7 +751,7 @@
                 <w:sz w:val="18"/>
                 <w:szCs w:val="18"/>
               </w:rPr>
-              <w:t xml:space="preserve">23/10/2026</w:t>
+              <w:t xml:space="preserve">25/10/2026</w:t>
             </w:r>
           </w:p>
         </w:tc>
@@ -783,7 +783,7 @@
                 <w:sz w:val="18"/>
                 <w:szCs w:val="18"/>
               </w:rPr>
-              <w:t xml:space="preserve">Script 01-45.</w:t>
+              <w:t xml:space="preserve">Script 01-46, lavoro pianificato cwp_lettura_siti, impostazione url_marketing.</w:t>
             </w:r>
           </w:p>
         </w:tc>
@@ -853,7 +853,7 @@
                 <w:sz w:val="18"/>
                 <w:szCs w:val="18"/>
               </w:rPr>
-              <w:t xml:space="preserve">2.8</w:t>
+              <w:t xml:space="preserve">2.9</w:t>
             </w:r>
           </w:p>
         </w:tc>
@@ -919,7 +919,7 @@
                 <w:sz w:val="18"/>
                 <w:szCs w:val="18"/>
               </w:rPr>
-              <w:t xml:space="preserve">Script 01-44 e funzione marketing (Verify JWT disattivato).</w:t>
+              <w:t xml:space="preserve">Script 01-45.</w:t>
             </w:r>
           </w:p>
         </w:tc>
@@ -989,7 +989,7 @@
                 <w:sz w:val="18"/>
                 <w:szCs w:val="18"/>
               </w:rPr>
-              <w:t xml:space="preserve">2.7</w:t>
+              <w:t xml:space="preserve">2.8</w:t>
             </w:r>
           </w:p>
         </w:tc>
@@ -1053,7 +1053,7 @@
                 <w:sz w:val="18"/>
                 <w:szCs w:val="18"/>
               </w:rPr>
-              <w:t xml:space="preserve">Script 34 in produzione: l'ordine 01-43 resta quello di ricostruzione.</w:t>
+              <w:t xml:space="preserve">Script 01-44 e funzione marketing (Verify JWT disattivato).</w:t>
             </w:r>
           </w:p>
         </w:tc>
@@ -1123,7 +1123,7 @@
                 <w:sz w:val="18"/>
                 <w:szCs w:val="18"/>
               </w:rPr>
-              <w:t xml:space="preserve">2.6</w:t>
+              <w:t xml:space="preserve">2.7</w:t>
             </w:r>
           </w:p>
         </w:tc>
@@ -1189,7 +1189,7 @@
                 <w:sz w:val="18"/>
                 <w:szCs w:val="18"/>
               </w:rPr>
-              <w:t xml:space="preserve">Script del database 01-43.</w:t>
+              <w:t xml:space="preserve">Script 34 in produzione: l'ordine 01-43 resta quello di ricostruzione.</w:t>
             </w:r>
           </w:p>
         </w:tc>
@@ -1259,7 +1259,7 @@
                 <w:sz w:val="18"/>
                 <w:szCs w:val="18"/>
               </w:rPr>
-              <w:t xml:space="preserve">2.5</w:t>
+              <w:t xml:space="preserve">2.6</w:t>
             </w:r>
           </w:p>
         </w:tc>
@@ -1323,7 +1323,7 @@
                 <w:sz w:val="18"/>
                 <w:szCs w:val="18"/>
               </w:rPr>
-              <w:t xml:space="preserve">Script del database 01-42.</w:t>
+              <w:t xml:space="preserve">Script del database 01-43.</w:t>
             </w:r>
           </w:p>
         </w:tc>
@@ -1393,7 +1393,7 @@
                 <w:sz w:val="18"/>
                 <w:szCs w:val="18"/>
               </w:rPr>
-              <w:t xml:space="preserve">2.4</w:t>
+              <w:t xml:space="preserve">2.5</w:t>
             </w:r>
           </w:p>
         </w:tc>
@@ -1459,7 +1459,7 @@
                 <w:sz w:val="18"/>
                 <w:szCs w:val="18"/>
               </w:rPr>
-              <w:t xml:space="preserve">Script del database 01-41.</w:t>
+              <w:t xml:space="preserve">Script del database 01-42.</w:t>
             </w:r>
           </w:p>
         </w:tc>
@@ -1529,7 +1529,7 @@
                 <w:sz w:val="18"/>
                 <w:szCs w:val="18"/>
               </w:rPr>
-              <w:t xml:space="preserve">2.3</w:t>
+              <w:t xml:space="preserve">2.4</w:t>
             </w:r>
           </w:p>
         </w:tc>
@@ -1561,7 +1561,7 @@
                 <w:sz w:val="18"/>
                 <w:szCs w:val="18"/>
               </w:rPr>
-              <w:t xml:space="preserve">22/10/2026</w:t>
+              <w:t xml:space="preserve">23/10/2026</w:t>
             </w:r>
           </w:p>
         </w:tc>
@@ -1593,7 +1593,7 @@
                 <w:sz w:val="18"/>
                 <w:szCs w:val="18"/>
               </w:rPr>
-              <w:t xml:space="preserve">Script 01-40 (Banca Dati Utenze).</w:t>
+              <w:t xml:space="preserve">Script del database 01-41.</w:t>
             </w:r>
           </w:p>
         </w:tc>
@@ -1663,7 +1663,7 @@
                 <w:sz w:val="18"/>
                 <w:szCs w:val="18"/>
               </w:rPr>
-              <w:t xml:space="preserve">2.2</w:t>
+              <w:t xml:space="preserve">2.3</w:t>
             </w:r>
           </w:p>
         </w:tc>
@@ -1729,7 +1729,7 @@
                 <w:sz w:val="18"/>
                 <w:szCs w:val="18"/>
               </w:rPr>
-              <w:t xml:space="preserve">Stato del backup al 22/10: script 38 in produzione, installazione sul Mac da fare.</w:t>
+              <w:t xml:space="preserve">Script 01-40 (Banca Dati Utenze).</w:t>
             </w:r>
           </w:p>
         </w:tc>
@@ -1799,7 +1799,7 @@
                 <w:sz w:val="18"/>
                 <w:szCs w:val="18"/>
               </w:rPr>
-              <w:t xml:space="preserve">2.1</w:t>
+              <w:t xml:space="preserve">2.2</w:t>
             </w:r>
           </w:p>
         </w:tc>
@@ -1863,7 +1863,7 @@
                 <w:sz w:val="18"/>
                 <w:szCs w:val="18"/>
               </w:rPr>
-              <w:t xml:space="preserve">Script 01-39.</w:t>
+              <w:t xml:space="preserve">Stato del backup al 22/10: script 38 in produzione, installazione sul Mac da fare.</w:t>
             </w:r>
           </w:p>
         </w:tc>
@@ -1933,7 +1933,7 @@
                 <w:sz w:val="18"/>
                 <w:szCs w:val="18"/>
               </w:rPr>
-              <w:t xml:space="preserve">2.0</w:t>
+              <w:t xml:space="preserve">2.1</w:t>
             </w:r>
           </w:p>
         </w:tc>
@@ -1966,7 +1966,7 @@
                 <w:sz w:val="18"/>
                 <w:szCs w:val="18"/>
               </w:rPr>
-              <w:t xml:space="preserve">21/10/2026</w:t>
+              <w:t xml:space="preserve">22/10/2026</w:t>
             </w:r>
           </w:p>
         </w:tc>
@@ -1999,7 +1999,7 @@
                 <w:sz w:val="18"/>
                 <w:szCs w:val="18"/>
               </w:rPr>
-              <w:t xml:space="preserve">Backup giornaliero alle 20:00 dal Mac in Cwp › backup › data (Google blocca Apps Script); backup manuale; script 38.</w:t>
+              <w:t xml:space="preserve">Script 01-39.</w:t>
             </w:r>
           </w:p>
         </w:tc>
@@ -2069,7 +2069,7 @@
                 <w:sz w:val="18"/>
                 <w:szCs w:val="18"/>
               </w:rPr>
-              <w:t xml:space="preserve">1.9</w:t>
+              <w:t xml:space="preserve">2.0</w:t>
             </w:r>
           </w:p>
         </w:tc>
@@ -2133,7 +2133,7 @@
                 <w:sz w:val="18"/>
                 <w:szCs w:val="18"/>
               </w:rPr>
-              <w:t xml:space="preserve">Tramite per Google News delle Notizie CO2. Script 37. Tolto il tramite per Google News. Tolto il tramite per Google News.</w:t>
+              <w:t xml:space="preserve">Backup giornaliero alle 20:00 dal Mac in Cwp › backup › data (Google blocca Apps Script); backup manuale; script 38.</w:t>
             </w:r>
           </w:p>
         </w:tc>
@@ -2203,7 +2203,7 @@
                 <w:sz w:val="18"/>
                 <w:szCs w:val="18"/>
               </w:rPr>
-              <w:t xml:space="preserve">1.8</w:t>
+              <w:t xml:space="preserve">1.9</w:t>
             </w:r>
           </w:p>
         </w:tc>
@@ -2269,7 +2269,7 @@
                 <w:sz w:val="18"/>
                 <w:szCs w:val="18"/>
               </w:rPr>
-              <w:t xml:space="preserve">Script 36 e funzione notizie (Verify JWT disattivato, indirizzo url_notizie, quarto lavoro pianificato).</w:t>
+              <w:t xml:space="preserve">Tramite per Google News delle Notizie CO2. Script 37. Tolto il tramite per Google News. Tolto il tramite per Google News.</w:t>
             </w:r>
           </w:p>
         </w:tc>
@@ -2339,7 +2339,7 @@
                 <w:sz w:val="18"/>
                 <w:szCs w:val="18"/>
               </w:rPr>
-              <w:t xml:space="preserve">1.7</w:t>
+              <w:t xml:space="preserve">1.8</w:t>
             </w:r>
           </w:p>
         </w:tc>
@@ -2403,7 +2403,7 @@
                 <w:sz w:val="18"/>
                 <w:szCs w:val="18"/>
               </w:rPr>
-              <w:t xml:space="preserve">Backup automatico su Google Drive alle 13 e alle 21 (installazione, contenuto) e ripristino da un backup automatico, provato sul banco locale.</w:t>
+              <w:t xml:space="preserve">Script 36 e funzione notizie (Verify JWT disattivato, indirizzo url_notizie, quarto lavoro pianificato).</w:t>
             </w:r>
           </w:p>
         </w:tc>
@@ -2473,7 +2473,7 @@
                 <w:sz w:val="18"/>
                 <w:szCs w:val="18"/>
               </w:rPr>
-              <w:t xml:space="preserve">1.6</w:t>
+              <w:t xml:space="preserve">1.7</w:t>
             </w:r>
           </w:p>
         </w:tc>
@@ -2539,7 +2539,7 @@
                 <w:sz w:val="18"/>
                 <w:szCs w:val="18"/>
               </w:rPr>
-              <w:t xml:space="preserve">Ricostruzione del database con gli script da 01 a 35 (simulatore, Amministratore principale, assistente, utenti online, Audit User, avvisi di sicurezza, controlli del collaudo).</w:t>
+              <w:t xml:space="preserve">Backup automatico su Google Drive alle 13 e alle 21 (installazione, contenuto) e ripristino da un backup automatico, provato sul banco locale.</w:t>
             </w:r>
           </w:p>
         </w:tc>
@@ -2609,7 +2609,7 @@
                 <w:sz w:val="18"/>
                 <w:szCs w:val="18"/>
               </w:rPr>
-              <w:t xml:space="preserve">1.5</w:t>
+              <w:t xml:space="preserve">1.6</w:t>
             </w:r>
           </w:p>
         </w:tc>
@@ -2641,7 +2641,7 @@
                 <w:sz w:val="18"/>
                 <w:szCs w:val="18"/>
               </w:rPr>
-              <w:t xml:space="preserve">20/10/2026</w:t>
+              <w:t xml:space="preserve">21/10/2026</w:t>
             </w:r>
           </w:p>
         </w:tc>
@@ -2673,7 +2673,7 @@
                 <w:sz w:val="18"/>
                 <w:szCs w:val="18"/>
               </w:rPr>
-              <w:t xml:space="preserve">Indirizzo Supabase nella Content-Security-Policy di vercel.json; script 01-34.</w:t>
+              <w:t xml:space="preserve">Ricostruzione del database con gli script da 01 a 35 (simulatore, Amministratore principale, assistente, utenti online, Audit User, avvisi di sicurezza, controlli del collaudo).</w:t>
             </w:r>
           </w:p>
         </w:tc>
@@ -2743,7 +2743,7 @@
                 <w:sz w:val="18"/>
                 <w:szCs w:val="18"/>
               </w:rPr>
-              <w:t xml:space="preserve">1.4</w:t>
+              <w:t xml:space="preserve">1.5</w:t>
             </w:r>
           </w:p>
         </w:tc>
@@ -2809,7 +2809,7 @@
                 <w:sz w:val="18"/>
                 <w:szCs w:val="18"/>
               </w:rPr>
-              <w:t xml:space="preserve">Amministratore principale e verifiche dopo il ripristino (Audit User, assistente).</w:t>
+              <w:t xml:space="preserve">Indirizzo Supabase nella Content-Security-Policy di vercel.json; script 01-34.</w:t>
             </w:r>
           </w:p>
         </w:tc>
@@ -2879,7 +2879,7 @@
                 <w:sz w:val="18"/>
                 <w:szCs w:val="18"/>
               </w:rPr>
-              <w:t xml:space="preserve">1.3</w:t>
+              <w:t xml:space="preserve">1.4</w:t>
             </w:r>
           </w:p>
         </w:tc>
@@ -2943,7 +2943,7 @@
                 <w:sz w:val="18"/>
                 <w:szCs w:val="18"/>
               </w:rPr>
-              <w:t xml:space="preserve">Script 01-33.</w:t>
+              <w:t xml:space="preserve">Amministratore principale e verifiche dopo il ripristino (Audit User, assistente).</w:t>
             </w:r>
           </w:p>
         </w:tc>
@@ -3013,7 +3013,7 @@
                 <w:sz w:val="18"/>
                 <w:szCs w:val="18"/>
               </w:rPr>
-              <w:t xml:space="preserve">1.2</w:t>
+              <w:t xml:space="preserve">1.3</w:t>
             </w:r>
           </w:p>
         </w:tc>
@@ -3079,7 +3079,7 @@
                 <w:sz w:val="18"/>
                 <w:szCs w:val="18"/>
               </w:rPr>
-              <w:t xml:space="preserve">Script 01-32.</w:t>
+              <w:t xml:space="preserve">Script 01-33.</w:t>
             </w:r>
           </w:p>
         </w:tc>
@@ -3149,7 +3149,7 @@
                 <w:sz w:val="18"/>
                 <w:szCs w:val="18"/>
               </w:rPr>
-              <w:t xml:space="preserve">1.1</w:t>
+              <w:t xml:space="preserve">1.2</w:t>
             </w:r>
           </w:p>
         </w:tc>
@@ -3181,7 +3181,7 @@
                 <w:sz w:val="18"/>
                 <w:szCs w:val="18"/>
               </w:rPr>
-              <w:t xml:space="preserve">19/10/2026</w:t>
+              <w:t xml:space="preserve">20/10/2026</w:t>
             </w:r>
           </w:p>
         </w:tc>
@@ -3213,7 +3213,7 @@
                 <w:sz w:val="18"/>
                 <w:szCs w:val="18"/>
               </w:rPr>
-              <w:t xml:space="preserve">Funzione assistente e chiave ANTHROPIC_API_KEY; Claude Console tra i servizi; script 01-31.</w:t>
+              <w:t xml:space="preserve">Script 01-32.</w:t>
             </w:r>
           </w:p>
         </w:tc>
@@ -3283,6 +3283,142 @@
                 <w:sz w:val="18"/>
                 <w:szCs w:val="18"/>
               </w:rPr>
+              <w:t xml:space="preserve">1.1</w:t>
+            </w:r>
+          </w:p>
+        </w:tc>
+        <w:tc>
+          <w:tcPr>
+            <w:tcW w:type="dxa" w:w="1300"/>
+            <w:tcBorders>
+              <w:top w:val="single" w:color="D9D4C5" w:sz="4"/>
+              <w:left w:val="single" w:color="D9D4C5" w:sz="4"/>
+              <w:bottom w:val="single" w:color="D9D4C5" w:sz="4"/>
+              <w:right w:val="single" w:color="D9D4C5" w:sz="4"/>
+            </w:tcBorders>
+            <w:shd w:fill="F6F4EE" w:color="auto" w:val="clear"/>
+            <w:tcMar>
+              <w:top w:type="dxa" w:w="70"/>
+              <w:left w:type="dxa" w:w="110"/>
+              <w:bottom w:type="dxa" w:w="70"/>
+              <w:right w:type="dxa" w:w="110"/>
+            </w:tcMar>
+            <w:vAlign w:val="center"/>
+          </w:tcPr>
+          <w:p>
+            <w:pPr>
+              <w:spacing w:after="0" w:before="0"/>
+            </w:pPr>
+            <w:r>
+              <w:rPr>
+                <w:rFonts w:ascii="Arial" w:cs="Arial" w:eastAsia="Arial" w:hAnsi="Arial"/>
+                <w:color w:val="1B2118"/>
+                <w:sz w:val="18"/>
+                <w:szCs w:val="18"/>
+              </w:rPr>
+              <w:t xml:space="preserve">19/10/2026</w:t>
+            </w:r>
+          </w:p>
+        </w:tc>
+        <w:tc>
+          <w:tcPr>
+            <w:tcW w:type="dxa" w:w="5538"/>
+            <w:tcBorders>
+              <w:top w:val="single" w:color="D9D4C5" w:sz="4"/>
+              <w:left w:val="single" w:color="D9D4C5" w:sz="4"/>
+              <w:bottom w:val="single" w:color="D9D4C5" w:sz="4"/>
+              <w:right w:val="single" w:color="D9D4C5" w:sz="4"/>
+            </w:tcBorders>
+            <w:shd w:fill="F6F4EE" w:color="auto" w:val="clear"/>
+            <w:tcMar>
+              <w:top w:type="dxa" w:w="70"/>
+              <w:left w:type="dxa" w:w="110"/>
+              <w:bottom w:type="dxa" w:w="70"/>
+              <w:right w:type="dxa" w:w="110"/>
+            </w:tcMar>
+            <w:vAlign w:val="center"/>
+          </w:tcPr>
+          <w:p>
+            <w:pPr>
+              <w:spacing w:after="0" w:before="0"/>
+            </w:pPr>
+            <w:r>
+              <w:rPr>
+                <w:rFonts w:ascii="Arial" w:cs="Arial" w:eastAsia="Arial" w:hAnsi="Arial"/>
+                <w:color w:val="1B2118"/>
+                <w:sz w:val="18"/>
+                <w:szCs w:val="18"/>
+              </w:rPr>
+              <w:t xml:space="preserve">Funzione assistente e chiave ANTHROPIC_API_KEY; Claude Console tra i servizi; script 01-31.</w:t>
+            </w:r>
+          </w:p>
+        </w:tc>
+        <w:tc>
+          <w:tcPr>
+            <w:tcW w:type="dxa" w:w="2000"/>
+            <w:tcBorders>
+              <w:top w:val="single" w:color="D9D4C5" w:sz="4"/>
+              <w:left w:val="single" w:color="D9D4C5" w:sz="4"/>
+              <w:bottom w:val="single" w:color="D9D4C5" w:sz="4"/>
+              <w:right w:val="single" w:color="D9D4C5" w:sz="4"/>
+            </w:tcBorders>
+            <w:shd w:fill="F6F4EE" w:color="auto" w:val="clear"/>
+            <w:tcMar>
+              <w:top w:type="dxa" w:w="70"/>
+              <w:left w:type="dxa" w:w="110"/>
+              <w:bottom w:type="dxa" w:w="70"/>
+              <w:right w:type="dxa" w:w="110"/>
+            </w:tcMar>
+            <w:vAlign w:val="center"/>
+          </w:tcPr>
+          <w:p>
+            <w:pPr>
+              <w:spacing w:after="0" w:before="0"/>
+            </w:pPr>
+            <w:r>
+              <w:rPr>
+                <w:rFonts w:ascii="Arial" w:cs="Arial" w:eastAsia="Arial" w:hAnsi="Arial"/>
+                <w:color w:val="1B2118"/>
+                <w:sz w:val="18"/>
+                <w:szCs w:val="18"/>
+              </w:rPr>
+              <w:t xml:space="preserve">Fondazione Operate</w:t>
+            </w:r>
+          </w:p>
+        </w:tc>
+      </w:tr>
+      <w:tr>
+        <w:trPr>
+          <w:cantSplit/>
+        </w:trPr>
+        <w:tc>
+          <w:tcPr>
+            <w:tcW w:type="dxa" w:w="800"/>
+            <w:tcBorders>
+              <w:top w:val="single" w:color="D9D4C5" w:sz="4"/>
+              <w:left w:val="single" w:color="D9D4C5" w:sz="4"/>
+              <w:bottom w:val="single" w:color="D9D4C5" w:sz="4"/>
+              <w:right w:val="single" w:color="D9D4C5" w:sz="4"/>
+            </w:tcBorders>
+            <w:tcMar>
+              <w:top w:type="dxa" w:w="70"/>
+              <w:left w:type="dxa" w:w="110"/>
+              <w:bottom w:type="dxa" w:w="70"/>
+              <w:right w:type="dxa" w:w="110"/>
+            </w:tcMar>
+            <w:vAlign w:val="center"/>
+          </w:tcPr>
+          <w:p>
+            <w:pPr>
+              <w:spacing w:after="0" w:before="0"/>
+            </w:pPr>
+            <w:r>
+              <w:rPr>
+                <w:rFonts w:ascii="Arial" w:cs="Arial" w:eastAsia="Arial" w:hAnsi="Arial"/>
+                <w:color w:val="1B2118"/>
+                <w:sz w:val="18"/>
+                <w:szCs w:val="18"/>
+              </w:rPr>
               <w:t xml:space="preserve">1.0</w:t>
             </w:r>
           </w:p>
@@ -3296,7 +3432,6 @@
               <w:bottom w:val="single" w:color="D9D4C5" w:sz="4"/>
               <w:right w:val="single" w:color="D9D4C5" w:sz="4"/>
             </w:tcBorders>
-            <w:shd w:fill="F6F4EE" w:color="auto" w:val="clear"/>
             <w:tcMar>
               <w:top w:type="dxa" w:w="70"/>
               <w:left w:type="dxa" w:w="110"/>
@@ -3329,7 +3464,6 @@
               <w:bottom w:val="single" w:color="D9D4C5" w:sz="4"/>
               <w:right w:val="single" w:color="D9D4C5" w:sz="4"/>
             </w:tcBorders>
-            <w:shd w:fill="F6F4EE" w:color="auto" w:val="clear"/>
             <w:tcMar>
               <w:top w:type="dxa" w:w="70"/>
               <w:left w:type="dxa" w:w="110"/>
@@ -3362,7 +3496,6 @@
               <w:bottom w:val="single" w:color="D9D4C5" w:sz="4"/>
               <w:right w:val="single" w:color="D9D4C5" w:sz="4"/>
             </w:tcBorders>
-            <w:shd w:fill="F6F4EE" w:color="auto" w:val="clear"/>
             <w:tcMar>
               <w:top w:type="dxa" w:w="70"/>
               <w:left w:type="dxa" w:w="110"/>
@@ -3404,7 +3537,7 @@
           <w:sz w:val="20"/>
           <w:szCs w:val="20"/>
         </w:rPr>
-        <w:t xml:space="preserve">Istruzioni alla revisione 2.9 del 23/10/2026. Si aggiornano quando cambiano servizi, piani, script del database, funzioni o chiavi; una copia è dentro ogni archivio di backup e la versione corrente si scarica dall'area Documentazione del portale (solo Amministratori).</w:t>
+        <w:t xml:space="preserve">Istruzioni alla revisione 3.0 del 25/10/2026. Si aggiornano quando cambiano servizi, piani, script del database, funzioni o chiavi; una copia è dentro ogni archivio di backup e la versione corrente si scarica dall'area Documentazione del portale (solo Amministratori).</w:t>
       </w:r>
     </w:p>
     <w:p>
@@ -4929,7 +5062,7 @@
                 <w:sz w:val="18"/>
                 <w:szCs w:val="18"/>
               </w:rPr>
-              <w:t xml:space="preserve">Tutto il codice, gli script del database (01-45), le funzioni del server, i manuali e la loro storia</w:t>
+              <w:t xml:space="preserve">Tutto il codice, gli script del database (01-46), le funzioni del server, i manuali e la loro storia</w:t>
             </w:r>
           </w:p>
         </w:tc>
@@ -8497,7 +8630,7 @@
         </w:rPr>
         <w:t xml:space="preserve"> (</w:t>
       </w:r>
-      <w:hyperlink w:history="1" r:id="rIdw_tobpltktigjbee3g0c3">
+      <w:hyperlink w:history="1" r:id="rIdtilo3jtlsn2mvb-h_yb1r">
         <w:r>
           <w:rPr>
             <w:rFonts w:ascii="Arial" w:cs="Arial" w:eastAsia="Arial" w:hAnsi="Arial"/>
@@ -9309,7 +9442,7 @@
           <w:sz w:val="21"/>
           <w:szCs w:val="21"/>
         </w:rPr>
-        <w:t xml:space="preserve"> ed esecuzione degli script 01-45, come nel capitolo «Supabase: ricostruzione da zero», passi 1 e 2.</w:t>
+        <w:t xml:space="preserve"> ed esecuzione degli script 01-46, come nel capitolo «Supabase: ricostruzione da zero», passi 1 e 2.</w:t>
       </w:r>
     </w:p>
     <w:p>
@@ -11861,7 +11994,7 @@
           <w:sz w:val="21"/>
           <w:szCs w:val="21"/>
         </w:rPr>
-        <w:t xml:space="preserve">45_rapporto_registrato_marketing_rls.sql</w:t>
+        <w:t xml:space="preserve">46_lettura_siti.sql</w:t>
       </w:r>
       <w:r>
         <w:rPr>
@@ -12244,6 +12377,90 @@
           <w:szCs w:val="14"/>
         </w:rPr>
         <w:t xml:space="preserve"> where chiave = 'url_email_notifiche';</w:t>
+      </w:r>
+    </w:p>
+    <w:p>
+      <w:pPr>
+        <w:pStyle w:val="ListParagraph"/>
+        <w:numPr>
+          <w:ilvl w:val="0"/>
+          <w:numId w:val="2"/>
+        </w:numPr>
+        <w:spacing w:after="70" w:line="290"/>
+      </w:pPr>
+      <w:r>
+        <w:rPr>
+          <w:rFonts w:ascii="Arial" w:cs="Arial" w:eastAsia="Arial" w:hAnsi="Arial"/>
+          <w:b/>
+          <w:bCs/>
+          <w:color w:val="1B2118"/>
+          <w:sz w:val="21"/>
+          <w:szCs w:val="21"/>
+        </w:rPr>
+        <w:t xml:space="preserve">dopo</w:t>
+      </w:r>
+      <w:r>
+        <w:rPr>
+          <w:rFonts w:ascii="Arial" w:cs="Arial" w:eastAsia="Arial" w:hAnsi="Arial"/>
+          <w:color w:val="1B2118"/>
+          <w:sz w:val="21"/>
+          <w:szCs w:val="21"/>
+        </w:rPr>
+        <w:t xml:space="preserve"> </w:t>
+      </w:r>
+      <w:r>
+        <w:rPr>
+          <w:rFonts w:ascii="Consolas" w:cs="Consolas" w:eastAsia="Consolas" w:hAnsi="Consolas"/>
+          <w:color w:val="2F5D3A"/>
+          <w:sz w:val="21"/>
+          <w:szCs w:val="21"/>
+        </w:rPr>
+        <w:t xml:space="preserve">46_lettura_siti.sql</w:t>
+      </w:r>
+      <w:r>
+        <w:rPr>
+          <w:rFonts w:ascii="Arial" w:cs="Arial" w:eastAsia="Arial" w:hAnsi="Arial"/>
+          <w:color w:val="1B2118"/>
+          <w:sz w:val="21"/>
+          <w:szCs w:val="21"/>
+        </w:rPr>
+        <w:t xml:space="preserve">, se il progetto è nuovo, l'indirizzo della funzione </w:t>
+      </w:r>
+      <w:r>
+        <w:rPr>
+          <w:rFonts w:ascii="Consolas" w:cs="Consolas" w:eastAsia="Consolas" w:hAnsi="Consolas"/>
+          <w:color w:val="2F5D3A"/>
+          <w:sz w:val="21"/>
+          <w:szCs w:val="21"/>
+        </w:rPr>
+        <w:t xml:space="preserve">marketing</w:t>
+      </w:r>
+      <w:r>
+        <w:rPr>
+          <w:rFonts w:ascii="Arial" w:cs="Arial" w:eastAsia="Arial" w:hAnsi="Arial"/>
+          <w:color w:val="1B2118"/>
+          <w:sz w:val="21"/>
+          <w:szCs w:val="21"/>
+        </w:rPr>
+        <w:t xml:space="preserve"> (impostazione </w:t>
+      </w:r>
+      <w:r>
+        <w:rPr>
+          <w:rFonts w:ascii="Consolas" w:cs="Consolas" w:eastAsia="Consolas" w:hAnsi="Consolas"/>
+          <w:color w:val="2F5D3A"/>
+          <w:sz w:val="21"/>
+          <w:szCs w:val="21"/>
+        </w:rPr>
+        <w:t xml:space="preserve">url_marketing</w:t>
+      </w:r>
+      <w:r>
+        <w:rPr>
+          <w:rFonts w:ascii="Arial" w:cs="Arial" w:eastAsia="Arial" w:hAnsi="Arial"/>
+          <w:color w:val="1B2118"/>
+          <w:sz w:val="21"/>
+          <w:szCs w:val="21"/>
+        </w:rPr>
+        <w:t xml:space="preserve">), come per le altre funzioni; il codice segreto del lettore si genera da solo;</w:t>
       </w:r>
     </w:p>
     <w:p>
@@ -14285,7 +14502,7 @@
           <w:sz w:val="21"/>
           <w:szCs w:val="21"/>
         </w:rPr>
-        <w:t xml:space="preserve">Verifiche: accesso come Amministratore principale, con il menu completo (fino ad Audit User) e la scheda Accessi di Audit User che registra l'accesso appena fatto; la pagina /programma mostra gli 8 documenti, la PEC e il soggetto promotore; un utente di prova riceve l'email; l'assistente risponde; nella pagina Notizie CO2 «Aggiorna ora» completa una ricerca; i lavori pianificati sono quattro:</w:t>
+        <w:t xml:space="preserve">Verifiche: accesso come Amministratore principale, con il menu completo (fino ad Audit User) e la scheda Accessi di Audit User che registra l'accesso appena fatto; la pagina /programma mostra gli 8 documenti, la PEC e il soggetto promotore; un utente di prova riceve l'email; l'assistente risponde; nella pagina Notizie CO2 «Aggiorna ora» completa una ricerca; i lavori pianificati sono cinque:</w:t>
       </w:r>
     </w:p>
     <w:p>
@@ -14320,7 +14537,7 @@
           <w:sz w:val="14"/>
           <w:szCs w:val="14"/>
         </w:rPr>
-        <w:t xml:space="preserve">-- attesi: cwp_avvisi_crediti, cwp_notifiche_scadenze, cwp_notizie, cwp_riprova_email</w:t>
+        <w:t xml:space="preserve">-- attesi: cwp_avvisi_crediti, cwp_lettura_siti, cwp_notifiche_scadenze, cwp_notizie, cwp_riprova_email</w:t>
       </w:r>
     </w:p>
     <w:p>
@@ -16902,7 +17119,7 @@
         <w:szCs w:val="16"/>
       </w:rPr>
       <w:tab/>
-      <w:t xml:space="preserve">Istruzioni di ripristino · Rev. 2.9 · 23/10/2026</w:t>
+      <w:t xml:space="preserve">Istruzioni di ripristino · Rev. 3.0 · 25/10/2026</w:t>
     </w:r>
   </w:p>
 </w:hdr>
@@ -16967,7 +17184,7 @@
         <w:szCs w:val="16"/>
       </w:rPr>
       <w:tab/>
-      <w:t xml:space="preserve">Istruzioni di ripristino · Rev. 2.9 · 23/10/2026</w:t>
+      <w:t xml:space="preserve">Istruzioni di ripristino · Rev. 3.0 · 25/10/2026</w:t>
     </w:r>
   </w:p>
 </w:hdr>

</xml_diff>

<commit_message>
Documenti: listino obbligatorio (script 47)
Co-Authored-By: Claude Opus 5.5 <noreply@anthropic.com>
Claude-Session: https://claude.ai/code/session_01E8XCbEeVHWVP3hntUZ6kZ1
</commit_message>
<xml_diff>
--- a/public/documentazione/Istruzioni_Ripristino_Portale_CWP.docx
+++ b/public/documentazione/Istruzioni_Ripristino_Portale_CWP.docx
@@ -302,7 +302,7 @@
                 <w:sz w:val="20"/>
                 <w:szCs w:val="20"/>
               </w:rPr>
-              <w:t xml:space="preserve">Rev. 3.0</w:t>
+              <w:t xml:space="preserve">Rev. 3.1</w:t>
             </w:r>
           </w:p>
         </w:tc>
@@ -719,7 +719,7 @@
                 <w:sz w:val="18"/>
                 <w:szCs w:val="18"/>
               </w:rPr>
-              <w:t xml:space="preserve">3.0</w:t>
+              <w:t xml:space="preserve">3.1</w:t>
             </w:r>
           </w:p>
         </w:tc>
@@ -783,7 +783,7 @@
                 <w:sz w:val="18"/>
                 <w:szCs w:val="18"/>
               </w:rPr>
-              <w:t xml:space="preserve">Script 01-46, lavoro pianificato cwp_lettura_siti, impostazione url_marketing.</w:t>
+              <w:t xml:space="preserve">Script 01-47.</w:t>
             </w:r>
           </w:p>
         </w:tc>
@@ -853,7 +853,7 @@
                 <w:sz w:val="18"/>
                 <w:szCs w:val="18"/>
               </w:rPr>
-              <w:t xml:space="preserve">2.9</w:t>
+              <w:t xml:space="preserve">3.0</w:t>
             </w:r>
           </w:p>
         </w:tc>
@@ -886,7 +886,7 @@
                 <w:sz w:val="18"/>
                 <w:szCs w:val="18"/>
               </w:rPr>
-              <w:t xml:space="preserve">23/10/2026</w:t>
+              <w:t xml:space="preserve">25/10/2026</w:t>
             </w:r>
           </w:p>
         </w:tc>
@@ -919,7 +919,7 @@
                 <w:sz w:val="18"/>
                 <w:szCs w:val="18"/>
               </w:rPr>
-              <w:t xml:space="preserve">Script 01-45.</w:t>
+              <w:t xml:space="preserve">Script 01-46, lavoro pianificato cwp_lettura_siti, impostazione url_marketing.</w:t>
             </w:r>
           </w:p>
         </w:tc>
@@ -989,7 +989,7 @@
                 <w:sz w:val="18"/>
                 <w:szCs w:val="18"/>
               </w:rPr>
-              <w:t xml:space="preserve">2.8</w:t>
+              <w:t xml:space="preserve">2.9</w:t>
             </w:r>
           </w:p>
         </w:tc>
@@ -1053,7 +1053,7 @@
                 <w:sz w:val="18"/>
                 <w:szCs w:val="18"/>
               </w:rPr>
-              <w:t xml:space="preserve">Script 01-44 e funzione marketing (Verify JWT disattivato).</w:t>
+              <w:t xml:space="preserve">Script 01-45.</w:t>
             </w:r>
           </w:p>
         </w:tc>
@@ -1123,7 +1123,7 @@
                 <w:sz w:val="18"/>
                 <w:szCs w:val="18"/>
               </w:rPr>
-              <w:t xml:space="preserve">2.7</w:t>
+              <w:t xml:space="preserve">2.8</w:t>
             </w:r>
           </w:p>
         </w:tc>
@@ -1189,7 +1189,7 @@
                 <w:sz w:val="18"/>
                 <w:szCs w:val="18"/>
               </w:rPr>
-              <w:t xml:space="preserve">Script 34 in produzione: l'ordine 01-43 resta quello di ricostruzione.</w:t>
+              <w:t xml:space="preserve">Script 01-44 e funzione marketing (Verify JWT disattivato).</w:t>
             </w:r>
           </w:p>
         </w:tc>
@@ -1259,7 +1259,7 @@
                 <w:sz w:val="18"/>
                 <w:szCs w:val="18"/>
               </w:rPr>
-              <w:t xml:space="preserve">2.6</w:t>
+              <w:t xml:space="preserve">2.7</w:t>
             </w:r>
           </w:p>
         </w:tc>
@@ -1323,7 +1323,7 @@
                 <w:sz w:val="18"/>
                 <w:szCs w:val="18"/>
               </w:rPr>
-              <w:t xml:space="preserve">Script del database 01-43.</w:t>
+              <w:t xml:space="preserve">Script 34 in produzione: l'ordine 01-43 resta quello di ricostruzione.</w:t>
             </w:r>
           </w:p>
         </w:tc>
@@ -1393,7 +1393,7 @@
                 <w:sz w:val="18"/>
                 <w:szCs w:val="18"/>
               </w:rPr>
-              <w:t xml:space="preserve">2.5</w:t>
+              <w:t xml:space="preserve">2.6</w:t>
             </w:r>
           </w:p>
         </w:tc>
@@ -1459,7 +1459,7 @@
                 <w:sz w:val="18"/>
                 <w:szCs w:val="18"/>
               </w:rPr>
-              <w:t xml:space="preserve">Script del database 01-42.</w:t>
+              <w:t xml:space="preserve">Script del database 01-43.</w:t>
             </w:r>
           </w:p>
         </w:tc>
@@ -1529,7 +1529,7 @@
                 <w:sz w:val="18"/>
                 <w:szCs w:val="18"/>
               </w:rPr>
-              <w:t xml:space="preserve">2.4</w:t>
+              <w:t xml:space="preserve">2.5</w:t>
             </w:r>
           </w:p>
         </w:tc>
@@ -1593,7 +1593,7 @@
                 <w:sz w:val="18"/>
                 <w:szCs w:val="18"/>
               </w:rPr>
-              <w:t xml:space="preserve">Script del database 01-41.</w:t>
+              <w:t xml:space="preserve">Script del database 01-42.</w:t>
             </w:r>
           </w:p>
         </w:tc>
@@ -1663,7 +1663,7 @@
                 <w:sz w:val="18"/>
                 <w:szCs w:val="18"/>
               </w:rPr>
-              <w:t xml:space="preserve">2.3</w:t>
+              <w:t xml:space="preserve">2.4</w:t>
             </w:r>
           </w:p>
         </w:tc>
@@ -1696,7 +1696,7 @@
                 <w:sz w:val="18"/>
                 <w:szCs w:val="18"/>
               </w:rPr>
-              <w:t xml:space="preserve">22/10/2026</w:t>
+              <w:t xml:space="preserve">23/10/2026</w:t>
             </w:r>
           </w:p>
         </w:tc>
@@ -1729,7 +1729,7 @@
                 <w:sz w:val="18"/>
                 <w:szCs w:val="18"/>
               </w:rPr>
-              <w:t xml:space="preserve">Script 01-40 (Banca Dati Utenze).</w:t>
+              <w:t xml:space="preserve">Script del database 01-41.</w:t>
             </w:r>
           </w:p>
         </w:tc>
@@ -1799,7 +1799,7 @@
                 <w:sz w:val="18"/>
                 <w:szCs w:val="18"/>
               </w:rPr>
-              <w:t xml:space="preserve">2.2</w:t>
+              <w:t xml:space="preserve">2.3</w:t>
             </w:r>
           </w:p>
         </w:tc>
@@ -1863,7 +1863,7 @@
                 <w:sz w:val="18"/>
                 <w:szCs w:val="18"/>
               </w:rPr>
-              <w:t xml:space="preserve">Stato del backup al 22/10: script 38 in produzione, installazione sul Mac da fare.</w:t>
+              <w:t xml:space="preserve">Script 01-40 (Banca Dati Utenze).</w:t>
             </w:r>
           </w:p>
         </w:tc>
@@ -1933,7 +1933,7 @@
                 <w:sz w:val="18"/>
                 <w:szCs w:val="18"/>
               </w:rPr>
-              <w:t xml:space="preserve">2.1</w:t>
+              <w:t xml:space="preserve">2.2</w:t>
             </w:r>
           </w:p>
         </w:tc>
@@ -1999,7 +1999,7 @@
                 <w:sz w:val="18"/>
                 <w:szCs w:val="18"/>
               </w:rPr>
-              <w:t xml:space="preserve">Script 01-39.</w:t>
+              <w:t xml:space="preserve">Stato del backup al 22/10: script 38 in produzione, installazione sul Mac da fare.</w:t>
             </w:r>
           </w:p>
         </w:tc>
@@ -2069,7 +2069,7 @@
                 <w:sz w:val="18"/>
                 <w:szCs w:val="18"/>
               </w:rPr>
-              <w:t xml:space="preserve">2.0</w:t>
+              <w:t xml:space="preserve">2.1</w:t>
             </w:r>
           </w:p>
         </w:tc>
@@ -2101,7 +2101,7 @@
                 <w:sz w:val="18"/>
                 <w:szCs w:val="18"/>
               </w:rPr>
-              <w:t xml:space="preserve">21/10/2026</w:t>
+              <w:t xml:space="preserve">22/10/2026</w:t>
             </w:r>
           </w:p>
         </w:tc>
@@ -2133,7 +2133,7 @@
                 <w:sz w:val="18"/>
                 <w:szCs w:val="18"/>
               </w:rPr>
-              <w:t xml:space="preserve">Backup giornaliero alle 20:00 dal Mac in Cwp › backup › data (Google blocca Apps Script); backup manuale; script 38.</w:t>
+              <w:t xml:space="preserve">Script 01-39.</w:t>
             </w:r>
           </w:p>
         </w:tc>
@@ -2203,7 +2203,7 @@
                 <w:sz w:val="18"/>
                 <w:szCs w:val="18"/>
               </w:rPr>
-              <w:t xml:space="preserve">1.9</w:t>
+              <w:t xml:space="preserve">2.0</w:t>
             </w:r>
           </w:p>
         </w:tc>
@@ -2269,7 +2269,7 @@
                 <w:sz w:val="18"/>
                 <w:szCs w:val="18"/>
               </w:rPr>
-              <w:t xml:space="preserve">Tramite per Google News delle Notizie CO2. Script 37. Tolto il tramite per Google News. Tolto il tramite per Google News.</w:t>
+              <w:t xml:space="preserve">Backup giornaliero alle 20:00 dal Mac in Cwp › backup › data (Google blocca Apps Script); backup manuale; script 38.</w:t>
             </w:r>
           </w:p>
         </w:tc>
@@ -2339,7 +2339,7 @@
                 <w:sz w:val="18"/>
                 <w:szCs w:val="18"/>
               </w:rPr>
-              <w:t xml:space="preserve">1.8</w:t>
+              <w:t xml:space="preserve">1.9</w:t>
             </w:r>
           </w:p>
         </w:tc>
@@ -2403,7 +2403,7 @@
                 <w:sz w:val="18"/>
                 <w:szCs w:val="18"/>
               </w:rPr>
-              <w:t xml:space="preserve">Script 36 e funzione notizie (Verify JWT disattivato, indirizzo url_notizie, quarto lavoro pianificato).</w:t>
+              <w:t xml:space="preserve">Tramite per Google News delle Notizie CO2. Script 37. Tolto il tramite per Google News. Tolto il tramite per Google News.</w:t>
             </w:r>
           </w:p>
         </w:tc>
@@ -2473,7 +2473,7 @@
                 <w:sz w:val="18"/>
                 <w:szCs w:val="18"/>
               </w:rPr>
-              <w:t xml:space="preserve">1.7</w:t>
+              <w:t xml:space="preserve">1.8</w:t>
             </w:r>
           </w:p>
         </w:tc>
@@ -2539,7 +2539,7 @@
                 <w:sz w:val="18"/>
                 <w:szCs w:val="18"/>
               </w:rPr>
-              <w:t xml:space="preserve">Backup automatico su Google Drive alle 13 e alle 21 (installazione, contenuto) e ripristino da un backup automatico, provato sul banco locale.</w:t>
+              <w:t xml:space="preserve">Script 36 e funzione notizie (Verify JWT disattivato, indirizzo url_notizie, quarto lavoro pianificato).</w:t>
             </w:r>
           </w:p>
         </w:tc>
@@ -2609,7 +2609,7 @@
                 <w:sz w:val="18"/>
                 <w:szCs w:val="18"/>
               </w:rPr>
-              <w:t xml:space="preserve">1.6</w:t>
+              <w:t xml:space="preserve">1.7</w:t>
             </w:r>
           </w:p>
         </w:tc>
@@ -2673,7 +2673,7 @@
                 <w:sz w:val="18"/>
                 <w:szCs w:val="18"/>
               </w:rPr>
-              <w:t xml:space="preserve">Ricostruzione del database con gli script da 01 a 35 (simulatore, Amministratore principale, assistente, utenti online, Audit User, avvisi di sicurezza, controlli del collaudo).</w:t>
+              <w:t xml:space="preserve">Backup automatico su Google Drive alle 13 e alle 21 (installazione, contenuto) e ripristino da un backup automatico, provato sul banco locale.</w:t>
             </w:r>
           </w:p>
         </w:tc>
@@ -2743,7 +2743,7 @@
                 <w:sz w:val="18"/>
                 <w:szCs w:val="18"/>
               </w:rPr>
-              <w:t xml:space="preserve">1.5</w:t>
+              <w:t xml:space="preserve">1.6</w:t>
             </w:r>
           </w:p>
         </w:tc>
@@ -2776,7 +2776,7 @@
                 <w:sz w:val="18"/>
                 <w:szCs w:val="18"/>
               </w:rPr>
-              <w:t xml:space="preserve">20/10/2026</w:t>
+              <w:t xml:space="preserve">21/10/2026</w:t>
             </w:r>
           </w:p>
         </w:tc>
@@ -2809,7 +2809,7 @@
                 <w:sz w:val="18"/>
                 <w:szCs w:val="18"/>
               </w:rPr>
-              <w:t xml:space="preserve">Indirizzo Supabase nella Content-Security-Policy di vercel.json; script 01-34.</w:t>
+              <w:t xml:space="preserve">Ricostruzione del database con gli script da 01 a 35 (simulatore, Amministratore principale, assistente, utenti online, Audit User, avvisi di sicurezza, controlli del collaudo).</w:t>
             </w:r>
           </w:p>
         </w:tc>
@@ -2879,7 +2879,7 @@
                 <w:sz w:val="18"/>
                 <w:szCs w:val="18"/>
               </w:rPr>
-              <w:t xml:space="preserve">1.4</w:t>
+              <w:t xml:space="preserve">1.5</w:t>
             </w:r>
           </w:p>
         </w:tc>
@@ -2943,7 +2943,7 @@
                 <w:sz w:val="18"/>
                 <w:szCs w:val="18"/>
               </w:rPr>
-              <w:t xml:space="preserve">Amministratore principale e verifiche dopo il ripristino (Audit User, assistente).</w:t>
+              <w:t xml:space="preserve">Indirizzo Supabase nella Content-Security-Policy di vercel.json; script 01-34.</w:t>
             </w:r>
           </w:p>
         </w:tc>
@@ -3013,7 +3013,7 @@
                 <w:sz w:val="18"/>
                 <w:szCs w:val="18"/>
               </w:rPr>
-              <w:t xml:space="preserve">1.3</w:t>
+              <w:t xml:space="preserve">1.4</w:t>
             </w:r>
           </w:p>
         </w:tc>
@@ -3079,7 +3079,7 @@
                 <w:sz w:val="18"/>
                 <w:szCs w:val="18"/>
               </w:rPr>
-              <w:t xml:space="preserve">Script 01-33.</w:t>
+              <w:t xml:space="preserve">Amministratore principale e verifiche dopo il ripristino (Audit User, assistente).</w:t>
             </w:r>
           </w:p>
         </w:tc>
@@ -3149,7 +3149,7 @@
                 <w:sz w:val="18"/>
                 <w:szCs w:val="18"/>
               </w:rPr>
-              <w:t xml:space="preserve">1.2</w:t>
+              <w:t xml:space="preserve">1.3</w:t>
             </w:r>
           </w:p>
         </w:tc>
@@ -3213,7 +3213,7 @@
                 <w:sz w:val="18"/>
                 <w:szCs w:val="18"/>
               </w:rPr>
-              <w:t xml:space="preserve">Script 01-32.</w:t>
+              <w:t xml:space="preserve">Script 01-33.</w:t>
             </w:r>
           </w:p>
         </w:tc>
@@ -3283,7 +3283,7 @@
                 <w:sz w:val="18"/>
                 <w:szCs w:val="18"/>
               </w:rPr>
-              <w:t xml:space="preserve">1.1</w:t>
+              <w:t xml:space="preserve">1.2</w:t>
             </w:r>
           </w:p>
         </w:tc>
@@ -3316,7 +3316,7 @@
                 <w:sz w:val="18"/>
                 <w:szCs w:val="18"/>
               </w:rPr>
-              <w:t xml:space="preserve">19/10/2026</w:t>
+              <w:t xml:space="preserve">20/10/2026</w:t>
             </w:r>
           </w:p>
         </w:tc>
@@ -3349,7 +3349,7 @@
                 <w:sz w:val="18"/>
                 <w:szCs w:val="18"/>
               </w:rPr>
-              <w:t xml:space="preserve">Funzione assistente e chiave ANTHROPIC_API_KEY; Claude Console tra i servizi; script 01-31.</w:t>
+              <w:t xml:space="preserve">Script 01-32.</w:t>
             </w:r>
           </w:p>
         </w:tc>
@@ -3419,6 +3419,140 @@
                 <w:sz w:val="18"/>
                 <w:szCs w:val="18"/>
               </w:rPr>
+              <w:t xml:space="preserve">1.1</w:t>
+            </w:r>
+          </w:p>
+        </w:tc>
+        <w:tc>
+          <w:tcPr>
+            <w:tcW w:type="dxa" w:w="1300"/>
+            <w:tcBorders>
+              <w:top w:val="single" w:color="D9D4C5" w:sz="4"/>
+              <w:left w:val="single" w:color="D9D4C5" w:sz="4"/>
+              <w:bottom w:val="single" w:color="D9D4C5" w:sz="4"/>
+              <w:right w:val="single" w:color="D9D4C5" w:sz="4"/>
+            </w:tcBorders>
+            <w:tcMar>
+              <w:top w:type="dxa" w:w="70"/>
+              <w:left w:type="dxa" w:w="110"/>
+              <w:bottom w:type="dxa" w:w="70"/>
+              <w:right w:type="dxa" w:w="110"/>
+            </w:tcMar>
+            <w:vAlign w:val="center"/>
+          </w:tcPr>
+          <w:p>
+            <w:pPr>
+              <w:spacing w:after="0" w:before="0"/>
+            </w:pPr>
+            <w:r>
+              <w:rPr>
+                <w:rFonts w:ascii="Arial" w:cs="Arial" w:eastAsia="Arial" w:hAnsi="Arial"/>
+                <w:color w:val="1B2118"/>
+                <w:sz w:val="18"/>
+                <w:szCs w:val="18"/>
+              </w:rPr>
+              <w:t xml:space="preserve">19/10/2026</w:t>
+            </w:r>
+          </w:p>
+        </w:tc>
+        <w:tc>
+          <w:tcPr>
+            <w:tcW w:type="dxa" w:w="5538"/>
+            <w:tcBorders>
+              <w:top w:val="single" w:color="D9D4C5" w:sz="4"/>
+              <w:left w:val="single" w:color="D9D4C5" w:sz="4"/>
+              <w:bottom w:val="single" w:color="D9D4C5" w:sz="4"/>
+              <w:right w:val="single" w:color="D9D4C5" w:sz="4"/>
+            </w:tcBorders>
+            <w:tcMar>
+              <w:top w:type="dxa" w:w="70"/>
+              <w:left w:type="dxa" w:w="110"/>
+              <w:bottom w:type="dxa" w:w="70"/>
+              <w:right w:type="dxa" w:w="110"/>
+            </w:tcMar>
+            <w:vAlign w:val="center"/>
+          </w:tcPr>
+          <w:p>
+            <w:pPr>
+              <w:spacing w:after="0" w:before="0"/>
+            </w:pPr>
+            <w:r>
+              <w:rPr>
+                <w:rFonts w:ascii="Arial" w:cs="Arial" w:eastAsia="Arial" w:hAnsi="Arial"/>
+                <w:color w:val="1B2118"/>
+                <w:sz w:val="18"/>
+                <w:szCs w:val="18"/>
+              </w:rPr>
+              <w:t xml:space="preserve">Funzione assistente e chiave ANTHROPIC_API_KEY; Claude Console tra i servizi; script 01-31.</w:t>
+            </w:r>
+          </w:p>
+        </w:tc>
+        <w:tc>
+          <w:tcPr>
+            <w:tcW w:type="dxa" w:w="2000"/>
+            <w:tcBorders>
+              <w:top w:val="single" w:color="D9D4C5" w:sz="4"/>
+              <w:left w:val="single" w:color="D9D4C5" w:sz="4"/>
+              <w:bottom w:val="single" w:color="D9D4C5" w:sz="4"/>
+              <w:right w:val="single" w:color="D9D4C5" w:sz="4"/>
+            </w:tcBorders>
+            <w:tcMar>
+              <w:top w:type="dxa" w:w="70"/>
+              <w:left w:type="dxa" w:w="110"/>
+              <w:bottom w:type="dxa" w:w="70"/>
+              <w:right w:type="dxa" w:w="110"/>
+            </w:tcMar>
+            <w:vAlign w:val="center"/>
+          </w:tcPr>
+          <w:p>
+            <w:pPr>
+              <w:spacing w:after="0" w:before="0"/>
+            </w:pPr>
+            <w:r>
+              <w:rPr>
+                <w:rFonts w:ascii="Arial" w:cs="Arial" w:eastAsia="Arial" w:hAnsi="Arial"/>
+                <w:color w:val="1B2118"/>
+                <w:sz w:val="18"/>
+                <w:szCs w:val="18"/>
+              </w:rPr>
+              <w:t xml:space="preserve">Fondazione Operate</w:t>
+            </w:r>
+          </w:p>
+        </w:tc>
+      </w:tr>
+      <w:tr>
+        <w:trPr>
+          <w:cantSplit/>
+        </w:trPr>
+        <w:tc>
+          <w:tcPr>
+            <w:tcW w:type="dxa" w:w="800"/>
+            <w:tcBorders>
+              <w:top w:val="single" w:color="D9D4C5" w:sz="4"/>
+              <w:left w:val="single" w:color="D9D4C5" w:sz="4"/>
+              <w:bottom w:val="single" w:color="D9D4C5" w:sz="4"/>
+              <w:right w:val="single" w:color="D9D4C5" w:sz="4"/>
+            </w:tcBorders>
+            <w:shd w:fill="F6F4EE" w:color="auto" w:val="clear"/>
+            <w:tcMar>
+              <w:top w:type="dxa" w:w="70"/>
+              <w:left w:type="dxa" w:w="110"/>
+              <w:bottom w:type="dxa" w:w="70"/>
+              <w:right w:type="dxa" w:w="110"/>
+            </w:tcMar>
+            <w:vAlign w:val="center"/>
+          </w:tcPr>
+          <w:p>
+            <w:pPr>
+              <w:spacing w:after="0" w:before="0"/>
+            </w:pPr>
+            <w:r>
+              <w:rPr>
+                <w:rFonts w:ascii="Arial" w:cs="Arial" w:eastAsia="Arial" w:hAnsi="Arial"/>
+                <w:color w:val="1B2118"/>
+                <w:sz w:val="18"/>
+                <w:szCs w:val="18"/>
+              </w:rPr>
               <w:t xml:space="preserve">1.0</w:t>
             </w:r>
           </w:p>
@@ -3432,6 +3566,7 @@
               <w:bottom w:val="single" w:color="D9D4C5" w:sz="4"/>
               <w:right w:val="single" w:color="D9D4C5" w:sz="4"/>
             </w:tcBorders>
+            <w:shd w:fill="F6F4EE" w:color="auto" w:val="clear"/>
             <w:tcMar>
               <w:top w:type="dxa" w:w="70"/>
               <w:left w:type="dxa" w:w="110"/>
@@ -3464,6 +3599,7 @@
               <w:bottom w:val="single" w:color="D9D4C5" w:sz="4"/>
               <w:right w:val="single" w:color="D9D4C5" w:sz="4"/>
             </w:tcBorders>
+            <w:shd w:fill="F6F4EE" w:color="auto" w:val="clear"/>
             <w:tcMar>
               <w:top w:type="dxa" w:w="70"/>
               <w:left w:type="dxa" w:w="110"/>
@@ -3496,6 +3632,7 @@
               <w:bottom w:val="single" w:color="D9D4C5" w:sz="4"/>
               <w:right w:val="single" w:color="D9D4C5" w:sz="4"/>
             </w:tcBorders>
+            <w:shd w:fill="F6F4EE" w:color="auto" w:val="clear"/>
             <w:tcMar>
               <w:top w:type="dxa" w:w="70"/>
               <w:left w:type="dxa" w:w="110"/>
@@ -3537,7 +3674,7 @@
           <w:sz w:val="20"/>
           <w:szCs w:val="20"/>
         </w:rPr>
-        <w:t xml:space="preserve">Istruzioni alla revisione 3.0 del 25/10/2026. Si aggiornano quando cambiano servizi, piani, script del database, funzioni o chiavi; una copia è dentro ogni archivio di backup e la versione corrente si scarica dall'area Documentazione del portale (solo Amministratori).</w:t>
+        <w:t xml:space="preserve">Istruzioni alla revisione 3.1 del 25/10/2026. Si aggiornano quando cambiano servizi, piani, script del database, funzioni o chiavi; una copia è dentro ogni archivio di backup e la versione corrente si scarica dall'area Documentazione del portale (solo Amministratori).</w:t>
       </w:r>
     </w:p>
     <w:p>
@@ -5062,7 +5199,7 @@
                 <w:sz w:val="18"/>
                 <w:szCs w:val="18"/>
               </w:rPr>
-              <w:t xml:space="preserve">Tutto il codice, gli script del database (01-46), le funzioni del server, i manuali e la loro storia</w:t>
+              <w:t xml:space="preserve">Tutto il codice, gli script del database (01-47), le funzioni del server, i manuali e la loro storia</w:t>
             </w:r>
           </w:p>
         </w:tc>
@@ -8630,7 +8767,7 @@
         </w:rPr>
         <w:t xml:space="preserve"> (</w:t>
       </w:r>
-      <w:hyperlink w:history="1" r:id="rIdtilo3jtlsn2mvb-h_yb1r">
+      <w:hyperlink w:history="1" r:id="rIdwsuof4rcpjxeuxzfurfks">
         <w:r>
           <w:rPr>
             <w:rFonts w:ascii="Arial" w:cs="Arial" w:eastAsia="Arial" w:hAnsi="Arial"/>
@@ -9442,7 +9579,7 @@
           <w:sz w:val="21"/>
           <w:szCs w:val="21"/>
         </w:rPr>
-        <w:t xml:space="preserve"> ed esecuzione degli script 01-46, come nel capitolo «Supabase: ricostruzione da zero», passi 1 e 2.</w:t>
+        <w:t xml:space="preserve"> ed esecuzione degli script 01-47, come nel capitolo «Supabase: ricostruzione da zero», passi 1 e 2.</w:t>
       </w:r>
     </w:p>
     <w:p>
@@ -11994,7 +12131,7 @@
           <w:sz w:val="21"/>
           <w:szCs w:val="21"/>
         </w:rPr>
-        <w:t xml:space="preserve">46_lettura_siti.sql</w:t>
+        <w:t xml:space="preserve">47_listino_obbligatorio.sql</w:t>
       </w:r>
       <w:r>
         <w:rPr>
@@ -17119,7 +17256,7 @@
         <w:szCs w:val="16"/>
       </w:rPr>
       <w:tab/>
-      <w:t xml:space="preserve">Istruzioni di ripristino · Rev. 3.0 · 25/10/2026</w:t>
+      <w:t xml:space="preserve">Istruzioni di ripristino · Rev. 3.1 · 25/10/2026</w:t>
     </w:r>
   </w:p>
 </w:hdr>
@@ -17184,7 +17321,7 @@
         <w:szCs w:val="16"/>
       </w:rPr>
       <w:tab/>
-      <w:t xml:space="preserve">Istruzioni di ripristino · Rev. 3.0 · 25/10/2026</w:t>
+      <w:t xml:space="preserve">Istruzioni di ripristino · Rev. 3.1 · 25/10/2026</w:t>
     </w:r>
   </w:p>
 </w:hdr>

</xml_diff>

<commit_message>
Revisione generale dei documenti al 26/10 (lettura dei siti, listino, scenari, nuova slide)
Co-Authored-By: Claude Opus 5.5 <noreply@anthropic.com>
Claude-Session: https://claude.ai/code/session_01E8XCbEeVHWVP3hntUZ6kZ1
</commit_message>
<xml_diff>
--- a/public/documentazione/Istruzioni_Ripristino_Portale_CWP.docx
+++ b/public/documentazione/Istruzioni_Ripristino_Portale_CWP.docx
@@ -302,7 +302,7 @@
                 <w:sz w:val="20"/>
                 <w:szCs w:val="20"/>
               </w:rPr>
-              <w:t xml:space="preserve">Rev. 3.1</w:t>
+              <w:t xml:space="preserve">Rev. 3.2</w:t>
             </w:r>
           </w:p>
         </w:tc>
@@ -365,7 +365,7 @@
                 <w:sz w:val="20"/>
                 <w:szCs w:val="20"/>
               </w:rPr>
-              <w:t xml:space="preserve">25/10/2026</w:t>
+              <w:t xml:space="preserve">26/10/2026</w:t>
             </w:r>
           </w:p>
         </w:tc>
@@ -719,7 +719,7 @@
                 <w:sz w:val="18"/>
                 <w:szCs w:val="18"/>
               </w:rPr>
-              <w:t xml:space="preserve">3.1</w:t>
+              <w:t xml:space="preserve">3.2</w:t>
             </w:r>
           </w:p>
         </w:tc>
@@ -751,7 +751,7 @@
                 <w:sz w:val="18"/>
                 <w:szCs w:val="18"/>
               </w:rPr>
-              <w:t xml:space="preserve">25/10/2026</w:t>
+              <w:t xml:space="preserve">26/10/2026</w:t>
             </w:r>
           </w:p>
         </w:tc>
@@ -783,7 +783,7 @@
                 <w:sz w:val="18"/>
                 <w:szCs w:val="18"/>
               </w:rPr>
-              <w:t xml:space="preserve">Script 01-47.</w:t>
+              <w:t xml:space="preserve">Revisione del 26/10.</w:t>
             </w:r>
           </w:p>
         </w:tc>
@@ -853,7 +853,7 @@
                 <w:sz w:val="18"/>
                 <w:szCs w:val="18"/>
               </w:rPr>
-              <w:t xml:space="preserve">3.0</w:t>
+              <w:t xml:space="preserve">3.1</w:t>
             </w:r>
           </w:p>
         </w:tc>
@@ -919,7 +919,7 @@
                 <w:sz w:val="18"/>
                 <w:szCs w:val="18"/>
               </w:rPr>
-              <w:t xml:space="preserve">Script 01-46, lavoro pianificato cwp_lettura_siti, impostazione url_marketing.</w:t>
+              <w:t xml:space="preserve">Script 01-47.</w:t>
             </w:r>
           </w:p>
         </w:tc>
@@ -989,7 +989,7 @@
                 <w:sz w:val="18"/>
                 <w:szCs w:val="18"/>
               </w:rPr>
-              <w:t xml:space="preserve">2.9</w:t>
+              <w:t xml:space="preserve">3.0</w:t>
             </w:r>
           </w:p>
         </w:tc>
@@ -1021,7 +1021,7 @@
                 <w:sz w:val="18"/>
                 <w:szCs w:val="18"/>
               </w:rPr>
-              <w:t xml:space="preserve">23/10/2026</w:t>
+              <w:t xml:space="preserve">25/10/2026</w:t>
             </w:r>
           </w:p>
         </w:tc>
@@ -1053,7 +1053,7 @@
                 <w:sz w:val="18"/>
                 <w:szCs w:val="18"/>
               </w:rPr>
-              <w:t xml:space="preserve">Script 01-45.</w:t>
+              <w:t xml:space="preserve">Script 01-46, lavoro pianificato cwp_lettura_siti, impostazione url_marketing.</w:t>
             </w:r>
           </w:p>
         </w:tc>
@@ -1123,7 +1123,7 @@
                 <w:sz w:val="18"/>
                 <w:szCs w:val="18"/>
               </w:rPr>
-              <w:t xml:space="preserve">2.8</w:t>
+              <w:t xml:space="preserve">2.9</w:t>
             </w:r>
           </w:p>
         </w:tc>
@@ -1189,7 +1189,7 @@
                 <w:sz w:val="18"/>
                 <w:szCs w:val="18"/>
               </w:rPr>
-              <w:t xml:space="preserve">Script 01-44 e funzione marketing (Verify JWT disattivato).</w:t>
+              <w:t xml:space="preserve">Script 01-45.</w:t>
             </w:r>
           </w:p>
         </w:tc>
@@ -1259,7 +1259,7 @@
                 <w:sz w:val="18"/>
                 <w:szCs w:val="18"/>
               </w:rPr>
-              <w:t xml:space="preserve">2.7</w:t>
+              <w:t xml:space="preserve">2.8</w:t>
             </w:r>
           </w:p>
         </w:tc>
@@ -1323,7 +1323,7 @@
                 <w:sz w:val="18"/>
                 <w:szCs w:val="18"/>
               </w:rPr>
-              <w:t xml:space="preserve">Script 34 in produzione: l'ordine 01-43 resta quello di ricostruzione.</w:t>
+              <w:t xml:space="preserve">Script 01-44 e funzione marketing (Verify JWT disattivato).</w:t>
             </w:r>
           </w:p>
         </w:tc>
@@ -1393,7 +1393,7 @@
                 <w:sz w:val="18"/>
                 <w:szCs w:val="18"/>
               </w:rPr>
-              <w:t xml:space="preserve">2.6</w:t>
+              <w:t xml:space="preserve">2.7</w:t>
             </w:r>
           </w:p>
         </w:tc>
@@ -1459,7 +1459,7 @@
                 <w:sz w:val="18"/>
                 <w:szCs w:val="18"/>
               </w:rPr>
-              <w:t xml:space="preserve">Script del database 01-43.</w:t>
+              <w:t xml:space="preserve">Script 34 in produzione: l'ordine 01-43 resta quello di ricostruzione.</w:t>
             </w:r>
           </w:p>
         </w:tc>
@@ -1529,7 +1529,7 @@
                 <w:sz w:val="18"/>
                 <w:szCs w:val="18"/>
               </w:rPr>
-              <w:t xml:space="preserve">2.5</w:t>
+              <w:t xml:space="preserve">2.6</w:t>
             </w:r>
           </w:p>
         </w:tc>
@@ -1593,7 +1593,7 @@
                 <w:sz w:val="18"/>
                 <w:szCs w:val="18"/>
               </w:rPr>
-              <w:t xml:space="preserve">Script del database 01-42.</w:t>
+              <w:t xml:space="preserve">Script del database 01-43.</w:t>
             </w:r>
           </w:p>
         </w:tc>
@@ -1663,7 +1663,7 @@
                 <w:sz w:val="18"/>
                 <w:szCs w:val="18"/>
               </w:rPr>
-              <w:t xml:space="preserve">2.4</w:t>
+              <w:t xml:space="preserve">2.5</w:t>
             </w:r>
           </w:p>
         </w:tc>
@@ -1729,7 +1729,7 @@
                 <w:sz w:val="18"/>
                 <w:szCs w:val="18"/>
               </w:rPr>
-              <w:t xml:space="preserve">Script del database 01-41.</w:t>
+              <w:t xml:space="preserve">Script del database 01-42.</w:t>
             </w:r>
           </w:p>
         </w:tc>
@@ -1799,7 +1799,7 @@
                 <w:sz w:val="18"/>
                 <w:szCs w:val="18"/>
               </w:rPr>
-              <w:t xml:space="preserve">2.3</w:t>
+              <w:t xml:space="preserve">2.4</w:t>
             </w:r>
           </w:p>
         </w:tc>
@@ -1831,7 +1831,7 @@
                 <w:sz w:val="18"/>
                 <w:szCs w:val="18"/>
               </w:rPr>
-              <w:t xml:space="preserve">22/10/2026</w:t>
+              <w:t xml:space="preserve">23/10/2026</w:t>
             </w:r>
           </w:p>
         </w:tc>
@@ -1863,7 +1863,7 @@
                 <w:sz w:val="18"/>
                 <w:szCs w:val="18"/>
               </w:rPr>
-              <w:t xml:space="preserve">Script 01-40 (Banca Dati Utenze).</w:t>
+              <w:t xml:space="preserve">Script del database 01-41.</w:t>
             </w:r>
           </w:p>
         </w:tc>
@@ -1933,7 +1933,7 @@
                 <w:sz w:val="18"/>
                 <w:szCs w:val="18"/>
               </w:rPr>
-              <w:t xml:space="preserve">2.2</w:t>
+              <w:t xml:space="preserve">2.3</w:t>
             </w:r>
           </w:p>
         </w:tc>
@@ -1999,7 +1999,7 @@
                 <w:sz w:val="18"/>
                 <w:szCs w:val="18"/>
               </w:rPr>
-              <w:t xml:space="preserve">Stato del backup al 22/10: script 38 in produzione, installazione sul Mac da fare.</w:t>
+              <w:t xml:space="preserve">Script 01-40 (Banca Dati Utenze).</w:t>
             </w:r>
           </w:p>
         </w:tc>
@@ -2069,7 +2069,7 @@
                 <w:sz w:val="18"/>
                 <w:szCs w:val="18"/>
               </w:rPr>
-              <w:t xml:space="preserve">2.1</w:t>
+              <w:t xml:space="preserve">2.2</w:t>
             </w:r>
           </w:p>
         </w:tc>
@@ -2133,7 +2133,7 @@
                 <w:sz w:val="18"/>
                 <w:szCs w:val="18"/>
               </w:rPr>
-              <w:t xml:space="preserve">Script 01-39.</w:t>
+              <w:t xml:space="preserve">Stato del backup al 22/10: script 38 in produzione, installazione sul Mac da fare.</w:t>
             </w:r>
           </w:p>
         </w:tc>
@@ -2203,7 +2203,7 @@
                 <w:sz w:val="18"/>
                 <w:szCs w:val="18"/>
               </w:rPr>
-              <w:t xml:space="preserve">2.0</w:t>
+              <w:t xml:space="preserve">2.1</w:t>
             </w:r>
           </w:p>
         </w:tc>
@@ -2236,7 +2236,7 @@
                 <w:sz w:val="18"/>
                 <w:szCs w:val="18"/>
               </w:rPr>
-              <w:t xml:space="preserve">21/10/2026</w:t>
+              <w:t xml:space="preserve">22/10/2026</w:t>
             </w:r>
           </w:p>
         </w:tc>
@@ -2269,7 +2269,7 @@
                 <w:sz w:val="18"/>
                 <w:szCs w:val="18"/>
               </w:rPr>
-              <w:t xml:space="preserve">Backup giornaliero alle 20:00 dal Mac in Cwp › backup › data (Google blocca Apps Script); backup manuale; script 38.</w:t>
+              <w:t xml:space="preserve">Script 01-39.</w:t>
             </w:r>
           </w:p>
         </w:tc>
@@ -2339,7 +2339,7 @@
                 <w:sz w:val="18"/>
                 <w:szCs w:val="18"/>
               </w:rPr>
-              <w:t xml:space="preserve">1.9</w:t>
+              <w:t xml:space="preserve">2.0</w:t>
             </w:r>
           </w:p>
         </w:tc>
@@ -2403,7 +2403,7 @@
                 <w:sz w:val="18"/>
                 <w:szCs w:val="18"/>
               </w:rPr>
-              <w:t xml:space="preserve">Tramite per Google News delle Notizie CO2. Script 37. Tolto il tramite per Google News. Tolto il tramite per Google News.</w:t>
+              <w:t xml:space="preserve">Backup giornaliero alle 20:00 dal Mac in Cwp › backup › data (Google blocca Apps Script); backup manuale; script 38.</w:t>
             </w:r>
           </w:p>
         </w:tc>
@@ -2473,7 +2473,7 @@
                 <w:sz w:val="18"/>
                 <w:szCs w:val="18"/>
               </w:rPr>
-              <w:t xml:space="preserve">1.8</w:t>
+              <w:t xml:space="preserve">1.9</w:t>
             </w:r>
           </w:p>
         </w:tc>
@@ -2539,7 +2539,7 @@
                 <w:sz w:val="18"/>
                 <w:szCs w:val="18"/>
               </w:rPr>
-              <w:t xml:space="preserve">Script 36 e funzione notizie (Verify JWT disattivato, indirizzo url_notizie, quarto lavoro pianificato).</w:t>
+              <w:t xml:space="preserve">Tramite per Google News delle Notizie CO2. Script 37. Tolto il tramite per Google News. Tolto il tramite per Google News.</w:t>
             </w:r>
           </w:p>
         </w:tc>
@@ -2609,7 +2609,7 @@
                 <w:sz w:val="18"/>
                 <w:szCs w:val="18"/>
               </w:rPr>
-              <w:t xml:space="preserve">1.7</w:t>
+              <w:t xml:space="preserve">1.8</w:t>
             </w:r>
           </w:p>
         </w:tc>
@@ -2673,7 +2673,7 @@
                 <w:sz w:val="18"/>
                 <w:szCs w:val="18"/>
               </w:rPr>
-              <w:t xml:space="preserve">Backup automatico su Google Drive alle 13 e alle 21 (installazione, contenuto) e ripristino da un backup automatico, provato sul banco locale.</w:t>
+              <w:t xml:space="preserve">Script 36 e funzione notizie (Verify JWT disattivato, indirizzo url_notizie, quarto lavoro pianificato).</w:t>
             </w:r>
           </w:p>
         </w:tc>
@@ -2743,7 +2743,7 @@
                 <w:sz w:val="18"/>
                 <w:szCs w:val="18"/>
               </w:rPr>
-              <w:t xml:space="preserve">1.6</w:t>
+              <w:t xml:space="preserve">1.7</w:t>
             </w:r>
           </w:p>
         </w:tc>
@@ -2809,7 +2809,7 @@
                 <w:sz w:val="18"/>
                 <w:szCs w:val="18"/>
               </w:rPr>
-              <w:t xml:space="preserve">Ricostruzione del database con gli script da 01 a 35 (simulatore, Amministratore principale, assistente, utenti online, Audit User, avvisi di sicurezza, controlli del collaudo).</w:t>
+              <w:t xml:space="preserve">Backup automatico su Google Drive alle 13 e alle 21 (installazione, contenuto) e ripristino da un backup automatico, provato sul banco locale.</w:t>
             </w:r>
           </w:p>
         </w:tc>
@@ -2879,7 +2879,7 @@
                 <w:sz w:val="18"/>
                 <w:szCs w:val="18"/>
               </w:rPr>
-              <w:t xml:space="preserve">1.5</w:t>
+              <w:t xml:space="preserve">1.6</w:t>
             </w:r>
           </w:p>
         </w:tc>
@@ -2911,7 +2911,7 @@
                 <w:sz w:val="18"/>
                 <w:szCs w:val="18"/>
               </w:rPr>
-              <w:t xml:space="preserve">20/10/2026</w:t>
+              <w:t xml:space="preserve">21/10/2026</w:t>
             </w:r>
           </w:p>
         </w:tc>
@@ -2943,7 +2943,7 @@
                 <w:sz w:val="18"/>
                 <w:szCs w:val="18"/>
               </w:rPr>
-              <w:t xml:space="preserve">Indirizzo Supabase nella Content-Security-Policy di vercel.json; script 01-34.</w:t>
+              <w:t xml:space="preserve">Ricostruzione del database con gli script da 01 a 35 (simulatore, Amministratore principale, assistente, utenti online, Audit User, avvisi di sicurezza, controlli del collaudo).</w:t>
             </w:r>
           </w:p>
         </w:tc>
@@ -3013,7 +3013,7 @@
                 <w:sz w:val="18"/>
                 <w:szCs w:val="18"/>
               </w:rPr>
-              <w:t xml:space="preserve">1.4</w:t>
+              <w:t xml:space="preserve">1.5</w:t>
             </w:r>
           </w:p>
         </w:tc>
@@ -3079,7 +3079,7 @@
                 <w:sz w:val="18"/>
                 <w:szCs w:val="18"/>
               </w:rPr>
-              <w:t xml:space="preserve">Amministratore principale e verifiche dopo il ripristino (Audit User, assistente).</w:t>
+              <w:t xml:space="preserve">Indirizzo Supabase nella Content-Security-Policy di vercel.json; script 01-34.</w:t>
             </w:r>
           </w:p>
         </w:tc>
@@ -3149,7 +3149,7 @@
                 <w:sz w:val="18"/>
                 <w:szCs w:val="18"/>
               </w:rPr>
-              <w:t xml:space="preserve">1.3</w:t>
+              <w:t xml:space="preserve">1.4</w:t>
             </w:r>
           </w:p>
         </w:tc>
@@ -3213,7 +3213,7 @@
                 <w:sz w:val="18"/>
                 <w:szCs w:val="18"/>
               </w:rPr>
-              <w:t xml:space="preserve">Script 01-33.</w:t>
+              <w:t xml:space="preserve">Amministratore principale e verifiche dopo il ripristino (Audit User, assistente).</w:t>
             </w:r>
           </w:p>
         </w:tc>
@@ -3283,7 +3283,7 @@
                 <w:sz w:val="18"/>
                 <w:szCs w:val="18"/>
               </w:rPr>
-              <w:t xml:space="preserve">1.2</w:t>
+              <w:t xml:space="preserve">1.3</w:t>
             </w:r>
           </w:p>
         </w:tc>
@@ -3349,7 +3349,7 @@
                 <w:sz w:val="18"/>
                 <w:szCs w:val="18"/>
               </w:rPr>
-              <w:t xml:space="preserve">Script 01-32.</w:t>
+              <w:t xml:space="preserve">Script 01-33.</w:t>
             </w:r>
           </w:p>
         </w:tc>
@@ -3419,7 +3419,7 @@
                 <w:sz w:val="18"/>
                 <w:szCs w:val="18"/>
               </w:rPr>
-              <w:t xml:space="preserve">1.1</w:t>
+              <w:t xml:space="preserve">1.2</w:t>
             </w:r>
           </w:p>
         </w:tc>
@@ -3451,7 +3451,7 @@
                 <w:sz w:val="18"/>
                 <w:szCs w:val="18"/>
               </w:rPr>
-              <w:t xml:space="preserve">19/10/2026</w:t>
+              <w:t xml:space="preserve">20/10/2026</w:t>
             </w:r>
           </w:p>
         </w:tc>
@@ -3483,7 +3483,7 @@
                 <w:sz w:val="18"/>
                 <w:szCs w:val="18"/>
               </w:rPr>
-              <w:t xml:space="preserve">Funzione assistente e chiave ANTHROPIC_API_KEY; Claude Console tra i servizi; script 01-31.</w:t>
+              <w:t xml:space="preserve">Script 01-32.</w:t>
             </w:r>
           </w:p>
         </w:tc>
@@ -3553,6 +3553,142 @@
                 <w:sz w:val="18"/>
                 <w:szCs w:val="18"/>
               </w:rPr>
+              <w:t xml:space="preserve">1.1</w:t>
+            </w:r>
+          </w:p>
+        </w:tc>
+        <w:tc>
+          <w:tcPr>
+            <w:tcW w:type="dxa" w:w="1300"/>
+            <w:tcBorders>
+              <w:top w:val="single" w:color="D9D4C5" w:sz="4"/>
+              <w:left w:val="single" w:color="D9D4C5" w:sz="4"/>
+              <w:bottom w:val="single" w:color="D9D4C5" w:sz="4"/>
+              <w:right w:val="single" w:color="D9D4C5" w:sz="4"/>
+            </w:tcBorders>
+            <w:shd w:fill="F6F4EE" w:color="auto" w:val="clear"/>
+            <w:tcMar>
+              <w:top w:type="dxa" w:w="70"/>
+              <w:left w:type="dxa" w:w="110"/>
+              <w:bottom w:type="dxa" w:w="70"/>
+              <w:right w:type="dxa" w:w="110"/>
+            </w:tcMar>
+            <w:vAlign w:val="center"/>
+          </w:tcPr>
+          <w:p>
+            <w:pPr>
+              <w:spacing w:after="0" w:before="0"/>
+            </w:pPr>
+            <w:r>
+              <w:rPr>
+                <w:rFonts w:ascii="Arial" w:cs="Arial" w:eastAsia="Arial" w:hAnsi="Arial"/>
+                <w:color w:val="1B2118"/>
+                <w:sz w:val="18"/>
+                <w:szCs w:val="18"/>
+              </w:rPr>
+              <w:t xml:space="preserve">19/10/2026</w:t>
+            </w:r>
+          </w:p>
+        </w:tc>
+        <w:tc>
+          <w:tcPr>
+            <w:tcW w:type="dxa" w:w="5538"/>
+            <w:tcBorders>
+              <w:top w:val="single" w:color="D9D4C5" w:sz="4"/>
+              <w:left w:val="single" w:color="D9D4C5" w:sz="4"/>
+              <w:bottom w:val="single" w:color="D9D4C5" w:sz="4"/>
+              <w:right w:val="single" w:color="D9D4C5" w:sz="4"/>
+            </w:tcBorders>
+            <w:shd w:fill="F6F4EE" w:color="auto" w:val="clear"/>
+            <w:tcMar>
+              <w:top w:type="dxa" w:w="70"/>
+              <w:left w:type="dxa" w:w="110"/>
+              <w:bottom w:type="dxa" w:w="70"/>
+              <w:right w:type="dxa" w:w="110"/>
+            </w:tcMar>
+            <w:vAlign w:val="center"/>
+          </w:tcPr>
+          <w:p>
+            <w:pPr>
+              <w:spacing w:after="0" w:before="0"/>
+            </w:pPr>
+            <w:r>
+              <w:rPr>
+                <w:rFonts w:ascii="Arial" w:cs="Arial" w:eastAsia="Arial" w:hAnsi="Arial"/>
+                <w:color w:val="1B2118"/>
+                <w:sz w:val="18"/>
+                <w:szCs w:val="18"/>
+              </w:rPr>
+              <w:t xml:space="preserve">Funzione assistente e chiave ANTHROPIC_API_KEY; Claude Console tra i servizi; script 01-31.</w:t>
+            </w:r>
+          </w:p>
+        </w:tc>
+        <w:tc>
+          <w:tcPr>
+            <w:tcW w:type="dxa" w:w="2000"/>
+            <w:tcBorders>
+              <w:top w:val="single" w:color="D9D4C5" w:sz="4"/>
+              <w:left w:val="single" w:color="D9D4C5" w:sz="4"/>
+              <w:bottom w:val="single" w:color="D9D4C5" w:sz="4"/>
+              <w:right w:val="single" w:color="D9D4C5" w:sz="4"/>
+            </w:tcBorders>
+            <w:shd w:fill="F6F4EE" w:color="auto" w:val="clear"/>
+            <w:tcMar>
+              <w:top w:type="dxa" w:w="70"/>
+              <w:left w:type="dxa" w:w="110"/>
+              <w:bottom w:type="dxa" w:w="70"/>
+              <w:right w:type="dxa" w:w="110"/>
+            </w:tcMar>
+            <w:vAlign w:val="center"/>
+          </w:tcPr>
+          <w:p>
+            <w:pPr>
+              <w:spacing w:after="0" w:before="0"/>
+            </w:pPr>
+            <w:r>
+              <w:rPr>
+                <w:rFonts w:ascii="Arial" w:cs="Arial" w:eastAsia="Arial" w:hAnsi="Arial"/>
+                <w:color w:val="1B2118"/>
+                <w:sz w:val="18"/>
+                <w:szCs w:val="18"/>
+              </w:rPr>
+              <w:t xml:space="preserve">Fondazione Operate</w:t>
+            </w:r>
+          </w:p>
+        </w:tc>
+      </w:tr>
+      <w:tr>
+        <w:trPr>
+          <w:cantSplit/>
+        </w:trPr>
+        <w:tc>
+          <w:tcPr>
+            <w:tcW w:type="dxa" w:w="800"/>
+            <w:tcBorders>
+              <w:top w:val="single" w:color="D9D4C5" w:sz="4"/>
+              <w:left w:val="single" w:color="D9D4C5" w:sz="4"/>
+              <w:bottom w:val="single" w:color="D9D4C5" w:sz="4"/>
+              <w:right w:val="single" w:color="D9D4C5" w:sz="4"/>
+            </w:tcBorders>
+            <w:tcMar>
+              <w:top w:type="dxa" w:w="70"/>
+              <w:left w:type="dxa" w:w="110"/>
+              <w:bottom w:type="dxa" w:w="70"/>
+              <w:right w:type="dxa" w:w="110"/>
+            </w:tcMar>
+            <w:vAlign w:val="center"/>
+          </w:tcPr>
+          <w:p>
+            <w:pPr>
+              <w:spacing w:after="0" w:before="0"/>
+            </w:pPr>
+            <w:r>
+              <w:rPr>
+                <w:rFonts w:ascii="Arial" w:cs="Arial" w:eastAsia="Arial" w:hAnsi="Arial"/>
+                <w:color w:val="1B2118"/>
+                <w:sz w:val="18"/>
+                <w:szCs w:val="18"/>
+              </w:rPr>
               <w:t xml:space="preserve">1.0</w:t>
             </w:r>
           </w:p>
@@ -3566,7 +3702,6 @@
               <w:bottom w:val="single" w:color="D9D4C5" w:sz="4"/>
               <w:right w:val="single" w:color="D9D4C5" w:sz="4"/>
             </w:tcBorders>
-            <w:shd w:fill="F6F4EE" w:color="auto" w:val="clear"/>
             <w:tcMar>
               <w:top w:type="dxa" w:w="70"/>
               <w:left w:type="dxa" w:w="110"/>
@@ -3599,7 +3734,6 @@
               <w:bottom w:val="single" w:color="D9D4C5" w:sz="4"/>
               <w:right w:val="single" w:color="D9D4C5" w:sz="4"/>
             </w:tcBorders>
-            <w:shd w:fill="F6F4EE" w:color="auto" w:val="clear"/>
             <w:tcMar>
               <w:top w:type="dxa" w:w="70"/>
               <w:left w:type="dxa" w:w="110"/>
@@ -3632,7 +3766,6 @@
               <w:bottom w:val="single" w:color="D9D4C5" w:sz="4"/>
               <w:right w:val="single" w:color="D9D4C5" w:sz="4"/>
             </w:tcBorders>
-            <w:shd w:fill="F6F4EE" w:color="auto" w:val="clear"/>
             <w:tcMar>
               <w:top w:type="dxa" w:w="70"/>
               <w:left w:type="dxa" w:w="110"/>
@@ -3674,7 +3807,7 @@
           <w:sz w:val="20"/>
           <w:szCs w:val="20"/>
         </w:rPr>
-        <w:t xml:space="preserve">Istruzioni alla revisione 3.1 del 25/10/2026. Si aggiornano quando cambiano servizi, piani, script del database, funzioni o chiavi; una copia è dentro ogni archivio di backup e la versione corrente si scarica dall'area Documentazione del portale (solo Amministratori).</w:t>
+        <w:t xml:space="preserve">Istruzioni alla revisione 3.2 del 26/10/2026. Si aggiornano quando cambiano servizi, piani, script del database, funzioni o chiavi; una copia è dentro ogni archivio di backup e la versione corrente si scarica dall'area Documentazione del portale (solo Amministratori).</w:t>
       </w:r>
     </w:p>
     <w:p>
@@ -8767,7 +8900,7 @@
         </w:rPr>
         <w:t xml:space="preserve"> (</w:t>
       </w:r>
-      <w:hyperlink w:history="1" r:id="rIdwsuof4rcpjxeuxzfurfks">
+      <w:hyperlink w:history="1" r:id="rIdwxxsjahxgrqawpmy_lkxe">
         <w:r>
           <w:rPr>
             <w:rFonts w:ascii="Arial" w:cs="Arial" w:eastAsia="Arial" w:hAnsi="Arial"/>
@@ -17256,7 +17389,7 @@
         <w:szCs w:val="16"/>
       </w:rPr>
       <w:tab/>
-      <w:t xml:space="preserve">Istruzioni di ripristino · Rev. 3.1 · 25/10/2026</w:t>
+      <w:t xml:space="preserve">Istruzioni di ripristino · Rev. 3.2 · 26/10/2026</w:t>
     </w:r>
   </w:p>
 </w:hdr>
@@ -17321,7 +17454,7 @@
         <w:szCs w:val="16"/>
       </w:rPr>
       <w:tab/>
-      <w:t xml:space="preserve">Istruzioni di ripristino · Rev. 3.1 · 25/10/2026</w:t>
+      <w:t xml:space="preserve">Istruzioni di ripristino · Rev. 3.2 · 26/10/2026</w:t>
     </w:r>
   </w:p>
 </w:hdr>

</xml_diff>